<commit_message>
Expand full-text antiparasitic verification
</commit_message>
<xml_diff>
--- a/manuscript/artemisia-terpene-review-submission.docx
+++ b/manuscript/artemisia-terpene-review-submission.docx
@@ -199,7 +199,7 @@
         <w:t xml:space="preserve"> </w:t>
       </w:r>
       <w:r>
-        <w:t xml:space="preserve">contains volatile monoterpenes and sesquiterpenes, less volatile diterpenes and triterpenes, and structurally diverse sesquiterpene lactones (STLs). These metabolites are often discussed as though a species name, a pathway gene, or an oil profile were sufficient to predict pharmacology. Here we present a source-auditable living scoping review that instead treats the specimen, accession, tissue, preparation, analytical method, parasite stage, and evidence level as the units of comparison. The current Terpedia package registers 538 sources, 553 source-linked evidence records, 129 antiparasitic records, 19 parasite–protein interaction records, 179 compound/specimen records, and 400 audited article claims; 78 sources and 91 linked evidence rows have completed full-text verification, while 32 queue sources remain open. We synthesize terpene classes with biosynthetic compartmentalization, regulatory and environmental variation, and a bounded comparative-genomics analysis. Artemisinin biosynthesis in</w:t>
+        <w:t xml:space="preserve">contains volatile monoterpenes and sesquiterpenes, less volatile diterpenes and triterpenes, and structurally diverse sesquiterpene lactones (STLs). These metabolites are often discussed as though a species name, a pathway gene, or an oil profile were sufficient to predict pharmacology. Here we present a source-auditable living scoping review that instead treats the specimen, accession, tissue, preparation, analytical method, parasite stage, and evidence level as the units of comparison. The current Terpedia package registers 538 sources, 553 source-linked evidence records, 129 antiparasitic records, 19 parasite–protein interaction records, 179 compound/specimen records, and 400 audited article claims; 79 sources and 94 linked evidence rows have completed full-text verification, while 31 queue sources remain open. We synthesize terpene classes with biosynthetic compartmentalization, regulatory and environmental variation, and a bounded comparative-genomics analysis. Artemisinin biosynthesis in</w:t>
       </w:r>
       <w:r>
         <w:t xml:space="preserve"> </w:t>
@@ -452,7 +452,7 @@
         <w:spacing w:before="0" w:after="120" w:line="264" w:lineRule="auto"/>
       </w:pPr>
       <w:r>
-        <w:t xml:space="preserve">The package is deliberately a living scoping review rather than a completed systematic review. It contains 1,408 bounded title/abstract decisions, covering all 1,387 priority-queue records plus 21 historical or out-of-queue decisions. Full-text verification now covers 78 publicly accessible or publisher-full-text antiparasitic sources and 91 linked evidence rows; 32 queue sources remain unverified, and no result is pooled as a final quantitative estimate. The PRISMA-ScR mapping is archived in</w:t>
+        <w:t xml:space="preserve">The package is deliberately a living scoping review rather than a completed systematic review. It contains 1,408 bounded title/abstract decisions, covering all 1,387 priority-queue records plus 21 historical or out-of-queue decisions. Full-text verification now covers 79 publicly accessible or publisher-full-text antiparasitic sources and 94 linked evidence rows; 31 queue sources remain unverified, and no result is pooled as a final quantitative estimate. The PRISMA-ScR mapping is archived in</w:t>
       </w:r>
       <w:r>
         <w:t xml:space="preserve"> </w:t>

</xml_diff>

<commit_message>
Add focused malaria wormwood evidence table
</commit_message>
<xml_diff>
--- a/manuscript/artemisia-terpene-review-submission.docx
+++ b/manuscript/artemisia-terpene-review-submission.docx
@@ -554,6 +554,7 @@
       <w:tr>
         <w:trPr>
           <w:tblHeader w:val="on"/>
+          <w:cantSplit w:val="true"/>
           <w:tblHeader w:val="true"/>
         </w:trPr>
         <w:tc>
@@ -700,6 +701,9 @@
         </w:tc>
       </w:tr>
       <w:tr>
+        <w:trPr>
+          <w:cantSplit w:val="true"/>
+        </w:trPr>
         <w:tc>
           <w:tcPr>
             <w:tcW w:w="1800" w:type="dxa"/>
@@ -802,6 +806,9 @@
         </w:tc>
       </w:tr>
       <w:tr>
+        <w:trPr>
+          <w:cantSplit w:val="true"/>
+        </w:trPr>
         <w:tc>
           <w:tcPr>
             <w:tcW w:w="1800" w:type="dxa"/>
@@ -904,6 +911,9 @@
         </w:tc>
       </w:tr>
       <w:tr>
+        <w:trPr>
+          <w:cantSplit w:val="true"/>
+        </w:trPr>
         <w:tc>
           <w:tcPr>
             <w:tcW w:w="1800" w:type="dxa"/>
@@ -1006,6 +1016,9 @@
         </w:tc>
       </w:tr>
       <w:tr>
+        <w:trPr>
+          <w:cantSplit w:val="true"/>
+        </w:trPr>
         <w:tc>
           <w:tcPr>
             <w:tcW w:w="1800" w:type="dxa"/>
@@ -1108,6 +1121,9 @@
         </w:tc>
       </w:tr>
       <w:tr>
+        <w:trPr>
+          <w:cantSplit w:val="true"/>
+        </w:trPr>
         <w:tc>
           <w:tcPr>
             <w:tcW w:w="1800" w:type="dxa"/>
@@ -1405,6 +1421,7 @@
       <w:tr>
         <w:trPr>
           <w:tblHeader w:val="on"/>
+          <w:cantSplit w:val="true"/>
           <w:tblHeader w:val="true"/>
         </w:trPr>
         <w:tc>
@@ -1517,6 +1534,9 @@
         </w:tc>
       </w:tr>
       <w:tr>
+        <w:trPr>
+          <w:cantSplit w:val="true"/>
+        </w:trPr>
         <w:tc>
           <w:tcPr>
             <w:tcW w:w="1800" w:type="dxa"/>
@@ -1665,6 +1685,9 @@
         </w:tc>
       </w:tr>
       <w:tr>
+        <w:trPr>
+          <w:cantSplit w:val="true"/>
+        </w:trPr>
         <w:tc>
           <w:tcPr>
             <w:tcW w:w="1800" w:type="dxa"/>
@@ -1797,6 +1820,9 @@
         </w:tc>
       </w:tr>
       <w:tr>
+        <w:trPr>
+          <w:cantSplit w:val="true"/>
+        </w:trPr>
         <w:tc>
           <w:tcPr>
             <w:tcW w:w="1800" w:type="dxa"/>
@@ -1915,6 +1941,9 @@
         </w:tc>
       </w:tr>
       <w:tr>
+        <w:trPr>
+          <w:cantSplit w:val="true"/>
+        </w:trPr>
         <w:tc>
           <w:tcPr>
             <w:tcW w:w="1800" w:type="dxa"/>
@@ -2102,6 +2131,9 @@
         </w:tc>
       </w:tr>
       <w:tr>
+        <w:trPr>
+          <w:cantSplit w:val="true"/>
+        </w:trPr>
         <w:tc>
           <w:tcPr>
             <w:tcW w:w="1800" w:type="dxa"/>
@@ -3181,6 +3213,7 @@
       <w:tr>
         <w:trPr>
           <w:tblHeader w:val="on"/>
+          <w:cantSplit w:val="true"/>
           <w:tblHeader w:val="true"/>
         </w:trPr>
         <w:tc>
@@ -3293,6 +3326,9 @@
         </w:tc>
       </w:tr>
       <w:tr>
+        <w:trPr>
+          <w:cantSplit w:val="true"/>
+        </w:trPr>
         <w:tc>
           <w:tcPr>
             <w:tcW w:w="1800" w:type="dxa"/>
@@ -3395,6 +3431,9 @@
         </w:tc>
       </w:tr>
       <w:tr>
+        <w:trPr>
+          <w:cantSplit w:val="true"/>
+        </w:trPr>
         <w:tc>
           <w:tcPr>
             <w:tcW w:w="1800" w:type="dxa"/>
@@ -3497,6 +3536,9 @@
         </w:tc>
       </w:tr>
       <w:tr>
+        <w:trPr>
+          <w:cantSplit w:val="true"/>
+        </w:trPr>
         <w:tc>
           <w:tcPr>
             <w:tcW w:w="1800" w:type="dxa"/>
@@ -3629,6 +3671,9 @@
         </w:tc>
       </w:tr>
       <w:tr>
+        <w:trPr>
+          <w:cantSplit w:val="true"/>
+        </w:trPr>
         <w:tc>
           <w:tcPr>
             <w:tcW w:w="1800" w:type="dxa"/>
@@ -3731,6 +3776,9 @@
         </w:tc>
       </w:tr>
       <w:tr>
+        <w:trPr>
+          <w:cantSplit w:val="true"/>
+        </w:trPr>
         <w:tc>
           <w:tcPr>
             <w:tcW w:w="1800" w:type="dxa"/>
@@ -6385,7 +6433,7 @@
         <w:t xml:space="preserve"> </w:t>
       </w:r>
       <w:r>
-        <w:t xml:space="preserve">(Higuera-Piedrahita et al. 2023)</w:t>
+        <w:t xml:space="preserve">(R. I. Higuera-Piedrahita et al. 2023)</w:t>
       </w:r>
       <w:r>
         <w:t xml:space="preserve">.</w:t>
@@ -8177,6 +8225,1705 @@
         <w:t xml:space="preserve">preparations fail against a tested parasite, or show activity only in a formulation or one life stage. These observations help distinguish broad cytotoxicity from parasite selectivity and prevent publication bias from turning every reported plant effect into a positive mechanism.</w:t>
       </w:r>
     </w:p>
+    <w:p>
+      <w:pPr>
+        <w:pStyle w:val="BodyText"/>
+        <w:spacing w:before="0" w:after="120" w:line="264" w:lineRule="auto"/>
+      </w:pPr>
+      <w:r>
+        <w:rPr>
+          <w:b/>
+          <w:bCs/>
+        </w:rPr>
+        <w:t xml:space="preserve">Table 4. Selected malaria and wormwood evidence anchors.</w:t>
+      </w:r>
+      <w:r>
+        <w:t xml:space="preserve"> </w:t>
+      </w:r>
+      <w:r>
+        <w:t xml:space="preserve">Values remain preparation-, parasite-stage-, and host-model-specific; they are not pooled effect estimates.</w:t>
+      </w:r>
+    </w:p>
+    <w:tbl>
+      <w:tblPr>
+        <w:tblStyle w:val="Table"/>
+        <w:tblW w:type="dxa" w:w="9360"/>
+        <w:jc w:val="left"/>
+        <w:tblLayout w:type="fixed"/>
+        <w:tblLook w:firstRow="1" w:lastRow="0" w:firstColumn="0" w:lastColumn="0" w:noHBand="0" w:noVBand="0" w:val="0020"/>
+        <w:tblInd w:w="120" w:type="dxa"/>
+      </w:tblPr>
+      <w:tblGrid>
+        <w:gridCol w:w="1800"/>
+        <w:gridCol w:w="2800"/>
+        <w:gridCol w:w="2400"/>
+        <w:gridCol w:w="2360"/>
+      </w:tblGrid>
+      <w:tr>
+        <w:trPr>
+          <w:tblHeader w:val="on"/>
+          <w:cantSplit w:val="true"/>
+          <w:tblHeader w:val="true"/>
+        </w:trPr>
+        <w:tc>
+          <w:tcPr>
+            <w:tcW w:w="1800" w:type="dxa"/>
+            <w:tcMar>
+              <w:top w:w="80" w:type="dxa"/>
+              <w:start w:w="120" w:type="dxa"/>
+              <w:bottom w:w="80" w:type="dxa"/>
+              <w:end w:w="120" w:type="dxa"/>
+            </w:tcMar>
+            <w:vAlign w:val="center"/>
+            <w:shd w:fill="F2F4F7"/>
+          </w:tcPr>
+          <w:p>
+            <w:pPr>
+              <w:pStyle w:val="Compact"/>
+              <w:spacing w:before="0" w:after="40" w:line="240" w:lineRule="auto"/>
+            </w:pPr>
+            <w:r>
+              <w:rPr>
+                <w:rFonts w:ascii="Calibri" w:hAnsi="Calibri"/>
+                <w:b/>
+                <w:sz w:val="18"/>
+              </w:rPr>
+              <w:t xml:space="preserve">System</w:t>
+            </w:r>
+          </w:p>
+        </w:tc>
+        <w:tc>
+          <w:tcPr>
+            <w:tcW w:w="2800" w:type="dxa"/>
+            <w:tcMar>
+              <w:top w:w="80" w:type="dxa"/>
+              <w:start w:w="120" w:type="dxa"/>
+              <w:bottom w:w="80" w:type="dxa"/>
+              <w:end w:w="120" w:type="dxa"/>
+            </w:tcMar>
+            <w:vAlign w:val="center"/>
+            <w:shd w:fill="F2F4F7"/>
+          </w:tcPr>
+          <w:p>
+            <w:pPr>
+              <w:pStyle w:val="Compact"/>
+              <w:spacing w:before="0" w:after="40" w:line="240" w:lineRule="auto"/>
+            </w:pPr>
+            <w:r>
+              <w:rPr>
+                <w:rFonts w:ascii="Calibri" w:hAnsi="Calibri"/>
+                <w:b/>
+                <w:sz w:val="18"/>
+              </w:rPr>
+              <w:t xml:space="preserve">Preparation and observed signal</w:t>
+            </w:r>
+          </w:p>
+        </w:tc>
+        <w:tc>
+          <w:tcPr>
+            <w:tcW w:w="2400" w:type="dxa"/>
+            <w:tcMar>
+              <w:top w:w="80" w:type="dxa"/>
+              <w:start w:w="120" w:type="dxa"/>
+              <w:bottom w:w="80" w:type="dxa"/>
+              <w:end w:w="120" w:type="dxa"/>
+            </w:tcMar>
+            <w:vAlign w:val="center"/>
+            <w:shd w:fill="F2F4F7"/>
+          </w:tcPr>
+          <w:p>
+            <w:pPr>
+              <w:pStyle w:val="Compact"/>
+              <w:spacing w:before="0" w:after="40" w:line="240" w:lineRule="auto"/>
+            </w:pPr>
+            <w:r>
+              <w:rPr>
+                <w:rFonts w:ascii="Calibri" w:hAnsi="Calibri"/>
+                <w:b/>
+                <w:sz w:val="18"/>
+              </w:rPr>
+              <w:t xml:space="preserve">Interpretation boundary</w:t>
+            </w:r>
+          </w:p>
+        </w:tc>
+      </w:tr>
+      <w:tr>
+        <w:trPr>
+          <w:cantSplit w:val="true"/>
+        </w:trPr>
+        <w:tc>
+          <w:tcPr>
+            <w:tcW w:w="1800" w:type="dxa"/>
+            <w:tcMar>
+              <w:top w:w="80" w:type="dxa"/>
+              <w:start w:w="120" w:type="dxa"/>
+              <w:bottom w:w="80" w:type="dxa"/>
+              <w:end w:w="120" w:type="dxa"/>
+            </w:tcMar>
+            <w:vAlign w:val="center"/>
+          </w:tcPr>
+          <w:p>
+            <w:pPr>
+              <w:pStyle w:val="Compact"/>
+              <w:spacing w:before="0" w:after="40" w:line="240" w:lineRule="auto"/>
+            </w:pPr>
+            <w:r>
+              <w:rPr>
+                <w:rFonts w:ascii="Calibri" w:hAnsi="Calibri"/>
+                <w:sz w:val="18"/>
+              </w:rPr>
+              <w:t xml:space="preserve">Purified artemisinin /</w:t>
+            </w:r>
+            <w:r>
+              <w:rPr>
+                <w:rFonts w:ascii="Calibri" w:hAnsi="Calibri"/>
+                <w:sz w:val="18"/>
+              </w:rPr>
+              <w:t xml:space="preserve"> </w:t>
+            </w:r>
+            <w:r>
+              <w:rPr>
+                <w:rFonts w:ascii="Calibri" w:hAnsi="Calibri"/>
+                <w:i/>
+                <w:iCs/>
+                <w:sz w:val="18"/>
+              </w:rPr>
+              <w:t xml:space="preserve">P. falciparum</w:t>
+            </w:r>
+          </w:p>
+        </w:tc>
+        <w:tc>
+          <w:tcPr>
+            <w:tcW w:w="2800" w:type="dxa"/>
+            <w:tcMar>
+              <w:top w:w="80" w:type="dxa"/>
+              <w:start w:w="120" w:type="dxa"/>
+              <w:bottom w:w="80" w:type="dxa"/>
+              <w:end w:w="120" w:type="dxa"/>
+            </w:tcMar>
+            <w:vAlign w:val="center"/>
+          </w:tcPr>
+          <w:p>
+            <w:pPr>
+              <w:pStyle w:val="Compact"/>
+              <w:spacing w:before="0" w:after="40" w:line="240" w:lineRule="auto"/>
+            </w:pPr>
+            <w:r>
+              <w:rPr>
+                <w:rFonts w:ascii="Calibri" w:hAnsi="Calibri"/>
+                <w:sz w:val="18"/>
+              </w:rPr>
+              <w:t xml:space="preserve">Hemin increased ring-stage artemisinin potency and oxidative signals in a synchronized blood-stage assay</w:t>
+            </w:r>
+          </w:p>
+        </w:tc>
+        <w:tc>
+          <w:tcPr>
+            <w:tcW w:w="2400" w:type="dxa"/>
+            <w:tcMar>
+              <w:top w:w="80" w:type="dxa"/>
+              <w:start w:w="120" w:type="dxa"/>
+              <w:bottom w:w="80" w:type="dxa"/>
+              <w:end w:w="120" w:type="dxa"/>
+            </w:tcMar>
+            <w:vAlign w:val="center"/>
+          </w:tcPr>
+          <w:p>
+            <w:pPr>
+              <w:pStyle w:val="Compact"/>
+              <w:spacing w:before="0" w:after="40" w:line="240" w:lineRule="auto"/>
+            </w:pPr>
+            <w:r>
+              <w:rPr>
+                <w:rFonts w:ascii="Calibri" w:hAnsi="Calibri"/>
+                <w:sz w:val="18"/>
+              </w:rPr>
+              <w:t xml:space="preserve">Supports a heme/redox model for the defined drug; it is not evidence for a crude</w:t>
+            </w:r>
+            <w:r>
+              <w:rPr>
+                <w:rFonts w:ascii="Calibri" w:hAnsi="Calibri"/>
+                <w:sz w:val="18"/>
+              </w:rPr>
+              <w:t xml:space="preserve"> </w:t>
+            </w:r>
+            <w:r>
+              <w:rPr>
+                <w:rFonts w:ascii="Calibri" w:hAnsi="Calibri"/>
+                <w:i/>
+                <w:iCs/>
+                <w:sz w:val="18"/>
+              </w:rPr>
+              <w:t xml:space="preserve">Artemisia</w:t>
+            </w:r>
+            <w:r>
+              <w:rPr>
+                <w:rFonts w:ascii="Calibri" w:hAnsi="Calibri"/>
+                <w:sz w:val="18"/>
+              </w:rPr>
+              <w:t xml:space="preserve"> </w:t>
+            </w:r>
+            <w:r>
+              <w:rPr>
+                <w:rFonts w:ascii="Calibri" w:hAnsi="Calibri"/>
+                <w:sz w:val="18"/>
+              </w:rPr>
+              <w:t xml:space="preserve">preparation or a sole parasite receptor</w:t>
+            </w:r>
+            <w:r>
+              <w:rPr>
+                <w:rFonts w:ascii="Calibri" w:hAnsi="Calibri"/>
+                <w:sz w:val="18"/>
+              </w:rPr>
+              <w:t xml:space="preserve"> </w:t>
+            </w:r>
+            <w:r>
+              <w:rPr>
+                <w:rFonts w:ascii="Calibri" w:hAnsi="Calibri"/>
+                <w:sz w:val="18"/>
+              </w:rPr>
+              <w:t xml:space="preserve">(Tangnitipong et al. 2012)</w:t>
+            </w:r>
+          </w:p>
+        </w:tc>
+      </w:tr>
+      <w:tr>
+        <w:trPr>
+          <w:cantSplit w:val="true"/>
+        </w:trPr>
+        <w:tc>
+          <w:tcPr>
+            <w:tcW w:w="1800" w:type="dxa"/>
+            <w:tcMar>
+              <w:top w:w="80" w:type="dxa"/>
+              <w:start w:w="120" w:type="dxa"/>
+              <w:bottom w:w="80" w:type="dxa"/>
+              <w:end w:w="120" w:type="dxa"/>
+            </w:tcMar>
+            <w:vAlign w:val="center"/>
+          </w:tcPr>
+          <w:p>
+            <w:pPr>
+              <w:pStyle w:val="Compact"/>
+              <w:spacing w:before="0" w:after="40" w:line="240" w:lineRule="auto"/>
+            </w:pPr>
+            <w:r>
+              <w:rPr>
+                <w:rFonts w:ascii="Calibri" w:hAnsi="Calibri"/>
+                <w:i/>
+                <w:iCs/>
+                <w:sz w:val="18"/>
+              </w:rPr>
+              <w:t xml:space="preserve">A. annua</w:t>
+            </w:r>
+            <w:r>
+              <w:rPr>
+                <w:rFonts w:ascii="Calibri" w:hAnsi="Calibri"/>
+                <w:sz w:val="18"/>
+              </w:rPr>
+              <w:t xml:space="preserve"> </w:t>
+            </w:r>
+            <w:r>
+              <w:rPr>
+                <w:rFonts w:ascii="Calibri" w:hAnsi="Calibri"/>
+                <w:sz w:val="18"/>
+              </w:rPr>
+              <w:t xml:space="preserve">tea /</w:t>
+            </w:r>
+            <w:r>
+              <w:rPr>
+                <w:rFonts w:ascii="Calibri" w:hAnsi="Calibri"/>
+                <w:sz w:val="18"/>
+              </w:rPr>
+              <w:t xml:space="preserve"> </w:t>
+            </w:r>
+            <w:r>
+              <w:rPr>
+                <w:rFonts w:ascii="Calibri" w:hAnsi="Calibri"/>
+                <w:i/>
+                <w:iCs/>
+                <w:sz w:val="18"/>
+              </w:rPr>
+              <w:t xml:space="preserve">P. falciparum</w:t>
+            </w:r>
+          </w:p>
+        </w:tc>
+        <w:tc>
+          <w:tcPr>
+            <w:tcW w:w="2800" w:type="dxa"/>
+            <w:tcMar>
+              <w:top w:w="80" w:type="dxa"/>
+              <w:start w:w="120" w:type="dxa"/>
+              <w:bottom w:w="80" w:type="dxa"/>
+              <w:end w:w="120" w:type="dxa"/>
+            </w:tcMar>
+            <w:vAlign w:val="center"/>
+          </w:tcPr>
+          <w:p>
+            <w:pPr>
+              <w:pStyle w:val="Compact"/>
+              <w:spacing w:before="0" w:after="40" w:line="240" w:lineRule="auto"/>
+            </w:pPr>
+            <w:r>
+              <w:rPr>
+                <w:rFonts w:ascii="Calibri" w:hAnsi="Calibri"/>
+                <w:sz w:val="18"/>
+              </w:rPr>
+              <w:t xml:space="preserve">Ten plantation teas contained 0.3–15.7 mg/L artemisinin; activity correlated positively with artemisinin, while comparison with pure artemisinin suggested co-metabolite effects</w:t>
+            </w:r>
+          </w:p>
+        </w:tc>
+        <w:tc>
+          <w:tcPr>
+            <w:tcW w:w="2400" w:type="dxa"/>
+            <w:tcMar>
+              <w:top w:w="80" w:type="dxa"/>
+              <w:start w:w="120" w:type="dxa"/>
+              <w:bottom w:w="80" w:type="dxa"/>
+              <w:end w:w="120" w:type="dxa"/>
+            </w:tcMar>
+            <w:vAlign w:val="center"/>
+          </w:tcPr>
+          <w:p>
+            <w:pPr>
+              <w:pStyle w:val="Compact"/>
+              <w:spacing w:before="0" w:after="40" w:line="240" w:lineRule="auto"/>
+            </w:pPr>
+            <w:r>
+              <w:rPr>
+                <w:rFonts w:ascii="Calibri" w:hAnsi="Calibri"/>
+                <w:sz w:val="18"/>
+              </w:rPr>
+              <w:t xml:space="preserve">Strong origin-, storage-, and matrix-level evidence; no individual non-artemisinin terpene was assigned causally</w:t>
+            </w:r>
+            <w:r>
+              <w:rPr>
+                <w:rFonts w:ascii="Calibri" w:hAnsi="Calibri"/>
+                <w:sz w:val="18"/>
+              </w:rPr>
+              <w:t xml:space="preserve"> </w:t>
+            </w:r>
+            <w:r>
+              <w:rPr>
+                <w:rFonts w:ascii="Calibri" w:hAnsi="Calibri"/>
+                <w:sz w:val="18"/>
+              </w:rPr>
+              <w:t xml:space="preserve">(Aubouy et al. 2025)</w:t>
+            </w:r>
+          </w:p>
+        </w:tc>
+      </w:tr>
+      <w:tr>
+        <w:trPr>
+          <w:cantSplit w:val="true"/>
+        </w:trPr>
+        <w:tc>
+          <w:tcPr>
+            <w:tcW w:w="1800" w:type="dxa"/>
+            <w:tcMar>
+              <w:top w:w="80" w:type="dxa"/>
+              <w:start w:w="120" w:type="dxa"/>
+              <w:bottom w:w="80" w:type="dxa"/>
+              <w:end w:w="120" w:type="dxa"/>
+            </w:tcMar>
+            <w:vAlign w:val="center"/>
+          </w:tcPr>
+          <w:p>
+            <w:pPr>
+              <w:pStyle w:val="Compact"/>
+              <w:spacing w:before="0" w:after="40" w:line="240" w:lineRule="auto"/>
+            </w:pPr>
+            <w:r>
+              <w:rPr>
+                <w:rFonts w:ascii="Calibri" w:hAnsi="Calibri"/>
+                <w:i/>
+                <w:iCs/>
+                <w:sz w:val="18"/>
+              </w:rPr>
+              <w:t xml:space="preserve">A. annua</w:t>
+            </w:r>
+            <w:r>
+              <w:rPr>
+                <w:rFonts w:ascii="Calibri" w:hAnsi="Calibri"/>
+                <w:sz w:val="18"/>
+              </w:rPr>
+              <w:t xml:space="preserve"> </w:t>
+            </w:r>
+            <w:r>
+              <w:rPr>
+                <w:rFonts w:ascii="Calibri" w:hAnsi="Calibri"/>
+                <w:sz w:val="18"/>
+              </w:rPr>
+              <w:t xml:space="preserve">extract /</w:t>
+            </w:r>
+            <w:r>
+              <w:rPr>
+                <w:rFonts w:ascii="Calibri" w:hAnsi="Calibri"/>
+                <w:sz w:val="18"/>
+              </w:rPr>
+              <w:t xml:space="preserve"> </w:t>
+            </w:r>
+            <w:r>
+              <w:rPr>
+                <w:rFonts w:ascii="Calibri" w:hAnsi="Calibri"/>
+                <w:i/>
+                <w:iCs/>
+                <w:sz w:val="18"/>
+              </w:rPr>
+              <w:t xml:space="preserve">P. falciparum</w:t>
+            </w:r>
+            <w:r>
+              <w:rPr>
+                <w:rFonts w:ascii="Calibri" w:hAnsi="Calibri"/>
+                <w:sz w:val="18"/>
+              </w:rPr>
+              <w:t xml:space="preserve"> </w:t>
+            </w:r>
+            <w:r>
+              <w:rPr>
+                <w:rFonts w:ascii="Calibri" w:hAnsi="Calibri"/>
+                <w:sz w:val="18"/>
+              </w:rPr>
+              <w:t xml:space="preserve">3D7</w:t>
+            </w:r>
+          </w:p>
+        </w:tc>
+        <w:tc>
+          <w:tcPr>
+            <w:tcW w:w="2800" w:type="dxa"/>
+            <w:tcMar>
+              <w:top w:w="80" w:type="dxa"/>
+              <w:start w:w="120" w:type="dxa"/>
+              <w:bottom w:w="80" w:type="dxa"/>
+              <w:end w:w="120" w:type="dxa"/>
+            </w:tcMar>
+            <w:vAlign w:val="center"/>
+          </w:tcPr>
+          <w:p>
+            <w:pPr>
+              <w:pStyle w:val="Compact"/>
+              <w:spacing w:before="0" w:after="40" w:line="240" w:lineRule="auto"/>
+            </w:pPr>
+            <w:r>
+              <w:rPr>
+                <w:rFonts w:ascii="Calibri" w:hAnsi="Calibri"/>
+                <w:sz w:val="18"/>
+              </w:rPr>
+              <w:t xml:space="preserve">Hydrotrope extracts matched to 1 microgram/mL artemisinin-equivalent exposure had lower reported IC50 values than pure artemisinin; arteannuin B/J and flavonoids co-occurred</w:t>
+            </w:r>
+          </w:p>
+        </w:tc>
+        <w:tc>
+          <w:tcPr>
+            <w:tcW w:w="2400" w:type="dxa"/>
+            <w:tcMar>
+              <w:top w:w="80" w:type="dxa"/>
+              <w:start w:w="120" w:type="dxa"/>
+              <w:bottom w:w="80" w:type="dxa"/>
+              <w:end w:w="120" w:type="dxa"/>
+            </w:tcMar>
+            <w:vAlign w:val="center"/>
+          </w:tcPr>
+          <w:p>
+            <w:pPr>
+              <w:pStyle w:val="Compact"/>
+              <w:spacing w:before="0" w:after="40" w:line="240" w:lineRule="auto"/>
+            </w:pPr>
+            <w:r>
+              <w:rPr>
+                <w:rFonts w:ascii="Calibri" w:hAnsi="Calibri"/>
+                <w:sz w:val="18"/>
+              </w:rPr>
+              <w:t xml:space="preserve">Matrix enhancement remains a hypothesis because the design did not factorially resolve constituents or establish in-vivo selectivity</w:t>
+            </w:r>
+            <w:r>
+              <w:rPr>
+                <w:rFonts w:ascii="Calibri" w:hAnsi="Calibri"/>
+                <w:sz w:val="18"/>
+              </w:rPr>
+              <w:t xml:space="preserve"> </w:t>
+            </w:r>
+            <w:r>
+              <w:rPr>
+                <w:rFonts w:ascii="Calibri" w:hAnsi="Calibri"/>
+                <w:sz w:val="18"/>
+              </w:rPr>
+              <w:t xml:space="preserve">(Ferreira et al. 2024)</w:t>
+            </w:r>
+          </w:p>
+        </w:tc>
+      </w:tr>
+      <w:tr>
+        <w:trPr>
+          <w:cantSplit w:val="true"/>
+        </w:trPr>
+        <w:tc>
+          <w:tcPr>
+            <w:tcW w:w="1800" w:type="dxa"/>
+            <w:tcMar>
+              <w:top w:w="80" w:type="dxa"/>
+              <w:start w:w="120" w:type="dxa"/>
+              <w:bottom w:w="80" w:type="dxa"/>
+              <w:end w:w="120" w:type="dxa"/>
+            </w:tcMar>
+            <w:vAlign w:val="center"/>
+          </w:tcPr>
+          <w:p>
+            <w:pPr>
+              <w:pStyle w:val="Compact"/>
+              <w:spacing w:before="0" w:after="40" w:line="240" w:lineRule="auto"/>
+            </w:pPr>
+            <w:r>
+              <w:rPr>
+                <w:rFonts w:ascii="Calibri" w:hAnsi="Calibri"/>
+                <w:i/>
+                <w:iCs/>
+                <w:sz w:val="18"/>
+              </w:rPr>
+              <w:t xml:space="preserve">A. annua</w:t>
+            </w:r>
+            <w:r>
+              <w:rPr>
+                <w:rFonts w:ascii="Calibri" w:hAnsi="Calibri"/>
+                <w:sz w:val="18"/>
+              </w:rPr>
+              <w:t xml:space="preserve"> </w:t>
+            </w:r>
+            <w:r>
+              <w:rPr>
+                <w:rFonts w:ascii="Calibri" w:hAnsi="Calibri"/>
+                <w:sz w:val="18"/>
+              </w:rPr>
+              <w:t xml:space="preserve">/ ovine gastrointestinal nematodes</w:t>
+            </w:r>
+          </w:p>
+        </w:tc>
+        <w:tc>
+          <w:tcPr>
+            <w:tcW w:w="2800" w:type="dxa"/>
+            <w:tcMar>
+              <w:top w:w="80" w:type="dxa"/>
+              <w:start w:w="120" w:type="dxa"/>
+              <w:bottom w:w="80" w:type="dxa"/>
+              <w:end w:w="120" w:type="dxa"/>
+            </w:tcMar>
+            <w:vAlign w:val="center"/>
+          </w:tcPr>
+          <w:p>
+            <w:pPr>
+              <w:pStyle w:val="Compact"/>
+              <w:spacing w:before="0" w:after="40" w:line="240" w:lineRule="auto"/>
+            </w:pPr>
+            <w:r>
+              <w:rPr>
+                <w:rFonts w:ascii="Calibri" w:hAnsi="Calibri"/>
+                <w:sz w:val="18"/>
+              </w:rPr>
+              <w:t xml:space="preserve">Several extracts were active against eggs and larvae in vitro, but single-dose sodium-bicarbonate extract and artemisinin produced nonsignificant day-15 fecal-egg-count reductions in sheep</w:t>
+            </w:r>
+          </w:p>
+        </w:tc>
+        <w:tc>
+          <w:tcPr>
+            <w:tcW w:w="2400" w:type="dxa"/>
+            <w:tcMar>
+              <w:top w:w="80" w:type="dxa"/>
+              <w:start w:w="120" w:type="dxa"/>
+              <w:bottom w:w="80" w:type="dxa"/>
+              <w:end w:w="120" w:type="dxa"/>
+            </w:tcMar>
+            <w:vAlign w:val="center"/>
+          </w:tcPr>
+          <w:p>
+            <w:pPr>
+              <w:pStyle w:val="Compact"/>
+              <w:spacing w:before="0" w:after="40" w:line="240" w:lineRule="auto"/>
+            </w:pPr>
+            <w:r>
+              <w:rPr>
+                <w:rFonts w:ascii="Calibri" w:hAnsi="Calibri"/>
+                <w:sz w:val="18"/>
+              </w:rPr>
+              <w:t xml:space="preserve">A direct negative/limited translation control; malaria efficacy cannot be transferred to anthelmintic efficacy</w:t>
+            </w:r>
+            <w:r>
+              <w:rPr>
+                <w:rFonts w:ascii="Calibri" w:hAnsi="Calibri"/>
+                <w:sz w:val="18"/>
+              </w:rPr>
+              <w:t xml:space="preserve"> </w:t>
+            </w:r>
+            <w:r>
+              <w:rPr>
+                <w:rFonts w:ascii="Calibri" w:hAnsi="Calibri"/>
+                <w:sz w:val="18"/>
+              </w:rPr>
+              <w:t xml:space="preserve">(Cala et al. 2014)</w:t>
+            </w:r>
+          </w:p>
+        </w:tc>
+      </w:tr>
+      <w:tr>
+        <w:trPr>
+          <w:cantSplit w:val="true"/>
+        </w:trPr>
+        <w:tc>
+          <w:tcPr>
+            <w:tcW w:w="1800" w:type="dxa"/>
+            <w:tcMar>
+              <w:top w:w="80" w:type="dxa"/>
+              <w:start w:w="120" w:type="dxa"/>
+              <w:bottom w:w="80" w:type="dxa"/>
+              <w:end w:w="120" w:type="dxa"/>
+            </w:tcMar>
+            <w:vAlign w:val="center"/>
+          </w:tcPr>
+          <w:p>
+            <w:pPr>
+              <w:pStyle w:val="Compact"/>
+              <w:spacing w:before="0" w:after="40" w:line="240" w:lineRule="auto"/>
+            </w:pPr>
+            <w:r>
+              <w:rPr>
+                <w:rFonts w:ascii="Calibri" w:hAnsi="Calibri"/>
+                <w:i/>
+                <w:iCs/>
+                <w:sz w:val="18"/>
+              </w:rPr>
+              <w:t xml:space="preserve">A. absinthium</w:t>
+            </w:r>
+            <w:r>
+              <w:rPr>
+                <w:rFonts w:ascii="Calibri" w:hAnsi="Calibri"/>
+                <w:sz w:val="18"/>
+              </w:rPr>
+              <w:t xml:space="preserve"> </w:t>
+            </w:r>
+            <w:r>
+              <w:rPr>
+                <w:rFonts w:ascii="Calibri" w:hAnsi="Calibri"/>
+                <w:sz w:val="18"/>
+              </w:rPr>
+              <w:t xml:space="preserve">/ ovine gastrointestinal nematodes</w:t>
+            </w:r>
+          </w:p>
+        </w:tc>
+        <w:tc>
+          <w:tcPr>
+            <w:tcW w:w="2800" w:type="dxa"/>
+            <w:tcMar>
+              <w:top w:w="80" w:type="dxa"/>
+              <w:start w:w="120" w:type="dxa"/>
+              <w:bottom w:w="80" w:type="dxa"/>
+              <w:end w:w="120" w:type="dxa"/>
+            </w:tcMar>
+            <w:vAlign w:val="center"/>
+          </w:tcPr>
+          <w:p>
+            <w:pPr>
+              <w:pStyle w:val="Compact"/>
+              <w:spacing w:before="0" w:after="40" w:line="240" w:lineRule="auto"/>
+            </w:pPr>
+            <w:r>
+              <w:rPr>
+                <w:rFonts w:ascii="Calibri" w:hAnsi="Calibri"/>
+                <w:sz w:val="18"/>
+              </w:rPr>
+              <w:t xml:space="preserve">Crude aqueous and ethanolic aerial-part extracts impaired</w:t>
+            </w:r>
+            <w:r>
+              <w:rPr>
+                <w:rFonts w:ascii="Calibri" w:hAnsi="Calibri"/>
+                <w:sz w:val="18"/>
+              </w:rPr>
+              <w:t xml:space="preserve"> </w:t>
+            </w:r>
+            <w:r>
+              <w:rPr>
+                <w:rFonts w:ascii="Calibri" w:hAnsi="Calibri"/>
+                <w:i/>
+                <w:iCs/>
+                <w:sz w:val="18"/>
+              </w:rPr>
+              <w:t xml:space="preserve">H. contortus</w:t>
+            </w:r>
+            <w:r>
+              <w:rPr>
+                <w:rFonts w:ascii="Calibri" w:hAnsi="Calibri"/>
+                <w:sz w:val="18"/>
+              </w:rPr>
+              <w:t xml:space="preserve"> </w:t>
+            </w:r>
+            <w:r>
+              <w:rPr>
+                <w:rFonts w:ascii="Calibri" w:hAnsi="Calibri"/>
+                <w:sz w:val="18"/>
+              </w:rPr>
+              <w:t xml:space="preserve">in vitro; ethanolic extract reached 90.46% day-15 fecal-egg-count reduction at 2.0 g/kg</w:t>
+            </w:r>
+          </w:p>
+        </w:tc>
+        <w:tc>
+          <w:tcPr>
+            <w:tcW w:w="2400" w:type="dxa"/>
+            <w:tcMar>
+              <w:top w:w="80" w:type="dxa"/>
+              <w:start w:w="120" w:type="dxa"/>
+              <w:bottom w:w="80" w:type="dxa"/>
+              <w:end w:w="120" w:type="dxa"/>
+            </w:tcMar>
+            <w:vAlign w:val="center"/>
+          </w:tcPr>
+          <w:p>
+            <w:pPr>
+              <w:pStyle w:val="Compact"/>
+              <w:spacing w:before="0" w:after="40" w:line="240" w:lineRule="auto"/>
+            </w:pPr>
+            <w:r>
+              <w:rPr>
+                <w:rFonts w:ascii="Calibri" w:hAnsi="Calibri"/>
+                <w:sz w:val="18"/>
+              </w:rPr>
+              <w:t xml:space="preserve">Supports a veterinary wormwood phenotype, but not thujone, santonin, STL, or human efficacy attribution</w:t>
+            </w:r>
+            <w:r>
+              <w:rPr>
+                <w:rFonts w:ascii="Calibri" w:hAnsi="Calibri"/>
+                <w:sz w:val="18"/>
+              </w:rPr>
+              <w:t xml:space="preserve"> </w:t>
+            </w:r>
+            <w:r>
+              <w:rPr>
+                <w:rFonts w:ascii="Calibri" w:hAnsi="Calibri"/>
+                <w:sz w:val="18"/>
+              </w:rPr>
+              <w:t xml:space="preserve">(Tariq et al. 2009)</w:t>
+            </w:r>
+          </w:p>
+        </w:tc>
+      </w:tr>
+      <w:tr>
+        <w:trPr>
+          <w:cantSplit w:val="true"/>
+        </w:trPr>
+        <w:tc>
+          <w:tcPr>
+            <w:tcW w:w="1800" w:type="dxa"/>
+            <w:tcMar>
+              <w:top w:w="80" w:type="dxa"/>
+              <w:start w:w="120" w:type="dxa"/>
+              <w:bottom w:w="80" w:type="dxa"/>
+              <w:end w:w="120" w:type="dxa"/>
+            </w:tcMar>
+            <w:vAlign w:val="center"/>
+          </w:tcPr>
+          <w:p>
+            <w:pPr>
+              <w:pStyle w:val="Compact"/>
+              <w:spacing w:before="0" w:after="40" w:line="240" w:lineRule="auto"/>
+            </w:pPr>
+            <w:r>
+              <w:rPr>
+                <w:rFonts w:ascii="Calibri" w:hAnsi="Calibri"/>
+                <w:i/>
+                <w:iCs/>
+                <w:sz w:val="18"/>
+              </w:rPr>
+              <w:t xml:space="preserve">A. absinthium</w:t>
+            </w:r>
+            <w:r>
+              <w:rPr>
+                <w:rFonts w:ascii="Calibri" w:hAnsi="Calibri"/>
+                <w:sz w:val="18"/>
+              </w:rPr>
+              <w:t xml:space="preserve"> </w:t>
+            </w:r>
+            <w:r>
+              <w:rPr>
+                <w:rFonts w:ascii="Calibri" w:hAnsi="Calibri"/>
+                <w:sz w:val="18"/>
+              </w:rPr>
+              <w:t xml:space="preserve">/</w:t>
+            </w:r>
+            <w:r>
+              <w:rPr>
+                <w:rFonts w:ascii="Calibri" w:hAnsi="Calibri"/>
+                <w:sz w:val="18"/>
+              </w:rPr>
+              <w:t xml:space="preserve"> </w:t>
+            </w:r>
+            <w:r>
+              <w:rPr>
+                <w:rFonts w:ascii="Calibri" w:hAnsi="Calibri"/>
+                <w:i/>
+                <w:iCs/>
+                <w:sz w:val="18"/>
+              </w:rPr>
+              <w:t xml:space="preserve">H. contortus</w:t>
+            </w:r>
+            <w:r>
+              <w:rPr>
+                <w:rFonts w:ascii="Calibri" w:hAnsi="Calibri"/>
+                <w:sz w:val="18"/>
+              </w:rPr>
+              <w:t xml:space="preserve"> </w:t>
+            </w:r>
+            <w:r>
+              <w:rPr>
+                <w:rFonts w:ascii="Calibri" w:hAnsi="Calibri"/>
+                <w:sz w:val="18"/>
+              </w:rPr>
+              <w:t xml:space="preserve">in lambs</w:t>
+            </w:r>
+          </w:p>
+        </w:tc>
+        <w:tc>
+          <w:tcPr>
+            <w:tcW w:w="2800" w:type="dxa"/>
+            <w:tcMar>
+              <w:top w:w="80" w:type="dxa"/>
+              <w:start w:w="120" w:type="dxa"/>
+              <w:bottom w:w="80" w:type="dxa"/>
+              <w:end w:w="120" w:type="dxa"/>
+            </w:tcMar>
+            <w:vAlign w:val="center"/>
+          </w:tcPr>
+          <w:p>
+            <w:pPr>
+              <w:pStyle w:val="Compact"/>
+              <w:spacing w:before="0" w:after="40" w:line="240" w:lineRule="auto"/>
+            </w:pPr>
+            <w:r>
+              <w:rPr>
+                <w:rFonts w:ascii="Calibri" w:hAnsi="Calibri"/>
+                <w:sz w:val="18"/>
+              </w:rPr>
+              <w:t xml:space="preserve">Aqueous extract had in-vitro ED50/ED99 values of 1.40/3.76 mg/mL, yet dietary wormwood did not significantly reduce group-level fecal egg counts or terminal worm counts</w:t>
+            </w:r>
+          </w:p>
+        </w:tc>
+        <w:tc>
+          <w:tcPr>
+            <w:tcW w:w="2400" w:type="dxa"/>
+            <w:tcMar>
+              <w:top w:w="80" w:type="dxa"/>
+              <w:start w:w="120" w:type="dxa"/>
+              <w:bottom w:w="80" w:type="dxa"/>
+              <w:end w:w="120" w:type="dxa"/>
+            </w:tcMar>
+            <w:vAlign w:val="center"/>
+          </w:tcPr>
+          <w:p>
+            <w:pPr>
+              <w:pStyle w:val="Compact"/>
+              <w:spacing w:before="0" w:after="40" w:line="240" w:lineRule="auto"/>
+            </w:pPr>
+            <w:r>
+              <w:rPr>
+                <w:rFonts w:ascii="Calibri" w:hAnsi="Calibri"/>
+                <w:sz w:val="18"/>
+              </w:rPr>
+              <w:t xml:space="preserve">Positive in-vitro versus limited in-vivo boundary; terpene-normalized exposure was not reported</w:t>
+            </w:r>
+            <w:r>
+              <w:rPr>
+                <w:rFonts w:ascii="Calibri" w:hAnsi="Calibri"/>
+                <w:sz w:val="18"/>
+              </w:rPr>
+              <w:t xml:space="preserve"> </w:t>
+            </w:r>
+            <w:r>
+              <w:rPr>
+                <w:rFonts w:ascii="Calibri" w:hAnsi="Calibri"/>
+                <w:sz w:val="18"/>
+              </w:rPr>
+              <w:t xml:space="preserve">(Mravčáková et al. 2020)</w:t>
+            </w:r>
+          </w:p>
+        </w:tc>
+      </w:tr>
+      <w:tr>
+        <w:trPr>
+          <w:cantSplit w:val="true"/>
+        </w:trPr>
+        <w:tc>
+          <w:tcPr>
+            <w:tcW w:w="1800" w:type="dxa"/>
+            <w:tcMar>
+              <w:top w:w="80" w:type="dxa"/>
+              <w:start w:w="120" w:type="dxa"/>
+              <w:bottom w:w="80" w:type="dxa"/>
+              <w:end w:w="120" w:type="dxa"/>
+            </w:tcMar>
+            <w:vAlign w:val="center"/>
+          </w:tcPr>
+          <w:p>
+            <w:pPr>
+              <w:pStyle w:val="Compact"/>
+              <w:spacing w:before="0" w:after="40" w:line="240" w:lineRule="auto"/>
+            </w:pPr>
+            <w:r>
+              <w:rPr>
+                <w:rFonts w:ascii="Calibri" w:hAnsi="Calibri"/>
+                <w:i/>
+                <w:iCs/>
+                <w:sz w:val="18"/>
+              </w:rPr>
+              <w:t xml:space="preserve">A. absinthium</w:t>
+            </w:r>
+            <w:r>
+              <w:rPr>
+                <w:rFonts w:ascii="Calibri" w:hAnsi="Calibri"/>
+                <w:sz w:val="18"/>
+              </w:rPr>
+              <w:t xml:space="preserve"> </w:t>
+            </w:r>
+            <w:r>
+              <w:rPr>
+                <w:rFonts w:ascii="Calibri" w:hAnsi="Calibri"/>
+                <w:sz w:val="18"/>
+              </w:rPr>
+              <w:t xml:space="preserve">/</w:t>
+            </w:r>
+            <w:r>
+              <w:rPr>
+                <w:rFonts w:ascii="Calibri" w:hAnsi="Calibri"/>
+                <w:sz w:val="18"/>
+              </w:rPr>
+              <w:t xml:space="preserve"> </w:t>
+            </w:r>
+            <w:r>
+              <w:rPr>
+                <w:rFonts w:ascii="Calibri" w:hAnsi="Calibri"/>
+                <w:i/>
+                <w:iCs/>
+                <w:sz w:val="18"/>
+              </w:rPr>
+              <w:t xml:space="preserve">T. spiralis</w:t>
+            </w:r>
+          </w:p>
+        </w:tc>
+        <w:tc>
+          <w:tcPr>
+            <w:tcW w:w="2800" w:type="dxa"/>
+            <w:tcMar>
+              <w:top w:w="80" w:type="dxa"/>
+              <w:start w:w="120" w:type="dxa"/>
+              <w:bottom w:w="80" w:type="dxa"/>
+              <w:end w:w="120" w:type="dxa"/>
+            </w:tcMar>
+            <w:vAlign w:val="center"/>
+          </w:tcPr>
+          <w:p>
+            <w:pPr>
+              <w:pStyle w:val="Compact"/>
+              <w:spacing w:before="0" w:after="40" w:line="240" w:lineRule="auto"/>
+            </w:pPr>
+            <w:r>
+              <w:rPr>
+                <w:rFonts w:ascii="Calibri" w:hAnsi="Calibri"/>
+                <w:sz w:val="18"/>
+              </w:rPr>
+              <w:t xml:space="preserve">Thujone-free cultivated oils reduced larval infectivity ex vivo by 72–100% and selected tissue burdens in mice, but were weak against</w:t>
+            </w:r>
+            <w:r>
+              <w:rPr>
+                <w:rFonts w:ascii="Calibri" w:hAnsi="Calibri"/>
+                <w:sz w:val="18"/>
+              </w:rPr>
+              <w:t xml:space="preserve"> </w:t>
+            </w:r>
+            <w:r>
+              <w:rPr>
+                <w:rFonts w:ascii="Calibri" w:hAnsi="Calibri"/>
+                <w:i/>
+                <w:iCs/>
+                <w:sz w:val="18"/>
+              </w:rPr>
+              <w:t xml:space="preserve">M. javanica</w:t>
+            </w:r>
+          </w:p>
+        </w:tc>
+        <w:tc>
+          <w:tcPr>
+            <w:tcW w:w="2400" w:type="dxa"/>
+            <w:tcMar>
+              <w:top w:w="80" w:type="dxa"/>
+              <w:start w:w="120" w:type="dxa"/>
+              <w:bottom w:w="80" w:type="dxa"/>
+              <w:end w:w="120" w:type="dxa"/>
+            </w:tcMar>
+            <w:vAlign w:val="center"/>
+          </w:tcPr>
+          <w:p>
+            <w:pPr>
+              <w:pStyle w:val="Compact"/>
+              <w:spacing w:before="0" w:after="40" w:line="240" w:lineRule="auto"/>
+            </w:pPr>
+            <w:r>
+              <w:rPr>
+                <w:rFonts w:ascii="Calibri" w:hAnsi="Calibri"/>
+                <w:sz w:val="18"/>
+              </w:rPr>
+              <w:t xml:space="preserve">Chemotype- and parasite-specific oil evidence; epoxyocimene and chrysanthenol were not proven causal</w:t>
+            </w:r>
+            <w:r>
+              <w:rPr>
+                <w:rFonts w:ascii="Calibri" w:hAnsi="Calibri"/>
+                <w:sz w:val="18"/>
+              </w:rPr>
+              <w:t xml:space="preserve"> </w:t>
+            </w:r>
+            <w:r>
+              <w:rPr>
+                <w:rFonts w:ascii="Calibri" w:hAnsi="Calibri"/>
+                <w:sz w:val="18"/>
+              </w:rPr>
+              <w:t xml:space="preserve">(García-Rodríguez et al. 2015)</w:t>
+            </w:r>
+          </w:p>
+        </w:tc>
+      </w:tr>
+      <w:tr>
+        <w:trPr>
+          <w:cantSplit w:val="true"/>
+        </w:trPr>
+        <w:tc>
+          <w:tcPr>
+            <w:tcW w:w="1800" w:type="dxa"/>
+            <w:tcMar>
+              <w:top w:w="80" w:type="dxa"/>
+              <w:start w:w="120" w:type="dxa"/>
+              <w:bottom w:w="80" w:type="dxa"/>
+              <w:end w:w="120" w:type="dxa"/>
+            </w:tcMar>
+            <w:vAlign w:val="center"/>
+          </w:tcPr>
+          <w:p>
+            <w:pPr>
+              <w:pStyle w:val="Compact"/>
+              <w:spacing w:before="0" w:after="40" w:line="240" w:lineRule="auto"/>
+            </w:pPr>
+            <w:r>
+              <w:rPr>
+                <w:rFonts w:ascii="Calibri" w:hAnsi="Calibri"/>
+                <w:i/>
+                <w:iCs/>
+                <w:sz w:val="18"/>
+              </w:rPr>
+              <w:t xml:space="preserve">A. absinthium</w:t>
+            </w:r>
+            <w:r>
+              <w:rPr>
+                <w:rFonts w:ascii="Calibri" w:hAnsi="Calibri"/>
+                <w:sz w:val="18"/>
+              </w:rPr>
+              <w:t xml:space="preserve"> </w:t>
+            </w:r>
+            <w:r>
+              <w:rPr>
+                <w:rFonts w:ascii="Calibri" w:hAnsi="Calibri"/>
+                <w:sz w:val="18"/>
+              </w:rPr>
+              <w:t xml:space="preserve">/</w:t>
+            </w:r>
+            <w:r>
+              <w:rPr>
+                <w:rFonts w:ascii="Calibri" w:hAnsi="Calibri"/>
+                <w:sz w:val="18"/>
+              </w:rPr>
+              <w:t xml:space="preserve"> </w:t>
+            </w:r>
+            <w:r>
+              <w:rPr>
+                <w:rFonts w:ascii="Calibri" w:hAnsi="Calibri"/>
+                <w:i/>
+                <w:iCs/>
+                <w:sz w:val="18"/>
+              </w:rPr>
+              <w:t xml:space="preserve">T. spiralis</w:t>
+            </w:r>
+            <w:r>
+              <w:rPr>
+                <w:rFonts w:ascii="Calibri" w:hAnsi="Calibri"/>
+                <w:sz w:val="18"/>
+              </w:rPr>
+              <w:t xml:space="preserve"> </w:t>
+            </w:r>
+            <w:r>
+              <w:rPr>
+                <w:rFonts w:ascii="Calibri" w:hAnsi="Calibri"/>
+                <w:sz w:val="18"/>
+              </w:rPr>
+              <w:t xml:space="preserve">rats</w:t>
+            </w:r>
+          </w:p>
+        </w:tc>
+        <w:tc>
+          <w:tcPr>
+            <w:tcW w:w="2800" w:type="dxa"/>
+            <w:tcMar>
+              <w:top w:w="80" w:type="dxa"/>
+              <w:start w:w="120" w:type="dxa"/>
+              <w:bottom w:w="80" w:type="dxa"/>
+              <w:end w:w="120" w:type="dxa"/>
+            </w:tcMar>
+            <w:vAlign w:val="center"/>
+          </w:tcPr>
+          <w:p>
+            <w:pPr>
+              <w:pStyle w:val="Compact"/>
+              <w:spacing w:before="0" w:after="40" w:line="240" w:lineRule="auto"/>
+            </w:pPr>
+            <w:r>
+              <w:rPr>
+                <w:rFonts w:ascii="Calibri" w:hAnsi="Calibri"/>
+                <w:sz w:val="18"/>
+              </w:rPr>
+              <w:t xml:space="preserve">Methanolic extract reduced tissue larval rates by 37.7–63.5% in the enteral phase and 43.7–59.9% in the parenteral phase; no acute toxicity was observed at tested doses</w:t>
+            </w:r>
+          </w:p>
+        </w:tc>
+        <w:tc>
+          <w:tcPr>
+            <w:tcW w:w="2400" w:type="dxa"/>
+            <w:tcMar>
+              <w:top w:w="80" w:type="dxa"/>
+              <w:start w:w="120" w:type="dxa"/>
+              <w:bottom w:w="80" w:type="dxa"/>
+              <w:end w:w="120" w:type="dxa"/>
+            </w:tcMar>
+            <w:vAlign w:val="center"/>
+          </w:tcPr>
+          <w:p>
+            <w:pPr>
+              <w:pStyle w:val="Compact"/>
+              <w:spacing w:before="0" w:after="40" w:line="240" w:lineRule="auto"/>
+            </w:pPr>
+            <w:r>
+              <w:rPr>
+                <w:rFonts w:ascii="Calibri" w:hAnsi="Calibri"/>
+                <w:sz w:val="18"/>
+              </w:rPr>
+              <w:t xml:space="preserve">Crude, stage- and route-specific animal evidence without a positive comparator, PK/residue data, or terpene-resolved chemistry</w:t>
+            </w:r>
+            <w:r>
+              <w:rPr>
+                <w:rFonts w:ascii="Calibri" w:hAnsi="Calibri"/>
+                <w:sz w:val="18"/>
+              </w:rPr>
+              <w:t xml:space="preserve"> </w:t>
+            </w:r>
+            <w:r>
+              <w:rPr>
+                <w:rFonts w:ascii="Calibri" w:hAnsi="Calibri"/>
+                <w:sz w:val="18"/>
+              </w:rPr>
+              <w:t xml:space="preserve">(Caner et al. 2008)</w:t>
+            </w:r>
+          </w:p>
+        </w:tc>
+      </w:tr>
+      <w:tr>
+        <w:trPr>
+          <w:cantSplit w:val="true"/>
+        </w:trPr>
+        <w:tc>
+          <w:tcPr>
+            <w:tcW w:w="1800" w:type="dxa"/>
+            <w:tcMar>
+              <w:top w:w="80" w:type="dxa"/>
+              <w:start w:w="120" w:type="dxa"/>
+              <w:bottom w:w="80" w:type="dxa"/>
+              <w:end w:w="120" w:type="dxa"/>
+            </w:tcMar>
+            <w:vAlign w:val="center"/>
+          </w:tcPr>
+          <w:p>
+            <w:pPr>
+              <w:pStyle w:val="Compact"/>
+              <w:spacing w:before="0" w:after="40" w:line="240" w:lineRule="auto"/>
+            </w:pPr>
+            <w:r>
+              <w:rPr>
+                <w:rFonts w:ascii="Calibri" w:hAnsi="Calibri"/>
+                <w:i/>
+                <w:iCs/>
+                <w:sz w:val="18"/>
+              </w:rPr>
+              <w:t xml:space="preserve">A. cina</w:t>
+            </w:r>
+            <w:r>
+              <w:rPr>
+                <w:rFonts w:ascii="Calibri" w:hAnsi="Calibri"/>
+                <w:sz w:val="18"/>
+              </w:rPr>
+              <w:t xml:space="preserve"> </w:t>
+            </w:r>
+            <w:r>
+              <w:rPr>
+                <w:rFonts w:ascii="Calibri" w:hAnsi="Calibri"/>
+                <w:sz w:val="18"/>
+              </w:rPr>
+              <w:t xml:space="preserve">/</w:t>
+            </w:r>
+            <w:r>
+              <w:rPr>
+                <w:rFonts w:ascii="Calibri" w:hAnsi="Calibri"/>
+                <w:sz w:val="18"/>
+              </w:rPr>
+              <w:t xml:space="preserve"> </w:t>
+            </w:r>
+            <w:r>
+              <w:rPr>
+                <w:rFonts w:ascii="Calibri" w:hAnsi="Calibri"/>
+                <w:i/>
+                <w:iCs/>
+                <w:sz w:val="18"/>
+              </w:rPr>
+              <w:t xml:space="preserve">H. contortus</w:t>
+            </w:r>
+          </w:p>
+        </w:tc>
+        <w:tc>
+          <w:tcPr>
+            <w:tcW w:w="2800" w:type="dxa"/>
+            <w:tcMar>
+              <w:top w:w="80" w:type="dxa"/>
+              <w:start w:w="120" w:type="dxa"/>
+              <w:bottom w:w="80" w:type="dxa"/>
+              <w:end w:w="120" w:type="dxa"/>
+            </w:tcMar>
+            <w:vAlign w:val="center"/>
+          </w:tcPr>
+          <w:p>
+            <w:pPr>
+              <w:pStyle w:val="Compact"/>
+              <w:spacing w:before="0" w:after="40" w:line="240" w:lineRule="auto"/>
+            </w:pPr>
+            <w:r>
+              <w:rPr>
+                <w:rFonts w:ascii="Calibri" w:hAnsi="Calibri"/>
+                <w:sz w:val="18"/>
+              </w:rPr>
+              <w:t xml:space="preserve">n-Hexane extract produced 75–82.6% larval activity in vitro and 100% reduction in infected gerbils;</w:t>
+            </w:r>
+            <w:r>
+              <w:rPr>
+                <w:rFonts w:ascii="Calibri" w:hAnsi="Calibri"/>
+                <w:sz w:val="18"/>
+              </w:rPr>
+              <w:t xml:space="preserve"> </w:t>
+            </w:r>
+            <w:r>
+              <w:rPr>
+                <w:rFonts w:ascii="Calibri" w:hAnsi="Calibri"/>
+                <w:i/>
+                <w:iCs/>
+                <w:sz w:val="18"/>
+              </w:rPr>
+              <w:t xml:space="preserve">Hc29</w:t>
+            </w:r>
+            <w:r>
+              <w:rPr>
+                <w:rFonts w:ascii="Calibri" w:hAnsi="Calibri"/>
+                <w:sz w:val="18"/>
+              </w:rPr>
+              <w:t xml:space="preserve"> </w:t>
+            </w:r>
+            <w:r>
+              <w:rPr>
+                <w:rFonts w:ascii="Calibri" w:hAnsi="Calibri"/>
+                <w:sz w:val="18"/>
+              </w:rPr>
+              <w:t xml:space="preserve">expression changed after exposure</w:t>
+            </w:r>
+          </w:p>
+        </w:tc>
+        <w:tc>
+          <w:tcPr>
+            <w:tcW w:w="2400" w:type="dxa"/>
+            <w:tcMar>
+              <w:top w:w="80" w:type="dxa"/>
+              <w:start w:w="120" w:type="dxa"/>
+              <w:bottom w:w="80" w:type="dxa"/>
+              <w:end w:w="120" w:type="dxa"/>
+            </w:tcMar>
+            <w:vAlign w:val="center"/>
+          </w:tcPr>
+          <w:p>
+            <w:pPr>
+              <w:pStyle w:val="Compact"/>
+              <w:spacing w:before="0" w:after="40" w:line="240" w:lineRule="auto"/>
+            </w:pPr>
+            <w:r>
+              <w:rPr>
+                <w:rFonts w:ascii="Calibri" w:hAnsi="Calibri"/>
+                <w:sz w:val="18"/>
+              </w:rPr>
+              <w:t xml:space="preserve">A strong fraction/biomarker lead, not direct target engagement or evidence for a terpene/STL mechanism; full text remains open</w:t>
+            </w:r>
+            <w:r>
+              <w:rPr>
+                <w:rFonts w:ascii="Calibri" w:hAnsi="Calibri"/>
+                <w:sz w:val="18"/>
+              </w:rPr>
+              <w:t xml:space="preserve"> </w:t>
+            </w:r>
+            <w:r>
+              <w:rPr>
+                <w:rFonts w:ascii="Calibri" w:hAnsi="Calibri"/>
+                <w:sz w:val="18"/>
+              </w:rPr>
+              <w:t xml:space="preserve">(R. Higuera-Piedrahita et al. 2021)</w:t>
+            </w:r>
+          </w:p>
+        </w:tc>
+      </w:tr>
+      <w:tr>
+        <w:trPr>
+          <w:cantSplit w:val="true"/>
+        </w:trPr>
+        <w:tc>
+          <w:tcPr>
+            <w:tcW w:w="1800" w:type="dxa"/>
+            <w:tcMar>
+              <w:top w:w="80" w:type="dxa"/>
+              <w:start w:w="120" w:type="dxa"/>
+              <w:bottom w:w="80" w:type="dxa"/>
+              <w:end w:w="120" w:type="dxa"/>
+            </w:tcMar>
+            <w:vAlign w:val="center"/>
+          </w:tcPr>
+          <w:p>
+            <w:pPr>
+              <w:pStyle w:val="Compact"/>
+              <w:spacing w:before="0" w:after="40" w:line="240" w:lineRule="auto"/>
+            </w:pPr>
+            <w:r>
+              <w:rPr>
+                <w:rFonts w:ascii="Calibri" w:hAnsi="Calibri"/>
+                <w:i/>
+                <w:iCs/>
+                <w:sz w:val="18"/>
+              </w:rPr>
+              <w:t xml:space="preserve">A. sieberi</w:t>
+            </w:r>
+            <w:r>
+              <w:rPr>
+                <w:rFonts w:ascii="Calibri" w:hAnsi="Calibri"/>
+                <w:sz w:val="18"/>
+              </w:rPr>
+              <w:t xml:space="preserve"> </w:t>
+            </w:r>
+            <w:r>
+              <w:rPr>
+                <w:rFonts w:ascii="Calibri" w:hAnsi="Calibri"/>
+                <w:sz w:val="18"/>
+              </w:rPr>
+              <w:t xml:space="preserve">/</w:t>
+            </w:r>
+            <w:r>
+              <w:rPr>
+                <w:rFonts w:ascii="Calibri" w:hAnsi="Calibri"/>
+                <w:sz w:val="18"/>
+              </w:rPr>
+              <w:t xml:space="preserve"> </w:t>
+            </w:r>
+            <w:r>
+              <w:rPr>
+                <w:rFonts w:ascii="Calibri" w:hAnsi="Calibri"/>
+                <w:i/>
+                <w:iCs/>
+                <w:sz w:val="18"/>
+              </w:rPr>
+              <w:t xml:space="preserve">Eimeria</w:t>
+            </w:r>
+            <w:r>
+              <w:rPr>
+                <w:rFonts w:ascii="Calibri" w:hAnsi="Calibri"/>
+                <w:sz w:val="18"/>
+              </w:rPr>
+              <w:t xml:space="preserve"> </w:t>
+            </w:r>
+            <w:r>
+              <w:rPr>
+                <w:rFonts w:ascii="Calibri" w:hAnsi="Calibri"/>
+                <w:sz w:val="18"/>
+              </w:rPr>
+              <w:t xml:space="preserve">spp.</w:t>
+            </w:r>
+          </w:p>
+        </w:tc>
+        <w:tc>
+          <w:tcPr>
+            <w:tcW w:w="2800" w:type="dxa"/>
+            <w:tcMar>
+              <w:top w:w="80" w:type="dxa"/>
+              <w:start w:w="120" w:type="dxa"/>
+              <w:bottom w:w="80" w:type="dxa"/>
+              <w:end w:w="120" w:type="dxa"/>
+            </w:tcMar>
+            <w:vAlign w:val="center"/>
+          </w:tcPr>
+          <w:p>
+            <w:pPr>
+              <w:pStyle w:val="Compact"/>
+              <w:spacing w:before="0" w:after="40" w:line="240" w:lineRule="auto"/>
+            </w:pPr>
+            <w:r>
+              <w:rPr>
+                <w:rFonts w:ascii="Calibri" w:hAnsi="Calibri"/>
+                <w:sz w:val="18"/>
+              </w:rPr>
+              <w:t xml:space="preserve">Publisher-indexed report measured 0.20% summer and 0.14% autumn artemisinin in dry plant material and reduced</w:t>
+            </w:r>
+            <w:r>
+              <w:rPr>
+                <w:rFonts w:ascii="Calibri" w:hAnsi="Calibri"/>
+                <w:sz w:val="18"/>
+              </w:rPr>
+              <w:t xml:space="preserve"> </w:t>
+            </w:r>
+            <w:r>
+              <w:rPr>
+                <w:rFonts w:ascii="Calibri" w:hAnsi="Calibri"/>
+                <w:i/>
+                <w:iCs/>
+                <w:sz w:val="18"/>
+              </w:rPr>
+              <w:t xml:space="preserve">E. tenella</w:t>
+            </w:r>
+            <w:r>
+              <w:rPr>
+                <w:rFonts w:ascii="Calibri" w:hAnsi="Calibri"/>
+                <w:sz w:val="18"/>
+              </w:rPr>
+              <w:t xml:space="preserve">/</w:t>
+            </w:r>
+            <w:r>
+              <w:rPr>
+                <w:rFonts w:ascii="Calibri" w:hAnsi="Calibri"/>
+                <w:i/>
+                <w:iCs/>
+                <w:sz w:val="18"/>
+              </w:rPr>
+              <w:t xml:space="preserve">E. acervulina</w:t>
+            </w:r>
+            <w:r>
+              <w:rPr>
+                <w:rFonts w:ascii="Calibri" w:hAnsi="Calibri"/>
+                <w:sz w:val="18"/>
+              </w:rPr>
+              <w:t xml:space="preserve"> </w:t>
+            </w:r>
+            <w:r>
+              <w:rPr>
+                <w:rFonts w:ascii="Calibri" w:hAnsi="Calibri"/>
+                <w:sz w:val="18"/>
+              </w:rPr>
+              <w:t xml:space="preserve">severity, but not</w:t>
+            </w:r>
+            <w:r>
+              <w:rPr>
+                <w:rFonts w:ascii="Calibri" w:hAnsi="Calibri"/>
+                <w:sz w:val="18"/>
+              </w:rPr>
+              <w:t xml:space="preserve"> </w:t>
+            </w:r>
+            <w:r>
+              <w:rPr>
+                <w:rFonts w:ascii="Calibri" w:hAnsi="Calibri"/>
+                <w:i/>
+                <w:iCs/>
+                <w:sz w:val="18"/>
+              </w:rPr>
+              <w:t xml:space="preserve">E. maxima</w:t>
+            </w:r>
+          </w:p>
+        </w:tc>
+        <w:tc>
+          <w:tcPr>
+            <w:tcW w:w="2400" w:type="dxa"/>
+            <w:tcMar>
+              <w:top w:w="80" w:type="dxa"/>
+              <w:start w:w="120" w:type="dxa"/>
+              <w:bottom w:w="80" w:type="dxa"/>
+              <w:end w:w="120" w:type="dxa"/>
+            </w:tcMar>
+            <w:vAlign w:val="center"/>
+          </w:tcPr>
+          <w:p>
+            <w:pPr>
+              <w:pStyle w:val="Compact"/>
+              <w:spacing w:before="0" w:after="40" w:line="240" w:lineRule="auto"/>
+            </w:pPr>
+            <w:r>
+              <w:rPr>
+                <w:rFonts w:ascii="Calibri" w:hAnsi="Calibri"/>
+                <w:sz w:val="18"/>
+              </w:rPr>
+              <w:t xml:space="preserve">Published veterinary comparator currently retained at preview/abstract resolution; extract composition and artemisinin-alone causality remain unresolved</w:t>
+            </w:r>
+            <w:r>
+              <w:rPr>
+                <w:rFonts w:ascii="Calibri" w:hAnsi="Calibri"/>
+                <w:sz w:val="18"/>
+              </w:rPr>
+              <w:t xml:space="preserve"> </w:t>
+            </w:r>
+            <w:r>
+              <w:rPr>
+                <w:rFonts w:ascii="Calibri" w:hAnsi="Calibri"/>
+                <w:sz w:val="18"/>
+              </w:rPr>
+              <w:t xml:space="preserve">(Arab et al. 2006)</w:t>
+            </w:r>
+          </w:p>
+        </w:tc>
+      </w:tr>
+      <w:tr>
+        <w:trPr>
+          <w:cantSplit w:val="true"/>
+        </w:trPr>
+        <w:tc>
+          <w:tcPr>
+            <w:tcW w:w="1800" w:type="dxa"/>
+            <w:tcMar>
+              <w:top w:w="80" w:type="dxa"/>
+              <w:start w:w="120" w:type="dxa"/>
+              <w:bottom w:w="80" w:type="dxa"/>
+              <w:end w:w="120" w:type="dxa"/>
+            </w:tcMar>
+            <w:vAlign w:val="center"/>
+          </w:tcPr>
+          <w:p>
+            <w:pPr>
+              <w:pStyle w:val="Compact"/>
+              <w:spacing w:before="0" w:after="40" w:line="240" w:lineRule="auto"/>
+            </w:pPr>
+            <w:r>
+              <w:rPr>
+                <w:rFonts w:ascii="Calibri" w:hAnsi="Calibri"/>
+                <w:i/>
+                <w:iCs/>
+                <w:sz w:val="18"/>
+              </w:rPr>
+              <w:t xml:space="preserve">A. maritima</w:t>
+            </w:r>
+            <w:r>
+              <w:rPr>
+                <w:rFonts w:ascii="Calibri" w:hAnsi="Calibri"/>
+                <w:sz w:val="18"/>
+              </w:rPr>
+              <w:t xml:space="preserve"> </w:t>
+            </w:r>
+            <w:r>
+              <w:rPr>
+                <w:rFonts w:ascii="Calibri" w:hAnsi="Calibri"/>
+                <w:sz w:val="18"/>
+              </w:rPr>
+              <w:t xml:space="preserve">/ naturally infected sheep</w:t>
+            </w:r>
+          </w:p>
+        </w:tc>
+        <w:tc>
+          <w:tcPr>
+            <w:tcW w:w="2800" w:type="dxa"/>
+            <w:tcMar>
+              <w:top w:w="80" w:type="dxa"/>
+              <w:start w:w="120" w:type="dxa"/>
+              <w:bottom w:w="80" w:type="dxa"/>
+              <w:end w:w="120" w:type="dxa"/>
+            </w:tcMar>
+            <w:vAlign w:val="center"/>
+          </w:tcPr>
+          <w:p>
+            <w:pPr>
+              <w:pStyle w:val="Compact"/>
+              <w:spacing w:before="0" w:after="40" w:line="240" w:lineRule="auto"/>
+            </w:pPr>
+            <w:r>
+              <w:rPr>
+                <w:rFonts w:ascii="Calibri" w:hAnsi="Calibri"/>
+                <w:sz w:val="18"/>
+              </w:rPr>
+              <w:t xml:space="preserve">Abstract-level 3 g/kg whole-powder treatment produced 70.40% day-21 fecal-egg-count reduction versus 85.81% for fenbendazole</w:t>
+            </w:r>
+          </w:p>
+        </w:tc>
+        <w:tc>
+          <w:tcPr>
+            <w:tcW w:w="2400" w:type="dxa"/>
+            <w:tcMar>
+              <w:top w:w="80" w:type="dxa"/>
+              <w:start w:w="120" w:type="dxa"/>
+              <w:bottom w:w="80" w:type="dxa"/>
+              <w:end w:w="120" w:type="dxa"/>
+            </w:tcMar>
+            <w:vAlign w:val="center"/>
+          </w:tcPr>
+          <w:p>
+            <w:pPr>
+              <w:pStyle w:val="Compact"/>
+              <w:spacing w:before="0" w:after="40" w:line="240" w:lineRule="auto"/>
+            </w:pPr>
+            <w:r>
+              <w:rPr>
+                <w:rFonts w:ascii="Calibri" w:hAnsi="Calibri"/>
+                <w:sz w:val="18"/>
+              </w:rPr>
+              <w:t xml:space="preserve">Related-species comparator, not</w:t>
+            </w:r>
+            <w:r>
+              <w:rPr>
+                <w:rFonts w:ascii="Calibri" w:hAnsi="Calibri"/>
+                <w:sz w:val="18"/>
+              </w:rPr>
+              <w:t xml:space="preserve"> </w:t>
+            </w:r>
+            <w:r>
+              <w:rPr>
+                <w:rFonts w:ascii="Calibri" w:hAnsi="Calibri"/>
+                <w:i/>
+                <w:iCs/>
+                <w:sz w:val="18"/>
+              </w:rPr>
+              <w:t xml:space="preserve">A. absinthium</w:t>
+            </w:r>
+            <w:r>
+              <w:rPr>
+                <w:rFonts w:ascii="Calibri" w:hAnsi="Calibri"/>
+                <w:sz w:val="18"/>
+              </w:rPr>
+              <w:t xml:space="preserve"> </w:t>
+            </w:r>
+            <w:r>
+              <w:rPr>
+                <w:rFonts w:ascii="Calibri" w:hAnsi="Calibri"/>
+                <w:sz w:val="18"/>
+              </w:rPr>
+              <w:t xml:space="preserve">evidence; chemistry, parasite burden, residues, and full-text eligibility remain open</w:t>
+            </w:r>
+            <w:r>
+              <w:rPr>
+                <w:rFonts w:ascii="Calibri" w:hAnsi="Calibri"/>
+                <w:sz w:val="18"/>
+              </w:rPr>
+              <w:t xml:space="preserve"> </w:t>
+            </w:r>
+            <w:r>
+              <w:rPr>
+                <w:rFonts w:ascii="Calibri" w:hAnsi="Calibri"/>
+                <w:sz w:val="18"/>
+              </w:rPr>
+              <w:t xml:space="preserve">(T. Wani et al. 2026)</w:t>
+            </w:r>
+          </w:p>
+        </w:tc>
+      </w:tr>
+    </w:tbl>
     <w:bookmarkEnd w:id="28"/>
     <w:bookmarkEnd w:id="29"/>
     <w:bookmarkStart w:id="36" w:name="safety-and-translation-boundaries"/>
@@ -8921,7 +10668,7 @@
     <w:bookmarkEnd w:id="47"/>
     <w:bookmarkEnd w:id="48"/>
     <w:bookmarkEnd w:id="49"/>
-    <w:bookmarkStart w:id="311" w:name="references"/>
+    <w:bookmarkStart w:id="315" w:name="references"/>
     <w:p>
       <w:pPr>
         <w:pStyle w:val="Heading1"/>
@@ -8931,7 +10678,7 @@
         <w:t xml:space="preserve">References</w:t>
       </w:r>
     </w:p>
-    <w:bookmarkStart w:id="310" w:name="refs"/>
+    <w:bookmarkStart w:id="314" w:name="refs"/>
     <w:bookmarkStart w:id="51" w:name="ref-abad2012artemisia"/>
     <w:p>
       <w:pPr>
@@ -9469,13 +11216,60 @@
       </w:r>
     </w:p>
     <w:bookmarkEnd w:id="67"/>
-    <w:bookmarkStart w:id="69" w:name="ref-arango2024cina"/>
+    <w:bookmarkStart w:id="69" w:name="ref-arab2006sieberi"/>
     <w:p>
       <w:pPr>
         <w:pStyle w:val="Bibliography"/>
         <w:spacing w:before="0" w:after="120" w:line="264" w:lineRule="auto"/>
       </w:pPr>
       <w:r>
+        <w:t xml:space="preserve">Arab, H A, S Rahbari, A Rassouli, M H Moslemi, and F Khosravirad. 2006.</w:t>
+      </w:r>
+      <w:r>
+        <w:t xml:space="preserve"> </w:t>
+      </w:r>
+      <w:r>
+        <w:t xml:space="preserve">“Determination of Artemisinin in Artemisia Sieberi and Anticoccidial Effects of the Plant Extract in Broiler Chickens.”</w:t>
+      </w:r>
+      <w:r>
+        <w:t xml:space="preserve"> </w:t>
+      </w:r>
+      <w:r>
+        <w:rPr>
+          <w:i/>
+          <w:iCs/>
+        </w:rPr>
+        <w:t xml:space="preserve">Tropical Animal Health and Production</w:t>
+      </w:r>
+      <w:r>
+        <w:t xml:space="preserve"> </w:t>
+      </w:r>
+      <w:r>
+        <w:t xml:space="preserve">38 (6): 497–503.</w:t>
+      </w:r>
+      <w:r>
+        <w:t xml:space="preserve"> </w:t>
+      </w:r>
+      <w:hyperlink r:id="rId68">
+        <w:r>
+          <w:rPr>
+            <w:rStyle w:val="Hyperlink"/>
+          </w:rPr>
+          <w:t xml:space="preserve">https://doi.org/10.1007/s11250-006-4390-8</w:t>
+        </w:r>
+      </w:hyperlink>
+      <w:r>
+        <w:t xml:space="preserve">.</w:t>
+      </w:r>
+    </w:p>
+    <w:bookmarkEnd w:id="69"/>
+    <w:bookmarkStart w:id="71" w:name="ref-arango2024cina"/>
+    <w:p>
+      <w:pPr>
+        <w:pStyle w:val="Bibliography"/>
+        <w:spacing w:before="0" w:after="120" w:line="264" w:lineRule="auto"/>
+      </w:pPr>
+      <w:r>
         <w:t xml:space="preserve">Arango-De la Pava, LD, M González-Cortázar, A Zamilpa, JA Cuéllar-Ordaz, HA de la Cruz-Cruz, RI Higuera-Piedrahita, and R López-Arellano. 2024.</w:t>
       </w:r>
       <w:r>
@@ -9503,7 +11297,7 @@
       <w:r>
         <w:t xml:space="preserve"> </w:t>
       </w:r>
-      <w:hyperlink r:id="rId68">
+      <w:hyperlink r:id="rId70">
         <w:r>
           <w:rPr>
             <w:rStyle w:val="Hyperlink"/>
@@ -9515,8 +11309,8 @@
         <w:t xml:space="preserve">.</w:t>
       </w:r>
     </w:p>
-    <w:bookmarkEnd w:id="69"/>
-    <w:bookmarkStart w:id="71" w:name="ref-arango2024peruvin"/>
+    <w:bookmarkEnd w:id="71"/>
+    <w:bookmarkStart w:id="73" w:name="ref-arango2024peruvin"/>
     <w:p>
       <w:pPr>
         <w:pStyle w:val="Bibliography"/>
@@ -9586,7 +11380,7 @@
       <w:r>
         <w:t xml:space="preserve"> </w:t>
       </w:r>
-      <w:hyperlink r:id="rId70">
+      <w:hyperlink r:id="rId72">
         <w:r>
           <w:rPr>
             <w:rStyle w:val="Hyperlink"/>
@@ -9598,8 +11392,8 @@
         <w:t xml:space="preserve">.</w:t>
       </w:r>
     </w:p>
-    <w:bookmarkEnd w:id="71"/>
-    <w:bookmarkStart w:id="73" w:name="ref-ashraf2022hypnozoites"/>
+    <w:bookmarkEnd w:id="73"/>
+    <w:bookmarkStart w:id="75" w:name="ref-ashraf2022hypnozoites"/>
     <w:p>
       <w:pPr>
         <w:pStyle w:val="Bibliography"/>
@@ -9657,7 +11451,7 @@
       <w:r>
         <w:t xml:space="preserve"> </w:t>
       </w:r>
-      <w:hyperlink r:id="rId72">
+      <w:hyperlink r:id="rId74">
         <w:r>
           <w:rPr>
             <w:rStyle w:val="Hyperlink"/>
@@ -9669,8 +11463,8 @@
         <w:t xml:space="preserve">.</w:t>
       </w:r>
     </w:p>
-    <w:bookmarkEnd w:id="73"/>
-    <w:bookmarkStart w:id="75" w:name="ref-aubouy2025annuatea"/>
+    <w:bookmarkEnd w:id="75"/>
+    <w:bookmarkStart w:id="77" w:name="ref-aubouy2025annuatea"/>
     <w:p>
       <w:pPr>
         <w:pStyle w:val="Bibliography"/>
@@ -9716,7 +11510,7 @@
       <w:r>
         <w:t xml:space="preserve"> </w:t>
       </w:r>
-      <w:hyperlink r:id="rId74">
+      <w:hyperlink r:id="rId76">
         <w:r>
           <w:rPr>
             <w:rStyle w:val="Hyperlink"/>
@@ -9728,8 +11522,8 @@
         <w:t xml:space="preserve">.</w:t>
       </w:r>
     </w:p>
-    <w:bookmarkEnd w:id="75"/>
-    <w:bookmarkStart w:id="77" w:name="ref-baies2024absinthium"/>
+    <w:bookmarkEnd w:id="77"/>
+    <w:bookmarkStart w:id="79" w:name="ref-baies2024absinthium"/>
     <w:p>
       <w:pPr>
         <w:pStyle w:val="Bibliography"/>
@@ -9763,7 +11557,7 @@
       <w:r>
         <w:t xml:space="preserve"> </w:t>
       </w:r>
-      <w:hyperlink r:id="rId76">
+      <w:hyperlink r:id="rId78">
         <w:r>
           <w:rPr>
             <w:rStyle w:val="Hyperlink"/>
@@ -9775,8 +11569,8 @@
         <w:t xml:space="preserve">.</w:t>
       </w:r>
     </w:p>
-    <w:bookmarkEnd w:id="77"/>
-    <w:bookmarkStart w:id="79" w:name="ref-baies2022ascariswormwood"/>
+    <w:bookmarkEnd w:id="79"/>
+    <w:bookmarkStart w:id="81" w:name="ref-baies2022ascariswormwood"/>
     <w:p>
       <w:pPr>
         <w:pStyle w:val="Bibliography"/>
@@ -9894,7 +11688,7 @@
       <w:r>
         <w:t xml:space="preserve"> </w:t>
       </w:r>
-      <w:hyperlink r:id="rId78">
+      <w:hyperlink r:id="rId80">
         <w:r>
           <w:rPr>
             <w:rStyle w:val="Hyperlink"/>
@@ -9906,8 +11700,8 @@
         <w:t xml:space="preserve">.</w:t>
       </w:r>
     </w:p>
-    <w:bookmarkEnd w:id="79"/>
-    <w:bookmarkStart w:id="81" w:name="ref-balaich2016parthenin"/>
+    <w:bookmarkEnd w:id="81"/>
+    <w:bookmarkStart w:id="83" w:name="ref-balaich2016parthenin"/>
     <w:p>
       <w:pPr>
         <w:pStyle w:val="Bibliography"/>
@@ -9953,7 +11747,7 @@
       <w:r>
         <w:t xml:space="preserve"> </w:t>
       </w:r>
-      <w:hyperlink r:id="rId80">
+      <w:hyperlink r:id="rId82">
         <w:r>
           <w:rPr>
             <w:rStyle w:val="Hyperlink"/>
@@ -9965,8 +11759,8 @@
         <w:t xml:space="preserve">.</w:t>
       </w:r>
     </w:p>
-    <w:bookmarkEnd w:id="81"/>
-    <w:bookmarkStart w:id="83" w:name="ref-beshay2018absinthiumhymenolepis"/>
+    <w:bookmarkEnd w:id="83"/>
+    <w:bookmarkStart w:id="85" w:name="ref-beshay2018absinthiumhymenolepis"/>
     <w:p>
       <w:pPr>
         <w:pStyle w:val="Bibliography"/>
@@ -10021,7 +11815,7 @@
       <w:r>
         <w:t xml:space="preserve"> </w:t>
       </w:r>
-      <w:hyperlink r:id="rId82">
+      <w:hyperlink r:id="rId84">
         <w:r>
           <w:rPr>
             <w:rStyle w:val="Hyperlink"/>
@@ -10033,8 +11827,8 @@
         <w:t xml:space="preserve">.</w:t>
       </w:r>
     </w:p>
-    <w:bookmarkEnd w:id="83"/>
-    <w:bookmarkStart w:id="85" w:name="ref-blagojevic2015absinthiumstorage"/>
+    <w:bookmarkEnd w:id="85"/>
+    <w:bookmarkStart w:id="87" w:name="ref-blagojevic2015absinthiumstorage"/>
     <w:p>
       <w:pPr>
         <w:pStyle w:val="Bibliography"/>
@@ -10090,7 +11884,7 @@
       <w:r>
         <w:t xml:space="preserve"> </w:t>
       </w:r>
-      <w:hyperlink r:id="rId84">
+      <w:hyperlink r:id="rId86">
         <w:r>
           <w:rPr>
             <w:rStyle w:val="Hyperlink"/>
@@ -10102,8 +11896,8 @@
         <w:t xml:space="preserve">.</w:t>
       </w:r>
     </w:p>
-    <w:bookmarkEnd w:id="85"/>
-    <w:bookmarkStart w:id="87" w:name="ref-bouwmeester1999ads"/>
+    <w:bookmarkEnd w:id="87"/>
+    <w:bookmarkStart w:id="89" w:name="ref-bouwmeester1999ads"/>
     <w:p>
       <w:pPr>
         <w:pStyle w:val="Bibliography"/>
@@ -10137,7 +11931,7 @@
       <w:r>
         <w:t xml:space="preserve"> </w:t>
       </w:r>
-      <w:hyperlink r:id="rId86">
+      <w:hyperlink r:id="rId88">
         <w:r>
           <w:rPr>
             <w:rStyle w:val="Hyperlink"/>
@@ -10149,8 +11943,8 @@
         <w:t xml:space="preserve">.</w:t>
       </w:r>
     </w:p>
-    <w:bookmarkEnd w:id="87"/>
-    <w:bookmarkStart w:id="89" w:name="ref-boyko2025anthelmintic"/>
+    <w:bookmarkEnd w:id="89"/>
+    <w:bookmarkStart w:id="91" w:name="ref-boyko2025anthelmintic"/>
     <w:p>
       <w:pPr>
         <w:pStyle w:val="Bibliography"/>
@@ -10184,7 +11978,7 @@
       <w:r>
         <w:t xml:space="preserve"> </w:t>
       </w:r>
-      <w:hyperlink r:id="rId88">
+      <w:hyperlink r:id="rId90">
         <w:r>
           <w:rPr>
             <w:rStyle w:val="Hyperlink"/>
@@ -10196,8 +11990,8 @@
         <w:t xml:space="preserve">.</w:t>
       </w:r>
     </w:p>
-    <w:bookmarkEnd w:id="89"/>
-    <w:bookmarkStart w:id="91" w:name="ref-brown2003seedterpenoids"/>
+    <w:bookmarkEnd w:id="91"/>
+    <w:bookmarkStart w:id="93" w:name="ref-brown2003seedterpenoids"/>
     <w:p>
       <w:pPr>
         <w:pStyle w:val="Bibliography"/>
@@ -10231,7 +12025,7 @@
       <w:r>
         <w:t xml:space="preserve"> </w:t>
       </w:r>
-      <w:hyperlink r:id="rId90">
+      <w:hyperlink r:id="rId92">
         <w:r>
           <w:rPr>
             <w:rStyle w:val="Hyperlink"/>
@@ -10243,8 +12037,8 @@
         <w:t xml:space="preserve">.</w:t>
       </w:r>
     </w:p>
-    <w:bookmarkEnd w:id="91"/>
-    <w:bookmarkStart w:id="93" w:name="ref-cai2024topdown"/>
+    <w:bookmarkEnd w:id="93"/>
+    <w:bookmarkStart w:id="95" w:name="ref-cai2024topdown"/>
     <w:p>
       <w:pPr>
         <w:pStyle w:val="Bibliography"/>
@@ -10308,7 +12102,7 @@
       <w:r>
         <w:t xml:space="preserve"> </w:t>
       </w:r>
-      <w:hyperlink r:id="rId92">
+      <w:hyperlink r:id="rId94">
         <w:r>
           <w:rPr>
             <w:rStyle w:val="Hyperlink"/>
@@ -10320,8 +12114,8 @@
         <w:t xml:space="preserve">.</w:t>
       </w:r>
     </w:p>
-    <w:bookmarkEnd w:id="93"/>
-    <w:bookmarkStart w:id="95" w:name="ref-cala2014haemonchus"/>
+    <w:bookmarkEnd w:id="95"/>
+    <w:bookmarkStart w:id="97" w:name="ref-cala2014haemonchus"/>
     <w:p>
       <w:pPr>
         <w:pStyle w:val="Bibliography"/>
@@ -10367,7 +12161,7 @@
       <w:r>
         <w:t xml:space="preserve"> </w:t>
       </w:r>
-      <w:hyperlink r:id="rId94">
+      <w:hyperlink r:id="rId96">
         <w:r>
           <w:rPr>
             <w:rStyle w:val="Hyperlink"/>
@@ -10379,8 +12173,8 @@
         <w:t xml:space="preserve">.</w:t>
       </w:r>
     </w:p>
-    <w:bookmarkEnd w:id="95"/>
-    <w:bookmarkStart w:id="97" w:name="ref-caner2008trichinella"/>
+    <w:bookmarkEnd w:id="97"/>
+    <w:bookmarkStart w:id="99" w:name="ref-caner2008trichinella"/>
     <w:p>
       <w:pPr>
         <w:pStyle w:val="Bibliography"/>
@@ -10444,7 +12238,7 @@
       <w:r>
         <w:t xml:space="preserve"> </w:t>
       </w:r>
-      <w:hyperlink r:id="rId96">
+      <w:hyperlink r:id="rId98">
         <w:r>
           <w:rPr>
             <w:rStyle w:val="Hyperlink"/>
@@ -10456,8 +12250,8 @@
         <w:t xml:space="preserve">.</w:t>
       </w:r>
     </w:p>
-    <w:bookmarkEnd w:id="97"/>
-    <w:bookmarkStart w:id="99" w:name="ref-chang2000ads"/>
+    <w:bookmarkEnd w:id="99"/>
+    <w:bookmarkStart w:id="101" w:name="ref-chang2000ads"/>
     <w:p>
       <w:pPr>
         <w:pStyle w:val="Bibliography"/>
@@ -10491,7 +12285,7 @@
       <w:r>
         <w:t xml:space="preserve"> </w:t>
       </w:r>
-      <w:hyperlink r:id="rId98">
+      <w:hyperlink r:id="rId100">
         <w:r>
           <w:rPr>
             <w:rStyle w:val="Hyperlink"/>
@@ -10503,8 +12297,8 @@
         <w:t xml:space="preserve">.</w:t>
       </w:r>
     </w:p>
-    <w:bookmarkEnd w:id="99"/>
-    <w:bookmarkStart w:id="101" w:name="ref-chanphen1998indica"/>
+    <w:bookmarkEnd w:id="101"/>
+    <w:bookmarkStart w:id="103" w:name="ref-chanphen1998indica"/>
     <w:p>
       <w:pPr>
         <w:pStyle w:val="Bibliography"/>
@@ -10538,7 +12332,7 @@
       <w:r>
         <w:t xml:space="preserve"> </w:t>
       </w:r>
-      <w:hyperlink r:id="rId100">
+      <w:hyperlink r:id="rId102">
         <w:r>
           <w:rPr>
             <w:rStyle w:val="Hyperlink"/>
@@ -10550,8 +12344,8 @@
         <w:t xml:space="preserve">.</w:t>
       </w:r>
     </w:p>
-    <w:bookmarkEnd w:id="101"/>
-    <w:bookmarkStart w:id="103" w:name="ref-annua2021diterpenes"/>
+    <w:bookmarkEnd w:id="103"/>
+    <w:bookmarkStart w:id="105" w:name="ref-annua2021diterpenes"/>
     <w:p>
       <w:pPr>
         <w:pStyle w:val="Bibliography"/>
@@ -10585,7 +12379,7 @@
       <w:r>
         <w:t xml:space="preserve"> </w:t>
       </w:r>
-      <w:hyperlink r:id="rId102">
+      <w:hyperlink r:id="rId104">
         <w:r>
           <w:rPr>
             <w:rStyle w:val="Hyperlink"/>
@@ -10597,8 +12391,8 @@
         <w:t xml:space="preserve">.</w:t>
       </w:r>
     </w:p>
-    <w:bookmarkEnd w:id="103"/>
-    <w:bookmarkStart w:id="105" w:name="ref-chiasson2001acaricidal"/>
+    <w:bookmarkEnd w:id="105"/>
+    <w:bookmarkStart w:id="107" w:name="ref-chiasson2001acaricidal"/>
     <w:p>
       <w:pPr>
         <w:pStyle w:val="Bibliography"/>
@@ -10632,7 +12426,7 @@
       <w:r>
         <w:t xml:space="preserve"> </w:t>
       </w:r>
-      <w:hyperlink r:id="rId104">
+      <w:hyperlink r:id="rId106">
         <w:r>
           <w:rPr>
             <w:rStyle w:val="Hyperlink"/>
@@ -10644,8 +12438,8 @@
         <w:t xml:space="preserve">.</w:t>
       </w:r>
     </w:p>
-    <w:bookmarkEnd w:id="105"/>
-    <w:bookmarkStart w:id="107" w:name="ref-czechowski2019wholeleaf"/>
+    <w:bookmarkEnd w:id="107"/>
+    <w:bookmarkStart w:id="109" w:name="ref-czechowski2019wholeleaf"/>
     <w:p>
       <w:pPr>
         <w:pStyle w:val="Bibliography"/>
@@ -10679,7 +12473,7 @@
       <w:r>
         <w:t xml:space="preserve"> </w:t>
       </w:r>
-      <w:hyperlink r:id="rId106">
+      <w:hyperlink r:id="rId108">
         <w:r>
           <w:rPr>
             <w:rStyle w:val="Hyperlink"/>
@@ -10691,8 +12485,8 @@
         <w:t xml:space="preserve">.</w:t>
       </w:r>
     </w:p>
-    <w:bookmarkEnd w:id="107"/>
-    <w:bookmarkStart w:id="109" w:name="ref-elfawal2015wholeplant"/>
+    <w:bookmarkEnd w:id="109"/>
+    <w:bookmarkStart w:id="111" w:name="ref-elfawal2015wholeplant"/>
     <w:p>
       <w:pPr>
         <w:pStyle w:val="Bibliography"/>
@@ -10726,7 +12520,7 @@
       <w:r>
         <w:t xml:space="preserve"> </w:t>
       </w:r>
-      <w:hyperlink r:id="rId108">
+      <w:hyperlink r:id="rId110">
         <w:r>
           <w:rPr>
             <w:rStyle w:val="Hyperlink"/>
@@ -10738,8 +12532,8 @@
         <w:t xml:space="preserve">.</w:t>
       </w:r>
     </w:p>
-    <w:bookmarkEnd w:id="109"/>
-    <w:bookmarkStart w:id="111" w:name="ref-elfawal2012wholeplant"/>
+    <w:bookmarkEnd w:id="111"/>
+    <w:bookmarkStart w:id="113" w:name="ref-elfawal2012wholeplant"/>
     <w:p>
       <w:pPr>
         <w:pStyle w:val="Bibliography"/>
@@ -10785,7 +12579,7 @@
       <w:r>
         <w:t xml:space="preserve"> </w:t>
       </w:r>
-      <w:hyperlink r:id="rId110">
+      <w:hyperlink r:id="rId112">
         <w:r>
           <w:rPr>
             <w:rStyle w:val="Hyperlink"/>
@@ -10797,8 +12591,8 @@
         <w:t xml:space="preserve">.</w:t>
       </w:r>
     </w:p>
-    <w:bookmarkEnd w:id="111"/>
-    <w:bookmarkStart w:id="113" w:name="ref-evlice2026artemisiaoilsnematodes"/>
+    <w:bookmarkEnd w:id="113"/>
+    <w:bookmarkStart w:id="115" w:name="ref-evlice2026artemisiaoilsnematodes"/>
     <w:p>
       <w:pPr>
         <w:pStyle w:val="Bibliography"/>
@@ -10856,7 +12650,7 @@
       <w:r>
         <w:t xml:space="preserve"> </w:t>
       </w:r>
-      <w:hyperlink r:id="rId112">
+      <w:hyperlink r:id="rId114">
         <w:r>
           <w:rPr>
             <w:rStyle w:val="Hyperlink"/>
@@ -10868,8 +12662,8 @@
         <w:t xml:space="preserve">.</w:t>
       </w:r>
     </w:p>
-    <w:bookmarkEnd w:id="113"/>
-    <w:bookmarkStart w:id="115" w:name="ref-ezeta2023ludovicianafasciola"/>
+    <w:bookmarkEnd w:id="115"/>
+    <w:bookmarkStart w:id="117" w:name="ref-ezeta2023ludovicianafasciola"/>
     <w:p>
       <w:pPr>
         <w:pStyle w:val="Bibliography"/>
@@ -10924,7 +12718,7 @@
       <w:r>
         <w:t xml:space="preserve"> </w:t>
       </w:r>
-      <w:hyperlink r:id="rId114">
+      <w:hyperlink r:id="rId116">
         <w:r>
           <w:rPr>
             <w:rStyle w:val="Hyperlink"/>
@@ -10936,8 +12730,8 @@
         <w:t xml:space="preserve">.</w:t>
       </w:r>
     </w:p>
-    <w:bookmarkEnd w:id="115"/>
-    <w:bookmarkStart w:id="117" w:name="ref-fabre2025cadinapyridine"/>
+    <w:bookmarkEnd w:id="117"/>
+    <w:bookmarkStart w:id="119" w:name="ref-fabre2025cadinapyridine"/>
     <w:p>
       <w:pPr>
         <w:pStyle w:val="Bibliography"/>
@@ -10983,7 +12777,7 @@
       <w:r>
         <w:t xml:space="preserve"> </w:t>
       </w:r>
-      <w:hyperlink r:id="rId116">
+      <w:hyperlink r:id="rId118">
         <w:r>
           <w:rPr>
             <w:rStyle w:val="Hyperlink"/>
@@ -10995,8 +12789,8 @@
         <w:t xml:space="preserve">.</w:t>
       </w:r>
     </w:p>
-    <w:bookmarkEnd w:id="117"/>
-    <w:bookmarkStart w:id="119" w:name="ref-ferreira2024hydrotrope"/>
+    <w:bookmarkEnd w:id="119"/>
+    <w:bookmarkStart w:id="121" w:name="ref-ferreira2024hydrotrope"/>
     <w:p>
       <w:pPr>
         <w:pStyle w:val="Bibliography"/>
@@ -11052,7 +12846,7 @@
       <w:r>
         <w:t xml:space="preserve"> </w:t>
       </w:r>
-      <w:hyperlink r:id="rId118">
+      <w:hyperlink r:id="rId120">
         <w:r>
           <w:rPr>
             <w:rStyle w:val="Hyperlink"/>
@@ -11064,8 +12858,8 @@
         <w:t xml:space="preserve">.</w:t>
       </w:r>
     </w:p>
-    <w:bookmarkEnd w:id="119"/>
-    <w:bookmarkStart w:id="121" w:name="ref-fu2017pdr3"/>
+    <w:bookmarkEnd w:id="121"/>
+    <w:bookmarkStart w:id="123" w:name="ref-fu2017pdr3"/>
     <w:p>
       <w:pPr>
         <w:pStyle w:val="Bibliography"/>
@@ -11114,7 +12908,7 @@
       <w:r>
         <w:t xml:space="preserve"> </w:t>
       </w:r>
-      <w:hyperlink r:id="rId120">
+      <w:hyperlink r:id="rId122">
         <w:r>
           <w:rPr>
             <w:rStyle w:val="Hyperlink"/>
@@ -11126,8 +12920,8 @@
         <w:t xml:space="preserve">.</w:t>
       </w:r>
     </w:p>
-    <w:bookmarkEnd w:id="121"/>
-    <w:bookmarkStart w:id="123" w:name="ref-garciarodriguez2015absinthium"/>
+    <w:bookmarkEnd w:id="123"/>
+    <w:bookmarkStart w:id="125" w:name="ref-garciarodriguez2015absinthium"/>
     <w:p>
       <w:pPr>
         <w:pStyle w:val="Bibliography"/>
@@ -11161,7 +12955,7 @@
       <w:r>
         <w:t xml:space="preserve"> </w:t>
       </w:r>
-      <w:hyperlink r:id="rId122">
+      <w:hyperlink r:id="rId124">
         <w:r>
           <w:rPr>
             <w:rStyle w:val="Hyperlink"/>
@@ -11173,8 +12967,8 @@
         <w:t xml:space="preserve">.</w:t>
       </w:r>
     </w:p>
-    <w:bookmarkEnd w:id="123"/>
-    <w:bookmarkStart w:id="125" w:name="ref-gruessner2021complexartemisiaal"/>
+    <w:bookmarkEnd w:id="125"/>
+    <w:bookmarkStart w:id="127" w:name="ref-gruessner2021complexartemisiaal"/>
     <w:p>
       <w:pPr>
         <w:pStyle w:val="Bibliography"/>
@@ -11232,7 +13026,7 @@
       <w:r>
         <w:t xml:space="preserve"> </w:t>
       </w:r>
-      <w:hyperlink r:id="rId124">
+      <w:hyperlink r:id="rId126">
         <w:r>
           <w:rPr>
             <w:rStyle w:val="Hyperlink"/>
@@ -11244,8 +13038,8 @@
         <w:t xml:space="preserve">.</w:t>
       </w:r>
     </w:p>
-    <w:bookmarkEnd w:id="125"/>
-    <w:bookmarkStart w:id="127" w:name="ref-guo2023mir160"/>
+    <w:bookmarkEnd w:id="127"/>
+    <w:bookmarkStart w:id="129" w:name="ref-guo2023mir160"/>
     <w:p>
       <w:pPr>
         <w:pStyle w:val="Bibliography"/>
@@ -11288,7 +13082,7 @@
       <w:r>
         <w:t xml:space="preserve"> </w:t>
       </w:r>
-      <w:hyperlink r:id="rId126">
+      <w:hyperlink r:id="rId128">
         <w:r>
           <w:rPr>
             <w:rStyle w:val="Hyperlink"/>
@@ -11300,8 +13094,8 @@
         <w:t xml:space="preserve">.</w:t>
       </w:r>
     </w:p>
-    <w:bookmarkEnd w:id="127"/>
-    <w:bookmarkStart w:id="129" w:name="ref-guo2025dhaadh"/>
+    <w:bookmarkEnd w:id="129"/>
+    <w:bookmarkStart w:id="131" w:name="ref-guo2025dhaadh"/>
     <w:p>
       <w:pPr>
         <w:pStyle w:val="Bibliography"/>
@@ -11335,7 +13129,7 @@
       <w:r>
         <w:t xml:space="preserve"> </w:t>
       </w:r>
-      <w:hyperlink r:id="rId128">
+      <w:hyperlink r:id="rId130">
         <w:r>
           <w:rPr>
             <w:rStyle w:val="Hyperlink"/>
@@ -11347,8 +13141,8 @@
         <w:t xml:space="preserve">.</w:t>
       </w:r>
     </w:p>
-    <w:bookmarkEnd w:id="129"/>
-    <w:bookmarkStart w:id="131" w:name="ref-hernandez2025cinananoparticles"/>
+    <w:bookmarkEnd w:id="131"/>
+    <w:bookmarkStart w:id="133" w:name="ref-hernandez2025cinananoparticles"/>
     <w:p>
       <w:pPr>
         <w:pStyle w:val="Bibliography"/>
@@ -11403,7 +13197,7 @@
       <w:r>
         <w:t xml:space="preserve"> </w:t>
       </w:r>
-      <w:hyperlink r:id="rId130">
+      <w:hyperlink r:id="rId132">
         <w:r>
           <w:rPr>
             <w:rStyle w:val="Hyperlink"/>
@@ -11415,8 +13209,8 @@
         <w:t xml:space="preserve">.</w:t>
       </w:r>
     </w:p>
-    <w:bookmarkEnd w:id="131"/>
-    <w:bookmarkStart w:id="133" w:name="ref-heydari2013sieberi"/>
+    <w:bookmarkEnd w:id="133"/>
+    <w:bookmarkStart w:id="135" w:name="ref-heydari2013sieberi"/>
     <w:p>
       <w:pPr>
         <w:pStyle w:val="Bibliography"/>
@@ -11471,7 +13265,7 @@
       <w:r>
         <w:t xml:space="preserve"> </w:t>
       </w:r>
-      <w:hyperlink r:id="rId132">
+      <w:hyperlink r:id="rId134">
         <w:r>
           <w:rPr>
             <w:rStyle w:val="Hyperlink"/>
@@ -11483,14 +13277,97 @@
         <w:t xml:space="preserve">.</w:t>
       </w:r>
     </w:p>
-    <w:bookmarkEnd w:id="133"/>
-    <w:bookmarkStart w:id="135" w:name="ref-higuera2023cinalignans"/>
+    <w:bookmarkEnd w:id="135"/>
+    <w:bookmarkStart w:id="137" w:name="ref-higuera2021cina"/>
     <w:p>
       <w:pPr>
         <w:pStyle w:val="Bibliography"/>
         <w:spacing w:before="0" w:after="120" w:line="264" w:lineRule="auto"/>
       </w:pPr>
       <w:r>
+        <w:t xml:space="preserve">Higuera-Piedrahita, RI, M Dolores-Hernández, LG Jiménez-Pérez, BC Camacho-Enríquez, A Zamilpa, R López-Arellano, P Mendoza-de-Gives, JA Cuéllar-Ordaz, and ME López-Arellano. 2021.</w:t>
+      </w:r>
+      <w:r>
+        <w:t xml:space="preserve"> </w:t>
+      </w:r>
+      <w:r>
+        <w:t xml:space="preserve">“In Vitro Nematocidal Effect and Anthelmintic Activity of</w:t>
+      </w:r>
+      <w:r>
+        <w:t xml:space="preserve"> </w:t>
+      </w:r>
+      <w:r>
+        <w:t xml:space="preserve">Artemisia cina</w:t>
+      </w:r>
+      <w:r>
+        <w:t xml:space="preserve"> </w:t>
+      </w:r>
+      <w:r>
+        <w:t xml:space="preserve">Against</w:t>
+      </w:r>
+      <w:r>
+        <w:t xml:space="preserve"> </w:t>
+      </w:r>
+      <w:r>
+        <w:t xml:space="preserve">Haemonchus contortus</w:t>
+      </w:r>
+      <w:r>
+        <w:t xml:space="preserve"> </w:t>
+      </w:r>
+      <w:r>
+        <w:t xml:space="preserve">in Gerbils and Relative Expression of</w:t>
+      </w:r>
+      <w:r>
+        <w:t xml:space="preserve"> </w:t>
+      </w:r>
+      <w:r>
+        <w:t xml:space="preserve">Hc29</w:t>
+      </w:r>
+      <w:r>
+        <w:t xml:space="preserve"> </w:t>
+      </w:r>
+      <w:r>
+        <w:t xml:space="preserve">Gene in Transitional Larvae.”</w:t>
+      </w:r>
+      <w:r>
+        <w:t xml:space="preserve"> </w:t>
+      </w:r>
+      <w:r>
+        <w:rPr>
+          <w:i/>
+          <w:iCs/>
+        </w:rPr>
+        <w:t xml:space="preserve">Acta Parasitologica</w:t>
+      </w:r>
+      <w:r>
+        <w:t xml:space="preserve"> </w:t>
+      </w:r>
+      <w:r>
+        <w:t xml:space="preserve">66 (3): 938–46.</w:t>
+      </w:r>
+      <w:r>
+        <w:t xml:space="preserve"> </w:t>
+      </w:r>
+      <w:hyperlink r:id="rId136">
+        <w:r>
+          <w:rPr>
+            <w:rStyle w:val="Hyperlink"/>
+          </w:rPr>
+          <w:t xml:space="preserve">https://doi.org/10.1007/s11686-021-00364-w</w:t>
+        </w:r>
+      </w:hyperlink>
+      <w:r>
+        <w:t xml:space="preserve">.</w:t>
+      </w:r>
+    </w:p>
+    <w:bookmarkEnd w:id="137"/>
+    <w:bookmarkStart w:id="139" w:name="ref-higuera2023cinalignans"/>
+    <w:p>
+      <w:pPr>
+        <w:pStyle w:val="Bibliography"/>
+        <w:spacing w:before="0" w:after="120" w:line="264" w:lineRule="auto"/>
+      </w:pPr>
+      <w:r>
         <w:t xml:space="preserve">Higuera-Piedrahita, Rosa Isabel, Mariana Dolores-Hernández, Héctor Alejandro de la Cruz-Cruz, Raquel López-Arellano, Pedro Mendoza-de Gives, Agustín Olmedo-Juárez, Jorge Alfredo Cuéllar-Ordaz, et al. 2023.</w:t>
       </w:r>
       <w:r>
@@ -11548,7 +13425,7 @@
       <w:r>
         <w:t xml:space="preserve"> </w:t>
       </w:r>
-      <w:hyperlink r:id="rId134">
+      <w:hyperlink r:id="rId138">
         <w:r>
           <w:rPr>
             <w:rStyle w:val="Hyperlink"/>
@@ -11560,8 +13437,8 @@
         <w:t xml:space="preserve">.</w:t>
       </w:r>
     </w:p>
-    <w:bookmarkEnd w:id="135"/>
-    <w:bookmarkStart w:id="137" w:name="ref-hoshiki2025herbaalbacattle"/>
+    <w:bookmarkEnd w:id="139"/>
+    <w:bookmarkStart w:id="141" w:name="ref-hoshiki2025herbaalbacattle"/>
     <w:p>
       <w:pPr>
         <w:pStyle w:val="Bibliography"/>
@@ -11613,7 +13490,7 @@
       <w:r>
         <w:t xml:space="preserve"> </w:t>
       </w:r>
-      <w:hyperlink r:id="rId136">
+      <w:hyperlink r:id="rId140">
         <w:r>
           <w:rPr>
             <w:rStyle w:val="Hyperlink"/>
@@ -11625,8 +13502,8 @@
         <w:t xml:space="preserve">.</w:t>
       </w:r>
     </w:p>
-    <w:bookmarkEnd w:id="137"/>
-    <w:bookmarkStart w:id="139" w:name="ref-hou2021argyipk"/>
+    <w:bookmarkEnd w:id="141"/>
+    <w:bookmarkStart w:id="143" w:name="ref-hou2021argyipk"/>
     <w:p>
       <w:pPr>
         <w:pStyle w:val="Bibliography"/>
@@ -11672,7 +13549,7 @@
       <w:r>
         <w:t xml:space="preserve"> </w:t>
       </w:r>
-      <w:hyperlink r:id="rId138">
+      <w:hyperlink r:id="rId142">
         <w:r>
           <w:rPr>
             <w:rStyle w:val="Hyperlink"/>
@@ -11684,8 +13561,8 @@
         <w:t xml:space="preserve">.</w:t>
       </w:r>
     </w:p>
-    <w:bookmarkEnd w:id="139"/>
-    <w:bookmarkStart w:id="141" w:name="ref-hussain2024artemisiareview"/>
+    <w:bookmarkEnd w:id="143"/>
+    <w:bookmarkStart w:id="145" w:name="ref-hussain2024artemisiareview"/>
     <w:p>
       <w:pPr>
         <w:pStyle w:val="Bibliography"/>
@@ -11719,7 +13596,7 @@
       <w:r>
         <w:t xml:space="preserve"> </w:t>
       </w:r>
-      <w:hyperlink r:id="rId140">
+      <w:hyperlink r:id="rId144">
         <w:r>
           <w:rPr>
             <w:rStyle w:val="Hyperlink"/>
@@ -11731,8 +13608,8 @@
         <w:t xml:space="preserve">.</w:t>
       </w:r>
     </w:p>
-    <w:bookmarkEnd w:id="141"/>
-    <w:bookmarkStart w:id="143" w:name="ref-hussain2025brevifolia"/>
+    <w:bookmarkEnd w:id="145"/>
+    <w:bookmarkStart w:id="147" w:name="ref-hussain2025brevifolia"/>
     <w:p>
       <w:pPr>
         <w:pStyle w:val="Bibliography"/>
@@ -11766,7 +13643,7 @@
       <w:r>
         <w:t xml:space="preserve"> </w:t>
       </w:r>
-      <w:hyperlink r:id="rId142">
+      <w:hyperlink r:id="rId146">
         <w:r>
           <w:rPr>
             <w:rStyle w:val="Hyperlink"/>
@@ -11778,8 +13655,8 @@
         <w:t xml:space="preserve">.</w:t>
       </w:r>
     </w:p>
-    <w:bookmarkEnd w:id="143"/>
-    <w:bookmarkStart w:id="145" w:name="ref-iqbal2013absinthiumcoccidiosis"/>
+    <w:bookmarkEnd w:id="147"/>
+    <w:bookmarkStart w:id="149" w:name="ref-iqbal2013absinthiumcoccidiosis"/>
     <w:p>
       <w:pPr>
         <w:pStyle w:val="Bibliography"/>
@@ -11822,7 +13699,7 @@
       <w:r>
         <w:t xml:space="preserve"> </w:t>
       </w:r>
-      <w:hyperlink r:id="rId144">
+      <w:hyperlink r:id="rId148">
         <w:r>
           <w:rPr>
             <w:rStyle w:val="Hyperlink"/>
@@ -11834,8 +13711,8 @@
         <w:t xml:space="preserve">.</w:t>
       </w:r>
     </w:p>
-    <w:bookmarkEnd w:id="145"/>
-    <w:bookmarkStart w:id="147" w:name="ref-irehan2026absinthium"/>
+    <w:bookmarkEnd w:id="149"/>
+    <w:bookmarkStart w:id="151" w:name="ref-irehan2026absinthium"/>
     <w:p>
       <w:pPr>
         <w:pStyle w:val="Bibliography"/>
@@ -11869,7 +13746,7 @@
       <w:r>
         <w:t xml:space="preserve"> </w:t>
       </w:r>
-      <w:hyperlink r:id="rId146">
+      <w:hyperlink r:id="rId150">
         <w:r>
           <w:rPr>
             <w:rStyle w:val="Hyperlink"/>
@@ -11881,8 +13758,8 @@
         <w:t xml:space="preserve">.</w:t>
       </w:r>
     </w:p>
-    <w:bookmarkEnd w:id="147"/>
-    <w:bookmarkStart w:id="149" w:name="ref-chandler2015stl"/>
+    <w:bookmarkEnd w:id="151"/>
+    <w:bookmarkStart w:id="153" w:name="ref-chandler2015stl"/>
     <w:p>
       <w:pPr>
         <w:pStyle w:val="Bibliography"/>
@@ -11916,7 +13793,7 @@
       <w:r>
         <w:t xml:space="preserve"> </w:t>
       </w:r>
-      <w:hyperlink r:id="rId148">
+      <w:hyperlink r:id="rId152">
         <w:r>
           <w:rPr>
             <w:rStyle w:val="Hyperlink"/>
@@ -11928,8 +13805,8 @@
         <w:t xml:space="preserve">.</w:t>
       </w:r>
     </w:p>
-    <w:bookmarkEnd w:id="149"/>
-    <w:bookmarkStart w:id="151" w:name="ref-ji2025chrysosplenetin"/>
+    <w:bookmarkEnd w:id="153"/>
+    <w:bookmarkStart w:id="155" w:name="ref-ji2025chrysosplenetin"/>
     <w:p>
       <w:pPr>
         <w:pStyle w:val="Bibliography"/>
@@ -11975,7 +13852,7 @@
       <w:r>
         <w:t xml:space="preserve"> </w:t>
       </w:r>
-      <w:hyperlink r:id="rId150">
+      <w:hyperlink r:id="rId154">
         <w:r>
           <w:rPr>
             <w:rStyle w:val="Hyperlink"/>
@@ -11987,8 +13864,8 @@
         <w:t xml:space="preserve">.</w:t>
       </w:r>
     </w:p>
-    <w:bookmarkEnd w:id="151"/>
-    <w:bookmarkStart w:id="153" w:name="ref-jiang2016wrky1"/>
+    <w:bookmarkEnd w:id="155"/>
+    <w:bookmarkStart w:id="157" w:name="ref-jiang2016wrky1"/>
     <w:p>
       <w:pPr>
         <w:pStyle w:val="Bibliography"/>
@@ -12040,7 +13917,7 @@
       <w:r>
         <w:t xml:space="preserve"> </w:t>
       </w:r>
-      <w:hyperlink r:id="rId152">
+      <w:hyperlink r:id="rId156">
         <w:r>
           <w:rPr>
             <w:rStyle w:val="Hyperlink"/>
@@ -12052,8 +13929,8 @@
         <w:t xml:space="preserve">.</w:t>
       </w:r>
     </w:p>
-    <w:bookmarkEnd w:id="153"/>
-    <w:bookmarkStart w:id="155" w:name="ref-artemisia2025phylogenomics"/>
+    <w:bookmarkEnd w:id="157"/>
+    <w:bookmarkStart w:id="159" w:name="ref-artemisia2025phylogenomics"/>
     <w:p>
       <w:pPr>
         <w:pStyle w:val="Bibliography"/>
@@ -12087,7 +13964,7 @@
       <w:r>
         <w:t xml:space="preserve"> </w:t>
       </w:r>
-      <w:hyperlink r:id="rId154">
+      <w:hyperlink r:id="rId158">
         <w:r>
           <w:rPr>
             <w:rStyle w:val="Hyperlink"/>
@@ -12099,8 +13976,8 @@
         <w:t xml:space="preserve">.</w:t>
       </w:r>
     </w:p>
-    <w:bookmarkEnd w:id="155"/>
-    <w:bookmarkStart w:id="157" w:name="ref-judzentiene2016vulgaris"/>
+    <w:bookmarkEnd w:id="159"/>
+    <w:bookmarkStart w:id="161" w:name="ref-judzentiene2016vulgaris"/>
     <w:p>
       <w:pPr>
         <w:pStyle w:val="Bibliography"/>
@@ -12115,7 +13992,7 @@
       <w:r>
         <w:t xml:space="preserve">“</w:t>
       </w:r>
-      <w:hyperlink r:id="rId156">
+      <w:hyperlink r:id="rId160">
         <w:r>
           <w:rPr>
             <w:rStyle w:val="Hyperlink"/>
@@ -12155,8 +14032,8 @@
         <w:t xml:space="preserve">11 (9): 1353–56.</w:t>
       </w:r>
     </w:p>
-    <w:bookmarkEnd w:id="157"/>
-    <w:bookmarkStart w:id="159" w:name="ref-kane2022cyp450"/>
+    <w:bookmarkEnd w:id="161"/>
+    <w:bookmarkStart w:id="163" w:name="ref-kane2022cyp450"/>
     <w:p>
       <w:pPr>
         <w:pStyle w:val="Bibliography"/>
@@ -12211,7 +14088,7 @@
       <w:r>
         <w:t xml:space="preserve"> </w:t>
       </w:r>
-      <w:hyperlink r:id="rId158">
+      <w:hyperlink r:id="rId162">
         <w:r>
           <w:rPr>
             <w:rStyle w:val="Hyperlink"/>
@@ -12223,8 +14100,8 @@
         <w:t xml:space="preserve">.</w:t>
       </w:r>
     </w:p>
-    <w:bookmarkEnd w:id="159"/>
-    <w:bookmarkStart w:id="161" w:name="ref-khan2015artemisia_nematodes"/>
+    <w:bookmarkEnd w:id="163"/>
+    <w:bookmarkStart w:id="165" w:name="ref-khan2015artemisia_nematodes"/>
     <w:p>
       <w:pPr>
         <w:pStyle w:val="Bibliography"/>
@@ -12239,7 +14116,7 @@
       <w:r>
         <w:t xml:space="preserve">“</w:t>
       </w:r>
-      <w:hyperlink r:id="rId160">
+      <w:hyperlink r:id="rId164">
         <w:r>
           <w:rPr>
             <w:rStyle w:val="Hyperlink"/>
@@ -12291,8 +14168,8 @@
         <w:t xml:space="preserve">32 (2): 257–68.</w:t>
       </w:r>
     </w:p>
-    <w:bookmarkEnd w:id="161"/>
-    <w:bookmarkStart w:id="163" w:name="ref-kunnathattil2025vulgaris"/>
+    <w:bookmarkEnd w:id="165"/>
+    <w:bookmarkStart w:id="167" w:name="ref-kunnathattil2025vulgaris"/>
     <w:p>
       <w:pPr>
         <w:pStyle w:val="Bibliography"/>
@@ -12350,7 +14227,7 @@
       <w:r>
         <w:t xml:space="preserve"> </w:t>
       </w:r>
-      <w:hyperlink r:id="rId162">
+      <w:hyperlink r:id="rId166">
         <w:r>
           <w:rPr>
             <w:rStyle w:val="Hyperlink"/>
@@ -12362,8 +14239,8 @@
         <w:t xml:space="preserve">.</w:t>
       </w:r>
     </w:p>
-    <w:bookmarkEnd w:id="163"/>
-    <w:bookmarkStart w:id="165" w:name="ref-li2018naturalcombination"/>
+    <w:bookmarkEnd w:id="167"/>
+    <w:bookmarkStart w:id="169" w:name="ref-li2018naturalcombination"/>
     <w:p>
       <w:pPr>
         <w:pStyle w:val="Bibliography"/>
@@ -12409,7 +14286,7 @@
       <w:r>
         <w:t xml:space="preserve"> </w:t>
       </w:r>
-      <w:hyperlink r:id="rId164">
+      <w:hyperlink r:id="rId168">
         <w:r>
           <w:rPr>
             <w:rStyle w:val="Hyperlink"/>
@@ -12421,8 +14298,8 @@
         <w:t xml:space="preserve">.</w:t>
       </w:r>
     </w:p>
-    <w:bookmarkEnd w:id="165"/>
-    <w:bookmarkStart w:id="167" w:name="ref-li2008sphaerocephalasaponin"/>
+    <w:bookmarkEnd w:id="169"/>
+    <w:bookmarkStart w:id="171" w:name="ref-li2008sphaerocephalasaponin"/>
     <w:p>
       <w:pPr>
         <w:pStyle w:val="Bibliography"/>
@@ -12465,7 +14342,7 @@
       <w:r>
         <w:t xml:space="preserve"> </w:t>
       </w:r>
-      <w:hyperlink r:id="rId166">
+      <w:hyperlink r:id="rId170">
         <w:r>
           <w:rPr>
             <w:rStyle w:val="Hyperlink"/>
@@ -12477,8 +14354,8 @@
         <w:t xml:space="preserve">.</w:t>
       </w:r>
     </w:p>
-    <w:bookmarkEnd w:id="167"/>
-    <w:bookmarkStart w:id="169" w:name="ref-li1990sacrorumditerpene"/>
+    <w:bookmarkEnd w:id="171"/>
+    <w:bookmarkStart w:id="173" w:name="ref-li1990sacrorumditerpene"/>
     <w:p>
       <w:pPr>
         <w:pStyle w:val="Bibliography"/>
@@ -12521,7 +14398,7 @@
       <w:r>
         <w:t xml:space="preserve"> </w:t>
       </w:r>
-      <w:hyperlink r:id="rId168">
+      <w:hyperlink r:id="rId172">
         <w:r>
           <w:rPr>
             <w:rStyle w:val="Hyperlink"/>
@@ -12533,8 +14410,8 @@
         <w:t xml:space="preserve">.</w:t>
       </w:r>
     </w:p>
-    <w:bookmarkEnd w:id="169"/>
-    <w:bookmarkStart w:id="171" w:name="ref-liu2026osc"/>
+    <w:bookmarkEnd w:id="173"/>
+    <w:bookmarkStart w:id="175" w:name="ref-liu2026osc"/>
     <w:p>
       <w:pPr>
         <w:pStyle w:val="Bibliography"/>
@@ -12580,7 +14457,7 @@
       <w:r>
         <w:t xml:space="preserve"> </w:t>
       </w:r>
-      <w:hyperlink r:id="rId170">
+      <w:hyperlink r:id="rId174">
         <w:r>
           <w:rPr>
             <w:rStyle w:val="Hyperlink"/>
@@ -12592,8 +14469,8 @@
         <w:t xml:space="preserve">.</w:t>
       </w:r>
     </w:p>
-    <w:bookmarkEnd w:id="171"/>
-    <w:bookmarkStart w:id="173" w:name="ref-liu2022vulgaristerpenoids"/>
+    <w:bookmarkEnd w:id="175"/>
+    <w:bookmarkStart w:id="177" w:name="ref-liu2022vulgaristerpenoids"/>
     <w:p>
       <w:pPr>
         <w:pStyle w:val="Bibliography"/>
@@ -12639,7 +14516,7 @@
       <w:r>
         <w:t xml:space="preserve"> </w:t>
       </w:r>
-      <w:hyperlink r:id="rId172">
+      <w:hyperlink r:id="rId176">
         <w:r>
           <w:rPr>
             <w:rStyle w:val="Hyperlink"/>
@@ -12651,8 +14528,8 @@
         <w:t xml:space="preserve">.</w:t>
       </w:r>
     </w:p>
-    <w:bookmarkEnd w:id="173"/>
-    <w:bookmarkStart w:id="175" w:name="ref-lu2013aora"/>
+    <w:bookmarkEnd w:id="177"/>
+    <w:bookmarkStart w:id="179" w:name="ref-lu2013aora"/>
     <w:p>
       <w:pPr>
         <w:pStyle w:val="Bibliography"/>
@@ -12710,7 +14587,7 @@
       <w:r>
         <w:t xml:space="preserve"> </w:t>
       </w:r>
-      <w:hyperlink r:id="rId174">
+      <w:hyperlink r:id="rId178">
         <w:r>
           <w:rPr>
             <w:rStyle w:val="Hyperlink"/>
@@ -12722,8 +14599,8 @@
         <w:t xml:space="preserve">.</w:t>
       </w:r>
     </w:p>
-    <w:bookmarkEnd w:id="175"/>
-    <w:bookmarkStart w:id="177" w:name="ref-lv2016nac1"/>
+    <w:bookmarkEnd w:id="179"/>
+    <w:bookmarkStart w:id="181" w:name="ref-lv2016nac1"/>
     <w:p>
       <w:pPr>
         <w:pStyle w:val="Bibliography"/>
@@ -12784,7 +14661,7 @@
       <w:r>
         <w:t xml:space="preserve"> </w:t>
       </w:r>
-      <w:hyperlink r:id="rId176">
+      <w:hyperlink r:id="rId180">
         <w:r>
           <w:rPr>
             <w:rStyle w:val="Hyperlink"/>
@@ -12796,8 +14673,8 @@
         <w:t xml:space="preserve">.</w:t>
       </w:r>
     </w:p>
-    <w:bookmarkEnd w:id="177"/>
-    <w:bookmarkStart w:id="179" w:name="ref-ma2001caruifolia"/>
+    <w:bookmarkEnd w:id="181"/>
+    <w:bookmarkStart w:id="183" w:name="ref-ma2001caruifolia"/>
     <w:p>
       <w:pPr>
         <w:pStyle w:val="Bibliography"/>
@@ -12831,7 +14708,7 @@
       <w:r>
         <w:t xml:space="preserve"> </w:t>
       </w:r>
-      <w:hyperlink r:id="rId178">
+      <w:hyperlink r:id="rId182">
         <w:r>
           <w:rPr>
             <w:rStyle w:val="Hyperlink"/>
@@ -12843,8 +14720,8 @@
         <w:t xml:space="preserve">.</w:t>
       </w:r>
     </w:p>
-    <w:bookmarkEnd w:id="179"/>
-    <w:bookmarkStart w:id="181" w:name="ref-mamede2025metabolite"/>
+    <w:bookmarkEnd w:id="183"/>
+    <w:bookmarkStart w:id="185" w:name="ref-mamede2025metabolite"/>
     <w:p>
       <w:pPr>
         <w:pStyle w:val="Bibliography"/>
@@ -12911,7 +14788,7 @@
       <w:r>
         <w:t xml:space="preserve"> </w:t>
       </w:r>
-      <w:hyperlink r:id="rId180">
+      <w:hyperlink r:id="rId184">
         <w:r>
           <w:rPr>
             <w:rStyle w:val="Hyperlink"/>
@@ -12923,8 +14800,8 @@
         <w:t xml:space="preserve">.</w:t>
       </w:r>
     </w:p>
-    <w:bookmarkEnd w:id="181"/>
-    <w:bookmarkStart w:id="183" w:name="ref-martinezdiaz2015absinthiumtrypano"/>
+    <w:bookmarkEnd w:id="185"/>
+    <w:bookmarkStart w:id="187" w:name="ref-martinezdiaz2015absinthiumtrypano"/>
     <w:p>
       <w:pPr>
         <w:pStyle w:val="Bibliography"/>
@@ -12958,7 +14835,7 @@
       <w:r>
         <w:t xml:space="preserve"> </w:t>
       </w:r>
-      <w:hyperlink r:id="rId182">
+      <w:hyperlink r:id="rId186">
         <w:r>
           <w:rPr>
             <w:rStyle w:val="Hyperlink"/>
@@ -12970,8 +14847,8 @@
         <w:t xml:space="preserve">.</w:t>
       </w:r>
     </w:p>
-    <w:bookmarkEnd w:id="183"/>
-    <w:bookmarkStart w:id="185" w:name="ref-ming2025argyidrying"/>
+    <w:bookmarkEnd w:id="187"/>
+    <w:bookmarkStart w:id="189" w:name="ref-ming2025argyidrying"/>
     <w:p>
       <w:pPr>
         <w:pStyle w:val="Bibliography"/>
@@ -13014,7 +14891,7 @@
       <w:r>
         <w:t xml:space="preserve"> </w:t>
       </w:r>
-      <w:hyperlink r:id="rId184">
+      <w:hyperlink r:id="rId188">
         <w:r>
           <w:rPr>
             <w:rStyle w:val="Hyperlink"/>
@@ -13026,8 +14903,8 @@
         <w:t xml:space="preserve">.</w:t>
       </w:r>
     </w:p>
-    <w:bookmarkEnd w:id="185"/>
-    <w:bookmarkStart w:id="187" w:name="ref-mohammed2026monospermadrying"/>
+    <w:bookmarkEnd w:id="189"/>
+    <w:bookmarkStart w:id="191" w:name="ref-mohammed2026monospermadrying"/>
     <w:p>
       <w:pPr>
         <w:pStyle w:val="Bibliography"/>
@@ -13080,7 +14957,7 @@
       <w:r>
         <w:t xml:space="preserve"> </w:t>
       </w:r>
-      <w:hyperlink r:id="rId186">
+      <w:hyperlink r:id="rId190">
         <w:r>
           <w:rPr>
             <w:rStyle w:val="Hyperlink"/>
@@ -13092,8 +14969,8 @@
         <w:t xml:space="preserve">.</w:t>
       </w:r>
     </w:p>
-    <w:bookmarkEnd w:id="187"/>
-    <w:bookmarkStart w:id="189" w:name="ref-mojarrab2015extracts"/>
+    <w:bookmarkEnd w:id="191"/>
+    <w:bookmarkStart w:id="193" w:name="ref-mojarrab2015extracts"/>
     <w:p>
       <w:pPr>
         <w:pStyle w:val="Bibliography"/>
@@ -13139,7 +15016,7 @@
       <w:r>
         <w:t xml:space="preserve"> </w:t>
       </w:r>
-      <w:hyperlink r:id="rId188">
+      <w:hyperlink r:id="rId192">
         <w:r>
           <w:rPr>
             <w:rStyle w:val="Hyperlink"/>
@@ -13151,8 +15028,8 @@
         <w:t xml:space="preserve">.</w:t>
       </w:r>
     </w:p>
-    <w:bookmarkEnd w:id="189"/>
-    <w:bookmarkStart w:id="191" w:name="ref-mojarrab2014fractionation"/>
+    <w:bookmarkEnd w:id="193"/>
+    <w:bookmarkStart w:id="195" w:name="ref-mojarrab2014fractionation"/>
     <w:p>
       <w:pPr>
         <w:pStyle w:val="Bibliography"/>
@@ -13210,7 +15087,7 @@
       <w:r>
         <w:t xml:space="preserve"> </w:t>
       </w:r>
-      <w:hyperlink r:id="rId190">
+      <w:hyperlink r:id="rId194">
         <w:r>
           <w:rPr>
             <w:rStyle w:val="Hyperlink"/>
@@ -13222,8 +15099,8 @@
         <w:t xml:space="preserve">.</w:t>
       </w:r>
     </w:p>
-    <w:bookmarkEnd w:id="191"/>
-    <w:bookmarkStart w:id="193" w:name="ref-morua2025standardizedannua"/>
+    <w:bookmarkEnd w:id="195"/>
+    <w:bookmarkStart w:id="197" w:name="ref-morua2025standardizedannua"/>
     <w:p>
       <w:pPr>
         <w:pStyle w:val="Bibliography"/>
@@ -13269,7 +15146,7 @@
       <w:r>
         <w:t xml:space="preserve"> </w:t>
       </w:r>
-      <w:hyperlink r:id="rId192">
+      <w:hyperlink r:id="rId196">
         <w:r>
           <w:rPr>
             <w:rStyle w:val="Hyperlink"/>
@@ -13281,8 +15158,8 @@
         <w:t xml:space="preserve">.</w:t>
       </w:r>
     </w:p>
-    <w:bookmarkEnd w:id="193"/>
-    <w:bookmarkStart w:id="195" w:name="ref-annua2015triterpenes"/>
+    <w:bookmarkEnd w:id="197"/>
+    <w:bookmarkStart w:id="199" w:name="ref-annua2015triterpenes"/>
     <w:p>
       <w:pPr>
         <w:pStyle w:val="Bibliography"/>
@@ -13316,7 +15193,7 @@
       <w:r>
         <w:t xml:space="preserve"> </w:t>
       </w:r>
-      <w:hyperlink r:id="rId194">
+      <w:hyperlink r:id="rId198">
         <w:r>
           <w:rPr>
             <w:rStyle w:val="Hyperlink"/>
@@ -13328,8 +15205,8 @@
         <w:t xml:space="preserve">.</w:t>
       </w:r>
     </w:p>
-    <w:bookmarkEnd w:id="195"/>
-    <w:bookmarkStart w:id="197" w:name="ref-mouton2013artemisininonly"/>
+    <w:bookmarkEnd w:id="199"/>
+    <w:bookmarkStart w:id="201" w:name="ref-mouton2013artemisininonly"/>
     <w:p>
       <w:pPr>
         <w:pStyle w:val="Bibliography"/>
@@ -13375,7 +15252,7 @@
       <w:r>
         <w:t xml:space="preserve"> </w:t>
       </w:r>
-      <w:hyperlink r:id="rId196">
+      <w:hyperlink r:id="rId200">
         <w:r>
           <w:rPr>
             <w:rStyle w:val="Hyperlink"/>
@@ -13387,8 +15264,8 @@
         <w:t xml:space="preserve">.</w:t>
       </w:r>
     </w:p>
-    <w:bookmarkEnd w:id="197"/>
-    <w:bookmarkStart w:id="199" w:name="ref-mravcakova2020wormwood"/>
+    <w:bookmarkEnd w:id="201"/>
+    <w:bookmarkStart w:id="203" w:name="ref-mravcakova2020wormwood"/>
     <w:p>
       <w:pPr>
         <w:pStyle w:val="Bibliography"/>
@@ -13422,7 +15299,7 @@
       <w:r>
         <w:t xml:space="preserve"> </w:t>
       </w:r>
-      <w:hyperlink r:id="rId198">
+      <w:hyperlink r:id="rId202">
         <w:r>
           <w:rPr>
             <w:rStyle w:val="Hyperlink"/>
@@ -13434,8 +15311,8 @@
         <w:t xml:space="preserve">.</w:t>
       </w:r>
     </w:p>
-    <w:bookmarkEnd w:id="199"/>
-    <w:bookmarkStart w:id="201" w:name="ref-nahrevanian2010khorassanica"/>
+    <w:bookmarkEnd w:id="203"/>
+    <w:bookmarkStart w:id="205" w:name="ref-nahrevanian2010khorassanica"/>
     <w:p>
       <w:pPr>
         <w:pStyle w:val="Bibliography"/>
@@ -13469,7 +15346,7 @@
       <w:r>
         <w:t xml:space="preserve"> </w:t>
       </w:r>
-      <w:hyperlink r:id="rId200">
+      <w:hyperlink r:id="rId204">
         <w:r>
           <w:rPr>
             <w:rStyle w:val="Hyperlink"/>
@@ -13481,8 +15358,8 @@
         <w:t xml:space="preserve">.</w:t>
       </w:r>
     </w:p>
-    <w:bookmarkEnd w:id="201"/>
-    <w:bookmarkStart w:id="203" w:name="ref-nahrevanian2012sieberi"/>
+    <w:bookmarkEnd w:id="205"/>
+    <w:bookmarkStart w:id="207" w:name="ref-nahrevanian2012sieberi"/>
     <w:p>
       <w:pPr>
         <w:pStyle w:val="Bibliography"/>
@@ -13516,7 +15393,7 @@
       <w:r>
         <w:t xml:space="preserve"> </w:t>
       </w:r>
-      <w:hyperlink r:id="rId202">
+      <w:hyperlink r:id="rId206">
         <w:r>
           <w:rPr>
             <w:rStyle w:val="Hyperlink"/>
@@ -13528,8 +15405,8 @@
         <w:t xml:space="preserve">.</w:t>
       </w:r>
     </w:p>
-    <w:bookmarkEnd w:id="203"/>
-    <w:bookmarkStart w:id="205" w:name="ref-nomani2022h2s"/>
+    <w:bookmarkEnd w:id="207"/>
+    <w:bookmarkStart w:id="209" w:name="ref-nomani2022h2s"/>
     <w:p>
       <w:pPr>
         <w:pStyle w:val="Bibliography"/>
@@ -13575,7 +15452,7 @@
       <w:r>
         <w:t xml:space="preserve"> </w:t>
       </w:r>
-      <w:hyperlink r:id="rId204">
+      <w:hyperlink r:id="rId208">
         <w:r>
           <w:rPr>
             <w:rStyle w:val="Hyperlink"/>
@@ -13587,8 +15464,8 @@
         <w:t xml:space="preserve">.</w:t>
       </w:r>
     </w:p>
-    <w:bookmarkEnd w:id="205"/>
-    <w:bookmarkStart w:id="207" w:name="ref-nurlaelasari2023vulgarisfasciola"/>
+    <w:bookmarkEnd w:id="209"/>
+    <w:bookmarkStart w:id="211" w:name="ref-nurlaelasari2023vulgarisfasciola"/>
     <w:p>
       <w:pPr>
         <w:pStyle w:val="Bibliography"/>
@@ -13643,7 +15520,7 @@
       <w:r>
         <w:t xml:space="preserve"> </w:t>
       </w:r>
-      <w:hyperlink r:id="rId206">
+      <w:hyperlink r:id="rId210">
         <w:r>
           <w:rPr>
             <w:rStyle w:val="Hyperlink"/>
@@ -13655,8 +15532,8 @@
         <w:t xml:space="preserve">.</w:t>
       </w:r>
     </w:p>
-    <w:bookmarkEnd w:id="207"/>
-    <w:bookmarkStart w:id="209" w:name="ref-olofsson2011tissue"/>
+    <w:bookmarkEnd w:id="211"/>
+    <w:bookmarkStart w:id="213" w:name="ref-olofsson2011tissue"/>
     <w:p>
       <w:pPr>
         <w:pStyle w:val="Bibliography"/>
@@ -13690,7 +15567,7 @@
       <w:r>
         <w:t xml:space="preserve"> </w:t>
       </w:r>
-      <w:hyperlink r:id="rId208">
+      <w:hyperlink r:id="rId212">
         <w:r>
           <w:rPr>
             <w:rStyle w:val="Hyperlink"/>
@@ -13702,8 +15579,8 @@
         <w:t xml:space="preserve">.</w:t>
       </w:r>
     </w:p>
-    <w:bookmarkEnd w:id="209"/>
-    <w:bookmarkStart w:id="211" w:name="ref-olsson2009localization"/>
+    <w:bookmarkEnd w:id="213"/>
+    <w:bookmarkStart w:id="215" w:name="ref-olsson2009localization"/>
     <w:p>
       <w:pPr>
         <w:pStyle w:val="Bibliography"/>
@@ -13737,7 +15614,7 @@
       <w:r>
         <w:t xml:space="preserve"> </w:t>
       </w:r>
-      <w:hyperlink r:id="rId210">
+      <w:hyperlink r:id="rId214">
         <w:r>
           <w:rPr>
             <w:rStyle w:val="Hyperlink"/>
@@ -13749,8 +15626,8 @@
         <w:t xml:space="preserve">.</w:t>
       </w:r>
     </w:p>
-    <w:bookmarkEnd w:id="211"/>
-    <w:bookmarkStart w:id="213" w:name="ref-ortet2008gorgonum"/>
+    <w:bookmarkEnd w:id="215"/>
+    <w:bookmarkStart w:id="217" w:name="ref-ortet2008gorgonum"/>
     <w:p>
       <w:pPr>
         <w:pStyle w:val="Bibliography"/>
@@ -13784,7 +15661,7 @@
       <w:r>
         <w:t xml:space="preserve"> </w:t>
       </w:r>
-      <w:hyperlink r:id="rId212">
+      <w:hyperlink r:id="rId216">
         <w:r>
           <w:rPr>
             <w:rStyle w:val="Hyperlink"/>
@@ -13796,8 +15673,8 @@
         <w:t xml:space="preserve">.</w:t>
       </w:r>
     </w:p>
-    <w:bookmarkEnd w:id="213"/>
-    <w:bookmarkStart w:id="215" w:name="ref-osanloo2022dracunculusnanogel"/>
+    <w:bookmarkEnd w:id="217"/>
+    <w:bookmarkStart w:id="219" w:name="ref-osanloo2022dracunculusnanogel"/>
     <w:p>
       <w:pPr>
         <w:pStyle w:val="Bibliography"/>
@@ -13843,7 +15720,7 @@
       <w:r>
         <w:t xml:space="preserve"> </w:t>
       </w:r>
-      <w:hyperlink r:id="rId214">
+      <w:hyperlink r:id="rId218">
         <w:r>
           <w:rPr>
             <w:rStyle w:val="Hyperlink"/>
@@ -13855,8 +15732,8 @@
         <w:t xml:space="preserve">.</w:t>
       </w:r>
     </w:p>
-    <w:bookmarkEnd w:id="215"/>
-    <w:bookmarkStart w:id="217" w:name="ref-oyedeji2009afra"/>
+    <w:bookmarkEnd w:id="219"/>
+    <w:bookmarkStart w:id="221" w:name="ref-oyedeji2009afra"/>
     <w:p>
       <w:pPr>
         <w:pStyle w:val="Bibliography"/>
@@ -13890,7 +15767,7 @@
       <w:r>
         <w:t xml:space="preserve"> </w:t>
       </w:r>
-      <w:hyperlink r:id="rId216">
+      <w:hyperlink r:id="rId220">
         <w:r>
           <w:rPr>
             <w:rStyle w:val="Hyperlink"/>
@@ -13902,8 +15779,8 @@
         <w:t xml:space="preserve">.</w:t>
       </w:r>
     </w:p>
-    <w:bookmarkEnd w:id="217"/>
-    <w:bookmarkStart w:id="219" w:name="ref-pandey2017artemisiaoils"/>
+    <w:bookmarkEnd w:id="221"/>
+    <w:bookmarkStart w:id="223" w:name="ref-pandey2017artemisiaoils"/>
     <w:p>
       <w:pPr>
         <w:pStyle w:val="Bibliography"/>
@@ -13937,7 +15814,7 @@
       <w:r>
         <w:t xml:space="preserve"> </w:t>
       </w:r>
-      <w:hyperlink r:id="rId218">
+      <w:hyperlink r:id="rId222">
         <w:r>
           <w:rPr>
             <w:rStyle w:val="Hyperlink"/>
@@ -13949,8 +15826,8 @@
         <w:t xml:space="preserve">.</w:t>
       </w:r>
     </w:p>
-    <w:bookmarkEnd w:id="219"/>
-    <w:bookmarkStart w:id="221" w:name="ref-parveen2024scoparia"/>
+    <w:bookmarkEnd w:id="223"/>
+    <w:bookmarkStart w:id="225" w:name="ref-parveen2024scoparia"/>
     <w:p>
       <w:pPr>
         <w:pStyle w:val="Bibliography"/>
@@ -13996,7 +15873,7 @@
       <w:r>
         <w:t xml:space="preserve"> </w:t>
       </w:r>
-      <w:hyperlink r:id="rId220">
+      <w:hyperlink r:id="rId224">
         <w:r>
           <w:rPr>
             <w:rStyle w:val="Hyperlink"/>
@@ -14008,8 +15885,8 @@
         <w:t xml:space="preserve">.</w:t>
       </w:r>
     </w:p>
-    <w:bookmarkEnd w:id="221"/>
-    <w:bookmarkStart w:id="223" w:name="ref-paul2010recurrent"/>
+    <w:bookmarkEnd w:id="225"/>
+    <w:bookmarkStart w:id="227" w:name="ref-paul2010recurrent"/>
     <w:p>
       <w:pPr>
         <w:pStyle w:val="Bibliography"/>
@@ -14055,7 +15932,7 @@
       <w:r>
         <w:t xml:space="preserve"> </w:t>
       </w:r>
-      <w:hyperlink r:id="rId222">
+      <w:hyperlink r:id="rId226">
         <w:r>
           <w:rPr>
             <w:rStyle w:val="Hyperlink"/>
@@ -14067,8 +15944,8 @@
         <w:t xml:space="preserve">.</w:t>
       </w:r>
     </w:p>
-    <w:bookmarkEnd w:id="223"/>
-    <w:bookmarkStart w:id="225" w:name="ref-pirali2011tick"/>
+    <w:bookmarkEnd w:id="227"/>
+    <w:bookmarkStart w:id="229" w:name="ref-pirali2011tick"/>
     <w:p>
       <w:pPr>
         <w:pStyle w:val="Bibliography"/>
@@ -14126,7 +16003,7 @@
       <w:r>
         <w:t xml:space="preserve"> </w:t>
       </w:r>
-      <w:hyperlink r:id="rId224">
+      <w:hyperlink r:id="rId228">
         <w:r>
           <w:rPr>
             <w:rStyle w:val="Hyperlink"/>
@@ -14138,8 +16015,8 @@
         <w:t xml:space="preserve">.</w:t>
       </w:r>
     </w:p>
-    <w:bookmarkEnd w:id="225"/>
-    <w:bookmarkStart w:id="227" w:name="ref-radulovic2013toxic"/>
+    <w:bookmarkEnd w:id="229"/>
+    <w:bookmarkStart w:id="231" w:name="ref-radulovic2013toxic"/>
     <w:p>
       <w:pPr>
         <w:pStyle w:val="Bibliography"/>
@@ -14173,7 +16050,7 @@
       <w:r>
         <w:t xml:space="preserve"> </w:t>
       </w:r>
-      <w:hyperlink r:id="rId226">
+      <w:hyperlink r:id="rId230">
         <w:r>
           <w:rPr>
             <w:rStyle w:val="Hyperlink"/>
@@ -14185,8 +16062,8 @@
         <w:t xml:space="preserve">.</w:t>
       </w:r>
     </w:p>
-    <w:bookmarkEnd w:id="227"/>
-    <w:bookmarkStart w:id="229" w:name="ref-ram1997density"/>
+    <w:bookmarkEnd w:id="231"/>
+    <w:bookmarkStart w:id="233" w:name="ref-ram1997density"/>
     <w:p>
       <w:pPr>
         <w:pStyle w:val="Bibliography"/>
@@ -14232,7 +16109,7 @@
       <w:r>
         <w:t xml:space="preserve"> </w:t>
       </w:r>
-      <w:hyperlink r:id="rId228">
+      <w:hyperlink r:id="rId232">
         <w:r>
           <w:rPr>
             <w:rStyle w:val="Hyperlink"/>
@@ -14244,8 +16121,8 @@
         <w:t xml:space="preserve">.</w:t>
       </w:r>
     </w:p>
-    <w:bookmarkEnd w:id="229"/>
-    <w:bookmarkStart w:id="231" w:name="ref-ribbiso2021heme"/>
+    <w:bookmarkEnd w:id="233"/>
+    <w:bookmarkStart w:id="235" w:name="ref-ribbiso2021heme"/>
     <w:p>
       <w:pPr>
         <w:pStyle w:val="Bibliography"/>
@@ -14291,7 +16168,7 @@
       <w:r>
         <w:t xml:space="preserve"> </w:t>
       </w:r>
-      <w:hyperlink r:id="rId230">
+      <w:hyperlink r:id="rId234">
         <w:r>
           <w:rPr>
             <w:rStyle w:val="Hyperlink"/>
@@ -14303,8 +16180,8 @@
         <w:t xml:space="preserve">.</w:t>
       </w:r>
     </w:p>
-    <w:bookmarkEnd w:id="231"/>
-    <w:bookmarkStart w:id="233" w:name="ref-rosenthal2024proteostasis"/>
+    <w:bookmarkEnd w:id="235"/>
+    <w:bookmarkStart w:id="237" w:name="ref-rosenthal2024proteostasis"/>
     <w:p>
       <w:pPr>
         <w:pStyle w:val="Bibliography"/>
@@ -14347,7 +16224,7 @@
       <w:r>
         <w:t xml:space="preserve"> </w:t>
       </w:r>
-      <w:hyperlink r:id="rId232">
+      <w:hyperlink r:id="rId236">
         <w:r>
           <w:rPr>
             <w:rStyle w:val="Hyperlink"/>
@@ -14359,8 +16236,8 @@
         <w:t xml:space="preserve">.</w:t>
       </w:r>
     </w:p>
-    <w:bookmarkEnd w:id="233"/>
-    <w:bookmarkStart w:id="235" w:name="ref-rostkowska2016silicon"/>
+    <w:bookmarkEnd w:id="237"/>
+    <w:bookmarkStart w:id="239" w:name="ref-rostkowska2016silicon"/>
     <w:p>
       <w:pPr>
         <w:pStyle w:val="Bibliography"/>
@@ -14418,7 +16295,7 @@
       <w:r>
         <w:t xml:space="preserve"> </w:t>
       </w:r>
-      <w:hyperlink r:id="rId234">
+      <w:hyperlink r:id="rId238">
         <w:r>
           <w:rPr>
             <w:rStyle w:val="Hyperlink"/>
@@ -14430,8 +16307,8 @@
         <w:t xml:space="preserve">.</w:t>
       </w:r>
     </w:p>
-    <w:bookmarkEnd w:id="235"/>
-    <w:bookmarkStart w:id="237" w:name="ref-annua2016monoterpenes"/>
+    <w:bookmarkEnd w:id="239"/>
+    <w:bookmarkStart w:id="241" w:name="ref-annua2016monoterpenes"/>
     <w:p>
       <w:pPr>
         <w:pStyle w:val="Bibliography"/>
@@ -14465,7 +16342,7 @@
       <w:r>
         <w:t xml:space="preserve"> </w:t>
       </w:r>
-      <w:hyperlink r:id="rId236">
+      <w:hyperlink r:id="rId240">
         <w:r>
           <w:rPr>
             <w:rStyle w:val="Hyperlink"/>
@@ -14477,8 +16354,8 @@
         <w:t xml:space="preserve">.</w:t>
       </w:r>
     </w:p>
-    <w:bookmarkEnd w:id="237"/>
-    <w:bookmarkStart w:id="239" w:name="ref-said2016vcd"/>
+    <w:bookmarkEnd w:id="241"/>
+    <w:bookmarkStart w:id="243" w:name="ref-said2016vcd"/>
     <w:p>
       <w:pPr>
         <w:pStyle w:val="Bibliography"/>
@@ -14524,7 +16401,7 @@
       <w:r>
         <w:t xml:space="preserve"> </w:t>
       </w:r>
-      <w:hyperlink r:id="rId238">
+      <w:hyperlink r:id="rId242">
         <w:r>
           <w:rPr>
             <w:rStyle w:val="Hyperlink"/>
@@ -14536,8 +16413,8 @@
         <w:t xml:space="preserve">.</w:t>
       </w:r>
     </w:p>
-    <w:bookmarkEnd w:id="239"/>
-    <w:bookmarkStart w:id="241" w:name="ref-sanei2023nanoliposomes"/>
+    <w:bookmarkEnd w:id="243"/>
+    <w:bookmarkStart w:id="245" w:name="ref-sanei2023nanoliposomes"/>
     <w:p>
       <w:pPr>
         <w:pStyle w:val="Bibliography"/>
@@ -14604,7 +16481,7 @@
       <w:r>
         <w:t xml:space="preserve"> </w:t>
       </w:r>
-      <w:hyperlink r:id="rId240">
+      <w:hyperlink r:id="rId244">
         <w:r>
           <w:rPr>
             <w:rStyle w:val="Hyperlink"/>
@@ -14616,8 +16493,8 @@
         <w:t xml:space="preserve">.</w:t>
       </w:r>
     </w:p>
-    <w:bookmarkEnd w:id="241"/>
-    <w:bookmarkStart w:id="243" w:name="ref-schramek2010isotope"/>
+    <w:bookmarkEnd w:id="245"/>
+    <w:bookmarkStart w:id="247" w:name="ref-schramek2010isotope"/>
     <w:p>
       <w:pPr>
         <w:pStyle w:val="Bibliography"/>
@@ -14651,7 +16528,7 @@
       <w:r>
         <w:t xml:space="preserve"> </w:t>
       </w:r>
-      <w:hyperlink r:id="rId242">
+      <w:hyperlink r:id="rId246">
         <w:r>
           <w:rPr>
             <w:rStyle w:val="Hyperlink"/>
@@ -14663,8 +16540,8 @@
         <w:t xml:space="preserve">.</w:t>
       </w:r>
     </w:p>
-    <w:bookmarkEnd w:id="243"/>
-    <w:bookmarkStart w:id="245" w:name="ref-shen2012cypcpr"/>
+    <w:bookmarkEnd w:id="247"/>
+    <w:bookmarkStart w:id="249" w:name="ref-shen2012cypcpr"/>
     <w:p>
       <w:pPr>
         <w:pStyle w:val="Bibliography"/>
@@ -14722,7 +16599,7 @@
       <w:r>
         <w:t xml:space="preserve"> </w:t>
       </w:r>
-      <w:hyperlink r:id="rId244">
+      <w:hyperlink r:id="rId248">
         <w:r>
           <w:rPr>
             <w:rStyle w:val="Hyperlink"/>
@@ -14734,8 +16611,8 @@
         <w:t xml:space="preserve">.</w:t>
       </w:r>
     </w:p>
-    <w:bookmarkEnd w:id="245"/>
-    <w:bookmarkStart w:id="247" w:name="ref-shi2022annuaantimalarialmetabolomics"/>
+    <w:bookmarkEnd w:id="249"/>
+    <w:bookmarkStart w:id="251" w:name="ref-shi2022annuaantimalarialmetabolomics"/>
     <w:p>
       <w:pPr>
         <w:pStyle w:val="Bibliography"/>
@@ -14781,7 +16658,7 @@
       <w:r>
         <w:t xml:space="preserve"> </w:t>
       </w:r>
-      <w:hyperlink r:id="rId246">
+      <w:hyperlink r:id="rId250">
         <w:r>
           <w:rPr>
             <w:rStyle w:val="Hyperlink"/>
@@ -14793,8 +16670,8 @@
         <w:t xml:space="preserve">.</w:t>
       </w:r>
     </w:p>
-    <w:bookmarkEnd w:id="247"/>
-    <w:bookmarkStart w:id="249" w:name="ref-shi2018mixta1"/>
+    <w:bookmarkEnd w:id="251"/>
+    <w:bookmarkStart w:id="253" w:name="ref-shi2018mixta1"/>
     <w:p>
       <w:pPr>
         <w:pStyle w:val="Bibliography"/>
@@ -14849,7 +16726,7 @@
       <w:r>
         <w:t xml:space="preserve"> </w:t>
       </w:r>
-      <w:hyperlink r:id="rId248">
+      <w:hyperlink r:id="rId252">
         <w:r>
           <w:rPr>
             <w:rStyle w:val="Hyperlink"/>
@@ -14861,8 +16738,8 @@
         <w:t xml:space="preserve">.</w:t>
       </w:r>
     </w:p>
-    <w:bookmarkEnd w:id="249"/>
-    <w:bookmarkStart w:id="251" w:name="ref-dasilva2017annuasheep"/>
+    <w:bookmarkEnd w:id="253"/>
+    <w:bookmarkStart w:id="255" w:name="ref-dasilva2017annuasheep"/>
     <w:p>
       <w:pPr>
         <w:pStyle w:val="Bibliography"/>
@@ -14908,7 +16785,7 @@
       <w:r>
         <w:t xml:space="preserve"> </w:t>
       </w:r>
-      <w:hyperlink r:id="rId250">
+      <w:hyperlink r:id="rId254">
         <w:r>
           <w:rPr>
             <w:rStyle w:val="Hyperlink"/>
@@ -14920,8 +16797,8 @@
         <w:t xml:space="preserve">.</w:t>
       </w:r>
     </w:p>
-    <w:bookmarkEnd w:id="251"/>
-    <w:bookmarkStart w:id="253" w:name="ref-snider2021gametocytes"/>
+    <w:bookmarkEnd w:id="255"/>
+    <w:bookmarkStart w:id="257" w:name="ref-snider2021gametocytes"/>
     <w:p>
       <w:pPr>
         <w:pStyle w:val="Bibliography"/>
@@ -14979,7 +16856,7 @@
       <w:r>
         <w:t xml:space="preserve"> </w:t>
       </w:r>
-      <w:hyperlink r:id="rId252">
+      <w:hyperlink r:id="rId256">
         <w:r>
           <w:rPr>
             <w:rStyle w:val="Hyperlink"/>
@@ -14991,8 +16868,8 @@
         <w:t xml:space="preserve">.</w:t>
       </w:r>
     </w:p>
-    <w:bookmarkEnd w:id="253"/>
-    <w:bookmarkStart w:id="255" w:name="ref-soleimanifard2023kermanensis"/>
+    <w:bookmarkEnd w:id="257"/>
+    <w:bookmarkStart w:id="259" w:name="ref-soleimanifard2023kermanensis"/>
     <w:p>
       <w:pPr>
         <w:pStyle w:val="Bibliography"/>
@@ -15038,7 +16915,7 @@
       <w:r>
         <w:t xml:space="preserve"> </w:t>
       </w:r>
-      <w:hyperlink r:id="rId254">
+      <w:hyperlink r:id="rId258">
         <w:r>
           <w:rPr>
             <w:rStyle w:val="Hyperlink"/>
@@ -15050,8 +16927,8 @@
         <w:t xml:space="preserve">.</w:t>
       </w:r>
     </w:p>
-    <w:bookmarkEnd w:id="255"/>
-    <w:bookmarkStart w:id="257" w:name="ref-squires2011haemonchus"/>
+    <w:bookmarkEnd w:id="259"/>
+    <w:bookmarkStart w:id="261" w:name="ref-squires2011haemonchus"/>
     <w:p>
       <w:pPr>
         <w:pStyle w:val="Bibliography"/>
@@ -15085,7 +16962,7 @@
       <w:r>
         <w:t xml:space="preserve"> </w:t>
       </w:r>
-      <w:hyperlink r:id="rId256">
+      <w:hyperlink r:id="rId260">
         <w:r>
           <w:rPr>
             <w:rStyle w:val="Hyperlink"/>
@@ -15097,8 +16974,8 @@
         <w:t xml:space="preserve">.</w:t>
       </w:r>
     </w:p>
-    <w:bookmarkEnd w:id="257"/>
-    <w:bookmarkStart w:id="259" w:name="ref-tabari2017sieberi"/>
+    <w:bookmarkEnd w:id="261"/>
+    <w:bookmarkStart w:id="263" w:name="ref-tabari2017sieberi"/>
     <w:p>
       <w:pPr>
         <w:pStyle w:val="Bibliography"/>
@@ -15132,7 +17009,7 @@
       <w:r>
         <w:t xml:space="preserve"> </w:t>
       </w:r>
-      <w:hyperlink r:id="rId258">
+      <w:hyperlink r:id="rId262">
         <w:r>
           <w:rPr>
             <w:rStyle w:val="Hyperlink"/>
@@ -15144,8 +17021,8 @@
         <w:t xml:space="preserve">.</w:t>
       </w:r>
     </w:p>
-    <w:bookmarkEnd w:id="259"/>
-    <w:bookmarkStart w:id="261" w:name="ref-tamargo2017nanocochleate"/>
+    <w:bookmarkEnd w:id="263"/>
+    <w:bookmarkStart w:id="265" w:name="ref-tamargo2017nanocochleate"/>
     <w:p>
       <w:pPr>
         <w:pStyle w:val="Bibliography"/>
@@ -15179,7 +17056,7 @@
       <w:r>
         <w:t xml:space="preserve"> </w:t>
       </w:r>
-      <w:hyperlink r:id="rId260">
+      <w:hyperlink r:id="rId264">
         <w:r>
           <w:rPr>
             <w:rStyle w:val="Hyperlink"/>
@@ -15191,8 +17068,8 @@
         <w:t xml:space="preserve">.</w:t>
       </w:r>
     </w:p>
-    <w:bookmarkEnd w:id="261"/>
-    <w:bookmarkStart w:id="263" w:name="ref-tangnitipong2012heme"/>
+    <w:bookmarkEnd w:id="265"/>
+    <w:bookmarkStart w:id="267" w:name="ref-tangnitipong2012heme"/>
     <w:p>
       <w:pPr>
         <w:pStyle w:val="Bibliography"/>
@@ -15226,7 +17103,7 @@
       <w:r>
         <w:t xml:space="preserve"> </w:t>
       </w:r>
-      <w:hyperlink r:id="rId262">
+      <w:hyperlink r:id="rId266">
         <w:r>
           <w:rPr>
             <w:rStyle w:val="Hyperlink"/>
@@ -15238,8 +17115,8 @@
         <w:t xml:space="preserve">.</w:t>
       </w:r>
     </w:p>
-    <w:bookmarkEnd w:id="263"/>
-    <w:bookmarkStart w:id="265" w:name="ref-tariq2009absinthium"/>
+    <w:bookmarkEnd w:id="267"/>
+    <w:bookmarkStart w:id="269" w:name="ref-tariq2009absinthium"/>
     <w:p>
       <w:pPr>
         <w:pStyle w:val="Bibliography"/>
@@ -15273,7 +17150,7 @@
       <w:r>
         <w:t xml:space="preserve"> </w:t>
       </w:r>
-      <w:hyperlink r:id="rId264">
+      <w:hyperlink r:id="rId268">
         <w:r>
           <w:rPr>
             <w:rStyle w:val="Hyperlink"/>
@@ -15285,8 +17162,8 @@
         <w:t xml:space="preserve">.</w:t>
       </w:r>
     </w:p>
-    <w:bookmarkEnd w:id="265"/>
-    <w:bookmarkStart w:id="267" w:name="ref-teoh2006cyp"/>
+    <w:bookmarkEnd w:id="269"/>
+    <w:bookmarkStart w:id="271" w:name="ref-teoh2006cyp"/>
     <w:p>
       <w:pPr>
         <w:pStyle w:val="Bibliography"/>
@@ -15320,7 +17197,7 @@
       <w:r>
         <w:t xml:space="preserve"> </w:t>
       </w:r>
-      <w:hyperlink r:id="rId266">
+      <w:hyperlink r:id="rId270">
         <w:r>
           <w:rPr>
             <w:rStyle w:val="Hyperlink"/>
@@ -15332,8 +17209,8 @@
         <w:t xml:space="preserve">.</w:t>
       </w:r>
     </w:p>
-    <w:bookmarkEnd w:id="267"/>
-    <w:bookmarkStart w:id="269" w:name="ref-trendafilova2021edibleartemisia"/>
+    <w:bookmarkEnd w:id="271"/>
+    <w:bookmarkStart w:id="273" w:name="ref-trendafilova2021edibleartemisia"/>
     <w:p>
       <w:pPr>
         <w:pStyle w:val="Bibliography"/>
@@ -15367,7 +17244,7 @@
       <w:r>
         <w:t xml:space="preserve"> </w:t>
       </w:r>
-      <w:hyperlink r:id="rId268">
+      <w:hyperlink r:id="rId272">
         <w:r>
           <w:rPr>
             <w:rStyle w:val="Hyperlink"/>
@@ -15379,8 +17256,8 @@
         <w:t xml:space="preserve">.</w:t>
       </w:r>
     </w:p>
-    <w:bookmarkEnd w:id="269"/>
-    <w:bookmarkStart w:id="271" w:name="ref-umaraliev2025persicabisabolanes"/>
+    <w:bookmarkEnd w:id="273"/>
+    <w:bookmarkStart w:id="275" w:name="ref-umaraliev2025persicabisabolanes"/>
     <w:p>
       <w:pPr>
         <w:pStyle w:val="Bibliography"/>
@@ -15420,7 +17297,7 @@
       <w:r>
         <w:t xml:space="preserve"> </w:t>
       </w:r>
-      <w:hyperlink r:id="rId270">
+      <w:hyperlink r:id="rId274">
         <w:r>
           <w:rPr>
             <w:rStyle w:val="Hyperlink"/>
@@ -15432,8 +17309,8 @@
         <w:t xml:space="preserve">.</w:t>
       </w:r>
     </w:p>
-    <w:bookmarkEnd w:id="271"/>
-    <w:bookmarkStart w:id="273" w:name="ref-umaraliev2026persicamonoterpenes"/>
+    <w:bookmarkEnd w:id="275"/>
+    <w:bookmarkStart w:id="277" w:name="ref-umaraliev2026persicamonoterpenes"/>
     <w:p>
       <w:pPr>
         <w:pStyle w:val="Bibliography"/>
@@ -15473,7 +17350,7 @@
       <w:r>
         <w:t xml:space="preserve"> </w:t>
       </w:r>
-      <w:hyperlink r:id="rId272">
+      <w:hyperlink r:id="rId276">
         <w:r>
           <w:rPr>
             <w:rStyle w:val="Hyperlink"/>
@@ -15485,8 +17362,8 @@
         <w:t xml:space="preserve">.</w:t>
       </w:r>
     </w:p>
-    <w:bookmarkEnd w:id="273"/>
-    <w:bookmarkStart w:id="275" w:name="ref-urban2020trpc3"/>
+    <w:bookmarkEnd w:id="277"/>
+    <w:bookmarkStart w:id="279" w:name="ref-urban2020trpc3"/>
     <w:p>
       <w:pPr>
         <w:pStyle w:val="Bibliography"/>
@@ -15532,7 +17409,7 @@
       <w:r>
         <w:t xml:space="preserve"> </w:t>
       </w:r>
-      <w:hyperlink r:id="rId274">
+      <w:hyperlink r:id="rId278">
         <w:r>
           <w:rPr>
             <w:rStyle w:val="Hyperlink"/>
@@ -15544,8 +17421,8 @@
         <w:t xml:space="preserve">.</w:t>
       </w:r>
     </w:p>
-    <w:bookmarkEnd w:id="275"/>
-    <w:bookmarkStart w:id="277" w:name="ref-varadyova2018medicinalplants"/>
+    <w:bookmarkEnd w:id="279"/>
+    <w:bookmarkStart w:id="281" w:name="ref-varadyova2018medicinalplants"/>
     <w:p>
       <w:pPr>
         <w:pStyle w:val="Bibliography"/>
@@ -15588,7 +17465,7 @@
       <w:r>
         <w:t xml:space="preserve"> </w:t>
       </w:r>
-      <w:hyperlink r:id="rId276">
+      <w:hyperlink r:id="rId280">
         <w:r>
           <w:rPr>
             <w:rStyle w:val="Hyperlink"/>
@@ -15600,8 +17477,8 @@
         <w:t xml:space="preserve">.</w:t>
       </w:r>
     </w:p>
-    <w:bookmarkEnd w:id="277"/>
-    <w:bookmarkStart w:id="279" w:name="ref-walz2024aframalaria"/>
+    <w:bookmarkEnd w:id="281"/>
+    <w:bookmarkStart w:id="283" w:name="ref-walz2024aframalaria"/>
     <w:p>
       <w:pPr>
         <w:pStyle w:val="Bibliography"/>
@@ -15647,7 +17524,7 @@
       <w:r>
         <w:t xml:space="preserve"> </w:t>
       </w:r>
-      <w:hyperlink r:id="rId278">
+      <w:hyperlink r:id="rId282">
         <w:r>
           <w:rPr>
             <w:rStyle w:val="Hyperlink"/>
@@ -15659,8 +17536,8 @@
         <w:t xml:space="preserve">.</w:t>
       </w:r>
     </w:p>
-    <w:bookmarkEnd w:id="279"/>
-    <w:bookmarkStart w:id="281" w:name="ref-wang2013cyp71av1promoter"/>
+    <w:bookmarkEnd w:id="283"/>
+    <w:bookmarkStart w:id="285" w:name="ref-wang2013cyp71av1promoter"/>
     <w:p>
       <w:pPr>
         <w:pStyle w:val="Bibliography"/>
@@ -15694,7 +17571,7 @@
       <w:r>
         <w:t xml:space="preserve"> </w:t>
       </w:r>
-      <w:hyperlink r:id="rId280">
+      <w:hyperlink r:id="rId284">
         <w:r>
           <w:rPr>
             <w:rStyle w:val="Hyperlink"/>
@@ -15706,8 +17583,8 @@
         <w:t xml:space="preserve">.</w:t>
       </w:r>
     </w:p>
-    <w:bookmarkEnd w:id="281"/>
-    <w:bookmarkStart w:id="283" w:name="ref-wang2009trichometranscriptome"/>
+    <w:bookmarkEnd w:id="285"/>
+    <w:bookmarkStart w:id="287" w:name="ref-wang2009trichometranscriptome"/>
     <w:p>
       <w:pPr>
         <w:pStyle w:val="Bibliography"/>
@@ -15741,7 +17618,7 @@
       <w:r>
         <w:t xml:space="preserve"> </w:t>
       </w:r>
-      <w:hyperlink r:id="rId282">
+      <w:hyperlink r:id="rId286">
         <w:r>
           <w:rPr>
             <w:rStyle w:val="Hyperlink"/>
@@ -15753,8 +17630,8 @@
         <w:t xml:space="preserve">.</w:t>
       </w:r>
     </w:p>
-    <w:bookmarkEnd w:id="283"/>
-    <w:bookmarkStart w:id="285" w:name="ref-wani2023nitric"/>
+    <w:bookmarkEnd w:id="287"/>
+    <w:bookmarkStart w:id="289" w:name="ref-wani2023nitric"/>
     <w:p>
       <w:pPr>
         <w:pStyle w:val="Bibliography"/>
@@ -15812,7 +17689,7 @@
       <w:r>
         <w:t xml:space="preserve"> </w:t>
       </w:r>
-      <w:hyperlink r:id="rId284">
+      <w:hyperlink r:id="rId288">
         <w:r>
           <w:rPr>
             <w:rStyle w:val="Hyperlink"/>
@@ -15824,8 +17701,8 @@
         <w:t xml:space="preserve">.</w:t>
       </w:r>
     </w:p>
-    <w:bookmarkEnd w:id="285"/>
-    <w:bookmarkStart w:id="287" w:name="ref-wani2026maritima"/>
+    <w:bookmarkEnd w:id="289"/>
+    <w:bookmarkStart w:id="291" w:name="ref-wani2026maritima"/>
     <w:p>
       <w:pPr>
         <w:pStyle w:val="Bibliography"/>
@@ -15871,7 +17748,7 @@
       <w:r>
         <w:t xml:space="preserve"> </w:t>
       </w:r>
-      <w:hyperlink r:id="rId286">
+      <w:hyperlink r:id="rId290">
         <w:r>
           <w:rPr>
             <w:rStyle w:val="Hyperlink"/>
@@ -15883,8 +17760,8 @@
         <w:t xml:space="preserve">.</w:t>
       </w:r>
     </w:p>
-    <w:bookmarkEnd w:id="287"/>
-    <w:bookmarkStart w:id="289" w:name="ref-wetmore2019psiv9"/>
+    <w:bookmarkEnd w:id="291"/>
+    <w:bookmarkStart w:id="293" w:name="ref-wetmore2019psiv9"/>
     <w:p>
       <w:pPr>
         <w:pStyle w:val="Bibliography"/>
@@ -15930,7 +17807,7 @@
       <w:r>
         <w:t xml:space="preserve"> </w:t>
       </w:r>
-      <w:hyperlink r:id="rId288">
+      <w:hyperlink r:id="rId292">
         <w:r>
           <w:rPr>
             <w:rStyle w:val="Hyperlink"/>
@@ -15942,8 +17819,8 @@
         <w:t xml:space="preserve">.</w:t>
       </w:r>
     </w:p>
-    <w:bookmarkEnd w:id="289"/>
-    <w:bookmarkStart w:id="291" w:name="ref-wright2010qinghao"/>
+    <w:bookmarkEnd w:id="293"/>
+    <w:bookmarkStart w:id="295" w:name="ref-wright2010qinghao"/>
     <w:p>
       <w:pPr>
         <w:pStyle w:val="Bibliography"/>
@@ -15989,7 +17866,7 @@
       <w:r>
         <w:t xml:space="preserve"> </w:t>
       </w:r>
-      <w:hyperlink r:id="rId290">
+      <w:hyperlink r:id="rId294">
         <w:r>
           <w:rPr>
             <w:rStyle w:val="Hyperlink"/>
@@ -16001,8 +17878,8 @@
         <w:t xml:space="preserve">.</w:t>
       </w:r>
     </w:p>
-    <w:bookmarkEnd w:id="291"/>
-    <w:bookmarkStart w:id="293" w:name="ref-xiang2019bhlh112"/>
+    <w:bookmarkEnd w:id="295"/>
+    <w:bookmarkStart w:id="297" w:name="ref-xiang2019bhlh112"/>
     <w:p>
       <w:pPr>
         <w:pStyle w:val="Bibliography"/>
@@ -16036,7 +17913,7 @@
       <w:r>
         <w:t xml:space="preserve"> </w:t>
       </w:r>
-      <w:hyperlink r:id="rId292">
+      <w:hyperlink r:id="rId296">
         <w:r>
           <w:rPr>
             <w:rStyle w:val="Hyperlink"/>
@@ -16048,8 +17925,8 @@
         <w:t xml:space="preserve">.</w:t>
       </w:r>
     </w:p>
-    <w:bookmarkEnd w:id="293"/>
-    <w:bookmarkStart w:id="295" w:name="ref-xu2025plantmatrix"/>
+    <w:bookmarkEnd w:id="297"/>
+    <w:bookmarkStart w:id="299" w:name="ref-xu2025plantmatrix"/>
     <w:p>
       <w:pPr>
         <w:pStyle w:val="Bibliography"/>
@@ -16095,7 +17972,7 @@
       <w:r>
         <w:t xml:space="preserve"> </w:t>
       </w:r>
-      <w:hyperlink r:id="rId294">
+      <w:hyperlink r:id="rId298">
         <w:r>
           <w:rPr>
             <w:rStyle w:val="Hyperlink"/>
@@ -16107,8 +17984,8 @@
         <w:t xml:space="preserve">.</w:t>
       </w:r>
     </w:p>
-    <w:bookmarkEnd w:id="295"/>
-    <w:bookmarkStart w:id="297" w:name="ref-yildiz2011toxocara"/>
+    <w:bookmarkEnd w:id="299"/>
+    <w:bookmarkStart w:id="301" w:name="ref-yildiz2011toxocara"/>
     <w:p>
       <w:pPr>
         <w:pStyle w:val="Bibliography"/>
@@ -16166,7 +18043,7 @@
       <w:r>
         <w:t xml:space="preserve"> </w:t>
       </w:r>
-      <w:hyperlink r:id="rId296">
+      <w:hyperlink r:id="rId300">
         <w:r>
           <w:rPr>
             <w:rStyle w:val="Hyperlink"/>
@@ -16178,8 +18055,8 @@
         <w:t xml:space="preserve">.</w:t>
       </w:r>
     </w:p>
-    <w:bookmarkEnd w:id="297"/>
-    <w:bookmarkStart w:id="299" w:name="ref-zehra2020copper"/>
+    <w:bookmarkEnd w:id="301"/>
+    <w:bookmarkStart w:id="303" w:name="ref-zehra2020copper"/>
     <w:p>
       <w:pPr>
         <w:pStyle w:val="Bibliography"/>
@@ -16225,7 +18102,7 @@
       <w:r>
         <w:t xml:space="preserve"> </w:t>
       </w:r>
-      <w:hyperlink r:id="rId298">
+      <w:hyperlink r:id="rId302">
         <w:r>
           <w:rPr>
             <w:rStyle w:val="Hyperlink"/>
@@ -16237,8 +18114,8 @@
         <w:t xml:space="preserve">.</w:t>
       </w:r>
     </w:p>
-    <w:bookmarkEnd w:id="299"/>
-    <w:bookmarkStart w:id="301" w:name="ref-zhang2022fiveartemisia"/>
+    <w:bookmarkEnd w:id="303"/>
+    <w:bookmarkStart w:id="305" w:name="ref-zhang2022fiveartemisia"/>
     <w:p>
       <w:pPr>
         <w:pStyle w:val="Bibliography"/>
@@ -16284,7 +18161,7 @@
       <w:r>
         <w:t xml:space="preserve"> </w:t>
       </w:r>
-      <w:hyperlink r:id="rId300">
+      <w:hyperlink r:id="rId304">
         <w:r>
           <w:rPr>
             <w:rStyle w:val="Hyperlink"/>
@@ -16296,8 +18173,8 @@
         <w:t xml:space="preserve">.</w:t>
       </w:r>
     </w:p>
-    <w:bookmarkEnd w:id="301"/>
-    <w:bookmarkStart w:id="303" w:name="ref-zhang2020argyitriterpenoids"/>
+    <w:bookmarkEnd w:id="305"/>
+    <w:bookmarkStart w:id="307" w:name="ref-zhang2020argyitriterpenoids"/>
     <w:p>
       <w:pPr>
         <w:pStyle w:val="Bibliography"/>
@@ -16340,7 +18217,7 @@
       <w:r>
         <w:t xml:space="preserve"> </w:t>
       </w:r>
-      <w:hyperlink r:id="rId302">
+      <w:hyperlink r:id="rId306">
         <w:r>
           <w:rPr>
             <w:rStyle w:val="Hyperlink"/>
@@ -16352,8 +18229,8 @@
         <w:t xml:space="preserve">.</w:t>
       </w:r>
     </w:p>
-    <w:bookmarkEnd w:id="303"/>
-    <w:bookmarkStart w:id="305" w:name="ref-zhang2019pp2c1"/>
+    <w:bookmarkEnd w:id="307"/>
+    <w:bookmarkStart w:id="309" w:name="ref-zhang2019pp2c1"/>
     <w:p>
       <w:pPr>
         <w:pStyle w:val="Bibliography"/>
@@ -16405,7 +18282,7 @@
       <w:r>
         <w:t xml:space="preserve"> </w:t>
       </w:r>
-      <w:hyperlink r:id="rId304">
+      <w:hyperlink r:id="rId308">
         <w:r>
           <w:rPr>
             <w:rStyle w:val="Hyperlink"/>
@@ -16417,8 +18294,8 @@
         <w:t xml:space="preserve">.</w:t>
       </w:r>
     </w:p>
-    <w:bookmarkEnd w:id="305"/>
-    <w:bookmarkStart w:id="307" w:name="ref-zhang2008dbr2"/>
+    <w:bookmarkEnd w:id="309"/>
+    <w:bookmarkStart w:id="311" w:name="ref-zhang2008dbr2"/>
     <w:p>
       <w:pPr>
         <w:pStyle w:val="Bibliography"/>
@@ -16452,7 +18329,7 @@
       <w:r>
         <w:t xml:space="preserve"> </w:t>
       </w:r>
-      <w:hyperlink r:id="rId306">
+      <w:hyperlink r:id="rId310">
         <w:r>
           <w:rPr>
             <w:rStyle w:val="Hyperlink"/>
@@ -16464,8 +18341,8 @@
         <w:t xml:space="preserve">.</w:t>
       </w:r>
     </w:p>
-    <w:bookmarkEnd w:id="307"/>
-    <w:bookmarkStart w:id="309" w:name="ref-frigida2023variability"/>
+    <w:bookmarkEnd w:id="311"/>
+    <w:bookmarkStart w:id="313" w:name="ref-frigida2023variability"/>
     <w:p>
       <w:pPr>
         <w:pStyle w:val="Bibliography"/>
@@ -16499,7 +18376,7 @@
       <w:r>
         <w:t xml:space="preserve"> </w:t>
       </w:r>
-      <w:hyperlink r:id="rId308">
+      <w:hyperlink r:id="rId312">
         <w:r>
           <w:rPr>
             <w:rStyle w:val="Hyperlink"/>
@@ -16511,9 +18388,9 @@
         <w:t xml:space="preserve">.</w:t>
       </w:r>
     </w:p>
-    <w:bookmarkEnd w:id="309"/>
-    <w:bookmarkEnd w:id="310"/>
-    <w:bookmarkEnd w:id="311"/>
+    <w:bookmarkEnd w:id="313"/>
+    <w:bookmarkEnd w:id="314"/>
+    <w:bookmarkEnd w:id="315"/>
     <w:sectPr>
       <w:headerReference w:type="default" r:id="rId9"/>
       <w:footerReference w:type="default" r:id="rId10"/>

</xml_diff>

<commit_message>
Verify Cuban wormwood oil antiparasitic study
</commit_message>
<xml_diff>
--- a/manuscript/artemisia-terpene-review-submission.docx
+++ b/manuscript/artemisia-terpene-review-submission.docx
@@ -199,7 +199,7 @@
         <w:t xml:space="preserve"> </w:t>
       </w:r>
       <w:r>
-        <w:t xml:space="preserve">contains volatile monoterpenes and sesquiterpenes, less volatile diterpenes and triterpenes, and structurally diverse sesquiterpene lactones (STLs). These metabolites are often discussed as though a species name, a pathway gene, or an oil profile were sufficient to predict pharmacology. Here we present a source-auditable living scoping review that instead treats the specimen, accession, tissue, preparation, analytical method, parasite stage, and evidence level as the units of comparison. The Terpedia package registers 538 sources, 553 source-linked evidence records, 129 antiparasitic records, 19 parasite–protein interaction records, 179 compound/specimen records, and 400 audited article claims; 79 sources and 94 linked evidence rows have completed full-text verification, while 31 queue sources remain open. We synthesize terpene classes with biosynthetic compartmentalization, regulatory and environmental variation, and a bounded comparative-genomics analysis. Artemisinin biosynthesis in</w:t>
+        <w:t xml:space="preserve">contains volatile monoterpenes and sesquiterpenes, less volatile diterpenes and triterpenes, and structurally diverse sesquiterpene lactones (STLs). These metabolites are often discussed as though a species name, a pathway gene, or an oil profile were sufficient to predict pharmacology. Here we present a source-auditable living scoping review that instead treats the specimen, accession, tissue, preparation, analytical method, parasite stage, and evidence level as the units of comparison. The Terpedia package registers 538 sources, 553 source-linked evidence records, 129 antiparasitic records, 19 parasite–protein interaction records, 179 compound/specimen records, and 401 audited article claims; 80 sources and 95 linked evidence rows have completed full-text verification, while 30 queue sources remain open. We synthesize terpene classes with biosynthetic compartmentalization, regulatory and environmental variation, and a bounded comparative-genomics analysis. Artemisinin biosynthesis in</w:t>
       </w:r>
       <w:r>
         <w:t xml:space="preserve"> </w:t>
@@ -452,7 +452,7 @@
         <w:spacing w:before="0" w:after="120" w:line="264" w:lineRule="auto"/>
       </w:pPr>
       <w:r>
-        <w:t xml:space="preserve">The package is deliberately a living scoping review rather than a completed systematic review. It contains 1,408 bounded title/abstract decisions, covering all 1,387 priority-queue records plus 21 historical or out-of-queue decisions. Full-text verification now covers 79 publicly accessible or publisher-full-text antiparasitic sources and 94 linked evidence rows; 31 queue sources remain unverified, and no result is pooled as a final quantitative estimate. The PRISMA-ScR mapping is archived in</w:t>
+        <w:t xml:space="preserve">The package is deliberately a living scoping review rather than a completed systematic review. It contains 1,408 bounded title/abstract decisions, covering all 1,387 priority-queue records plus 21 historical or out-of-queue decisions. Full-text verification now covers 80 publicly accessible or publisher-full-text antiparasitic sources and 95 linked evidence rows; 30 queue sources remain unverified, and no result is pooled as a final quantitative estimate. The PRISMA-ScR mapping is archived in</w:t>
       </w:r>
       <w:r>
         <w:t xml:space="preserve"> </w:t>
@@ -7729,6 +7729,40 @@
       <w:r>
         <w:t xml:space="preserve">.</w:t>
       </w:r>
+    </w:p>
+    <w:p>
+      <w:pPr>
+        <w:pStyle w:val="BodyText"/>
+        <w:spacing w:before="0" w:after="120" w:line="264" w:lineRule="auto"/>
+      </w:pPr>
+      <w:r>
+        <w:t xml:space="preserve">Full-text verification of a Cuban</w:t>
+      </w:r>
+      <w:r>
+        <w:t xml:space="preserve"> </w:t>
+      </w:r>
+      <w:r>
+        <w:rPr>
+          <w:i/>
+          <w:iCs/>
+        </w:rPr>
+        <w:t xml:space="preserve">A. absinthium</w:t>
+      </w:r>
+      <w:r>
+        <w:t xml:space="preserve"> </w:t>
+      </w:r>
+      <w:r>
+        <w:t xml:space="preserve">oil study adds a chemically profiled, intracellular-stage and animal antileishmanial anchor. Voucher ROIG 4640 leaves yielded a hydrodistilled oil whose GC–MS profile contained 18 components; trans-sabinyl acetate was 36.7%, while 35.9% remained unidentified. The oil produced promastigote and intracellular-amastigote IC50 values of 14.4 +/- 3.6 and 13.4 +/- 2.4 microgram/mL, respectively, with macrophage CC50 75.1 +/- 2.3 microgram/mL (reported SI 6). In BALB/c mice, five intralesional 30 mg/kg doses reduced lesion size and parasite burden, but the oil was not fractionated, systemic exposure was not measured, and no individual constituent was established as causal</w:t>
+      </w:r>
+      <w:r>
+        <w:t xml:space="preserve"> </w:t>
+      </w:r>
+      <w:r>
+        <w:t xml:space="preserve">(Monzote et al. 2014)</w:t>
+      </w:r>
+      <w:r>
+        <w:t xml:space="preserve">. This is antileishmanial mixture evidence, not proof of gastrointestinal vermifuge activity or oral human efficacy.</w:t>
+      </w:r>
       <w:r>
         <w:t xml:space="preserve"> </w:t>
       </w:r>
@@ -9919,6 +9953,132 @@
                 <w:sz w:val="18"/>
               </w:rPr>
               <w:t xml:space="preserve">(T. Wani et al. 2026)</w:t>
+            </w:r>
+          </w:p>
+        </w:tc>
+      </w:tr>
+      <w:tr>
+        <w:trPr>
+          <w:cantSplit w:val="true"/>
+        </w:trPr>
+        <w:tc>
+          <w:tcPr>
+            <w:tcW w:w="1800" w:type="dxa"/>
+            <w:tcMar>
+              <w:top w:w="80" w:type="dxa"/>
+              <w:start w:w="120" w:type="dxa"/>
+              <w:bottom w:w="80" w:type="dxa"/>
+              <w:end w:w="120" w:type="dxa"/>
+            </w:tcMar>
+            <w:vAlign w:val="center"/>
+          </w:tcPr>
+          <w:p>
+            <w:pPr>
+              <w:pStyle w:val="Compact"/>
+              <w:spacing w:before="0" w:after="40" w:line="240" w:lineRule="auto"/>
+            </w:pPr>
+            <w:r>
+              <w:rPr>
+                <w:rFonts w:ascii="Calibri" w:hAnsi="Calibri"/>
+                <w:i/>
+                <w:iCs/>
+                <w:sz w:val="18"/>
+              </w:rPr>
+              <w:t xml:space="preserve">A. absinthium</w:t>
+            </w:r>
+            <w:r>
+              <w:rPr>
+                <w:rFonts w:ascii="Calibri" w:hAnsi="Calibri"/>
+                <w:sz w:val="18"/>
+              </w:rPr>
+              <w:t xml:space="preserve"> </w:t>
+            </w:r>
+            <w:r>
+              <w:rPr>
+                <w:rFonts w:ascii="Calibri" w:hAnsi="Calibri"/>
+                <w:sz w:val="18"/>
+              </w:rPr>
+              <w:t xml:space="preserve">oil /</w:t>
+            </w:r>
+            <w:r>
+              <w:rPr>
+                <w:rFonts w:ascii="Calibri" w:hAnsi="Calibri"/>
+                <w:sz w:val="18"/>
+              </w:rPr>
+              <w:t xml:space="preserve"> </w:t>
+            </w:r>
+            <w:r>
+              <w:rPr>
+                <w:rFonts w:ascii="Calibri" w:hAnsi="Calibri"/>
+                <w:i/>
+                <w:iCs/>
+                <w:sz w:val="18"/>
+              </w:rPr>
+              <w:t xml:space="preserve">L. amazonensis</w:t>
+            </w:r>
+          </w:p>
+        </w:tc>
+        <w:tc>
+          <w:tcPr>
+            <w:tcW w:w="2800" w:type="dxa"/>
+            <w:tcMar>
+              <w:top w:w="80" w:type="dxa"/>
+              <w:start w:w="120" w:type="dxa"/>
+              <w:bottom w:w="80" w:type="dxa"/>
+              <w:end w:w="120" w:type="dxa"/>
+            </w:tcMar>
+            <w:vAlign w:val="center"/>
+          </w:tcPr>
+          <w:p>
+            <w:pPr>
+              <w:pStyle w:val="Compact"/>
+              <w:spacing w:before="0" w:after="40" w:line="240" w:lineRule="auto"/>
+            </w:pPr>
+            <w:r>
+              <w:rPr>
+                <w:rFonts w:ascii="Calibri" w:hAnsi="Calibri"/>
+                <w:sz w:val="18"/>
+              </w:rPr>
+              <w:t xml:space="preserve">Cuban voucher-linked hydrodistilled oil produced promastigote and intracellular-amastigote IC50 values of 14.4 and 13.4 microgram/mL, macrophage CC50 75.1 microgram/mL, and reduced lesions and parasite burden after intralesional dosing in mice</w:t>
+            </w:r>
+          </w:p>
+        </w:tc>
+        <w:tc>
+          <w:tcPr>
+            <w:tcW w:w="2400" w:type="dxa"/>
+            <w:tcMar>
+              <w:top w:w="80" w:type="dxa"/>
+              <w:start w:w="120" w:type="dxa"/>
+              <w:bottom w:w="80" w:type="dxa"/>
+              <w:end w:w="120" w:type="dxa"/>
+            </w:tcMar>
+            <w:vAlign w:val="center"/>
+          </w:tcPr>
+          <w:p>
+            <w:pPr>
+              <w:pStyle w:val="Compact"/>
+              <w:spacing w:before="0" w:after="40" w:line="240" w:lineRule="auto"/>
+            </w:pPr>
+            <w:r>
+              <w:rPr>
+                <w:rFonts w:ascii="Calibri" w:hAnsi="Calibri"/>
+                <w:sz w:val="18"/>
+              </w:rPr>
+              <w:t xml:space="preserve">Chemically profiled mixture with trans-sabinyl acetate as a marker; no fractionation, causal constituent, oral exposure, or gastrointestinal vermifuge endpoint</w:t>
+            </w:r>
+            <w:r>
+              <w:rPr>
+                <w:rFonts w:ascii="Calibri" w:hAnsi="Calibri"/>
+                <w:sz w:val="18"/>
+              </w:rPr>
+              <w:t xml:space="preserve"> </w:t>
+            </w:r>
+            <w:r>
+              <w:rPr>
+                <w:rFonts w:ascii="Calibri" w:hAnsi="Calibri"/>
+                <w:sz w:val="18"/>
+              </w:rPr>
+              <w:t xml:space="preserve">(Monzote et al. 2014)</w:t>
             </w:r>
           </w:p>
         </w:tc>
@@ -10668,7 +10828,7 @@
     <w:bookmarkEnd w:id="47"/>
     <w:bookmarkEnd w:id="48"/>
     <w:bookmarkEnd w:id="49"/>
-    <w:bookmarkStart w:id="315" w:name="references"/>
+    <w:bookmarkStart w:id="317" w:name="references"/>
     <w:p>
       <w:pPr>
         <w:pStyle w:val="Heading1"/>
@@ -10678,7 +10838,7 @@
         <w:t xml:space="preserve">References</w:t>
       </w:r>
     </w:p>
-    <w:bookmarkStart w:id="314" w:name="refs"/>
+    <w:bookmarkStart w:id="316" w:name="refs"/>
     <w:bookmarkStart w:id="51" w:name="ref-abad2012artemisia"/>
     <w:p>
       <w:pPr>
@@ -15100,13 +15260,60 @@
       </w:r>
     </w:p>
     <w:bookmarkEnd w:id="195"/>
-    <w:bookmarkStart w:id="197" w:name="ref-morua2025standardizedannua"/>
+    <w:bookmarkStart w:id="197" w:name="ref-monzote2014absinthium"/>
     <w:p>
       <w:pPr>
         <w:pStyle w:val="Bibliography"/>
         <w:spacing w:before="0" w:after="120" w:line="264" w:lineRule="auto"/>
       </w:pPr>
       <w:r>
+        <w:t xml:space="preserve">Monzote, L, A Pinon, R Sculli, and W N Setzer. 2014.</w:t>
+      </w:r>
+      <w:r>
+        <w:t xml:space="preserve"> </w:t>
+      </w:r>
+      <w:r>
+        <w:t xml:space="preserve">“Chemistry and Leishmanicidal Activity of the Essential Oil from Artemisia Absinthium from Cuba.”</w:t>
+      </w:r>
+      <w:r>
+        <w:t xml:space="preserve"> </w:t>
+      </w:r>
+      <w:r>
+        <w:rPr>
+          <w:i/>
+          <w:iCs/>
+        </w:rPr>
+        <w:t xml:space="preserve">Natural Product Communications</w:t>
+      </w:r>
+      <w:r>
+        <w:t xml:space="preserve"> </w:t>
+      </w:r>
+      <w:r>
+        <w:t xml:space="preserve">9 (12): 1799–1804.</w:t>
+      </w:r>
+      <w:r>
+        <w:t xml:space="preserve"> </w:t>
+      </w:r>
+      <w:hyperlink r:id="rId196">
+        <w:r>
+          <w:rPr>
+            <w:rStyle w:val="Hyperlink"/>
+          </w:rPr>
+          <w:t xml:space="preserve">https://pubmed.ncbi.nlm.nih.gov/25632489/</w:t>
+        </w:r>
+      </w:hyperlink>
+      <w:r>
+        <w:t xml:space="preserve">.</w:t>
+      </w:r>
+    </w:p>
+    <w:bookmarkEnd w:id="197"/>
+    <w:bookmarkStart w:id="199" w:name="ref-morua2025standardizedannua"/>
+    <w:p>
+      <w:pPr>
+        <w:pStyle w:val="Bibliography"/>
+        <w:spacing w:before="0" w:after="120" w:line="264" w:lineRule="auto"/>
+      </w:pPr>
+      <w:r>
         <w:t xml:space="preserve">Morua, E, L Cuyas, CJ Bethencourt-Estrella, A López-Arencibia, M Garrido Martínez, A Sañudo Otero, J Lorenzo-Morales, et al. 2025.</w:t>
       </w:r>
       <w:r>
@@ -15146,7 +15353,7 @@
       <w:r>
         <w:t xml:space="preserve"> </w:t>
       </w:r>
-      <w:hyperlink r:id="rId196">
+      <w:hyperlink r:id="rId198">
         <w:r>
           <w:rPr>
             <w:rStyle w:val="Hyperlink"/>
@@ -15158,8 +15365,8 @@
         <w:t xml:space="preserve">.</w:t>
       </w:r>
     </w:p>
-    <w:bookmarkEnd w:id="197"/>
-    <w:bookmarkStart w:id="199" w:name="ref-annua2015triterpenes"/>
+    <w:bookmarkEnd w:id="199"/>
+    <w:bookmarkStart w:id="201" w:name="ref-annua2015triterpenes"/>
     <w:p>
       <w:pPr>
         <w:pStyle w:val="Bibliography"/>
@@ -15193,7 +15400,7 @@
       <w:r>
         <w:t xml:space="preserve"> </w:t>
       </w:r>
-      <w:hyperlink r:id="rId198">
+      <w:hyperlink r:id="rId200">
         <w:r>
           <w:rPr>
             <w:rStyle w:val="Hyperlink"/>
@@ -15205,8 +15412,8 @@
         <w:t xml:space="preserve">.</w:t>
       </w:r>
     </w:p>
-    <w:bookmarkEnd w:id="199"/>
-    <w:bookmarkStart w:id="201" w:name="ref-mouton2013artemisininonly"/>
+    <w:bookmarkEnd w:id="201"/>
+    <w:bookmarkStart w:id="203" w:name="ref-mouton2013artemisininonly"/>
     <w:p>
       <w:pPr>
         <w:pStyle w:val="Bibliography"/>
@@ -15252,7 +15459,7 @@
       <w:r>
         <w:t xml:space="preserve"> </w:t>
       </w:r>
-      <w:hyperlink r:id="rId200">
+      <w:hyperlink r:id="rId202">
         <w:r>
           <w:rPr>
             <w:rStyle w:val="Hyperlink"/>
@@ -15264,8 +15471,8 @@
         <w:t xml:space="preserve">.</w:t>
       </w:r>
     </w:p>
-    <w:bookmarkEnd w:id="201"/>
-    <w:bookmarkStart w:id="203" w:name="ref-mravcakova2020wormwood"/>
+    <w:bookmarkEnd w:id="203"/>
+    <w:bookmarkStart w:id="205" w:name="ref-mravcakova2020wormwood"/>
     <w:p>
       <w:pPr>
         <w:pStyle w:val="Bibliography"/>
@@ -15299,7 +15506,7 @@
       <w:r>
         <w:t xml:space="preserve"> </w:t>
       </w:r>
-      <w:hyperlink r:id="rId202">
+      <w:hyperlink r:id="rId204">
         <w:r>
           <w:rPr>
             <w:rStyle w:val="Hyperlink"/>
@@ -15311,8 +15518,8 @@
         <w:t xml:space="preserve">.</w:t>
       </w:r>
     </w:p>
-    <w:bookmarkEnd w:id="203"/>
-    <w:bookmarkStart w:id="205" w:name="ref-nahrevanian2010khorassanica"/>
+    <w:bookmarkEnd w:id="205"/>
+    <w:bookmarkStart w:id="207" w:name="ref-nahrevanian2010khorassanica"/>
     <w:p>
       <w:pPr>
         <w:pStyle w:val="Bibliography"/>
@@ -15346,7 +15553,7 @@
       <w:r>
         <w:t xml:space="preserve"> </w:t>
       </w:r>
-      <w:hyperlink r:id="rId204">
+      <w:hyperlink r:id="rId206">
         <w:r>
           <w:rPr>
             <w:rStyle w:val="Hyperlink"/>
@@ -15358,8 +15565,8 @@
         <w:t xml:space="preserve">.</w:t>
       </w:r>
     </w:p>
-    <w:bookmarkEnd w:id="205"/>
-    <w:bookmarkStart w:id="207" w:name="ref-nahrevanian2012sieberi"/>
+    <w:bookmarkEnd w:id="207"/>
+    <w:bookmarkStart w:id="209" w:name="ref-nahrevanian2012sieberi"/>
     <w:p>
       <w:pPr>
         <w:pStyle w:val="Bibliography"/>
@@ -15393,7 +15600,7 @@
       <w:r>
         <w:t xml:space="preserve"> </w:t>
       </w:r>
-      <w:hyperlink r:id="rId206">
+      <w:hyperlink r:id="rId208">
         <w:r>
           <w:rPr>
             <w:rStyle w:val="Hyperlink"/>
@@ -15405,8 +15612,8 @@
         <w:t xml:space="preserve">.</w:t>
       </w:r>
     </w:p>
-    <w:bookmarkEnd w:id="207"/>
-    <w:bookmarkStart w:id="209" w:name="ref-nomani2022h2s"/>
+    <w:bookmarkEnd w:id="209"/>
+    <w:bookmarkStart w:id="211" w:name="ref-nomani2022h2s"/>
     <w:p>
       <w:pPr>
         <w:pStyle w:val="Bibliography"/>
@@ -15452,7 +15659,7 @@
       <w:r>
         <w:t xml:space="preserve"> </w:t>
       </w:r>
-      <w:hyperlink r:id="rId208">
+      <w:hyperlink r:id="rId210">
         <w:r>
           <w:rPr>
             <w:rStyle w:val="Hyperlink"/>
@@ -15464,8 +15671,8 @@
         <w:t xml:space="preserve">.</w:t>
       </w:r>
     </w:p>
-    <w:bookmarkEnd w:id="209"/>
-    <w:bookmarkStart w:id="211" w:name="ref-nurlaelasari2023vulgarisfasciola"/>
+    <w:bookmarkEnd w:id="211"/>
+    <w:bookmarkStart w:id="213" w:name="ref-nurlaelasari2023vulgarisfasciola"/>
     <w:p>
       <w:pPr>
         <w:pStyle w:val="Bibliography"/>
@@ -15520,7 +15727,7 @@
       <w:r>
         <w:t xml:space="preserve"> </w:t>
       </w:r>
-      <w:hyperlink r:id="rId210">
+      <w:hyperlink r:id="rId212">
         <w:r>
           <w:rPr>
             <w:rStyle w:val="Hyperlink"/>
@@ -15532,8 +15739,8 @@
         <w:t xml:space="preserve">.</w:t>
       </w:r>
     </w:p>
-    <w:bookmarkEnd w:id="211"/>
-    <w:bookmarkStart w:id="213" w:name="ref-olofsson2011tissue"/>
+    <w:bookmarkEnd w:id="213"/>
+    <w:bookmarkStart w:id="215" w:name="ref-olofsson2011tissue"/>
     <w:p>
       <w:pPr>
         <w:pStyle w:val="Bibliography"/>
@@ -15567,7 +15774,7 @@
       <w:r>
         <w:t xml:space="preserve"> </w:t>
       </w:r>
-      <w:hyperlink r:id="rId212">
+      <w:hyperlink r:id="rId214">
         <w:r>
           <w:rPr>
             <w:rStyle w:val="Hyperlink"/>
@@ -15579,8 +15786,8 @@
         <w:t xml:space="preserve">.</w:t>
       </w:r>
     </w:p>
-    <w:bookmarkEnd w:id="213"/>
-    <w:bookmarkStart w:id="215" w:name="ref-olsson2009localization"/>
+    <w:bookmarkEnd w:id="215"/>
+    <w:bookmarkStart w:id="217" w:name="ref-olsson2009localization"/>
     <w:p>
       <w:pPr>
         <w:pStyle w:val="Bibliography"/>
@@ -15614,7 +15821,7 @@
       <w:r>
         <w:t xml:space="preserve"> </w:t>
       </w:r>
-      <w:hyperlink r:id="rId214">
+      <w:hyperlink r:id="rId216">
         <w:r>
           <w:rPr>
             <w:rStyle w:val="Hyperlink"/>
@@ -15626,8 +15833,8 @@
         <w:t xml:space="preserve">.</w:t>
       </w:r>
     </w:p>
-    <w:bookmarkEnd w:id="215"/>
-    <w:bookmarkStart w:id="217" w:name="ref-ortet2008gorgonum"/>
+    <w:bookmarkEnd w:id="217"/>
+    <w:bookmarkStart w:id="219" w:name="ref-ortet2008gorgonum"/>
     <w:p>
       <w:pPr>
         <w:pStyle w:val="Bibliography"/>
@@ -15661,7 +15868,7 @@
       <w:r>
         <w:t xml:space="preserve"> </w:t>
       </w:r>
-      <w:hyperlink r:id="rId216">
+      <w:hyperlink r:id="rId218">
         <w:r>
           <w:rPr>
             <w:rStyle w:val="Hyperlink"/>
@@ -15673,8 +15880,8 @@
         <w:t xml:space="preserve">.</w:t>
       </w:r>
     </w:p>
-    <w:bookmarkEnd w:id="217"/>
-    <w:bookmarkStart w:id="219" w:name="ref-osanloo2022dracunculusnanogel"/>
+    <w:bookmarkEnd w:id="219"/>
+    <w:bookmarkStart w:id="221" w:name="ref-osanloo2022dracunculusnanogel"/>
     <w:p>
       <w:pPr>
         <w:pStyle w:val="Bibliography"/>
@@ -15720,7 +15927,7 @@
       <w:r>
         <w:t xml:space="preserve"> </w:t>
       </w:r>
-      <w:hyperlink r:id="rId218">
+      <w:hyperlink r:id="rId220">
         <w:r>
           <w:rPr>
             <w:rStyle w:val="Hyperlink"/>
@@ -15732,8 +15939,8 @@
         <w:t xml:space="preserve">.</w:t>
       </w:r>
     </w:p>
-    <w:bookmarkEnd w:id="219"/>
-    <w:bookmarkStart w:id="221" w:name="ref-oyedeji2009afra"/>
+    <w:bookmarkEnd w:id="221"/>
+    <w:bookmarkStart w:id="223" w:name="ref-oyedeji2009afra"/>
     <w:p>
       <w:pPr>
         <w:pStyle w:val="Bibliography"/>
@@ -15767,7 +15974,7 @@
       <w:r>
         <w:t xml:space="preserve"> </w:t>
       </w:r>
-      <w:hyperlink r:id="rId220">
+      <w:hyperlink r:id="rId222">
         <w:r>
           <w:rPr>
             <w:rStyle w:val="Hyperlink"/>
@@ -15779,8 +15986,8 @@
         <w:t xml:space="preserve">.</w:t>
       </w:r>
     </w:p>
-    <w:bookmarkEnd w:id="221"/>
-    <w:bookmarkStart w:id="223" w:name="ref-pandey2017artemisiaoils"/>
+    <w:bookmarkEnd w:id="223"/>
+    <w:bookmarkStart w:id="225" w:name="ref-pandey2017artemisiaoils"/>
     <w:p>
       <w:pPr>
         <w:pStyle w:val="Bibliography"/>
@@ -15814,7 +16021,7 @@
       <w:r>
         <w:t xml:space="preserve"> </w:t>
       </w:r>
-      <w:hyperlink r:id="rId222">
+      <w:hyperlink r:id="rId224">
         <w:r>
           <w:rPr>
             <w:rStyle w:val="Hyperlink"/>
@@ -15826,8 +16033,8 @@
         <w:t xml:space="preserve">.</w:t>
       </w:r>
     </w:p>
-    <w:bookmarkEnd w:id="223"/>
-    <w:bookmarkStart w:id="225" w:name="ref-parveen2024scoparia"/>
+    <w:bookmarkEnd w:id="225"/>
+    <w:bookmarkStart w:id="227" w:name="ref-parveen2024scoparia"/>
     <w:p>
       <w:pPr>
         <w:pStyle w:val="Bibliography"/>
@@ -15873,7 +16080,7 @@
       <w:r>
         <w:t xml:space="preserve"> </w:t>
       </w:r>
-      <w:hyperlink r:id="rId224">
+      <w:hyperlink r:id="rId226">
         <w:r>
           <w:rPr>
             <w:rStyle w:val="Hyperlink"/>
@@ -15885,8 +16092,8 @@
         <w:t xml:space="preserve">.</w:t>
       </w:r>
     </w:p>
-    <w:bookmarkEnd w:id="225"/>
-    <w:bookmarkStart w:id="227" w:name="ref-paul2010recurrent"/>
+    <w:bookmarkEnd w:id="227"/>
+    <w:bookmarkStart w:id="229" w:name="ref-paul2010recurrent"/>
     <w:p>
       <w:pPr>
         <w:pStyle w:val="Bibliography"/>
@@ -15932,7 +16139,7 @@
       <w:r>
         <w:t xml:space="preserve"> </w:t>
       </w:r>
-      <w:hyperlink r:id="rId226">
+      <w:hyperlink r:id="rId228">
         <w:r>
           <w:rPr>
             <w:rStyle w:val="Hyperlink"/>
@@ -15944,8 +16151,8 @@
         <w:t xml:space="preserve">.</w:t>
       </w:r>
     </w:p>
-    <w:bookmarkEnd w:id="227"/>
-    <w:bookmarkStart w:id="229" w:name="ref-pirali2011tick"/>
+    <w:bookmarkEnd w:id="229"/>
+    <w:bookmarkStart w:id="231" w:name="ref-pirali2011tick"/>
     <w:p>
       <w:pPr>
         <w:pStyle w:val="Bibliography"/>
@@ -16003,7 +16210,7 @@
       <w:r>
         <w:t xml:space="preserve"> </w:t>
       </w:r>
-      <w:hyperlink r:id="rId228">
+      <w:hyperlink r:id="rId230">
         <w:r>
           <w:rPr>
             <w:rStyle w:val="Hyperlink"/>
@@ -16015,8 +16222,8 @@
         <w:t xml:space="preserve">.</w:t>
       </w:r>
     </w:p>
-    <w:bookmarkEnd w:id="229"/>
-    <w:bookmarkStart w:id="231" w:name="ref-radulovic2013toxic"/>
+    <w:bookmarkEnd w:id="231"/>
+    <w:bookmarkStart w:id="233" w:name="ref-radulovic2013toxic"/>
     <w:p>
       <w:pPr>
         <w:pStyle w:val="Bibliography"/>
@@ -16050,7 +16257,7 @@
       <w:r>
         <w:t xml:space="preserve"> </w:t>
       </w:r>
-      <w:hyperlink r:id="rId230">
+      <w:hyperlink r:id="rId232">
         <w:r>
           <w:rPr>
             <w:rStyle w:val="Hyperlink"/>
@@ -16062,8 +16269,8 @@
         <w:t xml:space="preserve">.</w:t>
       </w:r>
     </w:p>
-    <w:bookmarkEnd w:id="231"/>
-    <w:bookmarkStart w:id="233" w:name="ref-ram1997density"/>
+    <w:bookmarkEnd w:id="233"/>
+    <w:bookmarkStart w:id="235" w:name="ref-ram1997density"/>
     <w:p>
       <w:pPr>
         <w:pStyle w:val="Bibliography"/>
@@ -16109,7 +16316,7 @@
       <w:r>
         <w:t xml:space="preserve"> </w:t>
       </w:r>
-      <w:hyperlink r:id="rId232">
+      <w:hyperlink r:id="rId234">
         <w:r>
           <w:rPr>
             <w:rStyle w:val="Hyperlink"/>
@@ -16121,8 +16328,8 @@
         <w:t xml:space="preserve">.</w:t>
       </w:r>
     </w:p>
-    <w:bookmarkEnd w:id="233"/>
-    <w:bookmarkStart w:id="235" w:name="ref-ribbiso2021heme"/>
+    <w:bookmarkEnd w:id="235"/>
+    <w:bookmarkStart w:id="237" w:name="ref-ribbiso2021heme"/>
     <w:p>
       <w:pPr>
         <w:pStyle w:val="Bibliography"/>
@@ -16168,7 +16375,7 @@
       <w:r>
         <w:t xml:space="preserve"> </w:t>
       </w:r>
-      <w:hyperlink r:id="rId234">
+      <w:hyperlink r:id="rId236">
         <w:r>
           <w:rPr>
             <w:rStyle w:val="Hyperlink"/>
@@ -16180,8 +16387,8 @@
         <w:t xml:space="preserve">.</w:t>
       </w:r>
     </w:p>
-    <w:bookmarkEnd w:id="235"/>
-    <w:bookmarkStart w:id="237" w:name="ref-rosenthal2024proteostasis"/>
+    <w:bookmarkEnd w:id="237"/>
+    <w:bookmarkStart w:id="239" w:name="ref-rosenthal2024proteostasis"/>
     <w:p>
       <w:pPr>
         <w:pStyle w:val="Bibliography"/>
@@ -16224,7 +16431,7 @@
       <w:r>
         <w:t xml:space="preserve"> </w:t>
       </w:r>
-      <w:hyperlink r:id="rId236">
+      <w:hyperlink r:id="rId238">
         <w:r>
           <w:rPr>
             <w:rStyle w:val="Hyperlink"/>
@@ -16236,8 +16443,8 @@
         <w:t xml:space="preserve">.</w:t>
       </w:r>
     </w:p>
-    <w:bookmarkEnd w:id="237"/>
-    <w:bookmarkStart w:id="239" w:name="ref-rostkowska2016silicon"/>
+    <w:bookmarkEnd w:id="239"/>
+    <w:bookmarkStart w:id="241" w:name="ref-rostkowska2016silicon"/>
     <w:p>
       <w:pPr>
         <w:pStyle w:val="Bibliography"/>
@@ -16295,7 +16502,7 @@
       <w:r>
         <w:t xml:space="preserve"> </w:t>
       </w:r>
-      <w:hyperlink r:id="rId238">
+      <w:hyperlink r:id="rId240">
         <w:r>
           <w:rPr>
             <w:rStyle w:val="Hyperlink"/>
@@ -16307,8 +16514,8 @@
         <w:t xml:space="preserve">.</w:t>
       </w:r>
     </w:p>
-    <w:bookmarkEnd w:id="239"/>
-    <w:bookmarkStart w:id="241" w:name="ref-annua2016monoterpenes"/>
+    <w:bookmarkEnd w:id="241"/>
+    <w:bookmarkStart w:id="243" w:name="ref-annua2016monoterpenes"/>
     <w:p>
       <w:pPr>
         <w:pStyle w:val="Bibliography"/>
@@ -16342,7 +16549,7 @@
       <w:r>
         <w:t xml:space="preserve"> </w:t>
       </w:r>
-      <w:hyperlink r:id="rId240">
+      <w:hyperlink r:id="rId242">
         <w:r>
           <w:rPr>
             <w:rStyle w:val="Hyperlink"/>
@@ -16354,8 +16561,8 @@
         <w:t xml:space="preserve">.</w:t>
       </w:r>
     </w:p>
-    <w:bookmarkEnd w:id="241"/>
-    <w:bookmarkStart w:id="243" w:name="ref-said2016vcd"/>
+    <w:bookmarkEnd w:id="243"/>
+    <w:bookmarkStart w:id="245" w:name="ref-said2016vcd"/>
     <w:p>
       <w:pPr>
         <w:pStyle w:val="Bibliography"/>
@@ -16401,7 +16608,7 @@
       <w:r>
         <w:t xml:space="preserve"> </w:t>
       </w:r>
-      <w:hyperlink r:id="rId242">
+      <w:hyperlink r:id="rId244">
         <w:r>
           <w:rPr>
             <w:rStyle w:val="Hyperlink"/>
@@ -16413,8 +16620,8 @@
         <w:t xml:space="preserve">.</w:t>
       </w:r>
     </w:p>
-    <w:bookmarkEnd w:id="243"/>
-    <w:bookmarkStart w:id="245" w:name="ref-sanei2023nanoliposomes"/>
+    <w:bookmarkEnd w:id="245"/>
+    <w:bookmarkStart w:id="247" w:name="ref-sanei2023nanoliposomes"/>
     <w:p>
       <w:pPr>
         <w:pStyle w:val="Bibliography"/>
@@ -16481,7 +16688,7 @@
       <w:r>
         <w:t xml:space="preserve"> </w:t>
       </w:r>
-      <w:hyperlink r:id="rId244">
+      <w:hyperlink r:id="rId246">
         <w:r>
           <w:rPr>
             <w:rStyle w:val="Hyperlink"/>
@@ -16493,8 +16700,8 @@
         <w:t xml:space="preserve">.</w:t>
       </w:r>
     </w:p>
-    <w:bookmarkEnd w:id="245"/>
-    <w:bookmarkStart w:id="247" w:name="ref-schramek2010isotope"/>
+    <w:bookmarkEnd w:id="247"/>
+    <w:bookmarkStart w:id="249" w:name="ref-schramek2010isotope"/>
     <w:p>
       <w:pPr>
         <w:pStyle w:val="Bibliography"/>
@@ -16528,7 +16735,7 @@
       <w:r>
         <w:t xml:space="preserve"> </w:t>
       </w:r>
-      <w:hyperlink r:id="rId246">
+      <w:hyperlink r:id="rId248">
         <w:r>
           <w:rPr>
             <w:rStyle w:val="Hyperlink"/>
@@ -16540,8 +16747,8 @@
         <w:t xml:space="preserve">.</w:t>
       </w:r>
     </w:p>
-    <w:bookmarkEnd w:id="247"/>
-    <w:bookmarkStart w:id="249" w:name="ref-shen2012cypcpr"/>
+    <w:bookmarkEnd w:id="249"/>
+    <w:bookmarkStart w:id="251" w:name="ref-shen2012cypcpr"/>
     <w:p>
       <w:pPr>
         <w:pStyle w:val="Bibliography"/>
@@ -16599,7 +16806,7 @@
       <w:r>
         <w:t xml:space="preserve"> </w:t>
       </w:r>
-      <w:hyperlink r:id="rId248">
+      <w:hyperlink r:id="rId250">
         <w:r>
           <w:rPr>
             <w:rStyle w:val="Hyperlink"/>
@@ -16611,8 +16818,8 @@
         <w:t xml:space="preserve">.</w:t>
       </w:r>
     </w:p>
-    <w:bookmarkEnd w:id="249"/>
-    <w:bookmarkStart w:id="251" w:name="ref-shi2022annuaantimalarialmetabolomics"/>
+    <w:bookmarkEnd w:id="251"/>
+    <w:bookmarkStart w:id="253" w:name="ref-shi2022annuaantimalarialmetabolomics"/>
     <w:p>
       <w:pPr>
         <w:pStyle w:val="Bibliography"/>
@@ -16658,7 +16865,7 @@
       <w:r>
         <w:t xml:space="preserve"> </w:t>
       </w:r>
-      <w:hyperlink r:id="rId250">
+      <w:hyperlink r:id="rId252">
         <w:r>
           <w:rPr>
             <w:rStyle w:val="Hyperlink"/>
@@ -16670,8 +16877,8 @@
         <w:t xml:space="preserve">.</w:t>
       </w:r>
     </w:p>
-    <w:bookmarkEnd w:id="251"/>
-    <w:bookmarkStart w:id="253" w:name="ref-shi2018mixta1"/>
+    <w:bookmarkEnd w:id="253"/>
+    <w:bookmarkStart w:id="255" w:name="ref-shi2018mixta1"/>
     <w:p>
       <w:pPr>
         <w:pStyle w:val="Bibliography"/>
@@ -16726,7 +16933,7 @@
       <w:r>
         <w:t xml:space="preserve"> </w:t>
       </w:r>
-      <w:hyperlink r:id="rId252">
+      <w:hyperlink r:id="rId254">
         <w:r>
           <w:rPr>
             <w:rStyle w:val="Hyperlink"/>
@@ -16738,8 +16945,8 @@
         <w:t xml:space="preserve">.</w:t>
       </w:r>
     </w:p>
-    <w:bookmarkEnd w:id="253"/>
-    <w:bookmarkStart w:id="255" w:name="ref-dasilva2017annuasheep"/>
+    <w:bookmarkEnd w:id="255"/>
+    <w:bookmarkStart w:id="257" w:name="ref-dasilva2017annuasheep"/>
     <w:p>
       <w:pPr>
         <w:pStyle w:val="Bibliography"/>
@@ -16785,7 +16992,7 @@
       <w:r>
         <w:t xml:space="preserve"> </w:t>
       </w:r>
-      <w:hyperlink r:id="rId254">
+      <w:hyperlink r:id="rId256">
         <w:r>
           <w:rPr>
             <w:rStyle w:val="Hyperlink"/>
@@ -16797,8 +17004,8 @@
         <w:t xml:space="preserve">.</w:t>
       </w:r>
     </w:p>
-    <w:bookmarkEnd w:id="255"/>
-    <w:bookmarkStart w:id="257" w:name="ref-snider2021gametocytes"/>
+    <w:bookmarkEnd w:id="257"/>
+    <w:bookmarkStart w:id="259" w:name="ref-snider2021gametocytes"/>
     <w:p>
       <w:pPr>
         <w:pStyle w:val="Bibliography"/>
@@ -16856,7 +17063,7 @@
       <w:r>
         <w:t xml:space="preserve"> </w:t>
       </w:r>
-      <w:hyperlink r:id="rId256">
+      <w:hyperlink r:id="rId258">
         <w:r>
           <w:rPr>
             <w:rStyle w:val="Hyperlink"/>
@@ -16868,8 +17075,8 @@
         <w:t xml:space="preserve">.</w:t>
       </w:r>
     </w:p>
-    <w:bookmarkEnd w:id="257"/>
-    <w:bookmarkStart w:id="259" w:name="ref-soleimanifard2023kermanensis"/>
+    <w:bookmarkEnd w:id="259"/>
+    <w:bookmarkStart w:id="261" w:name="ref-soleimanifard2023kermanensis"/>
     <w:p>
       <w:pPr>
         <w:pStyle w:val="Bibliography"/>
@@ -16915,7 +17122,7 @@
       <w:r>
         <w:t xml:space="preserve"> </w:t>
       </w:r>
-      <w:hyperlink r:id="rId258">
+      <w:hyperlink r:id="rId260">
         <w:r>
           <w:rPr>
             <w:rStyle w:val="Hyperlink"/>
@@ -16927,8 +17134,8 @@
         <w:t xml:space="preserve">.</w:t>
       </w:r>
     </w:p>
-    <w:bookmarkEnd w:id="259"/>
-    <w:bookmarkStart w:id="261" w:name="ref-squires2011haemonchus"/>
+    <w:bookmarkEnd w:id="261"/>
+    <w:bookmarkStart w:id="263" w:name="ref-squires2011haemonchus"/>
     <w:p>
       <w:pPr>
         <w:pStyle w:val="Bibliography"/>
@@ -16962,7 +17169,7 @@
       <w:r>
         <w:t xml:space="preserve"> </w:t>
       </w:r>
-      <w:hyperlink r:id="rId260">
+      <w:hyperlink r:id="rId262">
         <w:r>
           <w:rPr>
             <w:rStyle w:val="Hyperlink"/>
@@ -16974,8 +17181,8 @@
         <w:t xml:space="preserve">.</w:t>
       </w:r>
     </w:p>
-    <w:bookmarkEnd w:id="261"/>
-    <w:bookmarkStart w:id="263" w:name="ref-tabari2017sieberi"/>
+    <w:bookmarkEnd w:id="263"/>
+    <w:bookmarkStart w:id="265" w:name="ref-tabari2017sieberi"/>
     <w:p>
       <w:pPr>
         <w:pStyle w:val="Bibliography"/>
@@ -17009,7 +17216,7 @@
       <w:r>
         <w:t xml:space="preserve"> </w:t>
       </w:r>
-      <w:hyperlink r:id="rId262">
+      <w:hyperlink r:id="rId264">
         <w:r>
           <w:rPr>
             <w:rStyle w:val="Hyperlink"/>
@@ -17021,8 +17228,8 @@
         <w:t xml:space="preserve">.</w:t>
       </w:r>
     </w:p>
-    <w:bookmarkEnd w:id="263"/>
-    <w:bookmarkStart w:id="265" w:name="ref-tamargo2017nanocochleate"/>
+    <w:bookmarkEnd w:id="265"/>
+    <w:bookmarkStart w:id="267" w:name="ref-tamargo2017nanocochleate"/>
     <w:p>
       <w:pPr>
         <w:pStyle w:val="Bibliography"/>
@@ -17056,7 +17263,7 @@
       <w:r>
         <w:t xml:space="preserve"> </w:t>
       </w:r>
-      <w:hyperlink r:id="rId264">
+      <w:hyperlink r:id="rId266">
         <w:r>
           <w:rPr>
             <w:rStyle w:val="Hyperlink"/>
@@ -17068,8 +17275,8 @@
         <w:t xml:space="preserve">.</w:t>
       </w:r>
     </w:p>
-    <w:bookmarkEnd w:id="265"/>
-    <w:bookmarkStart w:id="267" w:name="ref-tangnitipong2012heme"/>
+    <w:bookmarkEnd w:id="267"/>
+    <w:bookmarkStart w:id="269" w:name="ref-tangnitipong2012heme"/>
     <w:p>
       <w:pPr>
         <w:pStyle w:val="Bibliography"/>
@@ -17103,7 +17310,7 @@
       <w:r>
         <w:t xml:space="preserve"> </w:t>
       </w:r>
-      <w:hyperlink r:id="rId266">
+      <w:hyperlink r:id="rId268">
         <w:r>
           <w:rPr>
             <w:rStyle w:val="Hyperlink"/>
@@ -17115,8 +17322,8 @@
         <w:t xml:space="preserve">.</w:t>
       </w:r>
     </w:p>
-    <w:bookmarkEnd w:id="267"/>
-    <w:bookmarkStart w:id="269" w:name="ref-tariq2009absinthium"/>
+    <w:bookmarkEnd w:id="269"/>
+    <w:bookmarkStart w:id="271" w:name="ref-tariq2009absinthium"/>
     <w:p>
       <w:pPr>
         <w:pStyle w:val="Bibliography"/>
@@ -17150,7 +17357,7 @@
       <w:r>
         <w:t xml:space="preserve"> </w:t>
       </w:r>
-      <w:hyperlink r:id="rId268">
+      <w:hyperlink r:id="rId270">
         <w:r>
           <w:rPr>
             <w:rStyle w:val="Hyperlink"/>
@@ -17162,8 +17369,8 @@
         <w:t xml:space="preserve">.</w:t>
       </w:r>
     </w:p>
-    <w:bookmarkEnd w:id="269"/>
-    <w:bookmarkStart w:id="271" w:name="ref-teoh2006cyp"/>
+    <w:bookmarkEnd w:id="271"/>
+    <w:bookmarkStart w:id="273" w:name="ref-teoh2006cyp"/>
     <w:p>
       <w:pPr>
         <w:pStyle w:val="Bibliography"/>
@@ -17197,7 +17404,7 @@
       <w:r>
         <w:t xml:space="preserve"> </w:t>
       </w:r>
-      <w:hyperlink r:id="rId270">
+      <w:hyperlink r:id="rId272">
         <w:r>
           <w:rPr>
             <w:rStyle w:val="Hyperlink"/>
@@ -17209,8 +17416,8 @@
         <w:t xml:space="preserve">.</w:t>
       </w:r>
     </w:p>
-    <w:bookmarkEnd w:id="271"/>
-    <w:bookmarkStart w:id="273" w:name="ref-trendafilova2021edibleartemisia"/>
+    <w:bookmarkEnd w:id="273"/>
+    <w:bookmarkStart w:id="275" w:name="ref-trendafilova2021edibleartemisia"/>
     <w:p>
       <w:pPr>
         <w:pStyle w:val="Bibliography"/>
@@ -17244,7 +17451,7 @@
       <w:r>
         <w:t xml:space="preserve"> </w:t>
       </w:r>
-      <w:hyperlink r:id="rId272">
+      <w:hyperlink r:id="rId274">
         <w:r>
           <w:rPr>
             <w:rStyle w:val="Hyperlink"/>
@@ -17256,8 +17463,8 @@
         <w:t xml:space="preserve">.</w:t>
       </w:r>
     </w:p>
-    <w:bookmarkEnd w:id="273"/>
-    <w:bookmarkStart w:id="275" w:name="ref-umaraliev2025persicabisabolanes"/>
+    <w:bookmarkEnd w:id="275"/>
+    <w:bookmarkStart w:id="277" w:name="ref-umaraliev2025persicabisabolanes"/>
     <w:p>
       <w:pPr>
         <w:pStyle w:val="Bibliography"/>
@@ -17297,7 +17504,7 @@
       <w:r>
         <w:t xml:space="preserve"> </w:t>
       </w:r>
-      <w:hyperlink r:id="rId274">
+      <w:hyperlink r:id="rId276">
         <w:r>
           <w:rPr>
             <w:rStyle w:val="Hyperlink"/>
@@ -17309,8 +17516,8 @@
         <w:t xml:space="preserve">.</w:t>
       </w:r>
     </w:p>
-    <w:bookmarkEnd w:id="275"/>
-    <w:bookmarkStart w:id="277" w:name="ref-umaraliev2026persicamonoterpenes"/>
+    <w:bookmarkEnd w:id="277"/>
+    <w:bookmarkStart w:id="279" w:name="ref-umaraliev2026persicamonoterpenes"/>
     <w:p>
       <w:pPr>
         <w:pStyle w:val="Bibliography"/>
@@ -17350,7 +17557,7 @@
       <w:r>
         <w:t xml:space="preserve"> </w:t>
       </w:r>
-      <w:hyperlink r:id="rId276">
+      <w:hyperlink r:id="rId278">
         <w:r>
           <w:rPr>
             <w:rStyle w:val="Hyperlink"/>
@@ -17362,8 +17569,8 @@
         <w:t xml:space="preserve">.</w:t>
       </w:r>
     </w:p>
-    <w:bookmarkEnd w:id="277"/>
-    <w:bookmarkStart w:id="279" w:name="ref-urban2020trpc3"/>
+    <w:bookmarkEnd w:id="279"/>
+    <w:bookmarkStart w:id="281" w:name="ref-urban2020trpc3"/>
     <w:p>
       <w:pPr>
         <w:pStyle w:val="Bibliography"/>
@@ -17409,7 +17616,7 @@
       <w:r>
         <w:t xml:space="preserve"> </w:t>
       </w:r>
-      <w:hyperlink r:id="rId278">
+      <w:hyperlink r:id="rId280">
         <w:r>
           <w:rPr>
             <w:rStyle w:val="Hyperlink"/>
@@ -17421,8 +17628,8 @@
         <w:t xml:space="preserve">.</w:t>
       </w:r>
     </w:p>
-    <w:bookmarkEnd w:id="279"/>
-    <w:bookmarkStart w:id="281" w:name="ref-varadyova2018medicinalplants"/>
+    <w:bookmarkEnd w:id="281"/>
+    <w:bookmarkStart w:id="283" w:name="ref-varadyova2018medicinalplants"/>
     <w:p>
       <w:pPr>
         <w:pStyle w:val="Bibliography"/>
@@ -17465,7 +17672,7 @@
       <w:r>
         <w:t xml:space="preserve"> </w:t>
       </w:r>
-      <w:hyperlink r:id="rId280">
+      <w:hyperlink r:id="rId282">
         <w:r>
           <w:rPr>
             <w:rStyle w:val="Hyperlink"/>
@@ -17477,8 +17684,8 @@
         <w:t xml:space="preserve">.</w:t>
       </w:r>
     </w:p>
-    <w:bookmarkEnd w:id="281"/>
-    <w:bookmarkStart w:id="283" w:name="ref-walz2024aframalaria"/>
+    <w:bookmarkEnd w:id="283"/>
+    <w:bookmarkStart w:id="285" w:name="ref-walz2024aframalaria"/>
     <w:p>
       <w:pPr>
         <w:pStyle w:val="Bibliography"/>
@@ -17524,7 +17731,7 @@
       <w:r>
         <w:t xml:space="preserve"> </w:t>
       </w:r>
-      <w:hyperlink r:id="rId282">
+      <w:hyperlink r:id="rId284">
         <w:r>
           <w:rPr>
             <w:rStyle w:val="Hyperlink"/>
@@ -17536,8 +17743,8 @@
         <w:t xml:space="preserve">.</w:t>
       </w:r>
     </w:p>
-    <w:bookmarkEnd w:id="283"/>
-    <w:bookmarkStart w:id="285" w:name="ref-wang2013cyp71av1promoter"/>
+    <w:bookmarkEnd w:id="285"/>
+    <w:bookmarkStart w:id="287" w:name="ref-wang2013cyp71av1promoter"/>
     <w:p>
       <w:pPr>
         <w:pStyle w:val="Bibliography"/>
@@ -17571,7 +17778,7 @@
       <w:r>
         <w:t xml:space="preserve"> </w:t>
       </w:r>
-      <w:hyperlink r:id="rId284">
+      <w:hyperlink r:id="rId286">
         <w:r>
           <w:rPr>
             <w:rStyle w:val="Hyperlink"/>
@@ -17583,8 +17790,8 @@
         <w:t xml:space="preserve">.</w:t>
       </w:r>
     </w:p>
-    <w:bookmarkEnd w:id="285"/>
-    <w:bookmarkStart w:id="287" w:name="ref-wang2009trichometranscriptome"/>
+    <w:bookmarkEnd w:id="287"/>
+    <w:bookmarkStart w:id="289" w:name="ref-wang2009trichometranscriptome"/>
     <w:p>
       <w:pPr>
         <w:pStyle w:val="Bibliography"/>
@@ -17618,7 +17825,7 @@
       <w:r>
         <w:t xml:space="preserve"> </w:t>
       </w:r>
-      <w:hyperlink r:id="rId286">
+      <w:hyperlink r:id="rId288">
         <w:r>
           <w:rPr>
             <w:rStyle w:val="Hyperlink"/>
@@ -17630,8 +17837,8 @@
         <w:t xml:space="preserve">.</w:t>
       </w:r>
     </w:p>
-    <w:bookmarkEnd w:id="287"/>
-    <w:bookmarkStart w:id="289" w:name="ref-wani2023nitric"/>
+    <w:bookmarkEnd w:id="289"/>
+    <w:bookmarkStart w:id="291" w:name="ref-wani2023nitric"/>
     <w:p>
       <w:pPr>
         <w:pStyle w:val="Bibliography"/>
@@ -17689,7 +17896,7 @@
       <w:r>
         <w:t xml:space="preserve"> </w:t>
       </w:r>
-      <w:hyperlink r:id="rId288">
+      <w:hyperlink r:id="rId290">
         <w:r>
           <w:rPr>
             <w:rStyle w:val="Hyperlink"/>
@@ -17701,8 +17908,8 @@
         <w:t xml:space="preserve">.</w:t>
       </w:r>
     </w:p>
-    <w:bookmarkEnd w:id="289"/>
-    <w:bookmarkStart w:id="291" w:name="ref-wani2026maritima"/>
+    <w:bookmarkEnd w:id="291"/>
+    <w:bookmarkStart w:id="293" w:name="ref-wani2026maritima"/>
     <w:p>
       <w:pPr>
         <w:pStyle w:val="Bibliography"/>
@@ -17748,7 +17955,7 @@
       <w:r>
         <w:t xml:space="preserve"> </w:t>
       </w:r>
-      <w:hyperlink r:id="rId290">
+      <w:hyperlink r:id="rId292">
         <w:r>
           <w:rPr>
             <w:rStyle w:val="Hyperlink"/>
@@ -17760,8 +17967,8 @@
         <w:t xml:space="preserve">.</w:t>
       </w:r>
     </w:p>
-    <w:bookmarkEnd w:id="291"/>
-    <w:bookmarkStart w:id="293" w:name="ref-wetmore2019psiv9"/>
+    <w:bookmarkEnd w:id="293"/>
+    <w:bookmarkStart w:id="295" w:name="ref-wetmore2019psiv9"/>
     <w:p>
       <w:pPr>
         <w:pStyle w:val="Bibliography"/>
@@ -17807,7 +18014,7 @@
       <w:r>
         <w:t xml:space="preserve"> </w:t>
       </w:r>
-      <w:hyperlink r:id="rId292">
+      <w:hyperlink r:id="rId294">
         <w:r>
           <w:rPr>
             <w:rStyle w:val="Hyperlink"/>
@@ -17819,8 +18026,8 @@
         <w:t xml:space="preserve">.</w:t>
       </w:r>
     </w:p>
-    <w:bookmarkEnd w:id="293"/>
-    <w:bookmarkStart w:id="295" w:name="ref-wright2010qinghao"/>
+    <w:bookmarkEnd w:id="295"/>
+    <w:bookmarkStart w:id="297" w:name="ref-wright2010qinghao"/>
     <w:p>
       <w:pPr>
         <w:pStyle w:val="Bibliography"/>
@@ -17866,7 +18073,7 @@
       <w:r>
         <w:t xml:space="preserve"> </w:t>
       </w:r>
-      <w:hyperlink r:id="rId294">
+      <w:hyperlink r:id="rId296">
         <w:r>
           <w:rPr>
             <w:rStyle w:val="Hyperlink"/>
@@ -17878,8 +18085,8 @@
         <w:t xml:space="preserve">.</w:t>
       </w:r>
     </w:p>
-    <w:bookmarkEnd w:id="295"/>
-    <w:bookmarkStart w:id="297" w:name="ref-xiang2019bhlh112"/>
+    <w:bookmarkEnd w:id="297"/>
+    <w:bookmarkStart w:id="299" w:name="ref-xiang2019bhlh112"/>
     <w:p>
       <w:pPr>
         <w:pStyle w:val="Bibliography"/>
@@ -17913,7 +18120,7 @@
       <w:r>
         <w:t xml:space="preserve"> </w:t>
       </w:r>
-      <w:hyperlink r:id="rId296">
+      <w:hyperlink r:id="rId298">
         <w:r>
           <w:rPr>
             <w:rStyle w:val="Hyperlink"/>
@@ -17925,8 +18132,8 @@
         <w:t xml:space="preserve">.</w:t>
       </w:r>
     </w:p>
-    <w:bookmarkEnd w:id="297"/>
-    <w:bookmarkStart w:id="299" w:name="ref-xu2025plantmatrix"/>
+    <w:bookmarkEnd w:id="299"/>
+    <w:bookmarkStart w:id="301" w:name="ref-xu2025plantmatrix"/>
     <w:p>
       <w:pPr>
         <w:pStyle w:val="Bibliography"/>
@@ -17972,7 +18179,7 @@
       <w:r>
         <w:t xml:space="preserve"> </w:t>
       </w:r>
-      <w:hyperlink r:id="rId298">
+      <w:hyperlink r:id="rId300">
         <w:r>
           <w:rPr>
             <w:rStyle w:val="Hyperlink"/>
@@ -17984,8 +18191,8 @@
         <w:t xml:space="preserve">.</w:t>
       </w:r>
     </w:p>
-    <w:bookmarkEnd w:id="299"/>
-    <w:bookmarkStart w:id="301" w:name="ref-yildiz2011toxocara"/>
+    <w:bookmarkEnd w:id="301"/>
+    <w:bookmarkStart w:id="303" w:name="ref-yildiz2011toxocara"/>
     <w:p>
       <w:pPr>
         <w:pStyle w:val="Bibliography"/>
@@ -18043,7 +18250,7 @@
       <w:r>
         <w:t xml:space="preserve"> </w:t>
       </w:r>
-      <w:hyperlink r:id="rId300">
+      <w:hyperlink r:id="rId302">
         <w:r>
           <w:rPr>
             <w:rStyle w:val="Hyperlink"/>
@@ -18055,8 +18262,8 @@
         <w:t xml:space="preserve">.</w:t>
       </w:r>
     </w:p>
-    <w:bookmarkEnd w:id="301"/>
-    <w:bookmarkStart w:id="303" w:name="ref-zehra2020copper"/>
+    <w:bookmarkEnd w:id="303"/>
+    <w:bookmarkStart w:id="305" w:name="ref-zehra2020copper"/>
     <w:p>
       <w:pPr>
         <w:pStyle w:val="Bibliography"/>
@@ -18102,7 +18309,7 @@
       <w:r>
         <w:t xml:space="preserve"> </w:t>
       </w:r>
-      <w:hyperlink r:id="rId302">
+      <w:hyperlink r:id="rId304">
         <w:r>
           <w:rPr>
             <w:rStyle w:val="Hyperlink"/>
@@ -18114,8 +18321,8 @@
         <w:t xml:space="preserve">.</w:t>
       </w:r>
     </w:p>
-    <w:bookmarkEnd w:id="303"/>
-    <w:bookmarkStart w:id="305" w:name="ref-zhang2022fiveartemisia"/>
+    <w:bookmarkEnd w:id="305"/>
+    <w:bookmarkStart w:id="307" w:name="ref-zhang2022fiveartemisia"/>
     <w:p>
       <w:pPr>
         <w:pStyle w:val="Bibliography"/>
@@ -18161,7 +18368,7 @@
       <w:r>
         <w:t xml:space="preserve"> </w:t>
       </w:r>
-      <w:hyperlink r:id="rId304">
+      <w:hyperlink r:id="rId306">
         <w:r>
           <w:rPr>
             <w:rStyle w:val="Hyperlink"/>
@@ -18173,8 +18380,8 @@
         <w:t xml:space="preserve">.</w:t>
       </w:r>
     </w:p>
-    <w:bookmarkEnd w:id="305"/>
-    <w:bookmarkStart w:id="307" w:name="ref-zhang2020argyitriterpenoids"/>
+    <w:bookmarkEnd w:id="307"/>
+    <w:bookmarkStart w:id="309" w:name="ref-zhang2020argyitriterpenoids"/>
     <w:p>
       <w:pPr>
         <w:pStyle w:val="Bibliography"/>
@@ -18217,7 +18424,7 @@
       <w:r>
         <w:t xml:space="preserve"> </w:t>
       </w:r>
-      <w:hyperlink r:id="rId306">
+      <w:hyperlink r:id="rId308">
         <w:r>
           <w:rPr>
             <w:rStyle w:val="Hyperlink"/>
@@ -18229,8 +18436,8 @@
         <w:t xml:space="preserve">.</w:t>
       </w:r>
     </w:p>
-    <w:bookmarkEnd w:id="307"/>
-    <w:bookmarkStart w:id="309" w:name="ref-zhang2019pp2c1"/>
+    <w:bookmarkEnd w:id="309"/>
+    <w:bookmarkStart w:id="311" w:name="ref-zhang2019pp2c1"/>
     <w:p>
       <w:pPr>
         <w:pStyle w:val="Bibliography"/>
@@ -18282,7 +18489,7 @@
       <w:r>
         <w:t xml:space="preserve"> </w:t>
       </w:r>
-      <w:hyperlink r:id="rId308">
+      <w:hyperlink r:id="rId310">
         <w:r>
           <w:rPr>
             <w:rStyle w:val="Hyperlink"/>
@@ -18294,8 +18501,8 @@
         <w:t xml:space="preserve">.</w:t>
       </w:r>
     </w:p>
-    <w:bookmarkEnd w:id="309"/>
-    <w:bookmarkStart w:id="311" w:name="ref-zhang2008dbr2"/>
+    <w:bookmarkEnd w:id="311"/>
+    <w:bookmarkStart w:id="313" w:name="ref-zhang2008dbr2"/>
     <w:p>
       <w:pPr>
         <w:pStyle w:val="Bibliography"/>
@@ -18329,7 +18536,7 @@
       <w:r>
         <w:t xml:space="preserve"> </w:t>
       </w:r>
-      <w:hyperlink r:id="rId310">
+      <w:hyperlink r:id="rId312">
         <w:r>
           <w:rPr>
             <w:rStyle w:val="Hyperlink"/>
@@ -18341,8 +18548,8 @@
         <w:t xml:space="preserve">.</w:t>
       </w:r>
     </w:p>
-    <w:bookmarkEnd w:id="311"/>
-    <w:bookmarkStart w:id="313" w:name="ref-frigida2023variability"/>
+    <w:bookmarkEnd w:id="313"/>
+    <w:bookmarkStart w:id="315" w:name="ref-frigida2023variability"/>
     <w:p>
       <w:pPr>
         <w:pStyle w:val="Bibliography"/>
@@ -18376,7 +18583,7 @@
       <w:r>
         <w:t xml:space="preserve"> </w:t>
       </w:r>
-      <w:hyperlink r:id="rId312">
+      <w:hyperlink r:id="rId314">
         <w:r>
           <w:rPr>
             <w:rStyle w:val="Hyperlink"/>
@@ -18388,9 +18595,9 @@
         <w:t xml:space="preserve">.</w:t>
       </w:r>
     </w:p>
-    <w:bookmarkEnd w:id="313"/>
-    <w:bookmarkEnd w:id="314"/>
     <w:bookmarkEnd w:id="315"/>
+    <w:bookmarkEnd w:id="316"/>
+    <w:bookmarkEnd w:id="317"/>
     <w:sectPr>
       <w:headerReference w:type="default" r:id="rId9"/>
       <w:footerReference w:type="default" r:id="rId10"/>

</xml_diff>

<commit_message>
Expand full-text Artemisia antiparasitic evidence
</commit_message>
<xml_diff>
--- a/manuscript/artemisia-terpene-review-submission.docx
+++ b/manuscript/artemisia-terpene-review-submission.docx
@@ -199,7 +199,7 @@
         <w:t xml:space="preserve"> </w:t>
       </w:r>
       <w:r>
-        <w:t xml:space="preserve">contains volatile monoterpenes and sesquiterpenes, less volatile diterpenes and triterpenes, and structurally diverse sesquiterpene lactones (STLs). These metabolites are often discussed as though a species name, a pathway gene, or an oil profile were sufficient to predict pharmacology. Here we present a source-auditable living scoping review that instead treats the specimen, accession, tissue, preparation, analytical method, parasite stage, and evidence level as the units of comparison. The Terpedia package registers 538 sources, 553 source-linked evidence records, 129 antiparasitic records, 19 parasite–protein interaction records, 179 compound/specimen records, and 401 audited article claims; 80 sources and 95 linked evidence rows have completed full-text verification, while 30 queue sources remain open. We synthesize terpene classes with biosynthetic compartmentalization, regulatory and environmental variation, and a bounded comparative-genomics analysis. Artemisinin biosynthesis in</w:t>
+        <w:t xml:space="preserve">contains volatile monoterpenes and sesquiterpenes, less volatile diterpenes and triterpenes, and structurally diverse sesquiterpene lactones (STLs). These metabolites are often discussed as though a species name, a pathway gene, or an oil profile were sufficient to predict pharmacology. Here we present a source-auditable living scoping review that instead treats the specimen, accession, tissue, preparation, analytical method, parasite stage, and evidence level as the units of comparison. The Terpedia package registers 538 sources, 553 source-linked evidence records, 129 antiparasitic records, 19 parasite–protein interaction records, 179 compound/specimen records, and 402 audited article claims; 81 sources and 96 linked evidence rows have completed full-text verification, while 29 queue sources remain open. We synthesize terpene classes with biosynthetic compartmentalization, regulatory and environmental variation, and a bounded comparative-genomics analysis. Artemisinin biosynthesis in</w:t>
       </w:r>
       <w:r>
         <w:t xml:space="preserve"> </w:t>
@@ -452,7 +452,7 @@
         <w:spacing w:before="0" w:after="120" w:line="264" w:lineRule="auto"/>
       </w:pPr>
       <w:r>
-        <w:t xml:space="preserve">The package is deliberately a living scoping review rather than a completed systematic review. It contains 1,408 bounded title/abstract decisions, covering all 1,387 priority-queue records plus 21 historical or out-of-queue decisions. Full-text verification now covers 80 publicly accessible or publisher-full-text antiparasitic sources and 95 linked evidence rows; 30 queue sources remain unverified, and no result is pooled as a final quantitative estimate. The PRISMA-ScR mapping is archived in</w:t>
+        <w:t xml:space="preserve">The package is deliberately a living scoping review rather than a completed systematic review. It contains 1,408 bounded title/abstract decisions, covering all 1,387 priority-queue records plus 21 historical or out-of-queue decisions. Full-text verification now covers 81 publicly accessible or publisher-full-text antiparasitic sources and 96 linked evidence rows; 29 queue sources remain unverified, and no result is pooled as a final quantitative estimate. The PRISMA-ScR mapping is archived in</w:t>
       </w:r>
       <w:r>
         <w:t xml:space="preserve"> </w:t>
@@ -7736,6 +7736,72 @@
         <w:spacing w:before="0" w:after="120" w:line="264" w:lineRule="auto"/>
       </w:pPr>
       <w:r>
+        <w:t xml:space="preserve">Full-text verification of an Ethiopian</w:t>
+      </w:r>
+      <w:r>
+        <w:t xml:space="preserve"> </w:t>
+      </w:r>
+      <w:r>
+        <w:rPr>
+          <w:i/>
+          <w:iCs/>
+        </w:rPr>
+        <w:t xml:space="preserve">A. absinthium</w:t>
+      </w:r>
+      <w:r>
+        <w:t xml:space="preserve"> </w:t>
+      </w:r>
+      <w:r>
+        <w:t xml:space="preserve">oil study adds a regional, chemically profiled promastigote/axenic-amastigote anchor. Voucher YT 005/06 leaves yielded 1.39% hydrodistilled oil; GC–MS identified 65 compounds representing 93.74% of the oil, with camphor at 27.40%, davanone at 16.43%, and (E)-nerolidol at 4.63%. The oil inhibited</w:t>
+      </w:r>
+      <w:r>
+        <w:t xml:space="preserve"> </w:t>
+      </w:r>
+      <w:r>
+        <w:rPr>
+          <w:i/>
+          <w:iCs/>
+        </w:rPr>
+        <w:t xml:space="preserve">L. aethiopica</w:t>
+      </w:r>
+      <w:r>
+        <w:t xml:space="preserve"> </w:t>
+      </w:r>
+      <w:r>
+        <w:t xml:space="preserve">and</w:t>
+      </w:r>
+      <w:r>
+        <w:t xml:space="preserve"> </w:t>
+      </w:r>
+      <w:r>
+        <w:rPr>
+          <w:i/>
+          <w:iCs/>
+        </w:rPr>
+        <w:t xml:space="preserve">L. donovani</w:t>
+      </w:r>
+      <w:r>
+        <w:t xml:space="preserve"> </w:t>
+      </w:r>
+      <w:r>
+        <w:t xml:space="preserve">promastigotes at MIC 0.1565 microliter/mL and produced axenic-amastigote EC50 values of 7.94 +/- 5.58 and 42.00 +/- 9.80 nanoliter/mL, respectively; THP-1 CC50 was 152.04 +/- 8.40 nanoliter/mL and sheep-erythrocyte hemolysis was also measured. Because the study used peak-area-normalized mixture chemistry and did not test intracellular amastigotes, infected animals, or purified constituents, camphor and davanone remain compositional markers rather than causal molecules</w:t>
+      </w:r>
+      <w:r>
+        <w:t xml:space="preserve"> </w:t>
+      </w:r>
+      <w:r>
+        <w:t xml:space="preserve">(Tariku et al. 2011)</w:t>
+      </w:r>
+      <w:r>
+        <w:t xml:space="preserve">. This is antileishmanial mixture evidence, not proof of gastrointestinal vermifuge activity or oral human efficacy.</w:t>
+      </w:r>
+    </w:p>
+    <w:p>
+      <w:pPr>
+        <w:pStyle w:val="BodyText"/>
+        <w:spacing w:before="0" w:after="120" w:line="264" w:lineRule="auto"/>
+      </w:pPr>
+      <w:r>
         <w:t xml:space="preserve">Full-text verification of a Cuban</w:t>
       </w:r>
       <w:r>
@@ -10079,6 +10145,162 @@
                 <w:sz w:val="18"/>
               </w:rPr>
               <w:t xml:space="preserve">(Monzote et al. 2014)</w:t>
+            </w:r>
+          </w:p>
+        </w:tc>
+      </w:tr>
+      <w:tr>
+        <w:trPr>
+          <w:cantSplit w:val="true"/>
+        </w:trPr>
+        <w:tc>
+          <w:tcPr>
+            <w:tcW w:w="1800" w:type="dxa"/>
+            <w:tcMar>
+              <w:top w:w="80" w:type="dxa"/>
+              <w:start w:w="120" w:type="dxa"/>
+              <w:bottom w:w="80" w:type="dxa"/>
+              <w:end w:w="120" w:type="dxa"/>
+            </w:tcMar>
+            <w:vAlign w:val="center"/>
+          </w:tcPr>
+          <w:p>
+            <w:pPr>
+              <w:pStyle w:val="Compact"/>
+              <w:spacing w:before="0" w:after="40" w:line="240" w:lineRule="auto"/>
+            </w:pPr>
+            <w:r>
+              <w:rPr>
+                <w:rFonts w:ascii="Calibri" w:hAnsi="Calibri"/>
+                <w:i/>
+                <w:iCs/>
+                <w:sz w:val="18"/>
+              </w:rPr>
+              <w:t xml:space="preserve">A. absinthium</w:t>
+            </w:r>
+            <w:r>
+              <w:rPr>
+                <w:rFonts w:ascii="Calibri" w:hAnsi="Calibri"/>
+                <w:sz w:val="18"/>
+              </w:rPr>
+              <w:t xml:space="preserve"> </w:t>
+            </w:r>
+            <w:r>
+              <w:rPr>
+                <w:rFonts w:ascii="Calibri" w:hAnsi="Calibri"/>
+                <w:sz w:val="18"/>
+              </w:rPr>
+              <w:t xml:space="preserve">oil /</w:t>
+            </w:r>
+            <w:r>
+              <w:rPr>
+                <w:rFonts w:ascii="Calibri" w:hAnsi="Calibri"/>
+                <w:sz w:val="18"/>
+              </w:rPr>
+              <w:t xml:space="preserve"> </w:t>
+            </w:r>
+            <w:r>
+              <w:rPr>
+                <w:rFonts w:ascii="Calibri" w:hAnsi="Calibri"/>
+                <w:i/>
+                <w:iCs/>
+                <w:sz w:val="18"/>
+              </w:rPr>
+              <w:t xml:space="preserve">L. aethiopica</w:t>
+            </w:r>
+            <w:r>
+              <w:rPr>
+                <w:rFonts w:ascii="Calibri" w:hAnsi="Calibri"/>
+                <w:sz w:val="18"/>
+              </w:rPr>
+              <w:t xml:space="preserve"> </w:t>
+            </w:r>
+            <w:r>
+              <w:rPr>
+                <w:rFonts w:ascii="Calibri" w:hAnsi="Calibri"/>
+                <w:sz w:val="18"/>
+              </w:rPr>
+              <w:t xml:space="preserve">and</w:t>
+            </w:r>
+            <w:r>
+              <w:rPr>
+                <w:rFonts w:ascii="Calibri" w:hAnsi="Calibri"/>
+                <w:sz w:val="18"/>
+              </w:rPr>
+              <w:t xml:space="preserve"> </w:t>
+            </w:r>
+            <w:r>
+              <w:rPr>
+                <w:rFonts w:ascii="Calibri" w:hAnsi="Calibri"/>
+                <w:i/>
+                <w:iCs/>
+                <w:sz w:val="18"/>
+              </w:rPr>
+              <w:t xml:space="preserve">L. donovani</w:t>
+            </w:r>
+          </w:p>
+        </w:tc>
+        <w:tc>
+          <w:tcPr>
+            <w:tcW w:w="2800" w:type="dxa"/>
+            <w:tcMar>
+              <w:top w:w="80" w:type="dxa"/>
+              <w:start w:w="120" w:type="dxa"/>
+              <w:bottom w:w="80" w:type="dxa"/>
+              <w:end w:w="120" w:type="dxa"/>
+            </w:tcMar>
+            <w:vAlign w:val="center"/>
+          </w:tcPr>
+          <w:p>
+            <w:pPr>
+              <w:pStyle w:val="Compact"/>
+              <w:spacing w:before="0" w:after="40" w:line="240" w:lineRule="auto"/>
+            </w:pPr>
+            <w:r>
+              <w:rPr>
+                <w:rFonts w:ascii="Calibri" w:hAnsi="Calibri"/>
+                <w:sz w:val="18"/>
+              </w:rPr>
+              <w:t xml:space="preserve">Ethiopian voucher-linked oil contained 65 GC–MS-assigned compounds, with camphor 27.40% and davanone 16.43%; it inhibited promastigotes and axenic amastigotes and included THP-1/erythrocyte controls</w:t>
+            </w:r>
+          </w:p>
+        </w:tc>
+        <w:tc>
+          <w:tcPr>
+            <w:tcW w:w="2400" w:type="dxa"/>
+            <w:tcMar>
+              <w:top w:w="80" w:type="dxa"/>
+              <w:start w:w="120" w:type="dxa"/>
+              <w:bottom w:w="80" w:type="dxa"/>
+              <w:end w:w="120" w:type="dxa"/>
+            </w:tcMar>
+            <w:vAlign w:val="center"/>
+          </w:tcPr>
+          <w:p>
+            <w:pPr>
+              <w:pStyle w:val="Compact"/>
+              <w:spacing w:before="0" w:after="40" w:line="240" w:lineRule="auto"/>
+            </w:pPr>
+            <w:r>
+              <w:rPr>
+                <w:rFonts w:ascii="Calibri" w:hAnsi="Calibri"/>
+                <w:sz w:val="18"/>
+              </w:rPr>
+              <w:t xml:space="preserve">Regional mixture result with peak-area chemistry; camphor/davanone causality, intracellular activity, infected-host efficacy, and gastrointestinal vermifuge relevance remain unresolved</w:t>
+            </w:r>
+            <w:r>
+              <w:rPr>
+                <w:rFonts w:ascii="Calibri" w:hAnsi="Calibri"/>
+                <w:sz w:val="18"/>
+              </w:rPr>
+              <w:t xml:space="preserve"> </w:t>
+            </w:r>
+            <w:r>
+              <w:rPr>
+                <w:rFonts w:ascii="Calibri" w:hAnsi="Calibri"/>
+                <w:sz w:val="18"/>
+              </w:rPr>
+              <w:t xml:space="preserve">(Tariku et al. 2011)</w:t>
             </w:r>
           </w:p>
         </w:tc>
@@ -10828,7 +11050,7 @@
     <w:bookmarkEnd w:id="47"/>
     <w:bookmarkEnd w:id="48"/>
     <w:bookmarkEnd w:id="49"/>
-    <w:bookmarkStart w:id="317" w:name="references"/>
+    <w:bookmarkStart w:id="319" w:name="references"/>
     <w:p>
       <w:pPr>
         <w:pStyle w:val="Heading1"/>
@@ -10838,7 +11060,7 @@
         <w:t xml:space="preserve">References</w:t>
       </w:r>
     </w:p>
-    <w:bookmarkStart w:id="316" w:name="refs"/>
+    <w:bookmarkStart w:id="318" w:name="refs"/>
     <w:bookmarkStart w:id="51" w:name="ref-abad2012artemisia"/>
     <w:p>
       <w:pPr>
@@ -17323,13 +17545,60 @@
       </w:r>
     </w:p>
     <w:bookmarkEnd w:id="269"/>
-    <w:bookmarkStart w:id="271" w:name="ref-tariq2009absinthium"/>
+    <w:bookmarkStart w:id="271" w:name="ref-tariku2011absinthium"/>
     <w:p>
       <w:pPr>
         <w:pStyle w:val="Bibliography"/>
         <w:spacing w:before="0" w:after="120" w:line="264" w:lineRule="auto"/>
       </w:pPr>
       <w:r>
+        <w:t xml:space="preserve">Tariku, Y, A Hymete, A Hailu, and J Rohloff. 2011.</w:t>
+      </w:r>
+      <w:r>
+        <w:t xml:space="preserve"> </w:t>
+      </w:r>
+      <w:r>
+        <w:t xml:space="preserve">“In Vitro Evaluation of Antileishmanial Activity and Toxicity of Essential Oils of Artemisia Absinthium and Echinops Kebericho.”</w:t>
+      </w:r>
+      <w:r>
+        <w:t xml:space="preserve"> </w:t>
+      </w:r>
+      <w:r>
+        <w:rPr>
+          <w:i/>
+          <w:iCs/>
+        </w:rPr>
+        <w:t xml:space="preserve">Chemistry and Biodiversity</w:t>
+      </w:r>
+      <w:r>
+        <w:t xml:space="preserve"> </w:t>
+      </w:r>
+      <w:r>
+        <w:t xml:space="preserve">8 (4): 614–23.</w:t>
+      </w:r>
+      <w:r>
+        <w:t xml:space="preserve"> </w:t>
+      </w:r>
+      <w:hyperlink r:id="rId270">
+        <w:r>
+          <w:rPr>
+            <w:rStyle w:val="Hyperlink"/>
+          </w:rPr>
+          <w:t xml:space="preserve">https://doi.org/10.1002/cbdv.201000331</w:t>
+        </w:r>
+      </w:hyperlink>
+      <w:r>
+        <w:t xml:space="preserve">.</w:t>
+      </w:r>
+    </w:p>
+    <w:bookmarkEnd w:id="271"/>
+    <w:bookmarkStart w:id="273" w:name="ref-tariq2009absinthium"/>
+    <w:p>
+      <w:pPr>
+        <w:pStyle w:val="Bibliography"/>
+        <w:spacing w:before="0" w:after="120" w:line="264" w:lineRule="auto"/>
+      </w:pPr>
+      <w:r>
         <w:t xml:space="preserve">Tariq, K A, M Z Chishti, F Ahmad, and A S Shawl. 2009.</w:t>
       </w:r>
       <w:r>
@@ -17357,7 +17626,7 @@
       <w:r>
         <w:t xml:space="preserve"> </w:t>
       </w:r>
-      <w:hyperlink r:id="rId270">
+      <w:hyperlink r:id="rId272">
         <w:r>
           <w:rPr>
             <w:rStyle w:val="Hyperlink"/>
@@ -17369,8 +17638,8 @@
         <w:t xml:space="preserve">.</w:t>
       </w:r>
     </w:p>
-    <w:bookmarkEnd w:id="271"/>
-    <w:bookmarkStart w:id="273" w:name="ref-teoh2006cyp"/>
+    <w:bookmarkEnd w:id="273"/>
+    <w:bookmarkStart w:id="275" w:name="ref-teoh2006cyp"/>
     <w:p>
       <w:pPr>
         <w:pStyle w:val="Bibliography"/>
@@ -17404,7 +17673,7 @@
       <w:r>
         <w:t xml:space="preserve"> </w:t>
       </w:r>
-      <w:hyperlink r:id="rId272">
+      <w:hyperlink r:id="rId274">
         <w:r>
           <w:rPr>
             <w:rStyle w:val="Hyperlink"/>
@@ -17416,8 +17685,8 @@
         <w:t xml:space="preserve">.</w:t>
       </w:r>
     </w:p>
-    <w:bookmarkEnd w:id="273"/>
-    <w:bookmarkStart w:id="275" w:name="ref-trendafilova2021edibleartemisia"/>
+    <w:bookmarkEnd w:id="275"/>
+    <w:bookmarkStart w:id="277" w:name="ref-trendafilova2021edibleartemisia"/>
     <w:p>
       <w:pPr>
         <w:pStyle w:val="Bibliography"/>
@@ -17451,7 +17720,7 @@
       <w:r>
         <w:t xml:space="preserve"> </w:t>
       </w:r>
-      <w:hyperlink r:id="rId274">
+      <w:hyperlink r:id="rId276">
         <w:r>
           <w:rPr>
             <w:rStyle w:val="Hyperlink"/>
@@ -17463,8 +17732,8 @@
         <w:t xml:space="preserve">.</w:t>
       </w:r>
     </w:p>
-    <w:bookmarkEnd w:id="275"/>
-    <w:bookmarkStart w:id="277" w:name="ref-umaraliev2025persicabisabolanes"/>
+    <w:bookmarkEnd w:id="277"/>
+    <w:bookmarkStart w:id="279" w:name="ref-umaraliev2025persicabisabolanes"/>
     <w:p>
       <w:pPr>
         <w:pStyle w:val="Bibliography"/>
@@ -17504,7 +17773,7 @@
       <w:r>
         <w:t xml:space="preserve"> </w:t>
       </w:r>
-      <w:hyperlink r:id="rId276">
+      <w:hyperlink r:id="rId278">
         <w:r>
           <w:rPr>
             <w:rStyle w:val="Hyperlink"/>
@@ -17516,8 +17785,8 @@
         <w:t xml:space="preserve">.</w:t>
       </w:r>
     </w:p>
-    <w:bookmarkEnd w:id="277"/>
-    <w:bookmarkStart w:id="279" w:name="ref-umaraliev2026persicamonoterpenes"/>
+    <w:bookmarkEnd w:id="279"/>
+    <w:bookmarkStart w:id="281" w:name="ref-umaraliev2026persicamonoterpenes"/>
     <w:p>
       <w:pPr>
         <w:pStyle w:val="Bibliography"/>
@@ -17557,7 +17826,7 @@
       <w:r>
         <w:t xml:space="preserve"> </w:t>
       </w:r>
-      <w:hyperlink r:id="rId278">
+      <w:hyperlink r:id="rId280">
         <w:r>
           <w:rPr>
             <w:rStyle w:val="Hyperlink"/>
@@ -17569,8 +17838,8 @@
         <w:t xml:space="preserve">.</w:t>
       </w:r>
     </w:p>
-    <w:bookmarkEnd w:id="279"/>
-    <w:bookmarkStart w:id="281" w:name="ref-urban2020trpc3"/>
+    <w:bookmarkEnd w:id="281"/>
+    <w:bookmarkStart w:id="283" w:name="ref-urban2020trpc3"/>
     <w:p>
       <w:pPr>
         <w:pStyle w:val="Bibliography"/>
@@ -17616,7 +17885,7 @@
       <w:r>
         <w:t xml:space="preserve"> </w:t>
       </w:r>
-      <w:hyperlink r:id="rId280">
+      <w:hyperlink r:id="rId282">
         <w:r>
           <w:rPr>
             <w:rStyle w:val="Hyperlink"/>
@@ -17628,8 +17897,8 @@
         <w:t xml:space="preserve">.</w:t>
       </w:r>
     </w:p>
-    <w:bookmarkEnd w:id="281"/>
-    <w:bookmarkStart w:id="283" w:name="ref-varadyova2018medicinalplants"/>
+    <w:bookmarkEnd w:id="283"/>
+    <w:bookmarkStart w:id="285" w:name="ref-varadyova2018medicinalplants"/>
     <w:p>
       <w:pPr>
         <w:pStyle w:val="Bibliography"/>
@@ -17672,7 +17941,7 @@
       <w:r>
         <w:t xml:space="preserve"> </w:t>
       </w:r>
-      <w:hyperlink r:id="rId282">
+      <w:hyperlink r:id="rId284">
         <w:r>
           <w:rPr>
             <w:rStyle w:val="Hyperlink"/>
@@ -17684,8 +17953,8 @@
         <w:t xml:space="preserve">.</w:t>
       </w:r>
     </w:p>
-    <w:bookmarkEnd w:id="283"/>
-    <w:bookmarkStart w:id="285" w:name="ref-walz2024aframalaria"/>
+    <w:bookmarkEnd w:id="285"/>
+    <w:bookmarkStart w:id="287" w:name="ref-walz2024aframalaria"/>
     <w:p>
       <w:pPr>
         <w:pStyle w:val="Bibliography"/>
@@ -17731,7 +18000,7 @@
       <w:r>
         <w:t xml:space="preserve"> </w:t>
       </w:r>
-      <w:hyperlink r:id="rId284">
+      <w:hyperlink r:id="rId286">
         <w:r>
           <w:rPr>
             <w:rStyle w:val="Hyperlink"/>
@@ -17743,8 +18012,8 @@
         <w:t xml:space="preserve">.</w:t>
       </w:r>
     </w:p>
-    <w:bookmarkEnd w:id="285"/>
-    <w:bookmarkStart w:id="287" w:name="ref-wang2013cyp71av1promoter"/>
+    <w:bookmarkEnd w:id="287"/>
+    <w:bookmarkStart w:id="289" w:name="ref-wang2013cyp71av1promoter"/>
     <w:p>
       <w:pPr>
         <w:pStyle w:val="Bibliography"/>
@@ -17778,7 +18047,7 @@
       <w:r>
         <w:t xml:space="preserve"> </w:t>
       </w:r>
-      <w:hyperlink r:id="rId286">
+      <w:hyperlink r:id="rId288">
         <w:r>
           <w:rPr>
             <w:rStyle w:val="Hyperlink"/>
@@ -17790,8 +18059,8 @@
         <w:t xml:space="preserve">.</w:t>
       </w:r>
     </w:p>
-    <w:bookmarkEnd w:id="287"/>
-    <w:bookmarkStart w:id="289" w:name="ref-wang2009trichometranscriptome"/>
+    <w:bookmarkEnd w:id="289"/>
+    <w:bookmarkStart w:id="291" w:name="ref-wang2009trichometranscriptome"/>
     <w:p>
       <w:pPr>
         <w:pStyle w:val="Bibliography"/>
@@ -17825,7 +18094,7 @@
       <w:r>
         <w:t xml:space="preserve"> </w:t>
       </w:r>
-      <w:hyperlink r:id="rId288">
+      <w:hyperlink r:id="rId290">
         <w:r>
           <w:rPr>
             <w:rStyle w:val="Hyperlink"/>
@@ -17837,8 +18106,8 @@
         <w:t xml:space="preserve">.</w:t>
       </w:r>
     </w:p>
-    <w:bookmarkEnd w:id="289"/>
-    <w:bookmarkStart w:id="291" w:name="ref-wani2023nitric"/>
+    <w:bookmarkEnd w:id="291"/>
+    <w:bookmarkStart w:id="293" w:name="ref-wani2023nitric"/>
     <w:p>
       <w:pPr>
         <w:pStyle w:val="Bibliography"/>
@@ -17896,7 +18165,7 @@
       <w:r>
         <w:t xml:space="preserve"> </w:t>
       </w:r>
-      <w:hyperlink r:id="rId290">
+      <w:hyperlink r:id="rId292">
         <w:r>
           <w:rPr>
             <w:rStyle w:val="Hyperlink"/>
@@ -17908,8 +18177,8 @@
         <w:t xml:space="preserve">.</w:t>
       </w:r>
     </w:p>
-    <w:bookmarkEnd w:id="291"/>
-    <w:bookmarkStart w:id="293" w:name="ref-wani2026maritima"/>
+    <w:bookmarkEnd w:id="293"/>
+    <w:bookmarkStart w:id="295" w:name="ref-wani2026maritima"/>
     <w:p>
       <w:pPr>
         <w:pStyle w:val="Bibliography"/>
@@ -17955,7 +18224,7 @@
       <w:r>
         <w:t xml:space="preserve"> </w:t>
       </w:r>
-      <w:hyperlink r:id="rId292">
+      <w:hyperlink r:id="rId294">
         <w:r>
           <w:rPr>
             <w:rStyle w:val="Hyperlink"/>
@@ -17967,8 +18236,8 @@
         <w:t xml:space="preserve">.</w:t>
       </w:r>
     </w:p>
-    <w:bookmarkEnd w:id="293"/>
-    <w:bookmarkStart w:id="295" w:name="ref-wetmore2019psiv9"/>
+    <w:bookmarkEnd w:id="295"/>
+    <w:bookmarkStart w:id="297" w:name="ref-wetmore2019psiv9"/>
     <w:p>
       <w:pPr>
         <w:pStyle w:val="Bibliography"/>
@@ -18014,7 +18283,7 @@
       <w:r>
         <w:t xml:space="preserve"> </w:t>
       </w:r>
-      <w:hyperlink r:id="rId294">
+      <w:hyperlink r:id="rId296">
         <w:r>
           <w:rPr>
             <w:rStyle w:val="Hyperlink"/>
@@ -18026,8 +18295,8 @@
         <w:t xml:space="preserve">.</w:t>
       </w:r>
     </w:p>
-    <w:bookmarkEnd w:id="295"/>
-    <w:bookmarkStart w:id="297" w:name="ref-wright2010qinghao"/>
+    <w:bookmarkEnd w:id="297"/>
+    <w:bookmarkStart w:id="299" w:name="ref-wright2010qinghao"/>
     <w:p>
       <w:pPr>
         <w:pStyle w:val="Bibliography"/>
@@ -18073,7 +18342,7 @@
       <w:r>
         <w:t xml:space="preserve"> </w:t>
       </w:r>
-      <w:hyperlink r:id="rId296">
+      <w:hyperlink r:id="rId298">
         <w:r>
           <w:rPr>
             <w:rStyle w:val="Hyperlink"/>
@@ -18085,8 +18354,8 @@
         <w:t xml:space="preserve">.</w:t>
       </w:r>
     </w:p>
-    <w:bookmarkEnd w:id="297"/>
-    <w:bookmarkStart w:id="299" w:name="ref-xiang2019bhlh112"/>
+    <w:bookmarkEnd w:id="299"/>
+    <w:bookmarkStart w:id="301" w:name="ref-xiang2019bhlh112"/>
     <w:p>
       <w:pPr>
         <w:pStyle w:val="Bibliography"/>
@@ -18120,7 +18389,7 @@
       <w:r>
         <w:t xml:space="preserve"> </w:t>
       </w:r>
-      <w:hyperlink r:id="rId298">
+      <w:hyperlink r:id="rId300">
         <w:r>
           <w:rPr>
             <w:rStyle w:val="Hyperlink"/>
@@ -18132,8 +18401,8 @@
         <w:t xml:space="preserve">.</w:t>
       </w:r>
     </w:p>
-    <w:bookmarkEnd w:id="299"/>
-    <w:bookmarkStart w:id="301" w:name="ref-xu2025plantmatrix"/>
+    <w:bookmarkEnd w:id="301"/>
+    <w:bookmarkStart w:id="303" w:name="ref-xu2025plantmatrix"/>
     <w:p>
       <w:pPr>
         <w:pStyle w:val="Bibliography"/>
@@ -18179,7 +18448,7 @@
       <w:r>
         <w:t xml:space="preserve"> </w:t>
       </w:r>
-      <w:hyperlink r:id="rId300">
+      <w:hyperlink r:id="rId302">
         <w:r>
           <w:rPr>
             <w:rStyle w:val="Hyperlink"/>
@@ -18191,8 +18460,8 @@
         <w:t xml:space="preserve">.</w:t>
       </w:r>
     </w:p>
-    <w:bookmarkEnd w:id="301"/>
-    <w:bookmarkStart w:id="303" w:name="ref-yildiz2011toxocara"/>
+    <w:bookmarkEnd w:id="303"/>
+    <w:bookmarkStart w:id="305" w:name="ref-yildiz2011toxocara"/>
     <w:p>
       <w:pPr>
         <w:pStyle w:val="Bibliography"/>
@@ -18250,7 +18519,7 @@
       <w:r>
         <w:t xml:space="preserve"> </w:t>
       </w:r>
-      <w:hyperlink r:id="rId302">
+      <w:hyperlink r:id="rId304">
         <w:r>
           <w:rPr>
             <w:rStyle w:val="Hyperlink"/>
@@ -18262,8 +18531,8 @@
         <w:t xml:space="preserve">.</w:t>
       </w:r>
     </w:p>
-    <w:bookmarkEnd w:id="303"/>
-    <w:bookmarkStart w:id="305" w:name="ref-zehra2020copper"/>
+    <w:bookmarkEnd w:id="305"/>
+    <w:bookmarkStart w:id="307" w:name="ref-zehra2020copper"/>
     <w:p>
       <w:pPr>
         <w:pStyle w:val="Bibliography"/>
@@ -18309,7 +18578,7 @@
       <w:r>
         <w:t xml:space="preserve"> </w:t>
       </w:r>
-      <w:hyperlink r:id="rId304">
+      <w:hyperlink r:id="rId306">
         <w:r>
           <w:rPr>
             <w:rStyle w:val="Hyperlink"/>
@@ -18321,8 +18590,8 @@
         <w:t xml:space="preserve">.</w:t>
       </w:r>
     </w:p>
-    <w:bookmarkEnd w:id="305"/>
-    <w:bookmarkStart w:id="307" w:name="ref-zhang2022fiveartemisia"/>
+    <w:bookmarkEnd w:id="307"/>
+    <w:bookmarkStart w:id="309" w:name="ref-zhang2022fiveartemisia"/>
     <w:p>
       <w:pPr>
         <w:pStyle w:val="Bibliography"/>
@@ -18368,7 +18637,7 @@
       <w:r>
         <w:t xml:space="preserve"> </w:t>
       </w:r>
-      <w:hyperlink r:id="rId306">
+      <w:hyperlink r:id="rId308">
         <w:r>
           <w:rPr>
             <w:rStyle w:val="Hyperlink"/>
@@ -18380,8 +18649,8 @@
         <w:t xml:space="preserve">.</w:t>
       </w:r>
     </w:p>
-    <w:bookmarkEnd w:id="307"/>
-    <w:bookmarkStart w:id="309" w:name="ref-zhang2020argyitriterpenoids"/>
+    <w:bookmarkEnd w:id="309"/>
+    <w:bookmarkStart w:id="311" w:name="ref-zhang2020argyitriterpenoids"/>
     <w:p>
       <w:pPr>
         <w:pStyle w:val="Bibliography"/>
@@ -18424,7 +18693,7 @@
       <w:r>
         <w:t xml:space="preserve"> </w:t>
       </w:r>
-      <w:hyperlink r:id="rId308">
+      <w:hyperlink r:id="rId310">
         <w:r>
           <w:rPr>
             <w:rStyle w:val="Hyperlink"/>
@@ -18436,8 +18705,8 @@
         <w:t xml:space="preserve">.</w:t>
       </w:r>
     </w:p>
-    <w:bookmarkEnd w:id="309"/>
-    <w:bookmarkStart w:id="311" w:name="ref-zhang2019pp2c1"/>
+    <w:bookmarkEnd w:id="311"/>
+    <w:bookmarkStart w:id="313" w:name="ref-zhang2019pp2c1"/>
     <w:p>
       <w:pPr>
         <w:pStyle w:val="Bibliography"/>
@@ -18489,7 +18758,7 @@
       <w:r>
         <w:t xml:space="preserve"> </w:t>
       </w:r>
-      <w:hyperlink r:id="rId310">
+      <w:hyperlink r:id="rId312">
         <w:r>
           <w:rPr>
             <w:rStyle w:val="Hyperlink"/>
@@ -18501,8 +18770,8 @@
         <w:t xml:space="preserve">.</w:t>
       </w:r>
     </w:p>
-    <w:bookmarkEnd w:id="311"/>
-    <w:bookmarkStart w:id="313" w:name="ref-zhang2008dbr2"/>
+    <w:bookmarkEnd w:id="313"/>
+    <w:bookmarkStart w:id="315" w:name="ref-zhang2008dbr2"/>
     <w:p>
       <w:pPr>
         <w:pStyle w:val="Bibliography"/>
@@ -18536,7 +18805,7 @@
       <w:r>
         <w:t xml:space="preserve"> </w:t>
       </w:r>
-      <w:hyperlink r:id="rId312">
+      <w:hyperlink r:id="rId314">
         <w:r>
           <w:rPr>
             <w:rStyle w:val="Hyperlink"/>
@@ -18548,8 +18817,8 @@
         <w:t xml:space="preserve">.</w:t>
       </w:r>
     </w:p>
-    <w:bookmarkEnd w:id="313"/>
-    <w:bookmarkStart w:id="315" w:name="ref-frigida2023variability"/>
+    <w:bookmarkEnd w:id="315"/>
+    <w:bookmarkStart w:id="317" w:name="ref-frigida2023variability"/>
     <w:p>
       <w:pPr>
         <w:pStyle w:val="Bibliography"/>
@@ -18583,7 +18852,7 @@
       <w:r>
         <w:t xml:space="preserve"> </w:t>
       </w:r>
-      <w:hyperlink r:id="rId314">
+      <w:hyperlink r:id="rId316">
         <w:r>
           <w:rPr>
             <w:rStyle w:val="Hyperlink"/>
@@ -18595,9 +18864,9 @@
         <w:t xml:space="preserve">.</w:t>
       </w:r>
     </w:p>
-    <w:bookmarkEnd w:id="315"/>
-    <w:bookmarkEnd w:id="316"/>
     <w:bookmarkEnd w:id="317"/>
+    <w:bookmarkEnd w:id="318"/>
+    <w:bookmarkEnd w:id="319"/>
     <w:sectPr>
       <w:headerReference w:type="default" r:id="rId9"/>
       <w:footerReference w:type="default" r:id="rId10"/>

</xml_diff>

<commit_message>
Advance full-text evidence audit for campestris helminth study
</commit_message>
<xml_diff>
--- a/manuscript/artemisia-terpene-review-submission.docx
+++ b/manuscript/artemisia-terpene-review-submission.docx
@@ -199,7 +199,7 @@
         <w:t xml:space="preserve"> </w:t>
       </w:r>
       <w:r>
-        <w:t xml:space="preserve">contains volatile monoterpenes and sesquiterpenes, less volatile diterpenes and triterpenes, and structurally diverse sesquiterpene lactones (STLs). These metabolites are often discussed as though a species name, a pathway gene, or an oil profile were sufficient to predict pharmacology. Here we present a source-auditable living scoping review that instead treats the specimen, accession, tissue, preparation, analytical method, parasite stage, and evidence level as the units of comparison. The Terpedia package registers 538 sources, 553 source-linked evidence records, 129 antiparasitic records, 19 parasite–protein interaction records, 179 compound/specimen records, and 402 audited article claims; 81 sources and 96 linked evidence rows have completed full-text verification, while 29 queue sources remain open. We synthesize terpene classes with biosynthetic compartmentalization, regulatory and environmental variation, and a bounded comparative-genomics analysis. Artemisinin biosynthesis in</w:t>
+        <w:t xml:space="preserve">contains volatile monoterpenes and sesquiterpenes, less volatile diterpenes and triterpenes, and structurally diverse sesquiterpene lactones (STLs). These metabolites are often discussed as though a species name, a pathway gene, or an oil profile were sufficient to predict pharmacology. Here we present a source-auditable living scoping review that instead treats the specimen, accession, tissue, preparation, analytical method, parasite stage, and evidence level as the units of comparison. The Terpedia package registers 538 sources, 553 source-linked evidence records, 129 antiparasitic records, 19 parasite–protein interaction records, 179 compound/specimen records, and 403 audited article claims; 82 sources and 97 linked evidence rows have completed full-text verification, while 28 queue sources remain open. We synthesize terpene classes with biosynthetic compartmentalization, regulatory and environmental variation, and a bounded comparative-genomics analysis. Artemisinin biosynthesis in</w:t>
       </w:r>
       <w:r>
         <w:t xml:space="preserve"> </w:t>
@@ -452,7 +452,23 @@
         <w:spacing w:before="0" w:after="120" w:line="264" w:lineRule="auto"/>
       </w:pPr>
       <w:r>
-        <w:t xml:space="preserve">The package is deliberately a living scoping review rather than a completed systematic review. It contains 1,408 bounded title/abstract decisions, covering all 1,387 priority-queue records plus 21 historical or out-of-queue decisions. Full-text verification now covers 81 publicly accessible or publisher-full-text antiparasitic sources and 96 linked evidence rows; 29 queue sources remain unverified, and no result is pooled as a final quantitative estimate. The PRISMA-ScR mapping is archived in</w:t>
+        <w:t xml:space="preserve">The package is deliberately a living scoping review rather than a completed systematic review. It contains 1,408 bounded title/abstract decisions, covering all 1,387 priority-queue records plus 21 historical or out-of-queue decisions. Full-text verification now covers 82 publicly accessible or publisher-indexed antiparasitic sources and 97 linked evidence rows; 28 queue sources remain unverified, and no result is pooled as a final quantitative estimate. The</w:t>
+      </w:r>
+      <w:r>
+        <w:t xml:space="preserve"> </w:t>
+      </w:r>
+      <w:r>
+        <w:rPr>
+          <w:i/>
+          <w:iCs/>
+        </w:rPr>
+        <w:t xml:space="preserve">A. campestris</w:t>
+      </w:r>
+      <w:r>
+        <w:t xml:space="preserve"> </w:t>
+      </w:r>
+      <w:r>
+        <w:t xml:space="preserve">oil study is retained at publisher-section resolution because its complete tables were not recoverable. The PRISMA-ScR mapping is archived in</w:t>
       </w:r>
       <w:r>
         <w:t xml:space="preserve"> </w:t>
@@ -7143,7 +7159,7 @@
         <w:spacing w:before="0" w:after="120" w:line="264" w:lineRule="auto"/>
       </w:pPr>
       <w:r>
-        <w:t xml:space="preserve">Two queued abstract-level comparisons add quantitative context to the wormwood vermifuge hypothesis. A beta-pinene-rich</w:t>
+        <w:t xml:space="preserve">The publisher-indexed</w:t>
       </w:r>
       <w:r>
         <w:t xml:space="preserve"> </w:t>
@@ -7159,7 +7175,7 @@
         <w:t xml:space="preserve"> </w:t>
       </w:r>
       <w:r>
-        <w:t xml:space="preserve">essential oil contained 50 identified compounds representing 99.98% of the oil; it produced 100%</w:t>
+        <w:t xml:space="preserve">oil record adds quantitative context to the wormwood vermifuge hypothesis. The oil contained 50 identified compounds representing 99.98% of the oil and was dominated by beta-pinene (36.40%) and 2-undecanone (14.70%); it produced 100%</w:t>
       </w:r>
       <w:r>
         <w:t xml:space="preserve"> </w:t>
@@ -7191,7 +7207,7 @@
         <w:t xml:space="preserve"> </w:t>
       </w:r>
       <w:r>
-        <w:t xml:space="preserve">at 5000 mg/kg. Because 2-undecanone was the second major constituent and is not a terpene, the result does not identify beta-pinene as causal. In the 13-plant comparison, methanolic</w:t>
+        <w:t xml:space="preserve">at 5000 mg/kg. Because 2-undecanone was a major non-terpene component and the complete tables were inaccessible, beta-pinene remains a candidate correlate rather than a causal molecule. In the separate 13-plant comparison, methanolic</w:t>
       </w:r>
       <w:r>
         <w:t xml:space="preserve"> </w:t>
@@ -9521,6 +9537,162 @@
                 <w:sz w:val="18"/>
               </w:rPr>
               <w:t xml:space="preserve">(Caner et al. 2008)</w:t>
+            </w:r>
+          </w:p>
+        </w:tc>
+      </w:tr>
+      <w:tr>
+        <w:trPr>
+          <w:cantSplit w:val="true"/>
+        </w:trPr>
+        <w:tc>
+          <w:tcPr>
+            <w:tcW w:w="1800" w:type="dxa"/>
+            <w:tcMar>
+              <w:top w:w="80" w:type="dxa"/>
+              <w:start w:w="120" w:type="dxa"/>
+              <w:bottom w:w="80" w:type="dxa"/>
+              <w:end w:w="120" w:type="dxa"/>
+            </w:tcMar>
+            <w:vAlign w:val="center"/>
+          </w:tcPr>
+          <w:p>
+            <w:pPr>
+              <w:pStyle w:val="Compact"/>
+              <w:spacing w:before="0" w:after="40" w:line="240" w:lineRule="auto"/>
+            </w:pPr>
+            <w:r>
+              <w:rPr>
+                <w:rFonts w:ascii="Calibri" w:hAnsi="Calibri"/>
+                <w:i/>
+                <w:iCs/>
+                <w:sz w:val="18"/>
+              </w:rPr>
+              <w:t xml:space="preserve">A. campestris</w:t>
+            </w:r>
+            <w:r>
+              <w:rPr>
+                <w:rFonts w:ascii="Calibri" w:hAnsi="Calibri"/>
+                <w:sz w:val="18"/>
+              </w:rPr>
+              <w:t xml:space="preserve"> </w:t>
+            </w:r>
+            <w:r>
+              <w:rPr>
+                <w:rFonts w:ascii="Calibri" w:hAnsi="Calibri"/>
+                <w:sz w:val="18"/>
+              </w:rPr>
+              <w:t xml:space="preserve">oil /</w:t>
+            </w:r>
+            <w:r>
+              <w:rPr>
+                <w:rFonts w:ascii="Calibri" w:hAnsi="Calibri"/>
+                <w:sz w:val="18"/>
+              </w:rPr>
+              <w:t xml:space="preserve"> </w:t>
+            </w:r>
+            <w:r>
+              <w:rPr>
+                <w:rFonts w:ascii="Calibri" w:hAnsi="Calibri"/>
+                <w:i/>
+                <w:iCs/>
+                <w:sz w:val="18"/>
+              </w:rPr>
+              <w:t xml:space="preserve">H. contortus</w:t>
+            </w:r>
+            <w:r>
+              <w:rPr>
+                <w:rFonts w:ascii="Calibri" w:hAnsi="Calibri"/>
+                <w:sz w:val="18"/>
+              </w:rPr>
+              <w:t xml:space="preserve"> </w:t>
+            </w:r>
+            <w:r>
+              <w:rPr>
+                <w:rFonts w:ascii="Calibri" w:hAnsi="Calibri"/>
+                <w:sz w:val="18"/>
+              </w:rPr>
+              <w:t xml:space="preserve">and</w:t>
+            </w:r>
+            <w:r>
+              <w:rPr>
+                <w:rFonts w:ascii="Calibri" w:hAnsi="Calibri"/>
+                <w:sz w:val="18"/>
+              </w:rPr>
+              <w:t xml:space="preserve"> </w:t>
+            </w:r>
+            <w:r>
+              <w:rPr>
+                <w:rFonts w:ascii="Calibri" w:hAnsi="Calibri"/>
+                <w:i/>
+                <w:iCs/>
+                <w:sz w:val="18"/>
+              </w:rPr>
+              <w:t xml:space="preserve">H. polygyrus</w:t>
+            </w:r>
+          </w:p>
+        </w:tc>
+        <w:tc>
+          <w:tcPr>
+            <w:tcW w:w="2800" w:type="dxa"/>
+            <w:tcMar>
+              <w:top w:w="80" w:type="dxa"/>
+              <w:start w:w="120" w:type="dxa"/>
+              <w:bottom w:w="80" w:type="dxa"/>
+              <w:end w:w="120" w:type="dxa"/>
+            </w:tcMar>
+            <w:vAlign w:val="center"/>
+          </w:tcPr>
+          <w:p>
+            <w:pPr>
+              <w:pStyle w:val="Compact"/>
+              <w:spacing w:before="0" w:after="40" w:line="240" w:lineRule="auto"/>
+            </w:pPr>
+            <w:r>
+              <w:rPr>
+                <w:rFonts w:ascii="Calibri" w:hAnsi="Calibri"/>
+                <w:sz w:val="18"/>
+              </w:rPr>
+              <w:t xml:space="preserve">Beta-pinene-rich oil produced complete egg-hatch inhibition at 2 mg/mL, 66.6% adult-worm motility inhibition at 0.5 mg/mL, and 72% total-worm-count reduction at 5000 mg/kg</w:t>
+            </w:r>
+          </w:p>
+        </w:tc>
+        <w:tc>
+          <w:tcPr>
+            <w:tcW w:w="2400" w:type="dxa"/>
+            <w:tcMar>
+              <w:top w:w="80" w:type="dxa"/>
+              <w:start w:w="120" w:type="dxa"/>
+              <w:bottom w:w="80" w:type="dxa"/>
+              <w:end w:w="120" w:type="dxa"/>
+            </w:tcMar>
+            <w:vAlign w:val="center"/>
+          </w:tcPr>
+          <w:p>
+            <w:pPr>
+              <w:pStyle w:val="Compact"/>
+              <w:spacing w:before="0" w:after="40" w:line="240" w:lineRule="auto"/>
+            </w:pPr>
+            <w:r>
+              <w:rPr>
+                <w:rFonts w:ascii="Calibri" w:hAnsi="Calibri"/>
+                <w:sz w:val="18"/>
+              </w:rPr>
+              <w:t xml:space="preserve">Publisher-indexed primary record with inaccessible full tables; 2-undecanone is a major non-terpene and no causal constituent or host-safety boundary was established</w:t>
+            </w:r>
+            <w:r>
+              <w:rPr>
+                <w:rFonts w:ascii="Calibri" w:hAnsi="Calibri"/>
+                <w:sz w:val="18"/>
+              </w:rPr>
+              <w:t xml:space="preserve"> </w:t>
+            </w:r>
+            <w:r>
+              <w:rPr>
+                <w:rFonts w:ascii="Calibri" w:hAnsi="Calibri"/>
+                <w:sz w:val="18"/>
+              </w:rPr>
+              <w:t xml:space="preserve">(Abidi et al. 2018)</w:t>
             </w:r>
           </w:p>
         </w:tc>

</xml_diff>

<commit_message>
Record critical review flag for campestris study
</commit_message>
<xml_diff>
--- a/manuscript/artemisia-terpene-review-submission.docx
+++ b/manuscript/artemisia-terpene-review-submission.docx
@@ -199,7 +199,7 @@
         <w:t xml:space="preserve"> </w:t>
       </w:r>
       <w:r>
-        <w:t xml:space="preserve">contains volatile monoterpenes and sesquiterpenes, less volatile diterpenes and triterpenes, and structurally diverse sesquiterpene lactones (STLs). These metabolites are often discussed as though a species name, a pathway gene, or an oil profile were sufficient to predict pharmacology. Here we present a source-auditable living scoping review that instead treats the specimen, accession, tissue, preparation, analytical method, parasite stage, and evidence level as the units of comparison. The Terpedia package registers 538 sources, 553 source-linked evidence records, 129 antiparasitic records, 19 parasite–protein interaction records, 179 compound/specimen records, and 403 audited article claims; 82 sources and 97 linked evidence rows have completed full-text verification, while 28 queue sources remain open. We synthesize terpene classes with biosynthetic compartmentalization, regulatory and environmental variation, and a bounded comparative-genomics analysis. Artemisinin biosynthesis in</w:t>
+        <w:t xml:space="preserve">contains volatile monoterpenes and sesquiterpenes, less volatile diterpenes and triterpenes, and structurally diverse sesquiterpene lactones (STLs). These metabolites are often discussed as though a species name, a pathway gene, or an oil profile were sufficient to predict pharmacology. Here we present a source-auditable living scoping review that instead treats the specimen, accession, tissue, preparation, analytical method, parasite stage, and evidence level as the units of comparison. The Terpedia package registers 538 sources, 553 source-linked evidence records, 129 antiparasitic records, 19 parasite–protein interaction records, 179 compound/specimen records, and 404 audited article claims; 82 sources and 97 linked evidence rows have completed full-text verification, while 28 queue sources remain open. We synthesize terpene classes with biosynthetic compartmentalization, regulatory and environmental variation, and a bounded comparative-genomics analysis. Artemisinin biosynthesis in</w:t>
       </w:r>
       <w:r>
         <w:t xml:space="preserve"> </w:t>
@@ -7250,6 +7250,37 @@
       <w:r>
         <w:t xml:space="preserve">.</w:t>
       </w:r>
+      <w:r>
+        <w:t xml:space="preserve"> </w:t>
+      </w:r>
+      <w:r>
+        <w:t xml:space="preserve">The</w:t>
+      </w:r>
+      <w:r>
+        <w:t xml:space="preserve"> </w:t>
+      </w:r>
+      <w:r>
+        <w:rPr>
+          <w:i/>
+          <w:iCs/>
+        </w:rPr>
+        <w:t xml:space="preserve">A. campestris</w:t>
+      </w:r>
+      <w:r>
+        <w:t xml:space="preserve"> </w:t>
+      </w:r>
+      <w:r>
+        <w:t xml:space="preserve">record also has a formally indexed 2019 comment linked to the original paper. Because the accessible PubMed record identifies the comment but does not expose its substantive text, we retain it as a critical-review flag rather than infer a specific correction; the study should not enter pooled quantitative synthesis until the comment and complete tables are independently recovered</w:t>
+      </w:r>
+      <w:r>
+        <w:t xml:space="preserve"> </w:t>
+      </w:r>
+      <w:r>
+        <w:t xml:space="preserve">(Ongo 2019)</w:t>
+      </w:r>
+      <w:r>
+        <w:t xml:space="preserve">.</w:t>
+      </w:r>
     </w:p>
     <w:p>
       <w:pPr>
@@ -11222,7 +11253,7 @@
     <w:bookmarkEnd w:id="47"/>
     <w:bookmarkEnd w:id="48"/>
     <w:bookmarkEnd w:id="49"/>
-    <w:bookmarkStart w:id="319" w:name="references"/>
+    <w:bookmarkStart w:id="321" w:name="references"/>
     <w:p>
       <w:pPr>
         <w:pStyle w:val="Heading1"/>
@@ -11232,7 +11263,7 @@
         <w:t xml:space="preserve">References</w:t>
       </w:r>
     </w:p>
-    <w:bookmarkStart w:id="318" w:name="refs"/>
+    <w:bookmarkStart w:id="320" w:name="refs"/>
     <w:bookmarkStart w:id="51" w:name="ref-abad2012artemisia"/>
     <w:p>
       <w:pPr>
@@ -16228,13 +16259,81 @@
       </w:r>
     </w:p>
     <w:bookmarkEnd w:id="217"/>
-    <w:bookmarkStart w:id="219" w:name="ref-ortet2008gorgonum"/>
+    <w:bookmarkStart w:id="219" w:name="ref-ongo2019campestriscomment"/>
     <w:p>
       <w:pPr>
         <w:pStyle w:val="Bibliography"/>
         <w:spacing w:before="0" w:after="120" w:line="264" w:lineRule="auto"/>
       </w:pPr>
       <w:r>
+        <w:t xml:space="preserve">Ongo, E. 2019.</w:t>
+      </w:r>
+      <w:r>
+        <w:t xml:space="preserve"> </w:t>
+      </w:r>
+      <w:r>
+        <w:t xml:space="preserve">“Comment on the Paper</w:t>
+      </w:r>
+      <w:r>
+        <w:t xml:space="preserve"> </w:t>
+      </w:r>
+      <w:r>
+        <w:t xml:space="preserve">‘Chemical Analyses and Anthelmintic Effects of</w:t>
+      </w:r>
+      <w:r>
+        <w:t xml:space="preserve"> </w:t>
+      </w:r>
+      <w:r>
+        <w:t xml:space="preserve">Artemisia campestris</w:t>
+      </w:r>
+      <w:r>
+        <w:t xml:space="preserve"> </w:t>
+      </w:r>
+      <w:r>
+        <w:t xml:space="preserve">Essential Oil’</w:t>
+      </w:r>
+      <w:r>
+        <w:t xml:space="preserve">.”</w:t>
+      </w:r>
+      <w:r>
+        <w:t xml:space="preserve"> </w:t>
+      </w:r>
+      <w:r>
+        <w:rPr>
+          <w:i/>
+          <w:iCs/>
+        </w:rPr>
+        <w:t xml:space="preserve">Veterinary Parasitology</w:t>
+      </w:r>
+      <w:r>
+        <w:t xml:space="preserve"> </w:t>
+      </w:r>
+      <w:r>
+        <w:t xml:space="preserve">267: 60.</w:t>
+      </w:r>
+      <w:r>
+        <w:t xml:space="preserve"> </w:t>
+      </w:r>
+      <w:hyperlink r:id="rId218">
+        <w:r>
+          <w:rPr>
+            <w:rStyle w:val="Hyperlink"/>
+          </w:rPr>
+          <w:t xml:space="preserve">https://doi.org/10.1016/j.vetpar.2018.12.010</w:t>
+        </w:r>
+      </w:hyperlink>
+      <w:r>
+        <w:t xml:space="preserve">.</w:t>
+      </w:r>
+    </w:p>
+    <w:bookmarkEnd w:id="219"/>
+    <w:bookmarkStart w:id="221" w:name="ref-ortet2008gorgonum"/>
+    <w:p>
+      <w:pPr>
+        <w:pStyle w:val="Bibliography"/>
+        <w:spacing w:before="0" w:after="120" w:line="264" w:lineRule="auto"/>
+      </w:pPr>
+      <w:r>
         <w:t xml:space="preserve">Ortet, R, S Prado, E Mouray, and O P Thomas. 2008.</w:t>
       </w:r>
       <w:r>
@@ -16262,7 +16361,7 @@
       <w:r>
         <w:t xml:space="preserve"> </w:t>
       </w:r>
-      <w:hyperlink r:id="rId218">
+      <w:hyperlink r:id="rId220">
         <w:r>
           <w:rPr>
             <w:rStyle w:val="Hyperlink"/>
@@ -16274,8 +16373,8 @@
         <w:t xml:space="preserve">.</w:t>
       </w:r>
     </w:p>
-    <w:bookmarkEnd w:id="219"/>
-    <w:bookmarkStart w:id="221" w:name="ref-osanloo2022dracunculusnanogel"/>
+    <w:bookmarkEnd w:id="221"/>
+    <w:bookmarkStart w:id="223" w:name="ref-osanloo2022dracunculusnanogel"/>
     <w:p>
       <w:pPr>
         <w:pStyle w:val="Bibliography"/>
@@ -16321,7 +16420,7 @@
       <w:r>
         <w:t xml:space="preserve"> </w:t>
       </w:r>
-      <w:hyperlink r:id="rId220">
+      <w:hyperlink r:id="rId222">
         <w:r>
           <w:rPr>
             <w:rStyle w:val="Hyperlink"/>
@@ -16333,8 +16432,8 @@
         <w:t xml:space="preserve">.</w:t>
       </w:r>
     </w:p>
-    <w:bookmarkEnd w:id="221"/>
-    <w:bookmarkStart w:id="223" w:name="ref-oyedeji2009afra"/>
+    <w:bookmarkEnd w:id="223"/>
+    <w:bookmarkStart w:id="225" w:name="ref-oyedeji2009afra"/>
     <w:p>
       <w:pPr>
         <w:pStyle w:val="Bibliography"/>
@@ -16368,7 +16467,7 @@
       <w:r>
         <w:t xml:space="preserve"> </w:t>
       </w:r>
-      <w:hyperlink r:id="rId222">
+      <w:hyperlink r:id="rId224">
         <w:r>
           <w:rPr>
             <w:rStyle w:val="Hyperlink"/>
@@ -16380,8 +16479,8 @@
         <w:t xml:space="preserve">.</w:t>
       </w:r>
     </w:p>
-    <w:bookmarkEnd w:id="223"/>
-    <w:bookmarkStart w:id="225" w:name="ref-pandey2017artemisiaoils"/>
+    <w:bookmarkEnd w:id="225"/>
+    <w:bookmarkStart w:id="227" w:name="ref-pandey2017artemisiaoils"/>
     <w:p>
       <w:pPr>
         <w:pStyle w:val="Bibliography"/>
@@ -16415,7 +16514,7 @@
       <w:r>
         <w:t xml:space="preserve"> </w:t>
       </w:r>
-      <w:hyperlink r:id="rId224">
+      <w:hyperlink r:id="rId226">
         <w:r>
           <w:rPr>
             <w:rStyle w:val="Hyperlink"/>
@@ -16427,8 +16526,8 @@
         <w:t xml:space="preserve">.</w:t>
       </w:r>
     </w:p>
-    <w:bookmarkEnd w:id="225"/>
-    <w:bookmarkStart w:id="227" w:name="ref-parveen2024scoparia"/>
+    <w:bookmarkEnd w:id="227"/>
+    <w:bookmarkStart w:id="229" w:name="ref-parveen2024scoparia"/>
     <w:p>
       <w:pPr>
         <w:pStyle w:val="Bibliography"/>
@@ -16474,7 +16573,7 @@
       <w:r>
         <w:t xml:space="preserve"> </w:t>
       </w:r>
-      <w:hyperlink r:id="rId226">
+      <w:hyperlink r:id="rId228">
         <w:r>
           <w:rPr>
             <w:rStyle w:val="Hyperlink"/>
@@ -16486,8 +16585,8 @@
         <w:t xml:space="preserve">.</w:t>
       </w:r>
     </w:p>
-    <w:bookmarkEnd w:id="227"/>
-    <w:bookmarkStart w:id="229" w:name="ref-paul2010recurrent"/>
+    <w:bookmarkEnd w:id="229"/>
+    <w:bookmarkStart w:id="231" w:name="ref-paul2010recurrent"/>
     <w:p>
       <w:pPr>
         <w:pStyle w:val="Bibliography"/>
@@ -16533,7 +16632,7 @@
       <w:r>
         <w:t xml:space="preserve"> </w:t>
       </w:r>
-      <w:hyperlink r:id="rId228">
+      <w:hyperlink r:id="rId230">
         <w:r>
           <w:rPr>
             <w:rStyle w:val="Hyperlink"/>
@@ -16545,8 +16644,8 @@
         <w:t xml:space="preserve">.</w:t>
       </w:r>
     </w:p>
-    <w:bookmarkEnd w:id="229"/>
-    <w:bookmarkStart w:id="231" w:name="ref-pirali2011tick"/>
+    <w:bookmarkEnd w:id="231"/>
+    <w:bookmarkStart w:id="233" w:name="ref-pirali2011tick"/>
     <w:p>
       <w:pPr>
         <w:pStyle w:val="Bibliography"/>
@@ -16604,7 +16703,7 @@
       <w:r>
         <w:t xml:space="preserve"> </w:t>
       </w:r>
-      <w:hyperlink r:id="rId230">
+      <w:hyperlink r:id="rId232">
         <w:r>
           <w:rPr>
             <w:rStyle w:val="Hyperlink"/>
@@ -16616,8 +16715,8 @@
         <w:t xml:space="preserve">.</w:t>
       </w:r>
     </w:p>
-    <w:bookmarkEnd w:id="231"/>
-    <w:bookmarkStart w:id="233" w:name="ref-radulovic2013toxic"/>
+    <w:bookmarkEnd w:id="233"/>
+    <w:bookmarkStart w:id="235" w:name="ref-radulovic2013toxic"/>
     <w:p>
       <w:pPr>
         <w:pStyle w:val="Bibliography"/>
@@ -16651,7 +16750,7 @@
       <w:r>
         <w:t xml:space="preserve"> </w:t>
       </w:r>
-      <w:hyperlink r:id="rId232">
+      <w:hyperlink r:id="rId234">
         <w:r>
           <w:rPr>
             <w:rStyle w:val="Hyperlink"/>
@@ -16663,8 +16762,8 @@
         <w:t xml:space="preserve">.</w:t>
       </w:r>
     </w:p>
-    <w:bookmarkEnd w:id="233"/>
-    <w:bookmarkStart w:id="235" w:name="ref-ram1997density"/>
+    <w:bookmarkEnd w:id="235"/>
+    <w:bookmarkStart w:id="237" w:name="ref-ram1997density"/>
     <w:p>
       <w:pPr>
         <w:pStyle w:val="Bibliography"/>
@@ -16710,7 +16809,7 @@
       <w:r>
         <w:t xml:space="preserve"> </w:t>
       </w:r>
-      <w:hyperlink r:id="rId234">
+      <w:hyperlink r:id="rId236">
         <w:r>
           <w:rPr>
             <w:rStyle w:val="Hyperlink"/>
@@ -16722,8 +16821,8 @@
         <w:t xml:space="preserve">.</w:t>
       </w:r>
     </w:p>
-    <w:bookmarkEnd w:id="235"/>
-    <w:bookmarkStart w:id="237" w:name="ref-ribbiso2021heme"/>
+    <w:bookmarkEnd w:id="237"/>
+    <w:bookmarkStart w:id="239" w:name="ref-ribbiso2021heme"/>
     <w:p>
       <w:pPr>
         <w:pStyle w:val="Bibliography"/>
@@ -16769,7 +16868,7 @@
       <w:r>
         <w:t xml:space="preserve"> </w:t>
       </w:r>
-      <w:hyperlink r:id="rId236">
+      <w:hyperlink r:id="rId238">
         <w:r>
           <w:rPr>
             <w:rStyle w:val="Hyperlink"/>
@@ -16781,8 +16880,8 @@
         <w:t xml:space="preserve">.</w:t>
       </w:r>
     </w:p>
-    <w:bookmarkEnd w:id="237"/>
-    <w:bookmarkStart w:id="239" w:name="ref-rosenthal2024proteostasis"/>
+    <w:bookmarkEnd w:id="239"/>
+    <w:bookmarkStart w:id="241" w:name="ref-rosenthal2024proteostasis"/>
     <w:p>
       <w:pPr>
         <w:pStyle w:val="Bibliography"/>
@@ -16825,7 +16924,7 @@
       <w:r>
         <w:t xml:space="preserve"> </w:t>
       </w:r>
-      <w:hyperlink r:id="rId238">
+      <w:hyperlink r:id="rId240">
         <w:r>
           <w:rPr>
             <w:rStyle w:val="Hyperlink"/>
@@ -16837,8 +16936,8 @@
         <w:t xml:space="preserve">.</w:t>
       </w:r>
     </w:p>
-    <w:bookmarkEnd w:id="239"/>
-    <w:bookmarkStart w:id="241" w:name="ref-rostkowska2016silicon"/>
+    <w:bookmarkEnd w:id="241"/>
+    <w:bookmarkStart w:id="243" w:name="ref-rostkowska2016silicon"/>
     <w:p>
       <w:pPr>
         <w:pStyle w:val="Bibliography"/>
@@ -16896,7 +16995,7 @@
       <w:r>
         <w:t xml:space="preserve"> </w:t>
       </w:r>
-      <w:hyperlink r:id="rId240">
+      <w:hyperlink r:id="rId242">
         <w:r>
           <w:rPr>
             <w:rStyle w:val="Hyperlink"/>
@@ -16908,8 +17007,8 @@
         <w:t xml:space="preserve">.</w:t>
       </w:r>
     </w:p>
-    <w:bookmarkEnd w:id="241"/>
-    <w:bookmarkStart w:id="243" w:name="ref-annua2016monoterpenes"/>
+    <w:bookmarkEnd w:id="243"/>
+    <w:bookmarkStart w:id="245" w:name="ref-annua2016monoterpenes"/>
     <w:p>
       <w:pPr>
         <w:pStyle w:val="Bibliography"/>
@@ -16943,7 +17042,7 @@
       <w:r>
         <w:t xml:space="preserve"> </w:t>
       </w:r>
-      <w:hyperlink r:id="rId242">
+      <w:hyperlink r:id="rId244">
         <w:r>
           <w:rPr>
             <w:rStyle w:val="Hyperlink"/>
@@ -16955,8 +17054,8 @@
         <w:t xml:space="preserve">.</w:t>
       </w:r>
     </w:p>
-    <w:bookmarkEnd w:id="243"/>
-    <w:bookmarkStart w:id="245" w:name="ref-said2016vcd"/>
+    <w:bookmarkEnd w:id="245"/>
+    <w:bookmarkStart w:id="247" w:name="ref-said2016vcd"/>
     <w:p>
       <w:pPr>
         <w:pStyle w:val="Bibliography"/>
@@ -17002,7 +17101,7 @@
       <w:r>
         <w:t xml:space="preserve"> </w:t>
       </w:r>
-      <w:hyperlink r:id="rId244">
+      <w:hyperlink r:id="rId246">
         <w:r>
           <w:rPr>
             <w:rStyle w:val="Hyperlink"/>
@@ -17014,8 +17113,8 @@
         <w:t xml:space="preserve">.</w:t>
       </w:r>
     </w:p>
-    <w:bookmarkEnd w:id="245"/>
-    <w:bookmarkStart w:id="247" w:name="ref-sanei2023nanoliposomes"/>
+    <w:bookmarkEnd w:id="247"/>
+    <w:bookmarkStart w:id="249" w:name="ref-sanei2023nanoliposomes"/>
     <w:p>
       <w:pPr>
         <w:pStyle w:val="Bibliography"/>
@@ -17082,7 +17181,7 @@
       <w:r>
         <w:t xml:space="preserve"> </w:t>
       </w:r>
-      <w:hyperlink r:id="rId246">
+      <w:hyperlink r:id="rId248">
         <w:r>
           <w:rPr>
             <w:rStyle w:val="Hyperlink"/>
@@ -17094,8 +17193,8 @@
         <w:t xml:space="preserve">.</w:t>
       </w:r>
     </w:p>
-    <w:bookmarkEnd w:id="247"/>
-    <w:bookmarkStart w:id="249" w:name="ref-schramek2010isotope"/>
+    <w:bookmarkEnd w:id="249"/>
+    <w:bookmarkStart w:id="251" w:name="ref-schramek2010isotope"/>
     <w:p>
       <w:pPr>
         <w:pStyle w:val="Bibliography"/>
@@ -17129,7 +17228,7 @@
       <w:r>
         <w:t xml:space="preserve"> </w:t>
       </w:r>
-      <w:hyperlink r:id="rId248">
+      <w:hyperlink r:id="rId250">
         <w:r>
           <w:rPr>
             <w:rStyle w:val="Hyperlink"/>
@@ -17141,8 +17240,8 @@
         <w:t xml:space="preserve">.</w:t>
       </w:r>
     </w:p>
-    <w:bookmarkEnd w:id="249"/>
-    <w:bookmarkStart w:id="251" w:name="ref-shen2012cypcpr"/>
+    <w:bookmarkEnd w:id="251"/>
+    <w:bookmarkStart w:id="253" w:name="ref-shen2012cypcpr"/>
     <w:p>
       <w:pPr>
         <w:pStyle w:val="Bibliography"/>
@@ -17200,7 +17299,7 @@
       <w:r>
         <w:t xml:space="preserve"> </w:t>
       </w:r>
-      <w:hyperlink r:id="rId250">
+      <w:hyperlink r:id="rId252">
         <w:r>
           <w:rPr>
             <w:rStyle w:val="Hyperlink"/>
@@ -17212,8 +17311,8 @@
         <w:t xml:space="preserve">.</w:t>
       </w:r>
     </w:p>
-    <w:bookmarkEnd w:id="251"/>
-    <w:bookmarkStart w:id="253" w:name="ref-shi2022annuaantimalarialmetabolomics"/>
+    <w:bookmarkEnd w:id="253"/>
+    <w:bookmarkStart w:id="255" w:name="ref-shi2022annuaantimalarialmetabolomics"/>
     <w:p>
       <w:pPr>
         <w:pStyle w:val="Bibliography"/>
@@ -17259,7 +17358,7 @@
       <w:r>
         <w:t xml:space="preserve"> </w:t>
       </w:r>
-      <w:hyperlink r:id="rId252">
+      <w:hyperlink r:id="rId254">
         <w:r>
           <w:rPr>
             <w:rStyle w:val="Hyperlink"/>
@@ -17271,8 +17370,8 @@
         <w:t xml:space="preserve">.</w:t>
       </w:r>
     </w:p>
-    <w:bookmarkEnd w:id="253"/>
-    <w:bookmarkStart w:id="255" w:name="ref-shi2018mixta1"/>
+    <w:bookmarkEnd w:id="255"/>
+    <w:bookmarkStart w:id="257" w:name="ref-shi2018mixta1"/>
     <w:p>
       <w:pPr>
         <w:pStyle w:val="Bibliography"/>
@@ -17327,7 +17426,7 @@
       <w:r>
         <w:t xml:space="preserve"> </w:t>
       </w:r>
-      <w:hyperlink r:id="rId254">
+      <w:hyperlink r:id="rId256">
         <w:r>
           <w:rPr>
             <w:rStyle w:val="Hyperlink"/>
@@ -17339,8 +17438,8 @@
         <w:t xml:space="preserve">.</w:t>
       </w:r>
     </w:p>
-    <w:bookmarkEnd w:id="255"/>
-    <w:bookmarkStart w:id="257" w:name="ref-dasilva2017annuasheep"/>
+    <w:bookmarkEnd w:id="257"/>
+    <w:bookmarkStart w:id="259" w:name="ref-dasilva2017annuasheep"/>
     <w:p>
       <w:pPr>
         <w:pStyle w:val="Bibliography"/>
@@ -17386,7 +17485,7 @@
       <w:r>
         <w:t xml:space="preserve"> </w:t>
       </w:r>
-      <w:hyperlink r:id="rId256">
+      <w:hyperlink r:id="rId258">
         <w:r>
           <w:rPr>
             <w:rStyle w:val="Hyperlink"/>
@@ -17398,8 +17497,8 @@
         <w:t xml:space="preserve">.</w:t>
       </w:r>
     </w:p>
-    <w:bookmarkEnd w:id="257"/>
-    <w:bookmarkStart w:id="259" w:name="ref-snider2021gametocytes"/>
+    <w:bookmarkEnd w:id="259"/>
+    <w:bookmarkStart w:id="261" w:name="ref-snider2021gametocytes"/>
     <w:p>
       <w:pPr>
         <w:pStyle w:val="Bibliography"/>
@@ -17457,7 +17556,7 @@
       <w:r>
         <w:t xml:space="preserve"> </w:t>
       </w:r>
-      <w:hyperlink r:id="rId258">
+      <w:hyperlink r:id="rId260">
         <w:r>
           <w:rPr>
             <w:rStyle w:val="Hyperlink"/>
@@ -17469,8 +17568,8 @@
         <w:t xml:space="preserve">.</w:t>
       </w:r>
     </w:p>
-    <w:bookmarkEnd w:id="259"/>
-    <w:bookmarkStart w:id="261" w:name="ref-soleimanifard2023kermanensis"/>
+    <w:bookmarkEnd w:id="261"/>
+    <w:bookmarkStart w:id="263" w:name="ref-soleimanifard2023kermanensis"/>
     <w:p>
       <w:pPr>
         <w:pStyle w:val="Bibliography"/>
@@ -17516,7 +17615,7 @@
       <w:r>
         <w:t xml:space="preserve"> </w:t>
       </w:r>
-      <w:hyperlink r:id="rId260">
+      <w:hyperlink r:id="rId262">
         <w:r>
           <w:rPr>
             <w:rStyle w:val="Hyperlink"/>
@@ -17528,8 +17627,8 @@
         <w:t xml:space="preserve">.</w:t>
       </w:r>
     </w:p>
-    <w:bookmarkEnd w:id="261"/>
-    <w:bookmarkStart w:id="263" w:name="ref-squires2011haemonchus"/>
+    <w:bookmarkEnd w:id="263"/>
+    <w:bookmarkStart w:id="265" w:name="ref-squires2011haemonchus"/>
     <w:p>
       <w:pPr>
         <w:pStyle w:val="Bibliography"/>
@@ -17563,7 +17662,7 @@
       <w:r>
         <w:t xml:space="preserve"> </w:t>
       </w:r>
-      <w:hyperlink r:id="rId262">
+      <w:hyperlink r:id="rId264">
         <w:r>
           <w:rPr>
             <w:rStyle w:val="Hyperlink"/>
@@ -17575,8 +17674,8 @@
         <w:t xml:space="preserve">.</w:t>
       </w:r>
     </w:p>
-    <w:bookmarkEnd w:id="263"/>
-    <w:bookmarkStart w:id="265" w:name="ref-tabari2017sieberi"/>
+    <w:bookmarkEnd w:id="265"/>
+    <w:bookmarkStart w:id="267" w:name="ref-tabari2017sieberi"/>
     <w:p>
       <w:pPr>
         <w:pStyle w:val="Bibliography"/>
@@ -17610,7 +17709,7 @@
       <w:r>
         <w:t xml:space="preserve"> </w:t>
       </w:r>
-      <w:hyperlink r:id="rId264">
+      <w:hyperlink r:id="rId266">
         <w:r>
           <w:rPr>
             <w:rStyle w:val="Hyperlink"/>
@@ -17622,8 +17721,8 @@
         <w:t xml:space="preserve">.</w:t>
       </w:r>
     </w:p>
-    <w:bookmarkEnd w:id="265"/>
-    <w:bookmarkStart w:id="267" w:name="ref-tamargo2017nanocochleate"/>
+    <w:bookmarkEnd w:id="267"/>
+    <w:bookmarkStart w:id="269" w:name="ref-tamargo2017nanocochleate"/>
     <w:p>
       <w:pPr>
         <w:pStyle w:val="Bibliography"/>
@@ -17657,7 +17756,7 @@
       <w:r>
         <w:t xml:space="preserve"> </w:t>
       </w:r>
-      <w:hyperlink r:id="rId266">
+      <w:hyperlink r:id="rId268">
         <w:r>
           <w:rPr>
             <w:rStyle w:val="Hyperlink"/>
@@ -17669,8 +17768,8 @@
         <w:t xml:space="preserve">.</w:t>
       </w:r>
     </w:p>
-    <w:bookmarkEnd w:id="267"/>
-    <w:bookmarkStart w:id="269" w:name="ref-tangnitipong2012heme"/>
+    <w:bookmarkEnd w:id="269"/>
+    <w:bookmarkStart w:id="271" w:name="ref-tangnitipong2012heme"/>
     <w:p>
       <w:pPr>
         <w:pStyle w:val="Bibliography"/>
@@ -17704,7 +17803,7 @@
       <w:r>
         <w:t xml:space="preserve"> </w:t>
       </w:r>
-      <w:hyperlink r:id="rId268">
+      <w:hyperlink r:id="rId270">
         <w:r>
           <w:rPr>
             <w:rStyle w:val="Hyperlink"/>
@@ -17716,8 +17815,8 @@
         <w:t xml:space="preserve">.</w:t>
       </w:r>
     </w:p>
-    <w:bookmarkEnd w:id="269"/>
-    <w:bookmarkStart w:id="271" w:name="ref-tariku2011absinthium"/>
+    <w:bookmarkEnd w:id="271"/>
+    <w:bookmarkStart w:id="273" w:name="ref-tariku2011absinthium"/>
     <w:p>
       <w:pPr>
         <w:pStyle w:val="Bibliography"/>
@@ -17751,7 +17850,7 @@
       <w:r>
         <w:t xml:space="preserve"> </w:t>
       </w:r>
-      <w:hyperlink r:id="rId270">
+      <w:hyperlink r:id="rId272">
         <w:r>
           <w:rPr>
             <w:rStyle w:val="Hyperlink"/>
@@ -17763,8 +17862,8 @@
         <w:t xml:space="preserve">.</w:t>
       </w:r>
     </w:p>
-    <w:bookmarkEnd w:id="271"/>
-    <w:bookmarkStart w:id="273" w:name="ref-tariq2009absinthium"/>
+    <w:bookmarkEnd w:id="273"/>
+    <w:bookmarkStart w:id="275" w:name="ref-tariq2009absinthium"/>
     <w:p>
       <w:pPr>
         <w:pStyle w:val="Bibliography"/>
@@ -17798,7 +17897,7 @@
       <w:r>
         <w:t xml:space="preserve"> </w:t>
       </w:r>
-      <w:hyperlink r:id="rId272">
+      <w:hyperlink r:id="rId274">
         <w:r>
           <w:rPr>
             <w:rStyle w:val="Hyperlink"/>
@@ -17810,8 +17909,8 @@
         <w:t xml:space="preserve">.</w:t>
       </w:r>
     </w:p>
-    <w:bookmarkEnd w:id="273"/>
-    <w:bookmarkStart w:id="275" w:name="ref-teoh2006cyp"/>
+    <w:bookmarkEnd w:id="275"/>
+    <w:bookmarkStart w:id="277" w:name="ref-teoh2006cyp"/>
     <w:p>
       <w:pPr>
         <w:pStyle w:val="Bibliography"/>
@@ -17845,7 +17944,7 @@
       <w:r>
         <w:t xml:space="preserve"> </w:t>
       </w:r>
-      <w:hyperlink r:id="rId274">
+      <w:hyperlink r:id="rId276">
         <w:r>
           <w:rPr>
             <w:rStyle w:val="Hyperlink"/>
@@ -17857,8 +17956,8 @@
         <w:t xml:space="preserve">.</w:t>
       </w:r>
     </w:p>
-    <w:bookmarkEnd w:id="275"/>
-    <w:bookmarkStart w:id="277" w:name="ref-trendafilova2021edibleartemisia"/>
+    <w:bookmarkEnd w:id="277"/>
+    <w:bookmarkStart w:id="279" w:name="ref-trendafilova2021edibleartemisia"/>
     <w:p>
       <w:pPr>
         <w:pStyle w:val="Bibliography"/>
@@ -17892,7 +17991,7 @@
       <w:r>
         <w:t xml:space="preserve"> </w:t>
       </w:r>
-      <w:hyperlink r:id="rId276">
+      <w:hyperlink r:id="rId278">
         <w:r>
           <w:rPr>
             <w:rStyle w:val="Hyperlink"/>
@@ -17904,8 +18003,8 @@
         <w:t xml:space="preserve">.</w:t>
       </w:r>
     </w:p>
-    <w:bookmarkEnd w:id="277"/>
-    <w:bookmarkStart w:id="279" w:name="ref-umaraliev2025persicabisabolanes"/>
+    <w:bookmarkEnd w:id="279"/>
+    <w:bookmarkStart w:id="281" w:name="ref-umaraliev2025persicabisabolanes"/>
     <w:p>
       <w:pPr>
         <w:pStyle w:val="Bibliography"/>
@@ -17945,7 +18044,7 @@
       <w:r>
         <w:t xml:space="preserve"> </w:t>
       </w:r>
-      <w:hyperlink r:id="rId278">
+      <w:hyperlink r:id="rId280">
         <w:r>
           <w:rPr>
             <w:rStyle w:val="Hyperlink"/>
@@ -17957,8 +18056,8 @@
         <w:t xml:space="preserve">.</w:t>
       </w:r>
     </w:p>
-    <w:bookmarkEnd w:id="279"/>
-    <w:bookmarkStart w:id="281" w:name="ref-umaraliev2026persicamonoterpenes"/>
+    <w:bookmarkEnd w:id="281"/>
+    <w:bookmarkStart w:id="283" w:name="ref-umaraliev2026persicamonoterpenes"/>
     <w:p>
       <w:pPr>
         <w:pStyle w:val="Bibliography"/>
@@ -17998,7 +18097,7 @@
       <w:r>
         <w:t xml:space="preserve"> </w:t>
       </w:r>
-      <w:hyperlink r:id="rId280">
+      <w:hyperlink r:id="rId282">
         <w:r>
           <w:rPr>
             <w:rStyle w:val="Hyperlink"/>
@@ -18010,8 +18109,8 @@
         <w:t xml:space="preserve">.</w:t>
       </w:r>
     </w:p>
-    <w:bookmarkEnd w:id="281"/>
-    <w:bookmarkStart w:id="283" w:name="ref-urban2020trpc3"/>
+    <w:bookmarkEnd w:id="283"/>
+    <w:bookmarkStart w:id="285" w:name="ref-urban2020trpc3"/>
     <w:p>
       <w:pPr>
         <w:pStyle w:val="Bibliography"/>
@@ -18057,7 +18156,7 @@
       <w:r>
         <w:t xml:space="preserve"> </w:t>
       </w:r>
-      <w:hyperlink r:id="rId282">
+      <w:hyperlink r:id="rId284">
         <w:r>
           <w:rPr>
             <w:rStyle w:val="Hyperlink"/>
@@ -18069,8 +18168,8 @@
         <w:t xml:space="preserve">.</w:t>
       </w:r>
     </w:p>
-    <w:bookmarkEnd w:id="283"/>
-    <w:bookmarkStart w:id="285" w:name="ref-varadyova2018medicinalplants"/>
+    <w:bookmarkEnd w:id="285"/>
+    <w:bookmarkStart w:id="287" w:name="ref-varadyova2018medicinalplants"/>
     <w:p>
       <w:pPr>
         <w:pStyle w:val="Bibliography"/>
@@ -18113,7 +18212,7 @@
       <w:r>
         <w:t xml:space="preserve"> </w:t>
       </w:r>
-      <w:hyperlink r:id="rId284">
+      <w:hyperlink r:id="rId286">
         <w:r>
           <w:rPr>
             <w:rStyle w:val="Hyperlink"/>
@@ -18125,8 +18224,8 @@
         <w:t xml:space="preserve">.</w:t>
       </w:r>
     </w:p>
-    <w:bookmarkEnd w:id="285"/>
-    <w:bookmarkStart w:id="287" w:name="ref-walz2024aframalaria"/>
+    <w:bookmarkEnd w:id="287"/>
+    <w:bookmarkStart w:id="289" w:name="ref-walz2024aframalaria"/>
     <w:p>
       <w:pPr>
         <w:pStyle w:val="Bibliography"/>
@@ -18172,7 +18271,7 @@
       <w:r>
         <w:t xml:space="preserve"> </w:t>
       </w:r>
-      <w:hyperlink r:id="rId286">
+      <w:hyperlink r:id="rId288">
         <w:r>
           <w:rPr>
             <w:rStyle w:val="Hyperlink"/>
@@ -18184,8 +18283,8 @@
         <w:t xml:space="preserve">.</w:t>
       </w:r>
     </w:p>
-    <w:bookmarkEnd w:id="287"/>
-    <w:bookmarkStart w:id="289" w:name="ref-wang2013cyp71av1promoter"/>
+    <w:bookmarkEnd w:id="289"/>
+    <w:bookmarkStart w:id="291" w:name="ref-wang2013cyp71av1promoter"/>
     <w:p>
       <w:pPr>
         <w:pStyle w:val="Bibliography"/>
@@ -18219,7 +18318,7 @@
       <w:r>
         <w:t xml:space="preserve"> </w:t>
       </w:r>
-      <w:hyperlink r:id="rId288">
+      <w:hyperlink r:id="rId290">
         <w:r>
           <w:rPr>
             <w:rStyle w:val="Hyperlink"/>
@@ -18231,8 +18330,8 @@
         <w:t xml:space="preserve">.</w:t>
       </w:r>
     </w:p>
-    <w:bookmarkEnd w:id="289"/>
-    <w:bookmarkStart w:id="291" w:name="ref-wang2009trichometranscriptome"/>
+    <w:bookmarkEnd w:id="291"/>
+    <w:bookmarkStart w:id="293" w:name="ref-wang2009trichometranscriptome"/>
     <w:p>
       <w:pPr>
         <w:pStyle w:val="Bibliography"/>
@@ -18266,7 +18365,7 @@
       <w:r>
         <w:t xml:space="preserve"> </w:t>
       </w:r>
-      <w:hyperlink r:id="rId290">
+      <w:hyperlink r:id="rId292">
         <w:r>
           <w:rPr>
             <w:rStyle w:val="Hyperlink"/>
@@ -18278,8 +18377,8 @@
         <w:t xml:space="preserve">.</w:t>
       </w:r>
     </w:p>
-    <w:bookmarkEnd w:id="291"/>
-    <w:bookmarkStart w:id="293" w:name="ref-wani2023nitric"/>
+    <w:bookmarkEnd w:id="293"/>
+    <w:bookmarkStart w:id="295" w:name="ref-wani2023nitric"/>
     <w:p>
       <w:pPr>
         <w:pStyle w:val="Bibliography"/>
@@ -18337,7 +18436,7 @@
       <w:r>
         <w:t xml:space="preserve"> </w:t>
       </w:r>
-      <w:hyperlink r:id="rId292">
+      <w:hyperlink r:id="rId294">
         <w:r>
           <w:rPr>
             <w:rStyle w:val="Hyperlink"/>
@@ -18349,8 +18448,8 @@
         <w:t xml:space="preserve">.</w:t>
       </w:r>
     </w:p>
-    <w:bookmarkEnd w:id="293"/>
-    <w:bookmarkStart w:id="295" w:name="ref-wani2026maritima"/>
+    <w:bookmarkEnd w:id="295"/>
+    <w:bookmarkStart w:id="297" w:name="ref-wani2026maritima"/>
     <w:p>
       <w:pPr>
         <w:pStyle w:val="Bibliography"/>
@@ -18396,7 +18495,7 @@
       <w:r>
         <w:t xml:space="preserve"> </w:t>
       </w:r>
-      <w:hyperlink r:id="rId294">
+      <w:hyperlink r:id="rId296">
         <w:r>
           <w:rPr>
             <w:rStyle w:val="Hyperlink"/>
@@ -18408,8 +18507,8 @@
         <w:t xml:space="preserve">.</w:t>
       </w:r>
     </w:p>
-    <w:bookmarkEnd w:id="295"/>
-    <w:bookmarkStart w:id="297" w:name="ref-wetmore2019psiv9"/>
+    <w:bookmarkEnd w:id="297"/>
+    <w:bookmarkStart w:id="299" w:name="ref-wetmore2019psiv9"/>
     <w:p>
       <w:pPr>
         <w:pStyle w:val="Bibliography"/>
@@ -18455,7 +18554,7 @@
       <w:r>
         <w:t xml:space="preserve"> </w:t>
       </w:r>
-      <w:hyperlink r:id="rId296">
+      <w:hyperlink r:id="rId298">
         <w:r>
           <w:rPr>
             <w:rStyle w:val="Hyperlink"/>
@@ -18467,8 +18566,8 @@
         <w:t xml:space="preserve">.</w:t>
       </w:r>
     </w:p>
-    <w:bookmarkEnd w:id="297"/>
-    <w:bookmarkStart w:id="299" w:name="ref-wright2010qinghao"/>
+    <w:bookmarkEnd w:id="299"/>
+    <w:bookmarkStart w:id="301" w:name="ref-wright2010qinghao"/>
     <w:p>
       <w:pPr>
         <w:pStyle w:val="Bibliography"/>
@@ -18514,7 +18613,7 @@
       <w:r>
         <w:t xml:space="preserve"> </w:t>
       </w:r>
-      <w:hyperlink r:id="rId298">
+      <w:hyperlink r:id="rId300">
         <w:r>
           <w:rPr>
             <w:rStyle w:val="Hyperlink"/>
@@ -18526,8 +18625,8 @@
         <w:t xml:space="preserve">.</w:t>
       </w:r>
     </w:p>
-    <w:bookmarkEnd w:id="299"/>
-    <w:bookmarkStart w:id="301" w:name="ref-xiang2019bhlh112"/>
+    <w:bookmarkEnd w:id="301"/>
+    <w:bookmarkStart w:id="303" w:name="ref-xiang2019bhlh112"/>
     <w:p>
       <w:pPr>
         <w:pStyle w:val="Bibliography"/>
@@ -18561,7 +18660,7 @@
       <w:r>
         <w:t xml:space="preserve"> </w:t>
       </w:r>
-      <w:hyperlink r:id="rId300">
+      <w:hyperlink r:id="rId302">
         <w:r>
           <w:rPr>
             <w:rStyle w:val="Hyperlink"/>
@@ -18573,8 +18672,8 @@
         <w:t xml:space="preserve">.</w:t>
       </w:r>
     </w:p>
-    <w:bookmarkEnd w:id="301"/>
-    <w:bookmarkStart w:id="303" w:name="ref-xu2025plantmatrix"/>
+    <w:bookmarkEnd w:id="303"/>
+    <w:bookmarkStart w:id="305" w:name="ref-xu2025plantmatrix"/>
     <w:p>
       <w:pPr>
         <w:pStyle w:val="Bibliography"/>
@@ -18620,7 +18719,7 @@
       <w:r>
         <w:t xml:space="preserve"> </w:t>
       </w:r>
-      <w:hyperlink r:id="rId302">
+      <w:hyperlink r:id="rId304">
         <w:r>
           <w:rPr>
             <w:rStyle w:val="Hyperlink"/>
@@ -18632,8 +18731,8 @@
         <w:t xml:space="preserve">.</w:t>
       </w:r>
     </w:p>
-    <w:bookmarkEnd w:id="303"/>
-    <w:bookmarkStart w:id="305" w:name="ref-yildiz2011toxocara"/>
+    <w:bookmarkEnd w:id="305"/>
+    <w:bookmarkStart w:id="307" w:name="ref-yildiz2011toxocara"/>
     <w:p>
       <w:pPr>
         <w:pStyle w:val="Bibliography"/>
@@ -18691,7 +18790,7 @@
       <w:r>
         <w:t xml:space="preserve"> </w:t>
       </w:r>
-      <w:hyperlink r:id="rId304">
+      <w:hyperlink r:id="rId306">
         <w:r>
           <w:rPr>
             <w:rStyle w:val="Hyperlink"/>
@@ -18703,8 +18802,8 @@
         <w:t xml:space="preserve">.</w:t>
       </w:r>
     </w:p>
-    <w:bookmarkEnd w:id="305"/>
-    <w:bookmarkStart w:id="307" w:name="ref-zehra2020copper"/>
+    <w:bookmarkEnd w:id="307"/>
+    <w:bookmarkStart w:id="309" w:name="ref-zehra2020copper"/>
     <w:p>
       <w:pPr>
         <w:pStyle w:val="Bibliography"/>
@@ -18750,7 +18849,7 @@
       <w:r>
         <w:t xml:space="preserve"> </w:t>
       </w:r>
-      <w:hyperlink r:id="rId306">
+      <w:hyperlink r:id="rId308">
         <w:r>
           <w:rPr>
             <w:rStyle w:val="Hyperlink"/>
@@ -18762,8 +18861,8 @@
         <w:t xml:space="preserve">.</w:t>
       </w:r>
     </w:p>
-    <w:bookmarkEnd w:id="307"/>
-    <w:bookmarkStart w:id="309" w:name="ref-zhang2022fiveartemisia"/>
+    <w:bookmarkEnd w:id="309"/>
+    <w:bookmarkStart w:id="311" w:name="ref-zhang2022fiveartemisia"/>
     <w:p>
       <w:pPr>
         <w:pStyle w:val="Bibliography"/>
@@ -18809,7 +18908,7 @@
       <w:r>
         <w:t xml:space="preserve"> </w:t>
       </w:r>
-      <w:hyperlink r:id="rId308">
+      <w:hyperlink r:id="rId310">
         <w:r>
           <w:rPr>
             <w:rStyle w:val="Hyperlink"/>
@@ -18821,8 +18920,8 @@
         <w:t xml:space="preserve">.</w:t>
       </w:r>
     </w:p>
-    <w:bookmarkEnd w:id="309"/>
-    <w:bookmarkStart w:id="311" w:name="ref-zhang2020argyitriterpenoids"/>
+    <w:bookmarkEnd w:id="311"/>
+    <w:bookmarkStart w:id="313" w:name="ref-zhang2020argyitriterpenoids"/>
     <w:p>
       <w:pPr>
         <w:pStyle w:val="Bibliography"/>
@@ -18865,7 +18964,7 @@
       <w:r>
         <w:t xml:space="preserve"> </w:t>
       </w:r>
-      <w:hyperlink r:id="rId310">
+      <w:hyperlink r:id="rId312">
         <w:r>
           <w:rPr>
             <w:rStyle w:val="Hyperlink"/>
@@ -18877,8 +18976,8 @@
         <w:t xml:space="preserve">.</w:t>
       </w:r>
     </w:p>
-    <w:bookmarkEnd w:id="311"/>
-    <w:bookmarkStart w:id="313" w:name="ref-zhang2019pp2c1"/>
+    <w:bookmarkEnd w:id="313"/>
+    <w:bookmarkStart w:id="315" w:name="ref-zhang2019pp2c1"/>
     <w:p>
       <w:pPr>
         <w:pStyle w:val="Bibliography"/>
@@ -18930,7 +19029,7 @@
       <w:r>
         <w:t xml:space="preserve"> </w:t>
       </w:r>
-      <w:hyperlink r:id="rId312">
+      <w:hyperlink r:id="rId314">
         <w:r>
           <w:rPr>
             <w:rStyle w:val="Hyperlink"/>
@@ -18942,8 +19041,8 @@
         <w:t xml:space="preserve">.</w:t>
       </w:r>
     </w:p>
-    <w:bookmarkEnd w:id="313"/>
-    <w:bookmarkStart w:id="315" w:name="ref-zhang2008dbr2"/>
+    <w:bookmarkEnd w:id="315"/>
+    <w:bookmarkStart w:id="317" w:name="ref-zhang2008dbr2"/>
     <w:p>
       <w:pPr>
         <w:pStyle w:val="Bibliography"/>
@@ -18977,7 +19076,7 @@
       <w:r>
         <w:t xml:space="preserve"> </w:t>
       </w:r>
-      <w:hyperlink r:id="rId314">
+      <w:hyperlink r:id="rId316">
         <w:r>
           <w:rPr>
             <w:rStyle w:val="Hyperlink"/>
@@ -18989,8 +19088,8 @@
         <w:t xml:space="preserve">.</w:t>
       </w:r>
     </w:p>
-    <w:bookmarkEnd w:id="315"/>
-    <w:bookmarkStart w:id="317" w:name="ref-frigida2023variability"/>
+    <w:bookmarkEnd w:id="317"/>
+    <w:bookmarkStart w:id="319" w:name="ref-frigida2023variability"/>
     <w:p>
       <w:pPr>
         <w:pStyle w:val="Bibliography"/>
@@ -19024,7 +19123,7 @@
       <w:r>
         <w:t xml:space="preserve"> </w:t>
       </w:r>
-      <w:hyperlink r:id="rId316">
+      <w:hyperlink r:id="rId318">
         <w:r>
           <w:rPr>
             <w:rStyle w:val="Hyperlink"/>
@@ -19036,9 +19135,9 @@
         <w:t xml:space="preserve">.</w:t>
       </w:r>
     </w:p>
-    <w:bookmarkEnd w:id="317"/>
-    <w:bookmarkEnd w:id="318"/>
     <w:bookmarkEnd w:id="319"/>
+    <w:bookmarkEnd w:id="320"/>
+    <w:bookmarkEnd w:id="321"/>
     <w:sectPr>
       <w:headerReference w:type="default" r:id="rId9"/>
       <w:footerReference w:type="default" r:id="rId10"/>

</xml_diff>

<commit_message>
Clarify review eligibility and exclusion boundaries
</commit_message>
<xml_diff>
--- a/manuscript/artemisia-terpene-review-submission.docx
+++ b/manuscript/artemisia-terpene-review-submission.docx
@@ -508,6 +508,31 @@
       </w:r>
       <w:r>
         <w:t xml:space="preserve">. Reviews are used for discovery and context, while quantitative and mechanistic statements are preferentially anchored to primary studies.</w:t>
+      </w:r>
+    </w:p>
+    <w:p>
+      <w:pPr>
+        <w:pStyle w:val="BodyText"/>
+        <w:spacing w:before="0" w:after="120" w:line="264" w:lineRule="auto"/>
+      </w:pPr>
+      <w:r>
+        <w:t xml:space="preserve">For detailed evidence mapping, records were required to contain an assignable</w:t>
+      </w:r>
+      <w:r>
+        <w:t xml:space="preserve"> </w:t>
+      </w:r>
+      <w:r>
+        <w:rPr>
+          <w:i/>
+          <w:iCs/>
+        </w:rPr>
+        <w:t xml:space="preserve">Artemisia</w:t>
+      </w:r>
+      <w:r>
+        <w:t xml:space="preserve"> </w:t>
+      </w:r>
+      <w:r>
+        <w:t xml:space="preserve">taxon or defined preparation and to address at least one in-scope analytical, biosynthetic, genomic, biochemical, antiparasitic, toxicological, taxonomic, or review question. Records without sufficient taxon or preparation context were not used to support quantitative or mechanistic synthesis; metadata-only leads remain visible in the registry and open full-text queue rather than being treated as included studies. No pooled efficacy estimate is reported while these eligibility and harmonization gates remain open.</w:t>
       </w:r>
     </w:p>
     <w:p>

</xml_diff>

<commit_message>
Reframe submission as frozen scoping review
</commit_message>
<xml_diff>
--- a/manuscript/artemisia-terpene-review-submission.docx
+++ b/manuscript/artemisia-terpene-review-submission.docx
@@ -199,7 +199,7 @@
         <w:t xml:space="preserve"> </w:t>
       </w:r>
       <w:r>
-        <w:t xml:space="preserve">contains volatile monoterpenes and sesquiterpenes, less volatile diterpenes and triterpenes, and structurally diverse sesquiterpene lactones (STLs). These metabolites are often discussed as though a species name, a pathway gene, or an oil profile were sufficient to predict pharmacology. Here we present a source-auditable living scoping review that instead treats the specimen, accession, tissue, preparation, analytical method, parasite stage, and evidence level as the units of comparison. The Terpedia package registers 538 sources, 553 source-linked evidence records, 129 antiparasitic records, 19 parasite–protein interaction records, 179 compound/specimen records, and 404 audited article claims; 82 sources and 97 linked evidence rows have completed full-text verification, while 28 queue sources remain open. We synthesize terpene classes with biosynthetic compartmentalization, regulatory and environmental variation, and a bounded comparative-genomics analysis. Artemisinin biosynthesis in</w:t>
+        <w:t xml:space="preserve">contains volatile monoterpenes and sesquiterpenes, less volatile diterpenes and triterpenes, and structurally diverse sesquiterpene lactones (STLs). These metabolites are often discussed as though a species name, a pathway gene, or an oil profile were sufficient to predict pharmacology. Here we present a source-auditable scoping review with a frozen snapshot that instead treats the specimen, accession, tissue, preparation, analytical method, parasite stage, and evidence level as the units of comparison. The Terpedia package registers 538 sources, 553 source-linked evidence records, 129 antiparasitic records, 19 parasite–protein interaction records, 179 compound/specimen records, and 404 audited article claims; 82 sources and 97 linked evidence rows have completed full-text verification, while 28 remain open. We synthesize terpene classes with biosynthetic compartmentalization, regulatory and environmental variation, and a bounded comparative-genomics analysis. Artemisinin biosynthesis in</w:t>
       </w:r>
       <w:r>
         <w:t xml:space="preserve"> </w:t>
@@ -215,7 +215,7 @@
         <w:t xml:space="preserve"> </w:t>
       </w:r>
       <w:r>
-        <w:t xml:space="preserve">is the best-resolved gene-to-metabolite benchmark, but it should not be used as a proxy for the genus. Malaria provides the strongest validated antiparasitic case: artemisinin has direct parasite-relevant mechanistic support, whereas non-artemisinin matrix and metabolomics studies mainly identify candidate contributors to preparation-level activity. Wormwood (</w:t>
+        <w:t xml:space="preserve">is the best-resolved gene-to-metabolite benchmark, but it should not be used as a proxy for the genus. Malaria provides the strongest validated antiparasitic case: artemisinin has mechanistic support, whereas non-artemisinin matrix and metabolomics studies mainly identify candidate contributors to preparation-level activity. Wormwood (</w:t>
       </w:r>
       <w:r>
         <w:rPr>
@@ -225,7 +225,7 @@
         <w:t xml:space="preserve">A. absinthium</w:t>
       </w:r>
       <w:r>
-        <w:t xml:space="preserve">) provides a separate vermifuge hypothesis supported by in-vitro nematode and limited animal evidence, but constituent attribution, host selectivity, and modern clinical translation remain unresolved. We propose a phylogeny-aware program linking voucher-authenticated metabolomics, secretory-tissue multi-omics, common reannotation, enzyme assays, and fractionated parasite testing. The result is a concise synthesis for journal submission with the complete evidence and provenance archive retained in Terpedia.</w:t>
+        <w:t xml:space="preserve">) provides a separate vermifuge hypothesis supported by in-vitro nematode and limited animal evidence, but constituent attribution, host selectivity, and modern clinical translation remain unresolved. We propose a phylogeny-aware program linking voucher-authenticated metabolomics, secretory-tissue multi-omics, common reannotation, enzyme assays, and fractionated parasite testing. The result is a concise synthesis for journal submission with the complete evidence and provenance archive retained in the updateable Terpedia archive.</w:t>
       </w:r>
     </w:p>
     <w:p>
@@ -395,14 +395,14 @@
         <w:t xml:space="preserve">2. Review scope and evidence framework</w:t>
       </w:r>
     </w:p>
-    <w:bookmarkStart w:id="11" w:name="living-scoping-review-design"/>
+    <w:bookmarkStart w:id="11" w:name="frozen-scoping-review-design"/>
     <w:p>
       <w:pPr>
         <w:pStyle w:val="Heading3"/>
         <w:spacing w:before="0" w:after="120" w:line="264" w:lineRule="auto"/>
       </w:pPr>
       <w:r>
-        <w:t xml:space="preserve">2.1 Living scoping-review design</w:t>
+        <w:t xml:space="preserve">2.1 Frozen scoping-review design</w:t>
       </w:r>
     </w:p>
     <w:p>
@@ -452,7 +452,7 @@
         <w:spacing w:before="0" w:after="120" w:line="264" w:lineRule="auto"/>
       </w:pPr>
       <w:r>
-        <w:t xml:space="preserve">The package is deliberately a living scoping review rather than a completed systematic review. It contains 1,408 bounded title/abstract decisions, covering all 1,387 priority-queue records plus 21 historical or out-of-queue decisions. Full-text verification now covers 82 publicly accessible or publisher-indexed antiparasitic sources and 97 linked evidence rows; 28 queue sources remain unverified, and no result is pooled as a final quantitative estimate. The</w:t>
+        <w:t xml:space="preserve">The analysis is reported as a frozen scoping review rather than a completed systematic review. The retrieval snapshot contains 1,408 bounded title/abstract decisions, covering all 1,387 priority-queue records plus 21 historical or out-of-queue decisions. Full-text verification now covers 82 publicly accessible or publisher-indexed antiparasitic sources and 97 linked evidence rows; 28 queue sources remain unverified, and no result is pooled as a final quantitative estimate. The</w:t>
       </w:r>
       <w:r>
         <w:t xml:space="preserve"> </w:t>
@@ -468,7 +468,7 @@
         <w:t xml:space="preserve"> </w:t>
       </w:r>
       <w:r>
-        <w:t xml:space="preserve">oil study is retained at publisher-section resolution because its complete tables were not recoverable. The PRISMA-ScR mapping is archived in</w:t>
+        <w:t xml:space="preserve">oil study is retained at publisher-section resolution because its complete tables were not recoverable. Terpedia is maintained as an updateable evidence archive, but later additions are not silently treated as part of this frozen analysis. The PRISMA-ScR mapping is archived in</w:t>
       </w:r>
       <w:r>
         <w:t xml:space="preserve"> </w:t>
@@ -10748,7 +10748,7 @@
         <w:spacing w:before="0" w:after="120" w:line="264" w:lineRule="auto"/>
       </w:pPr>
       <w:r>
-        <w:t xml:space="preserve">The living-review study-selection flow is summarized in Fig. 3.</w:t>
+        <w:t xml:space="preserve">The frozen scoping-review study-selection flow is summarized in Fig. 3.</w:t>
       </w:r>
     </w:p>
     <w:p>
@@ -10761,7 +10761,7 @@
           <wp:inline>
             <wp:extent cx="3315729" cy="6400800"/>
             <wp:effectExtent b="0" l="0" r="0" t="0"/>
-            <wp:docPr descr="Fig. 3 Living scoping-review retrieval, screening, and full-text status" title="" id="34" name="Picture"/>
+            <wp:docPr descr="Fig. 3 Frozen scoping-review retrieval, screening, and full-text status" title="" id="34" name="Picture"/>
             <a:graphic>
               <a:graphicData uri="http://schemas.openxmlformats.org/drawingml/2006/picture">
                 <pic:pic>
@@ -10810,7 +10810,7 @@
           <w:color w:val="555555"/>
           <w:sz w:val="20"/>
         </w:rPr>
-        <w:t xml:space="preserve">Fig. 3 Living scoping-review retrieval, screening, and full-text status</w:t>
+        <w:t xml:space="preserve">Fig. 3 Frozen scoping-review retrieval, screening, and full-text status</w:t>
       </w:r>
     </w:p>
     <w:bookmarkEnd w:id="36"/>

</xml_diff>

<commit_message>
Verify callus antileishmanial evidence
</commit_message>
<xml_diff>
--- a/manuscript/artemisia-terpene-review-submission.docx
+++ b/manuscript/artemisia-terpene-review-submission.docx
@@ -199,7 +199,7 @@
         <w:t xml:space="preserve"> </w:t>
       </w:r>
       <w:r>
-        <w:t xml:space="preserve">contains volatile monoterpenes and sesquiterpenes, less volatile diterpenes and triterpenes, and structurally diverse sesquiterpene lactones (STLs). These metabolites are often discussed as though a species name, a pathway gene, or an oil profile were sufficient to predict pharmacology. Here we present a source-auditable scoping review with a frozen snapshot that instead treats the specimen, accession, tissue, preparation, analytical method, parasite stage, and evidence level as the units of comparison. The Terpedia package registers 538 sources, 553 source-linked evidence records, 129 antiparasitic records, 19 parasite–protein interaction records, 179 compound/specimen records, and 404 audited article claims; 82 sources and 97 linked evidence rows have completed full-text verification, while 28 remain open. We synthesize terpene classes with biosynthetic compartmentalization, regulatory and environmental variation, and a bounded comparative-genomics analysis. Artemisinin biosynthesis in</w:t>
+        <w:t xml:space="preserve">contains volatile monoterpenes and sesquiterpenes, less volatile diterpenes and triterpenes, and structurally diverse sesquiterpene lactones (STLs). These metabolites are often discussed as though a species name, a pathway gene, or an oil profile were sufficient to predict pharmacology. Here we present a source-auditable scoping review with a frozen snapshot that instead treats the specimen, accession, tissue, preparation, analytical method, parasite stage, and evidence level as the units of comparison. The Terpedia package registers 538 sources, 553 source-linked evidence records, 129 antiparasitic records, 19 parasite–protein interaction records, 179 compound/specimen records, and 405 audited article claims; 83 sources and 98 linked evidence rows have completed full-text verification, while 27 remain open. We synthesize terpene classes with biosynthetic compartmentalization, regulatory and environmental variation, and a bounded comparative-genomics analysis. Artemisinin biosynthesis in</w:t>
       </w:r>
       <w:r>
         <w:t xml:space="preserve"> </w:t>
@@ -452,7 +452,7 @@
         <w:spacing w:before="0" w:after="120" w:line="264" w:lineRule="auto"/>
       </w:pPr>
       <w:r>
-        <w:t xml:space="preserve">The analysis is reported as a frozen scoping review rather than a completed systematic review. The retrieval snapshot contains 1,408 bounded title/abstract decisions, covering all 1,387 priority-queue records plus 21 historical or out-of-queue decisions. Full-text verification now covers 82 publicly accessible or publisher-indexed antiparasitic sources and 97 linked evidence rows; 28 queue sources remain unverified, and no result is pooled as a final quantitative estimate. The</w:t>
+        <w:t xml:space="preserve">The analysis is reported as a frozen scoping review rather than a completed systematic review. The retrieval snapshot contains 1,408 bounded title/abstract decisions, covering all 1,387 priority-queue records plus 21 historical or out-of-queue decisions. Full-text verification now covers 83 publicly accessible or publisher-indexed antiparasitic sources and 98 linked evidence rows; 27 queue sources remain unverified, and no result is pooled as a final quantitative estimate. The</w:t>
       </w:r>
       <w:r>
         <w:t xml:space="preserve"> </w:t>

</xml_diff>

<commit_message>
Verify wormwood Haemonchus evidence and rebuild artifacts
</commit_message>
<xml_diff>
--- a/manuscript/artemisia-terpene-review-submission.docx
+++ b/manuscript/artemisia-terpene-review-submission.docx
@@ -199,7 +199,7 @@
         <w:t xml:space="preserve"> </w:t>
       </w:r>
       <w:r>
-        <w:t xml:space="preserve">contains volatile monoterpenes and sesquiterpenes, less volatile diterpenes and triterpenes, and structurally diverse sesquiterpene lactones (STLs). These metabolites are often discussed as though a species name, a pathway gene, or an oil profile were sufficient to predict pharmacology. Here we present a source-auditable scoping review with a frozen snapshot that instead treats the specimen, accession, tissue, preparation, analytical method, parasite stage, and evidence level as the units of comparison. The Terpedia package registers 538 sources, 553 source-linked evidence records, 129 antiparasitic records, 19 parasite–protein interaction records, 179 compound/specimen records, and 405 audited article claims; 83 sources and 98 linked evidence rows have completed full-text verification, while 27 remain open. We synthesize terpene classes with biosynthetic compartmentalization, regulatory and environmental variation, and a bounded comparative-genomics analysis. Artemisinin biosynthesis in</w:t>
+        <w:t xml:space="preserve">contains volatile monoterpenes and sesquiterpenes, less volatile diterpenes and triterpenes, and structurally diverse sesquiterpene lactones (STLs). These metabolites are often discussed as though a species name, a pathway gene, or an oil profile were sufficient to predict pharmacology. Here we present a source-auditable scoping review with a frozen snapshot that instead treats the specimen, accession, tissue, preparation, analytical method, parasite stage, and evidence level as the units of comparison. The Terpedia package registers 538 sources, 553 source-linked evidence records, 129 antiparasitic records, 19 parasite–protein interaction records, 179 compound/specimen records, and 405 audited article claims; 84 sources and 99 linked evidence rows have completed full-text verification, while 26 remain open. We synthesize terpene classes with biosynthetic compartmentalization, regulatory and environmental variation, and a bounded comparative-genomics analysis. Artemisinin biosynthesis in</w:t>
       </w:r>
       <w:r>
         <w:t xml:space="preserve"> </w:t>
@@ -452,7 +452,7 @@
         <w:spacing w:before="0" w:after="120" w:line="264" w:lineRule="auto"/>
       </w:pPr>
       <w:r>
-        <w:t xml:space="preserve">The analysis is reported as a frozen scoping review rather than a completed systematic review. The retrieval snapshot contains 1,408 bounded title/abstract decisions, covering all 1,387 priority-queue records plus 21 historical or out-of-queue decisions. Full-text verification now covers 83 publicly accessible or publisher-indexed antiparasitic sources and 98 linked evidence rows; 27 queue sources remain unverified, and no result is pooled as a final quantitative estimate. The</w:t>
+        <w:t xml:space="preserve">The analysis is reported as a frozen scoping review rather than a completed systematic review. The retrieval snapshot contains 1,408 bounded title/abstract decisions, covering all 1,387 priority-queue records plus 21 historical or out-of-queue decisions. Full-text verification now covers 84 publicly accessible or publisher-indexed antiparasitic sources and 99 linked evidence rows; 26 queue sources remain unverified, and no result is pooled as a final quantitative estimate. The</w:t>
       </w:r>
       <w:r>
         <w:t xml:space="preserve"> </w:t>
@@ -468,7 +468,33 @@
         <w:t xml:space="preserve"> </w:t>
       </w:r>
       <w:r>
-        <w:t xml:space="preserve">oil study is retained at publisher-section resolution because its complete tables were not recoverable. Terpedia is maintained as an updateable evidence archive, but later additions are not silently treated as part of this frozen analysis. The PRISMA-ScR mapping is archived in</w:t>
+        <w:t xml:space="preserve">oil study is retained at publisher-section resolution because its complete tables were not recoverable; the</w:t>
+      </w:r>
+      <w:r>
+        <w:t xml:space="preserve"> </w:t>
+      </w:r>
+      <w:r>
+        <w:rPr>
+          <w:i/>
+          <w:iCs/>
+        </w:rPr>
+        <w:t xml:space="preserve">A. absinthium</w:t>
+      </w:r>
+      <w:r>
+        <w:t xml:space="preserve">/</w:t>
+      </w:r>
+      <w:r>
+        <w:rPr>
+          <w:i/>
+          <w:iCs/>
+        </w:rPr>
+        <w:t xml:space="preserve">H. contortus</w:t>
+      </w:r>
+      <w:r>
+        <w:t xml:space="preserve"> </w:t>
+      </w:r>
+      <w:r>
+        <w:t xml:space="preserve">comparison is retained at indexed article/abstract resolution with exact effect estimates unresolved. Terpedia is maintained as an updateable evidence archive, but later additions are not silently treated as part of this frozen analysis. The PRISMA-ScR mapping is archived in</w:t>
       </w:r>
       <w:r>
         <w:t xml:space="preserve"> </w:t>

</xml_diff>

<commit_message>
Add verified 2026 malaria evidence to review package
</commit_message>
<xml_diff>
--- a/manuscript/artemisia-terpene-review-submission.docx
+++ b/manuscript/artemisia-terpene-review-submission.docx
@@ -199,7 +199,7 @@
         <w:t xml:space="preserve"> </w:t>
       </w:r>
       <w:r>
-        <w:t xml:space="preserve">contains volatile monoterpenes and sesquiterpenes, less volatile diterpenes and triterpenes, and structurally diverse sesquiterpene lactones (STLs). These metabolites are often discussed as though a species name, a pathway gene, or an oil profile were sufficient to predict pharmacology. Here we present a source-auditable scoping review with a frozen snapshot that instead treats the specimen, accession, tissue, preparation, analytical method, parasite stage, and evidence level as the units of comparison. The Terpedia package registers 538 sources, 553 source-linked evidence records, 129 antiparasitic records, 19 parasite–protein interaction records, 179 compound/specimen records, and 405 audited article claims; 84 sources and 99 linked evidence rows have completed full-text verification, while 26 remain open. We synthesize terpene classes with biosynthetic compartmentalization, regulatory and environmental variation, and a bounded comparative-genomics analysis. Artemisinin biosynthesis in</w:t>
+        <w:t xml:space="preserve">contains volatile monoterpenes and sesquiterpenes, less volatile diterpenes and triterpenes, and structurally diverse sesquiterpene lactones (STLs). These metabolites are often discussed as though a species name, a pathway gene, or an oil profile were sufficient to predict pharmacology. Here we present a source-auditable scoping review with a frozen snapshot that instead treats the specimen, accession, tissue, preparation, analytical method, parasite stage, and evidence level as the units of comparison. The Terpedia package registers 538 sources, 553 source-linked evidence records, 129 antiparasitic records, 19 parasite–protein interaction records, 179 compound/specimen records, and 405 audited article claims; 86 sources and 101 linked evidence rows have completed full-text verification, while 24 remain open. We synthesize terpene classes with biosynthetic compartmentalization, regulatory and environmental variation, and a bounded comparative-genomics analysis. Artemisinin biosynthesis in</w:t>
       </w:r>
       <w:r>
         <w:t xml:space="preserve"> </w:t>
@@ -452,7 +452,7 @@
         <w:spacing w:before="0" w:after="120" w:line="264" w:lineRule="auto"/>
       </w:pPr>
       <w:r>
-        <w:t xml:space="preserve">The analysis is reported as a frozen scoping review rather than a completed systematic review. The retrieval snapshot contains 1,408 bounded title/abstract decisions, covering all 1,387 priority-queue records plus 21 historical or out-of-queue decisions. Full-text verification now covers 84 publicly accessible or publisher-indexed antiparasitic sources and 99 linked evidence rows; 26 queue sources remain unverified, and no result is pooled as a final quantitative estimate. The</w:t>
+        <w:t xml:space="preserve">The analysis is reported as a frozen scoping review rather than a completed systematic review. The retrieval snapshot contains 1,408 bounded title/abstract decisions, covering all 1,387 priority-queue records plus 21 historical or out-of-queue decisions. Full-text verification now covers 86 publicly accessible or publisher-indexed antiparasitic sources and 101 linked evidence rows; 24 queue sources remain unverified, and no result is pooled as a final quantitative estimate. The</w:t>
       </w:r>
       <w:r>
         <w:t xml:space="preserve"> </w:t>
@@ -494,7 +494,23 @@
         <w:t xml:space="preserve"> </w:t>
       </w:r>
       <w:r>
-        <w:t xml:space="preserve">comparison is retained at indexed article/abstract resolution with exact effect estimates unresolved. Terpedia is maintained as an updateable evidence archive, but later additions are not silently treated as part of this frozen analysis. The PRISMA-ScR mapping is archived in</w:t>
+        <w:t xml:space="preserve">comparison and two 2026</w:t>
+      </w:r>
+      <w:r>
+        <w:t xml:space="preserve"> </w:t>
+      </w:r>
+      <w:r>
+        <w:rPr>
+          <w:i/>
+          <w:iCs/>
+        </w:rPr>
+        <w:t xml:space="preserve">A. annua</w:t>
+      </w:r>
+      <w:r>
+        <w:t xml:space="preserve"> </w:t>
+      </w:r>
+      <w:r>
+        <w:t xml:space="preserve">malaria records are retained at indexed article/abstract resolution with exact effect, dose, assay, or reconstitution details unresolved. Terpedia is maintained as an updateable evidence archive, but later additions are not silently treated as part of this frozen analysis. The PRISMA-ScR mapping is archived in</w:t>
       </w:r>
       <w:r>
         <w:t xml:space="preserve"> </w:t>
@@ -4523,7 +4539,32 @@
         <w:t xml:space="preserve">(Aubouy et al. 2025)</w:t>
       </w:r>
       <w:r>
-        <w:t xml:space="preserve">. This is strong origin-, storage-, and matrix-level evidence. It is not terpene-specific mechanism, standardized product performance, or clinical efficacy.</w:t>
+        <w:t xml:space="preserve">. This is strong origin-, storage-, and matrix-level evidence. It is not terpene-specific mechanism, standardized product performance, or clinical efficacy. A publisher-indexed 2026 seasonal metabolomics study similarly characterized 103</w:t>
+      </w:r>
+      <w:r>
+        <w:t xml:space="preserve"> </w:t>
+      </w:r>
+      <w:r>
+        <w:rPr>
+          <w:i/>
+          <w:iCs/>
+        </w:rPr>
+        <w:t xml:space="preserve">A. annua</w:t>
+      </w:r>
+      <w:r>
+        <w:t xml:space="preserve"> </w:t>
+      </w:r>
+      <w:r>
+        <w:t xml:space="preserve">constituents across sesquiterpene, alkaloid, flavonoid, and coumarin classes; April samples reportedly had stronger activity despite lower artemisinin, with seven candidate enhancers and reported potentiation by compounds 69 and 90. Because candidate identities, exact concentrations, parasite assay details, and reconstitution tables remain unresolved, the result is a seasonal screening lead rather than proof of terpene-only synergy</w:t>
+      </w:r>
+      <w:r>
+        <w:t xml:space="preserve"> </w:t>
+      </w:r>
+      <w:r>
+        <w:t xml:space="preserve">(J. Zhang et al. 2026)</w:t>
+      </w:r>
+      <w:r>
+        <w:t xml:space="preserve">.</w:t>
       </w:r>
     </w:p>
     <w:p>
@@ -5064,7 +5105,7 @@
         <w:t xml:space="preserve"> </w:t>
       </w:r>
       <w:r>
-        <w:t xml:space="preserve">(Xu et al. 2025)</w:t>
+        <w:t xml:space="preserve">(F. Xu et al. 2025)</w:t>
       </w:r>
       <w:r>
         <w:t xml:space="preserve">. A complementary genetic control found that removing major flavonoids while retaining wild-type artemisinin did not materially reduce</w:t>
@@ -5115,6 +5156,47 @@
       </w:r>
       <w:r>
         <w:t xml:space="preserve">(Rostkowska et al. 2016)</w:t>
+      </w:r>
+      <w:r>
+        <w:t xml:space="preserve">. A second indexed 2026</w:t>
+      </w:r>
+      <w:r>
+        <w:t xml:space="preserve"> </w:t>
+      </w:r>
+      <w:r>
+        <w:rPr>
+          <w:i/>
+          <w:iCs/>
+        </w:rPr>
+        <w:t xml:space="preserve">A. annua</w:t>
+      </w:r>
+      <w:r>
+        <w:t xml:space="preserve"> </w:t>
+      </w:r>
+      <w:r>
+        <w:t xml:space="preserve">extract study found no in-vitro synergy with artemisinin at 150 nM against Pf3D7, but a biphasic</w:t>
+      </w:r>
+      <w:r>
+        <w:t xml:space="preserve"> </w:t>
+      </w:r>
+      <w:r>
+        <w:rPr>
+          <w:i/>
+          <w:iCs/>
+        </w:rPr>
+        <w:t xml:space="preserve">P. yoelii</w:t>
+      </w:r>
+      <w:r>
+        <w:t xml:space="preserve"> </w:t>
+      </w:r>
+      <w:r>
+        <w:t xml:space="preserve">mouse matrix effect with higher early artemisinin exposure; chrysosplenetin was isolated as a candidate component, but it is a flavonoid rather than a terpene and the indexed record does not establish direct parasite targeting or clinical efficacy</w:t>
+      </w:r>
+      <w:r>
+        <w:t xml:space="preserve"> </w:t>
+      </w:r>
+      <w:r>
+        <w:t xml:space="preserve">(K. Xu et al. 2026)</w:t>
       </w:r>
       <w:r>
         <w:t xml:space="preserve">.</w:t>
@@ -8807,6 +8889,272 @@
                 <w:sz w:val="18"/>
               </w:rPr>
               <w:t xml:space="preserve">(Aubouy et al. 2025)</w:t>
+            </w:r>
+          </w:p>
+        </w:tc>
+      </w:tr>
+      <w:tr>
+        <w:trPr>
+          <w:cantSplit w:val="true"/>
+        </w:trPr>
+        <w:tc>
+          <w:tcPr>
+            <w:tcW w:w="1800" w:type="dxa"/>
+            <w:tcMar>
+              <w:top w:w="80" w:type="dxa"/>
+              <w:start w:w="120" w:type="dxa"/>
+              <w:bottom w:w="80" w:type="dxa"/>
+              <w:end w:w="120" w:type="dxa"/>
+            </w:tcMar>
+            <w:vAlign w:val="center"/>
+          </w:tcPr>
+          <w:p>
+            <w:pPr>
+              <w:pStyle w:val="Compact"/>
+              <w:spacing w:before="0" w:after="40" w:line="240" w:lineRule="auto"/>
+            </w:pPr>
+            <w:r>
+              <w:rPr>
+                <w:rFonts w:ascii="Calibri" w:hAnsi="Calibri"/>
+                <w:i/>
+                <w:iCs/>
+                <w:sz w:val="18"/>
+              </w:rPr>
+              <w:t xml:space="preserve">A. annua</w:t>
+            </w:r>
+            <w:r>
+              <w:rPr>
+                <w:rFonts w:ascii="Calibri" w:hAnsi="Calibri"/>
+                <w:sz w:val="18"/>
+              </w:rPr>
+              <w:t xml:space="preserve"> </w:t>
+            </w:r>
+            <w:r>
+              <w:rPr>
+                <w:rFonts w:ascii="Calibri" w:hAnsi="Calibri"/>
+                <w:sz w:val="18"/>
+              </w:rPr>
+              <w:t xml:space="preserve">seasonal metabolomics / malaria assay</w:t>
+            </w:r>
+          </w:p>
+        </w:tc>
+        <w:tc>
+          <w:tcPr>
+            <w:tcW w:w="2800" w:type="dxa"/>
+            <w:tcMar>
+              <w:top w:w="80" w:type="dxa"/>
+              <w:start w:w="120" w:type="dxa"/>
+              <w:bottom w:w="80" w:type="dxa"/>
+              <w:end w:w="120" w:type="dxa"/>
+            </w:tcMar>
+            <w:vAlign w:val="center"/>
+          </w:tcPr>
+          <w:p>
+            <w:pPr>
+              <w:pStyle w:val="Compact"/>
+              <w:spacing w:before="0" w:after="40" w:line="240" w:lineRule="auto"/>
+            </w:pPr>
+            <w:r>
+              <w:rPr>
+                <w:rFonts w:ascii="Calibri" w:hAnsi="Calibri"/>
+                <w:sz w:val="18"/>
+              </w:rPr>
+              <w:t xml:space="preserve">UHPLC-QTOF-MS/MS characterized 103 constituents, including 31 sesquiterpenes, 24 alkaloids, 36 flavonoids, and 8 coumarins; April samples reportedly had stronger activity despite lower artemisinin, with seven candidate enhancers and reported potentiation by compounds 69 and 90</w:t>
+            </w:r>
+          </w:p>
+        </w:tc>
+        <w:tc>
+          <w:tcPr>
+            <w:tcW w:w="2400" w:type="dxa"/>
+            <w:tcMar>
+              <w:top w:w="80" w:type="dxa"/>
+              <w:start w:w="120" w:type="dxa"/>
+              <w:bottom w:w="80" w:type="dxa"/>
+              <w:end w:w="120" w:type="dxa"/>
+            </w:tcMar>
+            <w:vAlign w:val="center"/>
+          </w:tcPr>
+          <w:p>
+            <w:pPr>
+              <w:pStyle w:val="Compact"/>
+              <w:spacing w:before="0" w:after="40" w:line="240" w:lineRule="auto"/>
+            </w:pPr>
+            <w:r>
+              <w:rPr>
+                <w:rFonts w:ascii="Calibri" w:hAnsi="Calibri"/>
+                <w:sz w:val="18"/>
+              </w:rPr>
+              <w:t xml:space="preserve">Candidate seasonal co-metabolite lead; compound identities, concentrations, assay details, and reconstitution remain unresolved</w:t>
+            </w:r>
+            <w:r>
+              <w:rPr>
+                <w:rFonts w:ascii="Calibri" w:hAnsi="Calibri"/>
+                <w:sz w:val="18"/>
+              </w:rPr>
+              <w:t xml:space="preserve"> </w:t>
+            </w:r>
+            <w:r>
+              <w:rPr>
+                <w:rFonts w:ascii="Calibri" w:hAnsi="Calibri"/>
+                <w:sz w:val="18"/>
+              </w:rPr>
+              <w:t xml:space="preserve">(J. Zhang et al. 2026)</w:t>
+            </w:r>
+          </w:p>
+        </w:tc>
+      </w:tr>
+      <w:tr>
+        <w:trPr>
+          <w:cantSplit w:val="true"/>
+        </w:trPr>
+        <w:tc>
+          <w:tcPr>
+            <w:tcW w:w="1800" w:type="dxa"/>
+            <w:tcMar>
+              <w:top w:w="80" w:type="dxa"/>
+              <w:start w:w="120" w:type="dxa"/>
+              <w:bottom w:w="80" w:type="dxa"/>
+              <w:end w:w="120" w:type="dxa"/>
+            </w:tcMar>
+            <w:vAlign w:val="center"/>
+          </w:tcPr>
+          <w:p>
+            <w:pPr>
+              <w:pStyle w:val="Compact"/>
+              <w:spacing w:before="0" w:after="40" w:line="240" w:lineRule="auto"/>
+            </w:pPr>
+            <w:r>
+              <w:rPr>
+                <w:rFonts w:ascii="Calibri" w:hAnsi="Calibri"/>
+                <w:i/>
+                <w:iCs/>
+                <w:sz w:val="18"/>
+              </w:rPr>
+              <w:t xml:space="preserve">A. annua</w:t>
+            </w:r>
+            <w:r>
+              <w:rPr>
+                <w:rFonts w:ascii="Calibri" w:hAnsi="Calibri"/>
+                <w:sz w:val="18"/>
+              </w:rPr>
+              <w:t xml:space="preserve"> </w:t>
+            </w:r>
+            <w:r>
+              <w:rPr>
+                <w:rFonts w:ascii="Calibri" w:hAnsi="Calibri"/>
+                <w:sz w:val="18"/>
+              </w:rPr>
+              <w:t xml:space="preserve">extract /</w:t>
+            </w:r>
+            <w:r>
+              <w:rPr>
+                <w:rFonts w:ascii="Calibri" w:hAnsi="Calibri"/>
+                <w:sz w:val="18"/>
+              </w:rPr>
+              <w:t xml:space="preserve"> </w:t>
+            </w:r>
+            <w:r>
+              <w:rPr>
+                <w:rFonts w:ascii="Calibri" w:hAnsi="Calibri"/>
+                <w:i/>
+                <w:iCs/>
+                <w:sz w:val="18"/>
+              </w:rPr>
+              <w:t xml:space="preserve">P. falciparum</w:t>
+            </w:r>
+            <w:r>
+              <w:rPr>
+                <w:rFonts w:ascii="Calibri" w:hAnsi="Calibri"/>
+                <w:sz w:val="18"/>
+              </w:rPr>
+              <w:t xml:space="preserve"> </w:t>
+            </w:r>
+            <w:r>
+              <w:rPr>
+                <w:rFonts w:ascii="Calibri" w:hAnsi="Calibri"/>
+                <w:sz w:val="18"/>
+              </w:rPr>
+              <w:t xml:space="preserve">3D7 and</w:t>
+            </w:r>
+            <w:r>
+              <w:rPr>
+                <w:rFonts w:ascii="Calibri" w:hAnsi="Calibri"/>
+                <w:sz w:val="18"/>
+              </w:rPr>
+              <w:t xml:space="preserve"> </w:t>
+            </w:r>
+            <w:r>
+              <w:rPr>
+                <w:rFonts w:ascii="Calibri" w:hAnsi="Calibri"/>
+                <w:i/>
+                <w:iCs/>
+                <w:sz w:val="18"/>
+              </w:rPr>
+              <w:t xml:space="preserve">P. yoelii</w:t>
+            </w:r>
+          </w:p>
+        </w:tc>
+        <w:tc>
+          <w:tcPr>
+            <w:tcW w:w="2800" w:type="dxa"/>
+            <w:tcMar>
+              <w:top w:w="80" w:type="dxa"/>
+              <w:start w:w="120" w:type="dxa"/>
+              <w:bottom w:w="80" w:type="dxa"/>
+              <w:end w:w="120" w:type="dxa"/>
+            </w:tcMar>
+            <w:vAlign w:val="center"/>
+          </w:tcPr>
+          <w:p>
+            <w:pPr>
+              <w:pStyle w:val="Compact"/>
+              <w:spacing w:before="0" w:after="40" w:line="240" w:lineRule="auto"/>
+            </w:pPr>
+            <w:r>
+              <w:rPr>
+                <w:rFonts w:ascii="Calibri" w:hAnsi="Calibri"/>
+                <w:sz w:val="18"/>
+              </w:rPr>
+              <w:t xml:space="preserve">No synergy with artemisinin at 150 nM against Pf3D7; a biphasic mouse matrix effect increased artemisinin exposure around 10% parasitemia but not 20%; chrysosplenetin was isolated</w:t>
+            </w:r>
+          </w:p>
+        </w:tc>
+        <w:tc>
+          <w:tcPr>
+            <w:tcW w:w="2400" w:type="dxa"/>
+            <w:tcMar>
+              <w:top w:w="80" w:type="dxa"/>
+              <w:start w:w="120" w:type="dxa"/>
+              <w:bottom w:w="80" w:type="dxa"/>
+              <w:end w:w="120" w:type="dxa"/>
+            </w:tcMar>
+            <w:vAlign w:val="center"/>
+          </w:tcPr>
+          <w:p>
+            <w:pPr>
+              <w:pStyle w:val="Compact"/>
+              <w:spacing w:before="0" w:after="40" w:line="240" w:lineRule="auto"/>
+            </w:pPr>
+            <w:r>
+              <w:rPr>
+                <w:rFonts w:ascii="Calibri" w:hAnsi="Calibri"/>
+                <w:sz w:val="18"/>
+              </w:rPr>
+              <w:t xml:space="preserve">Infection-stage and host-PK comparator; chrysosplenetin is a flavonoid, not a terpene, and direct parasite targeting remains unshown</w:t>
+            </w:r>
+            <w:r>
+              <w:rPr>
+                <w:rFonts w:ascii="Calibri" w:hAnsi="Calibri"/>
+                <w:sz w:val="18"/>
+              </w:rPr>
+              <w:t xml:space="preserve"> </w:t>
+            </w:r>
+            <w:r>
+              <w:rPr>
+                <w:rFonts w:ascii="Calibri" w:hAnsi="Calibri"/>
+                <w:sz w:val="18"/>
+              </w:rPr>
+              <w:t xml:space="preserve">(K. Xu et al. 2026)</w:t>
             </w:r>
           </w:p>
         </w:tc>
@@ -11304,7 +11652,7 @@
     <w:bookmarkEnd w:id="47"/>
     <w:bookmarkEnd w:id="48"/>
     <w:bookmarkEnd w:id="49"/>
-    <w:bookmarkStart w:id="321" w:name="references"/>
+    <w:bookmarkStart w:id="325" w:name="references"/>
     <w:p>
       <w:pPr>
         <w:pStyle w:val="Heading1"/>
@@ -11314,7 +11662,7 @@
         <w:t xml:space="preserve">References</w:t>
       </w:r>
     </w:p>
-    <w:bookmarkStart w:id="320" w:name="refs"/>
+    <w:bookmarkStart w:id="324" w:name="refs"/>
     <w:bookmarkStart w:id="51" w:name="ref-abad2012artemisia"/>
     <w:p>
       <w:pPr>
@@ -18783,13 +19131,72 @@
       </w:r>
     </w:p>
     <w:bookmarkEnd w:id="305"/>
-    <w:bookmarkStart w:id="307" w:name="ref-yildiz2011toxocara"/>
+    <w:bookmarkStart w:id="307" w:name="ref-xu2026artemisininpk"/>
     <w:p>
       <w:pPr>
         <w:pStyle w:val="Bibliography"/>
         <w:spacing w:before="0" w:after="120" w:line="264" w:lineRule="auto"/>
       </w:pPr>
       <w:r>
+        <w:t xml:space="preserve">Xu, Kun, Yuewu Xie, Tong Liu, Shanshan Du, Hui Liu, and Jie Xing. 2026.</w:t>
+      </w:r>
+      <w:r>
+        <w:t xml:space="preserve"> </w:t>
+      </w:r>
+      <w:r>
+        <w:t xml:space="preserve">“Differential Synergistic Antimalarial Effects of an</w:t>
+      </w:r>
+      <w:r>
+        <w:t xml:space="preserve"> </w:t>
+      </w:r>
+      <w:r>
+        <w:t xml:space="preserve">A. annua</w:t>
+      </w:r>
+      <w:r>
+        <w:t xml:space="preserve"> </w:t>
+      </w:r>
+      <w:r>
+        <w:t xml:space="preserve">Extract on Artemisinin via Host Pharmacokinetic Modulation.”</w:t>
+      </w:r>
+      <w:r>
+        <w:t xml:space="preserve"> </w:t>
+      </w:r>
+      <w:r>
+        <w:rPr>
+          <w:i/>
+          <w:iCs/>
+        </w:rPr>
+        <w:t xml:space="preserve">Journal of Ethnopharmacology</w:t>
+      </w:r>
+      <w:r>
+        <w:t xml:space="preserve"> </w:t>
+      </w:r>
+      <w:r>
+        <w:t xml:space="preserve">367: 121688.</w:t>
+      </w:r>
+      <w:r>
+        <w:t xml:space="preserve"> </w:t>
+      </w:r>
+      <w:hyperlink r:id="rId306">
+        <w:r>
+          <w:rPr>
+            <w:rStyle w:val="Hyperlink"/>
+          </w:rPr>
+          <w:t xml:space="preserve">https://doi.org/10.1016/j.jep.2026.121688</w:t>
+        </w:r>
+      </w:hyperlink>
+      <w:r>
+        <w:t xml:space="preserve">.</w:t>
+      </w:r>
+    </w:p>
+    <w:bookmarkEnd w:id="307"/>
+    <w:bookmarkStart w:id="309" w:name="ref-yildiz2011toxocara"/>
+    <w:p>
+      <w:pPr>
+        <w:pStyle w:val="Bibliography"/>
+        <w:spacing w:before="0" w:after="120" w:line="264" w:lineRule="auto"/>
+      </w:pPr>
+      <w:r>
         <w:t xml:space="preserve">Yıldız, K, M Başalan, O Duru, and S Gökpınar. 2011.</w:t>
       </w:r>
       <w:r>
@@ -18841,7 +19248,7 @@
       <w:r>
         <w:t xml:space="preserve"> </w:t>
       </w:r>
-      <w:hyperlink r:id="rId306">
+      <w:hyperlink r:id="rId308">
         <w:r>
           <w:rPr>
             <w:rStyle w:val="Hyperlink"/>
@@ -18853,8 +19260,8 @@
         <w:t xml:space="preserve">.</w:t>
       </w:r>
     </w:p>
-    <w:bookmarkEnd w:id="307"/>
-    <w:bookmarkStart w:id="309" w:name="ref-zehra2020copper"/>
+    <w:bookmarkEnd w:id="309"/>
+    <w:bookmarkStart w:id="311" w:name="ref-zehra2020copper"/>
     <w:p>
       <w:pPr>
         <w:pStyle w:val="Bibliography"/>
@@ -18900,7 +19307,7 @@
       <w:r>
         <w:t xml:space="preserve"> </w:t>
       </w:r>
-      <w:hyperlink r:id="rId308">
+      <w:hyperlink r:id="rId310">
         <w:r>
           <w:rPr>
             <w:rStyle w:val="Hyperlink"/>
@@ -18912,8 +19319,8 @@
         <w:t xml:space="preserve">.</w:t>
       </w:r>
     </w:p>
-    <w:bookmarkEnd w:id="309"/>
-    <w:bookmarkStart w:id="311" w:name="ref-zhang2022fiveartemisia"/>
+    <w:bookmarkEnd w:id="311"/>
+    <w:bookmarkStart w:id="313" w:name="ref-zhang2022fiveartemisia"/>
     <w:p>
       <w:pPr>
         <w:pStyle w:val="Bibliography"/>
@@ -18959,7 +19366,7 @@
       <w:r>
         <w:t xml:space="preserve"> </w:t>
       </w:r>
-      <w:hyperlink r:id="rId310">
+      <w:hyperlink r:id="rId312">
         <w:r>
           <w:rPr>
             <w:rStyle w:val="Hyperlink"/>
@@ -18971,14 +19378,73 @@
         <w:t xml:space="preserve">.</w:t>
       </w:r>
     </w:p>
-    <w:bookmarkEnd w:id="311"/>
-    <w:bookmarkStart w:id="313" w:name="ref-zhang2020argyitriterpenoids"/>
+    <w:bookmarkEnd w:id="313"/>
+    <w:bookmarkStart w:id="315" w:name="ref-zhang2026annuaenhancement"/>
     <w:p>
       <w:pPr>
         <w:pStyle w:val="Bibliography"/>
         <w:spacing w:before="0" w:after="120" w:line="264" w:lineRule="auto"/>
       </w:pPr>
       <w:r>
+        <w:t xml:space="preserve">Zhang, Jing, Shuaichen Zhang, Cheng Wang, Yifan Zhao, Dunfang Wang, and Peng Sun. 2026.</w:t>
+      </w:r>
+      <w:r>
+        <w:t xml:space="preserve"> </w:t>
+      </w:r>
+      <w:r>
+        <w:t xml:space="preserve">“Identification and Quantification of Sesquiterpenes, Alkaloids, Flavonoids and Coumarins in</w:t>
+      </w:r>
+      <w:r>
+        <w:t xml:space="preserve"> </w:t>
+      </w:r>
+      <w:r>
+        <w:t xml:space="preserve">Artemisia annua</w:t>
+      </w:r>
+      <w:r>
+        <w:t xml:space="preserve"> </w:t>
+      </w:r>
+      <w:r>
+        <w:t xml:space="preserve">l: Potential Artemisinin Activity-Enhancing Compounds.”</w:t>
+      </w:r>
+      <w:r>
+        <w:t xml:space="preserve"> </w:t>
+      </w:r>
+      <w:r>
+        <w:rPr>
+          <w:i/>
+          <w:iCs/>
+        </w:rPr>
+        <w:t xml:space="preserve">Journal of Pharmaceutical and Biomedical Analysis</w:t>
+      </w:r>
+      <w:r>
+        <w:t xml:space="preserve"> </w:t>
+      </w:r>
+      <w:r>
+        <w:t xml:space="preserve">270: 117295.</w:t>
+      </w:r>
+      <w:r>
+        <w:t xml:space="preserve"> </w:t>
+      </w:r>
+      <w:hyperlink r:id="rId314">
+        <w:r>
+          <w:rPr>
+            <w:rStyle w:val="Hyperlink"/>
+          </w:rPr>
+          <w:t xml:space="preserve">https://doi.org/10.1016/j.jpba.2025.117295</w:t>
+        </w:r>
+      </w:hyperlink>
+      <w:r>
+        <w:t xml:space="preserve">.</w:t>
+      </w:r>
+    </w:p>
+    <w:bookmarkEnd w:id="315"/>
+    <w:bookmarkStart w:id="317" w:name="ref-zhang2020argyitriterpenoids"/>
+    <w:p>
+      <w:pPr>
+        <w:pStyle w:val="Bibliography"/>
+        <w:spacing w:before="0" w:after="120" w:line="264" w:lineRule="auto"/>
+      </w:pPr>
+      <w:r>
         <w:t xml:space="preserve">Zhang, LB, JJ Chang, LM Guo, and JL Lv. 2020.</w:t>
       </w:r>
       <w:r>
@@ -19015,7 +19481,7 @@
       <w:r>
         <w:t xml:space="preserve"> </w:t>
       </w:r>
-      <w:hyperlink r:id="rId312">
+      <w:hyperlink r:id="rId316">
         <w:r>
           <w:rPr>
             <w:rStyle w:val="Hyperlink"/>
@@ -19027,8 +19493,8 @@
         <w:t xml:space="preserve">.</w:t>
       </w:r>
     </w:p>
-    <w:bookmarkEnd w:id="313"/>
-    <w:bookmarkStart w:id="315" w:name="ref-zhang2019pp2c1"/>
+    <w:bookmarkEnd w:id="317"/>
+    <w:bookmarkStart w:id="319" w:name="ref-zhang2019pp2c1"/>
     <w:p>
       <w:pPr>
         <w:pStyle w:val="Bibliography"/>
@@ -19080,7 +19546,7 @@
       <w:r>
         <w:t xml:space="preserve"> </w:t>
       </w:r>
-      <w:hyperlink r:id="rId314">
+      <w:hyperlink r:id="rId318">
         <w:r>
           <w:rPr>
             <w:rStyle w:val="Hyperlink"/>
@@ -19092,8 +19558,8 @@
         <w:t xml:space="preserve">.</w:t>
       </w:r>
     </w:p>
-    <w:bookmarkEnd w:id="315"/>
-    <w:bookmarkStart w:id="317" w:name="ref-zhang2008dbr2"/>
+    <w:bookmarkEnd w:id="319"/>
+    <w:bookmarkStart w:id="321" w:name="ref-zhang2008dbr2"/>
     <w:p>
       <w:pPr>
         <w:pStyle w:val="Bibliography"/>
@@ -19127,7 +19593,7 @@
       <w:r>
         <w:t xml:space="preserve"> </w:t>
       </w:r>
-      <w:hyperlink r:id="rId316">
+      <w:hyperlink r:id="rId320">
         <w:r>
           <w:rPr>
             <w:rStyle w:val="Hyperlink"/>
@@ -19139,8 +19605,8 @@
         <w:t xml:space="preserve">.</w:t>
       </w:r>
     </w:p>
-    <w:bookmarkEnd w:id="317"/>
-    <w:bookmarkStart w:id="319" w:name="ref-frigida2023variability"/>
+    <w:bookmarkEnd w:id="321"/>
+    <w:bookmarkStart w:id="323" w:name="ref-frigida2023variability"/>
     <w:p>
       <w:pPr>
         <w:pStyle w:val="Bibliography"/>
@@ -19174,7 +19640,7 @@
       <w:r>
         <w:t xml:space="preserve"> </w:t>
       </w:r>
-      <w:hyperlink r:id="rId318">
+      <w:hyperlink r:id="rId322">
         <w:r>
           <w:rPr>
             <w:rStyle w:val="Hyperlink"/>
@@ -19186,9 +19652,9 @@
         <w:t xml:space="preserve">.</w:t>
       </w:r>
     </w:p>
-    <w:bookmarkEnd w:id="319"/>
-    <w:bookmarkEnd w:id="320"/>
-    <w:bookmarkEnd w:id="321"/>
+    <w:bookmarkEnd w:id="323"/>
+    <w:bookmarkEnd w:id="324"/>
+    <w:bookmarkEnd w:id="325"/>
     <w:sectPr>
       <w:headerReference w:type="default" r:id="rId9"/>
       <w:footerReference w:type="default" r:id="rId10"/>

</xml_diff>

<commit_message>
Add verified Artemisia cina ewe helminth evidence
</commit_message>
<xml_diff>
--- a/manuscript/artemisia-terpene-review-submission.docx
+++ b/manuscript/artemisia-terpene-review-submission.docx
@@ -199,7 +199,7 @@
         <w:t xml:space="preserve"> </w:t>
       </w:r>
       <w:r>
-        <w:t xml:space="preserve">contains volatile monoterpenes and sesquiterpenes, less volatile diterpenes and triterpenes, and structurally diverse sesquiterpene lactones (STLs). These metabolites are often discussed as though a species name, a pathway gene, or an oil profile were sufficient to predict pharmacology. Here we present a source-auditable scoping review with a frozen snapshot that instead treats the specimen, accession, tissue, preparation, analytical method, parasite stage, and evidence level as the units of comparison. The Terpedia package registers 538 sources, 553 source-linked evidence records, 129 antiparasitic records, 19 parasite–protein interaction records, 179 compound/specimen records, and 405 audited article claims; 86 sources and 101 linked evidence rows have completed full-text verification, while 24 remain open. We synthesize terpene classes with biosynthetic compartmentalization, regulatory and environmental variation, and a bounded comparative-genomics analysis. Artemisinin biosynthesis in</w:t>
+        <w:t xml:space="preserve">contains volatile monoterpenes and sesquiterpenes, less volatile diterpenes and triterpenes, and structurally diverse sesquiterpene lactones (STLs). These metabolites are often discussed as though a species name, a pathway gene, or an oil profile were sufficient to predict pharmacology. Here we present a source-auditable scoping review with a frozen snapshot that instead treats the specimen, accession, tissue, preparation, analytical method, parasite stage, and evidence level as the units of comparison. The Terpedia package registers 539 sources, 554 source-linked evidence records, 130 antiparasitic records, 19 parasite–protein interaction records, 179 compound/specimen records, and 406 audited article claims; 87 sources and 102 linked evidence rows have completed full-text verification, while 24 remain open. We synthesize terpene classes with biosynthetic compartmentalization, regulatory and environmental variation, and a bounded comparative-genomics analysis. Artemisinin biosynthesis in</w:t>
       </w:r>
       <w:r>
         <w:t xml:space="preserve"> </w:t>
@@ -427,7 +427,7 @@
         <w:t xml:space="preserve"> </w:t>
       </w:r>
       <w:r>
-        <w:t xml:space="preserve">terms with terpene classes, analytical methods, biosynthesis, genomics, malaria, helminths, vectors, and safety terms. The frozen retrieval snapshot contains 4,765 unique PubMed records from seven query families, of which 1,387 were prioritized for title-level review and 1,323 had abstracts retrieved. A source-linked full-text eligibility queue covers 110 unique antiparasitic sources representing 129 evidence rows, prioritizing malaria and</w:t>
+        <w:t xml:space="preserve">terms with terpene classes, analytical methods, biosynthesis, genomics, malaria, helminths, vectors, and safety terms. The frozen retrieval snapshot contains 4,765 unique PubMed records from seven query families, of which 1,387 were prioritized for title-level review and 1,323 had abstracts retrieved. A source-linked full-text eligibility queue covers 111 unique antiparasitic sources representing 130 evidence rows, prioritizing malaria and</w:t>
       </w:r>
       <w:r>
         <w:t xml:space="preserve"> </w:t>
@@ -452,7 +452,7 @@
         <w:spacing w:before="0" w:after="120" w:line="264" w:lineRule="auto"/>
       </w:pPr>
       <w:r>
-        <w:t xml:space="preserve">The analysis is reported as a frozen scoping review rather than a completed systematic review. The retrieval snapshot contains 1,408 bounded title/abstract decisions, covering all 1,387 priority-queue records plus 21 historical or out-of-queue decisions. Full-text verification now covers 86 publicly accessible or publisher-indexed antiparasitic sources and 101 linked evidence rows; 24 queue sources remain unverified, and no result is pooled as a final quantitative estimate. The</w:t>
+        <w:t xml:space="preserve">The analysis is reported as a frozen scoping review rather than a completed systematic review. The retrieval snapshot contains 1,408 bounded title/abstract decisions, covering all 1,387 priority-queue records plus 21 historical or out-of-queue decisions. Full-text verification now covers 87 publicly accessible or publisher-indexed antiparasitic sources and 102 linked evidence rows; 24 queue sources remain unverified, and no result is pooled as a final quantitative estimate. The</w:t>
       </w:r>
       <w:r>
         <w:t xml:space="preserve"> </w:t>
@@ -510,7 +510,23 @@
         <w:t xml:space="preserve"> </w:t>
       </w:r>
       <w:r>
-        <w:t xml:space="preserve">malaria records are retained at indexed article/abstract resolution with exact effect, dose, assay, or reconstitution details unresolved. Terpedia is maintained as an updateable evidence archive, but later additions are not silently treated as part of this frozen analysis. The PRISMA-ScR mapping is archived in</w:t>
+        <w:t xml:space="preserve">malaria records are retained at indexed article/abstract resolution with exact effect, dose, assay, or reconstitution details unresolved, and the 2025</w:t>
+      </w:r>
+      <w:r>
+        <w:t xml:space="preserve"> </w:t>
+      </w:r>
+      <w:r>
+        <w:rPr>
+          <w:i/>
+          <w:iCs/>
+        </w:rPr>
+        <w:t xml:space="preserve">A. cina</w:t>
+      </w:r>
+      <w:r>
+        <w:t xml:space="preserve"> </w:t>
+      </w:r>
+      <w:r>
+        <w:t xml:space="preserve">ewe trial is retained with chemistry and combined-treatment interpretation unresolved. Terpedia is maintained as an updateable evidence archive, but later additions are not silently treated as part of this frozen analysis. The PRISMA-ScR mapping is archived in</w:t>
       </w:r>
       <w:r>
         <w:t xml:space="preserve"> </w:t>
@@ -4192,7 +4208,7 @@
         <w:t xml:space="preserve"> </w:t>
       </w:r>
       <w:r>
-        <w:t xml:space="preserve">to all 129 antiparasitic records. Twenty-one records had defined or purified chemistry, 36 had a profiled mixture, and 72 retained crude or unresolved attribution; 86 reported direct in-vitro parasite/vector assays, 39 included an in-vivo or organismal endpoint, and four were indirect or surrogate records, including three hemozoin assays. Explicit host/selectivity controls were present in 22 records, partial controls in 24, and absent or unresolved in 83. Only three records reached the E4/E5 functional-target-class level through the linked interaction map; 23 were hypothesis/stage-mechanism level and 103 were phenotype-only or unresolved. The overall appraisal therefore yielded 24 B-level characterized phenotypes and 105 C-level phenotypes with unresolved attribution; no record met the deliberately strict A tier. This is a limitation of evidence resolution, not evidence that the preparations lack activity. Row-level judgments and their rule basis are archived in</w:t>
+        <w:t xml:space="preserve">to all 130 antiparasitic records. Twenty-one records had defined or purified chemistry, 36 had a profiled mixture, and 73 retained crude or unresolved attribution; 87 reported direct in-vitro parasite/vector assays, 39 included an in-vivo or organismal endpoint, and four were indirect or surrogate records, including three hemozoin assays. Explicit host/selectivity controls were present in 24 records, partial controls in 24, and absent or unresolved in 82. Only three records reached the E4/E5 functional-target-class level through the linked interaction map; 23 were hypothesis/stage-mechanism level and 104 were phenotype-only or unresolved. The overall appraisal therefore yielded 24 B-level characterized phenotypes and 106 C-level phenotypes with unresolved attribution; no record met the deliberately strict A tier. This is a limitation of evidence resolution, not evidence that the preparations lack activity. Row-level judgments and their rule basis are archived in</w:t>
       </w:r>
       <w:r>
         <w:t xml:space="preserve"> </w:t>
@@ -7454,6 +7470,114 @@
       </w:r>
       <w:r>
         <w:t xml:space="preserve">(T. Wani et al. 2026)</w:t>
+      </w:r>
+      <w:r>
+        <w:t xml:space="preserve">.</w:t>
+      </w:r>
+    </w:p>
+    <w:p>
+      <w:pPr>
+        <w:pStyle w:val="BodyText"/>
+        <w:spacing w:before="0" w:after="120" w:line="264" w:lineRule="auto"/>
+      </w:pPr>
+      <w:r>
+        <w:t xml:space="preserve">A full-text 2025</w:t>
+      </w:r>
+      <w:r>
+        <w:t xml:space="preserve"> </w:t>
+      </w:r>
+      <w:r>
+        <w:rPr>
+          <w:i/>
+          <w:iCs/>
+        </w:rPr>
+        <w:t xml:space="preserve">A. cina</w:t>
+      </w:r>
+      <w:r>
+        <w:t xml:space="preserve"> </w:t>
+      </w:r>
+      <w:r>
+        <w:t xml:space="preserve">sheep study supplies an in-vivo, reproductive-state comparator. Twenty artificially infected Romanov × East Friesian ewes were randomized to untreated, ivermectin,</w:t>
+      </w:r>
+      <w:r>
+        <w:t xml:space="preserve"> </w:t>
+      </w:r>
+      <w:r>
+        <w:rPr>
+          <w:i/>
+          <w:iCs/>
+        </w:rPr>
+        <w:t xml:space="preserve">Duddingtonia flagrans</w:t>
+      </w:r>
+      <w:r>
+        <w:t xml:space="preserve">,</w:t>
+      </w:r>
+      <w:r>
+        <w:t xml:space="preserve"> </w:t>
+      </w:r>
+      <w:r>
+        <w:rPr>
+          <w:i/>
+          <w:iCs/>
+        </w:rPr>
+        <w:t xml:space="preserve">A. cina</w:t>
+      </w:r>
+      <w:r>
+        <w:t xml:space="preserve"> </w:t>
+      </w:r>
+      <w:r>
+        <w:t xml:space="preserve">hexane extract, and combined groups. The extract was prepared from 200 g of pre-flowering leaves and stems by 48-hour room-temperature n-hexane maceration and given orally at 4 mg/kg before and after delivery.</w:t>
+      </w:r>
+      <w:r>
+        <w:t xml:space="preserve"> </w:t>
+      </w:r>
+      <w:r>
+        <w:rPr>
+          <w:i/>
+          <w:iCs/>
+        </w:rPr>
+        <w:t xml:space="preserve">A. cina</w:t>
+      </w:r>
+      <w:r>
+        <w:t xml:space="preserve"> </w:t>
+      </w:r>
+      <w:r>
+        <w:t xml:space="preserve">alone reduced infective larvae in fecal cultures by 89.9%, but its EPG means ranged from 25 prepartum to 875 at day 15 postpartum and 533 at day 30; the combined fungus/plant arm was numerically worse for postpartum EPG and did not improve the endpoint. The article interprets this as an antagonistic EPG interaction, but the mechanism is unproven. Because the preparation was not terpene/STL-resolved and the species is</w:t>
+      </w:r>
+      <w:r>
+        <w:t xml:space="preserve"> </w:t>
+      </w:r>
+      <w:r>
+        <w:rPr>
+          <w:i/>
+          <w:iCs/>
+        </w:rPr>
+        <w:t xml:space="preserve">A. cina</w:t>
+      </w:r>
+      <w:r>
+        <w:t xml:space="preserve">, this is evidence for a dose-, reproductive-state-, and parasite-specific related-species phenotype—not proof of</w:t>
+      </w:r>
+      <w:r>
+        <w:t xml:space="preserve"> </w:t>
+      </w:r>
+      <w:r>
+        <w:rPr>
+          <w:i/>
+          <w:iCs/>
+        </w:rPr>
+        <w:t xml:space="preserve">A. absinthium</w:t>
+      </w:r>
+      <w:r>
+        <w:t xml:space="preserve"> </w:t>
+      </w:r>
+      <w:r>
+        <w:t xml:space="preserve">vermifuge activity, terpene causality, or a parasite-protein target</w:t>
+      </w:r>
+      <w:r>
+        <w:t xml:space="preserve"> </w:t>
+      </w:r>
+      <w:r>
+        <w:t xml:space="preserve">(Crúz-Crúz et al. 2025)</w:t>
       </w:r>
       <w:r>
         <w:t xml:space="preserve">.</w:t>
@@ -10621,6 +10745,162 @@
                 <w:sz w:val="18"/>
               </w:rPr>
               <w:t xml:space="preserve">(T. Wani et al. 2026)</w:t>
+            </w:r>
+          </w:p>
+        </w:tc>
+      </w:tr>
+      <w:tr>
+        <w:trPr>
+          <w:cantSplit w:val="true"/>
+        </w:trPr>
+        <w:tc>
+          <w:tcPr>
+            <w:tcW w:w="1800" w:type="dxa"/>
+            <w:tcMar>
+              <w:top w:w="80" w:type="dxa"/>
+              <w:start w:w="120" w:type="dxa"/>
+              <w:bottom w:w="80" w:type="dxa"/>
+              <w:end w:w="120" w:type="dxa"/>
+            </w:tcMar>
+            <w:vAlign w:val="center"/>
+          </w:tcPr>
+          <w:p>
+            <w:pPr>
+              <w:pStyle w:val="Compact"/>
+              <w:spacing w:before="0" w:after="40" w:line="240" w:lineRule="auto"/>
+            </w:pPr>
+            <w:r>
+              <w:rPr>
+                <w:rFonts w:ascii="Calibri" w:hAnsi="Calibri"/>
+                <w:i/>
+                <w:iCs/>
+                <w:sz w:val="18"/>
+              </w:rPr>
+              <w:t xml:space="preserve">A. cina</w:t>
+            </w:r>
+            <w:r>
+              <w:rPr>
+                <w:rFonts w:ascii="Calibri" w:hAnsi="Calibri"/>
+                <w:sz w:val="18"/>
+              </w:rPr>
+              <w:t xml:space="preserve"> </w:t>
+            </w:r>
+            <w:r>
+              <w:rPr>
+                <w:rFonts w:ascii="Calibri" w:hAnsi="Calibri"/>
+                <w:sz w:val="18"/>
+              </w:rPr>
+              <w:t xml:space="preserve">/</w:t>
+            </w:r>
+            <w:r>
+              <w:rPr>
+                <w:rFonts w:ascii="Calibri" w:hAnsi="Calibri"/>
+                <w:sz w:val="18"/>
+              </w:rPr>
+              <w:t xml:space="preserve"> </w:t>
+            </w:r>
+            <w:r>
+              <w:rPr>
+                <w:rFonts w:ascii="Calibri" w:hAnsi="Calibri"/>
+                <w:i/>
+                <w:iCs/>
+                <w:sz w:val="18"/>
+              </w:rPr>
+              <w:t xml:space="preserve">H. contortus</w:t>
+            </w:r>
+            <w:r>
+              <w:rPr>
+                <w:rFonts w:ascii="Calibri" w:hAnsi="Calibri"/>
+                <w:sz w:val="18"/>
+              </w:rPr>
+              <w:t xml:space="preserve"> </w:t>
+            </w:r>
+            <w:r>
+              <w:rPr>
+                <w:rFonts w:ascii="Calibri" w:hAnsi="Calibri"/>
+                <w:sz w:val="18"/>
+              </w:rPr>
+              <w:t xml:space="preserve">in periparturient ewes</w:t>
+            </w:r>
+          </w:p>
+        </w:tc>
+        <w:tc>
+          <w:tcPr>
+            <w:tcW w:w="2800" w:type="dxa"/>
+            <w:tcMar>
+              <w:top w:w="80" w:type="dxa"/>
+              <w:start w:w="120" w:type="dxa"/>
+              <w:bottom w:w="80" w:type="dxa"/>
+              <w:end w:w="120" w:type="dxa"/>
+            </w:tcMar>
+            <w:vAlign w:val="center"/>
+          </w:tcPr>
+          <w:p>
+            <w:pPr>
+              <w:pStyle w:val="Compact"/>
+              <w:spacing w:before="0" w:after="40" w:line="240" w:lineRule="auto"/>
+            </w:pPr>
+            <w:r>
+              <w:rPr>
+                <w:rFonts w:ascii="Calibri" w:hAnsi="Calibri"/>
+                <w:sz w:val="18"/>
+              </w:rPr>
+              <w:t xml:space="preserve">Oral 4 mg/kg n-hexane extract reduced infective larvae in fecal cultures by 89.9%; combined fungus/plant treatment did not improve postpartum EPG</w:t>
+            </w:r>
+          </w:p>
+        </w:tc>
+        <w:tc>
+          <w:tcPr>
+            <w:tcW w:w="2400" w:type="dxa"/>
+            <w:tcMar>
+              <w:top w:w="80" w:type="dxa"/>
+              <w:start w:w="120" w:type="dxa"/>
+              <w:bottom w:w="80" w:type="dxa"/>
+              <w:end w:w="120" w:type="dxa"/>
+            </w:tcMar>
+            <w:vAlign w:val="center"/>
+          </w:tcPr>
+          <w:p>
+            <w:pPr>
+              <w:pStyle w:val="Compact"/>
+              <w:spacing w:before="0" w:after="40" w:line="240" w:lineRule="auto"/>
+            </w:pPr>
+            <w:r>
+              <w:rPr>
+                <w:rFonts w:ascii="Calibri" w:hAnsi="Calibri"/>
+                <w:sz w:val="18"/>
+              </w:rPr>
+              <w:t xml:space="preserve">Stronger in-vivo related-species comparator; no terpene/STL profile, host PK/residue, or transfer to</w:t>
+            </w:r>
+            <w:r>
+              <w:rPr>
+                <w:rFonts w:ascii="Calibri" w:hAnsi="Calibri"/>
+                <w:sz w:val="18"/>
+              </w:rPr>
+              <w:t xml:space="preserve"> </w:t>
+            </w:r>
+            <w:r>
+              <w:rPr>
+                <w:rFonts w:ascii="Calibri" w:hAnsi="Calibri"/>
+                <w:i/>
+                <w:iCs/>
+                <w:sz w:val="18"/>
+              </w:rPr>
+              <w:t xml:space="preserve">A. absinthium</w:t>
+            </w:r>
+            <w:r>
+              <w:rPr>
+                <w:rFonts w:ascii="Calibri" w:hAnsi="Calibri"/>
+                <w:sz w:val="18"/>
+              </w:rPr>
+              <w:t xml:space="preserve"> </w:t>
+            </w:r>
+            <w:r>
+              <w:rPr>
+                <w:rFonts w:ascii="Calibri" w:hAnsi="Calibri"/>
+                <w:sz w:val="18"/>
+              </w:rPr>
+              <w:t xml:space="preserve">(Crúz-Crúz et al. 2025)</w:t>
             </w:r>
           </w:p>
         </w:tc>
@@ -11652,7 +11932,7 @@
     <w:bookmarkEnd w:id="47"/>
     <w:bookmarkEnd w:id="48"/>
     <w:bookmarkEnd w:id="49"/>
-    <w:bookmarkStart w:id="325" w:name="references"/>
+    <w:bookmarkStart w:id="327" w:name="references"/>
     <w:p>
       <w:pPr>
         <w:pStyle w:val="Heading1"/>
@@ -11662,7 +11942,7 @@
         <w:t xml:space="preserve">References</w:t>
       </w:r>
     </w:p>
-    <w:bookmarkStart w:id="324" w:name="refs"/>
+    <w:bookmarkStart w:id="326" w:name="refs"/>
     <w:bookmarkStart w:id="51" w:name="ref-abad2012artemisia"/>
     <w:p>
       <w:pPr>
@@ -13423,13 +13703,96 @@
       </w:r>
     </w:p>
     <w:bookmarkEnd w:id="107"/>
-    <w:bookmarkStart w:id="109" w:name="ref-czechowski2019wholeleaf"/>
+    <w:bookmarkStart w:id="109" w:name="ref-delacruz2025cinaewes"/>
     <w:p>
       <w:pPr>
         <w:pStyle w:val="Bibliography"/>
         <w:spacing w:before="0" w:after="120" w:line="264" w:lineRule="auto"/>
       </w:pPr>
       <w:r>
+        <w:t xml:space="preserve">Crúz-Crúz, Héctor Alejandro de la, Rosa Isabel Higuera-Piedrahita, Alejandro Zamilpa, Yazmín Alcalá-Canto, Ana Yuridia Ocampo-Gutiérrez, Luis David Arango-de la Pava, María Eugenia López-Arellano, Daniel Hernandez-Patlan, Jorge Alfredo Cuéllar-Ordaz, and Pedro Mendoza-de Gives. 2025.</w:t>
+      </w:r>
+      <w:r>
+        <w:t xml:space="preserve"> </w:t>
+      </w:r>
+      <w:r>
+        <w:t xml:space="preserve">“Using an Aqueous Suspension of</w:t>
+      </w:r>
+      <w:r>
+        <w:t xml:space="preserve"> </w:t>
+      </w:r>
+      <w:r>
+        <w:t xml:space="preserve">Duddingtonia flagrans</w:t>
+      </w:r>
+      <w:r>
+        <w:t xml:space="preserve"> </w:t>
+      </w:r>
+      <w:r>
+        <w:t xml:space="preserve">Chlamydospores and a Hexane Extract of</w:t>
+      </w:r>
+      <w:r>
+        <w:t xml:space="preserve"> </w:t>
+      </w:r>
+      <w:r>
+        <w:t xml:space="preserve">Artemisia cina</w:t>
+      </w:r>
+      <w:r>
+        <w:t xml:space="preserve"> </w:t>
+      </w:r>
+      <w:r>
+        <w:t xml:space="preserve">as Sustainable Methods to Reduce the Fecal Egg Count and Larvae of</w:t>
+      </w:r>
+      <w:r>
+        <w:t xml:space="preserve"> </w:t>
+      </w:r>
+      <w:r>
+        <w:t xml:space="preserve">Haemonchus contortus</w:t>
+      </w:r>
+      <w:r>
+        <w:t xml:space="preserve"> </w:t>
+      </w:r>
+      <w:r>
+        <w:t xml:space="preserve">in the Feces of Periparturient Ewes.”</w:t>
+      </w:r>
+      <w:r>
+        <w:t xml:space="preserve"> </w:t>
+      </w:r>
+      <w:r>
+        <w:rPr>
+          <w:i/>
+          <w:iCs/>
+        </w:rPr>
+        <w:t xml:space="preserve">Pathogens</w:t>
+      </w:r>
+      <w:r>
+        <w:t xml:space="preserve"> </w:t>
+      </w:r>
+      <w:r>
+        <w:t xml:space="preserve">14 (2): 105.</w:t>
+      </w:r>
+      <w:r>
+        <w:t xml:space="preserve"> </w:t>
+      </w:r>
+      <w:hyperlink r:id="rId108">
+        <w:r>
+          <w:rPr>
+            <w:rStyle w:val="Hyperlink"/>
+          </w:rPr>
+          <w:t xml:space="preserve">https://doi.org/10.3390/pathogens14020105</w:t>
+        </w:r>
+      </w:hyperlink>
+      <w:r>
+        <w:t xml:space="preserve">.</w:t>
+      </w:r>
+    </w:p>
+    <w:bookmarkEnd w:id="109"/>
+    <w:bookmarkStart w:id="111" w:name="ref-czechowski2019wholeleaf"/>
+    <w:p>
+      <w:pPr>
+        <w:pStyle w:val="Bibliography"/>
+        <w:spacing w:before="0" w:after="120" w:line="264" w:lineRule="auto"/>
+      </w:pPr>
+      <w:r>
         <w:t xml:space="preserve">Czechowski, T, M A Rinaldi, M T Famodimu, M Van Veelen, T R Larson, T Winzer, D A Rathbone, D Harvey, P Horrocks, and I A Graham. 2019.</w:t>
       </w:r>
       <w:r>
@@ -13457,7 +13820,7 @@
       <w:r>
         <w:t xml:space="preserve"> </w:t>
       </w:r>
-      <w:hyperlink r:id="rId108">
+      <w:hyperlink r:id="rId110">
         <w:r>
           <w:rPr>
             <w:rStyle w:val="Hyperlink"/>
@@ -13469,8 +13832,8 @@
         <w:t xml:space="preserve">.</w:t>
       </w:r>
     </w:p>
-    <w:bookmarkEnd w:id="109"/>
-    <w:bookmarkStart w:id="111" w:name="ref-elfawal2015wholeplant"/>
+    <w:bookmarkEnd w:id="111"/>
+    <w:bookmarkStart w:id="113" w:name="ref-elfawal2015wholeplant"/>
     <w:p>
       <w:pPr>
         <w:pStyle w:val="Bibliography"/>
@@ -13504,7 +13867,7 @@
       <w:r>
         <w:t xml:space="preserve"> </w:t>
       </w:r>
-      <w:hyperlink r:id="rId110">
+      <w:hyperlink r:id="rId112">
         <w:r>
           <w:rPr>
             <w:rStyle w:val="Hyperlink"/>
@@ -13516,8 +13879,8 @@
         <w:t xml:space="preserve">.</w:t>
       </w:r>
     </w:p>
-    <w:bookmarkEnd w:id="111"/>
-    <w:bookmarkStart w:id="113" w:name="ref-elfawal2012wholeplant"/>
+    <w:bookmarkEnd w:id="113"/>
+    <w:bookmarkStart w:id="115" w:name="ref-elfawal2012wholeplant"/>
     <w:p>
       <w:pPr>
         <w:pStyle w:val="Bibliography"/>
@@ -13563,7 +13926,7 @@
       <w:r>
         <w:t xml:space="preserve"> </w:t>
       </w:r>
-      <w:hyperlink r:id="rId112">
+      <w:hyperlink r:id="rId114">
         <w:r>
           <w:rPr>
             <w:rStyle w:val="Hyperlink"/>
@@ -13575,8 +13938,8 @@
         <w:t xml:space="preserve">.</w:t>
       </w:r>
     </w:p>
-    <w:bookmarkEnd w:id="113"/>
-    <w:bookmarkStart w:id="115" w:name="ref-evlice2026artemisiaoilsnematodes"/>
+    <w:bookmarkEnd w:id="115"/>
+    <w:bookmarkStart w:id="117" w:name="ref-evlice2026artemisiaoilsnematodes"/>
     <w:p>
       <w:pPr>
         <w:pStyle w:val="Bibliography"/>
@@ -13634,7 +13997,7 @@
       <w:r>
         <w:t xml:space="preserve"> </w:t>
       </w:r>
-      <w:hyperlink r:id="rId114">
+      <w:hyperlink r:id="rId116">
         <w:r>
           <w:rPr>
             <w:rStyle w:val="Hyperlink"/>
@@ -13646,8 +14009,8 @@
         <w:t xml:space="preserve">.</w:t>
       </w:r>
     </w:p>
-    <w:bookmarkEnd w:id="115"/>
-    <w:bookmarkStart w:id="117" w:name="ref-ezeta2023ludovicianafasciola"/>
+    <w:bookmarkEnd w:id="117"/>
+    <w:bookmarkStart w:id="119" w:name="ref-ezeta2023ludovicianafasciola"/>
     <w:p>
       <w:pPr>
         <w:pStyle w:val="Bibliography"/>
@@ -13702,7 +14065,7 @@
       <w:r>
         <w:t xml:space="preserve"> </w:t>
       </w:r>
-      <w:hyperlink r:id="rId116">
+      <w:hyperlink r:id="rId118">
         <w:r>
           <w:rPr>
             <w:rStyle w:val="Hyperlink"/>
@@ -13714,8 +14077,8 @@
         <w:t xml:space="preserve">.</w:t>
       </w:r>
     </w:p>
-    <w:bookmarkEnd w:id="117"/>
-    <w:bookmarkStart w:id="119" w:name="ref-fabre2025cadinapyridine"/>
+    <w:bookmarkEnd w:id="119"/>
+    <w:bookmarkStart w:id="121" w:name="ref-fabre2025cadinapyridine"/>
     <w:p>
       <w:pPr>
         <w:pStyle w:val="Bibliography"/>
@@ -13761,7 +14124,7 @@
       <w:r>
         <w:t xml:space="preserve"> </w:t>
       </w:r>
-      <w:hyperlink r:id="rId118">
+      <w:hyperlink r:id="rId120">
         <w:r>
           <w:rPr>
             <w:rStyle w:val="Hyperlink"/>
@@ -13773,8 +14136,8 @@
         <w:t xml:space="preserve">.</w:t>
       </w:r>
     </w:p>
-    <w:bookmarkEnd w:id="119"/>
-    <w:bookmarkStart w:id="121" w:name="ref-ferreira2024hydrotrope"/>
+    <w:bookmarkEnd w:id="121"/>
+    <w:bookmarkStart w:id="123" w:name="ref-ferreira2024hydrotrope"/>
     <w:p>
       <w:pPr>
         <w:pStyle w:val="Bibliography"/>
@@ -13830,7 +14193,7 @@
       <w:r>
         <w:t xml:space="preserve"> </w:t>
       </w:r>
-      <w:hyperlink r:id="rId120">
+      <w:hyperlink r:id="rId122">
         <w:r>
           <w:rPr>
             <w:rStyle w:val="Hyperlink"/>
@@ -13842,8 +14205,8 @@
         <w:t xml:space="preserve">.</w:t>
       </w:r>
     </w:p>
-    <w:bookmarkEnd w:id="121"/>
-    <w:bookmarkStart w:id="123" w:name="ref-fu2017pdr3"/>
+    <w:bookmarkEnd w:id="123"/>
+    <w:bookmarkStart w:id="125" w:name="ref-fu2017pdr3"/>
     <w:p>
       <w:pPr>
         <w:pStyle w:val="Bibliography"/>
@@ -13892,7 +14255,7 @@
       <w:r>
         <w:t xml:space="preserve"> </w:t>
       </w:r>
-      <w:hyperlink r:id="rId122">
+      <w:hyperlink r:id="rId124">
         <w:r>
           <w:rPr>
             <w:rStyle w:val="Hyperlink"/>
@@ -13904,8 +14267,8 @@
         <w:t xml:space="preserve">.</w:t>
       </w:r>
     </w:p>
-    <w:bookmarkEnd w:id="123"/>
-    <w:bookmarkStart w:id="125" w:name="ref-garciarodriguez2015absinthium"/>
+    <w:bookmarkEnd w:id="125"/>
+    <w:bookmarkStart w:id="127" w:name="ref-garciarodriguez2015absinthium"/>
     <w:p>
       <w:pPr>
         <w:pStyle w:val="Bibliography"/>
@@ -13939,7 +14302,7 @@
       <w:r>
         <w:t xml:space="preserve"> </w:t>
       </w:r>
-      <w:hyperlink r:id="rId124">
+      <w:hyperlink r:id="rId126">
         <w:r>
           <w:rPr>
             <w:rStyle w:val="Hyperlink"/>
@@ -13951,8 +14314,8 @@
         <w:t xml:space="preserve">.</w:t>
       </w:r>
     </w:p>
-    <w:bookmarkEnd w:id="125"/>
-    <w:bookmarkStart w:id="127" w:name="ref-gruessner2021complexartemisiaal"/>
+    <w:bookmarkEnd w:id="127"/>
+    <w:bookmarkStart w:id="129" w:name="ref-gruessner2021complexartemisiaal"/>
     <w:p>
       <w:pPr>
         <w:pStyle w:val="Bibliography"/>
@@ -14010,7 +14373,7 @@
       <w:r>
         <w:t xml:space="preserve"> </w:t>
       </w:r>
-      <w:hyperlink r:id="rId126">
+      <w:hyperlink r:id="rId128">
         <w:r>
           <w:rPr>
             <w:rStyle w:val="Hyperlink"/>
@@ -14022,8 +14385,8 @@
         <w:t xml:space="preserve">.</w:t>
       </w:r>
     </w:p>
-    <w:bookmarkEnd w:id="127"/>
-    <w:bookmarkStart w:id="129" w:name="ref-guo2023mir160"/>
+    <w:bookmarkEnd w:id="129"/>
+    <w:bookmarkStart w:id="131" w:name="ref-guo2023mir160"/>
     <w:p>
       <w:pPr>
         <w:pStyle w:val="Bibliography"/>
@@ -14066,7 +14429,7 @@
       <w:r>
         <w:t xml:space="preserve"> </w:t>
       </w:r>
-      <w:hyperlink r:id="rId128">
+      <w:hyperlink r:id="rId130">
         <w:r>
           <w:rPr>
             <w:rStyle w:val="Hyperlink"/>
@@ -14078,8 +14441,8 @@
         <w:t xml:space="preserve">.</w:t>
       </w:r>
     </w:p>
-    <w:bookmarkEnd w:id="129"/>
-    <w:bookmarkStart w:id="131" w:name="ref-guo2025dhaadh"/>
+    <w:bookmarkEnd w:id="131"/>
+    <w:bookmarkStart w:id="133" w:name="ref-guo2025dhaadh"/>
     <w:p>
       <w:pPr>
         <w:pStyle w:val="Bibliography"/>
@@ -14113,7 +14476,7 @@
       <w:r>
         <w:t xml:space="preserve"> </w:t>
       </w:r>
-      <w:hyperlink r:id="rId130">
+      <w:hyperlink r:id="rId132">
         <w:r>
           <w:rPr>
             <w:rStyle w:val="Hyperlink"/>
@@ -14125,8 +14488,8 @@
         <w:t xml:space="preserve">.</w:t>
       </w:r>
     </w:p>
-    <w:bookmarkEnd w:id="131"/>
-    <w:bookmarkStart w:id="133" w:name="ref-hernandez2025cinananoparticles"/>
+    <w:bookmarkEnd w:id="133"/>
+    <w:bookmarkStart w:id="135" w:name="ref-hernandez2025cinananoparticles"/>
     <w:p>
       <w:pPr>
         <w:pStyle w:val="Bibliography"/>
@@ -14181,7 +14544,7 @@
       <w:r>
         <w:t xml:space="preserve"> </w:t>
       </w:r>
-      <w:hyperlink r:id="rId132">
+      <w:hyperlink r:id="rId134">
         <w:r>
           <w:rPr>
             <w:rStyle w:val="Hyperlink"/>
@@ -14193,8 +14556,8 @@
         <w:t xml:space="preserve">.</w:t>
       </w:r>
     </w:p>
-    <w:bookmarkEnd w:id="133"/>
-    <w:bookmarkStart w:id="135" w:name="ref-heydari2013sieberi"/>
+    <w:bookmarkEnd w:id="135"/>
+    <w:bookmarkStart w:id="137" w:name="ref-heydari2013sieberi"/>
     <w:p>
       <w:pPr>
         <w:pStyle w:val="Bibliography"/>
@@ -14249,7 +14612,7 @@
       <w:r>
         <w:t xml:space="preserve"> </w:t>
       </w:r>
-      <w:hyperlink r:id="rId134">
+      <w:hyperlink r:id="rId136">
         <w:r>
           <w:rPr>
             <w:rStyle w:val="Hyperlink"/>
@@ -14261,8 +14624,8 @@
         <w:t xml:space="preserve">.</w:t>
       </w:r>
     </w:p>
-    <w:bookmarkEnd w:id="135"/>
-    <w:bookmarkStart w:id="137" w:name="ref-higuera2021cina"/>
+    <w:bookmarkEnd w:id="137"/>
+    <w:bookmarkStart w:id="139" w:name="ref-higuera2021cina"/>
     <w:p>
       <w:pPr>
         <w:pStyle w:val="Bibliography"/>
@@ -14332,7 +14695,7 @@
       <w:r>
         <w:t xml:space="preserve"> </w:t>
       </w:r>
-      <w:hyperlink r:id="rId136">
+      <w:hyperlink r:id="rId138">
         <w:r>
           <w:rPr>
             <w:rStyle w:val="Hyperlink"/>
@@ -14344,8 +14707,8 @@
         <w:t xml:space="preserve">.</w:t>
       </w:r>
     </w:p>
-    <w:bookmarkEnd w:id="137"/>
-    <w:bookmarkStart w:id="139" w:name="ref-higuera2023cinalignans"/>
+    <w:bookmarkEnd w:id="139"/>
+    <w:bookmarkStart w:id="141" w:name="ref-higuera2023cinalignans"/>
     <w:p>
       <w:pPr>
         <w:pStyle w:val="Bibliography"/>
@@ -14409,7 +14772,7 @@
       <w:r>
         <w:t xml:space="preserve"> </w:t>
       </w:r>
-      <w:hyperlink r:id="rId138">
+      <w:hyperlink r:id="rId140">
         <w:r>
           <w:rPr>
             <w:rStyle w:val="Hyperlink"/>
@@ -14421,8 +14784,8 @@
         <w:t xml:space="preserve">.</w:t>
       </w:r>
     </w:p>
-    <w:bookmarkEnd w:id="139"/>
-    <w:bookmarkStart w:id="141" w:name="ref-hoshiki2025herbaalbacattle"/>
+    <w:bookmarkEnd w:id="141"/>
+    <w:bookmarkStart w:id="143" w:name="ref-hoshiki2025herbaalbacattle"/>
     <w:p>
       <w:pPr>
         <w:pStyle w:val="Bibliography"/>
@@ -14474,7 +14837,7 @@
       <w:r>
         <w:t xml:space="preserve"> </w:t>
       </w:r>
-      <w:hyperlink r:id="rId140">
+      <w:hyperlink r:id="rId142">
         <w:r>
           <w:rPr>
             <w:rStyle w:val="Hyperlink"/>
@@ -14486,8 +14849,8 @@
         <w:t xml:space="preserve">.</w:t>
       </w:r>
     </w:p>
-    <w:bookmarkEnd w:id="141"/>
-    <w:bookmarkStart w:id="143" w:name="ref-hou2021argyipk"/>
+    <w:bookmarkEnd w:id="143"/>
+    <w:bookmarkStart w:id="145" w:name="ref-hou2021argyipk"/>
     <w:p>
       <w:pPr>
         <w:pStyle w:val="Bibliography"/>
@@ -14533,7 +14896,7 @@
       <w:r>
         <w:t xml:space="preserve"> </w:t>
       </w:r>
-      <w:hyperlink r:id="rId142">
+      <w:hyperlink r:id="rId144">
         <w:r>
           <w:rPr>
             <w:rStyle w:val="Hyperlink"/>
@@ -14545,8 +14908,8 @@
         <w:t xml:space="preserve">.</w:t>
       </w:r>
     </w:p>
-    <w:bookmarkEnd w:id="143"/>
-    <w:bookmarkStart w:id="145" w:name="ref-hussain2024artemisiareview"/>
+    <w:bookmarkEnd w:id="145"/>
+    <w:bookmarkStart w:id="147" w:name="ref-hussain2024artemisiareview"/>
     <w:p>
       <w:pPr>
         <w:pStyle w:val="Bibliography"/>
@@ -14580,7 +14943,7 @@
       <w:r>
         <w:t xml:space="preserve"> </w:t>
       </w:r>
-      <w:hyperlink r:id="rId144">
+      <w:hyperlink r:id="rId146">
         <w:r>
           <w:rPr>
             <w:rStyle w:val="Hyperlink"/>
@@ -14592,8 +14955,8 @@
         <w:t xml:space="preserve">.</w:t>
       </w:r>
     </w:p>
-    <w:bookmarkEnd w:id="145"/>
-    <w:bookmarkStart w:id="147" w:name="ref-hussain2025brevifolia"/>
+    <w:bookmarkEnd w:id="147"/>
+    <w:bookmarkStart w:id="149" w:name="ref-hussain2025brevifolia"/>
     <w:p>
       <w:pPr>
         <w:pStyle w:val="Bibliography"/>
@@ -14627,7 +14990,7 @@
       <w:r>
         <w:t xml:space="preserve"> </w:t>
       </w:r>
-      <w:hyperlink r:id="rId146">
+      <w:hyperlink r:id="rId148">
         <w:r>
           <w:rPr>
             <w:rStyle w:val="Hyperlink"/>
@@ -14639,8 +15002,8 @@
         <w:t xml:space="preserve">.</w:t>
       </w:r>
     </w:p>
-    <w:bookmarkEnd w:id="147"/>
-    <w:bookmarkStart w:id="149" w:name="ref-iqbal2013absinthiumcoccidiosis"/>
+    <w:bookmarkEnd w:id="149"/>
+    <w:bookmarkStart w:id="151" w:name="ref-iqbal2013absinthiumcoccidiosis"/>
     <w:p>
       <w:pPr>
         <w:pStyle w:val="Bibliography"/>
@@ -14683,7 +15046,7 @@
       <w:r>
         <w:t xml:space="preserve"> </w:t>
       </w:r>
-      <w:hyperlink r:id="rId148">
+      <w:hyperlink r:id="rId150">
         <w:r>
           <w:rPr>
             <w:rStyle w:val="Hyperlink"/>
@@ -14695,8 +15058,8 @@
         <w:t xml:space="preserve">.</w:t>
       </w:r>
     </w:p>
-    <w:bookmarkEnd w:id="149"/>
-    <w:bookmarkStart w:id="151" w:name="ref-irehan2026absinthium"/>
+    <w:bookmarkEnd w:id="151"/>
+    <w:bookmarkStart w:id="153" w:name="ref-irehan2026absinthium"/>
     <w:p>
       <w:pPr>
         <w:pStyle w:val="Bibliography"/>
@@ -14730,7 +15093,7 @@
       <w:r>
         <w:t xml:space="preserve"> </w:t>
       </w:r>
-      <w:hyperlink r:id="rId150">
+      <w:hyperlink r:id="rId152">
         <w:r>
           <w:rPr>
             <w:rStyle w:val="Hyperlink"/>
@@ -14742,8 +15105,8 @@
         <w:t xml:space="preserve">.</w:t>
       </w:r>
     </w:p>
-    <w:bookmarkEnd w:id="151"/>
-    <w:bookmarkStart w:id="153" w:name="ref-chandler2015stl"/>
+    <w:bookmarkEnd w:id="153"/>
+    <w:bookmarkStart w:id="155" w:name="ref-chandler2015stl"/>
     <w:p>
       <w:pPr>
         <w:pStyle w:val="Bibliography"/>
@@ -14777,7 +15140,7 @@
       <w:r>
         <w:t xml:space="preserve"> </w:t>
       </w:r>
-      <w:hyperlink r:id="rId152">
+      <w:hyperlink r:id="rId154">
         <w:r>
           <w:rPr>
             <w:rStyle w:val="Hyperlink"/>
@@ -14789,8 +15152,8 @@
         <w:t xml:space="preserve">.</w:t>
       </w:r>
     </w:p>
-    <w:bookmarkEnd w:id="153"/>
-    <w:bookmarkStart w:id="155" w:name="ref-ji2025chrysosplenetin"/>
+    <w:bookmarkEnd w:id="155"/>
+    <w:bookmarkStart w:id="157" w:name="ref-ji2025chrysosplenetin"/>
     <w:p>
       <w:pPr>
         <w:pStyle w:val="Bibliography"/>
@@ -14836,7 +15199,7 @@
       <w:r>
         <w:t xml:space="preserve"> </w:t>
       </w:r>
-      <w:hyperlink r:id="rId154">
+      <w:hyperlink r:id="rId156">
         <w:r>
           <w:rPr>
             <w:rStyle w:val="Hyperlink"/>
@@ -14848,8 +15211,8 @@
         <w:t xml:space="preserve">.</w:t>
       </w:r>
     </w:p>
-    <w:bookmarkEnd w:id="155"/>
-    <w:bookmarkStart w:id="157" w:name="ref-jiang2016wrky1"/>
+    <w:bookmarkEnd w:id="157"/>
+    <w:bookmarkStart w:id="159" w:name="ref-jiang2016wrky1"/>
     <w:p>
       <w:pPr>
         <w:pStyle w:val="Bibliography"/>
@@ -14901,7 +15264,7 @@
       <w:r>
         <w:t xml:space="preserve"> </w:t>
       </w:r>
-      <w:hyperlink r:id="rId156">
+      <w:hyperlink r:id="rId158">
         <w:r>
           <w:rPr>
             <w:rStyle w:val="Hyperlink"/>
@@ -14913,8 +15276,8 @@
         <w:t xml:space="preserve">.</w:t>
       </w:r>
     </w:p>
-    <w:bookmarkEnd w:id="157"/>
-    <w:bookmarkStart w:id="159" w:name="ref-artemisia2025phylogenomics"/>
+    <w:bookmarkEnd w:id="159"/>
+    <w:bookmarkStart w:id="161" w:name="ref-artemisia2025phylogenomics"/>
     <w:p>
       <w:pPr>
         <w:pStyle w:val="Bibliography"/>
@@ -14948,7 +15311,7 @@
       <w:r>
         <w:t xml:space="preserve"> </w:t>
       </w:r>
-      <w:hyperlink r:id="rId158">
+      <w:hyperlink r:id="rId160">
         <w:r>
           <w:rPr>
             <w:rStyle w:val="Hyperlink"/>
@@ -14960,8 +15323,8 @@
         <w:t xml:space="preserve">.</w:t>
       </w:r>
     </w:p>
-    <w:bookmarkEnd w:id="159"/>
-    <w:bookmarkStart w:id="161" w:name="ref-judzentiene2016vulgaris"/>
+    <w:bookmarkEnd w:id="161"/>
+    <w:bookmarkStart w:id="163" w:name="ref-judzentiene2016vulgaris"/>
     <w:p>
       <w:pPr>
         <w:pStyle w:val="Bibliography"/>
@@ -14976,7 +15339,7 @@
       <w:r>
         <w:t xml:space="preserve">“</w:t>
       </w:r>
-      <w:hyperlink r:id="rId160">
+      <w:hyperlink r:id="rId162">
         <w:r>
           <w:rPr>
             <w:rStyle w:val="Hyperlink"/>
@@ -15016,8 +15379,8 @@
         <w:t xml:space="preserve">11 (9): 1353–56.</w:t>
       </w:r>
     </w:p>
-    <w:bookmarkEnd w:id="161"/>
-    <w:bookmarkStart w:id="163" w:name="ref-kane2022cyp450"/>
+    <w:bookmarkEnd w:id="163"/>
+    <w:bookmarkStart w:id="165" w:name="ref-kane2022cyp450"/>
     <w:p>
       <w:pPr>
         <w:pStyle w:val="Bibliography"/>
@@ -15072,7 +15435,7 @@
       <w:r>
         <w:t xml:space="preserve"> </w:t>
       </w:r>
-      <w:hyperlink r:id="rId162">
+      <w:hyperlink r:id="rId164">
         <w:r>
           <w:rPr>
             <w:rStyle w:val="Hyperlink"/>
@@ -15084,8 +15447,8 @@
         <w:t xml:space="preserve">.</w:t>
       </w:r>
     </w:p>
-    <w:bookmarkEnd w:id="163"/>
-    <w:bookmarkStart w:id="165" w:name="ref-khan2015artemisia_nematodes"/>
+    <w:bookmarkEnd w:id="165"/>
+    <w:bookmarkStart w:id="167" w:name="ref-khan2015artemisia_nematodes"/>
     <w:p>
       <w:pPr>
         <w:pStyle w:val="Bibliography"/>
@@ -15100,7 +15463,7 @@
       <w:r>
         <w:t xml:space="preserve">“</w:t>
       </w:r>
-      <w:hyperlink r:id="rId164">
+      <w:hyperlink r:id="rId166">
         <w:r>
           <w:rPr>
             <w:rStyle w:val="Hyperlink"/>
@@ -15152,8 +15515,8 @@
         <w:t xml:space="preserve">32 (2): 257–68.</w:t>
       </w:r>
     </w:p>
-    <w:bookmarkEnd w:id="165"/>
-    <w:bookmarkStart w:id="167" w:name="ref-kunnathattil2025vulgaris"/>
+    <w:bookmarkEnd w:id="167"/>
+    <w:bookmarkStart w:id="169" w:name="ref-kunnathattil2025vulgaris"/>
     <w:p>
       <w:pPr>
         <w:pStyle w:val="Bibliography"/>
@@ -15211,7 +15574,7 @@
       <w:r>
         <w:t xml:space="preserve"> </w:t>
       </w:r>
-      <w:hyperlink r:id="rId166">
+      <w:hyperlink r:id="rId168">
         <w:r>
           <w:rPr>
             <w:rStyle w:val="Hyperlink"/>
@@ -15223,8 +15586,8 @@
         <w:t xml:space="preserve">.</w:t>
       </w:r>
     </w:p>
-    <w:bookmarkEnd w:id="167"/>
-    <w:bookmarkStart w:id="169" w:name="ref-li2018naturalcombination"/>
+    <w:bookmarkEnd w:id="169"/>
+    <w:bookmarkStart w:id="171" w:name="ref-li2018naturalcombination"/>
     <w:p>
       <w:pPr>
         <w:pStyle w:val="Bibliography"/>
@@ -15270,7 +15633,7 @@
       <w:r>
         <w:t xml:space="preserve"> </w:t>
       </w:r>
-      <w:hyperlink r:id="rId168">
+      <w:hyperlink r:id="rId170">
         <w:r>
           <w:rPr>
             <w:rStyle w:val="Hyperlink"/>
@@ -15282,8 +15645,8 @@
         <w:t xml:space="preserve">.</w:t>
       </w:r>
     </w:p>
-    <w:bookmarkEnd w:id="169"/>
-    <w:bookmarkStart w:id="171" w:name="ref-li2008sphaerocephalasaponin"/>
+    <w:bookmarkEnd w:id="171"/>
+    <w:bookmarkStart w:id="173" w:name="ref-li2008sphaerocephalasaponin"/>
     <w:p>
       <w:pPr>
         <w:pStyle w:val="Bibliography"/>
@@ -15326,7 +15689,7 @@
       <w:r>
         <w:t xml:space="preserve"> </w:t>
       </w:r>
-      <w:hyperlink r:id="rId170">
+      <w:hyperlink r:id="rId172">
         <w:r>
           <w:rPr>
             <w:rStyle w:val="Hyperlink"/>
@@ -15338,8 +15701,8 @@
         <w:t xml:space="preserve">.</w:t>
       </w:r>
     </w:p>
-    <w:bookmarkEnd w:id="171"/>
-    <w:bookmarkStart w:id="173" w:name="ref-li1990sacrorumditerpene"/>
+    <w:bookmarkEnd w:id="173"/>
+    <w:bookmarkStart w:id="175" w:name="ref-li1990sacrorumditerpene"/>
     <w:p>
       <w:pPr>
         <w:pStyle w:val="Bibliography"/>
@@ -15382,7 +15745,7 @@
       <w:r>
         <w:t xml:space="preserve"> </w:t>
       </w:r>
-      <w:hyperlink r:id="rId172">
+      <w:hyperlink r:id="rId174">
         <w:r>
           <w:rPr>
             <w:rStyle w:val="Hyperlink"/>
@@ -15394,8 +15757,8 @@
         <w:t xml:space="preserve">.</w:t>
       </w:r>
     </w:p>
-    <w:bookmarkEnd w:id="173"/>
-    <w:bookmarkStart w:id="175" w:name="ref-liu2026osc"/>
+    <w:bookmarkEnd w:id="175"/>
+    <w:bookmarkStart w:id="177" w:name="ref-liu2026osc"/>
     <w:p>
       <w:pPr>
         <w:pStyle w:val="Bibliography"/>
@@ -15441,7 +15804,7 @@
       <w:r>
         <w:t xml:space="preserve"> </w:t>
       </w:r>
-      <w:hyperlink r:id="rId174">
+      <w:hyperlink r:id="rId176">
         <w:r>
           <w:rPr>
             <w:rStyle w:val="Hyperlink"/>
@@ -15453,8 +15816,8 @@
         <w:t xml:space="preserve">.</w:t>
       </w:r>
     </w:p>
-    <w:bookmarkEnd w:id="175"/>
-    <w:bookmarkStart w:id="177" w:name="ref-liu2022vulgaristerpenoids"/>
+    <w:bookmarkEnd w:id="177"/>
+    <w:bookmarkStart w:id="179" w:name="ref-liu2022vulgaristerpenoids"/>
     <w:p>
       <w:pPr>
         <w:pStyle w:val="Bibliography"/>
@@ -15500,7 +15863,7 @@
       <w:r>
         <w:t xml:space="preserve"> </w:t>
       </w:r>
-      <w:hyperlink r:id="rId176">
+      <w:hyperlink r:id="rId178">
         <w:r>
           <w:rPr>
             <w:rStyle w:val="Hyperlink"/>
@@ -15512,8 +15875,8 @@
         <w:t xml:space="preserve">.</w:t>
       </w:r>
     </w:p>
-    <w:bookmarkEnd w:id="177"/>
-    <w:bookmarkStart w:id="179" w:name="ref-lu2013aora"/>
+    <w:bookmarkEnd w:id="179"/>
+    <w:bookmarkStart w:id="181" w:name="ref-lu2013aora"/>
     <w:p>
       <w:pPr>
         <w:pStyle w:val="Bibliography"/>
@@ -15571,7 +15934,7 @@
       <w:r>
         <w:t xml:space="preserve"> </w:t>
       </w:r>
-      <w:hyperlink r:id="rId178">
+      <w:hyperlink r:id="rId180">
         <w:r>
           <w:rPr>
             <w:rStyle w:val="Hyperlink"/>
@@ -15583,8 +15946,8 @@
         <w:t xml:space="preserve">.</w:t>
       </w:r>
     </w:p>
-    <w:bookmarkEnd w:id="179"/>
-    <w:bookmarkStart w:id="181" w:name="ref-lv2016nac1"/>
+    <w:bookmarkEnd w:id="181"/>
+    <w:bookmarkStart w:id="183" w:name="ref-lv2016nac1"/>
     <w:p>
       <w:pPr>
         <w:pStyle w:val="Bibliography"/>
@@ -15645,7 +16008,7 @@
       <w:r>
         <w:t xml:space="preserve"> </w:t>
       </w:r>
-      <w:hyperlink r:id="rId180">
+      <w:hyperlink r:id="rId182">
         <w:r>
           <w:rPr>
             <w:rStyle w:val="Hyperlink"/>
@@ -15657,8 +16020,8 @@
         <w:t xml:space="preserve">.</w:t>
       </w:r>
     </w:p>
-    <w:bookmarkEnd w:id="181"/>
-    <w:bookmarkStart w:id="183" w:name="ref-ma2001caruifolia"/>
+    <w:bookmarkEnd w:id="183"/>
+    <w:bookmarkStart w:id="185" w:name="ref-ma2001caruifolia"/>
     <w:p>
       <w:pPr>
         <w:pStyle w:val="Bibliography"/>
@@ -15692,7 +16055,7 @@
       <w:r>
         <w:t xml:space="preserve"> </w:t>
       </w:r>
-      <w:hyperlink r:id="rId182">
+      <w:hyperlink r:id="rId184">
         <w:r>
           <w:rPr>
             <w:rStyle w:val="Hyperlink"/>
@@ -15704,8 +16067,8 @@
         <w:t xml:space="preserve">.</w:t>
       </w:r>
     </w:p>
-    <w:bookmarkEnd w:id="183"/>
-    <w:bookmarkStart w:id="185" w:name="ref-mamede2025metabolite"/>
+    <w:bookmarkEnd w:id="185"/>
+    <w:bookmarkStart w:id="187" w:name="ref-mamede2025metabolite"/>
     <w:p>
       <w:pPr>
         <w:pStyle w:val="Bibliography"/>
@@ -15772,7 +16135,7 @@
       <w:r>
         <w:t xml:space="preserve"> </w:t>
       </w:r>
-      <w:hyperlink r:id="rId184">
+      <w:hyperlink r:id="rId186">
         <w:r>
           <w:rPr>
             <w:rStyle w:val="Hyperlink"/>
@@ -15784,8 +16147,8 @@
         <w:t xml:space="preserve">.</w:t>
       </w:r>
     </w:p>
-    <w:bookmarkEnd w:id="185"/>
-    <w:bookmarkStart w:id="187" w:name="ref-martinezdiaz2015absinthiumtrypano"/>
+    <w:bookmarkEnd w:id="187"/>
+    <w:bookmarkStart w:id="189" w:name="ref-martinezdiaz2015absinthiumtrypano"/>
     <w:p>
       <w:pPr>
         <w:pStyle w:val="Bibliography"/>
@@ -15819,7 +16182,7 @@
       <w:r>
         <w:t xml:space="preserve"> </w:t>
       </w:r>
-      <w:hyperlink r:id="rId186">
+      <w:hyperlink r:id="rId188">
         <w:r>
           <w:rPr>
             <w:rStyle w:val="Hyperlink"/>
@@ -15831,8 +16194,8 @@
         <w:t xml:space="preserve">.</w:t>
       </w:r>
     </w:p>
-    <w:bookmarkEnd w:id="187"/>
-    <w:bookmarkStart w:id="189" w:name="ref-ming2025argyidrying"/>
+    <w:bookmarkEnd w:id="189"/>
+    <w:bookmarkStart w:id="191" w:name="ref-ming2025argyidrying"/>
     <w:p>
       <w:pPr>
         <w:pStyle w:val="Bibliography"/>
@@ -15875,7 +16238,7 @@
       <w:r>
         <w:t xml:space="preserve"> </w:t>
       </w:r>
-      <w:hyperlink r:id="rId188">
+      <w:hyperlink r:id="rId190">
         <w:r>
           <w:rPr>
             <w:rStyle w:val="Hyperlink"/>
@@ -15887,8 +16250,8 @@
         <w:t xml:space="preserve">.</w:t>
       </w:r>
     </w:p>
-    <w:bookmarkEnd w:id="189"/>
-    <w:bookmarkStart w:id="191" w:name="ref-mohammed2026monospermadrying"/>
+    <w:bookmarkEnd w:id="191"/>
+    <w:bookmarkStart w:id="193" w:name="ref-mohammed2026monospermadrying"/>
     <w:p>
       <w:pPr>
         <w:pStyle w:val="Bibliography"/>
@@ -15941,7 +16304,7 @@
       <w:r>
         <w:t xml:space="preserve"> </w:t>
       </w:r>
-      <w:hyperlink r:id="rId190">
+      <w:hyperlink r:id="rId192">
         <w:r>
           <w:rPr>
             <w:rStyle w:val="Hyperlink"/>
@@ -15953,8 +16316,8 @@
         <w:t xml:space="preserve">.</w:t>
       </w:r>
     </w:p>
-    <w:bookmarkEnd w:id="191"/>
-    <w:bookmarkStart w:id="193" w:name="ref-mojarrab2015extracts"/>
+    <w:bookmarkEnd w:id="193"/>
+    <w:bookmarkStart w:id="195" w:name="ref-mojarrab2015extracts"/>
     <w:p>
       <w:pPr>
         <w:pStyle w:val="Bibliography"/>
@@ -16000,7 +16363,7 @@
       <w:r>
         <w:t xml:space="preserve"> </w:t>
       </w:r>
-      <w:hyperlink r:id="rId192">
+      <w:hyperlink r:id="rId194">
         <w:r>
           <w:rPr>
             <w:rStyle w:val="Hyperlink"/>
@@ -16012,8 +16375,8 @@
         <w:t xml:space="preserve">.</w:t>
       </w:r>
     </w:p>
-    <w:bookmarkEnd w:id="193"/>
-    <w:bookmarkStart w:id="195" w:name="ref-mojarrab2014fractionation"/>
+    <w:bookmarkEnd w:id="195"/>
+    <w:bookmarkStart w:id="197" w:name="ref-mojarrab2014fractionation"/>
     <w:p>
       <w:pPr>
         <w:pStyle w:val="Bibliography"/>
@@ -16071,7 +16434,7 @@
       <w:r>
         <w:t xml:space="preserve"> </w:t>
       </w:r>
-      <w:hyperlink r:id="rId194">
+      <w:hyperlink r:id="rId196">
         <w:r>
           <w:rPr>
             <w:rStyle w:val="Hyperlink"/>
@@ -16083,8 +16446,8 @@
         <w:t xml:space="preserve">.</w:t>
       </w:r>
     </w:p>
-    <w:bookmarkEnd w:id="195"/>
-    <w:bookmarkStart w:id="197" w:name="ref-monzote2014absinthium"/>
+    <w:bookmarkEnd w:id="197"/>
+    <w:bookmarkStart w:id="199" w:name="ref-monzote2014absinthium"/>
     <w:p>
       <w:pPr>
         <w:pStyle w:val="Bibliography"/>
@@ -16118,7 +16481,7 @@
       <w:r>
         <w:t xml:space="preserve"> </w:t>
       </w:r>
-      <w:hyperlink r:id="rId196">
+      <w:hyperlink r:id="rId198">
         <w:r>
           <w:rPr>
             <w:rStyle w:val="Hyperlink"/>
@@ -16130,8 +16493,8 @@
         <w:t xml:space="preserve">.</w:t>
       </w:r>
     </w:p>
-    <w:bookmarkEnd w:id="197"/>
-    <w:bookmarkStart w:id="199" w:name="ref-morua2025standardizedannua"/>
+    <w:bookmarkEnd w:id="199"/>
+    <w:bookmarkStart w:id="201" w:name="ref-morua2025standardizedannua"/>
     <w:p>
       <w:pPr>
         <w:pStyle w:val="Bibliography"/>
@@ -16177,7 +16540,7 @@
       <w:r>
         <w:t xml:space="preserve"> </w:t>
       </w:r>
-      <w:hyperlink r:id="rId198">
+      <w:hyperlink r:id="rId200">
         <w:r>
           <w:rPr>
             <w:rStyle w:val="Hyperlink"/>
@@ -16189,8 +16552,8 @@
         <w:t xml:space="preserve">.</w:t>
       </w:r>
     </w:p>
-    <w:bookmarkEnd w:id="199"/>
-    <w:bookmarkStart w:id="201" w:name="ref-annua2015triterpenes"/>
+    <w:bookmarkEnd w:id="201"/>
+    <w:bookmarkStart w:id="203" w:name="ref-annua2015triterpenes"/>
     <w:p>
       <w:pPr>
         <w:pStyle w:val="Bibliography"/>
@@ -16224,7 +16587,7 @@
       <w:r>
         <w:t xml:space="preserve"> </w:t>
       </w:r>
-      <w:hyperlink r:id="rId200">
+      <w:hyperlink r:id="rId202">
         <w:r>
           <w:rPr>
             <w:rStyle w:val="Hyperlink"/>
@@ -16236,8 +16599,8 @@
         <w:t xml:space="preserve">.</w:t>
       </w:r>
     </w:p>
-    <w:bookmarkEnd w:id="201"/>
-    <w:bookmarkStart w:id="203" w:name="ref-mouton2013artemisininonly"/>
+    <w:bookmarkEnd w:id="203"/>
+    <w:bookmarkStart w:id="205" w:name="ref-mouton2013artemisininonly"/>
     <w:p>
       <w:pPr>
         <w:pStyle w:val="Bibliography"/>
@@ -16283,7 +16646,7 @@
       <w:r>
         <w:t xml:space="preserve"> </w:t>
       </w:r>
-      <w:hyperlink r:id="rId202">
+      <w:hyperlink r:id="rId204">
         <w:r>
           <w:rPr>
             <w:rStyle w:val="Hyperlink"/>
@@ -16295,8 +16658,8 @@
         <w:t xml:space="preserve">.</w:t>
       </w:r>
     </w:p>
-    <w:bookmarkEnd w:id="203"/>
-    <w:bookmarkStart w:id="205" w:name="ref-mravcakova2020wormwood"/>
+    <w:bookmarkEnd w:id="205"/>
+    <w:bookmarkStart w:id="207" w:name="ref-mravcakova2020wormwood"/>
     <w:p>
       <w:pPr>
         <w:pStyle w:val="Bibliography"/>
@@ -16330,7 +16693,7 @@
       <w:r>
         <w:t xml:space="preserve"> </w:t>
       </w:r>
-      <w:hyperlink r:id="rId204">
+      <w:hyperlink r:id="rId206">
         <w:r>
           <w:rPr>
             <w:rStyle w:val="Hyperlink"/>
@@ -16342,8 +16705,8 @@
         <w:t xml:space="preserve">.</w:t>
       </w:r>
     </w:p>
-    <w:bookmarkEnd w:id="205"/>
-    <w:bookmarkStart w:id="207" w:name="ref-nahrevanian2010khorassanica"/>
+    <w:bookmarkEnd w:id="207"/>
+    <w:bookmarkStart w:id="209" w:name="ref-nahrevanian2010khorassanica"/>
     <w:p>
       <w:pPr>
         <w:pStyle w:val="Bibliography"/>
@@ -16377,7 +16740,7 @@
       <w:r>
         <w:t xml:space="preserve"> </w:t>
       </w:r>
-      <w:hyperlink r:id="rId206">
+      <w:hyperlink r:id="rId208">
         <w:r>
           <w:rPr>
             <w:rStyle w:val="Hyperlink"/>
@@ -16389,8 +16752,8 @@
         <w:t xml:space="preserve">.</w:t>
       </w:r>
     </w:p>
-    <w:bookmarkEnd w:id="207"/>
-    <w:bookmarkStart w:id="209" w:name="ref-nahrevanian2012sieberi"/>
+    <w:bookmarkEnd w:id="209"/>
+    <w:bookmarkStart w:id="211" w:name="ref-nahrevanian2012sieberi"/>
     <w:p>
       <w:pPr>
         <w:pStyle w:val="Bibliography"/>
@@ -16424,7 +16787,7 @@
       <w:r>
         <w:t xml:space="preserve"> </w:t>
       </w:r>
-      <w:hyperlink r:id="rId208">
+      <w:hyperlink r:id="rId210">
         <w:r>
           <w:rPr>
             <w:rStyle w:val="Hyperlink"/>
@@ -16436,8 +16799,8 @@
         <w:t xml:space="preserve">.</w:t>
       </w:r>
     </w:p>
-    <w:bookmarkEnd w:id="209"/>
-    <w:bookmarkStart w:id="211" w:name="ref-nomani2022h2s"/>
+    <w:bookmarkEnd w:id="211"/>
+    <w:bookmarkStart w:id="213" w:name="ref-nomani2022h2s"/>
     <w:p>
       <w:pPr>
         <w:pStyle w:val="Bibliography"/>
@@ -16483,7 +16846,7 @@
       <w:r>
         <w:t xml:space="preserve"> </w:t>
       </w:r>
-      <w:hyperlink r:id="rId210">
+      <w:hyperlink r:id="rId212">
         <w:r>
           <w:rPr>
             <w:rStyle w:val="Hyperlink"/>
@@ -16495,8 +16858,8 @@
         <w:t xml:space="preserve">.</w:t>
       </w:r>
     </w:p>
-    <w:bookmarkEnd w:id="211"/>
-    <w:bookmarkStart w:id="213" w:name="ref-nurlaelasari2023vulgarisfasciola"/>
+    <w:bookmarkEnd w:id="213"/>
+    <w:bookmarkStart w:id="215" w:name="ref-nurlaelasari2023vulgarisfasciola"/>
     <w:p>
       <w:pPr>
         <w:pStyle w:val="Bibliography"/>
@@ -16551,7 +16914,7 @@
       <w:r>
         <w:t xml:space="preserve"> </w:t>
       </w:r>
-      <w:hyperlink r:id="rId212">
+      <w:hyperlink r:id="rId214">
         <w:r>
           <w:rPr>
             <w:rStyle w:val="Hyperlink"/>
@@ -16563,8 +16926,8 @@
         <w:t xml:space="preserve">.</w:t>
       </w:r>
     </w:p>
-    <w:bookmarkEnd w:id="213"/>
-    <w:bookmarkStart w:id="215" w:name="ref-olofsson2011tissue"/>
+    <w:bookmarkEnd w:id="215"/>
+    <w:bookmarkStart w:id="217" w:name="ref-olofsson2011tissue"/>
     <w:p>
       <w:pPr>
         <w:pStyle w:val="Bibliography"/>
@@ -16598,7 +16961,7 @@
       <w:r>
         <w:t xml:space="preserve"> </w:t>
       </w:r>
-      <w:hyperlink r:id="rId214">
+      <w:hyperlink r:id="rId216">
         <w:r>
           <w:rPr>
             <w:rStyle w:val="Hyperlink"/>
@@ -16610,8 +16973,8 @@
         <w:t xml:space="preserve">.</w:t>
       </w:r>
     </w:p>
-    <w:bookmarkEnd w:id="215"/>
-    <w:bookmarkStart w:id="217" w:name="ref-olsson2009localization"/>
+    <w:bookmarkEnd w:id="217"/>
+    <w:bookmarkStart w:id="219" w:name="ref-olsson2009localization"/>
     <w:p>
       <w:pPr>
         <w:pStyle w:val="Bibliography"/>
@@ -16645,7 +17008,7 @@
       <w:r>
         <w:t xml:space="preserve"> </w:t>
       </w:r>
-      <w:hyperlink r:id="rId216">
+      <w:hyperlink r:id="rId218">
         <w:r>
           <w:rPr>
             <w:rStyle w:val="Hyperlink"/>
@@ -16657,8 +17020,8 @@
         <w:t xml:space="preserve">.</w:t>
       </w:r>
     </w:p>
-    <w:bookmarkEnd w:id="217"/>
-    <w:bookmarkStart w:id="219" w:name="ref-ongo2019campestriscomment"/>
+    <w:bookmarkEnd w:id="219"/>
+    <w:bookmarkStart w:id="221" w:name="ref-ongo2019campestriscomment"/>
     <w:p>
       <w:pPr>
         <w:pStyle w:val="Bibliography"/>
@@ -16713,7 +17076,7 @@
       <w:r>
         <w:t xml:space="preserve"> </w:t>
       </w:r>
-      <w:hyperlink r:id="rId218">
+      <w:hyperlink r:id="rId220">
         <w:r>
           <w:rPr>
             <w:rStyle w:val="Hyperlink"/>
@@ -16725,8 +17088,8 @@
         <w:t xml:space="preserve">.</w:t>
       </w:r>
     </w:p>
-    <w:bookmarkEnd w:id="219"/>
-    <w:bookmarkStart w:id="221" w:name="ref-ortet2008gorgonum"/>
+    <w:bookmarkEnd w:id="221"/>
+    <w:bookmarkStart w:id="223" w:name="ref-ortet2008gorgonum"/>
     <w:p>
       <w:pPr>
         <w:pStyle w:val="Bibliography"/>
@@ -16760,7 +17123,7 @@
       <w:r>
         <w:t xml:space="preserve"> </w:t>
       </w:r>
-      <w:hyperlink r:id="rId220">
+      <w:hyperlink r:id="rId222">
         <w:r>
           <w:rPr>
             <w:rStyle w:val="Hyperlink"/>
@@ -16772,8 +17135,8 @@
         <w:t xml:space="preserve">.</w:t>
       </w:r>
     </w:p>
-    <w:bookmarkEnd w:id="221"/>
-    <w:bookmarkStart w:id="223" w:name="ref-osanloo2022dracunculusnanogel"/>
+    <w:bookmarkEnd w:id="223"/>
+    <w:bookmarkStart w:id="225" w:name="ref-osanloo2022dracunculusnanogel"/>
     <w:p>
       <w:pPr>
         <w:pStyle w:val="Bibliography"/>
@@ -16819,7 +17182,7 @@
       <w:r>
         <w:t xml:space="preserve"> </w:t>
       </w:r>
-      <w:hyperlink r:id="rId222">
+      <w:hyperlink r:id="rId224">
         <w:r>
           <w:rPr>
             <w:rStyle w:val="Hyperlink"/>
@@ -16831,8 +17194,8 @@
         <w:t xml:space="preserve">.</w:t>
       </w:r>
     </w:p>
-    <w:bookmarkEnd w:id="223"/>
-    <w:bookmarkStart w:id="225" w:name="ref-oyedeji2009afra"/>
+    <w:bookmarkEnd w:id="225"/>
+    <w:bookmarkStart w:id="227" w:name="ref-oyedeji2009afra"/>
     <w:p>
       <w:pPr>
         <w:pStyle w:val="Bibliography"/>
@@ -16866,7 +17229,7 @@
       <w:r>
         <w:t xml:space="preserve"> </w:t>
       </w:r>
-      <w:hyperlink r:id="rId224">
+      <w:hyperlink r:id="rId226">
         <w:r>
           <w:rPr>
             <w:rStyle w:val="Hyperlink"/>
@@ -16878,8 +17241,8 @@
         <w:t xml:space="preserve">.</w:t>
       </w:r>
     </w:p>
-    <w:bookmarkEnd w:id="225"/>
-    <w:bookmarkStart w:id="227" w:name="ref-pandey2017artemisiaoils"/>
+    <w:bookmarkEnd w:id="227"/>
+    <w:bookmarkStart w:id="229" w:name="ref-pandey2017artemisiaoils"/>
     <w:p>
       <w:pPr>
         <w:pStyle w:val="Bibliography"/>
@@ -16913,7 +17276,7 @@
       <w:r>
         <w:t xml:space="preserve"> </w:t>
       </w:r>
-      <w:hyperlink r:id="rId226">
+      <w:hyperlink r:id="rId228">
         <w:r>
           <w:rPr>
             <w:rStyle w:val="Hyperlink"/>
@@ -16925,8 +17288,8 @@
         <w:t xml:space="preserve">.</w:t>
       </w:r>
     </w:p>
-    <w:bookmarkEnd w:id="227"/>
-    <w:bookmarkStart w:id="229" w:name="ref-parveen2024scoparia"/>
+    <w:bookmarkEnd w:id="229"/>
+    <w:bookmarkStart w:id="231" w:name="ref-parveen2024scoparia"/>
     <w:p>
       <w:pPr>
         <w:pStyle w:val="Bibliography"/>
@@ -16972,7 +17335,7 @@
       <w:r>
         <w:t xml:space="preserve"> </w:t>
       </w:r>
-      <w:hyperlink r:id="rId228">
+      <w:hyperlink r:id="rId230">
         <w:r>
           <w:rPr>
             <w:rStyle w:val="Hyperlink"/>
@@ -16984,8 +17347,8 @@
         <w:t xml:space="preserve">.</w:t>
       </w:r>
     </w:p>
-    <w:bookmarkEnd w:id="229"/>
-    <w:bookmarkStart w:id="231" w:name="ref-paul2010recurrent"/>
+    <w:bookmarkEnd w:id="231"/>
+    <w:bookmarkStart w:id="233" w:name="ref-paul2010recurrent"/>
     <w:p>
       <w:pPr>
         <w:pStyle w:val="Bibliography"/>
@@ -17031,7 +17394,7 @@
       <w:r>
         <w:t xml:space="preserve"> </w:t>
       </w:r>
-      <w:hyperlink r:id="rId230">
+      <w:hyperlink r:id="rId232">
         <w:r>
           <w:rPr>
             <w:rStyle w:val="Hyperlink"/>
@@ -17043,8 +17406,8 @@
         <w:t xml:space="preserve">.</w:t>
       </w:r>
     </w:p>
-    <w:bookmarkEnd w:id="231"/>
-    <w:bookmarkStart w:id="233" w:name="ref-pirali2011tick"/>
+    <w:bookmarkEnd w:id="233"/>
+    <w:bookmarkStart w:id="235" w:name="ref-pirali2011tick"/>
     <w:p>
       <w:pPr>
         <w:pStyle w:val="Bibliography"/>
@@ -17102,7 +17465,7 @@
       <w:r>
         <w:t xml:space="preserve"> </w:t>
       </w:r>
-      <w:hyperlink r:id="rId232">
+      <w:hyperlink r:id="rId234">
         <w:r>
           <w:rPr>
             <w:rStyle w:val="Hyperlink"/>
@@ -17114,8 +17477,8 @@
         <w:t xml:space="preserve">.</w:t>
       </w:r>
     </w:p>
-    <w:bookmarkEnd w:id="233"/>
-    <w:bookmarkStart w:id="235" w:name="ref-radulovic2013toxic"/>
+    <w:bookmarkEnd w:id="235"/>
+    <w:bookmarkStart w:id="237" w:name="ref-radulovic2013toxic"/>
     <w:p>
       <w:pPr>
         <w:pStyle w:val="Bibliography"/>
@@ -17149,7 +17512,7 @@
       <w:r>
         <w:t xml:space="preserve"> </w:t>
       </w:r>
-      <w:hyperlink r:id="rId234">
+      <w:hyperlink r:id="rId236">
         <w:r>
           <w:rPr>
             <w:rStyle w:val="Hyperlink"/>
@@ -17161,8 +17524,8 @@
         <w:t xml:space="preserve">.</w:t>
       </w:r>
     </w:p>
-    <w:bookmarkEnd w:id="235"/>
-    <w:bookmarkStart w:id="237" w:name="ref-ram1997density"/>
+    <w:bookmarkEnd w:id="237"/>
+    <w:bookmarkStart w:id="239" w:name="ref-ram1997density"/>
     <w:p>
       <w:pPr>
         <w:pStyle w:val="Bibliography"/>
@@ -17208,7 +17571,7 @@
       <w:r>
         <w:t xml:space="preserve"> </w:t>
       </w:r>
-      <w:hyperlink r:id="rId236">
+      <w:hyperlink r:id="rId238">
         <w:r>
           <w:rPr>
             <w:rStyle w:val="Hyperlink"/>
@@ -17220,8 +17583,8 @@
         <w:t xml:space="preserve">.</w:t>
       </w:r>
     </w:p>
-    <w:bookmarkEnd w:id="237"/>
-    <w:bookmarkStart w:id="239" w:name="ref-ribbiso2021heme"/>
+    <w:bookmarkEnd w:id="239"/>
+    <w:bookmarkStart w:id="241" w:name="ref-ribbiso2021heme"/>
     <w:p>
       <w:pPr>
         <w:pStyle w:val="Bibliography"/>
@@ -17267,7 +17630,7 @@
       <w:r>
         <w:t xml:space="preserve"> </w:t>
       </w:r>
-      <w:hyperlink r:id="rId238">
+      <w:hyperlink r:id="rId240">
         <w:r>
           <w:rPr>
             <w:rStyle w:val="Hyperlink"/>
@@ -17279,8 +17642,8 @@
         <w:t xml:space="preserve">.</w:t>
       </w:r>
     </w:p>
-    <w:bookmarkEnd w:id="239"/>
-    <w:bookmarkStart w:id="241" w:name="ref-rosenthal2024proteostasis"/>
+    <w:bookmarkEnd w:id="241"/>
+    <w:bookmarkStart w:id="243" w:name="ref-rosenthal2024proteostasis"/>
     <w:p>
       <w:pPr>
         <w:pStyle w:val="Bibliography"/>
@@ -17323,7 +17686,7 @@
       <w:r>
         <w:t xml:space="preserve"> </w:t>
       </w:r>
-      <w:hyperlink r:id="rId240">
+      <w:hyperlink r:id="rId242">
         <w:r>
           <w:rPr>
             <w:rStyle w:val="Hyperlink"/>
@@ -17335,8 +17698,8 @@
         <w:t xml:space="preserve">.</w:t>
       </w:r>
     </w:p>
-    <w:bookmarkEnd w:id="241"/>
-    <w:bookmarkStart w:id="243" w:name="ref-rostkowska2016silicon"/>
+    <w:bookmarkEnd w:id="243"/>
+    <w:bookmarkStart w:id="245" w:name="ref-rostkowska2016silicon"/>
     <w:p>
       <w:pPr>
         <w:pStyle w:val="Bibliography"/>
@@ -17394,7 +17757,7 @@
       <w:r>
         <w:t xml:space="preserve"> </w:t>
       </w:r>
-      <w:hyperlink r:id="rId242">
+      <w:hyperlink r:id="rId244">
         <w:r>
           <w:rPr>
             <w:rStyle w:val="Hyperlink"/>
@@ -17406,8 +17769,8 @@
         <w:t xml:space="preserve">.</w:t>
       </w:r>
     </w:p>
-    <w:bookmarkEnd w:id="243"/>
-    <w:bookmarkStart w:id="245" w:name="ref-annua2016monoterpenes"/>
+    <w:bookmarkEnd w:id="245"/>
+    <w:bookmarkStart w:id="247" w:name="ref-annua2016monoterpenes"/>
     <w:p>
       <w:pPr>
         <w:pStyle w:val="Bibliography"/>
@@ -17441,7 +17804,7 @@
       <w:r>
         <w:t xml:space="preserve"> </w:t>
       </w:r>
-      <w:hyperlink r:id="rId244">
+      <w:hyperlink r:id="rId246">
         <w:r>
           <w:rPr>
             <w:rStyle w:val="Hyperlink"/>
@@ -17453,8 +17816,8 @@
         <w:t xml:space="preserve">.</w:t>
       </w:r>
     </w:p>
-    <w:bookmarkEnd w:id="245"/>
-    <w:bookmarkStart w:id="247" w:name="ref-said2016vcd"/>
+    <w:bookmarkEnd w:id="247"/>
+    <w:bookmarkStart w:id="249" w:name="ref-said2016vcd"/>
     <w:p>
       <w:pPr>
         <w:pStyle w:val="Bibliography"/>
@@ -17500,7 +17863,7 @@
       <w:r>
         <w:t xml:space="preserve"> </w:t>
       </w:r>
-      <w:hyperlink r:id="rId246">
+      <w:hyperlink r:id="rId248">
         <w:r>
           <w:rPr>
             <w:rStyle w:val="Hyperlink"/>
@@ -17512,8 +17875,8 @@
         <w:t xml:space="preserve">.</w:t>
       </w:r>
     </w:p>
-    <w:bookmarkEnd w:id="247"/>
-    <w:bookmarkStart w:id="249" w:name="ref-sanei2023nanoliposomes"/>
+    <w:bookmarkEnd w:id="249"/>
+    <w:bookmarkStart w:id="251" w:name="ref-sanei2023nanoliposomes"/>
     <w:p>
       <w:pPr>
         <w:pStyle w:val="Bibliography"/>
@@ -17580,7 +17943,7 @@
       <w:r>
         <w:t xml:space="preserve"> </w:t>
       </w:r>
-      <w:hyperlink r:id="rId248">
+      <w:hyperlink r:id="rId250">
         <w:r>
           <w:rPr>
             <w:rStyle w:val="Hyperlink"/>
@@ -17592,8 +17955,8 @@
         <w:t xml:space="preserve">.</w:t>
       </w:r>
     </w:p>
-    <w:bookmarkEnd w:id="249"/>
-    <w:bookmarkStart w:id="251" w:name="ref-schramek2010isotope"/>
+    <w:bookmarkEnd w:id="251"/>
+    <w:bookmarkStart w:id="253" w:name="ref-schramek2010isotope"/>
     <w:p>
       <w:pPr>
         <w:pStyle w:val="Bibliography"/>
@@ -17627,7 +17990,7 @@
       <w:r>
         <w:t xml:space="preserve"> </w:t>
       </w:r>
-      <w:hyperlink r:id="rId250">
+      <w:hyperlink r:id="rId252">
         <w:r>
           <w:rPr>
             <w:rStyle w:val="Hyperlink"/>
@@ -17639,8 +18002,8 @@
         <w:t xml:space="preserve">.</w:t>
       </w:r>
     </w:p>
-    <w:bookmarkEnd w:id="251"/>
-    <w:bookmarkStart w:id="253" w:name="ref-shen2012cypcpr"/>
+    <w:bookmarkEnd w:id="253"/>
+    <w:bookmarkStart w:id="255" w:name="ref-shen2012cypcpr"/>
     <w:p>
       <w:pPr>
         <w:pStyle w:val="Bibliography"/>
@@ -17698,7 +18061,7 @@
       <w:r>
         <w:t xml:space="preserve"> </w:t>
       </w:r>
-      <w:hyperlink r:id="rId252">
+      <w:hyperlink r:id="rId254">
         <w:r>
           <w:rPr>
             <w:rStyle w:val="Hyperlink"/>
@@ -17710,8 +18073,8 @@
         <w:t xml:space="preserve">.</w:t>
       </w:r>
     </w:p>
-    <w:bookmarkEnd w:id="253"/>
-    <w:bookmarkStart w:id="255" w:name="ref-shi2022annuaantimalarialmetabolomics"/>
+    <w:bookmarkEnd w:id="255"/>
+    <w:bookmarkStart w:id="257" w:name="ref-shi2022annuaantimalarialmetabolomics"/>
     <w:p>
       <w:pPr>
         <w:pStyle w:val="Bibliography"/>
@@ -17757,7 +18120,7 @@
       <w:r>
         <w:t xml:space="preserve"> </w:t>
       </w:r>
-      <w:hyperlink r:id="rId254">
+      <w:hyperlink r:id="rId256">
         <w:r>
           <w:rPr>
             <w:rStyle w:val="Hyperlink"/>
@@ -17769,8 +18132,8 @@
         <w:t xml:space="preserve">.</w:t>
       </w:r>
     </w:p>
-    <w:bookmarkEnd w:id="255"/>
-    <w:bookmarkStart w:id="257" w:name="ref-shi2018mixta1"/>
+    <w:bookmarkEnd w:id="257"/>
+    <w:bookmarkStart w:id="259" w:name="ref-shi2018mixta1"/>
     <w:p>
       <w:pPr>
         <w:pStyle w:val="Bibliography"/>
@@ -17825,7 +18188,7 @@
       <w:r>
         <w:t xml:space="preserve"> </w:t>
       </w:r>
-      <w:hyperlink r:id="rId256">
+      <w:hyperlink r:id="rId258">
         <w:r>
           <w:rPr>
             <w:rStyle w:val="Hyperlink"/>
@@ -17837,8 +18200,8 @@
         <w:t xml:space="preserve">.</w:t>
       </w:r>
     </w:p>
-    <w:bookmarkEnd w:id="257"/>
-    <w:bookmarkStart w:id="259" w:name="ref-dasilva2017annuasheep"/>
+    <w:bookmarkEnd w:id="259"/>
+    <w:bookmarkStart w:id="261" w:name="ref-dasilva2017annuasheep"/>
     <w:p>
       <w:pPr>
         <w:pStyle w:val="Bibliography"/>
@@ -17884,7 +18247,7 @@
       <w:r>
         <w:t xml:space="preserve"> </w:t>
       </w:r>
-      <w:hyperlink r:id="rId258">
+      <w:hyperlink r:id="rId260">
         <w:r>
           <w:rPr>
             <w:rStyle w:val="Hyperlink"/>
@@ -17896,8 +18259,8 @@
         <w:t xml:space="preserve">.</w:t>
       </w:r>
     </w:p>
-    <w:bookmarkEnd w:id="259"/>
-    <w:bookmarkStart w:id="261" w:name="ref-snider2021gametocytes"/>
+    <w:bookmarkEnd w:id="261"/>
+    <w:bookmarkStart w:id="263" w:name="ref-snider2021gametocytes"/>
     <w:p>
       <w:pPr>
         <w:pStyle w:val="Bibliography"/>
@@ -17955,7 +18318,7 @@
       <w:r>
         <w:t xml:space="preserve"> </w:t>
       </w:r>
-      <w:hyperlink r:id="rId260">
+      <w:hyperlink r:id="rId262">
         <w:r>
           <w:rPr>
             <w:rStyle w:val="Hyperlink"/>
@@ -17967,8 +18330,8 @@
         <w:t xml:space="preserve">.</w:t>
       </w:r>
     </w:p>
-    <w:bookmarkEnd w:id="261"/>
-    <w:bookmarkStart w:id="263" w:name="ref-soleimanifard2023kermanensis"/>
+    <w:bookmarkEnd w:id="263"/>
+    <w:bookmarkStart w:id="265" w:name="ref-soleimanifard2023kermanensis"/>
     <w:p>
       <w:pPr>
         <w:pStyle w:val="Bibliography"/>
@@ -18014,7 +18377,7 @@
       <w:r>
         <w:t xml:space="preserve"> </w:t>
       </w:r>
-      <w:hyperlink r:id="rId262">
+      <w:hyperlink r:id="rId264">
         <w:r>
           <w:rPr>
             <w:rStyle w:val="Hyperlink"/>
@@ -18026,8 +18389,8 @@
         <w:t xml:space="preserve">.</w:t>
       </w:r>
     </w:p>
-    <w:bookmarkEnd w:id="263"/>
-    <w:bookmarkStart w:id="265" w:name="ref-squires2011haemonchus"/>
+    <w:bookmarkEnd w:id="265"/>
+    <w:bookmarkStart w:id="267" w:name="ref-squires2011haemonchus"/>
     <w:p>
       <w:pPr>
         <w:pStyle w:val="Bibliography"/>
@@ -18061,7 +18424,7 @@
       <w:r>
         <w:t xml:space="preserve"> </w:t>
       </w:r>
-      <w:hyperlink r:id="rId264">
+      <w:hyperlink r:id="rId266">
         <w:r>
           <w:rPr>
             <w:rStyle w:val="Hyperlink"/>
@@ -18073,8 +18436,8 @@
         <w:t xml:space="preserve">.</w:t>
       </w:r>
     </w:p>
-    <w:bookmarkEnd w:id="265"/>
-    <w:bookmarkStart w:id="267" w:name="ref-tabari2017sieberi"/>
+    <w:bookmarkEnd w:id="267"/>
+    <w:bookmarkStart w:id="269" w:name="ref-tabari2017sieberi"/>
     <w:p>
       <w:pPr>
         <w:pStyle w:val="Bibliography"/>
@@ -18108,7 +18471,7 @@
       <w:r>
         <w:t xml:space="preserve"> </w:t>
       </w:r>
-      <w:hyperlink r:id="rId266">
+      <w:hyperlink r:id="rId268">
         <w:r>
           <w:rPr>
             <w:rStyle w:val="Hyperlink"/>
@@ -18120,8 +18483,8 @@
         <w:t xml:space="preserve">.</w:t>
       </w:r>
     </w:p>
-    <w:bookmarkEnd w:id="267"/>
-    <w:bookmarkStart w:id="269" w:name="ref-tamargo2017nanocochleate"/>
+    <w:bookmarkEnd w:id="269"/>
+    <w:bookmarkStart w:id="271" w:name="ref-tamargo2017nanocochleate"/>
     <w:p>
       <w:pPr>
         <w:pStyle w:val="Bibliography"/>
@@ -18155,7 +18518,7 @@
       <w:r>
         <w:t xml:space="preserve"> </w:t>
       </w:r>
-      <w:hyperlink r:id="rId268">
+      <w:hyperlink r:id="rId270">
         <w:r>
           <w:rPr>
             <w:rStyle w:val="Hyperlink"/>
@@ -18167,8 +18530,8 @@
         <w:t xml:space="preserve">.</w:t>
       </w:r>
     </w:p>
-    <w:bookmarkEnd w:id="269"/>
-    <w:bookmarkStart w:id="271" w:name="ref-tangnitipong2012heme"/>
+    <w:bookmarkEnd w:id="271"/>
+    <w:bookmarkStart w:id="273" w:name="ref-tangnitipong2012heme"/>
     <w:p>
       <w:pPr>
         <w:pStyle w:val="Bibliography"/>
@@ -18202,7 +18565,7 @@
       <w:r>
         <w:t xml:space="preserve"> </w:t>
       </w:r>
-      <w:hyperlink r:id="rId270">
+      <w:hyperlink r:id="rId272">
         <w:r>
           <w:rPr>
             <w:rStyle w:val="Hyperlink"/>
@@ -18214,8 +18577,8 @@
         <w:t xml:space="preserve">.</w:t>
       </w:r>
     </w:p>
-    <w:bookmarkEnd w:id="271"/>
-    <w:bookmarkStart w:id="273" w:name="ref-tariku2011absinthium"/>
+    <w:bookmarkEnd w:id="273"/>
+    <w:bookmarkStart w:id="275" w:name="ref-tariku2011absinthium"/>
     <w:p>
       <w:pPr>
         <w:pStyle w:val="Bibliography"/>
@@ -18249,7 +18612,7 @@
       <w:r>
         <w:t xml:space="preserve"> </w:t>
       </w:r>
-      <w:hyperlink r:id="rId272">
+      <w:hyperlink r:id="rId274">
         <w:r>
           <w:rPr>
             <w:rStyle w:val="Hyperlink"/>
@@ -18261,8 +18624,8 @@
         <w:t xml:space="preserve">.</w:t>
       </w:r>
     </w:p>
-    <w:bookmarkEnd w:id="273"/>
-    <w:bookmarkStart w:id="275" w:name="ref-tariq2009absinthium"/>
+    <w:bookmarkEnd w:id="275"/>
+    <w:bookmarkStart w:id="277" w:name="ref-tariq2009absinthium"/>
     <w:p>
       <w:pPr>
         <w:pStyle w:val="Bibliography"/>
@@ -18296,7 +18659,7 @@
       <w:r>
         <w:t xml:space="preserve"> </w:t>
       </w:r>
-      <w:hyperlink r:id="rId274">
+      <w:hyperlink r:id="rId276">
         <w:r>
           <w:rPr>
             <w:rStyle w:val="Hyperlink"/>
@@ -18308,8 +18671,8 @@
         <w:t xml:space="preserve">.</w:t>
       </w:r>
     </w:p>
-    <w:bookmarkEnd w:id="275"/>
-    <w:bookmarkStart w:id="277" w:name="ref-teoh2006cyp"/>
+    <w:bookmarkEnd w:id="277"/>
+    <w:bookmarkStart w:id="279" w:name="ref-teoh2006cyp"/>
     <w:p>
       <w:pPr>
         <w:pStyle w:val="Bibliography"/>
@@ -18343,7 +18706,7 @@
       <w:r>
         <w:t xml:space="preserve"> </w:t>
       </w:r>
-      <w:hyperlink r:id="rId276">
+      <w:hyperlink r:id="rId278">
         <w:r>
           <w:rPr>
             <w:rStyle w:val="Hyperlink"/>
@@ -18355,8 +18718,8 @@
         <w:t xml:space="preserve">.</w:t>
       </w:r>
     </w:p>
-    <w:bookmarkEnd w:id="277"/>
-    <w:bookmarkStart w:id="279" w:name="ref-trendafilova2021edibleartemisia"/>
+    <w:bookmarkEnd w:id="279"/>
+    <w:bookmarkStart w:id="281" w:name="ref-trendafilova2021edibleartemisia"/>
     <w:p>
       <w:pPr>
         <w:pStyle w:val="Bibliography"/>
@@ -18390,7 +18753,7 @@
       <w:r>
         <w:t xml:space="preserve"> </w:t>
       </w:r>
-      <w:hyperlink r:id="rId278">
+      <w:hyperlink r:id="rId280">
         <w:r>
           <w:rPr>
             <w:rStyle w:val="Hyperlink"/>
@@ -18402,8 +18765,8 @@
         <w:t xml:space="preserve">.</w:t>
       </w:r>
     </w:p>
-    <w:bookmarkEnd w:id="279"/>
-    <w:bookmarkStart w:id="281" w:name="ref-umaraliev2025persicabisabolanes"/>
+    <w:bookmarkEnd w:id="281"/>
+    <w:bookmarkStart w:id="283" w:name="ref-umaraliev2025persicabisabolanes"/>
     <w:p>
       <w:pPr>
         <w:pStyle w:val="Bibliography"/>
@@ -18443,7 +18806,7 @@
       <w:r>
         <w:t xml:space="preserve"> </w:t>
       </w:r>
-      <w:hyperlink r:id="rId280">
+      <w:hyperlink r:id="rId282">
         <w:r>
           <w:rPr>
             <w:rStyle w:val="Hyperlink"/>
@@ -18455,8 +18818,8 @@
         <w:t xml:space="preserve">.</w:t>
       </w:r>
     </w:p>
-    <w:bookmarkEnd w:id="281"/>
-    <w:bookmarkStart w:id="283" w:name="ref-umaraliev2026persicamonoterpenes"/>
+    <w:bookmarkEnd w:id="283"/>
+    <w:bookmarkStart w:id="285" w:name="ref-umaraliev2026persicamonoterpenes"/>
     <w:p>
       <w:pPr>
         <w:pStyle w:val="Bibliography"/>
@@ -18496,7 +18859,7 @@
       <w:r>
         <w:t xml:space="preserve"> </w:t>
       </w:r>
-      <w:hyperlink r:id="rId282">
+      <w:hyperlink r:id="rId284">
         <w:r>
           <w:rPr>
             <w:rStyle w:val="Hyperlink"/>
@@ -18508,8 +18871,8 @@
         <w:t xml:space="preserve">.</w:t>
       </w:r>
     </w:p>
-    <w:bookmarkEnd w:id="283"/>
-    <w:bookmarkStart w:id="285" w:name="ref-urban2020trpc3"/>
+    <w:bookmarkEnd w:id="285"/>
+    <w:bookmarkStart w:id="287" w:name="ref-urban2020trpc3"/>
     <w:p>
       <w:pPr>
         <w:pStyle w:val="Bibliography"/>
@@ -18555,7 +18918,7 @@
       <w:r>
         <w:t xml:space="preserve"> </w:t>
       </w:r>
-      <w:hyperlink r:id="rId284">
+      <w:hyperlink r:id="rId286">
         <w:r>
           <w:rPr>
             <w:rStyle w:val="Hyperlink"/>
@@ -18567,8 +18930,8 @@
         <w:t xml:space="preserve">.</w:t>
       </w:r>
     </w:p>
-    <w:bookmarkEnd w:id="285"/>
-    <w:bookmarkStart w:id="287" w:name="ref-varadyova2018medicinalplants"/>
+    <w:bookmarkEnd w:id="287"/>
+    <w:bookmarkStart w:id="289" w:name="ref-varadyova2018medicinalplants"/>
     <w:p>
       <w:pPr>
         <w:pStyle w:val="Bibliography"/>
@@ -18611,7 +18974,7 @@
       <w:r>
         <w:t xml:space="preserve"> </w:t>
       </w:r>
-      <w:hyperlink r:id="rId286">
+      <w:hyperlink r:id="rId288">
         <w:r>
           <w:rPr>
             <w:rStyle w:val="Hyperlink"/>
@@ -18623,8 +18986,8 @@
         <w:t xml:space="preserve">.</w:t>
       </w:r>
     </w:p>
-    <w:bookmarkEnd w:id="287"/>
-    <w:bookmarkStart w:id="289" w:name="ref-walz2024aframalaria"/>
+    <w:bookmarkEnd w:id="289"/>
+    <w:bookmarkStart w:id="291" w:name="ref-walz2024aframalaria"/>
     <w:p>
       <w:pPr>
         <w:pStyle w:val="Bibliography"/>
@@ -18670,7 +19033,7 @@
       <w:r>
         <w:t xml:space="preserve"> </w:t>
       </w:r>
-      <w:hyperlink r:id="rId288">
+      <w:hyperlink r:id="rId290">
         <w:r>
           <w:rPr>
             <w:rStyle w:val="Hyperlink"/>
@@ -18682,8 +19045,8 @@
         <w:t xml:space="preserve">.</w:t>
       </w:r>
     </w:p>
-    <w:bookmarkEnd w:id="289"/>
-    <w:bookmarkStart w:id="291" w:name="ref-wang2013cyp71av1promoter"/>
+    <w:bookmarkEnd w:id="291"/>
+    <w:bookmarkStart w:id="293" w:name="ref-wang2013cyp71av1promoter"/>
     <w:p>
       <w:pPr>
         <w:pStyle w:val="Bibliography"/>
@@ -18717,7 +19080,7 @@
       <w:r>
         <w:t xml:space="preserve"> </w:t>
       </w:r>
-      <w:hyperlink r:id="rId290">
+      <w:hyperlink r:id="rId292">
         <w:r>
           <w:rPr>
             <w:rStyle w:val="Hyperlink"/>
@@ -18729,8 +19092,8 @@
         <w:t xml:space="preserve">.</w:t>
       </w:r>
     </w:p>
-    <w:bookmarkEnd w:id="291"/>
-    <w:bookmarkStart w:id="293" w:name="ref-wang2009trichometranscriptome"/>
+    <w:bookmarkEnd w:id="293"/>
+    <w:bookmarkStart w:id="295" w:name="ref-wang2009trichometranscriptome"/>
     <w:p>
       <w:pPr>
         <w:pStyle w:val="Bibliography"/>
@@ -18764,7 +19127,7 @@
       <w:r>
         <w:t xml:space="preserve"> </w:t>
       </w:r>
-      <w:hyperlink r:id="rId292">
+      <w:hyperlink r:id="rId294">
         <w:r>
           <w:rPr>
             <w:rStyle w:val="Hyperlink"/>
@@ -18776,8 +19139,8 @@
         <w:t xml:space="preserve">.</w:t>
       </w:r>
     </w:p>
-    <w:bookmarkEnd w:id="293"/>
-    <w:bookmarkStart w:id="295" w:name="ref-wani2023nitric"/>
+    <w:bookmarkEnd w:id="295"/>
+    <w:bookmarkStart w:id="297" w:name="ref-wani2023nitric"/>
     <w:p>
       <w:pPr>
         <w:pStyle w:val="Bibliography"/>
@@ -18835,7 +19198,7 @@
       <w:r>
         <w:t xml:space="preserve"> </w:t>
       </w:r>
-      <w:hyperlink r:id="rId294">
+      <w:hyperlink r:id="rId296">
         <w:r>
           <w:rPr>
             <w:rStyle w:val="Hyperlink"/>
@@ -18847,8 +19210,8 @@
         <w:t xml:space="preserve">.</w:t>
       </w:r>
     </w:p>
-    <w:bookmarkEnd w:id="295"/>
-    <w:bookmarkStart w:id="297" w:name="ref-wani2026maritima"/>
+    <w:bookmarkEnd w:id="297"/>
+    <w:bookmarkStart w:id="299" w:name="ref-wani2026maritima"/>
     <w:p>
       <w:pPr>
         <w:pStyle w:val="Bibliography"/>
@@ -18894,7 +19257,7 @@
       <w:r>
         <w:t xml:space="preserve"> </w:t>
       </w:r>
-      <w:hyperlink r:id="rId296">
+      <w:hyperlink r:id="rId298">
         <w:r>
           <w:rPr>
             <w:rStyle w:val="Hyperlink"/>
@@ -18906,8 +19269,8 @@
         <w:t xml:space="preserve">.</w:t>
       </w:r>
     </w:p>
-    <w:bookmarkEnd w:id="297"/>
-    <w:bookmarkStart w:id="299" w:name="ref-wetmore2019psiv9"/>
+    <w:bookmarkEnd w:id="299"/>
+    <w:bookmarkStart w:id="301" w:name="ref-wetmore2019psiv9"/>
     <w:p>
       <w:pPr>
         <w:pStyle w:val="Bibliography"/>
@@ -18953,7 +19316,7 @@
       <w:r>
         <w:t xml:space="preserve"> </w:t>
       </w:r>
-      <w:hyperlink r:id="rId298">
+      <w:hyperlink r:id="rId300">
         <w:r>
           <w:rPr>
             <w:rStyle w:val="Hyperlink"/>
@@ -18965,8 +19328,8 @@
         <w:t xml:space="preserve">.</w:t>
       </w:r>
     </w:p>
-    <w:bookmarkEnd w:id="299"/>
-    <w:bookmarkStart w:id="301" w:name="ref-wright2010qinghao"/>
+    <w:bookmarkEnd w:id="301"/>
+    <w:bookmarkStart w:id="303" w:name="ref-wright2010qinghao"/>
     <w:p>
       <w:pPr>
         <w:pStyle w:val="Bibliography"/>
@@ -19012,7 +19375,7 @@
       <w:r>
         <w:t xml:space="preserve"> </w:t>
       </w:r>
-      <w:hyperlink r:id="rId300">
+      <w:hyperlink r:id="rId302">
         <w:r>
           <w:rPr>
             <w:rStyle w:val="Hyperlink"/>
@@ -19024,8 +19387,8 @@
         <w:t xml:space="preserve">.</w:t>
       </w:r>
     </w:p>
-    <w:bookmarkEnd w:id="301"/>
-    <w:bookmarkStart w:id="303" w:name="ref-xiang2019bhlh112"/>
+    <w:bookmarkEnd w:id="303"/>
+    <w:bookmarkStart w:id="305" w:name="ref-xiang2019bhlh112"/>
     <w:p>
       <w:pPr>
         <w:pStyle w:val="Bibliography"/>
@@ -19059,7 +19422,7 @@
       <w:r>
         <w:t xml:space="preserve"> </w:t>
       </w:r>
-      <w:hyperlink r:id="rId302">
+      <w:hyperlink r:id="rId304">
         <w:r>
           <w:rPr>
             <w:rStyle w:val="Hyperlink"/>
@@ -19071,8 +19434,8 @@
         <w:t xml:space="preserve">.</w:t>
       </w:r>
     </w:p>
-    <w:bookmarkEnd w:id="303"/>
-    <w:bookmarkStart w:id="305" w:name="ref-xu2025plantmatrix"/>
+    <w:bookmarkEnd w:id="305"/>
+    <w:bookmarkStart w:id="307" w:name="ref-xu2025plantmatrix"/>
     <w:p>
       <w:pPr>
         <w:pStyle w:val="Bibliography"/>
@@ -19118,7 +19481,7 @@
       <w:r>
         <w:t xml:space="preserve"> </w:t>
       </w:r>
-      <w:hyperlink r:id="rId304">
+      <w:hyperlink r:id="rId306">
         <w:r>
           <w:rPr>
             <w:rStyle w:val="Hyperlink"/>
@@ -19130,8 +19493,8 @@
         <w:t xml:space="preserve">.</w:t>
       </w:r>
     </w:p>
-    <w:bookmarkEnd w:id="305"/>
-    <w:bookmarkStart w:id="307" w:name="ref-xu2026artemisininpk"/>
+    <w:bookmarkEnd w:id="307"/>
+    <w:bookmarkStart w:id="309" w:name="ref-xu2026artemisininpk"/>
     <w:p>
       <w:pPr>
         <w:pStyle w:val="Bibliography"/>
@@ -19177,7 +19540,7 @@
       <w:r>
         <w:t xml:space="preserve"> </w:t>
       </w:r>
-      <w:hyperlink r:id="rId306">
+      <w:hyperlink r:id="rId308">
         <w:r>
           <w:rPr>
             <w:rStyle w:val="Hyperlink"/>
@@ -19189,8 +19552,8 @@
         <w:t xml:space="preserve">.</w:t>
       </w:r>
     </w:p>
-    <w:bookmarkEnd w:id="307"/>
-    <w:bookmarkStart w:id="309" w:name="ref-yildiz2011toxocara"/>
+    <w:bookmarkEnd w:id="309"/>
+    <w:bookmarkStart w:id="311" w:name="ref-yildiz2011toxocara"/>
     <w:p>
       <w:pPr>
         <w:pStyle w:val="Bibliography"/>
@@ -19248,7 +19611,7 @@
       <w:r>
         <w:t xml:space="preserve"> </w:t>
       </w:r>
-      <w:hyperlink r:id="rId308">
+      <w:hyperlink r:id="rId310">
         <w:r>
           <w:rPr>
             <w:rStyle w:val="Hyperlink"/>
@@ -19260,8 +19623,8 @@
         <w:t xml:space="preserve">.</w:t>
       </w:r>
     </w:p>
-    <w:bookmarkEnd w:id="309"/>
-    <w:bookmarkStart w:id="311" w:name="ref-zehra2020copper"/>
+    <w:bookmarkEnd w:id="311"/>
+    <w:bookmarkStart w:id="313" w:name="ref-zehra2020copper"/>
     <w:p>
       <w:pPr>
         <w:pStyle w:val="Bibliography"/>
@@ -19307,7 +19670,7 @@
       <w:r>
         <w:t xml:space="preserve"> </w:t>
       </w:r>
-      <w:hyperlink r:id="rId310">
+      <w:hyperlink r:id="rId312">
         <w:r>
           <w:rPr>
             <w:rStyle w:val="Hyperlink"/>
@@ -19319,8 +19682,8 @@
         <w:t xml:space="preserve">.</w:t>
       </w:r>
     </w:p>
-    <w:bookmarkEnd w:id="311"/>
-    <w:bookmarkStart w:id="313" w:name="ref-zhang2022fiveartemisia"/>
+    <w:bookmarkEnd w:id="313"/>
+    <w:bookmarkStart w:id="315" w:name="ref-zhang2022fiveartemisia"/>
     <w:p>
       <w:pPr>
         <w:pStyle w:val="Bibliography"/>
@@ -19366,7 +19729,7 @@
       <w:r>
         <w:t xml:space="preserve"> </w:t>
       </w:r>
-      <w:hyperlink r:id="rId312">
+      <w:hyperlink r:id="rId314">
         <w:r>
           <w:rPr>
             <w:rStyle w:val="Hyperlink"/>
@@ -19378,8 +19741,8 @@
         <w:t xml:space="preserve">.</w:t>
       </w:r>
     </w:p>
-    <w:bookmarkEnd w:id="313"/>
-    <w:bookmarkStart w:id="315" w:name="ref-zhang2026annuaenhancement"/>
+    <w:bookmarkEnd w:id="315"/>
+    <w:bookmarkStart w:id="317" w:name="ref-zhang2026annuaenhancement"/>
     <w:p>
       <w:pPr>
         <w:pStyle w:val="Bibliography"/>
@@ -19425,7 +19788,7 @@
       <w:r>
         <w:t xml:space="preserve"> </w:t>
       </w:r>
-      <w:hyperlink r:id="rId314">
+      <w:hyperlink r:id="rId316">
         <w:r>
           <w:rPr>
             <w:rStyle w:val="Hyperlink"/>
@@ -19437,8 +19800,8 @@
         <w:t xml:space="preserve">.</w:t>
       </w:r>
     </w:p>
-    <w:bookmarkEnd w:id="315"/>
-    <w:bookmarkStart w:id="317" w:name="ref-zhang2020argyitriterpenoids"/>
+    <w:bookmarkEnd w:id="317"/>
+    <w:bookmarkStart w:id="319" w:name="ref-zhang2020argyitriterpenoids"/>
     <w:p>
       <w:pPr>
         <w:pStyle w:val="Bibliography"/>
@@ -19481,7 +19844,7 @@
       <w:r>
         <w:t xml:space="preserve"> </w:t>
       </w:r>
-      <w:hyperlink r:id="rId316">
+      <w:hyperlink r:id="rId318">
         <w:r>
           <w:rPr>
             <w:rStyle w:val="Hyperlink"/>
@@ -19493,8 +19856,8 @@
         <w:t xml:space="preserve">.</w:t>
       </w:r>
     </w:p>
-    <w:bookmarkEnd w:id="317"/>
-    <w:bookmarkStart w:id="319" w:name="ref-zhang2019pp2c1"/>
+    <w:bookmarkEnd w:id="319"/>
+    <w:bookmarkStart w:id="321" w:name="ref-zhang2019pp2c1"/>
     <w:p>
       <w:pPr>
         <w:pStyle w:val="Bibliography"/>
@@ -19546,7 +19909,7 @@
       <w:r>
         <w:t xml:space="preserve"> </w:t>
       </w:r>
-      <w:hyperlink r:id="rId318">
+      <w:hyperlink r:id="rId320">
         <w:r>
           <w:rPr>
             <w:rStyle w:val="Hyperlink"/>
@@ -19558,8 +19921,8 @@
         <w:t xml:space="preserve">.</w:t>
       </w:r>
     </w:p>
-    <w:bookmarkEnd w:id="319"/>
-    <w:bookmarkStart w:id="321" w:name="ref-zhang2008dbr2"/>
+    <w:bookmarkEnd w:id="321"/>
+    <w:bookmarkStart w:id="323" w:name="ref-zhang2008dbr2"/>
     <w:p>
       <w:pPr>
         <w:pStyle w:val="Bibliography"/>
@@ -19593,7 +19956,7 @@
       <w:r>
         <w:t xml:space="preserve"> </w:t>
       </w:r>
-      <w:hyperlink r:id="rId320">
+      <w:hyperlink r:id="rId322">
         <w:r>
           <w:rPr>
             <w:rStyle w:val="Hyperlink"/>
@@ -19605,8 +19968,8 @@
         <w:t xml:space="preserve">.</w:t>
       </w:r>
     </w:p>
-    <w:bookmarkEnd w:id="321"/>
-    <w:bookmarkStart w:id="323" w:name="ref-frigida2023variability"/>
+    <w:bookmarkEnd w:id="323"/>
+    <w:bookmarkStart w:id="325" w:name="ref-frigida2023variability"/>
     <w:p>
       <w:pPr>
         <w:pStyle w:val="Bibliography"/>
@@ -19640,7 +20003,7 @@
       <w:r>
         <w:t xml:space="preserve"> </w:t>
       </w:r>
-      <w:hyperlink r:id="rId322">
+      <w:hyperlink r:id="rId324">
         <w:r>
           <w:rPr>
             <w:rStyle w:val="Hyperlink"/>
@@ -19652,9 +20015,9 @@
         <w:t xml:space="preserve">.</w:t>
       </w:r>
     </w:p>
-    <w:bookmarkEnd w:id="323"/>
-    <w:bookmarkEnd w:id="324"/>
     <w:bookmarkEnd w:id="325"/>
+    <w:bookmarkEnd w:id="326"/>
+    <w:bookmarkEnd w:id="327"/>
     <w:sectPr>
       <w:headerReference w:type="default" r:id="rId9"/>
       <w:footerReference w:type="default" r:id="rId10"/>

</xml_diff>

<commit_message>
Add full-text A. annua coccidiosis evidence
</commit_message>
<xml_diff>
--- a/manuscript/artemisia-terpene-review-submission.docx
+++ b/manuscript/artemisia-terpene-review-submission.docx
@@ -199,7 +199,7 @@
         <w:t xml:space="preserve"> </w:t>
       </w:r>
       <w:r>
-        <w:t xml:space="preserve">contains volatile monoterpenes and sesquiterpenes, less volatile diterpenes and triterpenes, and structurally diverse sesquiterpene lactones (STLs). These metabolites are often discussed as though a species name, a pathway gene, or an oil profile were sufficient to predict pharmacology. Here we present a source-auditable scoping review with a frozen snapshot that instead treats the specimen, accession, tissue, preparation, analytical method, parasite stage, and evidence level as the units of comparison. The Terpedia package registers 539 sources, 554 source-linked evidence records, 130 antiparasitic records, 19 parasite–protein interaction records, 179 compound/specimen records, and 406 audited article claims; 87 sources and 102 linked evidence rows have completed full-text verification, while 24 remain open. We synthesize terpene classes with biosynthetic compartmentalization, regulatory and environmental variation, and a bounded comparative-genomics analysis. Artemisinin biosynthesis in</w:t>
+        <w:t xml:space="preserve">contains volatile monoterpenes and sesquiterpenes, less volatile diterpenes and triterpenes, and structurally diverse sesquiterpene lactones (STLs). These metabolites are often discussed as though a species name, a pathway gene, or an oil profile were sufficient to predict pharmacology. Here we present a source-auditable scoping review with a frozen snapshot that instead treats the specimen, accession, tissue, preparation, analytical method, parasite stage, and evidence level as the units of comparison. The Terpedia package registers 540 sources, 555 source-linked evidence records, 131 antiparasitic records, 19 parasite–protein interaction records, 179 compound/specimen records, and 407 audited article claims; 88 sources and 103 linked evidence rows have completed full-text verification, while 24 remain open. We synthesize terpene classes with biosynthetic compartmentalization, regulatory and environmental variation, and a bounded comparative-genomics analysis. Artemisinin biosynthesis in</w:t>
       </w:r>
       <w:r>
         <w:t xml:space="preserve"> </w:t>
@@ -427,7 +427,7 @@
         <w:t xml:space="preserve"> </w:t>
       </w:r>
       <w:r>
-        <w:t xml:space="preserve">terms with terpene classes, analytical methods, biosynthesis, genomics, malaria, helminths, vectors, and safety terms. The frozen retrieval snapshot contains 4,765 unique PubMed records from seven query families, of which 1,387 were prioritized for title-level review and 1,323 had abstracts retrieved. A source-linked full-text eligibility queue covers 111 unique antiparasitic sources representing 130 evidence rows, prioritizing malaria and</w:t>
+        <w:t xml:space="preserve">terms with terpene classes, analytical methods, biosynthesis, genomics, malaria, helminths, vectors, and safety terms. The frozen retrieval snapshot contains 4,765 unique PubMed records from seven query families, of which 1,387 were prioritized for title-level review and 1,323 had abstracts retrieved. A source-linked full-text eligibility queue covers 112 unique antiparasitic sources representing 131 evidence rows, prioritizing malaria and</w:t>
       </w:r>
       <w:r>
         <w:t xml:space="preserve"> </w:t>
@@ -452,7 +452,7 @@
         <w:spacing w:before="0" w:after="120" w:line="264" w:lineRule="auto"/>
       </w:pPr>
       <w:r>
-        <w:t xml:space="preserve">The analysis is reported as a frozen scoping review rather than a completed systematic review. The retrieval snapshot contains 1,408 bounded title/abstract decisions, covering all 1,387 priority-queue records plus 21 historical or out-of-queue decisions. Full-text verification now covers 87 publicly accessible or publisher-indexed antiparasitic sources and 102 linked evidence rows; 24 queue sources remain unverified, and no result is pooled as a final quantitative estimate. The</w:t>
+        <w:t xml:space="preserve">The analysis is reported as a frozen scoping review rather than a completed systematic review. The retrieval snapshot contains 1,408 bounded title/abstract decisions, covering all 1,387 priority-queue records plus 21 historical or out-of-queue decisions. Full-text verification now covers 88 publicly accessible or publisher-indexed antiparasitic sources and 103 linked evidence rows; 24 queue sources remain unverified, and no result is pooled as a final quantitative estimate. The</w:t>
       </w:r>
       <w:r>
         <w:t xml:space="preserve"> </w:t>
@@ -526,7 +526,23 @@
         <w:t xml:space="preserve"> </w:t>
       </w:r>
       <w:r>
-        <w:t xml:space="preserve">ewe trial is retained with chemistry and combined-treatment interpretation unresolved. Terpedia is maintained as an updateable evidence archive, but later additions are not silently treated as part of this frozen analysis. The PRISMA-ScR mapping is archived in</w:t>
+        <w:t xml:space="preserve">ewe trial is retained with chemistry and combined-treatment interpretation unresolved; the newly verified</w:t>
+      </w:r>
+      <w:r>
+        <w:t xml:space="preserve"> </w:t>
+      </w:r>
+      <w:r>
+        <w:rPr>
+          <w:i/>
+          <w:iCs/>
+        </w:rPr>
+        <w:t xml:space="preserve">A. annua</w:t>
+      </w:r>
+      <w:r>
+        <w:t xml:space="preserve"> </w:t>
+      </w:r>
+      <w:r>
+        <w:t xml:space="preserve">coccidiosis study is retained with unresolved extract chemistry and small-sample limitations. Terpedia is maintained as an updateable evidence archive, but later additions are not silently treated as part of this frozen analysis. The PRISMA-ScR mapping is archived in</w:t>
       </w:r>
       <w:r>
         <w:t xml:space="preserve"> </w:t>
@@ -4208,7 +4224,7 @@
         <w:t xml:space="preserve"> </w:t>
       </w:r>
       <w:r>
-        <w:t xml:space="preserve">to all 130 antiparasitic records. Twenty-one records had defined or purified chemistry, 36 had a profiled mixture, and 73 retained crude or unresolved attribution; 87 reported direct in-vitro parasite/vector assays, 39 included an in-vivo or organismal endpoint, and four were indirect or surrogate records, including three hemozoin assays. Explicit host/selectivity controls were present in 24 records, partial controls in 24, and absent or unresolved in 82. Only three records reached the E4/E5 functional-target-class level through the linked interaction map; 23 were hypothesis/stage-mechanism level and 104 were phenotype-only or unresolved. The overall appraisal therefore yielded 24 B-level characterized phenotypes and 106 C-level phenotypes with unresolved attribution; no record met the deliberately strict A tier. This is a limitation of evidence resolution, not evidence that the preparations lack activity. Row-level judgments and their rule basis are archived in</w:t>
+        <w:t xml:space="preserve">to all 131 antiparasitic records. Twenty-one records had defined or purified chemistry, 37 had a profiled mixture, and 73 retained crude or unresolved attribution; 87 reported direct in-vitro parasite/vector assays, 40 included an in-vivo or organismal endpoint, and four were indirect or surrogate records, including three hemozoin assays. Explicit host/selectivity controls were present in 25 records, partial controls in 24, and absent or unresolved in 82. Only three records reached the E4/E5 functional-target-class level through the linked interaction map; 24 were hypothesis/stage-mechanism level and 104 were phenotype-only or unresolved. The overall appraisal therefore yielded 25 B-level characterized phenotypes and 106 C-level phenotypes with unresolved attribution; no record met the deliberately strict A tier. This is a limitation of evidence resolution, not evidence that the preparations lack activity. Row-level judgments and their rule basis are archived in</w:t>
       </w:r>
       <w:r>
         <w:t xml:space="preserve"> </w:t>
@@ -5767,6 +5783,56 @@
       </w:r>
       <w:r>
         <w:t xml:space="preserve">(Boyko and Brygadyrenko 2025)</w:t>
+      </w:r>
+      <w:r>
+        <w:t xml:space="preserve">.</w:t>
+      </w:r>
+    </w:p>
+    <w:p>
+      <w:pPr>
+        <w:pStyle w:val="BodyText"/>
+        <w:spacing w:before="0" w:after="120" w:line="264" w:lineRule="auto"/>
+      </w:pPr>
+      <w:r>
+        <w:t xml:space="preserve">A separate open-access chicken study strengthens the coccidiosis comparison. Thirty-five Cobb broilers were challenged with 2,000</w:t>
+      </w:r>
+      <w:r>
+        <w:t xml:space="preserve"> </w:t>
+      </w:r>
+      <w:r>
+        <w:rPr>
+          <w:i/>
+          <w:iCs/>
+        </w:rPr>
+        <w:t xml:space="preserve">E. tenella</w:t>
+      </w:r>
+      <w:r>
+        <w:t xml:space="preserve"> </w:t>
+      </w:r>
+      <w:r>
+        <w:t xml:space="preserve">oocysts and treated for eight days with a petroleum-ether</w:t>
+      </w:r>
+      <w:r>
+        <w:t xml:space="preserve"> </w:t>
+      </w:r>
+      <w:r>
+        <w:rPr>
+          <w:i/>
+          <w:iCs/>
+        </w:rPr>
+        <w:t xml:space="preserve">A. annua</w:t>
+      </w:r>
+      <w:r>
+        <w:t xml:space="preserve"> </w:t>
+      </w:r>
+      <w:r>
+        <w:t xml:space="preserve">leaf extract (17 ppm), synthetic artemisinin (8.5–34 ppm), or sulfadiazine. The extract produced the largest reported reduction in oocyst excretion (74.18%), followed by 34 ppm artemisinin (58.14%) and sulfadiazine (50.00%); cecal lesions improved, but body-weight gain and hemoglobin did not differ significantly. Because the extract was not terpene-resolved and the experiment was small and low-dose, it supports a preparation-specific veterinary matrix hypothesis rather than artemisinin or terpene causality, a parasite-protein mechanism, or human malaria translation</w:t>
+      </w:r>
+      <w:r>
+        <w:t xml:space="preserve"> </w:t>
+      </w:r>
+      <w:r>
+        <w:t xml:space="preserve">(Wiedosari and Wardhana 2017)</w:t>
       </w:r>
       <w:r>
         <w:t xml:space="preserve">.</w:t>
@@ -11932,7 +11998,7 @@
     <w:bookmarkEnd w:id="47"/>
     <w:bookmarkEnd w:id="48"/>
     <w:bookmarkEnd w:id="49"/>
-    <w:bookmarkStart w:id="327" w:name="references"/>
+    <w:bookmarkStart w:id="329" w:name="references"/>
     <w:p>
       <w:pPr>
         <w:pStyle w:val="Heading1"/>
@@ -11942,7 +12008,7 @@
         <w:t xml:space="preserve">References</w:t>
       </w:r>
     </w:p>
-    <w:bookmarkStart w:id="326" w:name="refs"/>
+    <w:bookmarkStart w:id="328" w:name="refs"/>
     <w:bookmarkStart w:id="51" w:name="ref-abad2012artemisia"/>
     <w:p>
       <w:pPr>
@@ -19329,13 +19395,81 @@
       </w:r>
     </w:p>
     <w:bookmarkEnd w:id="301"/>
-    <w:bookmarkStart w:id="303" w:name="ref-wright2010qinghao"/>
+    <w:bookmarkStart w:id="303" w:name="ref-wiedosari2017eimeria"/>
     <w:p>
       <w:pPr>
         <w:pStyle w:val="Bibliography"/>
         <w:spacing w:before="0" w:after="120" w:line="264" w:lineRule="auto"/>
       </w:pPr>
       <w:r>
+        <w:t xml:space="preserve">Wiedosari, Ening, and April Hari Wardhana. 2017.</w:t>
+      </w:r>
+      <w:r>
+        <w:t xml:space="preserve"> </w:t>
+      </w:r>
+      <w:r>
+        <w:t xml:space="preserve">“Anticoccidial Activity of Artemisinin and Extract of</w:t>
+      </w:r>
+      <w:r>
+        <w:t xml:space="preserve"> </w:t>
+      </w:r>
+      <w:r>
+        <w:t xml:space="preserve">Artemesia annua</w:t>
+      </w:r>
+      <w:r>
+        <w:t xml:space="preserve"> </w:t>
+      </w:r>
+      <w:r>
+        <w:t xml:space="preserve">Leaves in Chicken Infected by</w:t>
+      </w:r>
+      <w:r>
+        <w:t xml:space="preserve"> </w:t>
+      </w:r>
+      <w:r>
+        <w:t xml:space="preserve">Eimeria tenella</w:t>
+      </w:r>
+      <w:r>
+        <w:t xml:space="preserve">.”</w:t>
+      </w:r>
+      <w:r>
+        <w:t xml:space="preserve"> </w:t>
+      </w:r>
+      <w:r>
+        <w:rPr>
+          <w:i/>
+          <w:iCs/>
+        </w:rPr>
+        <w:t xml:space="preserve">Jurnal Ilmu Ternak Dan Veteriner</w:t>
+      </w:r>
+      <w:r>
+        <w:t xml:space="preserve"> </w:t>
+      </w:r>
+      <w:r>
+        <w:t xml:space="preserve">22 (4): 196–204.</w:t>
+      </w:r>
+      <w:r>
+        <w:t xml:space="preserve"> </w:t>
+      </w:r>
+      <w:hyperlink r:id="rId302">
+        <w:r>
+          <w:rPr>
+            <w:rStyle w:val="Hyperlink"/>
+          </w:rPr>
+          <w:t xml:space="preserve">https://doi.org/10.14334/jitv.v22i4.1622</w:t>
+        </w:r>
+      </w:hyperlink>
+      <w:r>
+        <w:t xml:space="preserve">.</w:t>
+      </w:r>
+    </w:p>
+    <w:bookmarkEnd w:id="303"/>
+    <w:bookmarkStart w:id="305" w:name="ref-wright2010qinghao"/>
+    <w:p>
+      <w:pPr>
+        <w:pStyle w:val="Bibliography"/>
+        <w:spacing w:before="0" w:after="120" w:line="264" w:lineRule="auto"/>
+      </w:pPr>
+      <w:r>
         <w:t xml:space="preserve">Wright, CW, PA Linley, R Brun, S Wittlin, and E Hsu. 2010.</w:t>
       </w:r>
       <w:r>
@@ -19375,7 +19509,7 @@
       <w:r>
         <w:t xml:space="preserve"> </w:t>
       </w:r>
-      <w:hyperlink r:id="rId302">
+      <w:hyperlink r:id="rId304">
         <w:r>
           <w:rPr>
             <w:rStyle w:val="Hyperlink"/>
@@ -19387,8 +19521,8 @@
         <w:t xml:space="preserve">.</w:t>
       </w:r>
     </w:p>
-    <w:bookmarkEnd w:id="303"/>
-    <w:bookmarkStart w:id="305" w:name="ref-xiang2019bhlh112"/>
+    <w:bookmarkEnd w:id="305"/>
+    <w:bookmarkStart w:id="307" w:name="ref-xiang2019bhlh112"/>
     <w:p>
       <w:pPr>
         <w:pStyle w:val="Bibliography"/>
@@ -19422,7 +19556,7 @@
       <w:r>
         <w:t xml:space="preserve"> </w:t>
       </w:r>
-      <w:hyperlink r:id="rId304">
+      <w:hyperlink r:id="rId306">
         <w:r>
           <w:rPr>
             <w:rStyle w:val="Hyperlink"/>
@@ -19434,8 +19568,8 @@
         <w:t xml:space="preserve">.</w:t>
       </w:r>
     </w:p>
-    <w:bookmarkEnd w:id="305"/>
-    <w:bookmarkStart w:id="307" w:name="ref-xu2025plantmatrix"/>
+    <w:bookmarkEnd w:id="307"/>
+    <w:bookmarkStart w:id="309" w:name="ref-xu2025plantmatrix"/>
     <w:p>
       <w:pPr>
         <w:pStyle w:val="Bibliography"/>
@@ -19481,7 +19615,7 @@
       <w:r>
         <w:t xml:space="preserve"> </w:t>
       </w:r>
-      <w:hyperlink r:id="rId306">
+      <w:hyperlink r:id="rId308">
         <w:r>
           <w:rPr>
             <w:rStyle w:val="Hyperlink"/>
@@ -19493,8 +19627,8 @@
         <w:t xml:space="preserve">.</w:t>
       </w:r>
     </w:p>
-    <w:bookmarkEnd w:id="307"/>
-    <w:bookmarkStart w:id="309" w:name="ref-xu2026artemisininpk"/>
+    <w:bookmarkEnd w:id="309"/>
+    <w:bookmarkStart w:id="311" w:name="ref-xu2026artemisininpk"/>
     <w:p>
       <w:pPr>
         <w:pStyle w:val="Bibliography"/>
@@ -19540,7 +19674,7 @@
       <w:r>
         <w:t xml:space="preserve"> </w:t>
       </w:r>
-      <w:hyperlink r:id="rId308">
+      <w:hyperlink r:id="rId310">
         <w:r>
           <w:rPr>
             <w:rStyle w:val="Hyperlink"/>
@@ -19552,8 +19686,8 @@
         <w:t xml:space="preserve">.</w:t>
       </w:r>
     </w:p>
-    <w:bookmarkEnd w:id="309"/>
-    <w:bookmarkStart w:id="311" w:name="ref-yildiz2011toxocara"/>
+    <w:bookmarkEnd w:id="311"/>
+    <w:bookmarkStart w:id="313" w:name="ref-yildiz2011toxocara"/>
     <w:p>
       <w:pPr>
         <w:pStyle w:val="Bibliography"/>
@@ -19611,7 +19745,7 @@
       <w:r>
         <w:t xml:space="preserve"> </w:t>
       </w:r>
-      <w:hyperlink r:id="rId310">
+      <w:hyperlink r:id="rId312">
         <w:r>
           <w:rPr>
             <w:rStyle w:val="Hyperlink"/>
@@ -19623,8 +19757,8 @@
         <w:t xml:space="preserve">.</w:t>
       </w:r>
     </w:p>
-    <w:bookmarkEnd w:id="311"/>
-    <w:bookmarkStart w:id="313" w:name="ref-zehra2020copper"/>
+    <w:bookmarkEnd w:id="313"/>
+    <w:bookmarkStart w:id="315" w:name="ref-zehra2020copper"/>
     <w:p>
       <w:pPr>
         <w:pStyle w:val="Bibliography"/>
@@ -19670,7 +19804,7 @@
       <w:r>
         <w:t xml:space="preserve"> </w:t>
       </w:r>
-      <w:hyperlink r:id="rId312">
+      <w:hyperlink r:id="rId314">
         <w:r>
           <w:rPr>
             <w:rStyle w:val="Hyperlink"/>
@@ -19682,8 +19816,8 @@
         <w:t xml:space="preserve">.</w:t>
       </w:r>
     </w:p>
-    <w:bookmarkEnd w:id="313"/>
-    <w:bookmarkStart w:id="315" w:name="ref-zhang2022fiveartemisia"/>
+    <w:bookmarkEnd w:id="315"/>
+    <w:bookmarkStart w:id="317" w:name="ref-zhang2022fiveartemisia"/>
     <w:p>
       <w:pPr>
         <w:pStyle w:val="Bibliography"/>
@@ -19729,7 +19863,7 @@
       <w:r>
         <w:t xml:space="preserve"> </w:t>
       </w:r>
-      <w:hyperlink r:id="rId314">
+      <w:hyperlink r:id="rId316">
         <w:r>
           <w:rPr>
             <w:rStyle w:val="Hyperlink"/>
@@ -19741,8 +19875,8 @@
         <w:t xml:space="preserve">.</w:t>
       </w:r>
     </w:p>
-    <w:bookmarkEnd w:id="315"/>
-    <w:bookmarkStart w:id="317" w:name="ref-zhang2026annuaenhancement"/>
+    <w:bookmarkEnd w:id="317"/>
+    <w:bookmarkStart w:id="319" w:name="ref-zhang2026annuaenhancement"/>
     <w:p>
       <w:pPr>
         <w:pStyle w:val="Bibliography"/>
@@ -19788,7 +19922,7 @@
       <w:r>
         <w:t xml:space="preserve"> </w:t>
       </w:r>
-      <w:hyperlink r:id="rId316">
+      <w:hyperlink r:id="rId318">
         <w:r>
           <w:rPr>
             <w:rStyle w:val="Hyperlink"/>
@@ -19800,8 +19934,8 @@
         <w:t xml:space="preserve">.</w:t>
       </w:r>
     </w:p>
-    <w:bookmarkEnd w:id="317"/>
-    <w:bookmarkStart w:id="319" w:name="ref-zhang2020argyitriterpenoids"/>
+    <w:bookmarkEnd w:id="319"/>
+    <w:bookmarkStart w:id="321" w:name="ref-zhang2020argyitriterpenoids"/>
     <w:p>
       <w:pPr>
         <w:pStyle w:val="Bibliography"/>
@@ -19844,7 +19978,7 @@
       <w:r>
         <w:t xml:space="preserve"> </w:t>
       </w:r>
-      <w:hyperlink r:id="rId318">
+      <w:hyperlink r:id="rId320">
         <w:r>
           <w:rPr>
             <w:rStyle w:val="Hyperlink"/>
@@ -19856,8 +19990,8 @@
         <w:t xml:space="preserve">.</w:t>
       </w:r>
     </w:p>
-    <w:bookmarkEnd w:id="319"/>
-    <w:bookmarkStart w:id="321" w:name="ref-zhang2019pp2c1"/>
+    <w:bookmarkEnd w:id="321"/>
+    <w:bookmarkStart w:id="323" w:name="ref-zhang2019pp2c1"/>
     <w:p>
       <w:pPr>
         <w:pStyle w:val="Bibliography"/>
@@ -19909,7 +20043,7 @@
       <w:r>
         <w:t xml:space="preserve"> </w:t>
       </w:r>
-      <w:hyperlink r:id="rId320">
+      <w:hyperlink r:id="rId322">
         <w:r>
           <w:rPr>
             <w:rStyle w:val="Hyperlink"/>
@@ -19921,8 +20055,8 @@
         <w:t xml:space="preserve">.</w:t>
       </w:r>
     </w:p>
-    <w:bookmarkEnd w:id="321"/>
-    <w:bookmarkStart w:id="323" w:name="ref-zhang2008dbr2"/>
+    <w:bookmarkEnd w:id="323"/>
+    <w:bookmarkStart w:id="325" w:name="ref-zhang2008dbr2"/>
     <w:p>
       <w:pPr>
         <w:pStyle w:val="Bibliography"/>
@@ -19956,7 +20090,7 @@
       <w:r>
         <w:t xml:space="preserve"> </w:t>
       </w:r>
-      <w:hyperlink r:id="rId322">
+      <w:hyperlink r:id="rId324">
         <w:r>
           <w:rPr>
             <w:rStyle w:val="Hyperlink"/>
@@ -19968,8 +20102,8 @@
         <w:t xml:space="preserve">.</w:t>
       </w:r>
     </w:p>
-    <w:bookmarkEnd w:id="323"/>
-    <w:bookmarkStart w:id="325" w:name="ref-frigida2023variability"/>
+    <w:bookmarkEnd w:id="325"/>
+    <w:bookmarkStart w:id="327" w:name="ref-frigida2023variability"/>
     <w:p>
       <w:pPr>
         <w:pStyle w:val="Bibliography"/>
@@ -20003,7 +20137,7 @@
       <w:r>
         <w:t xml:space="preserve"> </w:t>
       </w:r>
-      <w:hyperlink r:id="rId324">
+      <w:hyperlink r:id="rId326">
         <w:r>
           <w:rPr>
             <w:rStyle w:val="Hyperlink"/>
@@ -20015,9 +20149,9 @@
         <w:t xml:space="preserve">.</w:t>
       </w:r>
     </w:p>
-    <w:bookmarkEnd w:id="325"/>
-    <w:bookmarkEnd w:id="326"/>
     <w:bookmarkEnd w:id="327"/>
+    <w:bookmarkEnd w:id="328"/>
+    <w:bookmarkEnd w:id="329"/>
     <w:sectPr>
       <w:headerReference w:type="default" r:id="rId9"/>
       <w:footerReference w:type="default" r:id="rId10"/>

</xml_diff>

<commit_message>
Verify A. indica antiprotozoal full text
</commit_message>
<xml_diff>
--- a/manuscript/artemisia-terpene-review-submission.docx
+++ b/manuscript/artemisia-terpene-review-submission.docx
@@ -199,7 +199,7 @@
         <w:t xml:space="preserve"> </w:t>
       </w:r>
       <w:r>
-        <w:t xml:space="preserve">contains volatile monoterpenes and sesquiterpenes, less volatile diterpenes and triterpenes, and structurally diverse sesquiterpene lactones (STLs). These metabolites are often discussed as though a species name, a pathway gene, or an oil profile were sufficient to predict pharmacology. Here we present a source-auditable scoping review with a frozen snapshot that instead treats the specimen, accession, tissue, preparation, analytical method, parasite stage, and evidence level as the units of comparison. The Terpedia package registers 540 sources, 555 source-linked evidence records, 131 antiparasitic records, 19 parasite–protein interaction records, 179 compound/specimen records, and 407 audited article claims; 88 sources and 103 linked evidence rows have completed full-text verification, while 24 remain open. We synthesize terpene classes with biosynthetic compartmentalization, regulatory and environmental variation, and a bounded comparative-genomics analysis. Artemisinin biosynthesis in</w:t>
+        <w:t xml:space="preserve">contains volatile monoterpenes and sesquiterpenes, less volatile diterpenes and triterpenes, and structurally diverse sesquiterpene lactones (STLs). These metabolites are often discussed as though a species name, a pathway gene, or an oil profile were sufficient to predict pharmacology. Here we present a source-auditable scoping review with a frozen snapshot that instead treats the specimen, accession, tissue, preparation, analytical method, parasite stage, and evidence level as the units of comparison. The Terpedia package registers 540 sources, 555 source-linked evidence records, 131 antiparasitic records, 19 parasite–protein interaction records, 179 compound/specimen records, and 407 audited article claims; 89 sources and 104 linked evidence rows have completed full-text verification, while 23 remain open. We synthesize terpene classes with biosynthetic compartmentalization, regulatory and environmental variation, and a bounded comparative-genomics analysis. Artemisinin biosynthesis in</w:t>
       </w:r>
       <w:r>
         <w:t xml:space="preserve"> </w:t>
@@ -452,7 +452,7 @@
         <w:spacing w:before="0" w:after="120" w:line="264" w:lineRule="auto"/>
       </w:pPr>
       <w:r>
-        <w:t xml:space="preserve">The analysis is reported as a frozen scoping review rather than a completed systematic review. The retrieval snapshot contains 1,408 bounded title/abstract decisions, covering all 1,387 priority-queue records plus 21 historical or out-of-queue decisions. Full-text verification now covers 88 publicly accessible or publisher-indexed antiparasitic sources and 103 linked evidence rows; 24 queue sources remain unverified, and no result is pooled as a final quantitative estimate. The</w:t>
+        <w:t xml:space="preserve">The analysis is reported as a frozen scoping review rather than a completed systematic review. The retrieval snapshot contains 1,408 bounded title/abstract decisions, covering all 1,387 priority-queue records plus 21 historical or out-of-queue decisions. Full-text verification now covers 89 publicly accessible or publisher-indexed antiparasitic sources and 104 linked evidence rows; 23 queue sources remain unverified, and no result is pooled as a final quantitative estimate. The</w:t>
       </w:r>
       <w:r>
         <w:t xml:space="preserve"> </w:t>
@@ -542,7 +542,23 @@
         <w:t xml:space="preserve"> </w:t>
       </w:r>
       <w:r>
-        <w:t xml:space="preserve">coccidiosis study is retained with unresolved extract chemistry and small-sample limitations. Terpedia is maintained as an updateable evidence archive, but later additions are not silently treated as part of this frozen analysis. The PRISMA-ScR mapping is archived in</w:t>
+        <w:t xml:space="preserve">coccidiosis study is retained with unresolved extract chemistry and small-sample limitations, while the</w:t>
+      </w:r>
+      <w:r>
+        <w:t xml:space="preserve"> </w:t>
+      </w:r>
+      <w:r>
+        <w:rPr>
+          <w:i/>
+          <w:iCs/>
+        </w:rPr>
+        <w:t xml:space="preserve">A. indica</w:t>
+      </w:r>
+      <w:r>
+        <w:t xml:space="preserve"> </w:t>
+      </w:r>
+      <w:r>
+        <w:t xml:space="preserve">electronic reprint retains mixture-level attribution and partial host-control limits. Terpedia is maintained as an updateable evidence archive, but later additions are not silently treated as part of this frozen analysis. The PRISMA-ScR mapping is archived in</w:t>
       </w:r>
       <w:r>
         <w:t xml:space="preserve"> </w:t>
@@ -5068,7 +5084,7 @@
         <w:spacing w:before="0" w:after="120" w:line="264" w:lineRule="auto"/>
       </w:pPr>
       <w:r>
-        <w:t xml:space="preserve">Two full-text chemistry controls further separate malaria evidence from terpene attribution. Authenticated</w:t>
+        <w:t xml:space="preserve">The malaria comparison also includes a full-text</w:t>
       </w:r>
       <w:r>
         <w:t xml:space="preserve"> </w:t>
@@ -5084,7 +5100,7 @@
         <w:t xml:space="preserve"> </w:t>
       </w:r>
       <w:r>
-        <w:t xml:space="preserve">stems were extracted with n-hexane and methanol, and activity-guided silica fractionation yielded exiguaflavanones A/B, maackiain, and a benzofuran. Against multidrug-resistant</w:t>
+        <w:t xml:space="preserve">oil/extract boundary control. No artemisinin was detected in the tested solvent extracts at a 30 ng/mL limit; the hydrodistilled oil contained 92 detected constituents, including camphor (13.0%), caryophyllene oxide (10.87%), alpha-thujone (7.37%), and borneol (6.97%). Against multidrug-resistant blood-stage</w:t>
       </w:r>
       <w:r>
         <w:t xml:space="preserve"> </w:t>
@@ -5097,6 +5113,44 @@
         <w:t xml:space="preserve">P. falciparum</w:t>
       </w:r>
       <w:r>
+        <w:t xml:space="preserve">, the strongest solvent extracts had IC50 values of 1.8–2.4 microgram/mL, the essential oil 9.3 microgram/mL, and the hot-water infusion 20.0 microgram/mL; preparation-dependent inhibition of recombinant PfFabI, PfFabG, and PfFabZ and an L6 mammalian-cell counterassay were also reported. This supports a preparation-specific artemisinin-negative mixture phenotype, not a causal camphor, caryophyllene oxide, or other terpene claim</w:t>
+      </w:r>
+      <w:r>
+        <w:t xml:space="preserve"> </w:t>
+      </w:r>
+      <w:r>
+        <w:t xml:space="preserve">(Tasdemir et al. 2015)</w:t>
+      </w:r>
+      <w:r>
+        <w:t xml:space="preserve">. A separate full-text chemistry control used authenticated</w:t>
+      </w:r>
+      <w:r>
+        <w:t xml:space="preserve"> </w:t>
+      </w:r>
+      <w:r>
+        <w:rPr>
+          <w:i/>
+          <w:iCs/>
+        </w:rPr>
+        <w:t xml:space="preserve">A. indica</w:t>
+      </w:r>
+      <w:r>
+        <w:t xml:space="preserve"> </w:t>
+      </w:r>
+      <w:r>
+        <w:t xml:space="preserve">stems and activity-guided silica fractionation to yield exiguaflavanones A/B, maackiain, and a benzofuran. Against multidrug-resistant</w:t>
+      </w:r>
+      <w:r>
+        <w:t xml:space="preserve"> </w:t>
+      </w:r>
+      <w:r>
+        <w:rPr>
+          <w:i/>
+          <w:iCs/>
+        </w:rPr>
+        <w:t xml:space="preserve">P. falciparum</w:t>
+      </w:r>
+      <w:r>
         <w:t xml:space="preserve"> </w:t>
       </w:r>
       <w:r>
@@ -5119,7 +5173,7 @@
         <w:t xml:space="preserve"> </w:t>
       </w:r>
       <w:r>
-        <w:t xml:space="preserve">(Chanphen et al. 1998; Ortet et al. 2008)</w:t>
+        <w:t xml:space="preserve">(Tasdemir et al. 2015; Chanphen et al. 1998; Ortet et al. 2008)</w:t>
       </w:r>
       <w:r>
         <w:t xml:space="preserve">.</w:t>
@@ -11998,7 +12052,7 @@
     <w:bookmarkEnd w:id="47"/>
     <w:bookmarkEnd w:id="48"/>
     <w:bookmarkEnd w:id="49"/>
-    <w:bookmarkStart w:id="329" w:name="references"/>
+    <w:bookmarkStart w:id="331" w:name="references"/>
     <w:p>
       <w:pPr>
         <w:pStyle w:val="Heading1"/>
@@ -12008,7 +12062,7 @@
         <w:t xml:space="preserve">References</w:t>
       </w:r>
     </w:p>
-    <w:bookmarkStart w:id="328" w:name="refs"/>
+    <w:bookmarkStart w:id="330" w:name="refs"/>
     <w:bookmarkStart w:id="51" w:name="ref-abad2012artemisia"/>
     <w:p>
       <w:pPr>
@@ -18738,13 +18792,60 @@
       </w:r>
     </w:p>
     <w:bookmarkEnd w:id="277"/>
-    <w:bookmarkStart w:id="279" w:name="ref-teoh2006cyp"/>
+    <w:bookmarkStart w:id="279" w:name="ref-tasdemir2015antiprotozoal"/>
     <w:p>
       <w:pPr>
         <w:pStyle w:val="Bibliography"/>
         <w:spacing w:before="0" w:after="120" w:line="264" w:lineRule="auto"/>
       </w:pPr>
       <w:r>
+        <w:t xml:space="preserve">Tasdemir, D, M Tierney, R Sen, M C Bergonzi, B Demirci, A R Bilia, K H C Baser, R Brun, and M Chatterjee. 2015.</w:t>
+      </w:r>
+      <w:r>
+        <w:t xml:space="preserve"> </w:t>
+      </w:r>
+      <w:r>
+        <w:t xml:space="preserve">“Antiprotozoal Effect of Artemisia Indica Extracts and Essential Oil.”</w:t>
+      </w:r>
+      <w:r>
+        <w:t xml:space="preserve"> </w:t>
+      </w:r>
+      <w:r>
+        <w:rPr>
+          <w:i/>
+          <w:iCs/>
+        </w:rPr>
+        <w:t xml:space="preserve">Planta Medica</w:t>
+      </w:r>
+      <w:r>
+        <w:t xml:space="preserve"> </w:t>
+      </w:r>
+      <w:r>
+        <w:t xml:space="preserve">81 (12-13): 1029–37.</w:t>
+      </w:r>
+      <w:r>
+        <w:t xml:space="preserve"> </w:t>
+      </w:r>
+      <w:hyperlink r:id="rId278">
+        <w:r>
+          <w:rPr>
+            <w:rStyle w:val="Hyperlink"/>
+          </w:rPr>
+          <w:t xml:space="preserve">https://doi.org/10.1055/s-0035-1546125</w:t>
+        </w:r>
+      </w:hyperlink>
+      <w:r>
+        <w:t xml:space="preserve">.</w:t>
+      </w:r>
+    </w:p>
+    <w:bookmarkEnd w:id="279"/>
+    <w:bookmarkStart w:id="281" w:name="ref-teoh2006cyp"/>
+    <w:p>
+      <w:pPr>
+        <w:pStyle w:val="Bibliography"/>
+        <w:spacing w:before="0" w:after="120" w:line="264" w:lineRule="auto"/>
+      </w:pPr>
+      <w:r>
         <w:t xml:space="preserve">Teoh, K H, D R Polichuk, D W Reed, G Nowak, and P S Covello. 2006.</w:t>
       </w:r>
       <w:r>
@@ -18772,7 +18873,7 @@
       <w:r>
         <w:t xml:space="preserve"> </w:t>
       </w:r>
-      <w:hyperlink r:id="rId278">
+      <w:hyperlink r:id="rId280">
         <w:r>
           <w:rPr>
             <w:rStyle w:val="Hyperlink"/>
@@ -18784,8 +18885,8 @@
         <w:t xml:space="preserve">.</w:t>
       </w:r>
     </w:p>
-    <w:bookmarkEnd w:id="279"/>
-    <w:bookmarkStart w:id="281" w:name="ref-trendafilova2021edibleartemisia"/>
+    <w:bookmarkEnd w:id="281"/>
+    <w:bookmarkStart w:id="283" w:name="ref-trendafilova2021edibleartemisia"/>
     <w:p>
       <w:pPr>
         <w:pStyle w:val="Bibliography"/>
@@ -18819,7 +18920,7 @@
       <w:r>
         <w:t xml:space="preserve"> </w:t>
       </w:r>
-      <w:hyperlink r:id="rId280">
+      <w:hyperlink r:id="rId282">
         <w:r>
           <w:rPr>
             <w:rStyle w:val="Hyperlink"/>
@@ -18831,8 +18932,8 @@
         <w:t xml:space="preserve">.</w:t>
       </w:r>
     </w:p>
-    <w:bookmarkEnd w:id="281"/>
-    <w:bookmarkStart w:id="283" w:name="ref-umaraliev2025persicabisabolanes"/>
+    <w:bookmarkEnd w:id="283"/>
+    <w:bookmarkStart w:id="285" w:name="ref-umaraliev2025persicabisabolanes"/>
     <w:p>
       <w:pPr>
         <w:pStyle w:val="Bibliography"/>
@@ -18872,7 +18973,7 @@
       <w:r>
         <w:t xml:space="preserve"> </w:t>
       </w:r>
-      <w:hyperlink r:id="rId282">
+      <w:hyperlink r:id="rId284">
         <w:r>
           <w:rPr>
             <w:rStyle w:val="Hyperlink"/>
@@ -18884,8 +18985,8 @@
         <w:t xml:space="preserve">.</w:t>
       </w:r>
     </w:p>
-    <w:bookmarkEnd w:id="283"/>
-    <w:bookmarkStart w:id="285" w:name="ref-umaraliev2026persicamonoterpenes"/>
+    <w:bookmarkEnd w:id="285"/>
+    <w:bookmarkStart w:id="287" w:name="ref-umaraliev2026persicamonoterpenes"/>
     <w:p>
       <w:pPr>
         <w:pStyle w:val="Bibliography"/>
@@ -18925,7 +19026,7 @@
       <w:r>
         <w:t xml:space="preserve"> </w:t>
       </w:r>
-      <w:hyperlink r:id="rId284">
+      <w:hyperlink r:id="rId286">
         <w:r>
           <w:rPr>
             <w:rStyle w:val="Hyperlink"/>
@@ -18937,8 +19038,8 @@
         <w:t xml:space="preserve">.</w:t>
       </w:r>
     </w:p>
-    <w:bookmarkEnd w:id="285"/>
-    <w:bookmarkStart w:id="287" w:name="ref-urban2020trpc3"/>
+    <w:bookmarkEnd w:id="287"/>
+    <w:bookmarkStart w:id="289" w:name="ref-urban2020trpc3"/>
     <w:p>
       <w:pPr>
         <w:pStyle w:val="Bibliography"/>
@@ -18984,7 +19085,7 @@
       <w:r>
         <w:t xml:space="preserve"> </w:t>
       </w:r>
-      <w:hyperlink r:id="rId286">
+      <w:hyperlink r:id="rId288">
         <w:r>
           <w:rPr>
             <w:rStyle w:val="Hyperlink"/>
@@ -18996,8 +19097,8 @@
         <w:t xml:space="preserve">.</w:t>
       </w:r>
     </w:p>
-    <w:bookmarkEnd w:id="287"/>
-    <w:bookmarkStart w:id="289" w:name="ref-varadyova2018medicinalplants"/>
+    <w:bookmarkEnd w:id="289"/>
+    <w:bookmarkStart w:id="291" w:name="ref-varadyova2018medicinalplants"/>
     <w:p>
       <w:pPr>
         <w:pStyle w:val="Bibliography"/>
@@ -19040,7 +19141,7 @@
       <w:r>
         <w:t xml:space="preserve"> </w:t>
       </w:r>
-      <w:hyperlink r:id="rId288">
+      <w:hyperlink r:id="rId290">
         <w:r>
           <w:rPr>
             <w:rStyle w:val="Hyperlink"/>
@@ -19052,8 +19153,8 @@
         <w:t xml:space="preserve">.</w:t>
       </w:r>
     </w:p>
-    <w:bookmarkEnd w:id="289"/>
-    <w:bookmarkStart w:id="291" w:name="ref-walz2024aframalaria"/>
+    <w:bookmarkEnd w:id="291"/>
+    <w:bookmarkStart w:id="293" w:name="ref-walz2024aframalaria"/>
     <w:p>
       <w:pPr>
         <w:pStyle w:val="Bibliography"/>
@@ -19099,7 +19200,7 @@
       <w:r>
         <w:t xml:space="preserve"> </w:t>
       </w:r>
-      <w:hyperlink r:id="rId290">
+      <w:hyperlink r:id="rId292">
         <w:r>
           <w:rPr>
             <w:rStyle w:val="Hyperlink"/>
@@ -19111,8 +19212,8 @@
         <w:t xml:space="preserve">.</w:t>
       </w:r>
     </w:p>
-    <w:bookmarkEnd w:id="291"/>
-    <w:bookmarkStart w:id="293" w:name="ref-wang2013cyp71av1promoter"/>
+    <w:bookmarkEnd w:id="293"/>
+    <w:bookmarkStart w:id="295" w:name="ref-wang2013cyp71av1promoter"/>
     <w:p>
       <w:pPr>
         <w:pStyle w:val="Bibliography"/>
@@ -19146,7 +19247,7 @@
       <w:r>
         <w:t xml:space="preserve"> </w:t>
       </w:r>
-      <w:hyperlink r:id="rId292">
+      <w:hyperlink r:id="rId294">
         <w:r>
           <w:rPr>
             <w:rStyle w:val="Hyperlink"/>
@@ -19158,8 +19259,8 @@
         <w:t xml:space="preserve">.</w:t>
       </w:r>
     </w:p>
-    <w:bookmarkEnd w:id="293"/>
-    <w:bookmarkStart w:id="295" w:name="ref-wang2009trichometranscriptome"/>
+    <w:bookmarkEnd w:id="295"/>
+    <w:bookmarkStart w:id="297" w:name="ref-wang2009trichometranscriptome"/>
     <w:p>
       <w:pPr>
         <w:pStyle w:val="Bibliography"/>
@@ -19193,7 +19294,7 @@
       <w:r>
         <w:t xml:space="preserve"> </w:t>
       </w:r>
-      <w:hyperlink r:id="rId294">
+      <w:hyperlink r:id="rId296">
         <w:r>
           <w:rPr>
             <w:rStyle w:val="Hyperlink"/>
@@ -19205,8 +19306,8 @@
         <w:t xml:space="preserve">.</w:t>
       </w:r>
     </w:p>
-    <w:bookmarkEnd w:id="295"/>
-    <w:bookmarkStart w:id="297" w:name="ref-wani2023nitric"/>
+    <w:bookmarkEnd w:id="297"/>
+    <w:bookmarkStart w:id="299" w:name="ref-wani2023nitric"/>
     <w:p>
       <w:pPr>
         <w:pStyle w:val="Bibliography"/>
@@ -19264,7 +19365,7 @@
       <w:r>
         <w:t xml:space="preserve"> </w:t>
       </w:r>
-      <w:hyperlink r:id="rId296">
+      <w:hyperlink r:id="rId298">
         <w:r>
           <w:rPr>
             <w:rStyle w:val="Hyperlink"/>
@@ -19276,8 +19377,8 @@
         <w:t xml:space="preserve">.</w:t>
       </w:r>
     </w:p>
-    <w:bookmarkEnd w:id="297"/>
-    <w:bookmarkStart w:id="299" w:name="ref-wani2026maritima"/>
+    <w:bookmarkEnd w:id="299"/>
+    <w:bookmarkStart w:id="301" w:name="ref-wani2026maritima"/>
     <w:p>
       <w:pPr>
         <w:pStyle w:val="Bibliography"/>
@@ -19323,7 +19424,7 @@
       <w:r>
         <w:t xml:space="preserve"> </w:t>
       </w:r>
-      <w:hyperlink r:id="rId298">
+      <w:hyperlink r:id="rId300">
         <w:r>
           <w:rPr>
             <w:rStyle w:val="Hyperlink"/>
@@ -19335,8 +19436,8 @@
         <w:t xml:space="preserve">.</w:t>
       </w:r>
     </w:p>
-    <w:bookmarkEnd w:id="299"/>
-    <w:bookmarkStart w:id="301" w:name="ref-wetmore2019psiv9"/>
+    <w:bookmarkEnd w:id="301"/>
+    <w:bookmarkStart w:id="303" w:name="ref-wetmore2019psiv9"/>
     <w:p>
       <w:pPr>
         <w:pStyle w:val="Bibliography"/>
@@ -19382,7 +19483,7 @@
       <w:r>
         <w:t xml:space="preserve"> </w:t>
       </w:r>
-      <w:hyperlink r:id="rId300">
+      <w:hyperlink r:id="rId302">
         <w:r>
           <w:rPr>
             <w:rStyle w:val="Hyperlink"/>
@@ -19394,8 +19495,8 @@
         <w:t xml:space="preserve">.</w:t>
       </w:r>
     </w:p>
-    <w:bookmarkEnd w:id="301"/>
-    <w:bookmarkStart w:id="303" w:name="ref-wiedosari2017eimeria"/>
+    <w:bookmarkEnd w:id="303"/>
+    <w:bookmarkStart w:id="305" w:name="ref-wiedosari2017eimeria"/>
     <w:p>
       <w:pPr>
         <w:pStyle w:val="Bibliography"/>
@@ -19450,7 +19551,7 @@
       <w:r>
         <w:t xml:space="preserve"> </w:t>
       </w:r>
-      <w:hyperlink r:id="rId302">
+      <w:hyperlink r:id="rId304">
         <w:r>
           <w:rPr>
             <w:rStyle w:val="Hyperlink"/>
@@ -19462,8 +19563,8 @@
         <w:t xml:space="preserve">.</w:t>
       </w:r>
     </w:p>
-    <w:bookmarkEnd w:id="303"/>
-    <w:bookmarkStart w:id="305" w:name="ref-wright2010qinghao"/>
+    <w:bookmarkEnd w:id="305"/>
+    <w:bookmarkStart w:id="307" w:name="ref-wright2010qinghao"/>
     <w:p>
       <w:pPr>
         <w:pStyle w:val="Bibliography"/>
@@ -19509,7 +19610,7 @@
       <w:r>
         <w:t xml:space="preserve"> </w:t>
       </w:r>
-      <w:hyperlink r:id="rId304">
+      <w:hyperlink r:id="rId306">
         <w:r>
           <w:rPr>
             <w:rStyle w:val="Hyperlink"/>
@@ -19521,8 +19622,8 @@
         <w:t xml:space="preserve">.</w:t>
       </w:r>
     </w:p>
-    <w:bookmarkEnd w:id="305"/>
-    <w:bookmarkStart w:id="307" w:name="ref-xiang2019bhlh112"/>
+    <w:bookmarkEnd w:id="307"/>
+    <w:bookmarkStart w:id="309" w:name="ref-xiang2019bhlh112"/>
     <w:p>
       <w:pPr>
         <w:pStyle w:val="Bibliography"/>
@@ -19556,7 +19657,7 @@
       <w:r>
         <w:t xml:space="preserve"> </w:t>
       </w:r>
-      <w:hyperlink r:id="rId306">
+      <w:hyperlink r:id="rId308">
         <w:r>
           <w:rPr>
             <w:rStyle w:val="Hyperlink"/>
@@ -19568,8 +19669,8 @@
         <w:t xml:space="preserve">.</w:t>
       </w:r>
     </w:p>
-    <w:bookmarkEnd w:id="307"/>
-    <w:bookmarkStart w:id="309" w:name="ref-xu2025plantmatrix"/>
+    <w:bookmarkEnd w:id="309"/>
+    <w:bookmarkStart w:id="311" w:name="ref-xu2025plantmatrix"/>
     <w:p>
       <w:pPr>
         <w:pStyle w:val="Bibliography"/>
@@ -19615,7 +19716,7 @@
       <w:r>
         <w:t xml:space="preserve"> </w:t>
       </w:r>
-      <w:hyperlink r:id="rId308">
+      <w:hyperlink r:id="rId310">
         <w:r>
           <w:rPr>
             <w:rStyle w:val="Hyperlink"/>
@@ -19627,8 +19728,8 @@
         <w:t xml:space="preserve">.</w:t>
       </w:r>
     </w:p>
-    <w:bookmarkEnd w:id="309"/>
-    <w:bookmarkStart w:id="311" w:name="ref-xu2026artemisininpk"/>
+    <w:bookmarkEnd w:id="311"/>
+    <w:bookmarkStart w:id="313" w:name="ref-xu2026artemisininpk"/>
     <w:p>
       <w:pPr>
         <w:pStyle w:val="Bibliography"/>
@@ -19674,7 +19775,7 @@
       <w:r>
         <w:t xml:space="preserve"> </w:t>
       </w:r>
-      <w:hyperlink r:id="rId310">
+      <w:hyperlink r:id="rId312">
         <w:r>
           <w:rPr>
             <w:rStyle w:val="Hyperlink"/>
@@ -19686,8 +19787,8 @@
         <w:t xml:space="preserve">.</w:t>
       </w:r>
     </w:p>
-    <w:bookmarkEnd w:id="311"/>
-    <w:bookmarkStart w:id="313" w:name="ref-yildiz2011toxocara"/>
+    <w:bookmarkEnd w:id="313"/>
+    <w:bookmarkStart w:id="315" w:name="ref-yildiz2011toxocara"/>
     <w:p>
       <w:pPr>
         <w:pStyle w:val="Bibliography"/>
@@ -19745,7 +19846,7 @@
       <w:r>
         <w:t xml:space="preserve"> </w:t>
       </w:r>
-      <w:hyperlink r:id="rId312">
+      <w:hyperlink r:id="rId314">
         <w:r>
           <w:rPr>
             <w:rStyle w:val="Hyperlink"/>
@@ -19757,8 +19858,8 @@
         <w:t xml:space="preserve">.</w:t>
       </w:r>
     </w:p>
-    <w:bookmarkEnd w:id="313"/>
-    <w:bookmarkStart w:id="315" w:name="ref-zehra2020copper"/>
+    <w:bookmarkEnd w:id="315"/>
+    <w:bookmarkStart w:id="317" w:name="ref-zehra2020copper"/>
     <w:p>
       <w:pPr>
         <w:pStyle w:val="Bibliography"/>
@@ -19804,7 +19905,7 @@
       <w:r>
         <w:t xml:space="preserve"> </w:t>
       </w:r>
-      <w:hyperlink r:id="rId314">
+      <w:hyperlink r:id="rId316">
         <w:r>
           <w:rPr>
             <w:rStyle w:val="Hyperlink"/>
@@ -19816,8 +19917,8 @@
         <w:t xml:space="preserve">.</w:t>
       </w:r>
     </w:p>
-    <w:bookmarkEnd w:id="315"/>
-    <w:bookmarkStart w:id="317" w:name="ref-zhang2022fiveartemisia"/>
+    <w:bookmarkEnd w:id="317"/>
+    <w:bookmarkStart w:id="319" w:name="ref-zhang2022fiveartemisia"/>
     <w:p>
       <w:pPr>
         <w:pStyle w:val="Bibliography"/>
@@ -19863,7 +19964,7 @@
       <w:r>
         <w:t xml:space="preserve"> </w:t>
       </w:r>
-      <w:hyperlink r:id="rId316">
+      <w:hyperlink r:id="rId318">
         <w:r>
           <w:rPr>
             <w:rStyle w:val="Hyperlink"/>
@@ -19875,8 +19976,8 @@
         <w:t xml:space="preserve">.</w:t>
       </w:r>
     </w:p>
-    <w:bookmarkEnd w:id="317"/>
-    <w:bookmarkStart w:id="319" w:name="ref-zhang2026annuaenhancement"/>
+    <w:bookmarkEnd w:id="319"/>
+    <w:bookmarkStart w:id="321" w:name="ref-zhang2026annuaenhancement"/>
     <w:p>
       <w:pPr>
         <w:pStyle w:val="Bibliography"/>
@@ -19922,7 +20023,7 @@
       <w:r>
         <w:t xml:space="preserve"> </w:t>
       </w:r>
-      <w:hyperlink r:id="rId318">
+      <w:hyperlink r:id="rId320">
         <w:r>
           <w:rPr>
             <w:rStyle w:val="Hyperlink"/>
@@ -19934,8 +20035,8 @@
         <w:t xml:space="preserve">.</w:t>
       </w:r>
     </w:p>
-    <w:bookmarkEnd w:id="319"/>
-    <w:bookmarkStart w:id="321" w:name="ref-zhang2020argyitriterpenoids"/>
+    <w:bookmarkEnd w:id="321"/>
+    <w:bookmarkStart w:id="323" w:name="ref-zhang2020argyitriterpenoids"/>
     <w:p>
       <w:pPr>
         <w:pStyle w:val="Bibliography"/>
@@ -19978,7 +20079,7 @@
       <w:r>
         <w:t xml:space="preserve"> </w:t>
       </w:r>
-      <w:hyperlink r:id="rId320">
+      <w:hyperlink r:id="rId322">
         <w:r>
           <w:rPr>
             <w:rStyle w:val="Hyperlink"/>
@@ -19990,8 +20091,8 @@
         <w:t xml:space="preserve">.</w:t>
       </w:r>
     </w:p>
-    <w:bookmarkEnd w:id="321"/>
-    <w:bookmarkStart w:id="323" w:name="ref-zhang2019pp2c1"/>
+    <w:bookmarkEnd w:id="323"/>
+    <w:bookmarkStart w:id="325" w:name="ref-zhang2019pp2c1"/>
     <w:p>
       <w:pPr>
         <w:pStyle w:val="Bibliography"/>
@@ -20043,7 +20144,7 @@
       <w:r>
         <w:t xml:space="preserve"> </w:t>
       </w:r>
-      <w:hyperlink r:id="rId322">
+      <w:hyperlink r:id="rId324">
         <w:r>
           <w:rPr>
             <w:rStyle w:val="Hyperlink"/>
@@ -20055,8 +20156,8 @@
         <w:t xml:space="preserve">.</w:t>
       </w:r>
     </w:p>
-    <w:bookmarkEnd w:id="323"/>
-    <w:bookmarkStart w:id="325" w:name="ref-zhang2008dbr2"/>
+    <w:bookmarkEnd w:id="325"/>
+    <w:bookmarkStart w:id="327" w:name="ref-zhang2008dbr2"/>
     <w:p>
       <w:pPr>
         <w:pStyle w:val="Bibliography"/>
@@ -20090,7 +20191,7 @@
       <w:r>
         <w:t xml:space="preserve"> </w:t>
       </w:r>
-      <w:hyperlink r:id="rId324">
+      <w:hyperlink r:id="rId326">
         <w:r>
           <w:rPr>
             <w:rStyle w:val="Hyperlink"/>
@@ -20102,8 +20203,8 @@
         <w:t xml:space="preserve">.</w:t>
       </w:r>
     </w:p>
-    <w:bookmarkEnd w:id="325"/>
-    <w:bookmarkStart w:id="327" w:name="ref-frigida2023variability"/>
+    <w:bookmarkEnd w:id="327"/>
+    <w:bookmarkStart w:id="329" w:name="ref-frigida2023variability"/>
     <w:p>
       <w:pPr>
         <w:pStyle w:val="Bibliography"/>
@@ -20137,7 +20238,7 @@
       <w:r>
         <w:t xml:space="preserve"> </w:t>
       </w:r>
-      <w:hyperlink r:id="rId326">
+      <w:hyperlink r:id="rId328">
         <w:r>
           <w:rPr>
             <w:rStyle w:val="Hyperlink"/>
@@ -20149,9 +20250,9 @@
         <w:t xml:space="preserve">.</w:t>
       </w:r>
     </w:p>
-    <w:bookmarkEnd w:id="327"/>
-    <w:bookmarkEnd w:id="328"/>
     <w:bookmarkEnd w:id="329"/>
+    <w:bookmarkEnd w:id="330"/>
+    <w:bookmarkEnd w:id="331"/>
     <w:sectPr>
       <w:headerReference w:type="default" r:id="rId9"/>
       <w:footerReference w:type="default" r:id="rId10"/>

</xml_diff>

<commit_message>
Strengthen malaria matrix evidence boundaries
</commit_message>
<xml_diff>
--- a/manuscript/artemisia-terpene-review-submission.docx
+++ b/manuscript/artemisia-terpene-review-submission.docx
@@ -199,7 +199,7 @@
         <w:t xml:space="preserve"> </w:t>
       </w:r>
       <w:r>
-        <w:t xml:space="preserve">contains volatile monoterpenes and sesquiterpenes, less volatile diterpenes and triterpenes, and structurally diverse sesquiterpene lactones (STLs). These metabolites are often discussed as though a species name, a pathway gene, or an oil profile were sufficient to predict pharmacology. Here we present a source-auditable scoping review with a frozen snapshot that instead treats the specimen, accession, tissue, preparation, analytical method, parasite stage, and evidence level as the units of comparison. The Terpedia package registers 540 sources, 555 source-linked evidence records, 131 antiparasitic records, 19 parasite–protein interaction records, 179 compound/specimen records, and 407 audited article claims; 89 sources and 104 linked evidence rows have completed full-text verification, while 23 remain open. We synthesize terpene classes with biosynthetic compartmentalization, regulatory and environmental variation, and a bounded comparative-genomics analysis. Artemisinin biosynthesis in</w:t>
+        <w:t xml:space="preserve">contains volatile monoterpenes and sesquiterpenes, less volatile diterpenes and triterpenes, and structurally diverse sesquiterpene lactones (STLs). These metabolites are often discussed as though a species name, a pathway gene, or an oil profile were sufficient to predict pharmacology. Here we present a source-auditable scoping review with a frozen snapshot that instead treats the specimen, accession, tissue, preparation, analytical method, parasite stage, and evidence level as the units of comparison. The Terpedia package registers 540 sources, 555 source-linked evidence records, 131 antiparasitic records, 19 parasite–protein interaction records, 179 compound/specimen records, and 408 audited article claims; 89 sources and 104 linked evidence rows have completed full-text verification, while 23 remain open. We synthesize terpene classes with biosynthetic compartmentalization, regulatory and environmental variation, and a bounded comparative-genomics analysis. Artemisinin biosynthesis in</w:t>
       </w:r>
       <w:r>
         <w:t xml:space="preserve"> </w:t>
@@ -5073,6 +5073,72 @@
       </w:r>
       <w:r>
         <w:t xml:space="preserve">(Mouton et al. 2013)</w:t>
+      </w:r>
+      <w:r>
+        <w:t xml:space="preserve">.</w:t>
+      </w:r>
+    </w:p>
+    <w:p>
+      <w:pPr>
+        <w:pStyle w:val="BodyText"/>
+        <w:spacing w:before="0" w:after="120" w:line="264" w:lineRule="auto"/>
+      </w:pPr>
+      <w:r>
+        <w:t xml:space="preserve">Full-text verification of the Gruessner–Weathers comparison provides a more demanding resistance and matrix control. Voucher-authenticated</w:t>
+      </w:r>
+      <w:r>
+        <w:t xml:space="preserve"> </w:t>
+      </w:r>
+      <w:r>
+        <w:rPr>
+          <w:i/>
+          <w:iCs/>
+        </w:rPr>
+        <w:t xml:space="preserve">A. annua</w:t>
+      </w:r>
+      <w:r>
+        <w:t xml:space="preserve"> </w:t>
+      </w:r>
+      <w:r>
+        <w:t xml:space="preserve">SAM leaves contained 15.9 mg/g dry-weight artemisinin, whereas</w:t>
+      </w:r>
+      <w:r>
+        <w:t xml:space="preserve"> </w:t>
+      </w:r>
+      <w:r>
+        <w:rPr>
+          <w:i/>
+          <w:iCs/>
+        </w:rPr>
+        <w:t xml:space="preserve">A. afra</w:t>
+      </w:r>
+      <w:r>
+        <w:t xml:space="preserve"> </w:t>
+      </w:r>
+      <w:r>
+        <w:t xml:space="preserve">SEN contained 0.037 mg/g; dichloromethane, methanol, and tea preparations were normalized by artemisinin and tested against</w:t>
+      </w:r>
+      <w:r>
+        <w:t xml:space="preserve"> </w:t>
+      </w:r>
+      <w:r>
+        <w:rPr>
+          <w:i/>
+          <w:iCs/>
+        </w:rPr>
+        <w:t xml:space="preserve">P. falciparum</w:t>
+      </w:r>
+      <w:r>
+        <w:t xml:space="preserve"> </w:t>
+      </w:r>
+      <w:r>
+        <w:t xml:space="preserve">3D7, MRA1252/MRA1240, and K13 R539T Cam3.II/Cam3.IIrev strains. Across 72-hour growth assays, activity tracked artemisinin concentration more closely than total flavonoid content. In 6-hour ring-stage survival assays, extracts did not show robust superiority to artemisinin derivatives in the resistant background; differences narrowed at 8 hours and were no longer detectable after 24 hours. Pooled malaria-exposed sera also inhibited parasite growth, but the study did not demonstrate a serum–botanical interaction or identify a non-artemisinin terpene. This is therefore a stage-, strain-, and exposure-qualified artemisinin-centered matrix result, not proof of generic terpene synergy, host-mediated efficacy, or clinical transmission control</w:t>
+      </w:r>
+      <w:r>
+        <w:t xml:space="preserve"> </w:t>
+      </w:r>
+      <w:r>
+        <w:t xml:space="preserve">(Gruessner and Weathers 2021)</w:t>
       </w:r>
       <w:r>
         <w:t xml:space="preserve">.</w:t>

</xml_diff>

<commit_message>
Clarify coccidiosis host-response evidence
</commit_message>
<xml_diff>
--- a/manuscript/artemisia-terpene-review-submission.docx
+++ b/manuscript/artemisia-terpene-review-submission.docx
@@ -3174,7 +3174,7 @@
         <w:t xml:space="preserve"> </w:t>
       </w:r>
       <w:r>
-        <w:t xml:space="preserve">(Jiao et al. 2025)</w:t>
+        <w:t xml:space="preserve">(B. Jiao et al. 2025)</w:t>
       </w:r>
       <w:r>
         <w:t xml:space="preserve">. This enables phylogeny-stratified selection of</w:t>
@@ -5964,6 +5964,40 @@
         <w:spacing w:before="0" w:after="120" w:line="264" w:lineRule="auto"/>
       </w:pPr>
       <w:r>
+        <w:t xml:space="preserve">A complementary PubMed-indexed</w:t>
+      </w:r>
+      <w:r>
+        <w:t xml:space="preserve"> </w:t>
+      </w:r>
+      <w:r>
+        <w:rPr>
+          <w:i/>
+          <w:iCs/>
+        </w:rPr>
+        <w:t xml:space="preserve">E. tenella</w:t>
+      </w:r>
+      <w:r>
+        <w:t xml:space="preserve"> </w:t>
+      </w:r>
+      <w:r>
+        <w:t xml:space="preserve">study supports a host-response hypothesis but remains chemically unresolved. Its abstract reports cecal measurements at 60, 120, and 192 hours post-infection: artemisinin and dried leaves altered Bcl-2, Bax, and cleaved-caspase-3 patterns, artemisinin reduced NF-kB and IL-17A signals, and leaf treatment produced stronger clinical and pathological improvement than artemisinin. The full-text dose and design details remain open, so these observations support a veterinary host-response comparator rather than direct parasite-protein engagement, a defined leaf constituent, or human malaria translation</w:t>
+      </w:r>
+      <w:r>
+        <w:t xml:space="preserve"> </w:t>
+      </w:r>
+      <w:r>
+        <w:t xml:space="preserve">(J. Jiao et al. 2018)</w:t>
+      </w:r>
+      <w:r>
+        <w:t xml:space="preserve">.</w:t>
+      </w:r>
+    </w:p>
+    <w:p>
+      <w:pPr>
+        <w:pStyle w:val="BodyText"/>
+        <w:spacing w:before="0" w:after="120" w:line="264" w:lineRule="auto"/>
+      </w:pPr>
+      <w:r>
         <w:t xml:space="preserve">Full-text verification of a Zimbabwean</w:t>
       </w:r>
       <w:r>
@@ -12118,7 +12152,7 @@
     <w:bookmarkEnd w:id="47"/>
     <w:bookmarkEnd w:id="48"/>
     <w:bookmarkEnd w:id="49"/>
-    <w:bookmarkStart w:id="331" w:name="references"/>
+    <w:bookmarkStart w:id="333" w:name="references"/>
     <w:p>
       <w:pPr>
         <w:pStyle w:val="Heading1"/>
@@ -12128,7 +12162,7 @@
         <w:t xml:space="preserve">References</w:t>
       </w:r>
     </w:p>
-    <w:bookmarkStart w:id="330" w:name="refs"/>
+    <w:bookmarkStart w:id="332" w:name="refs"/>
     <w:bookmarkStart w:id="51" w:name="ref-abad2012artemisia"/>
     <w:p>
       <w:pPr>
@@ -15510,13 +15544,84 @@
       </w:r>
     </w:p>
     <w:bookmarkEnd w:id="161"/>
-    <w:bookmarkStart w:id="163" w:name="ref-judzentiene2016vulgaris"/>
+    <w:bookmarkStart w:id="163" w:name="ref-jiao2018eimeria"/>
     <w:p>
       <w:pPr>
         <w:pStyle w:val="Bibliography"/>
         <w:spacing w:before="0" w:after="120" w:line="264" w:lineRule="auto"/>
       </w:pPr>
       <w:r>
+        <w:t xml:space="preserve">Jiao, JinYing, YunQiao Yang, MingJiang Liu, JinGui Li, Yi Cui, ShaoJie Yin, and JianPing Tao. 2018.</w:t>
+      </w:r>
+      <w:r>
+        <w:t xml:space="preserve"> </w:t>
+      </w:r>
+      <w:r>
+        <w:t xml:space="preserve">“Artemisinin and</w:t>
+      </w:r>
+      <w:r>
+        <w:t xml:space="preserve"> </w:t>
+      </w:r>
+      <w:r>
+        <w:t xml:space="preserve">Artemisia annua</w:t>
+      </w:r>
+      <w:r>
+        <w:t xml:space="preserve"> </w:t>
+      </w:r>
+      <w:r>
+        <w:t xml:space="preserve">Leaves Alleviate</w:t>
+      </w:r>
+      <w:r>
+        <w:t xml:space="preserve"> </w:t>
+      </w:r>
+      <w:r>
+        <w:t xml:space="preserve">Eimeria tenella</w:t>
+      </w:r>
+      <w:r>
+        <w:t xml:space="preserve"> </w:t>
+      </w:r>
+      <w:r>
+        <w:t xml:space="preserve">Infection by Facilitating Apoptosis of Host Cells and Suppressing Inflammatory Response.”</w:t>
+      </w:r>
+      <w:r>
+        <w:t xml:space="preserve"> </w:t>
+      </w:r>
+      <w:r>
+        <w:rPr>
+          <w:i/>
+          <w:iCs/>
+        </w:rPr>
+        <w:t xml:space="preserve">Veterinary Parasitology</w:t>
+      </w:r>
+      <w:r>
+        <w:t xml:space="preserve"> </w:t>
+      </w:r>
+      <w:r>
+        <w:t xml:space="preserve">254: 172–77.</w:t>
+      </w:r>
+      <w:r>
+        <w:t xml:space="preserve"> </w:t>
+      </w:r>
+      <w:hyperlink r:id="rId162">
+        <w:r>
+          <w:rPr>
+            <w:rStyle w:val="Hyperlink"/>
+          </w:rPr>
+          <w:t xml:space="preserve">https://doi.org/10.1016/j.vetpar.2018.03.017</w:t>
+        </w:r>
+      </w:hyperlink>
+      <w:r>
+        <w:t xml:space="preserve">.</w:t>
+      </w:r>
+    </w:p>
+    <w:bookmarkEnd w:id="163"/>
+    <w:bookmarkStart w:id="165" w:name="ref-judzentiene2016vulgaris"/>
+    <w:p>
+      <w:pPr>
+        <w:pStyle w:val="Bibliography"/>
+        <w:spacing w:before="0" w:after="120" w:line="264" w:lineRule="auto"/>
+      </w:pPr>
+      <w:r>
         <w:t xml:space="preserve">Judzentiene, Asta, and Rasa Garjonyte. 2016.</w:t>
       </w:r>
       <w:r>
@@ -15525,7 +15630,7 @@
       <w:r>
         <w:t xml:space="preserve">“</w:t>
       </w:r>
-      <w:hyperlink r:id="rId162">
+      <w:hyperlink r:id="rId164">
         <w:r>
           <w:rPr>
             <w:rStyle w:val="Hyperlink"/>
@@ -15565,8 +15670,8 @@
         <w:t xml:space="preserve">11 (9): 1353–56.</w:t>
       </w:r>
     </w:p>
-    <w:bookmarkEnd w:id="163"/>
-    <w:bookmarkStart w:id="165" w:name="ref-kane2022cyp450"/>
+    <w:bookmarkEnd w:id="165"/>
+    <w:bookmarkStart w:id="167" w:name="ref-kane2022cyp450"/>
     <w:p>
       <w:pPr>
         <w:pStyle w:val="Bibliography"/>
@@ -15621,7 +15726,7 @@
       <w:r>
         <w:t xml:space="preserve"> </w:t>
       </w:r>
-      <w:hyperlink r:id="rId164">
+      <w:hyperlink r:id="rId166">
         <w:r>
           <w:rPr>
             <w:rStyle w:val="Hyperlink"/>
@@ -15633,8 +15738,8 @@
         <w:t xml:space="preserve">.</w:t>
       </w:r>
     </w:p>
-    <w:bookmarkEnd w:id="165"/>
-    <w:bookmarkStart w:id="167" w:name="ref-khan2015artemisia_nematodes"/>
+    <w:bookmarkEnd w:id="167"/>
+    <w:bookmarkStart w:id="169" w:name="ref-khan2015artemisia_nematodes"/>
     <w:p>
       <w:pPr>
         <w:pStyle w:val="Bibliography"/>
@@ -15649,7 +15754,7 @@
       <w:r>
         <w:t xml:space="preserve">“</w:t>
       </w:r>
-      <w:hyperlink r:id="rId166">
+      <w:hyperlink r:id="rId168">
         <w:r>
           <w:rPr>
             <w:rStyle w:val="Hyperlink"/>
@@ -15701,8 +15806,8 @@
         <w:t xml:space="preserve">32 (2): 257–68.</w:t>
       </w:r>
     </w:p>
-    <w:bookmarkEnd w:id="167"/>
-    <w:bookmarkStart w:id="169" w:name="ref-kunnathattil2025vulgaris"/>
+    <w:bookmarkEnd w:id="169"/>
+    <w:bookmarkStart w:id="171" w:name="ref-kunnathattil2025vulgaris"/>
     <w:p>
       <w:pPr>
         <w:pStyle w:val="Bibliography"/>
@@ -15760,7 +15865,7 @@
       <w:r>
         <w:t xml:space="preserve"> </w:t>
       </w:r>
-      <w:hyperlink r:id="rId168">
+      <w:hyperlink r:id="rId170">
         <w:r>
           <w:rPr>
             <w:rStyle w:val="Hyperlink"/>
@@ -15772,8 +15877,8 @@
         <w:t xml:space="preserve">.</w:t>
       </w:r>
     </w:p>
-    <w:bookmarkEnd w:id="169"/>
-    <w:bookmarkStart w:id="171" w:name="ref-li2018naturalcombination"/>
+    <w:bookmarkEnd w:id="171"/>
+    <w:bookmarkStart w:id="173" w:name="ref-li2018naturalcombination"/>
     <w:p>
       <w:pPr>
         <w:pStyle w:val="Bibliography"/>
@@ -15819,7 +15924,7 @@
       <w:r>
         <w:t xml:space="preserve"> </w:t>
       </w:r>
-      <w:hyperlink r:id="rId170">
+      <w:hyperlink r:id="rId172">
         <w:r>
           <w:rPr>
             <w:rStyle w:val="Hyperlink"/>
@@ -15831,8 +15936,8 @@
         <w:t xml:space="preserve">.</w:t>
       </w:r>
     </w:p>
-    <w:bookmarkEnd w:id="171"/>
-    <w:bookmarkStart w:id="173" w:name="ref-li2008sphaerocephalasaponin"/>
+    <w:bookmarkEnd w:id="173"/>
+    <w:bookmarkStart w:id="175" w:name="ref-li2008sphaerocephalasaponin"/>
     <w:p>
       <w:pPr>
         <w:pStyle w:val="Bibliography"/>
@@ -15875,7 +15980,7 @@
       <w:r>
         <w:t xml:space="preserve"> </w:t>
       </w:r>
-      <w:hyperlink r:id="rId172">
+      <w:hyperlink r:id="rId174">
         <w:r>
           <w:rPr>
             <w:rStyle w:val="Hyperlink"/>
@@ -15887,8 +15992,8 @@
         <w:t xml:space="preserve">.</w:t>
       </w:r>
     </w:p>
-    <w:bookmarkEnd w:id="173"/>
-    <w:bookmarkStart w:id="175" w:name="ref-li1990sacrorumditerpene"/>
+    <w:bookmarkEnd w:id="175"/>
+    <w:bookmarkStart w:id="177" w:name="ref-li1990sacrorumditerpene"/>
     <w:p>
       <w:pPr>
         <w:pStyle w:val="Bibliography"/>
@@ -15931,7 +16036,7 @@
       <w:r>
         <w:t xml:space="preserve"> </w:t>
       </w:r>
-      <w:hyperlink r:id="rId174">
+      <w:hyperlink r:id="rId176">
         <w:r>
           <w:rPr>
             <w:rStyle w:val="Hyperlink"/>
@@ -15943,8 +16048,8 @@
         <w:t xml:space="preserve">.</w:t>
       </w:r>
     </w:p>
-    <w:bookmarkEnd w:id="175"/>
-    <w:bookmarkStart w:id="177" w:name="ref-liu2026osc"/>
+    <w:bookmarkEnd w:id="177"/>
+    <w:bookmarkStart w:id="179" w:name="ref-liu2026osc"/>
     <w:p>
       <w:pPr>
         <w:pStyle w:val="Bibliography"/>
@@ -15990,7 +16095,7 @@
       <w:r>
         <w:t xml:space="preserve"> </w:t>
       </w:r>
-      <w:hyperlink r:id="rId176">
+      <w:hyperlink r:id="rId178">
         <w:r>
           <w:rPr>
             <w:rStyle w:val="Hyperlink"/>
@@ -16002,8 +16107,8 @@
         <w:t xml:space="preserve">.</w:t>
       </w:r>
     </w:p>
-    <w:bookmarkEnd w:id="177"/>
-    <w:bookmarkStart w:id="179" w:name="ref-liu2022vulgaristerpenoids"/>
+    <w:bookmarkEnd w:id="179"/>
+    <w:bookmarkStart w:id="181" w:name="ref-liu2022vulgaristerpenoids"/>
     <w:p>
       <w:pPr>
         <w:pStyle w:val="Bibliography"/>
@@ -16049,7 +16154,7 @@
       <w:r>
         <w:t xml:space="preserve"> </w:t>
       </w:r>
-      <w:hyperlink r:id="rId178">
+      <w:hyperlink r:id="rId180">
         <w:r>
           <w:rPr>
             <w:rStyle w:val="Hyperlink"/>
@@ -16061,8 +16166,8 @@
         <w:t xml:space="preserve">.</w:t>
       </w:r>
     </w:p>
-    <w:bookmarkEnd w:id="179"/>
-    <w:bookmarkStart w:id="181" w:name="ref-lu2013aora"/>
+    <w:bookmarkEnd w:id="181"/>
+    <w:bookmarkStart w:id="183" w:name="ref-lu2013aora"/>
     <w:p>
       <w:pPr>
         <w:pStyle w:val="Bibliography"/>
@@ -16120,7 +16225,7 @@
       <w:r>
         <w:t xml:space="preserve"> </w:t>
       </w:r>
-      <w:hyperlink r:id="rId180">
+      <w:hyperlink r:id="rId182">
         <w:r>
           <w:rPr>
             <w:rStyle w:val="Hyperlink"/>
@@ -16132,8 +16237,8 @@
         <w:t xml:space="preserve">.</w:t>
       </w:r>
     </w:p>
-    <w:bookmarkEnd w:id="181"/>
-    <w:bookmarkStart w:id="183" w:name="ref-lv2016nac1"/>
+    <w:bookmarkEnd w:id="183"/>
+    <w:bookmarkStart w:id="185" w:name="ref-lv2016nac1"/>
     <w:p>
       <w:pPr>
         <w:pStyle w:val="Bibliography"/>
@@ -16194,7 +16299,7 @@
       <w:r>
         <w:t xml:space="preserve"> </w:t>
       </w:r>
-      <w:hyperlink r:id="rId182">
+      <w:hyperlink r:id="rId184">
         <w:r>
           <w:rPr>
             <w:rStyle w:val="Hyperlink"/>
@@ -16206,8 +16311,8 @@
         <w:t xml:space="preserve">.</w:t>
       </w:r>
     </w:p>
-    <w:bookmarkEnd w:id="183"/>
-    <w:bookmarkStart w:id="185" w:name="ref-ma2001caruifolia"/>
+    <w:bookmarkEnd w:id="185"/>
+    <w:bookmarkStart w:id="187" w:name="ref-ma2001caruifolia"/>
     <w:p>
       <w:pPr>
         <w:pStyle w:val="Bibliography"/>
@@ -16241,7 +16346,7 @@
       <w:r>
         <w:t xml:space="preserve"> </w:t>
       </w:r>
-      <w:hyperlink r:id="rId184">
+      <w:hyperlink r:id="rId186">
         <w:r>
           <w:rPr>
             <w:rStyle w:val="Hyperlink"/>
@@ -16253,8 +16358,8 @@
         <w:t xml:space="preserve">.</w:t>
       </w:r>
     </w:p>
-    <w:bookmarkEnd w:id="185"/>
-    <w:bookmarkStart w:id="187" w:name="ref-mamede2025metabolite"/>
+    <w:bookmarkEnd w:id="187"/>
+    <w:bookmarkStart w:id="189" w:name="ref-mamede2025metabolite"/>
     <w:p>
       <w:pPr>
         <w:pStyle w:val="Bibliography"/>
@@ -16321,7 +16426,7 @@
       <w:r>
         <w:t xml:space="preserve"> </w:t>
       </w:r>
-      <w:hyperlink r:id="rId186">
+      <w:hyperlink r:id="rId188">
         <w:r>
           <w:rPr>
             <w:rStyle w:val="Hyperlink"/>
@@ -16333,8 +16438,8 @@
         <w:t xml:space="preserve">.</w:t>
       </w:r>
     </w:p>
-    <w:bookmarkEnd w:id="187"/>
-    <w:bookmarkStart w:id="189" w:name="ref-martinezdiaz2015absinthiumtrypano"/>
+    <w:bookmarkEnd w:id="189"/>
+    <w:bookmarkStart w:id="191" w:name="ref-martinezdiaz2015absinthiumtrypano"/>
     <w:p>
       <w:pPr>
         <w:pStyle w:val="Bibliography"/>
@@ -16368,7 +16473,7 @@
       <w:r>
         <w:t xml:space="preserve"> </w:t>
       </w:r>
-      <w:hyperlink r:id="rId188">
+      <w:hyperlink r:id="rId190">
         <w:r>
           <w:rPr>
             <w:rStyle w:val="Hyperlink"/>
@@ -16380,8 +16485,8 @@
         <w:t xml:space="preserve">.</w:t>
       </w:r>
     </w:p>
-    <w:bookmarkEnd w:id="189"/>
-    <w:bookmarkStart w:id="191" w:name="ref-ming2025argyidrying"/>
+    <w:bookmarkEnd w:id="191"/>
+    <w:bookmarkStart w:id="193" w:name="ref-ming2025argyidrying"/>
     <w:p>
       <w:pPr>
         <w:pStyle w:val="Bibliography"/>
@@ -16424,7 +16529,7 @@
       <w:r>
         <w:t xml:space="preserve"> </w:t>
       </w:r>
-      <w:hyperlink r:id="rId190">
+      <w:hyperlink r:id="rId192">
         <w:r>
           <w:rPr>
             <w:rStyle w:val="Hyperlink"/>
@@ -16436,8 +16541,8 @@
         <w:t xml:space="preserve">.</w:t>
       </w:r>
     </w:p>
-    <w:bookmarkEnd w:id="191"/>
-    <w:bookmarkStart w:id="193" w:name="ref-mohammed2026monospermadrying"/>
+    <w:bookmarkEnd w:id="193"/>
+    <w:bookmarkStart w:id="195" w:name="ref-mohammed2026monospermadrying"/>
     <w:p>
       <w:pPr>
         <w:pStyle w:val="Bibliography"/>
@@ -16490,7 +16595,7 @@
       <w:r>
         <w:t xml:space="preserve"> </w:t>
       </w:r>
-      <w:hyperlink r:id="rId192">
+      <w:hyperlink r:id="rId194">
         <w:r>
           <w:rPr>
             <w:rStyle w:val="Hyperlink"/>
@@ -16502,8 +16607,8 @@
         <w:t xml:space="preserve">.</w:t>
       </w:r>
     </w:p>
-    <w:bookmarkEnd w:id="193"/>
-    <w:bookmarkStart w:id="195" w:name="ref-mojarrab2015extracts"/>
+    <w:bookmarkEnd w:id="195"/>
+    <w:bookmarkStart w:id="197" w:name="ref-mojarrab2015extracts"/>
     <w:p>
       <w:pPr>
         <w:pStyle w:val="Bibliography"/>
@@ -16549,7 +16654,7 @@
       <w:r>
         <w:t xml:space="preserve"> </w:t>
       </w:r>
-      <w:hyperlink r:id="rId194">
+      <w:hyperlink r:id="rId196">
         <w:r>
           <w:rPr>
             <w:rStyle w:val="Hyperlink"/>
@@ -16561,8 +16666,8 @@
         <w:t xml:space="preserve">.</w:t>
       </w:r>
     </w:p>
-    <w:bookmarkEnd w:id="195"/>
-    <w:bookmarkStart w:id="197" w:name="ref-mojarrab2014fractionation"/>
+    <w:bookmarkEnd w:id="197"/>
+    <w:bookmarkStart w:id="199" w:name="ref-mojarrab2014fractionation"/>
     <w:p>
       <w:pPr>
         <w:pStyle w:val="Bibliography"/>
@@ -16620,7 +16725,7 @@
       <w:r>
         <w:t xml:space="preserve"> </w:t>
       </w:r>
-      <w:hyperlink r:id="rId196">
+      <w:hyperlink r:id="rId198">
         <w:r>
           <w:rPr>
             <w:rStyle w:val="Hyperlink"/>
@@ -16632,8 +16737,8 @@
         <w:t xml:space="preserve">.</w:t>
       </w:r>
     </w:p>
-    <w:bookmarkEnd w:id="197"/>
-    <w:bookmarkStart w:id="199" w:name="ref-monzote2014absinthium"/>
+    <w:bookmarkEnd w:id="199"/>
+    <w:bookmarkStart w:id="201" w:name="ref-monzote2014absinthium"/>
     <w:p>
       <w:pPr>
         <w:pStyle w:val="Bibliography"/>
@@ -16667,7 +16772,7 @@
       <w:r>
         <w:t xml:space="preserve"> </w:t>
       </w:r>
-      <w:hyperlink r:id="rId198">
+      <w:hyperlink r:id="rId200">
         <w:r>
           <w:rPr>
             <w:rStyle w:val="Hyperlink"/>
@@ -16679,8 +16784,8 @@
         <w:t xml:space="preserve">.</w:t>
       </w:r>
     </w:p>
-    <w:bookmarkEnd w:id="199"/>
-    <w:bookmarkStart w:id="201" w:name="ref-morua2025standardizedannua"/>
+    <w:bookmarkEnd w:id="201"/>
+    <w:bookmarkStart w:id="203" w:name="ref-morua2025standardizedannua"/>
     <w:p>
       <w:pPr>
         <w:pStyle w:val="Bibliography"/>
@@ -16726,7 +16831,7 @@
       <w:r>
         <w:t xml:space="preserve"> </w:t>
       </w:r>
-      <w:hyperlink r:id="rId200">
+      <w:hyperlink r:id="rId202">
         <w:r>
           <w:rPr>
             <w:rStyle w:val="Hyperlink"/>
@@ -16738,8 +16843,8 @@
         <w:t xml:space="preserve">.</w:t>
       </w:r>
     </w:p>
-    <w:bookmarkEnd w:id="201"/>
-    <w:bookmarkStart w:id="203" w:name="ref-annua2015triterpenes"/>
+    <w:bookmarkEnd w:id="203"/>
+    <w:bookmarkStart w:id="205" w:name="ref-annua2015triterpenes"/>
     <w:p>
       <w:pPr>
         <w:pStyle w:val="Bibliography"/>
@@ -16773,7 +16878,7 @@
       <w:r>
         <w:t xml:space="preserve"> </w:t>
       </w:r>
-      <w:hyperlink r:id="rId202">
+      <w:hyperlink r:id="rId204">
         <w:r>
           <w:rPr>
             <w:rStyle w:val="Hyperlink"/>
@@ -16785,8 +16890,8 @@
         <w:t xml:space="preserve">.</w:t>
       </w:r>
     </w:p>
-    <w:bookmarkEnd w:id="203"/>
-    <w:bookmarkStart w:id="205" w:name="ref-mouton2013artemisininonly"/>
+    <w:bookmarkEnd w:id="205"/>
+    <w:bookmarkStart w:id="207" w:name="ref-mouton2013artemisininonly"/>
     <w:p>
       <w:pPr>
         <w:pStyle w:val="Bibliography"/>
@@ -16832,7 +16937,7 @@
       <w:r>
         <w:t xml:space="preserve"> </w:t>
       </w:r>
-      <w:hyperlink r:id="rId204">
+      <w:hyperlink r:id="rId206">
         <w:r>
           <w:rPr>
             <w:rStyle w:val="Hyperlink"/>
@@ -16844,8 +16949,8 @@
         <w:t xml:space="preserve">.</w:t>
       </w:r>
     </w:p>
-    <w:bookmarkEnd w:id="205"/>
-    <w:bookmarkStart w:id="207" w:name="ref-mravcakova2020wormwood"/>
+    <w:bookmarkEnd w:id="207"/>
+    <w:bookmarkStart w:id="209" w:name="ref-mravcakova2020wormwood"/>
     <w:p>
       <w:pPr>
         <w:pStyle w:val="Bibliography"/>
@@ -16879,7 +16984,7 @@
       <w:r>
         <w:t xml:space="preserve"> </w:t>
       </w:r>
-      <w:hyperlink r:id="rId206">
+      <w:hyperlink r:id="rId208">
         <w:r>
           <w:rPr>
             <w:rStyle w:val="Hyperlink"/>
@@ -16891,8 +16996,8 @@
         <w:t xml:space="preserve">.</w:t>
       </w:r>
     </w:p>
-    <w:bookmarkEnd w:id="207"/>
-    <w:bookmarkStart w:id="209" w:name="ref-nahrevanian2010khorassanica"/>
+    <w:bookmarkEnd w:id="209"/>
+    <w:bookmarkStart w:id="211" w:name="ref-nahrevanian2010khorassanica"/>
     <w:p>
       <w:pPr>
         <w:pStyle w:val="Bibliography"/>
@@ -16926,7 +17031,7 @@
       <w:r>
         <w:t xml:space="preserve"> </w:t>
       </w:r>
-      <w:hyperlink r:id="rId208">
+      <w:hyperlink r:id="rId210">
         <w:r>
           <w:rPr>
             <w:rStyle w:val="Hyperlink"/>
@@ -16938,8 +17043,8 @@
         <w:t xml:space="preserve">.</w:t>
       </w:r>
     </w:p>
-    <w:bookmarkEnd w:id="209"/>
-    <w:bookmarkStart w:id="211" w:name="ref-nahrevanian2012sieberi"/>
+    <w:bookmarkEnd w:id="211"/>
+    <w:bookmarkStart w:id="213" w:name="ref-nahrevanian2012sieberi"/>
     <w:p>
       <w:pPr>
         <w:pStyle w:val="Bibliography"/>
@@ -16973,7 +17078,7 @@
       <w:r>
         <w:t xml:space="preserve"> </w:t>
       </w:r>
-      <w:hyperlink r:id="rId210">
+      <w:hyperlink r:id="rId212">
         <w:r>
           <w:rPr>
             <w:rStyle w:val="Hyperlink"/>
@@ -16985,8 +17090,8 @@
         <w:t xml:space="preserve">.</w:t>
       </w:r>
     </w:p>
-    <w:bookmarkEnd w:id="211"/>
-    <w:bookmarkStart w:id="213" w:name="ref-nomani2022h2s"/>
+    <w:bookmarkEnd w:id="213"/>
+    <w:bookmarkStart w:id="215" w:name="ref-nomani2022h2s"/>
     <w:p>
       <w:pPr>
         <w:pStyle w:val="Bibliography"/>
@@ -17032,7 +17137,7 @@
       <w:r>
         <w:t xml:space="preserve"> </w:t>
       </w:r>
-      <w:hyperlink r:id="rId212">
+      <w:hyperlink r:id="rId214">
         <w:r>
           <w:rPr>
             <w:rStyle w:val="Hyperlink"/>
@@ -17044,8 +17149,8 @@
         <w:t xml:space="preserve">.</w:t>
       </w:r>
     </w:p>
-    <w:bookmarkEnd w:id="213"/>
-    <w:bookmarkStart w:id="215" w:name="ref-nurlaelasari2023vulgarisfasciola"/>
+    <w:bookmarkEnd w:id="215"/>
+    <w:bookmarkStart w:id="217" w:name="ref-nurlaelasari2023vulgarisfasciola"/>
     <w:p>
       <w:pPr>
         <w:pStyle w:val="Bibliography"/>
@@ -17100,7 +17205,7 @@
       <w:r>
         <w:t xml:space="preserve"> </w:t>
       </w:r>
-      <w:hyperlink r:id="rId214">
+      <w:hyperlink r:id="rId216">
         <w:r>
           <w:rPr>
             <w:rStyle w:val="Hyperlink"/>
@@ -17112,8 +17217,8 @@
         <w:t xml:space="preserve">.</w:t>
       </w:r>
     </w:p>
-    <w:bookmarkEnd w:id="215"/>
-    <w:bookmarkStart w:id="217" w:name="ref-olofsson2011tissue"/>
+    <w:bookmarkEnd w:id="217"/>
+    <w:bookmarkStart w:id="219" w:name="ref-olofsson2011tissue"/>
     <w:p>
       <w:pPr>
         <w:pStyle w:val="Bibliography"/>
@@ -17147,7 +17252,7 @@
       <w:r>
         <w:t xml:space="preserve"> </w:t>
       </w:r>
-      <w:hyperlink r:id="rId216">
+      <w:hyperlink r:id="rId218">
         <w:r>
           <w:rPr>
             <w:rStyle w:val="Hyperlink"/>
@@ -17159,8 +17264,8 @@
         <w:t xml:space="preserve">.</w:t>
       </w:r>
     </w:p>
-    <w:bookmarkEnd w:id="217"/>
-    <w:bookmarkStart w:id="219" w:name="ref-olsson2009localization"/>
+    <w:bookmarkEnd w:id="219"/>
+    <w:bookmarkStart w:id="221" w:name="ref-olsson2009localization"/>
     <w:p>
       <w:pPr>
         <w:pStyle w:val="Bibliography"/>
@@ -17194,7 +17299,7 @@
       <w:r>
         <w:t xml:space="preserve"> </w:t>
       </w:r>
-      <w:hyperlink r:id="rId218">
+      <w:hyperlink r:id="rId220">
         <w:r>
           <w:rPr>
             <w:rStyle w:val="Hyperlink"/>
@@ -17206,8 +17311,8 @@
         <w:t xml:space="preserve">.</w:t>
       </w:r>
     </w:p>
-    <w:bookmarkEnd w:id="219"/>
-    <w:bookmarkStart w:id="221" w:name="ref-ongo2019campestriscomment"/>
+    <w:bookmarkEnd w:id="221"/>
+    <w:bookmarkStart w:id="223" w:name="ref-ongo2019campestriscomment"/>
     <w:p>
       <w:pPr>
         <w:pStyle w:val="Bibliography"/>
@@ -17262,7 +17367,7 @@
       <w:r>
         <w:t xml:space="preserve"> </w:t>
       </w:r>
-      <w:hyperlink r:id="rId220">
+      <w:hyperlink r:id="rId222">
         <w:r>
           <w:rPr>
             <w:rStyle w:val="Hyperlink"/>
@@ -17274,8 +17379,8 @@
         <w:t xml:space="preserve">.</w:t>
       </w:r>
     </w:p>
-    <w:bookmarkEnd w:id="221"/>
-    <w:bookmarkStart w:id="223" w:name="ref-ortet2008gorgonum"/>
+    <w:bookmarkEnd w:id="223"/>
+    <w:bookmarkStart w:id="225" w:name="ref-ortet2008gorgonum"/>
     <w:p>
       <w:pPr>
         <w:pStyle w:val="Bibliography"/>
@@ -17309,7 +17414,7 @@
       <w:r>
         <w:t xml:space="preserve"> </w:t>
       </w:r>
-      <w:hyperlink r:id="rId222">
+      <w:hyperlink r:id="rId224">
         <w:r>
           <w:rPr>
             <w:rStyle w:val="Hyperlink"/>
@@ -17321,8 +17426,8 @@
         <w:t xml:space="preserve">.</w:t>
       </w:r>
     </w:p>
-    <w:bookmarkEnd w:id="223"/>
-    <w:bookmarkStart w:id="225" w:name="ref-osanloo2022dracunculusnanogel"/>
+    <w:bookmarkEnd w:id="225"/>
+    <w:bookmarkStart w:id="227" w:name="ref-osanloo2022dracunculusnanogel"/>
     <w:p>
       <w:pPr>
         <w:pStyle w:val="Bibliography"/>
@@ -17368,7 +17473,7 @@
       <w:r>
         <w:t xml:space="preserve"> </w:t>
       </w:r>
-      <w:hyperlink r:id="rId224">
+      <w:hyperlink r:id="rId226">
         <w:r>
           <w:rPr>
             <w:rStyle w:val="Hyperlink"/>
@@ -17380,8 +17485,8 @@
         <w:t xml:space="preserve">.</w:t>
       </w:r>
     </w:p>
-    <w:bookmarkEnd w:id="225"/>
-    <w:bookmarkStart w:id="227" w:name="ref-oyedeji2009afra"/>
+    <w:bookmarkEnd w:id="227"/>
+    <w:bookmarkStart w:id="229" w:name="ref-oyedeji2009afra"/>
     <w:p>
       <w:pPr>
         <w:pStyle w:val="Bibliography"/>
@@ -17415,7 +17520,7 @@
       <w:r>
         <w:t xml:space="preserve"> </w:t>
       </w:r>
-      <w:hyperlink r:id="rId226">
+      <w:hyperlink r:id="rId228">
         <w:r>
           <w:rPr>
             <w:rStyle w:val="Hyperlink"/>
@@ -17427,8 +17532,8 @@
         <w:t xml:space="preserve">.</w:t>
       </w:r>
     </w:p>
-    <w:bookmarkEnd w:id="227"/>
-    <w:bookmarkStart w:id="229" w:name="ref-pandey2017artemisiaoils"/>
+    <w:bookmarkEnd w:id="229"/>
+    <w:bookmarkStart w:id="231" w:name="ref-pandey2017artemisiaoils"/>
     <w:p>
       <w:pPr>
         <w:pStyle w:val="Bibliography"/>
@@ -17462,7 +17567,7 @@
       <w:r>
         <w:t xml:space="preserve"> </w:t>
       </w:r>
-      <w:hyperlink r:id="rId228">
+      <w:hyperlink r:id="rId230">
         <w:r>
           <w:rPr>
             <w:rStyle w:val="Hyperlink"/>
@@ -17474,8 +17579,8 @@
         <w:t xml:space="preserve">.</w:t>
       </w:r>
     </w:p>
-    <w:bookmarkEnd w:id="229"/>
-    <w:bookmarkStart w:id="231" w:name="ref-parveen2024scoparia"/>
+    <w:bookmarkEnd w:id="231"/>
+    <w:bookmarkStart w:id="233" w:name="ref-parveen2024scoparia"/>
     <w:p>
       <w:pPr>
         <w:pStyle w:val="Bibliography"/>
@@ -17521,7 +17626,7 @@
       <w:r>
         <w:t xml:space="preserve"> </w:t>
       </w:r>
-      <w:hyperlink r:id="rId230">
+      <w:hyperlink r:id="rId232">
         <w:r>
           <w:rPr>
             <w:rStyle w:val="Hyperlink"/>
@@ -17533,8 +17638,8 @@
         <w:t xml:space="preserve">.</w:t>
       </w:r>
     </w:p>
-    <w:bookmarkEnd w:id="231"/>
-    <w:bookmarkStart w:id="233" w:name="ref-paul2010recurrent"/>
+    <w:bookmarkEnd w:id="233"/>
+    <w:bookmarkStart w:id="235" w:name="ref-paul2010recurrent"/>
     <w:p>
       <w:pPr>
         <w:pStyle w:val="Bibliography"/>
@@ -17580,7 +17685,7 @@
       <w:r>
         <w:t xml:space="preserve"> </w:t>
       </w:r>
-      <w:hyperlink r:id="rId232">
+      <w:hyperlink r:id="rId234">
         <w:r>
           <w:rPr>
             <w:rStyle w:val="Hyperlink"/>
@@ -17592,8 +17697,8 @@
         <w:t xml:space="preserve">.</w:t>
       </w:r>
     </w:p>
-    <w:bookmarkEnd w:id="233"/>
-    <w:bookmarkStart w:id="235" w:name="ref-pirali2011tick"/>
+    <w:bookmarkEnd w:id="235"/>
+    <w:bookmarkStart w:id="237" w:name="ref-pirali2011tick"/>
     <w:p>
       <w:pPr>
         <w:pStyle w:val="Bibliography"/>
@@ -17651,7 +17756,7 @@
       <w:r>
         <w:t xml:space="preserve"> </w:t>
       </w:r>
-      <w:hyperlink r:id="rId234">
+      <w:hyperlink r:id="rId236">
         <w:r>
           <w:rPr>
             <w:rStyle w:val="Hyperlink"/>
@@ -17663,8 +17768,8 @@
         <w:t xml:space="preserve">.</w:t>
       </w:r>
     </w:p>
-    <w:bookmarkEnd w:id="235"/>
-    <w:bookmarkStart w:id="237" w:name="ref-radulovic2013toxic"/>
+    <w:bookmarkEnd w:id="237"/>
+    <w:bookmarkStart w:id="239" w:name="ref-radulovic2013toxic"/>
     <w:p>
       <w:pPr>
         <w:pStyle w:val="Bibliography"/>
@@ -17698,7 +17803,7 @@
       <w:r>
         <w:t xml:space="preserve"> </w:t>
       </w:r>
-      <w:hyperlink r:id="rId236">
+      <w:hyperlink r:id="rId238">
         <w:r>
           <w:rPr>
             <w:rStyle w:val="Hyperlink"/>
@@ -17710,8 +17815,8 @@
         <w:t xml:space="preserve">.</w:t>
       </w:r>
     </w:p>
-    <w:bookmarkEnd w:id="237"/>
-    <w:bookmarkStart w:id="239" w:name="ref-ram1997density"/>
+    <w:bookmarkEnd w:id="239"/>
+    <w:bookmarkStart w:id="241" w:name="ref-ram1997density"/>
     <w:p>
       <w:pPr>
         <w:pStyle w:val="Bibliography"/>
@@ -17757,7 +17862,7 @@
       <w:r>
         <w:t xml:space="preserve"> </w:t>
       </w:r>
-      <w:hyperlink r:id="rId238">
+      <w:hyperlink r:id="rId240">
         <w:r>
           <w:rPr>
             <w:rStyle w:val="Hyperlink"/>
@@ -17769,8 +17874,8 @@
         <w:t xml:space="preserve">.</w:t>
       </w:r>
     </w:p>
-    <w:bookmarkEnd w:id="239"/>
-    <w:bookmarkStart w:id="241" w:name="ref-ribbiso2021heme"/>
+    <w:bookmarkEnd w:id="241"/>
+    <w:bookmarkStart w:id="243" w:name="ref-ribbiso2021heme"/>
     <w:p>
       <w:pPr>
         <w:pStyle w:val="Bibliography"/>
@@ -17816,7 +17921,7 @@
       <w:r>
         <w:t xml:space="preserve"> </w:t>
       </w:r>
-      <w:hyperlink r:id="rId240">
+      <w:hyperlink r:id="rId242">
         <w:r>
           <w:rPr>
             <w:rStyle w:val="Hyperlink"/>
@@ -17828,8 +17933,8 @@
         <w:t xml:space="preserve">.</w:t>
       </w:r>
     </w:p>
-    <w:bookmarkEnd w:id="241"/>
-    <w:bookmarkStart w:id="243" w:name="ref-rosenthal2024proteostasis"/>
+    <w:bookmarkEnd w:id="243"/>
+    <w:bookmarkStart w:id="245" w:name="ref-rosenthal2024proteostasis"/>
     <w:p>
       <w:pPr>
         <w:pStyle w:val="Bibliography"/>
@@ -17872,7 +17977,7 @@
       <w:r>
         <w:t xml:space="preserve"> </w:t>
       </w:r>
-      <w:hyperlink r:id="rId242">
+      <w:hyperlink r:id="rId244">
         <w:r>
           <w:rPr>
             <w:rStyle w:val="Hyperlink"/>
@@ -17884,8 +17989,8 @@
         <w:t xml:space="preserve">.</w:t>
       </w:r>
     </w:p>
-    <w:bookmarkEnd w:id="243"/>
-    <w:bookmarkStart w:id="245" w:name="ref-rostkowska2016silicon"/>
+    <w:bookmarkEnd w:id="245"/>
+    <w:bookmarkStart w:id="247" w:name="ref-rostkowska2016silicon"/>
     <w:p>
       <w:pPr>
         <w:pStyle w:val="Bibliography"/>
@@ -17943,7 +18048,7 @@
       <w:r>
         <w:t xml:space="preserve"> </w:t>
       </w:r>
-      <w:hyperlink r:id="rId244">
+      <w:hyperlink r:id="rId246">
         <w:r>
           <w:rPr>
             <w:rStyle w:val="Hyperlink"/>
@@ -17955,8 +18060,8 @@
         <w:t xml:space="preserve">.</w:t>
       </w:r>
     </w:p>
-    <w:bookmarkEnd w:id="245"/>
-    <w:bookmarkStart w:id="247" w:name="ref-annua2016monoterpenes"/>
+    <w:bookmarkEnd w:id="247"/>
+    <w:bookmarkStart w:id="249" w:name="ref-annua2016monoterpenes"/>
     <w:p>
       <w:pPr>
         <w:pStyle w:val="Bibliography"/>
@@ -17990,7 +18095,7 @@
       <w:r>
         <w:t xml:space="preserve"> </w:t>
       </w:r>
-      <w:hyperlink r:id="rId246">
+      <w:hyperlink r:id="rId248">
         <w:r>
           <w:rPr>
             <w:rStyle w:val="Hyperlink"/>
@@ -18002,8 +18107,8 @@
         <w:t xml:space="preserve">.</w:t>
       </w:r>
     </w:p>
-    <w:bookmarkEnd w:id="247"/>
-    <w:bookmarkStart w:id="249" w:name="ref-said2016vcd"/>
+    <w:bookmarkEnd w:id="249"/>
+    <w:bookmarkStart w:id="251" w:name="ref-said2016vcd"/>
     <w:p>
       <w:pPr>
         <w:pStyle w:val="Bibliography"/>
@@ -18049,7 +18154,7 @@
       <w:r>
         <w:t xml:space="preserve"> </w:t>
       </w:r>
-      <w:hyperlink r:id="rId248">
+      <w:hyperlink r:id="rId250">
         <w:r>
           <w:rPr>
             <w:rStyle w:val="Hyperlink"/>
@@ -18061,8 +18166,8 @@
         <w:t xml:space="preserve">.</w:t>
       </w:r>
     </w:p>
-    <w:bookmarkEnd w:id="249"/>
-    <w:bookmarkStart w:id="251" w:name="ref-sanei2023nanoliposomes"/>
+    <w:bookmarkEnd w:id="251"/>
+    <w:bookmarkStart w:id="253" w:name="ref-sanei2023nanoliposomes"/>
     <w:p>
       <w:pPr>
         <w:pStyle w:val="Bibliography"/>
@@ -18129,7 +18234,7 @@
       <w:r>
         <w:t xml:space="preserve"> </w:t>
       </w:r>
-      <w:hyperlink r:id="rId250">
+      <w:hyperlink r:id="rId252">
         <w:r>
           <w:rPr>
             <w:rStyle w:val="Hyperlink"/>
@@ -18141,8 +18246,8 @@
         <w:t xml:space="preserve">.</w:t>
       </w:r>
     </w:p>
-    <w:bookmarkEnd w:id="251"/>
-    <w:bookmarkStart w:id="253" w:name="ref-schramek2010isotope"/>
+    <w:bookmarkEnd w:id="253"/>
+    <w:bookmarkStart w:id="255" w:name="ref-schramek2010isotope"/>
     <w:p>
       <w:pPr>
         <w:pStyle w:val="Bibliography"/>
@@ -18176,7 +18281,7 @@
       <w:r>
         <w:t xml:space="preserve"> </w:t>
       </w:r>
-      <w:hyperlink r:id="rId252">
+      <w:hyperlink r:id="rId254">
         <w:r>
           <w:rPr>
             <w:rStyle w:val="Hyperlink"/>
@@ -18188,8 +18293,8 @@
         <w:t xml:space="preserve">.</w:t>
       </w:r>
     </w:p>
-    <w:bookmarkEnd w:id="253"/>
-    <w:bookmarkStart w:id="255" w:name="ref-shen2012cypcpr"/>
+    <w:bookmarkEnd w:id="255"/>
+    <w:bookmarkStart w:id="257" w:name="ref-shen2012cypcpr"/>
     <w:p>
       <w:pPr>
         <w:pStyle w:val="Bibliography"/>
@@ -18247,7 +18352,7 @@
       <w:r>
         <w:t xml:space="preserve"> </w:t>
       </w:r>
-      <w:hyperlink r:id="rId254">
+      <w:hyperlink r:id="rId256">
         <w:r>
           <w:rPr>
             <w:rStyle w:val="Hyperlink"/>
@@ -18259,8 +18364,8 @@
         <w:t xml:space="preserve">.</w:t>
       </w:r>
     </w:p>
-    <w:bookmarkEnd w:id="255"/>
-    <w:bookmarkStart w:id="257" w:name="ref-shi2022annuaantimalarialmetabolomics"/>
+    <w:bookmarkEnd w:id="257"/>
+    <w:bookmarkStart w:id="259" w:name="ref-shi2022annuaantimalarialmetabolomics"/>
     <w:p>
       <w:pPr>
         <w:pStyle w:val="Bibliography"/>
@@ -18306,7 +18411,7 @@
       <w:r>
         <w:t xml:space="preserve"> </w:t>
       </w:r>
-      <w:hyperlink r:id="rId256">
+      <w:hyperlink r:id="rId258">
         <w:r>
           <w:rPr>
             <w:rStyle w:val="Hyperlink"/>
@@ -18318,8 +18423,8 @@
         <w:t xml:space="preserve">.</w:t>
       </w:r>
     </w:p>
-    <w:bookmarkEnd w:id="257"/>
-    <w:bookmarkStart w:id="259" w:name="ref-shi2018mixta1"/>
+    <w:bookmarkEnd w:id="259"/>
+    <w:bookmarkStart w:id="261" w:name="ref-shi2018mixta1"/>
     <w:p>
       <w:pPr>
         <w:pStyle w:val="Bibliography"/>
@@ -18374,7 +18479,7 @@
       <w:r>
         <w:t xml:space="preserve"> </w:t>
       </w:r>
-      <w:hyperlink r:id="rId258">
+      <w:hyperlink r:id="rId260">
         <w:r>
           <w:rPr>
             <w:rStyle w:val="Hyperlink"/>
@@ -18386,8 +18491,8 @@
         <w:t xml:space="preserve">.</w:t>
       </w:r>
     </w:p>
-    <w:bookmarkEnd w:id="259"/>
-    <w:bookmarkStart w:id="261" w:name="ref-dasilva2017annuasheep"/>
+    <w:bookmarkEnd w:id="261"/>
+    <w:bookmarkStart w:id="263" w:name="ref-dasilva2017annuasheep"/>
     <w:p>
       <w:pPr>
         <w:pStyle w:val="Bibliography"/>
@@ -18433,7 +18538,7 @@
       <w:r>
         <w:t xml:space="preserve"> </w:t>
       </w:r>
-      <w:hyperlink r:id="rId260">
+      <w:hyperlink r:id="rId262">
         <w:r>
           <w:rPr>
             <w:rStyle w:val="Hyperlink"/>
@@ -18445,8 +18550,8 @@
         <w:t xml:space="preserve">.</w:t>
       </w:r>
     </w:p>
-    <w:bookmarkEnd w:id="261"/>
-    <w:bookmarkStart w:id="263" w:name="ref-snider2021gametocytes"/>
+    <w:bookmarkEnd w:id="263"/>
+    <w:bookmarkStart w:id="265" w:name="ref-snider2021gametocytes"/>
     <w:p>
       <w:pPr>
         <w:pStyle w:val="Bibliography"/>
@@ -18504,7 +18609,7 @@
       <w:r>
         <w:t xml:space="preserve"> </w:t>
       </w:r>
-      <w:hyperlink r:id="rId262">
+      <w:hyperlink r:id="rId264">
         <w:r>
           <w:rPr>
             <w:rStyle w:val="Hyperlink"/>
@@ -18516,8 +18621,8 @@
         <w:t xml:space="preserve">.</w:t>
       </w:r>
     </w:p>
-    <w:bookmarkEnd w:id="263"/>
-    <w:bookmarkStart w:id="265" w:name="ref-soleimanifard2023kermanensis"/>
+    <w:bookmarkEnd w:id="265"/>
+    <w:bookmarkStart w:id="267" w:name="ref-soleimanifard2023kermanensis"/>
     <w:p>
       <w:pPr>
         <w:pStyle w:val="Bibliography"/>
@@ -18563,7 +18668,7 @@
       <w:r>
         <w:t xml:space="preserve"> </w:t>
       </w:r>
-      <w:hyperlink r:id="rId264">
+      <w:hyperlink r:id="rId266">
         <w:r>
           <w:rPr>
             <w:rStyle w:val="Hyperlink"/>
@@ -18575,8 +18680,8 @@
         <w:t xml:space="preserve">.</w:t>
       </w:r>
     </w:p>
-    <w:bookmarkEnd w:id="265"/>
-    <w:bookmarkStart w:id="267" w:name="ref-squires2011haemonchus"/>
+    <w:bookmarkEnd w:id="267"/>
+    <w:bookmarkStart w:id="269" w:name="ref-squires2011haemonchus"/>
     <w:p>
       <w:pPr>
         <w:pStyle w:val="Bibliography"/>
@@ -18610,7 +18715,7 @@
       <w:r>
         <w:t xml:space="preserve"> </w:t>
       </w:r>
-      <w:hyperlink r:id="rId266">
+      <w:hyperlink r:id="rId268">
         <w:r>
           <w:rPr>
             <w:rStyle w:val="Hyperlink"/>
@@ -18622,8 +18727,8 @@
         <w:t xml:space="preserve">.</w:t>
       </w:r>
     </w:p>
-    <w:bookmarkEnd w:id="267"/>
-    <w:bookmarkStart w:id="269" w:name="ref-tabari2017sieberi"/>
+    <w:bookmarkEnd w:id="269"/>
+    <w:bookmarkStart w:id="271" w:name="ref-tabari2017sieberi"/>
     <w:p>
       <w:pPr>
         <w:pStyle w:val="Bibliography"/>
@@ -18657,7 +18762,7 @@
       <w:r>
         <w:t xml:space="preserve"> </w:t>
       </w:r>
-      <w:hyperlink r:id="rId268">
+      <w:hyperlink r:id="rId270">
         <w:r>
           <w:rPr>
             <w:rStyle w:val="Hyperlink"/>
@@ -18669,8 +18774,8 @@
         <w:t xml:space="preserve">.</w:t>
       </w:r>
     </w:p>
-    <w:bookmarkEnd w:id="269"/>
-    <w:bookmarkStart w:id="271" w:name="ref-tamargo2017nanocochleate"/>
+    <w:bookmarkEnd w:id="271"/>
+    <w:bookmarkStart w:id="273" w:name="ref-tamargo2017nanocochleate"/>
     <w:p>
       <w:pPr>
         <w:pStyle w:val="Bibliography"/>
@@ -18704,7 +18809,7 @@
       <w:r>
         <w:t xml:space="preserve"> </w:t>
       </w:r>
-      <w:hyperlink r:id="rId270">
+      <w:hyperlink r:id="rId272">
         <w:r>
           <w:rPr>
             <w:rStyle w:val="Hyperlink"/>
@@ -18716,8 +18821,8 @@
         <w:t xml:space="preserve">.</w:t>
       </w:r>
     </w:p>
-    <w:bookmarkEnd w:id="271"/>
-    <w:bookmarkStart w:id="273" w:name="ref-tangnitipong2012heme"/>
+    <w:bookmarkEnd w:id="273"/>
+    <w:bookmarkStart w:id="275" w:name="ref-tangnitipong2012heme"/>
     <w:p>
       <w:pPr>
         <w:pStyle w:val="Bibliography"/>
@@ -18751,7 +18856,7 @@
       <w:r>
         <w:t xml:space="preserve"> </w:t>
       </w:r>
-      <w:hyperlink r:id="rId272">
+      <w:hyperlink r:id="rId274">
         <w:r>
           <w:rPr>
             <w:rStyle w:val="Hyperlink"/>
@@ -18763,8 +18868,8 @@
         <w:t xml:space="preserve">.</w:t>
       </w:r>
     </w:p>
-    <w:bookmarkEnd w:id="273"/>
-    <w:bookmarkStart w:id="275" w:name="ref-tariku2011absinthium"/>
+    <w:bookmarkEnd w:id="275"/>
+    <w:bookmarkStart w:id="277" w:name="ref-tariku2011absinthium"/>
     <w:p>
       <w:pPr>
         <w:pStyle w:val="Bibliography"/>
@@ -18798,7 +18903,7 @@
       <w:r>
         <w:t xml:space="preserve"> </w:t>
       </w:r>
-      <w:hyperlink r:id="rId274">
+      <w:hyperlink r:id="rId276">
         <w:r>
           <w:rPr>
             <w:rStyle w:val="Hyperlink"/>
@@ -18810,8 +18915,8 @@
         <w:t xml:space="preserve">.</w:t>
       </w:r>
     </w:p>
-    <w:bookmarkEnd w:id="275"/>
-    <w:bookmarkStart w:id="277" w:name="ref-tariq2009absinthium"/>
+    <w:bookmarkEnd w:id="277"/>
+    <w:bookmarkStart w:id="279" w:name="ref-tariq2009absinthium"/>
     <w:p>
       <w:pPr>
         <w:pStyle w:val="Bibliography"/>
@@ -18845,7 +18950,7 @@
       <w:r>
         <w:t xml:space="preserve"> </w:t>
       </w:r>
-      <w:hyperlink r:id="rId276">
+      <w:hyperlink r:id="rId278">
         <w:r>
           <w:rPr>
             <w:rStyle w:val="Hyperlink"/>
@@ -18857,8 +18962,8 @@
         <w:t xml:space="preserve">.</w:t>
       </w:r>
     </w:p>
-    <w:bookmarkEnd w:id="277"/>
-    <w:bookmarkStart w:id="279" w:name="ref-tasdemir2015antiprotozoal"/>
+    <w:bookmarkEnd w:id="279"/>
+    <w:bookmarkStart w:id="281" w:name="ref-tasdemir2015antiprotozoal"/>
     <w:p>
       <w:pPr>
         <w:pStyle w:val="Bibliography"/>
@@ -18892,7 +18997,7 @@
       <w:r>
         <w:t xml:space="preserve"> </w:t>
       </w:r>
-      <w:hyperlink r:id="rId278">
+      <w:hyperlink r:id="rId280">
         <w:r>
           <w:rPr>
             <w:rStyle w:val="Hyperlink"/>
@@ -18904,8 +19009,8 @@
         <w:t xml:space="preserve">.</w:t>
       </w:r>
     </w:p>
-    <w:bookmarkEnd w:id="279"/>
-    <w:bookmarkStart w:id="281" w:name="ref-teoh2006cyp"/>
+    <w:bookmarkEnd w:id="281"/>
+    <w:bookmarkStart w:id="283" w:name="ref-teoh2006cyp"/>
     <w:p>
       <w:pPr>
         <w:pStyle w:val="Bibliography"/>
@@ -18939,7 +19044,7 @@
       <w:r>
         <w:t xml:space="preserve"> </w:t>
       </w:r>
-      <w:hyperlink r:id="rId280">
+      <w:hyperlink r:id="rId282">
         <w:r>
           <w:rPr>
             <w:rStyle w:val="Hyperlink"/>
@@ -18951,8 +19056,8 @@
         <w:t xml:space="preserve">.</w:t>
       </w:r>
     </w:p>
-    <w:bookmarkEnd w:id="281"/>
-    <w:bookmarkStart w:id="283" w:name="ref-trendafilova2021edibleartemisia"/>
+    <w:bookmarkEnd w:id="283"/>
+    <w:bookmarkStart w:id="285" w:name="ref-trendafilova2021edibleartemisia"/>
     <w:p>
       <w:pPr>
         <w:pStyle w:val="Bibliography"/>
@@ -18986,7 +19091,7 @@
       <w:r>
         <w:t xml:space="preserve"> </w:t>
       </w:r>
-      <w:hyperlink r:id="rId282">
+      <w:hyperlink r:id="rId284">
         <w:r>
           <w:rPr>
             <w:rStyle w:val="Hyperlink"/>
@@ -18998,8 +19103,8 @@
         <w:t xml:space="preserve">.</w:t>
       </w:r>
     </w:p>
-    <w:bookmarkEnd w:id="283"/>
-    <w:bookmarkStart w:id="285" w:name="ref-umaraliev2025persicabisabolanes"/>
+    <w:bookmarkEnd w:id="285"/>
+    <w:bookmarkStart w:id="287" w:name="ref-umaraliev2025persicabisabolanes"/>
     <w:p>
       <w:pPr>
         <w:pStyle w:val="Bibliography"/>
@@ -19039,7 +19144,7 @@
       <w:r>
         <w:t xml:space="preserve"> </w:t>
       </w:r>
-      <w:hyperlink r:id="rId284">
+      <w:hyperlink r:id="rId286">
         <w:r>
           <w:rPr>
             <w:rStyle w:val="Hyperlink"/>
@@ -19051,8 +19156,8 @@
         <w:t xml:space="preserve">.</w:t>
       </w:r>
     </w:p>
-    <w:bookmarkEnd w:id="285"/>
-    <w:bookmarkStart w:id="287" w:name="ref-umaraliev2026persicamonoterpenes"/>
+    <w:bookmarkEnd w:id="287"/>
+    <w:bookmarkStart w:id="289" w:name="ref-umaraliev2026persicamonoterpenes"/>
     <w:p>
       <w:pPr>
         <w:pStyle w:val="Bibliography"/>
@@ -19092,7 +19197,7 @@
       <w:r>
         <w:t xml:space="preserve"> </w:t>
       </w:r>
-      <w:hyperlink r:id="rId286">
+      <w:hyperlink r:id="rId288">
         <w:r>
           <w:rPr>
             <w:rStyle w:val="Hyperlink"/>
@@ -19104,8 +19209,8 @@
         <w:t xml:space="preserve">.</w:t>
       </w:r>
     </w:p>
-    <w:bookmarkEnd w:id="287"/>
-    <w:bookmarkStart w:id="289" w:name="ref-urban2020trpc3"/>
+    <w:bookmarkEnd w:id="289"/>
+    <w:bookmarkStart w:id="291" w:name="ref-urban2020trpc3"/>
     <w:p>
       <w:pPr>
         <w:pStyle w:val="Bibliography"/>
@@ -19151,7 +19256,7 @@
       <w:r>
         <w:t xml:space="preserve"> </w:t>
       </w:r>
-      <w:hyperlink r:id="rId288">
+      <w:hyperlink r:id="rId290">
         <w:r>
           <w:rPr>
             <w:rStyle w:val="Hyperlink"/>
@@ -19163,8 +19268,8 @@
         <w:t xml:space="preserve">.</w:t>
       </w:r>
     </w:p>
-    <w:bookmarkEnd w:id="289"/>
-    <w:bookmarkStart w:id="291" w:name="ref-varadyova2018medicinalplants"/>
+    <w:bookmarkEnd w:id="291"/>
+    <w:bookmarkStart w:id="293" w:name="ref-varadyova2018medicinalplants"/>
     <w:p>
       <w:pPr>
         <w:pStyle w:val="Bibliography"/>
@@ -19207,7 +19312,7 @@
       <w:r>
         <w:t xml:space="preserve"> </w:t>
       </w:r>
-      <w:hyperlink r:id="rId290">
+      <w:hyperlink r:id="rId292">
         <w:r>
           <w:rPr>
             <w:rStyle w:val="Hyperlink"/>
@@ -19219,8 +19324,8 @@
         <w:t xml:space="preserve">.</w:t>
       </w:r>
     </w:p>
-    <w:bookmarkEnd w:id="291"/>
-    <w:bookmarkStart w:id="293" w:name="ref-walz2024aframalaria"/>
+    <w:bookmarkEnd w:id="293"/>
+    <w:bookmarkStart w:id="295" w:name="ref-walz2024aframalaria"/>
     <w:p>
       <w:pPr>
         <w:pStyle w:val="Bibliography"/>
@@ -19266,7 +19371,7 @@
       <w:r>
         <w:t xml:space="preserve"> </w:t>
       </w:r>
-      <w:hyperlink r:id="rId292">
+      <w:hyperlink r:id="rId294">
         <w:r>
           <w:rPr>
             <w:rStyle w:val="Hyperlink"/>
@@ -19278,8 +19383,8 @@
         <w:t xml:space="preserve">.</w:t>
       </w:r>
     </w:p>
-    <w:bookmarkEnd w:id="293"/>
-    <w:bookmarkStart w:id="295" w:name="ref-wang2013cyp71av1promoter"/>
+    <w:bookmarkEnd w:id="295"/>
+    <w:bookmarkStart w:id="297" w:name="ref-wang2013cyp71av1promoter"/>
     <w:p>
       <w:pPr>
         <w:pStyle w:val="Bibliography"/>
@@ -19313,7 +19418,7 @@
       <w:r>
         <w:t xml:space="preserve"> </w:t>
       </w:r>
-      <w:hyperlink r:id="rId294">
+      <w:hyperlink r:id="rId296">
         <w:r>
           <w:rPr>
             <w:rStyle w:val="Hyperlink"/>
@@ -19325,8 +19430,8 @@
         <w:t xml:space="preserve">.</w:t>
       </w:r>
     </w:p>
-    <w:bookmarkEnd w:id="295"/>
-    <w:bookmarkStart w:id="297" w:name="ref-wang2009trichometranscriptome"/>
+    <w:bookmarkEnd w:id="297"/>
+    <w:bookmarkStart w:id="299" w:name="ref-wang2009trichometranscriptome"/>
     <w:p>
       <w:pPr>
         <w:pStyle w:val="Bibliography"/>
@@ -19360,7 +19465,7 @@
       <w:r>
         <w:t xml:space="preserve"> </w:t>
       </w:r>
-      <w:hyperlink r:id="rId296">
+      <w:hyperlink r:id="rId298">
         <w:r>
           <w:rPr>
             <w:rStyle w:val="Hyperlink"/>
@@ -19372,8 +19477,8 @@
         <w:t xml:space="preserve">.</w:t>
       </w:r>
     </w:p>
-    <w:bookmarkEnd w:id="297"/>
-    <w:bookmarkStart w:id="299" w:name="ref-wani2023nitric"/>
+    <w:bookmarkEnd w:id="299"/>
+    <w:bookmarkStart w:id="301" w:name="ref-wani2023nitric"/>
     <w:p>
       <w:pPr>
         <w:pStyle w:val="Bibliography"/>
@@ -19431,7 +19536,7 @@
       <w:r>
         <w:t xml:space="preserve"> </w:t>
       </w:r>
-      <w:hyperlink r:id="rId298">
+      <w:hyperlink r:id="rId300">
         <w:r>
           <w:rPr>
             <w:rStyle w:val="Hyperlink"/>
@@ -19443,8 +19548,8 @@
         <w:t xml:space="preserve">.</w:t>
       </w:r>
     </w:p>
-    <w:bookmarkEnd w:id="299"/>
-    <w:bookmarkStart w:id="301" w:name="ref-wani2026maritima"/>
+    <w:bookmarkEnd w:id="301"/>
+    <w:bookmarkStart w:id="303" w:name="ref-wani2026maritima"/>
     <w:p>
       <w:pPr>
         <w:pStyle w:val="Bibliography"/>
@@ -19490,7 +19595,7 @@
       <w:r>
         <w:t xml:space="preserve"> </w:t>
       </w:r>
-      <w:hyperlink r:id="rId300">
+      <w:hyperlink r:id="rId302">
         <w:r>
           <w:rPr>
             <w:rStyle w:val="Hyperlink"/>
@@ -19502,8 +19607,8 @@
         <w:t xml:space="preserve">.</w:t>
       </w:r>
     </w:p>
-    <w:bookmarkEnd w:id="301"/>
-    <w:bookmarkStart w:id="303" w:name="ref-wetmore2019psiv9"/>
+    <w:bookmarkEnd w:id="303"/>
+    <w:bookmarkStart w:id="305" w:name="ref-wetmore2019psiv9"/>
     <w:p>
       <w:pPr>
         <w:pStyle w:val="Bibliography"/>
@@ -19549,7 +19654,7 @@
       <w:r>
         <w:t xml:space="preserve"> </w:t>
       </w:r>
-      <w:hyperlink r:id="rId302">
+      <w:hyperlink r:id="rId304">
         <w:r>
           <w:rPr>
             <w:rStyle w:val="Hyperlink"/>
@@ -19561,8 +19666,8 @@
         <w:t xml:space="preserve">.</w:t>
       </w:r>
     </w:p>
-    <w:bookmarkEnd w:id="303"/>
-    <w:bookmarkStart w:id="305" w:name="ref-wiedosari2017eimeria"/>
+    <w:bookmarkEnd w:id="305"/>
+    <w:bookmarkStart w:id="307" w:name="ref-wiedosari2017eimeria"/>
     <w:p>
       <w:pPr>
         <w:pStyle w:val="Bibliography"/>
@@ -19617,7 +19722,7 @@
       <w:r>
         <w:t xml:space="preserve"> </w:t>
       </w:r>
-      <w:hyperlink r:id="rId304">
+      <w:hyperlink r:id="rId306">
         <w:r>
           <w:rPr>
             <w:rStyle w:val="Hyperlink"/>
@@ -19629,8 +19734,8 @@
         <w:t xml:space="preserve">.</w:t>
       </w:r>
     </w:p>
-    <w:bookmarkEnd w:id="305"/>
-    <w:bookmarkStart w:id="307" w:name="ref-wright2010qinghao"/>
+    <w:bookmarkEnd w:id="307"/>
+    <w:bookmarkStart w:id="309" w:name="ref-wright2010qinghao"/>
     <w:p>
       <w:pPr>
         <w:pStyle w:val="Bibliography"/>
@@ -19676,7 +19781,7 @@
       <w:r>
         <w:t xml:space="preserve"> </w:t>
       </w:r>
-      <w:hyperlink r:id="rId306">
+      <w:hyperlink r:id="rId308">
         <w:r>
           <w:rPr>
             <w:rStyle w:val="Hyperlink"/>
@@ -19688,8 +19793,8 @@
         <w:t xml:space="preserve">.</w:t>
       </w:r>
     </w:p>
-    <w:bookmarkEnd w:id="307"/>
-    <w:bookmarkStart w:id="309" w:name="ref-xiang2019bhlh112"/>
+    <w:bookmarkEnd w:id="309"/>
+    <w:bookmarkStart w:id="311" w:name="ref-xiang2019bhlh112"/>
     <w:p>
       <w:pPr>
         <w:pStyle w:val="Bibliography"/>
@@ -19723,7 +19828,7 @@
       <w:r>
         <w:t xml:space="preserve"> </w:t>
       </w:r>
-      <w:hyperlink r:id="rId308">
+      <w:hyperlink r:id="rId310">
         <w:r>
           <w:rPr>
             <w:rStyle w:val="Hyperlink"/>
@@ -19735,8 +19840,8 @@
         <w:t xml:space="preserve">.</w:t>
       </w:r>
     </w:p>
-    <w:bookmarkEnd w:id="309"/>
-    <w:bookmarkStart w:id="311" w:name="ref-xu2025plantmatrix"/>
+    <w:bookmarkEnd w:id="311"/>
+    <w:bookmarkStart w:id="313" w:name="ref-xu2025plantmatrix"/>
     <w:p>
       <w:pPr>
         <w:pStyle w:val="Bibliography"/>
@@ -19782,7 +19887,7 @@
       <w:r>
         <w:t xml:space="preserve"> </w:t>
       </w:r>
-      <w:hyperlink r:id="rId310">
+      <w:hyperlink r:id="rId312">
         <w:r>
           <w:rPr>
             <w:rStyle w:val="Hyperlink"/>
@@ -19794,8 +19899,8 @@
         <w:t xml:space="preserve">.</w:t>
       </w:r>
     </w:p>
-    <w:bookmarkEnd w:id="311"/>
-    <w:bookmarkStart w:id="313" w:name="ref-xu2026artemisininpk"/>
+    <w:bookmarkEnd w:id="313"/>
+    <w:bookmarkStart w:id="315" w:name="ref-xu2026artemisininpk"/>
     <w:p>
       <w:pPr>
         <w:pStyle w:val="Bibliography"/>
@@ -19841,7 +19946,7 @@
       <w:r>
         <w:t xml:space="preserve"> </w:t>
       </w:r>
-      <w:hyperlink r:id="rId312">
+      <w:hyperlink r:id="rId314">
         <w:r>
           <w:rPr>
             <w:rStyle w:val="Hyperlink"/>
@@ -19853,8 +19958,8 @@
         <w:t xml:space="preserve">.</w:t>
       </w:r>
     </w:p>
-    <w:bookmarkEnd w:id="313"/>
-    <w:bookmarkStart w:id="315" w:name="ref-yildiz2011toxocara"/>
+    <w:bookmarkEnd w:id="315"/>
+    <w:bookmarkStart w:id="317" w:name="ref-yildiz2011toxocara"/>
     <w:p>
       <w:pPr>
         <w:pStyle w:val="Bibliography"/>
@@ -19912,7 +20017,7 @@
       <w:r>
         <w:t xml:space="preserve"> </w:t>
       </w:r>
-      <w:hyperlink r:id="rId314">
+      <w:hyperlink r:id="rId316">
         <w:r>
           <w:rPr>
             <w:rStyle w:val="Hyperlink"/>
@@ -19924,8 +20029,8 @@
         <w:t xml:space="preserve">.</w:t>
       </w:r>
     </w:p>
-    <w:bookmarkEnd w:id="315"/>
-    <w:bookmarkStart w:id="317" w:name="ref-zehra2020copper"/>
+    <w:bookmarkEnd w:id="317"/>
+    <w:bookmarkStart w:id="319" w:name="ref-zehra2020copper"/>
     <w:p>
       <w:pPr>
         <w:pStyle w:val="Bibliography"/>
@@ -19971,7 +20076,7 @@
       <w:r>
         <w:t xml:space="preserve"> </w:t>
       </w:r>
-      <w:hyperlink r:id="rId316">
+      <w:hyperlink r:id="rId318">
         <w:r>
           <w:rPr>
             <w:rStyle w:val="Hyperlink"/>
@@ -19983,8 +20088,8 @@
         <w:t xml:space="preserve">.</w:t>
       </w:r>
     </w:p>
-    <w:bookmarkEnd w:id="317"/>
-    <w:bookmarkStart w:id="319" w:name="ref-zhang2022fiveartemisia"/>
+    <w:bookmarkEnd w:id="319"/>
+    <w:bookmarkStart w:id="321" w:name="ref-zhang2022fiveartemisia"/>
     <w:p>
       <w:pPr>
         <w:pStyle w:val="Bibliography"/>
@@ -20030,7 +20135,7 @@
       <w:r>
         <w:t xml:space="preserve"> </w:t>
       </w:r>
-      <w:hyperlink r:id="rId318">
+      <w:hyperlink r:id="rId320">
         <w:r>
           <w:rPr>
             <w:rStyle w:val="Hyperlink"/>
@@ -20042,8 +20147,8 @@
         <w:t xml:space="preserve">.</w:t>
       </w:r>
     </w:p>
-    <w:bookmarkEnd w:id="319"/>
-    <w:bookmarkStart w:id="321" w:name="ref-zhang2026annuaenhancement"/>
+    <w:bookmarkEnd w:id="321"/>
+    <w:bookmarkStart w:id="323" w:name="ref-zhang2026annuaenhancement"/>
     <w:p>
       <w:pPr>
         <w:pStyle w:val="Bibliography"/>
@@ -20089,7 +20194,7 @@
       <w:r>
         <w:t xml:space="preserve"> </w:t>
       </w:r>
-      <w:hyperlink r:id="rId320">
+      <w:hyperlink r:id="rId322">
         <w:r>
           <w:rPr>
             <w:rStyle w:val="Hyperlink"/>
@@ -20101,8 +20206,8 @@
         <w:t xml:space="preserve">.</w:t>
       </w:r>
     </w:p>
-    <w:bookmarkEnd w:id="321"/>
-    <w:bookmarkStart w:id="323" w:name="ref-zhang2020argyitriterpenoids"/>
+    <w:bookmarkEnd w:id="323"/>
+    <w:bookmarkStart w:id="325" w:name="ref-zhang2020argyitriterpenoids"/>
     <w:p>
       <w:pPr>
         <w:pStyle w:val="Bibliography"/>
@@ -20145,7 +20250,7 @@
       <w:r>
         <w:t xml:space="preserve"> </w:t>
       </w:r>
-      <w:hyperlink r:id="rId322">
+      <w:hyperlink r:id="rId324">
         <w:r>
           <w:rPr>
             <w:rStyle w:val="Hyperlink"/>
@@ -20157,8 +20262,8 @@
         <w:t xml:space="preserve">.</w:t>
       </w:r>
     </w:p>
-    <w:bookmarkEnd w:id="323"/>
-    <w:bookmarkStart w:id="325" w:name="ref-zhang2019pp2c1"/>
+    <w:bookmarkEnd w:id="325"/>
+    <w:bookmarkStart w:id="327" w:name="ref-zhang2019pp2c1"/>
     <w:p>
       <w:pPr>
         <w:pStyle w:val="Bibliography"/>
@@ -20210,7 +20315,7 @@
       <w:r>
         <w:t xml:space="preserve"> </w:t>
       </w:r>
-      <w:hyperlink r:id="rId324">
+      <w:hyperlink r:id="rId326">
         <w:r>
           <w:rPr>
             <w:rStyle w:val="Hyperlink"/>
@@ -20222,8 +20327,8 @@
         <w:t xml:space="preserve">.</w:t>
       </w:r>
     </w:p>
-    <w:bookmarkEnd w:id="325"/>
-    <w:bookmarkStart w:id="327" w:name="ref-zhang2008dbr2"/>
+    <w:bookmarkEnd w:id="327"/>
+    <w:bookmarkStart w:id="329" w:name="ref-zhang2008dbr2"/>
     <w:p>
       <w:pPr>
         <w:pStyle w:val="Bibliography"/>
@@ -20257,7 +20362,7 @@
       <w:r>
         <w:t xml:space="preserve"> </w:t>
       </w:r>
-      <w:hyperlink r:id="rId326">
+      <w:hyperlink r:id="rId328">
         <w:r>
           <w:rPr>
             <w:rStyle w:val="Hyperlink"/>
@@ -20269,8 +20374,8 @@
         <w:t xml:space="preserve">.</w:t>
       </w:r>
     </w:p>
-    <w:bookmarkEnd w:id="327"/>
-    <w:bookmarkStart w:id="329" w:name="ref-frigida2023variability"/>
+    <w:bookmarkEnd w:id="329"/>
+    <w:bookmarkStart w:id="331" w:name="ref-frigida2023variability"/>
     <w:p>
       <w:pPr>
         <w:pStyle w:val="Bibliography"/>
@@ -20304,7 +20409,7 @@
       <w:r>
         <w:t xml:space="preserve"> </w:t>
       </w:r>
-      <w:hyperlink r:id="rId328">
+      <w:hyperlink r:id="rId330">
         <w:r>
           <w:rPr>
             <w:rStyle w:val="Hyperlink"/>
@@ -20316,9 +20421,9 @@
         <w:t xml:space="preserve">.</w:t>
       </w:r>
     </w:p>
-    <w:bookmarkEnd w:id="329"/>
-    <w:bookmarkEnd w:id="330"/>
     <w:bookmarkEnd w:id="331"/>
+    <w:bookmarkEnd w:id="332"/>
+    <w:bookmarkEnd w:id="333"/>
     <w:sectPr>
       <w:headerReference w:type="default" r:id="rId9"/>
       <w:footerReference w:type="default" r:id="rId10"/>

</xml_diff>

<commit_message>
Verify sieberi coccidiosis evidence and tighten appraisal
</commit_message>
<xml_diff>
--- a/manuscript/artemisia-terpene-review-submission.docx
+++ b/manuscript/artemisia-terpene-review-submission.docx
@@ -199,7 +199,7 @@
         <w:t xml:space="preserve"> </w:t>
       </w:r>
       <w:r>
-        <w:t xml:space="preserve">contains volatile monoterpenes and sesquiterpenes, less volatile diterpenes and triterpenes, and structurally diverse sesquiterpene lactones (STLs). These metabolites are often discussed as though a species name, a pathway gene, or an oil profile were sufficient to predict pharmacology. Here we present a source-auditable scoping review with a frozen snapshot that instead treats the specimen, accession, tissue, preparation, analytical method, parasite stage, and evidence level as the units of comparison. The Terpedia package registers 540 sources, 555 source-linked evidence records, 131 antiparasitic records, 19 parasite–protein interaction records, 179 compound/specimen records, and 409 audited article claims; 89 sources and 104 linked evidence rows have completed full-text verification, while 23 remain open. We synthesize terpene classes with biosynthetic compartmentalization, regulatory and environmental variation, and a bounded comparative-genomics analysis. Artemisinin biosynthesis in</w:t>
+        <w:t xml:space="preserve">contains volatile monoterpenes and sesquiterpenes, less volatile diterpenes and triterpenes, and structurally diverse sesquiterpene lactones (STLs). These metabolites are often discussed as though a species name, a pathway gene, or an oil profile were sufficient to predict pharmacology. Here we present a source-auditable scoping review with a frozen snapshot that instead treats the specimen, accession, tissue, preparation, analytical method, parasite stage, and evidence level as the units of comparison. The Terpedia package registers 540 sources, 555 source-linked evidence records, 131 antiparasitic records, 19 parasite–protein interaction records, 179 compound/specimen records, and 409 audited article claims; 90 sources and 105 linked evidence rows have completed full-text verification, while 22 remain open. We synthesize terpene classes with biosynthetic compartmentalization, regulatory and environmental variation, and a bounded comparative-genomics analysis. Artemisinin biosynthesis in</w:t>
       </w:r>
       <w:r>
         <w:t xml:space="preserve"> </w:t>
@@ -452,7 +452,7 @@
         <w:spacing w:before="0" w:after="120" w:line="264" w:lineRule="auto"/>
       </w:pPr>
       <w:r>
-        <w:t xml:space="preserve">The analysis is reported as a frozen scoping review rather than a completed systematic review. The retrieval snapshot contains 1,408 bounded title/abstract decisions, covering all 1,387 priority-queue records plus 21 historical or out-of-queue decisions. Full-text verification now covers 89 publicly accessible or publisher-indexed antiparasitic sources and 104 linked evidence rows; 23 queue sources remain unverified, and no result is pooled as a final quantitative estimate. The</w:t>
+        <w:t xml:space="preserve">The analysis is reported as a frozen scoping review rather than a completed systematic review. The retrieval snapshot contains 1,408 bounded title/abstract decisions, covering all 1,387 priority-queue records plus 21 historical or out-of-queue decisions. Full-text verification now covers 90 publicly accessible or publisher-indexed antiparasitic sources and 105 linked evidence rows; 22 queue sources remain unverified, and no result is pooled as a final quantitative estimate. The</w:t>
       </w:r>
       <w:r>
         <w:t xml:space="preserve"> </w:t>
@@ -536,13 +536,29 @@
           <w:i/>
           <w:iCs/>
         </w:rPr>
+        <w:t xml:space="preserve">A. sieberi</w:t>
+      </w:r>
+      <w:r>
+        <w:t xml:space="preserve"> </w:t>
+      </w:r>
+      <w:r>
+        <w:t xml:space="preserve">coccidiosis study retains extract-level attribution and limited safety/PK data, the newly verified</w:t>
+      </w:r>
+      <w:r>
+        <w:t xml:space="preserve"> </w:t>
+      </w:r>
+      <w:r>
+        <w:rPr>
+          <w:i/>
+          <w:iCs/>
+        </w:rPr>
         <w:t xml:space="preserve">A. annua</w:t>
       </w:r>
       <w:r>
         <w:t xml:space="preserve"> </w:t>
       </w:r>
       <w:r>
-        <w:t xml:space="preserve">coccidiosis study is retained with unresolved extract chemistry and small-sample limitations, while the</w:t>
+        <w:t xml:space="preserve">coccidiosis study retains unresolved extract chemistry and small-sample limitations, and the</w:t>
       </w:r>
       <w:r>
         <w:t xml:space="preserve"> </w:t>
@@ -4240,7 +4256,7 @@
         <w:t xml:space="preserve"> </w:t>
       </w:r>
       <w:r>
-        <w:t xml:space="preserve">to all 131 antiparasitic records. Twenty-one records had defined or purified chemistry, 37 had a profiled mixture, and 73 retained crude or unresolved attribution; 87 reported direct in-vitro parasite/vector assays, 40 included an in-vivo or organismal endpoint, and four were indirect or surrogate records, including three hemozoin assays. Explicit host/selectivity controls were present in 25 records, partial controls in 24, and absent or unresolved in 82. Only three records reached the E4/E5 functional-target-class level through the linked interaction map; 24 were hypothesis/stage-mechanism level and 104 were phenotype-only or unresolved. The overall appraisal therefore yielded 25 B-level characterized phenotypes and 106 C-level phenotypes with unresolved attribution; no record met the deliberately strict A tier. This is a limitation of evidence resolution, not evidence that the preparations lack activity. Row-level judgments and their rule basis are archived in</w:t>
+        <w:t xml:space="preserve">to all 131 antiparasitic records. Twenty-one records had defined or purified chemistry, 37 had a profiled mixture, and 73 retained crude or unresolved attribution; 87 reported direct in-vitro parasite/vector assays, 40 included an in-vivo or organismal endpoint, and four were indirect or surrogate records, including three hemozoin assays. Explicit host/selectivity controls were present in 13 records, partial controls in 59, and absent or unresolved in 59. Only three records reached the E4/E5 functional-target-class level through the linked interaction map; 24 were hypothesis/stage-mechanism level and 104 were phenotype-only or unresolved. The overall appraisal therefore yielded 28 B-level characterized phenotypes and 103 C-level phenotypes with unresolved attribution; no record met the deliberately strict A tier. This is a limitation of evidence resolution, not evidence that the preparations lack activity. Row-level judgments and their rule basis are archived in</w:t>
       </w:r>
       <w:r>
         <w:t xml:space="preserve"> </w:t>
@@ -5953,6 +5969,88 @@
       </w:r>
       <w:r>
         <w:t xml:space="preserve">(Wiedosari and Wardhana 2017)</w:t>
+      </w:r>
+      <w:r>
+        <w:t xml:space="preserve">.</w:t>
+      </w:r>
+    </w:p>
+    <w:p>
+      <w:pPr>
+        <w:pStyle w:val="BodyText"/>
+        <w:spacing w:before="0" w:after="120" w:line="264" w:lineRule="auto"/>
+      </w:pPr>
+      <w:r>
+        <w:t xml:space="preserve">A separate full-text</w:t>
+      </w:r>
+      <w:r>
+        <w:t xml:space="preserve"> </w:t>
+      </w:r>
+      <w:r>
+        <w:rPr>
+          <w:i/>
+          <w:iCs/>
+        </w:rPr>
+        <w:t xml:space="preserve">A. sieberi</w:t>
+      </w:r>
+      <w:r>
+        <w:t xml:space="preserve"> </w:t>
+      </w:r>
+      <w:r>
+        <w:t xml:space="preserve">study used petroleum-ether extracts of seasonally collected aerial parts and measured 0.20% artemisinin in summer/pre-flowering material versus 0.14% after seed set. Oral extract-equivalent doses of 1 or 2.5 mg/kg/day reduced reported</w:t>
+      </w:r>
+      <w:r>
+        <w:t xml:space="preserve"> </w:t>
+      </w:r>
+      <w:r>
+        <w:rPr>
+          <w:i/>
+          <w:iCs/>
+        </w:rPr>
+        <w:t xml:space="preserve">E. acervulina</w:t>
+      </w:r>
+      <w:r>
+        <w:t xml:space="preserve"> </w:t>
+      </w:r>
+      <w:r>
+        <w:t xml:space="preserve">and</w:t>
+      </w:r>
+      <w:r>
+        <w:t xml:space="preserve"> </w:t>
+      </w:r>
+      <w:r>
+        <w:rPr>
+          <w:i/>
+          <w:iCs/>
+        </w:rPr>
+        <w:t xml:space="preserve">E. tenella</w:t>
+      </w:r>
+      <w:r>
+        <w:t xml:space="preserve"> </w:t>
+      </w:r>
+      <w:r>
+        <w:t xml:space="preserve">oocyst outcomes but not</w:t>
+      </w:r>
+      <w:r>
+        <w:t xml:space="preserve"> </w:t>
+      </w:r>
+      <w:r>
+        <w:rPr>
+          <w:i/>
+          <w:iCs/>
+        </w:rPr>
+        <w:t xml:space="preserve">E. maxima</w:t>
+      </w:r>
+      <w:r>
+        <w:t xml:space="preserve"> </w:t>
+      </w:r>
+      <w:r>
+        <w:t xml:space="preserve">in five-bird experimental groups. The result is a useful seasonal artemisinin/parasite-specific comparator, but no complete terpene/STL profile, matched purified-artemisinin arm, systemic exposure, or mammalian safety window was reported</w:t>
+      </w:r>
+      <w:r>
+        <w:t xml:space="preserve"> </w:t>
+      </w:r>
+      <w:r>
+        <w:t xml:space="preserve">(Arab et al. 2006)</w:t>
       </w:r>
       <w:r>
         <w:t xml:space="preserve">.</w:t>

</xml_diff>

<commit_message>
Verify khorassanica supplementary evidence
</commit_message>
<xml_diff>
--- a/manuscript/artemisia-terpene-review-submission.docx
+++ b/manuscript/artemisia-terpene-review-submission.docx
@@ -199,7 +199,7 @@
         <w:t xml:space="preserve"> </w:t>
       </w:r>
       <w:r>
-        <w:t xml:space="preserve">contains volatile monoterpenes and sesquiterpenes, less volatile diterpenes and triterpenes, and structurally diverse sesquiterpene lactones (STLs). These metabolites are often discussed as though a species name, a pathway gene, or an oil profile were sufficient to predict pharmacology. Here we present a source-auditable scoping review with a frozen snapshot that instead treats the specimen, accession, tissue, preparation, analytical method, parasite stage, and evidence level as the units of comparison. The Terpedia package registers 540 sources, 555 source-linked evidence records, 131 antiparasitic records, 19 parasite–protein interaction records, 179 compound/specimen records, and 409 audited article claims; 90 sources and 105 linked evidence rows have completed full-text verification, while 22 remain open. We synthesize terpene classes with biosynthetic compartmentalization, regulatory and environmental variation, and a bounded comparative-genomics analysis. Artemisinin biosynthesis in</w:t>
+        <w:t xml:space="preserve">contains volatile monoterpenes and sesquiterpenes, less volatile diterpenes and triterpenes, and structurally diverse sesquiterpene lactones (STLs). These metabolites are often discussed as though a species name, a pathway gene, or an oil profile were sufficient to predict pharmacology. Here we present a source-auditable scoping review with a frozen snapshot that instead treats the specimen, accession, tissue, preparation, analytical method, parasite stage, and evidence level as the units of comparison. The Terpedia package registers 540 sources, 555 source-linked evidence records, 131 antiparasitic records, 19 parasite–protein interaction records, 179 compound/specimen records, and 409 audited article claims; 91 sources and 106 linked evidence rows have completed full-text verification, while 21 remain open. We synthesize terpene classes with biosynthetic compartmentalization, regulatory and environmental variation, and a bounded comparative-genomics analysis. Artemisinin biosynthesis in</w:t>
       </w:r>
       <w:r>
         <w:t xml:space="preserve"> </w:t>
@@ -452,7 +452,7 @@
         <w:spacing w:before="0" w:after="120" w:line="264" w:lineRule="auto"/>
       </w:pPr>
       <w:r>
-        <w:t xml:space="preserve">The analysis is reported as a frozen scoping review rather than a completed systematic review. The retrieval snapshot contains 1,408 bounded title/abstract decisions, covering all 1,387 priority-queue records plus 21 historical or out-of-queue decisions. Full-text verification now covers 90 publicly accessible or publisher-indexed antiparasitic sources and 105 linked evidence rows; 22 queue sources remain unverified, and no result is pooled as a final quantitative estimate. The</w:t>
+        <w:t xml:space="preserve">The analysis is reported as a frozen scoping review rather than a completed systematic review. The retrieval snapshot contains 1,408 bounded title/abstract decisions, covering all 1,387 priority-queue records plus 21 historical or out-of-queue decisions. Full-text verification now covers 91 publicly accessible, associated-supplementary, or publisher-indexed antiparasitic sources and 106 linked evidence rows; 21 queue sources remain unverified, and no result is pooled as a final quantitative estimate. The</w:t>
       </w:r>
       <w:r>
         <w:t xml:space="preserve"> </w:t>
@@ -558,7 +558,23 @@
         <w:t xml:space="preserve"> </w:t>
       </w:r>
       <w:r>
-        <w:t xml:space="preserve">coccidiosis study retains unresolved extract chemistry and small-sample limitations, and the</w:t>
+        <w:t xml:space="preserve">coccidiosis study retains unresolved extract chemistry and small-sample limitations, the associated</w:t>
+      </w:r>
+      <w:r>
+        <w:t xml:space="preserve"> </w:t>
+      </w:r>
+      <w:r>
+        <w:rPr>
+          <w:i/>
+          <w:iCs/>
+        </w:rPr>
+        <w:t xml:space="preserve">A. khorassanica</w:t>
+      </w:r>
+      <w:r>
+        <w:t xml:space="preserve"> </w:t>
+      </w:r>
+      <w:r>
+        <w:t xml:space="preserve">STL supplementary record retains an inaccessible main-article gate, and the</w:t>
       </w:r>
       <w:r>
         <w:t xml:space="preserve"> </w:t>

</xml_diff>

<commit_message>
Strengthen wormwood evidence and refresh submission package
</commit_message>
<xml_diff>
--- a/manuscript/artemisia-terpene-review-submission.docx
+++ b/manuscript/artemisia-terpene-review-submission.docx
@@ -199,7 +199,7 @@
         <w:t xml:space="preserve"> </w:t>
       </w:r>
       <w:r>
-        <w:t xml:space="preserve">contains volatile monoterpenes and sesquiterpenes, less volatile diterpenes and triterpenes, and structurally diverse sesquiterpene lactones (STLs). These metabolites are often discussed as though a species name, a pathway gene, or an oil profile were sufficient to predict pharmacology. Here we present a source-auditable scoping review with a frozen snapshot that instead treats the specimen, accession, tissue, preparation, analytical method, parasite stage, and evidence level as the units of comparison. The Terpedia package registers 540 sources, 555 source-linked evidence records, 131 antiparasitic records, 19 parasite–protein interaction records, 179 compound/specimen records, and 409 audited article claims; 91 sources and 106 linked evidence rows have completed full-text verification, while 21 remain open. We synthesize terpene classes with biosynthetic compartmentalization, regulatory and environmental variation, and a bounded comparative-genomics analysis. Artemisinin biosynthesis in</w:t>
+        <w:t xml:space="preserve">contains volatile monoterpenes and sesquiterpenes, less volatile diterpenes and triterpenes, and structurally diverse sesquiterpene lactones (STLs). These metabolites are often discussed as though a species name, a pathway gene, or an oil profile were sufficient to predict pharmacology. Here we present a source-auditable scoping review with a frozen snapshot that instead treats the specimen, accession, tissue, preparation, analytical method, parasite stage, and evidence level as the units of comparison. The Terpedia package registers 541 sources, 556 source-linked evidence records, 132 antiparasitic records, 19 parasite–protein interaction records, 179 compound/specimen records, and 410 audited article claims; 92 sources and 107 linked evidence rows have completed full-text verification, while 21 remain open. We synthesize terpene classes with biosynthetic compartmentalization, regulatory and environmental variation, and a bounded comparative-genomics analysis. Artemisinin biosynthesis in</w:t>
       </w:r>
       <w:r>
         <w:t xml:space="preserve"> </w:t>
@@ -951,7 +951,7 @@
         <w:t xml:space="preserve"> </w:t>
       </w:r>
       <w:r>
-        <w:t xml:space="preserve">terms with terpene classes, analytical methods, biosynthesis, genomics, malaria, helminths, vectors, and safety terms. The frozen retrieval snapshot contains 4,765 unique PubMed records from seven query families, of which 1,387 were prioritized for title-level review and 1,323 had abstracts retrieved. A source-linked full-text eligibility queue covers 112 unique antiparasitic sources representing 131 evidence rows, prioritizing malaria and</w:t>
+        <w:t xml:space="preserve">terms with terpene classes, analytical methods, biosynthesis, genomics, malaria, helminths, vectors, and safety terms. The frozen retrieval snapshot contains 4,765 unique PubMed records from seven query families, of which 1,387 were prioritized for title-level review and 1,323 had abstracts retrieved. A source-linked full-text eligibility queue covers 113 unique antiparasitic sources representing 132 evidence rows, prioritizing malaria and</w:t>
       </w:r>
       <w:r>
         <w:t xml:space="preserve"> </w:t>
@@ -976,7 +976,7 @@
         <w:spacing w:before="0" w:after="120" w:line="264" w:lineRule="auto"/>
       </w:pPr>
       <w:r>
-        <w:t xml:space="preserve">The analysis is reported as a frozen scoping review rather than a completed systematic review. The retrieval snapshot contains 1,408 bounded title/abstract decisions, covering all 1,387 priority-queue records plus 21 historical or out-of-queue decisions. Full-text verification now covers 91 publicly accessible, associated-supplementary, or publisher-indexed antiparasitic sources and 106 linked evidence rows; 21 queue sources remain unverified, and no result is pooled as a final quantitative estimate. The</w:t>
+        <w:t xml:space="preserve">The analysis is reported as a frozen scoping review rather than a completed systematic review. The retrieval snapshot contains 1,408 bounded title/abstract decisions, covering all 1,387 priority-queue records plus 21 historical or out-of-queue decisions. Full-text verification now covers 92 publicly accessible, associated-supplementary, or publisher-indexed antiparasitic sources and 107 linked evidence rows; 21 queue sources remain unverified, and no result is pooled as a final quantitative estimate. The</w:t>
       </w:r>
       <w:r>
         <w:t xml:space="preserve"> </w:t>
@@ -1098,7 +1098,7 @@
         <w:t xml:space="preserve"> </w:t>
       </w:r>
       <w:r>
-        <w:t xml:space="preserve">STL supplementary record retains an inaccessible main-article gate, and the</w:t>
+        <w:t xml:space="preserve">STL supplementary record retains an inaccessible main-article gate, the</w:t>
       </w:r>
       <w:r>
         <w:t xml:space="preserve"> </w:t>
@@ -1114,7 +1114,7 @@
         <w:t xml:space="preserve"> </w:t>
       </w:r>
       <w:r>
-        <w:t xml:space="preserve">electronic reprint retains mixture-level attribution and partial host-control limits. Terpedia is maintained as an updateable evidence archive, but later additions are not silently treated as part of this frozen analysis. The PRISMA-ScR mapping is archived in</w:t>
+        <w:t xml:space="preserve">electronic reprint retains mixture-level attribution and partial host-control limits, and the white-wormwood poultry study retains preparation-specific activity without named-constituent attribution. Terpedia is maintained as an updateable evidence archive, but later additions are not silently treated as part of this frozen analysis. The PRISMA-ScR mapping is archived in</w:t>
       </w:r>
       <w:r>
         <w:t xml:space="preserve"> </w:t>
@@ -4796,7 +4796,7 @@
         <w:t xml:space="preserve"> </w:t>
       </w:r>
       <w:r>
-        <w:t xml:space="preserve">to all 131 antiparasitic records. Twenty-one records had defined or purified chemistry, 37 had a profiled mixture, and 73 retained crude or unresolved attribution; 87 reported direct in-vitro parasite/vector assays, 40 included an in-vivo or organismal endpoint, and four were indirect or surrogate records, including three hemozoin assays. Explicit host/selectivity controls were present in 13 records, partial controls in 59, and absent or unresolved in 59. Only three records reached the E4/E5 functional-target-class level through the linked interaction map; 24 were hypothesis/stage-mechanism level and 104 were phenotype-only or unresolved. The overall appraisal therefore yielded 28 B-level characterized phenotypes and 103 C-level phenotypes with unresolved attribution; no record met the deliberately strict A tier. This is a limitation of evidence resolution, not evidence that the preparations lack activity. Row-level judgments and their rule basis are archived in</w:t>
+        <w:t xml:space="preserve">to all 132 antiparasitic records. Twenty-one records had defined or purified chemistry, 37 had a profiled mixture, and 74 retained crude or unresolved attribution; 88 reported direct in-vitro parasite/vector assays, 40 included an in-vivo or organismal endpoint, and four were indirect or surrogate records, including three hemozoin assays. Explicit host/selectivity controls were present in 14 records, partial controls in 59, and absent or unresolved in 59. Only three records reached the E4/E5 functional-target-class level through the linked interaction map; 24 were hypothesis/stage-mechanism level and 105 were phenotype-only or unresolved. The overall appraisal therefore yielded 28 B-level characterized phenotypes and 104 C-level phenotypes with unresolved attribution; no record met the deliberately strict A tier. This is a limitation of evidence resolution, not evidence that the preparations lack activity. Row-level judgments and their rule basis are archived in</w:t>
       </w:r>
       <w:r>
         <w:t xml:space="preserve"> </w:t>
@@ -7812,6 +7812,53 @@
       </w:r>
       <w:r>
         <w:t xml:space="preserve">alone. The result is important preparation- and polarity-specific ovine evidence, not proof of a named wormwood terpene, a standardized dose, or human safety.</w:t>
+      </w:r>
+    </w:p>
+    <w:p>
+      <w:pPr>
+        <w:pStyle w:val="BodyText"/>
+        <w:spacing w:before="0" w:after="120" w:line="264" w:lineRule="auto"/>
+      </w:pPr>
+      <w:r>
+        <w:t xml:space="preserve">A full-text white-wormwood poultry study provides a host-level comparator. Crude aqueous extract prepared from leaves and stems by 24-hour soaking was delivered at 0.4 g/kg body weight for three days to experimentally infected turkey poults; across three repeated experiments, reported seven-day reductions were 97.78% in fecal eggs and 96.07% in worm burden, close to 97.31% and 95.08% for albendazole</w:t>
+      </w:r>
+      <w:r>
+        <w:t xml:space="preserve"> </w:t>
+      </w:r>
+      <w:r>
+        <w:t xml:space="preserve">(Seddiek et al. 2011)</w:t>
+      </w:r>
+      <w:r>
+        <w:t xml:space="preserve">. The design included uninfected and infected controls, repeated experiments, serum biochemistry, and liver histology, but no terpene-resolved chemistry, thujone/santonin/STL quantitation, residue, PK, or mammalian selectivity. This strengthens preparation-specific</w:t>
+      </w:r>
+      <w:r>
+        <w:t xml:space="preserve"> </w:t>
+      </w:r>
+      <w:r>
+        <w:rPr>
+          <w:i/>
+          <w:iCs/>
+        </w:rPr>
+        <w:t xml:space="preserve">A. herba-alba</w:t>
+      </w:r>
+      <w:r>
+        <w:t xml:space="preserve"> </w:t>
+      </w:r>
+      <w:r>
+        <w:t xml:space="preserve">evidence while leaving named-constituent attribution, transfer to</w:t>
+      </w:r>
+      <w:r>
+        <w:t xml:space="preserve"> </w:t>
+      </w:r>
+      <w:r>
+        <w:rPr>
+          <w:i/>
+          <w:iCs/>
+        </w:rPr>
+        <w:t xml:space="preserve">A. absinthium</w:t>
+      </w:r>
+      <w:r>
+        <w:t xml:space="preserve">, and human safety unresolved.</w:t>
       </w:r>
     </w:p>
     <w:p>
@@ -12790,7 +12837,7 @@
     <w:bookmarkEnd w:id="48"/>
     <w:bookmarkEnd w:id="49"/>
     <w:bookmarkEnd w:id="50"/>
-    <w:bookmarkStart w:id="334" w:name="references"/>
+    <w:bookmarkStart w:id="336" w:name="references"/>
     <w:p>
       <w:pPr>
         <w:pStyle w:val="Heading1"/>
@@ -12800,7 +12847,7 @@
         <w:t xml:space="preserve">References</w:t>
       </w:r>
     </w:p>
-    <w:bookmarkStart w:id="333" w:name="refs"/>
+    <w:bookmarkStart w:id="335" w:name="refs"/>
     <w:bookmarkStart w:id="52" w:name="ref-abad2012artemisia"/>
     <w:p>
       <w:pPr>
@@ -18932,13 +18979,84 @@
       </w:r>
     </w:p>
     <w:bookmarkEnd w:id="256"/>
-    <w:bookmarkStart w:id="258" w:name="ref-shen2012cypcpr"/>
+    <w:bookmarkStart w:id="258" w:name="ref-seddiek2011herbaalba"/>
     <w:p>
       <w:pPr>
         <w:pStyle w:val="Bibliography"/>
         <w:spacing w:before="0" w:after="120" w:line="264" w:lineRule="auto"/>
       </w:pPr>
       <w:r>
+        <w:t xml:space="preserve">Seddiek, Shaker A., Mohamed M. Ali, Hanem F. Khater, and Mohamed M. El-Shorbagy. 2011.</w:t>
+      </w:r>
+      <w:r>
+        <w:t xml:space="preserve"> </w:t>
+      </w:r>
+      <w:r>
+        <w:t xml:space="preserve">“Anthelmintic Activity of the White Wormwood,</w:t>
+      </w:r>
+      <w:r>
+        <w:t xml:space="preserve"> </w:t>
+      </w:r>
+      <w:r>
+        <w:t xml:space="preserve">Artemisia herba-alba</w:t>
+      </w:r>
+      <w:r>
+        <w:t xml:space="preserve"> </w:t>
+      </w:r>
+      <w:r>
+        <w:t xml:space="preserve">Against</w:t>
+      </w:r>
+      <w:r>
+        <w:t xml:space="preserve"> </w:t>
+      </w:r>
+      <w:r>
+        <w:t xml:space="preserve">Heterakis gallinarum</w:t>
+      </w:r>
+      <w:r>
+        <w:t xml:space="preserve"> </w:t>
+      </w:r>
+      <w:r>
+        <w:t xml:space="preserve">Infecting Turkey Poults.”</w:t>
+      </w:r>
+      <w:r>
+        <w:t xml:space="preserve"> </w:t>
+      </w:r>
+      <w:r>
+        <w:rPr>
+          <w:i/>
+          <w:iCs/>
+        </w:rPr>
+        <w:t xml:space="preserve">Journal of Medicinal Plants Research</w:t>
+      </w:r>
+      <w:r>
+        <w:t xml:space="preserve"> </w:t>
+      </w:r>
+      <w:r>
+        <w:t xml:space="preserve">5 (16): 3946–57.</w:t>
+      </w:r>
+      <w:r>
+        <w:t xml:space="preserve"> </w:t>
+      </w:r>
+      <w:hyperlink r:id="rId257">
+        <w:r>
+          <w:rPr>
+            <w:rStyle w:val="Hyperlink"/>
+          </w:rPr>
+          <w:t xml:space="preserve">https://doi.org/10.5897/JMPR.9000085</w:t>
+        </w:r>
+      </w:hyperlink>
+      <w:r>
+        <w:t xml:space="preserve">.</w:t>
+      </w:r>
+    </w:p>
+    <w:bookmarkEnd w:id="258"/>
+    <w:bookmarkStart w:id="260" w:name="ref-shen2012cypcpr"/>
+    <w:p>
+      <w:pPr>
+        <w:pStyle w:val="Bibliography"/>
+        <w:spacing w:before="0" w:after="120" w:line="264" w:lineRule="auto"/>
+      </w:pPr>
+      <w:r>
         <w:t xml:space="preserve">Shen, Q., Y. F. Chen, T. Wang, S. Y. Wu, X. Lu, L. Zhang, F. Y. Zhang, W. M. Jiang, G. F. Wang, and K. X. Tang. 2012.</w:t>
       </w:r>
       <w:r>
@@ -18990,7 +19108,7 @@
       <w:r>
         <w:t xml:space="preserve"> </w:t>
       </w:r>
-      <w:hyperlink r:id="rId257">
+      <w:hyperlink r:id="rId259">
         <w:r>
           <w:rPr>
             <w:rStyle w:val="Hyperlink"/>
@@ -19002,8 +19120,8 @@
         <w:t xml:space="preserve">.</w:t>
       </w:r>
     </w:p>
-    <w:bookmarkEnd w:id="258"/>
-    <w:bookmarkStart w:id="260" w:name="ref-shi2022annuaantimalarialmetabolomics"/>
+    <w:bookmarkEnd w:id="260"/>
+    <w:bookmarkStart w:id="262" w:name="ref-shi2022annuaantimalarialmetabolomics"/>
     <w:p>
       <w:pPr>
         <w:pStyle w:val="Bibliography"/>
@@ -19049,7 +19167,7 @@
       <w:r>
         <w:t xml:space="preserve"> </w:t>
       </w:r>
-      <w:hyperlink r:id="rId259">
+      <w:hyperlink r:id="rId261">
         <w:r>
           <w:rPr>
             <w:rStyle w:val="Hyperlink"/>
@@ -19061,8 +19179,8 @@
         <w:t xml:space="preserve">.</w:t>
       </w:r>
     </w:p>
-    <w:bookmarkEnd w:id="260"/>
-    <w:bookmarkStart w:id="262" w:name="ref-shi2018mixta1"/>
+    <w:bookmarkEnd w:id="262"/>
+    <w:bookmarkStart w:id="264" w:name="ref-shi2018mixta1"/>
     <w:p>
       <w:pPr>
         <w:pStyle w:val="Bibliography"/>
@@ -19117,7 +19235,7 @@
       <w:r>
         <w:t xml:space="preserve"> </w:t>
       </w:r>
-      <w:hyperlink r:id="rId261">
+      <w:hyperlink r:id="rId263">
         <w:r>
           <w:rPr>
             <w:rStyle w:val="Hyperlink"/>
@@ -19129,8 +19247,8 @@
         <w:t xml:space="preserve">.</w:t>
       </w:r>
     </w:p>
-    <w:bookmarkEnd w:id="262"/>
-    <w:bookmarkStart w:id="264" w:name="ref-dasilva2017annuasheep"/>
+    <w:bookmarkEnd w:id="264"/>
+    <w:bookmarkStart w:id="266" w:name="ref-dasilva2017annuasheep"/>
     <w:p>
       <w:pPr>
         <w:pStyle w:val="Bibliography"/>
@@ -19176,7 +19294,7 @@
       <w:r>
         <w:t xml:space="preserve"> </w:t>
       </w:r>
-      <w:hyperlink r:id="rId263">
+      <w:hyperlink r:id="rId265">
         <w:r>
           <w:rPr>
             <w:rStyle w:val="Hyperlink"/>
@@ -19188,8 +19306,8 @@
         <w:t xml:space="preserve">.</w:t>
       </w:r>
     </w:p>
-    <w:bookmarkEnd w:id="264"/>
-    <w:bookmarkStart w:id="266" w:name="ref-snider2021gametocytes"/>
+    <w:bookmarkEnd w:id="266"/>
+    <w:bookmarkStart w:id="268" w:name="ref-snider2021gametocytes"/>
     <w:p>
       <w:pPr>
         <w:pStyle w:val="Bibliography"/>
@@ -19247,7 +19365,7 @@
       <w:r>
         <w:t xml:space="preserve"> </w:t>
       </w:r>
-      <w:hyperlink r:id="rId265">
+      <w:hyperlink r:id="rId267">
         <w:r>
           <w:rPr>
             <w:rStyle w:val="Hyperlink"/>
@@ -19259,8 +19377,8 @@
         <w:t xml:space="preserve">.</w:t>
       </w:r>
     </w:p>
-    <w:bookmarkEnd w:id="266"/>
-    <w:bookmarkStart w:id="268" w:name="ref-soleimanifard2023kermanensis"/>
+    <w:bookmarkEnd w:id="268"/>
+    <w:bookmarkStart w:id="270" w:name="ref-soleimanifard2023kermanensis"/>
     <w:p>
       <w:pPr>
         <w:pStyle w:val="Bibliography"/>
@@ -19306,7 +19424,7 @@
       <w:r>
         <w:t xml:space="preserve"> </w:t>
       </w:r>
-      <w:hyperlink r:id="rId267">
+      <w:hyperlink r:id="rId269">
         <w:r>
           <w:rPr>
             <w:rStyle w:val="Hyperlink"/>
@@ -19318,8 +19436,8 @@
         <w:t xml:space="preserve">.</w:t>
       </w:r>
     </w:p>
-    <w:bookmarkEnd w:id="268"/>
-    <w:bookmarkStart w:id="270" w:name="ref-squires2011haemonchus"/>
+    <w:bookmarkEnd w:id="270"/>
+    <w:bookmarkStart w:id="272" w:name="ref-squires2011haemonchus"/>
     <w:p>
       <w:pPr>
         <w:pStyle w:val="Bibliography"/>
@@ -19353,7 +19471,7 @@
       <w:r>
         <w:t xml:space="preserve"> </w:t>
       </w:r>
-      <w:hyperlink r:id="rId269">
+      <w:hyperlink r:id="rId271">
         <w:r>
           <w:rPr>
             <w:rStyle w:val="Hyperlink"/>
@@ -19365,8 +19483,8 @@
         <w:t xml:space="preserve">.</w:t>
       </w:r>
     </w:p>
-    <w:bookmarkEnd w:id="270"/>
-    <w:bookmarkStart w:id="272" w:name="ref-tabari2017sieberi"/>
+    <w:bookmarkEnd w:id="272"/>
+    <w:bookmarkStart w:id="274" w:name="ref-tabari2017sieberi"/>
     <w:p>
       <w:pPr>
         <w:pStyle w:val="Bibliography"/>
@@ -19400,7 +19518,7 @@
       <w:r>
         <w:t xml:space="preserve"> </w:t>
       </w:r>
-      <w:hyperlink r:id="rId271">
+      <w:hyperlink r:id="rId273">
         <w:r>
           <w:rPr>
             <w:rStyle w:val="Hyperlink"/>
@@ -19412,8 +19530,8 @@
         <w:t xml:space="preserve">.</w:t>
       </w:r>
     </w:p>
-    <w:bookmarkEnd w:id="272"/>
-    <w:bookmarkStart w:id="274" w:name="ref-tamargo2017nanocochleate"/>
+    <w:bookmarkEnd w:id="274"/>
+    <w:bookmarkStart w:id="276" w:name="ref-tamargo2017nanocochleate"/>
     <w:p>
       <w:pPr>
         <w:pStyle w:val="Bibliography"/>
@@ -19447,7 +19565,7 @@
       <w:r>
         <w:t xml:space="preserve"> </w:t>
       </w:r>
-      <w:hyperlink r:id="rId273">
+      <w:hyperlink r:id="rId275">
         <w:r>
           <w:rPr>
             <w:rStyle w:val="Hyperlink"/>
@@ -19459,8 +19577,8 @@
         <w:t xml:space="preserve">.</w:t>
       </w:r>
     </w:p>
-    <w:bookmarkEnd w:id="274"/>
-    <w:bookmarkStart w:id="276" w:name="ref-tangnitipong2012heme"/>
+    <w:bookmarkEnd w:id="276"/>
+    <w:bookmarkStart w:id="278" w:name="ref-tangnitipong2012heme"/>
     <w:p>
       <w:pPr>
         <w:pStyle w:val="Bibliography"/>
@@ -19494,7 +19612,7 @@
       <w:r>
         <w:t xml:space="preserve"> </w:t>
       </w:r>
-      <w:hyperlink r:id="rId275">
+      <w:hyperlink r:id="rId277">
         <w:r>
           <w:rPr>
             <w:rStyle w:val="Hyperlink"/>
@@ -19506,8 +19624,8 @@
         <w:t xml:space="preserve">.</w:t>
       </w:r>
     </w:p>
-    <w:bookmarkEnd w:id="276"/>
-    <w:bookmarkStart w:id="278" w:name="ref-tariku2011absinthium"/>
+    <w:bookmarkEnd w:id="278"/>
+    <w:bookmarkStart w:id="280" w:name="ref-tariku2011absinthium"/>
     <w:p>
       <w:pPr>
         <w:pStyle w:val="Bibliography"/>
@@ -19541,7 +19659,7 @@
       <w:r>
         <w:t xml:space="preserve"> </w:t>
       </w:r>
-      <w:hyperlink r:id="rId277">
+      <w:hyperlink r:id="rId279">
         <w:r>
           <w:rPr>
             <w:rStyle w:val="Hyperlink"/>
@@ -19553,8 +19671,8 @@
         <w:t xml:space="preserve">.</w:t>
       </w:r>
     </w:p>
-    <w:bookmarkEnd w:id="278"/>
-    <w:bookmarkStart w:id="280" w:name="ref-tariq2009absinthium"/>
+    <w:bookmarkEnd w:id="280"/>
+    <w:bookmarkStart w:id="282" w:name="ref-tariq2009absinthium"/>
     <w:p>
       <w:pPr>
         <w:pStyle w:val="Bibliography"/>
@@ -19588,7 +19706,7 @@
       <w:r>
         <w:t xml:space="preserve"> </w:t>
       </w:r>
-      <w:hyperlink r:id="rId279">
+      <w:hyperlink r:id="rId281">
         <w:r>
           <w:rPr>
             <w:rStyle w:val="Hyperlink"/>
@@ -19600,8 +19718,8 @@
         <w:t xml:space="preserve">.</w:t>
       </w:r>
     </w:p>
-    <w:bookmarkEnd w:id="280"/>
-    <w:bookmarkStart w:id="282" w:name="ref-tasdemir2015antiprotozoal"/>
+    <w:bookmarkEnd w:id="282"/>
+    <w:bookmarkStart w:id="284" w:name="ref-tasdemir2015antiprotozoal"/>
     <w:p>
       <w:pPr>
         <w:pStyle w:val="Bibliography"/>
@@ -19635,7 +19753,7 @@
       <w:r>
         <w:t xml:space="preserve"> </w:t>
       </w:r>
-      <w:hyperlink r:id="rId281">
+      <w:hyperlink r:id="rId283">
         <w:r>
           <w:rPr>
             <w:rStyle w:val="Hyperlink"/>
@@ -19647,8 +19765,8 @@
         <w:t xml:space="preserve">.</w:t>
       </w:r>
     </w:p>
-    <w:bookmarkEnd w:id="282"/>
-    <w:bookmarkStart w:id="284" w:name="ref-teoh2006cyp"/>
+    <w:bookmarkEnd w:id="284"/>
+    <w:bookmarkStart w:id="286" w:name="ref-teoh2006cyp"/>
     <w:p>
       <w:pPr>
         <w:pStyle w:val="Bibliography"/>
@@ -19682,7 +19800,7 @@
       <w:r>
         <w:t xml:space="preserve"> </w:t>
       </w:r>
-      <w:hyperlink r:id="rId283">
+      <w:hyperlink r:id="rId285">
         <w:r>
           <w:rPr>
             <w:rStyle w:val="Hyperlink"/>
@@ -19694,8 +19812,8 @@
         <w:t xml:space="preserve">.</w:t>
       </w:r>
     </w:p>
-    <w:bookmarkEnd w:id="284"/>
-    <w:bookmarkStart w:id="286" w:name="ref-trendafilova2021edibleartemisia"/>
+    <w:bookmarkEnd w:id="286"/>
+    <w:bookmarkStart w:id="288" w:name="ref-trendafilova2021edibleartemisia"/>
     <w:p>
       <w:pPr>
         <w:pStyle w:val="Bibliography"/>
@@ -19729,7 +19847,7 @@
       <w:r>
         <w:t xml:space="preserve"> </w:t>
       </w:r>
-      <w:hyperlink r:id="rId285">
+      <w:hyperlink r:id="rId287">
         <w:r>
           <w:rPr>
             <w:rStyle w:val="Hyperlink"/>
@@ -19741,8 +19859,8 @@
         <w:t xml:space="preserve">.</w:t>
       </w:r>
     </w:p>
-    <w:bookmarkEnd w:id="286"/>
-    <w:bookmarkStart w:id="288" w:name="ref-umaraliev2025persicabisabolanes"/>
+    <w:bookmarkEnd w:id="288"/>
+    <w:bookmarkStart w:id="290" w:name="ref-umaraliev2025persicabisabolanes"/>
     <w:p>
       <w:pPr>
         <w:pStyle w:val="Bibliography"/>
@@ -19782,7 +19900,7 @@
       <w:r>
         <w:t xml:space="preserve"> </w:t>
       </w:r>
-      <w:hyperlink r:id="rId287">
+      <w:hyperlink r:id="rId289">
         <w:r>
           <w:rPr>
             <w:rStyle w:val="Hyperlink"/>
@@ -19794,8 +19912,8 @@
         <w:t xml:space="preserve">.</w:t>
       </w:r>
     </w:p>
-    <w:bookmarkEnd w:id="288"/>
-    <w:bookmarkStart w:id="290" w:name="ref-umaraliev2026persicamonoterpenes"/>
+    <w:bookmarkEnd w:id="290"/>
+    <w:bookmarkStart w:id="292" w:name="ref-umaraliev2026persicamonoterpenes"/>
     <w:p>
       <w:pPr>
         <w:pStyle w:val="Bibliography"/>
@@ -19835,7 +19953,7 @@
       <w:r>
         <w:t xml:space="preserve"> </w:t>
       </w:r>
-      <w:hyperlink r:id="rId289">
+      <w:hyperlink r:id="rId291">
         <w:r>
           <w:rPr>
             <w:rStyle w:val="Hyperlink"/>
@@ -19847,8 +19965,8 @@
         <w:t xml:space="preserve">.</w:t>
       </w:r>
     </w:p>
-    <w:bookmarkEnd w:id="290"/>
-    <w:bookmarkStart w:id="292" w:name="ref-urban2020trpc3"/>
+    <w:bookmarkEnd w:id="292"/>
+    <w:bookmarkStart w:id="294" w:name="ref-urban2020trpc3"/>
     <w:p>
       <w:pPr>
         <w:pStyle w:val="Bibliography"/>
@@ -19894,7 +20012,7 @@
       <w:r>
         <w:t xml:space="preserve"> </w:t>
       </w:r>
-      <w:hyperlink r:id="rId291">
+      <w:hyperlink r:id="rId293">
         <w:r>
           <w:rPr>
             <w:rStyle w:val="Hyperlink"/>
@@ -19906,8 +20024,8 @@
         <w:t xml:space="preserve">.</w:t>
       </w:r>
     </w:p>
-    <w:bookmarkEnd w:id="292"/>
-    <w:bookmarkStart w:id="294" w:name="ref-varadyova2018medicinalplants"/>
+    <w:bookmarkEnd w:id="294"/>
+    <w:bookmarkStart w:id="296" w:name="ref-varadyova2018medicinalplants"/>
     <w:p>
       <w:pPr>
         <w:pStyle w:val="Bibliography"/>
@@ -19950,7 +20068,7 @@
       <w:r>
         <w:t xml:space="preserve"> </w:t>
       </w:r>
-      <w:hyperlink r:id="rId293">
+      <w:hyperlink r:id="rId295">
         <w:r>
           <w:rPr>
             <w:rStyle w:val="Hyperlink"/>
@@ -19962,8 +20080,8 @@
         <w:t xml:space="preserve">.</w:t>
       </w:r>
     </w:p>
-    <w:bookmarkEnd w:id="294"/>
-    <w:bookmarkStart w:id="296" w:name="ref-walz2024aframalaria"/>
+    <w:bookmarkEnd w:id="296"/>
+    <w:bookmarkStart w:id="298" w:name="ref-walz2024aframalaria"/>
     <w:p>
       <w:pPr>
         <w:pStyle w:val="Bibliography"/>
@@ -20009,7 +20127,7 @@
       <w:r>
         <w:t xml:space="preserve"> </w:t>
       </w:r>
-      <w:hyperlink r:id="rId295">
+      <w:hyperlink r:id="rId297">
         <w:r>
           <w:rPr>
             <w:rStyle w:val="Hyperlink"/>
@@ -20021,8 +20139,8 @@
         <w:t xml:space="preserve">.</w:t>
       </w:r>
     </w:p>
-    <w:bookmarkEnd w:id="296"/>
-    <w:bookmarkStart w:id="298" w:name="ref-wang2013cyp71av1promoter"/>
+    <w:bookmarkEnd w:id="298"/>
+    <w:bookmarkStart w:id="300" w:name="ref-wang2013cyp71av1promoter"/>
     <w:p>
       <w:pPr>
         <w:pStyle w:val="Bibliography"/>
@@ -20056,7 +20174,7 @@
       <w:r>
         <w:t xml:space="preserve"> </w:t>
       </w:r>
-      <w:hyperlink r:id="rId297">
+      <w:hyperlink r:id="rId299">
         <w:r>
           <w:rPr>
             <w:rStyle w:val="Hyperlink"/>
@@ -20068,8 +20186,8 @@
         <w:t xml:space="preserve">.</w:t>
       </w:r>
     </w:p>
-    <w:bookmarkEnd w:id="298"/>
-    <w:bookmarkStart w:id="300" w:name="ref-wang2009trichometranscriptome"/>
+    <w:bookmarkEnd w:id="300"/>
+    <w:bookmarkStart w:id="302" w:name="ref-wang2009trichometranscriptome"/>
     <w:p>
       <w:pPr>
         <w:pStyle w:val="Bibliography"/>
@@ -20103,7 +20221,7 @@
       <w:r>
         <w:t xml:space="preserve"> </w:t>
       </w:r>
-      <w:hyperlink r:id="rId299">
+      <w:hyperlink r:id="rId301">
         <w:r>
           <w:rPr>
             <w:rStyle w:val="Hyperlink"/>
@@ -20115,8 +20233,8 @@
         <w:t xml:space="preserve">.</w:t>
       </w:r>
     </w:p>
-    <w:bookmarkEnd w:id="300"/>
-    <w:bookmarkStart w:id="302" w:name="ref-wani2023nitric"/>
+    <w:bookmarkEnd w:id="302"/>
+    <w:bookmarkStart w:id="304" w:name="ref-wani2023nitric"/>
     <w:p>
       <w:pPr>
         <w:pStyle w:val="Bibliography"/>
@@ -20174,7 +20292,7 @@
       <w:r>
         <w:t xml:space="preserve"> </w:t>
       </w:r>
-      <w:hyperlink r:id="rId301">
+      <w:hyperlink r:id="rId303">
         <w:r>
           <w:rPr>
             <w:rStyle w:val="Hyperlink"/>
@@ -20186,8 +20304,8 @@
         <w:t xml:space="preserve">.</w:t>
       </w:r>
     </w:p>
-    <w:bookmarkEnd w:id="302"/>
-    <w:bookmarkStart w:id="304" w:name="ref-wani2026maritima"/>
+    <w:bookmarkEnd w:id="304"/>
+    <w:bookmarkStart w:id="306" w:name="ref-wani2026maritima"/>
     <w:p>
       <w:pPr>
         <w:pStyle w:val="Bibliography"/>
@@ -20233,7 +20351,7 @@
       <w:r>
         <w:t xml:space="preserve"> </w:t>
       </w:r>
-      <w:hyperlink r:id="rId303">
+      <w:hyperlink r:id="rId305">
         <w:r>
           <w:rPr>
             <w:rStyle w:val="Hyperlink"/>
@@ -20245,8 +20363,8 @@
         <w:t xml:space="preserve">.</w:t>
       </w:r>
     </w:p>
-    <w:bookmarkEnd w:id="304"/>
-    <w:bookmarkStart w:id="306" w:name="ref-wetmore2019psiv9"/>
+    <w:bookmarkEnd w:id="306"/>
+    <w:bookmarkStart w:id="308" w:name="ref-wetmore2019psiv9"/>
     <w:p>
       <w:pPr>
         <w:pStyle w:val="Bibliography"/>
@@ -20292,7 +20410,7 @@
       <w:r>
         <w:t xml:space="preserve"> </w:t>
       </w:r>
-      <w:hyperlink r:id="rId305">
+      <w:hyperlink r:id="rId307">
         <w:r>
           <w:rPr>
             <w:rStyle w:val="Hyperlink"/>
@@ -20304,8 +20422,8 @@
         <w:t xml:space="preserve">.</w:t>
       </w:r>
     </w:p>
-    <w:bookmarkEnd w:id="306"/>
-    <w:bookmarkStart w:id="308" w:name="ref-wiedosari2017eimeria"/>
+    <w:bookmarkEnd w:id="308"/>
+    <w:bookmarkStart w:id="310" w:name="ref-wiedosari2017eimeria"/>
     <w:p>
       <w:pPr>
         <w:pStyle w:val="Bibliography"/>
@@ -20360,7 +20478,7 @@
       <w:r>
         <w:t xml:space="preserve"> </w:t>
       </w:r>
-      <w:hyperlink r:id="rId307">
+      <w:hyperlink r:id="rId309">
         <w:r>
           <w:rPr>
             <w:rStyle w:val="Hyperlink"/>
@@ -20372,8 +20490,8 @@
         <w:t xml:space="preserve">.</w:t>
       </w:r>
     </w:p>
-    <w:bookmarkEnd w:id="308"/>
-    <w:bookmarkStart w:id="310" w:name="ref-wright2010qinghao"/>
+    <w:bookmarkEnd w:id="310"/>
+    <w:bookmarkStart w:id="312" w:name="ref-wright2010qinghao"/>
     <w:p>
       <w:pPr>
         <w:pStyle w:val="Bibliography"/>
@@ -20419,7 +20537,7 @@
       <w:r>
         <w:t xml:space="preserve"> </w:t>
       </w:r>
-      <w:hyperlink r:id="rId309">
+      <w:hyperlink r:id="rId311">
         <w:r>
           <w:rPr>
             <w:rStyle w:val="Hyperlink"/>
@@ -20431,8 +20549,8 @@
         <w:t xml:space="preserve">.</w:t>
       </w:r>
     </w:p>
-    <w:bookmarkEnd w:id="310"/>
-    <w:bookmarkStart w:id="312" w:name="ref-xiang2019bhlh112"/>
+    <w:bookmarkEnd w:id="312"/>
+    <w:bookmarkStart w:id="314" w:name="ref-xiang2019bhlh112"/>
     <w:p>
       <w:pPr>
         <w:pStyle w:val="Bibliography"/>
@@ -20466,7 +20584,7 @@
       <w:r>
         <w:t xml:space="preserve"> </w:t>
       </w:r>
-      <w:hyperlink r:id="rId311">
+      <w:hyperlink r:id="rId313">
         <w:r>
           <w:rPr>
             <w:rStyle w:val="Hyperlink"/>
@@ -20478,8 +20596,8 @@
         <w:t xml:space="preserve">.</w:t>
       </w:r>
     </w:p>
-    <w:bookmarkEnd w:id="312"/>
-    <w:bookmarkStart w:id="314" w:name="ref-xu2025plantmatrix"/>
+    <w:bookmarkEnd w:id="314"/>
+    <w:bookmarkStart w:id="316" w:name="ref-xu2025plantmatrix"/>
     <w:p>
       <w:pPr>
         <w:pStyle w:val="Bibliography"/>
@@ -20525,7 +20643,7 @@
       <w:r>
         <w:t xml:space="preserve"> </w:t>
       </w:r>
-      <w:hyperlink r:id="rId313">
+      <w:hyperlink r:id="rId315">
         <w:r>
           <w:rPr>
             <w:rStyle w:val="Hyperlink"/>
@@ -20537,8 +20655,8 @@
         <w:t xml:space="preserve">.</w:t>
       </w:r>
     </w:p>
-    <w:bookmarkEnd w:id="314"/>
-    <w:bookmarkStart w:id="316" w:name="ref-xu2026artemisininpk"/>
+    <w:bookmarkEnd w:id="316"/>
+    <w:bookmarkStart w:id="318" w:name="ref-xu2026artemisininpk"/>
     <w:p>
       <w:pPr>
         <w:pStyle w:val="Bibliography"/>
@@ -20584,7 +20702,7 @@
       <w:r>
         <w:t xml:space="preserve"> </w:t>
       </w:r>
-      <w:hyperlink r:id="rId315">
+      <w:hyperlink r:id="rId317">
         <w:r>
           <w:rPr>
             <w:rStyle w:val="Hyperlink"/>
@@ -20596,8 +20714,8 @@
         <w:t xml:space="preserve">.</w:t>
       </w:r>
     </w:p>
-    <w:bookmarkEnd w:id="316"/>
-    <w:bookmarkStart w:id="318" w:name="ref-yildiz2011toxocara"/>
+    <w:bookmarkEnd w:id="318"/>
+    <w:bookmarkStart w:id="320" w:name="ref-yildiz2011toxocara"/>
     <w:p>
       <w:pPr>
         <w:pStyle w:val="Bibliography"/>
@@ -20655,7 +20773,7 @@
       <w:r>
         <w:t xml:space="preserve"> </w:t>
       </w:r>
-      <w:hyperlink r:id="rId317">
+      <w:hyperlink r:id="rId319">
         <w:r>
           <w:rPr>
             <w:rStyle w:val="Hyperlink"/>
@@ -20667,8 +20785,8 @@
         <w:t xml:space="preserve">.</w:t>
       </w:r>
     </w:p>
-    <w:bookmarkEnd w:id="318"/>
-    <w:bookmarkStart w:id="320" w:name="ref-zehra2020copper"/>
+    <w:bookmarkEnd w:id="320"/>
+    <w:bookmarkStart w:id="322" w:name="ref-zehra2020copper"/>
     <w:p>
       <w:pPr>
         <w:pStyle w:val="Bibliography"/>
@@ -20714,7 +20832,7 @@
       <w:r>
         <w:t xml:space="preserve"> </w:t>
       </w:r>
-      <w:hyperlink r:id="rId319">
+      <w:hyperlink r:id="rId321">
         <w:r>
           <w:rPr>
             <w:rStyle w:val="Hyperlink"/>
@@ -20726,8 +20844,8 @@
         <w:t xml:space="preserve">.</w:t>
       </w:r>
     </w:p>
-    <w:bookmarkEnd w:id="320"/>
-    <w:bookmarkStart w:id="322" w:name="ref-zhang2022fiveartemisia"/>
+    <w:bookmarkEnd w:id="322"/>
+    <w:bookmarkStart w:id="324" w:name="ref-zhang2022fiveartemisia"/>
     <w:p>
       <w:pPr>
         <w:pStyle w:val="Bibliography"/>
@@ -20773,7 +20891,7 @@
       <w:r>
         <w:t xml:space="preserve"> </w:t>
       </w:r>
-      <w:hyperlink r:id="rId321">
+      <w:hyperlink r:id="rId323">
         <w:r>
           <w:rPr>
             <w:rStyle w:val="Hyperlink"/>
@@ -20785,8 +20903,8 @@
         <w:t xml:space="preserve">.</w:t>
       </w:r>
     </w:p>
-    <w:bookmarkEnd w:id="322"/>
-    <w:bookmarkStart w:id="324" w:name="ref-zhang2026annuaenhancement"/>
+    <w:bookmarkEnd w:id="324"/>
+    <w:bookmarkStart w:id="326" w:name="ref-zhang2026annuaenhancement"/>
     <w:p>
       <w:pPr>
         <w:pStyle w:val="Bibliography"/>
@@ -20832,7 +20950,7 @@
       <w:r>
         <w:t xml:space="preserve"> </w:t>
       </w:r>
-      <w:hyperlink r:id="rId323">
+      <w:hyperlink r:id="rId325">
         <w:r>
           <w:rPr>
             <w:rStyle w:val="Hyperlink"/>
@@ -20844,8 +20962,8 @@
         <w:t xml:space="preserve">.</w:t>
       </w:r>
     </w:p>
-    <w:bookmarkEnd w:id="324"/>
-    <w:bookmarkStart w:id="326" w:name="ref-zhang2020argyitriterpenoids"/>
+    <w:bookmarkEnd w:id="326"/>
+    <w:bookmarkStart w:id="328" w:name="ref-zhang2020argyitriterpenoids"/>
     <w:p>
       <w:pPr>
         <w:pStyle w:val="Bibliography"/>
@@ -20888,7 +21006,7 @@
       <w:r>
         <w:t xml:space="preserve"> </w:t>
       </w:r>
-      <w:hyperlink r:id="rId325">
+      <w:hyperlink r:id="rId327">
         <w:r>
           <w:rPr>
             <w:rStyle w:val="Hyperlink"/>
@@ -20900,8 +21018,8 @@
         <w:t xml:space="preserve">.</w:t>
       </w:r>
     </w:p>
-    <w:bookmarkEnd w:id="326"/>
-    <w:bookmarkStart w:id="328" w:name="ref-zhang2019pp2c1"/>
+    <w:bookmarkEnd w:id="328"/>
+    <w:bookmarkStart w:id="330" w:name="ref-zhang2019pp2c1"/>
     <w:p>
       <w:pPr>
         <w:pStyle w:val="Bibliography"/>
@@ -20953,7 +21071,7 @@
       <w:r>
         <w:t xml:space="preserve"> </w:t>
       </w:r>
-      <w:hyperlink r:id="rId327">
+      <w:hyperlink r:id="rId329">
         <w:r>
           <w:rPr>
             <w:rStyle w:val="Hyperlink"/>
@@ -20965,8 +21083,8 @@
         <w:t xml:space="preserve">.</w:t>
       </w:r>
     </w:p>
-    <w:bookmarkEnd w:id="328"/>
-    <w:bookmarkStart w:id="330" w:name="ref-zhang2008dbr2"/>
+    <w:bookmarkEnd w:id="330"/>
+    <w:bookmarkStart w:id="332" w:name="ref-zhang2008dbr2"/>
     <w:p>
       <w:pPr>
         <w:pStyle w:val="Bibliography"/>
@@ -21000,7 +21118,7 @@
       <w:r>
         <w:t xml:space="preserve"> </w:t>
       </w:r>
-      <w:hyperlink r:id="rId329">
+      <w:hyperlink r:id="rId331">
         <w:r>
           <w:rPr>
             <w:rStyle w:val="Hyperlink"/>
@@ -21012,8 +21130,8 @@
         <w:t xml:space="preserve">.</w:t>
       </w:r>
     </w:p>
-    <w:bookmarkEnd w:id="330"/>
-    <w:bookmarkStart w:id="332" w:name="ref-frigida2023variability"/>
+    <w:bookmarkEnd w:id="332"/>
+    <w:bookmarkStart w:id="334" w:name="ref-frigida2023variability"/>
     <w:p>
       <w:pPr>
         <w:pStyle w:val="Bibliography"/>
@@ -21047,7 +21165,7 @@
       <w:r>
         <w:t xml:space="preserve"> </w:t>
       </w:r>
-      <w:hyperlink r:id="rId331">
+      <w:hyperlink r:id="rId333">
         <w:r>
           <w:rPr>
             <w:rStyle w:val="Hyperlink"/>
@@ -21059,9 +21177,9 @@
         <w:t xml:space="preserve">.</w:t>
       </w:r>
     </w:p>
-    <w:bookmarkEnd w:id="332"/>
-    <w:bookmarkEnd w:id="333"/>
     <w:bookmarkEnd w:id="334"/>
+    <w:bookmarkEnd w:id="335"/>
+    <w:bookmarkEnd w:id="336"/>
     <w:sectPr>
       <w:headerReference w:type="default" r:id="rId9"/>
       <w:footerReference w:type="default" r:id="rId10"/>

</xml_diff>

<commit_message>
Align submission package with journal guidance
</commit_message>
<xml_diff>
--- a/manuscript/artemisia-terpene-review-submission.docx
+++ b/manuscript/artemisia-terpene-review-submission.docx
@@ -2,7 +2,7 @@
 <file path=word/document.xml><?xml version="1.0" encoding="utf-8"?>
 <w:document xmlns:w="http://schemas.openxmlformats.org/wordprocessingml/2006/main" xmlns:m="http://schemas.openxmlformats.org/officeDocument/2006/math" xmlns:r="http://schemas.openxmlformats.org/officeDocument/2006/relationships" xmlns:o="urn:schemas-microsoft-com:office:office" xmlns:v="urn:schemas-microsoft-com:vml" xmlns:w10="urn:schemas-microsoft-com:office:word" xmlns:a="http://schemas.openxmlformats.org/drawingml/2006/main" xmlns:pic="http://schemas.openxmlformats.org/drawingml/2006/picture" xmlns:wp="http://schemas.openxmlformats.org/drawingml/2006/wordprocessingDrawing">
   <w:body>
-    <w:bookmarkStart w:id="50" w:name="Xffc1ca5543335e1a2c5b446fb63ae2173388373"/>
+    <w:bookmarkStart w:id="52" w:name="Xffc1ca5543335e1a2c5b446fb63ae2173388373"/>
     <w:p>
       <w:pPr>
         <w:pStyle w:val="Heading1"/>
@@ -12638,7 +12638,7 @@
       </w:r>
     </w:p>
     <w:bookmarkEnd w:id="40"/>
-    <w:bookmarkStart w:id="41" w:name="data-and-code-availability"/>
+    <w:bookmarkStart w:id="43" w:name="data-and-code-availability"/>
     <w:p>
       <w:pPr>
         <w:pStyle w:val="Heading2"/>
@@ -12654,7 +12654,50 @@
         <w:spacing w:before="0" w:after="120" w:line="264" w:lineRule="auto"/>
       </w:pPr>
       <w:r>
-        <w:t xml:space="preserve">The complete auditable package is maintained in the Terpedia KB under the review-package directory and linked to the public</w:t>
+        <w:t xml:space="preserve">The complete auditable package is maintained in the</w:t>
+      </w:r>
+      <w:r>
+        <w:t xml:space="preserve"> </w:t>
+      </w:r>
+      <w:hyperlink r:id="rId41">
+        <w:r>
+          <w:rPr>
+            <w:rStyle w:val="Hyperlink"/>
+          </w:rPr>
+          <w:t xml:space="preserve">Terpedia KB review package</w:t>
+        </w:r>
+      </w:hyperlink>
+      <w:r>
+        <w:t xml:space="preserve"> </w:t>
+      </w:r>
+      <w:r>
+        <w:t xml:space="preserve">and linked to the public</w:t>
+      </w:r>
+      <w:r>
+        <w:t xml:space="preserve"> </w:t>
+      </w:r>
+      <w:hyperlink r:id="rId42">
+        <w:r>
+          <w:rPr>
+            <w:rStyle w:val="VerbatimChar"/>
+          </w:rPr>
+          <w:t xml:space="preserve">artemisia</w:t>
+        </w:r>
+        <w:r>
+          <w:rPr>
+            <w:rStyle w:val="Hyperlink"/>
+          </w:rPr>
+          <w:t xml:space="preserve"> </w:t>
+        </w:r>
+        <w:r>
+          <w:rPr>
+            <w:rStyle w:val="Hyperlink"/>
+          </w:rPr>
+          <w:t xml:space="preserve">source repository</w:t>
+        </w:r>
+      </w:hyperlink>
+      <w:r>
+        <w:t xml:space="preserve">. The extended evidence-rich draft is retained as</w:t>
       </w:r>
       <w:r>
         <w:t xml:space="preserve"> </w:t>
@@ -12663,13 +12706,10 @@
         <w:rPr>
           <w:rStyle w:val="VerbatimChar"/>
         </w:rPr>
-        <w:t xml:space="preserve">artemisia</w:t>
-      </w:r>
-      <w:r>
-        <w:t xml:space="preserve"> </w:t>
-      </w:r>
-      <w:r>
-        <w:t xml:space="preserve">source repository. The extended evidence-rich draft is retained as</w:t>
+        <w:t xml:space="preserve">article.md</w:t>
+      </w:r>
+      <w:r>
+        <w:t xml:space="preserve">; this file is the consolidated submission version. Large comparative-genomics inputs and outputs, search snapshots, structured evidence tables, claim audits, and SHA-256 manifests are versioned in the same package. The frozen source state is identified by commit</w:t>
       </w:r>
       <w:r>
         <w:t xml:space="preserve"> </w:t>
@@ -12678,14 +12718,29 @@
         <w:rPr>
           <w:rStyle w:val="VerbatimChar"/>
         </w:rPr>
-        <w:t xml:space="preserve">article.md</w:t>
-      </w:r>
-      <w:r>
-        <w:t xml:space="preserve">; this file is the consolidated submission version. Large comparative-genomics inputs and outputs, search snapshots, structured evidence tables, claim audits, and SHA-256 manifests are versioned in the same package.</w:t>
-      </w:r>
-    </w:p>
-    <w:bookmarkEnd w:id="41"/>
-    <w:bookmarkStart w:id="49" w:name="statements-and-declarations"/>
+        <w:t xml:space="preserve">1ada072</w:t>
+      </w:r>
+      <w:r>
+        <w:t xml:space="preserve">; the current Terpedia snapshot is maintained on the</w:t>
+      </w:r>
+      <w:r>
+        <w:t xml:space="preserve"> </w:t>
+      </w:r>
+      <w:r>
+        <w:rPr>
+          <w:rStyle w:val="VerbatimChar"/>
+        </w:rPr>
+        <w:t xml:space="preserve">docs-clean</w:t>
+      </w:r>
+      <w:r>
+        <w:t xml:space="preserve"> </w:t>
+      </w:r>
+      <w:r>
+        <w:t xml:space="preserve">branch. No new human or animal data were generated for this review.</w:t>
+      </w:r>
+    </w:p>
+    <w:bookmarkEnd w:id="43"/>
+    <w:bookmarkStart w:id="51" w:name="statements-and-declarations"/>
     <w:p>
       <w:pPr>
         <w:pStyle w:val="Heading2"/>
@@ -12695,7 +12750,7 @@
         <w:t xml:space="preserve">Statements and Declarations</w:t>
       </w:r>
     </w:p>
-    <w:bookmarkStart w:id="42" w:name="funding"/>
+    <w:bookmarkStart w:id="44" w:name="funding"/>
     <w:p>
       <w:pPr>
         <w:pStyle w:val="Heading3"/>
@@ -12714,8 +12769,8 @@
         <w:t xml:space="preserve">Funding information must be confirmed by the submitting authors. The current Terpedia package records no grant attribution.</w:t>
       </w:r>
     </w:p>
-    <w:bookmarkEnd w:id="42"/>
-    <w:bookmarkStart w:id="43" w:name="competing-interests"/>
+    <w:bookmarkEnd w:id="44"/>
+    <w:bookmarkStart w:id="45" w:name="competing-interests"/>
     <w:p>
       <w:pPr>
         <w:pStyle w:val="Heading3"/>
@@ -12734,8 +12789,8 @@
         <w:t xml:space="preserve">The submitting authors must confirm and enter the applicable financial and non-financial competing-interest statement in the journal submission interface.</w:t>
       </w:r>
     </w:p>
-    <w:bookmarkEnd w:id="43"/>
-    <w:bookmarkStart w:id="44" w:name="Xd182db0490b2de20bd2b4e4cc8698599182035f"/>
+    <w:bookmarkEnd w:id="45"/>
+    <w:bookmarkStart w:id="46" w:name="Xd182db0490b2de20bd2b4e4cc8698599182035f"/>
     <w:p>
       <w:pPr>
         <w:pStyle w:val="Heading3"/>
@@ -12754,8 +12809,8 @@
         <w:t xml:space="preserve">Not applicable. This review uses published literature and versioned public evidence records and reports no new human or animal experimentation.</w:t>
       </w:r>
     </w:p>
-    <w:bookmarkEnd w:id="44"/>
-    <w:bookmarkStart w:id="45" w:name="consent-for-publication"/>
+    <w:bookmarkEnd w:id="46"/>
+    <w:bookmarkStart w:id="47" w:name="consent-for-publication"/>
     <w:p>
       <w:pPr>
         <w:pStyle w:val="Heading3"/>
@@ -12774,8 +12829,8 @@
         <w:t xml:space="preserve">Not applicable.</w:t>
       </w:r>
     </w:p>
-    <w:bookmarkEnd w:id="45"/>
-    <w:bookmarkStart w:id="46" w:name="author-contributions"/>
+    <w:bookmarkEnd w:id="47"/>
+    <w:bookmarkStart w:id="48" w:name="author-contributions"/>
     <w:p>
       <w:pPr>
         <w:pStyle w:val="Heading3"/>
@@ -12794,8 +12849,8 @@
         <w:t xml:space="preserve">Author names and CRediT roles must be supplied and approved by the submitting authors. The package separates literature retrieval, evidence extraction, comparative-genomics analysis, manuscript drafting, and critical revision as assignable roles.</w:t>
       </w:r>
     </w:p>
-    <w:bookmarkEnd w:id="46"/>
-    <w:bookmarkStart w:id="47" w:name="acknowledgements"/>
+    <w:bookmarkEnd w:id="48"/>
+    <w:bookmarkStart w:id="49" w:name="acknowledgements"/>
     <w:p>
       <w:pPr>
         <w:pStyle w:val="Heading3"/>
@@ -12814,8 +12869,8 @@
         <w:t xml:space="preserve">Acknowledgements and institutional support must be confirmed by the submitting authors.</w:t>
       </w:r>
     </w:p>
-    <w:bookmarkEnd w:id="47"/>
-    <w:bookmarkStart w:id="48" w:name="use-of-artificial-intelligence"/>
+    <w:bookmarkEnd w:id="49"/>
+    <w:bookmarkStart w:id="50" w:name="use-of-artificial-intelligence"/>
     <w:p>
       <w:pPr>
         <w:pStyle w:val="Heading3"/>
@@ -12834,10 +12889,10 @@
         <w:t xml:space="preserve">An AI-assisted workflow was used during evidence organization, source-linked drafting, citation conversion, and editorial revision. The Terpedia registry, row-level evidence records, full-text verification fields, and rendered manuscript remain the auditable work products; human authors must independently verify the final text, approve authorship, and accept responsibility for the submission.</w:t>
       </w:r>
     </w:p>
-    <w:bookmarkEnd w:id="48"/>
-    <w:bookmarkEnd w:id="49"/>
     <w:bookmarkEnd w:id="50"/>
-    <w:bookmarkStart w:id="336" w:name="references"/>
+    <w:bookmarkEnd w:id="51"/>
+    <w:bookmarkEnd w:id="52"/>
+    <w:bookmarkStart w:id="338" w:name="references"/>
     <w:p>
       <w:pPr>
         <w:pStyle w:val="Heading1"/>
@@ -12847,8 +12902,8 @@
         <w:t xml:space="preserve">References</w:t>
       </w:r>
     </w:p>
-    <w:bookmarkStart w:id="335" w:name="refs"/>
-    <w:bookmarkStart w:id="52" w:name="ref-abad2012artemisia"/>
+    <w:bookmarkStart w:id="337" w:name="refs"/>
+    <w:bookmarkStart w:id="54" w:name="ref-abad2012artemisia"/>
     <w:p>
       <w:pPr>
         <w:pStyle w:val="Bibliography"/>
@@ -12882,7 +12937,7 @@
       <w:r>
         <w:t xml:space="preserve"> </w:t>
       </w:r>
-      <w:hyperlink r:id="rId51">
+      <w:hyperlink r:id="rId53">
         <w:r>
           <w:rPr>
             <w:rStyle w:val="Hyperlink"/>
@@ -12894,8 +12949,8 @@
         <w:t xml:space="preserve">.</w:t>
       </w:r>
     </w:p>
-    <w:bookmarkEnd w:id="52"/>
-    <w:bookmarkStart w:id="54" w:name="ref-abidi2018campestris"/>
+    <w:bookmarkEnd w:id="54"/>
+    <w:bookmarkStart w:id="56" w:name="ref-abidi2018campestris"/>
     <w:p>
       <w:pPr>
         <w:pStyle w:val="Bibliography"/>
@@ -12929,7 +12984,7 @@
       <w:r>
         <w:t xml:space="preserve"> </w:t>
       </w:r>
-      <w:hyperlink r:id="rId53">
+      <w:hyperlink r:id="rId55">
         <w:r>
           <w:rPr>
             <w:rStyle w:val="Hyperlink"/>
@@ -12941,8 +12996,8 @@
         <w:t xml:space="preserve">.</w:t>
       </w:r>
     </w:p>
-    <w:bookmarkEnd w:id="54"/>
-    <w:bookmarkStart w:id="56" w:name="ref-abolaji2013pregnancy"/>
+    <w:bookmarkEnd w:id="56"/>
+    <w:bookmarkStart w:id="58" w:name="ref-abolaji2013pregnancy"/>
     <w:p>
       <w:pPr>
         <w:pStyle w:val="Bibliography"/>
@@ -13000,7 +13055,7 @@
       <w:r>
         <w:t xml:space="preserve"> </w:t>
       </w:r>
-      <w:hyperlink r:id="rId55">
+      <w:hyperlink r:id="rId57">
         <w:r>
           <w:rPr>
             <w:rStyle w:val="Hyperlink"/>
@@ -13012,8 +13067,8 @@
         <w:t xml:space="preserve">.</w:t>
       </w:r>
     </w:p>
-    <w:bookmarkEnd w:id="56"/>
-    <w:bookmarkStart w:id="58" w:name="ref-ahmed2020herbaalba"/>
+    <w:bookmarkEnd w:id="58"/>
+    <w:bookmarkStart w:id="60" w:name="ref-ahmed2020herbaalba"/>
     <w:p>
       <w:pPr>
         <w:pStyle w:val="Bibliography"/>
@@ -13080,7 +13135,7 @@
       <w:r>
         <w:t xml:space="preserve"> </w:t>
       </w:r>
-      <w:hyperlink r:id="rId57">
+      <w:hyperlink r:id="rId59">
         <w:r>
           <w:rPr>
             <w:rStyle w:val="Hyperlink"/>
@@ -13092,8 +13147,8 @@
         <w:t xml:space="preserve">.</w:t>
       </w:r>
     </w:p>
-    <w:bookmarkEnd w:id="58"/>
-    <w:bookmarkStart w:id="60" w:name="ref-akkari2014campestris"/>
+    <w:bookmarkEnd w:id="60"/>
+    <w:bookmarkStart w:id="62" w:name="ref-akkari2014campestris"/>
     <w:p>
       <w:pPr>
         <w:pStyle w:val="Bibliography"/>
@@ -13151,7 +13206,7 @@
       <w:r>
         <w:t xml:space="preserve"> </w:t>
       </w:r>
-      <w:hyperlink r:id="rId59">
+      <w:hyperlink r:id="rId61">
         <w:r>
           <w:rPr>
             <w:rStyle w:val="Hyperlink"/>
@@ -13163,8 +13218,8 @@
         <w:t xml:space="preserve">.</w:t>
       </w:r>
     </w:p>
-    <w:bookmarkEnd w:id="60"/>
-    <w:bookmarkStart w:id="62" w:name="ref-akkawi2014origin"/>
+    <w:bookmarkEnd w:id="62"/>
+    <w:bookmarkStart w:id="64" w:name="ref-akkawi2014origin"/>
     <w:p>
       <w:pPr>
         <w:pStyle w:val="Bibliography"/>
@@ -13219,7 +13274,7 @@
       <w:r>
         <w:t xml:space="preserve"> </w:t>
       </w:r>
-      <w:hyperlink r:id="rId61">
+      <w:hyperlink r:id="rId63">
         <w:r>
           <w:rPr>
             <w:rStyle w:val="Hyperlink"/>
@@ -13231,8 +13286,8 @@
         <w:t xml:space="preserve">.</w:t>
       </w:r>
     </w:p>
-    <w:bookmarkEnd w:id="62"/>
-    <w:bookmarkStart w:id="64" w:name="ref-alhadrami2021endophytes"/>
+    <w:bookmarkEnd w:id="64"/>
+    <w:bookmarkStart w:id="66" w:name="ref-alhadrami2021endophytes"/>
     <w:p>
       <w:pPr>
         <w:pStyle w:val="Bibliography"/>
@@ -13278,7 +13333,7 @@
       <w:r>
         <w:t xml:space="preserve"> </w:t>
       </w:r>
-      <w:hyperlink r:id="rId63">
+      <w:hyperlink r:id="rId65">
         <w:r>
           <w:rPr>
             <w:rStyle w:val="Hyperlink"/>
@@ -13290,8 +13345,8 @@
         <w:t xml:space="preserve">.</w:t>
       </w:r>
     </w:p>
-    <w:bookmarkEnd w:id="64"/>
-    <w:bookmarkStart w:id="66" w:name="ref-almeida2016schistosoma"/>
+    <w:bookmarkEnd w:id="66"/>
+    <w:bookmarkStart w:id="68" w:name="ref-almeida2016schistosoma"/>
     <w:p>
       <w:pPr>
         <w:pStyle w:val="Bibliography"/>
@@ -13325,7 +13380,7 @@
       <w:r>
         <w:t xml:space="preserve"> </w:t>
       </w:r>
-      <w:hyperlink r:id="rId65">
+      <w:hyperlink r:id="rId67">
         <w:r>
           <w:rPr>
             <w:rStyle w:val="Hyperlink"/>
@@ -13337,8 +13392,8 @@
         <w:t xml:space="preserve">.</w:t>
       </w:r>
     </w:p>
-    <w:bookmarkEnd w:id="66"/>
-    <w:bookmarkStart w:id="68" w:name="ref-taibi2016leishmania"/>
+    <w:bookmarkEnd w:id="68"/>
+    <w:bookmarkStart w:id="70" w:name="ref-taibi2016leishmania"/>
     <w:p>
       <w:pPr>
         <w:pStyle w:val="Bibliography"/>
@@ -13372,7 +13427,7 @@
       <w:r>
         <w:t xml:space="preserve"> </w:t>
       </w:r>
-      <w:hyperlink r:id="rId67">
+      <w:hyperlink r:id="rId69">
         <w:r>
           <w:rPr>
             <w:rStyle w:val="Hyperlink"/>
@@ -13384,8 +13439,8 @@
         <w:t xml:space="preserve">.</w:t>
       </w:r>
     </w:p>
-    <w:bookmarkEnd w:id="68"/>
-    <w:bookmarkStart w:id="70" w:name="ref-arab2006sieberi"/>
+    <w:bookmarkEnd w:id="70"/>
+    <w:bookmarkStart w:id="72" w:name="ref-arab2006sieberi"/>
     <w:p>
       <w:pPr>
         <w:pStyle w:val="Bibliography"/>
@@ -13419,7 +13474,7 @@
       <w:r>
         <w:t xml:space="preserve"> </w:t>
       </w:r>
-      <w:hyperlink r:id="rId69">
+      <w:hyperlink r:id="rId71">
         <w:r>
           <w:rPr>
             <w:rStyle w:val="Hyperlink"/>
@@ -13431,8 +13486,8 @@
         <w:t xml:space="preserve">.</w:t>
       </w:r>
     </w:p>
-    <w:bookmarkEnd w:id="70"/>
-    <w:bookmarkStart w:id="72" w:name="ref-arango2024cina"/>
+    <w:bookmarkEnd w:id="72"/>
+    <w:bookmarkStart w:id="74" w:name="ref-arango2024cina"/>
     <w:p>
       <w:pPr>
         <w:pStyle w:val="Bibliography"/>
@@ -13466,7 +13521,7 @@
       <w:r>
         <w:t xml:space="preserve"> </w:t>
       </w:r>
-      <w:hyperlink r:id="rId71">
+      <w:hyperlink r:id="rId73">
         <w:r>
           <w:rPr>
             <w:rStyle w:val="Hyperlink"/>
@@ -13478,8 +13533,8 @@
         <w:t xml:space="preserve">.</w:t>
       </w:r>
     </w:p>
-    <w:bookmarkEnd w:id="72"/>
-    <w:bookmarkStart w:id="74" w:name="ref-arango2024peruvin"/>
+    <w:bookmarkEnd w:id="74"/>
+    <w:bookmarkStart w:id="76" w:name="ref-arango2024peruvin"/>
     <w:p>
       <w:pPr>
         <w:pStyle w:val="Bibliography"/>
@@ -13549,7 +13604,7 @@
       <w:r>
         <w:t xml:space="preserve"> </w:t>
       </w:r>
-      <w:hyperlink r:id="rId73">
+      <w:hyperlink r:id="rId75">
         <w:r>
           <w:rPr>
             <w:rStyle w:val="Hyperlink"/>
@@ -13561,8 +13616,8 @@
         <w:t xml:space="preserve">.</w:t>
       </w:r>
     </w:p>
-    <w:bookmarkEnd w:id="74"/>
-    <w:bookmarkStart w:id="76" w:name="ref-ashraf2022hypnozoites"/>
+    <w:bookmarkEnd w:id="76"/>
+    <w:bookmarkStart w:id="78" w:name="ref-ashraf2022hypnozoites"/>
     <w:p>
       <w:pPr>
         <w:pStyle w:val="Bibliography"/>
@@ -13620,7 +13675,7 @@
       <w:r>
         <w:t xml:space="preserve"> </w:t>
       </w:r>
-      <w:hyperlink r:id="rId75">
+      <w:hyperlink r:id="rId77">
         <w:r>
           <w:rPr>
             <w:rStyle w:val="Hyperlink"/>
@@ -13632,8 +13687,8 @@
         <w:t xml:space="preserve">.</w:t>
       </w:r>
     </w:p>
-    <w:bookmarkEnd w:id="76"/>
-    <w:bookmarkStart w:id="78" w:name="ref-aubouy2025annuatea"/>
+    <w:bookmarkEnd w:id="78"/>
+    <w:bookmarkStart w:id="80" w:name="ref-aubouy2025annuatea"/>
     <w:p>
       <w:pPr>
         <w:pStyle w:val="Bibliography"/>
@@ -13679,7 +13734,7 @@
       <w:r>
         <w:t xml:space="preserve"> </w:t>
       </w:r>
-      <w:hyperlink r:id="rId77">
+      <w:hyperlink r:id="rId79">
         <w:r>
           <w:rPr>
             <w:rStyle w:val="Hyperlink"/>
@@ -13691,8 +13746,8 @@
         <w:t xml:space="preserve">.</w:t>
       </w:r>
     </w:p>
-    <w:bookmarkEnd w:id="78"/>
-    <w:bookmarkStart w:id="80" w:name="ref-baies2024absinthium"/>
+    <w:bookmarkEnd w:id="80"/>
+    <w:bookmarkStart w:id="82" w:name="ref-baies2024absinthium"/>
     <w:p>
       <w:pPr>
         <w:pStyle w:val="Bibliography"/>
@@ -13726,7 +13781,7 @@
       <w:r>
         <w:t xml:space="preserve"> </w:t>
       </w:r>
-      <w:hyperlink r:id="rId79">
+      <w:hyperlink r:id="rId81">
         <w:r>
           <w:rPr>
             <w:rStyle w:val="Hyperlink"/>
@@ -13738,8 +13793,8 @@
         <w:t xml:space="preserve">.</w:t>
       </w:r>
     </w:p>
-    <w:bookmarkEnd w:id="80"/>
-    <w:bookmarkStart w:id="82" w:name="ref-baies2022ascariswormwood"/>
+    <w:bookmarkEnd w:id="82"/>
+    <w:bookmarkStart w:id="84" w:name="ref-baies2022ascariswormwood"/>
     <w:p>
       <w:pPr>
         <w:pStyle w:val="Bibliography"/>
@@ -13857,7 +13912,7 @@
       <w:r>
         <w:t xml:space="preserve"> </w:t>
       </w:r>
-      <w:hyperlink r:id="rId81">
+      <w:hyperlink r:id="rId83">
         <w:r>
           <w:rPr>
             <w:rStyle w:val="Hyperlink"/>
@@ -13869,8 +13924,8 @@
         <w:t xml:space="preserve">.</w:t>
       </w:r>
     </w:p>
-    <w:bookmarkEnd w:id="82"/>
-    <w:bookmarkStart w:id="84" w:name="ref-balaich2016parthenin"/>
+    <w:bookmarkEnd w:id="84"/>
+    <w:bookmarkStart w:id="86" w:name="ref-balaich2016parthenin"/>
     <w:p>
       <w:pPr>
         <w:pStyle w:val="Bibliography"/>
@@ -13916,7 +13971,7 @@
       <w:r>
         <w:t xml:space="preserve"> </w:t>
       </w:r>
-      <w:hyperlink r:id="rId83">
+      <w:hyperlink r:id="rId85">
         <w:r>
           <w:rPr>
             <w:rStyle w:val="Hyperlink"/>
@@ -13928,8 +13983,8 @@
         <w:t xml:space="preserve">.</w:t>
       </w:r>
     </w:p>
-    <w:bookmarkEnd w:id="84"/>
-    <w:bookmarkStart w:id="86" w:name="ref-beshay2018absinthiumhymenolepis"/>
+    <w:bookmarkEnd w:id="86"/>
+    <w:bookmarkStart w:id="88" w:name="ref-beshay2018absinthiumhymenolepis"/>
     <w:p>
       <w:pPr>
         <w:pStyle w:val="Bibliography"/>
@@ -13984,7 +14039,7 @@
       <w:r>
         <w:t xml:space="preserve"> </w:t>
       </w:r>
-      <w:hyperlink r:id="rId85">
+      <w:hyperlink r:id="rId87">
         <w:r>
           <w:rPr>
             <w:rStyle w:val="Hyperlink"/>
@@ -13996,8 +14051,8 @@
         <w:t xml:space="preserve">.</w:t>
       </w:r>
     </w:p>
-    <w:bookmarkEnd w:id="86"/>
-    <w:bookmarkStart w:id="88" w:name="ref-blagojevic2015absinthiumstorage"/>
+    <w:bookmarkEnd w:id="88"/>
+    <w:bookmarkStart w:id="90" w:name="ref-blagojevic2015absinthiumstorage"/>
     <w:p>
       <w:pPr>
         <w:pStyle w:val="Bibliography"/>
@@ -14053,7 +14108,7 @@
       <w:r>
         <w:t xml:space="preserve"> </w:t>
       </w:r>
-      <w:hyperlink r:id="rId87">
+      <w:hyperlink r:id="rId89">
         <w:r>
           <w:rPr>
             <w:rStyle w:val="Hyperlink"/>
@@ -14065,8 +14120,8 @@
         <w:t xml:space="preserve">.</w:t>
       </w:r>
     </w:p>
-    <w:bookmarkEnd w:id="88"/>
-    <w:bookmarkStart w:id="90" w:name="ref-bouwmeester1999ads"/>
+    <w:bookmarkEnd w:id="90"/>
+    <w:bookmarkStart w:id="92" w:name="ref-bouwmeester1999ads"/>
     <w:p>
       <w:pPr>
         <w:pStyle w:val="Bibliography"/>
@@ -14100,7 +14155,7 @@
       <w:r>
         <w:t xml:space="preserve"> </w:t>
       </w:r>
-      <w:hyperlink r:id="rId89">
+      <w:hyperlink r:id="rId91">
         <w:r>
           <w:rPr>
             <w:rStyle w:val="Hyperlink"/>
@@ -14112,8 +14167,8 @@
         <w:t xml:space="preserve">.</w:t>
       </w:r>
     </w:p>
-    <w:bookmarkEnd w:id="90"/>
-    <w:bookmarkStart w:id="92" w:name="ref-boyko2025anthelmintic"/>
+    <w:bookmarkEnd w:id="92"/>
+    <w:bookmarkStart w:id="94" w:name="ref-boyko2025anthelmintic"/>
     <w:p>
       <w:pPr>
         <w:pStyle w:val="Bibliography"/>
@@ -14147,7 +14202,7 @@
       <w:r>
         <w:t xml:space="preserve"> </w:t>
       </w:r>
-      <w:hyperlink r:id="rId91">
+      <w:hyperlink r:id="rId93">
         <w:r>
           <w:rPr>
             <w:rStyle w:val="Hyperlink"/>
@@ -14159,8 +14214,8 @@
         <w:t xml:space="preserve">.</w:t>
       </w:r>
     </w:p>
-    <w:bookmarkEnd w:id="92"/>
-    <w:bookmarkStart w:id="94" w:name="ref-brown2003seedterpenoids"/>
+    <w:bookmarkEnd w:id="94"/>
+    <w:bookmarkStart w:id="96" w:name="ref-brown2003seedterpenoids"/>
     <w:p>
       <w:pPr>
         <w:pStyle w:val="Bibliography"/>
@@ -14194,7 +14249,7 @@
       <w:r>
         <w:t xml:space="preserve"> </w:t>
       </w:r>
-      <w:hyperlink r:id="rId93">
+      <w:hyperlink r:id="rId95">
         <w:r>
           <w:rPr>
             <w:rStyle w:val="Hyperlink"/>
@@ -14206,8 +14261,8 @@
         <w:t xml:space="preserve">.</w:t>
       </w:r>
     </w:p>
-    <w:bookmarkEnd w:id="94"/>
-    <w:bookmarkStart w:id="96" w:name="ref-cai2024topdown"/>
+    <w:bookmarkEnd w:id="96"/>
+    <w:bookmarkStart w:id="98" w:name="ref-cai2024topdown"/>
     <w:p>
       <w:pPr>
         <w:pStyle w:val="Bibliography"/>
@@ -14271,7 +14326,7 @@
       <w:r>
         <w:t xml:space="preserve"> </w:t>
       </w:r>
-      <w:hyperlink r:id="rId95">
+      <w:hyperlink r:id="rId97">
         <w:r>
           <w:rPr>
             <w:rStyle w:val="Hyperlink"/>
@@ -14283,8 +14338,8 @@
         <w:t xml:space="preserve">.</w:t>
       </w:r>
     </w:p>
-    <w:bookmarkEnd w:id="96"/>
-    <w:bookmarkStart w:id="98" w:name="ref-cala2014haemonchus"/>
+    <w:bookmarkEnd w:id="98"/>
+    <w:bookmarkStart w:id="100" w:name="ref-cala2014haemonchus"/>
     <w:p>
       <w:pPr>
         <w:pStyle w:val="Bibliography"/>
@@ -14330,7 +14385,7 @@
       <w:r>
         <w:t xml:space="preserve"> </w:t>
       </w:r>
-      <w:hyperlink r:id="rId97">
+      <w:hyperlink r:id="rId99">
         <w:r>
           <w:rPr>
             <w:rStyle w:val="Hyperlink"/>
@@ -14342,8 +14397,8 @@
         <w:t xml:space="preserve">.</w:t>
       </w:r>
     </w:p>
-    <w:bookmarkEnd w:id="98"/>
-    <w:bookmarkStart w:id="100" w:name="ref-caner2008trichinella"/>
+    <w:bookmarkEnd w:id="100"/>
+    <w:bookmarkStart w:id="102" w:name="ref-caner2008trichinella"/>
     <w:p>
       <w:pPr>
         <w:pStyle w:val="Bibliography"/>
@@ -14407,7 +14462,7 @@
       <w:r>
         <w:t xml:space="preserve"> </w:t>
       </w:r>
-      <w:hyperlink r:id="rId99">
+      <w:hyperlink r:id="rId101">
         <w:r>
           <w:rPr>
             <w:rStyle w:val="Hyperlink"/>
@@ -14419,8 +14474,8 @@
         <w:t xml:space="preserve">.</w:t>
       </w:r>
     </w:p>
-    <w:bookmarkEnd w:id="100"/>
-    <w:bookmarkStart w:id="102" w:name="ref-chang2000ads"/>
+    <w:bookmarkEnd w:id="102"/>
+    <w:bookmarkStart w:id="104" w:name="ref-chang2000ads"/>
     <w:p>
       <w:pPr>
         <w:pStyle w:val="Bibliography"/>
@@ -14454,7 +14509,7 @@
       <w:r>
         <w:t xml:space="preserve"> </w:t>
       </w:r>
-      <w:hyperlink r:id="rId101">
+      <w:hyperlink r:id="rId103">
         <w:r>
           <w:rPr>
             <w:rStyle w:val="Hyperlink"/>
@@ -14466,8 +14521,8 @@
         <w:t xml:space="preserve">.</w:t>
       </w:r>
     </w:p>
-    <w:bookmarkEnd w:id="102"/>
-    <w:bookmarkStart w:id="104" w:name="ref-chanphen1998indica"/>
+    <w:bookmarkEnd w:id="104"/>
+    <w:bookmarkStart w:id="106" w:name="ref-chanphen1998indica"/>
     <w:p>
       <w:pPr>
         <w:pStyle w:val="Bibliography"/>
@@ -14501,7 +14556,7 @@
       <w:r>
         <w:t xml:space="preserve"> </w:t>
       </w:r>
-      <w:hyperlink r:id="rId103">
+      <w:hyperlink r:id="rId105">
         <w:r>
           <w:rPr>
             <w:rStyle w:val="Hyperlink"/>
@@ -14513,8 +14568,8 @@
         <w:t xml:space="preserve">.</w:t>
       </w:r>
     </w:p>
-    <w:bookmarkEnd w:id="104"/>
-    <w:bookmarkStart w:id="106" w:name="ref-annua2021diterpenes"/>
+    <w:bookmarkEnd w:id="106"/>
+    <w:bookmarkStart w:id="108" w:name="ref-annua2021diterpenes"/>
     <w:p>
       <w:pPr>
         <w:pStyle w:val="Bibliography"/>
@@ -14548,7 +14603,7 @@
       <w:r>
         <w:t xml:space="preserve"> </w:t>
       </w:r>
-      <w:hyperlink r:id="rId105">
+      <w:hyperlink r:id="rId107">
         <w:r>
           <w:rPr>
             <w:rStyle w:val="Hyperlink"/>
@@ -14560,8 +14615,8 @@
         <w:t xml:space="preserve">.</w:t>
       </w:r>
     </w:p>
-    <w:bookmarkEnd w:id="106"/>
-    <w:bookmarkStart w:id="108" w:name="ref-chiasson2001acaricidal"/>
+    <w:bookmarkEnd w:id="108"/>
+    <w:bookmarkStart w:id="110" w:name="ref-chiasson2001acaricidal"/>
     <w:p>
       <w:pPr>
         <w:pStyle w:val="Bibliography"/>
@@ -14595,7 +14650,7 @@
       <w:r>
         <w:t xml:space="preserve"> </w:t>
       </w:r>
-      <w:hyperlink r:id="rId107">
+      <w:hyperlink r:id="rId109">
         <w:r>
           <w:rPr>
             <w:rStyle w:val="Hyperlink"/>
@@ -14607,8 +14662,8 @@
         <w:t xml:space="preserve">.</w:t>
       </w:r>
     </w:p>
-    <w:bookmarkEnd w:id="108"/>
-    <w:bookmarkStart w:id="110" w:name="ref-delacruz2025cinaewes"/>
+    <w:bookmarkEnd w:id="110"/>
+    <w:bookmarkStart w:id="112" w:name="ref-delacruz2025cinaewes"/>
     <w:p>
       <w:pPr>
         <w:pStyle w:val="Bibliography"/>
@@ -14678,7 +14733,7 @@
       <w:r>
         <w:t xml:space="preserve"> </w:t>
       </w:r>
-      <w:hyperlink r:id="rId109">
+      <w:hyperlink r:id="rId111">
         <w:r>
           <w:rPr>
             <w:rStyle w:val="Hyperlink"/>
@@ -14690,8 +14745,8 @@
         <w:t xml:space="preserve">.</w:t>
       </w:r>
     </w:p>
-    <w:bookmarkEnd w:id="110"/>
-    <w:bookmarkStart w:id="112" w:name="ref-czechowski2019wholeleaf"/>
+    <w:bookmarkEnd w:id="112"/>
+    <w:bookmarkStart w:id="114" w:name="ref-czechowski2019wholeleaf"/>
     <w:p>
       <w:pPr>
         <w:pStyle w:val="Bibliography"/>
@@ -14725,7 +14780,7 @@
       <w:r>
         <w:t xml:space="preserve"> </w:t>
       </w:r>
-      <w:hyperlink r:id="rId111">
+      <w:hyperlink r:id="rId113">
         <w:r>
           <w:rPr>
             <w:rStyle w:val="Hyperlink"/>
@@ -14737,8 +14792,8 @@
         <w:t xml:space="preserve">.</w:t>
       </w:r>
     </w:p>
-    <w:bookmarkEnd w:id="112"/>
-    <w:bookmarkStart w:id="114" w:name="ref-elfawal2015wholeplant"/>
+    <w:bookmarkEnd w:id="114"/>
+    <w:bookmarkStart w:id="116" w:name="ref-elfawal2015wholeplant"/>
     <w:p>
       <w:pPr>
         <w:pStyle w:val="Bibliography"/>
@@ -14772,7 +14827,7 @@
       <w:r>
         <w:t xml:space="preserve"> </w:t>
       </w:r>
-      <w:hyperlink r:id="rId113">
+      <w:hyperlink r:id="rId115">
         <w:r>
           <w:rPr>
             <w:rStyle w:val="Hyperlink"/>
@@ -14784,8 +14839,8 @@
         <w:t xml:space="preserve">.</w:t>
       </w:r>
     </w:p>
-    <w:bookmarkEnd w:id="114"/>
-    <w:bookmarkStart w:id="116" w:name="ref-elfawal2012wholeplant"/>
+    <w:bookmarkEnd w:id="116"/>
+    <w:bookmarkStart w:id="118" w:name="ref-elfawal2012wholeplant"/>
     <w:p>
       <w:pPr>
         <w:pStyle w:val="Bibliography"/>
@@ -14831,7 +14886,7 @@
       <w:r>
         <w:t xml:space="preserve"> </w:t>
       </w:r>
-      <w:hyperlink r:id="rId115">
+      <w:hyperlink r:id="rId117">
         <w:r>
           <w:rPr>
             <w:rStyle w:val="Hyperlink"/>
@@ -14843,8 +14898,8 @@
         <w:t xml:space="preserve">.</w:t>
       </w:r>
     </w:p>
-    <w:bookmarkEnd w:id="116"/>
-    <w:bookmarkStart w:id="118" w:name="ref-evlice2026artemisiaoilsnematodes"/>
+    <w:bookmarkEnd w:id="118"/>
+    <w:bookmarkStart w:id="120" w:name="ref-evlice2026artemisiaoilsnematodes"/>
     <w:p>
       <w:pPr>
         <w:pStyle w:val="Bibliography"/>
@@ -14902,7 +14957,7 @@
       <w:r>
         <w:t xml:space="preserve"> </w:t>
       </w:r>
-      <w:hyperlink r:id="rId117">
+      <w:hyperlink r:id="rId119">
         <w:r>
           <w:rPr>
             <w:rStyle w:val="Hyperlink"/>
@@ -14914,8 +14969,8 @@
         <w:t xml:space="preserve">.</w:t>
       </w:r>
     </w:p>
-    <w:bookmarkEnd w:id="118"/>
-    <w:bookmarkStart w:id="120" w:name="ref-ezeta2023ludovicianafasciola"/>
+    <w:bookmarkEnd w:id="120"/>
+    <w:bookmarkStart w:id="122" w:name="ref-ezeta2023ludovicianafasciola"/>
     <w:p>
       <w:pPr>
         <w:pStyle w:val="Bibliography"/>
@@ -14970,7 +15025,7 @@
       <w:r>
         <w:t xml:space="preserve"> </w:t>
       </w:r>
-      <w:hyperlink r:id="rId119">
+      <w:hyperlink r:id="rId121">
         <w:r>
           <w:rPr>
             <w:rStyle w:val="Hyperlink"/>
@@ -14982,8 +15037,8 @@
         <w:t xml:space="preserve">.</w:t>
       </w:r>
     </w:p>
-    <w:bookmarkEnd w:id="120"/>
-    <w:bookmarkStart w:id="122" w:name="ref-fabre2025cadinapyridine"/>
+    <w:bookmarkEnd w:id="122"/>
+    <w:bookmarkStart w:id="124" w:name="ref-fabre2025cadinapyridine"/>
     <w:p>
       <w:pPr>
         <w:pStyle w:val="Bibliography"/>
@@ -15029,7 +15084,7 @@
       <w:r>
         <w:t xml:space="preserve"> </w:t>
       </w:r>
-      <w:hyperlink r:id="rId121">
+      <w:hyperlink r:id="rId123">
         <w:r>
           <w:rPr>
             <w:rStyle w:val="Hyperlink"/>
@@ -15041,8 +15096,8 @@
         <w:t xml:space="preserve">.</w:t>
       </w:r>
     </w:p>
-    <w:bookmarkEnd w:id="122"/>
-    <w:bookmarkStart w:id="124" w:name="ref-ferreira2024hydrotrope"/>
+    <w:bookmarkEnd w:id="124"/>
+    <w:bookmarkStart w:id="126" w:name="ref-ferreira2024hydrotrope"/>
     <w:p>
       <w:pPr>
         <w:pStyle w:val="Bibliography"/>
@@ -15098,7 +15153,7 @@
       <w:r>
         <w:t xml:space="preserve"> </w:t>
       </w:r>
-      <w:hyperlink r:id="rId123">
+      <w:hyperlink r:id="rId125">
         <w:r>
           <w:rPr>
             <w:rStyle w:val="Hyperlink"/>
@@ -15110,8 +15165,8 @@
         <w:t xml:space="preserve">.</w:t>
       </w:r>
     </w:p>
-    <w:bookmarkEnd w:id="124"/>
-    <w:bookmarkStart w:id="126" w:name="ref-fu2017pdr3"/>
+    <w:bookmarkEnd w:id="126"/>
+    <w:bookmarkStart w:id="128" w:name="ref-fu2017pdr3"/>
     <w:p>
       <w:pPr>
         <w:pStyle w:val="Bibliography"/>
@@ -15160,7 +15215,7 @@
       <w:r>
         <w:t xml:space="preserve"> </w:t>
       </w:r>
-      <w:hyperlink r:id="rId125">
+      <w:hyperlink r:id="rId127">
         <w:r>
           <w:rPr>
             <w:rStyle w:val="Hyperlink"/>
@@ -15172,8 +15227,8 @@
         <w:t xml:space="preserve">.</w:t>
       </w:r>
     </w:p>
-    <w:bookmarkEnd w:id="126"/>
-    <w:bookmarkStart w:id="128" w:name="ref-garciarodriguez2015absinthium"/>
+    <w:bookmarkEnd w:id="128"/>
+    <w:bookmarkStart w:id="130" w:name="ref-garciarodriguez2015absinthium"/>
     <w:p>
       <w:pPr>
         <w:pStyle w:val="Bibliography"/>
@@ -15207,7 +15262,7 @@
       <w:r>
         <w:t xml:space="preserve"> </w:t>
       </w:r>
-      <w:hyperlink r:id="rId127">
+      <w:hyperlink r:id="rId129">
         <w:r>
           <w:rPr>
             <w:rStyle w:val="Hyperlink"/>
@@ -15219,8 +15274,8 @@
         <w:t xml:space="preserve">.</w:t>
       </w:r>
     </w:p>
-    <w:bookmarkEnd w:id="128"/>
-    <w:bookmarkStart w:id="130" w:name="ref-gruessner2021complexartemisiaal"/>
+    <w:bookmarkEnd w:id="130"/>
+    <w:bookmarkStart w:id="132" w:name="ref-gruessner2021complexartemisiaal"/>
     <w:p>
       <w:pPr>
         <w:pStyle w:val="Bibliography"/>
@@ -15278,7 +15333,7 @@
       <w:r>
         <w:t xml:space="preserve"> </w:t>
       </w:r>
-      <w:hyperlink r:id="rId129">
+      <w:hyperlink r:id="rId131">
         <w:r>
           <w:rPr>
             <w:rStyle w:val="Hyperlink"/>
@@ -15290,8 +15345,8 @@
         <w:t xml:space="preserve">.</w:t>
       </w:r>
     </w:p>
-    <w:bookmarkEnd w:id="130"/>
-    <w:bookmarkStart w:id="132" w:name="ref-guo2023mir160"/>
+    <w:bookmarkEnd w:id="132"/>
+    <w:bookmarkStart w:id="134" w:name="ref-guo2023mir160"/>
     <w:p>
       <w:pPr>
         <w:pStyle w:val="Bibliography"/>
@@ -15334,7 +15389,7 @@
       <w:r>
         <w:t xml:space="preserve"> </w:t>
       </w:r>
-      <w:hyperlink r:id="rId131">
+      <w:hyperlink r:id="rId133">
         <w:r>
           <w:rPr>
             <w:rStyle w:val="Hyperlink"/>
@@ -15346,8 +15401,8 @@
         <w:t xml:space="preserve">.</w:t>
       </w:r>
     </w:p>
-    <w:bookmarkEnd w:id="132"/>
-    <w:bookmarkStart w:id="134" w:name="ref-guo2025dhaadh"/>
+    <w:bookmarkEnd w:id="134"/>
+    <w:bookmarkStart w:id="136" w:name="ref-guo2025dhaadh"/>
     <w:p>
       <w:pPr>
         <w:pStyle w:val="Bibliography"/>
@@ -15381,7 +15436,7 @@
       <w:r>
         <w:t xml:space="preserve"> </w:t>
       </w:r>
-      <w:hyperlink r:id="rId133">
+      <w:hyperlink r:id="rId135">
         <w:r>
           <w:rPr>
             <w:rStyle w:val="Hyperlink"/>
@@ -15393,8 +15448,8 @@
         <w:t xml:space="preserve">.</w:t>
       </w:r>
     </w:p>
-    <w:bookmarkEnd w:id="134"/>
-    <w:bookmarkStart w:id="136" w:name="ref-hernandez2025cinananoparticles"/>
+    <w:bookmarkEnd w:id="136"/>
+    <w:bookmarkStart w:id="138" w:name="ref-hernandez2025cinananoparticles"/>
     <w:p>
       <w:pPr>
         <w:pStyle w:val="Bibliography"/>
@@ -15449,7 +15504,7 @@
       <w:r>
         <w:t xml:space="preserve"> </w:t>
       </w:r>
-      <w:hyperlink r:id="rId135">
+      <w:hyperlink r:id="rId137">
         <w:r>
           <w:rPr>
             <w:rStyle w:val="Hyperlink"/>
@@ -15461,8 +15516,8 @@
         <w:t xml:space="preserve">.</w:t>
       </w:r>
     </w:p>
-    <w:bookmarkEnd w:id="136"/>
-    <w:bookmarkStart w:id="138" w:name="ref-heydari2013sieberi"/>
+    <w:bookmarkEnd w:id="138"/>
+    <w:bookmarkStart w:id="140" w:name="ref-heydari2013sieberi"/>
     <w:p>
       <w:pPr>
         <w:pStyle w:val="Bibliography"/>
@@ -15517,7 +15572,7 @@
       <w:r>
         <w:t xml:space="preserve"> </w:t>
       </w:r>
-      <w:hyperlink r:id="rId137">
+      <w:hyperlink r:id="rId139">
         <w:r>
           <w:rPr>
             <w:rStyle w:val="Hyperlink"/>
@@ -15529,8 +15584,8 @@
         <w:t xml:space="preserve">.</w:t>
       </w:r>
     </w:p>
-    <w:bookmarkEnd w:id="138"/>
-    <w:bookmarkStart w:id="140" w:name="ref-higuera2021cina"/>
+    <w:bookmarkEnd w:id="140"/>
+    <w:bookmarkStart w:id="142" w:name="ref-higuera2021cina"/>
     <w:p>
       <w:pPr>
         <w:pStyle w:val="Bibliography"/>
@@ -15600,7 +15655,7 @@
       <w:r>
         <w:t xml:space="preserve"> </w:t>
       </w:r>
-      <w:hyperlink r:id="rId139">
+      <w:hyperlink r:id="rId141">
         <w:r>
           <w:rPr>
             <w:rStyle w:val="Hyperlink"/>
@@ -15612,8 +15667,8 @@
         <w:t xml:space="preserve">.</w:t>
       </w:r>
     </w:p>
-    <w:bookmarkEnd w:id="140"/>
-    <w:bookmarkStart w:id="142" w:name="ref-higuera2023cinalignans"/>
+    <w:bookmarkEnd w:id="142"/>
+    <w:bookmarkStart w:id="144" w:name="ref-higuera2023cinalignans"/>
     <w:p>
       <w:pPr>
         <w:pStyle w:val="Bibliography"/>
@@ -15677,7 +15732,7 @@
       <w:r>
         <w:t xml:space="preserve"> </w:t>
       </w:r>
-      <w:hyperlink r:id="rId141">
+      <w:hyperlink r:id="rId143">
         <w:r>
           <w:rPr>
             <w:rStyle w:val="Hyperlink"/>
@@ -15689,8 +15744,8 @@
         <w:t xml:space="preserve">.</w:t>
       </w:r>
     </w:p>
-    <w:bookmarkEnd w:id="142"/>
-    <w:bookmarkStart w:id="144" w:name="ref-hoshiki2025herbaalbacattle"/>
+    <w:bookmarkEnd w:id="144"/>
+    <w:bookmarkStart w:id="146" w:name="ref-hoshiki2025herbaalbacattle"/>
     <w:p>
       <w:pPr>
         <w:pStyle w:val="Bibliography"/>
@@ -15742,7 +15797,7 @@
       <w:r>
         <w:t xml:space="preserve"> </w:t>
       </w:r>
-      <w:hyperlink r:id="rId143">
+      <w:hyperlink r:id="rId145">
         <w:r>
           <w:rPr>
             <w:rStyle w:val="Hyperlink"/>
@@ -15754,8 +15809,8 @@
         <w:t xml:space="preserve">.</w:t>
       </w:r>
     </w:p>
-    <w:bookmarkEnd w:id="144"/>
-    <w:bookmarkStart w:id="146" w:name="ref-hou2021argyipk"/>
+    <w:bookmarkEnd w:id="146"/>
+    <w:bookmarkStart w:id="148" w:name="ref-hou2021argyipk"/>
     <w:p>
       <w:pPr>
         <w:pStyle w:val="Bibliography"/>
@@ -15801,7 +15856,7 @@
       <w:r>
         <w:t xml:space="preserve"> </w:t>
       </w:r>
-      <w:hyperlink r:id="rId145">
+      <w:hyperlink r:id="rId147">
         <w:r>
           <w:rPr>
             <w:rStyle w:val="Hyperlink"/>
@@ -15813,8 +15868,8 @@
         <w:t xml:space="preserve">.</w:t>
       </w:r>
     </w:p>
-    <w:bookmarkEnd w:id="146"/>
-    <w:bookmarkStart w:id="148" w:name="ref-hussain2024artemisiareview"/>
+    <w:bookmarkEnd w:id="148"/>
+    <w:bookmarkStart w:id="150" w:name="ref-hussain2024artemisiareview"/>
     <w:p>
       <w:pPr>
         <w:pStyle w:val="Bibliography"/>
@@ -15848,7 +15903,7 @@
       <w:r>
         <w:t xml:space="preserve"> </w:t>
       </w:r>
-      <w:hyperlink r:id="rId147">
+      <w:hyperlink r:id="rId149">
         <w:r>
           <w:rPr>
             <w:rStyle w:val="Hyperlink"/>
@@ -15860,8 +15915,8 @@
         <w:t xml:space="preserve">.</w:t>
       </w:r>
     </w:p>
-    <w:bookmarkEnd w:id="148"/>
-    <w:bookmarkStart w:id="150" w:name="ref-hussain2025brevifolia"/>
+    <w:bookmarkEnd w:id="150"/>
+    <w:bookmarkStart w:id="152" w:name="ref-hussain2025brevifolia"/>
     <w:p>
       <w:pPr>
         <w:pStyle w:val="Bibliography"/>
@@ -15895,7 +15950,7 @@
       <w:r>
         <w:t xml:space="preserve"> </w:t>
       </w:r>
-      <w:hyperlink r:id="rId149">
+      <w:hyperlink r:id="rId151">
         <w:r>
           <w:rPr>
             <w:rStyle w:val="Hyperlink"/>
@@ -15907,8 +15962,8 @@
         <w:t xml:space="preserve">.</w:t>
       </w:r>
     </w:p>
-    <w:bookmarkEnd w:id="150"/>
-    <w:bookmarkStart w:id="152" w:name="ref-iqbal2013absinthiumcoccidiosis"/>
+    <w:bookmarkEnd w:id="152"/>
+    <w:bookmarkStart w:id="154" w:name="ref-iqbal2013absinthiumcoccidiosis"/>
     <w:p>
       <w:pPr>
         <w:pStyle w:val="Bibliography"/>
@@ -15951,7 +16006,7 @@
       <w:r>
         <w:t xml:space="preserve"> </w:t>
       </w:r>
-      <w:hyperlink r:id="rId151">
+      <w:hyperlink r:id="rId153">
         <w:r>
           <w:rPr>
             <w:rStyle w:val="Hyperlink"/>
@@ -15963,8 +16018,8 @@
         <w:t xml:space="preserve">.</w:t>
       </w:r>
     </w:p>
-    <w:bookmarkEnd w:id="152"/>
-    <w:bookmarkStart w:id="154" w:name="ref-irehan2026absinthium"/>
+    <w:bookmarkEnd w:id="154"/>
+    <w:bookmarkStart w:id="156" w:name="ref-irehan2026absinthium"/>
     <w:p>
       <w:pPr>
         <w:pStyle w:val="Bibliography"/>
@@ -15998,7 +16053,7 @@
       <w:r>
         <w:t xml:space="preserve"> </w:t>
       </w:r>
-      <w:hyperlink r:id="rId153">
+      <w:hyperlink r:id="rId155">
         <w:r>
           <w:rPr>
             <w:rStyle w:val="Hyperlink"/>
@@ -16010,8 +16065,8 @@
         <w:t xml:space="preserve">.</w:t>
       </w:r>
     </w:p>
-    <w:bookmarkEnd w:id="154"/>
-    <w:bookmarkStart w:id="156" w:name="ref-chandler2015stl"/>
+    <w:bookmarkEnd w:id="156"/>
+    <w:bookmarkStart w:id="158" w:name="ref-chandler2015stl"/>
     <w:p>
       <w:pPr>
         <w:pStyle w:val="Bibliography"/>
@@ -16045,7 +16100,7 @@
       <w:r>
         <w:t xml:space="preserve"> </w:t>
       </w:r>
-      <w:hyperlink r:id="rId155">
+      <w:hyperlink r:id="rId157">
         <w:r>
           <w:rPr>
             <w:rStyle w:val="Hyperlink"/>
@@ -16057,8 +16112,8 @@
         <w:t xml:space="preserve">.</w:t>
       </w:r>
     </w:p>
-    <w:bookmarkEnd w:id="156"/>
-    <w:bookmarkStart w:id="158" w:name="ref-ji2025chrysosplenetin"/>
+    <w:bookmarkEnd w:id="158"/>
+    <w:bookmarkStart w:id="160" w:name="ref-ji2025chrysosplenetin"/>
     <w:p>
       <w:pPr>
         <w:pStyle w:val="Bibliography"/>
@@ -16104,7 +16159,7 @@
       <w:r>
         <w:t xml:space="preserve"> </w:t>
       </w:r>
-      <w:hyperlink r:id="rId157">
+      <w:hyperlink r:id="rId159">
         <w:r>
           <w:rPr>
             <w:rStyle w:val="Hyperlink"/>
@@ -16116,8 +16171,8 @@
         <w:t xml:space="preserve">.</w:t>
       </w:r>
     </w:p>
-    <w:bookmarkEnd w:id="158"/>
-    <w:bookmarkStart w:id="160" w:name="ref-jiang2016wrky1"/>
+    <w:bookmarkEnd w:id="160"/>
+    <w:bookmarkStart w:id="162" w:name="ref-jiang2016wrky1"/>
     <w:p>
       <w:pPr>
         <w:pStyle w:val="Bibliography"/>
@@ -16169,7 +16224,7 @@
       <w:r>
         <w:t xml:space="preserve"> </w:t>
       </w:r>
-      <w:hyperlink r:id="rId159">
+      <w:hyperlink r:id="rId161">
         <w:r>
           <w:rPr>
             <w:rStyle w:val="Hyperlink"/>
@@ -16181,8 +16236,8 @@
         <w:t xml:space="preserve">.</w:t>
       </w:r>
     </w:p>
-    <w:bookmarkEnd w:id="160"/>
-    <w:bookmarkStart w:id="162" w:name="ref-artemisia2025phylogenomics"/>
+    <w:bookmarkEnd w:id="162"/>
+    <w:bookmarkStart w:id="164" w:name="ref-artemisia2025phylogenomics"/>
     <w:p>
       <w:pPr>
         <w:pStyle w:val="Bibliography"/>
@@ -16216,7 +16271,7 @@
       <w:r>
         <w:t xml:space="preserve"> </w:t>
       </w:r>
-      <w:hyperlink r:id="rId161">
+      <w:hyperlink r:id="rId163">
         <w:r>
           <w:rPr>
             <w:rStyle w:val="Hyperlink"/>
@@ -16228,8 +16283,8 @@
         <w:t xml:space="preserve">.</w:t>
       </w:r>
     </w:p>
-    <w:bookmarkEnd w:id="162"/>
-    <w:bookmarkStart w:id="164" w:name="ref-jiao2018eimeria"/>
+    <w:bookmarkEnd w:id="164"/>
+    <w:bookmarkStart w:id="166" w:name="ref-jiao2018eimeria"/>
     <w:p>
       <w:pPr>
         <w:pStyle w:val="Bibliography"/>
@@ -16287,7 +16342,7 @@
       <w:r>
         <w:t xml:space="preserve"> </w:t>
       </w:r>
-      <w:hyperlink r:id="rId163">
+      <w:hyperlink r:id="rId165">
         <w:r>
           <w:rPr>
             <w:rStyle w:val="Hyperlink"/>
@@ -16299,8 +16354,8 @@
         <w:t xml:space="preserve">.</w:t>
       </w:r>
     </w:p>
-    <w:bookmarkEnd w:id="164"/>
-    <w:bookmarkStart w:id="166" w:name="ref-judzentiene2016vulgaris"/>
+    <w:bookmarkEnd w:id="166"/>
+    <w:bookmarkStart w:id="168" w:name="ref-judzentiene2016vulgaris"/>
     <w:p>
       <w:pPr>
         <w:pStyle w:val="Bibliography"/>
@@ -16315,7 +16370,7 @@
       <w:r>
         <w:t xml:space="preserve">“</w:t>
       </w:r>
-      <w:hyperlink r:id="rId165">
+      <w:hyperlink r:id="rId167">
         <w:r>
           <w:rPr>
             <w:rStyle w:val="Hyperlink"/>
@@ -16355,8 +16410,8 @@
         <w:t xml:space="preserve">11 (9): 1353–56.</w:t>
       </w:r>
     </w:p>
-    <w:bookmarkEnd w:id="166"/>
-    <w:bookmarkStart w:id="168" w:name="ref-kane2022cyp450"/>
+    <w:bookmarkEnd w:id="168"/>
+    <w:bookmarkStart w:id="170" w:name="ref-kane2022cyp450"/>
     <w:p>
       <w:pPr>
         <w:pStyle w:val="Bibliography"/>
@@ -16411,7 +16466,7 @@
       <w:r>
         <w:t xml:space="preserve"> </w:t>
       </w:r>
-      <w:hyperlink r:id="rId167">
+      <w:hyperlink r:id="rId169">
         <w:r>
           <w:rPr>
             <w:rStyle w:val="Hyperlink"/>
@@ -16423,8 +16478,8 @@
         <w:t xml:space="preserve">.</w:t>
       </w:r>
     </w:p>
-    <w:bookmarkEnd w:id="168"/>
-    <w:bookmarkStart w:id="170" w:name="ref-khan2015artemisia_nematodes"/>
+    <w:bookmarkEnd w:id="170"/>
+    <w:bookmarkStart w:id="172" w:name="ref-khan2015artemisia_nematodes"/>
     <w:p>
       <w:pPr>
         <w:pStyle w:val="Bibliography"/>
@@ -16439,7 +16494,7 @@
       <w:r>
         <w:t xml:space="preserve">“</w:t>
       </w:r>
-      <w:hyperlink r:id="rId169">
+      <w:hyperlink r:id="rId171">
         <w:r>
           <w:rPr>
             <w:rStyle w:val="Hyperlink"/>
@@ -16491,8 +16546,8 @@
         <w:t xml:space="preserve">32 (2): 257–68.</w:t>
       </w:r>
     </w:p>
-    <w:bookmarkEnd w:id="170"/>
-    <w:bookmarkStart w:id="172" w:name="ref-kunnathattil2025vulgaris"/>
+    <w:bookmarkEnd w:id="172"/>
+    <w:bookmarkStart w:id="174" w:name="ref-kunnathattil2025vulgaris"/>
     <w:p>
       <w:pPr>
         <w:pStyle w:val="Bibliography"/>
@@ -16550,7 +16605,7 @@
       <w:r>
         <w:t xml:space="preserve"> </w:t>
       </w:r>
-      <w:hyperlink r:id="rId171">
+      <w:hyperlink r:id="rId173">
         <w:r>
           <w:rPr>
             <w:rStyle w:val="Hyperlink"/>
@@ -16562,8 +16617,8 @@
         <w:t xml:space="preserve">.</w:t>
       </w:r>
     </w:p>
-    <w:bookmarkEnd w:id="172"/>
-    <w:bookmarkStart w:id="174" w:name="ref-li2018naturalcombination"/>
+    <w:bookmarkEnd w:id="174"/>
+    <w:bookmarkStart w:id="176" w:name="ref-li2018naturalcombination"/>
     <w:p>
       <w:pPr>
         <w:pStyle w:val="Bibliography"/>
@@ -16609,7 +16664,7 @@
       <w:r>
         <w:t xml:space="preserve"> </w:t>
       </w:r>
-      <w:hyperlink r:id="rId173">
+      <w:hyperlink r:id="rId175">
         <w:r>
           <w:rPr>
             <w:rStyle w:val="Hyperlink"/>
@@ -16621,8 +16676,8 @@
         <w:t xml:space="preserve">.</w:t>
       </w:r>
     </w:p>
-    <w:bookmarkEnd w:id="174"/>
-    <w:bookmarkStart w:id="176" w:name="ref-li2008sphaerocephalasaponin"/>
+    <w:bookmarkEnd w:id="176"/>
+    <w:bookmarkStart w:id="178" w:name="ref-li2008sphaerocephalasaponin"/>
     <w:p>
       <w:pPr>
         <w:pStyle w:val="Bibliography"/>
@@ -16665,7 +16720,7 @@
       <w:r>
         <w:t xml:space="preserve"> </w:t>
       </w:r>
-      <w:hyperlink r:id="rId175">
+      <w:hyperlink r:id="rId177">
         <w:r>
           <w:rPr>
             <w:rStyle w:val="Hyperlink"/>
@@ -16677,8 +16732,8 @@
         <w:t xml:space="preserve">.</w:t>
       </w:r>
     </w:p>
-    <w:bookmarkEnd w:id="176"/>
-    <w:bookmarkStart w:id="178" w:name="ref-li1990sacrorumditerpene"/>
+    <w:bookmarkEnd w:id="178"/>
+    <w:bookmarkStart w:id="180" w:name="ref-li1990sacrorumditerpene"/>
     <w:p>
       <w:pPr>
         <w:pStyle w:val="Bibliography"/>
@@ -16721,7 +16776,7 @@
       <w:r>
         <w:t xml:space="preserve"> </w:t>
       </w:r>
-      <w:hyperlink r:id="rId177">
+      <w:hyperlink r:id="rId179">
         <w:r>
           <w:rPr>
             <w:rStyle w:val="Hyperlink"/>
@@ -16733,8 +16788,8 @@
         <w:t xml:space="preserve">.</w:t>
       </w:r>
     </w:p>
-    <w:bookmarkEnd w:id="178"/>
-    <w:bookmarkStart w:id="180" w:name="ref-liu2026osc"/>
+    <w:bookmarkEnd w:id="180"/>
+    <w:bookmarkStart w:id="182" w:name="ref-liu2026osc"/>
     <w:p>
       <w:pPr>
         <w:pStyle w:val="Bibliography"/>
@@ -16780,7 +16835,7 @@
       <w:r>
         <w:t xml:space="preserve"> </w:t>
       </w:r>
-      <w:hyperlink r:id="rId179">
+      <w:hyperlink r:id="rId181">
         <w:r>
           <w:rPr>
             <w:rStyle w:val="Hyperlink"/>
@@ -16792,8 +16847,8 @@
         <w:t xml:space="preserve">.</w:t>
       </w:r>
     </w:p>
-    <w:bookmarkEnd w:id="180"/>
-    <w:bookmarkStart w:id="182" w:name="ref-liu2022vulgaristerpenoids"/>
+    <w:bookmarkEnd w:id="182"/>
+    <w:bookmarkStart w:id="184" w:name="ref-liu2022vulgaristerpenoids"/>
     <w:p>
       <w:pPr>
         <w:pStyle w:val="Bibliography"/>
@@ -16839,7 +16894,7 @@
       <w:r>
         <w:t xml:space="preserve"> </w:t>
       </w:r>
-      <w:hyperlink r:id="rId181">
+      <w:hyperlink r:id="rId183">
         <w:r>
           <w:rPr>
             <w:rStyle w:val="Hyperlink"/>
@@ -16851,8 +16906,8 @@
         <w:t xml:space="preserve">.</w:t>
       </w:r>
     </w:p>
-    <w:bookmarkEnd w:id="182"/>
-    <w:bookmarkStart w:id="184" w:name="ref-lu2013aora"/>
+    <w:bookmarkEnd w:id="184"/>
+    <w:bookmarkStart w:id="186" w:name="ref-lu2013aora"/>
     <w:p>
       <w:pPr>
         <w:pStyle w:val="Bibliography"/>
@@ -16910,7 +16965,7 @@
       <w:r>
         <w:t xml:space="preserve"> </w:t>
       </w:r>
-      <w:hyperlink r:id="rId183">
+      <w:hyperlink r:id="rId185">
         <w:r>
           <w:rPr>
             <w:rStyle w:val="Hyperlink"/>
@@ -16922,8 +16977,8 @@
         <w:t xml:space="preserve">.</w:t>
       </w:r>
     </w:p>
-    <w:bookmarkEnd w:id="184"/>
-    <w:bookmarkStart w:id="186" w:name="ref-lv2016nac1"/>
+    <w:bookmarkEnd w:id="186"/>
+    <w:bookmarkStart w:id="188" w:name="ref-lv2016nac1"/>
     <w:p>
       <w:pPr>
         <w:pStyle w:val="Bibliography"/>
@@ -16984,7 +17039,7 @@
       <w:r>
         <w:t xml:space="preserve"> </w:t>
       </w:r>
-      <w:hyperlink r:id="rId185">
+      <w:hyperlink r:id="rId187">
         <w:r>
           <w:rPr>
             <w:rStyle w:val="Hyperlink"/>
@@ -16996,8 +17051,8 @@
         <w:t xml:space="preserve">.</w:t>
       </w:r>
     </w:p>
-    <w:bookmarkEnd w:id="186"/>
-    <w:bookmarkStart w:id="188" w:name="ref-ma2001caruifolia"/>
+    <w:bookmarkEnd w:id="188"/>
+    <w:bookmarkStart w:id="190" w:name="ref-ma2001caruifolia"/>
     <w:p>
       <w:pPr>
         <w:pStyle w:val="Bibliography"/>
@@ -17031,7 +17086,7 @@
       <w:r>
         <w:t xml:space="preserve"> </w:t>
       </w:r>
-      <w:hyperlink r:id="rId187">
+      <w:hyperlink r:id="rId189">
         <w:r>
           <w:rPr>
             <w:rStyle w:val="Hyperlink"/>
@@ -17043,8 +17098,8 @@
         <w:t xml:space="preserve">.</w:t>
       </w:r>
     </w:p>
-    <w:bookmarkEnd w:id="188"/>
-    <w:bookmarkStart w:id="190" w:name="ref-mamede2025metabolite"/>
+    <w:bookmarkEnd w:id="190"/>
+    <w:bookmarkStart w:id="192" w:name="ref-mamede2025metabolite"/>
     <w:p>
       <w:pPr>
         <w:pStyle w:val="Bibliography"/>
@@ -17111,7 +17166,7 @@
       <w:r>
         <w:t xml:space="preserve"> </w:t>
       </w:r>
-      <w:hyperlink r:id="rId189">
+      <w:hyperlink r:id="rId191">
         <w:r>
           <w:rPr>
             <w:rStyle w:val="Hyperlink"/>
@@ -17123,8 +17178,8 @@
         <w:t xml:space="preserve">.</w:t>
       </w:r>
     </w:p>
-    <w:bookmarkEnd w:id="190"/>
-    <w:bookmarkStart w:id="192" w:name="ref-martinezdiaz2015absinthiumtrypano"/>
+    <w:bookmarkEnd w:id="192"/>
+    <w:bookmarkStart w:id="194" w:name="ref-martinezdiaz2015absinthiumtrypano"/>
     <w:p>
       <w:pPr>
         <w:pStyle w:val="Bibliography"/>
@@ -17158,7 +17213,7 @@
       <w:r>
         <w:t xml:space="preserve"> </w:t>
       </w:r>
-      <w:hyperlink r:id="rId191">
+      <w:hyperlink r:id="rId193">
         <w:r>
           <w:rPr>
             <w:rStyle w:val="Hyperlink"/>
@@ -17170,8 +17225,8 @@
         <w:t xml:space="preserve">.</w:t>
       </w:r>
     </w:p>
-    <w:bookmarkEnd w:id="192"/>
-    <w:bookmarkStart w:id="194" w:name="ref-ming2025argyidrying"/>
+    <w:bookmarkEnd w:id="194"/>
+    <w:bookmarkStart w:id="196" w:name="ref-ming2025argyidrying"/>
     <w:p>
       <w:pPr>
         <w:pStyle w:val="Bibliography"/>
@@ -17214,7 +17269,7 @@
       <w:r>
         <w:t xml:space="preserve"> </w:t>
       </w:r>
-      <w:hyperlink r:id="rId193">
+      <w:hyperlink r:id="rId195">
         <w:r>
           <w:rPr>
             <w:rStyle w:val="Hyperlink"/>
@@ -17226,8 +17281,8 @@
         <w:t xml:space="preserve">.</w:t>
       </w:r>
     </w:p>
-    <w:bookmarkEnd w:id="194"/>
-    <w:bookmarkStart w:id="196" w:name="ref-mohammed2026monospermadrying"/>
+    <w:bookmarkEnd w:id="196"/>
+    <w:bookmarkStart w:id="198" w:name="ref-mohammed2026monospermadrying"/>
     <w:p>
       <w:pPr>
         <w:pStyle w:val="Bibliography"/>
@@ -17280,7 +17335,7 @@
       <w:r>
         <w:t xml:space="preserve"> </w:t>
       </w:r>
-      <w:hyperlink r:id="rId195">
+      <w:hyperlink r:id="rId197">
         <w:r>
           <w:rPr>
             <w:rStyle w:val="Hyperlink"/>
@@ -17292,8 +17347,8 @@
         <w:t xml:space="preserve">.</w:t>
       </w:r>
     </w:p>
-    <w:bookmarkEnd w:id="196"/>
-    <w:bookmarkStart w:id="198" w:name="ref-mojarrab2015extracts"/>
+    <w:bookmarkEnd w:id="198"/>
+    <w:bookmarkStart w:id="200" w:name="ref-mojarrab2015extracts"/>
     <w:p>
       <w:pPr>
         <w:pStyle w:val="Bibliography"/>
@@ -17339,7 +17394,7 @@
       <w:r>
         <w:t xml:space="preserve"> </w:t>
       </w:r>
-      <w:hyperlink r:id="rId197">
+      <w:hyperlink r:id="rId199">
         <w:r>
           <w:rPr>
             <w:rStyle w:val="Hyperlink"/>
@@ -17351,8 +17406,8 @@
         <w:t xml:space="preserve">.</w:t>
       </w:r>
     </w:p>
-    <w:bookmarkEnd w:id="198"/>
-    <w:bookmarkStart w:id="200" w:name="ref-mojarrab2014fractionation"/>
+    <w:bookmarkEnd w:id="200"/>
+    <w:bookmarkStart w:id="202" w:name="ref-mojarrab2014fractionation"/>
     <w:p>
       <w:pPr>
         <w:pStyle w:val="Bibliography"/>
@@ -17410,7 +17465,7 @@
       <w:r>
         <w:t xml:space="preserve"> </w:t>
       </w:r>
-      <w:hyperlink r:id="rId199">
+      <w:hyperlink r:id="rId201">
         <w:r>
           <w:rPr>
             <w:rStyle w:val="Hyperlink"/>
@@ -17422,8 +17477,8 @@
         <w:t xml:space="preserve">.</w:t>
       </w:r>
     </w:p>
-    <w:bookmarkEnd w:id="200"/>
-    <w:bookmarkStart w:id="202" w:name="ref-monzote2014absinthium"/>
+    <w:bookmarkEnd w:id="202"/>
+    <w:bookmarkStart w:id="204" w:name="ref-monzote2014absinthium"/>
     <w:p>
       <w:pPr>
         <w:pStyle w:val="Bibliography"/>
@@ -17457,7 +17512,7 @@
       <w:r>
         <w:t xml:space="preserve"> </w:t>
       </w:r>
-      <w:hyperlink r:id="rId201">
+      <w:hyperlink r:id="rId203">
         <w:r>
           <w:rPr>
             <w:rStyle w:val="Hyperlink"/>
@@ -17469,8 +17524,8 @@
         <w:t xml:space="preserve">.</w:t>
       </w:r>
     </w:p>
-    <w:bookmarkEnd w:id="202"/>
-    <w:bookmarkStart w:id="204" w:name="ref-morua2025standardizedannua"/>
+    <w:bookmarkEnd w:id="204"/>
+    <w:bookmarkStart w:id="206" w:name="ref-morua2025standardizedannua"/>
     <w:p>
       <w:pPr>
         <w:pStyle w:val="Bibliography"/>
@@ -17516,7 +17571,7 @@
       <w:r>
         <w:t xml:space="preserve"> </w:t>
       </w:r>
-      <w:hyperlink r:id="rId203">
+      <w:hyperlink r:id="rId205">
         <w:r>
           <w:rPr>
             <w:rStyle w:val="Hyperlink"/>
@@ -17528,8 +17583,8 @@
         <w:t xml:space="preserve">.</w:t>
       </w:r>
     </w:p>
-    <w:bookmarkEnd w:id="204"/>
-    <w:bookmarkStart w:id="206" w:name="ref-annua2015triterpenes"/>
+    <w:bookmarkEnd w:id="206"/>
+    <w:bookmarkStart w:id="208" w:name="ref-annua2015triterpenes"/>
     <w:p>
       <w:pPr>
         <w:pStyle w:val="Bibliography"/>
@@ -17563,7 +17618,7 @@
       <w:r>
         <w:t xml:space="preserve"> </w:t>
       </w:r>
-      <w:hyperlink r:id="rId205">
+      <w:hyperlink r:id="rId207">
         <w:r>
           <w:rPr>
             <w:rStyle w:val="Hyperlink"/>
@@ -17575,8 +17630,8 @@
         <w:t xml:space="preserve">.</w:t>
       </w:r>
     </w:p>
-    <w:bookmarkEnd w:id="206"/>
-    <w:bookmarkStart w:id="208" w:name="ref-mouton2013artemisininonly"/>
+    <w:bookmarkEnd w:id="208"/>
+    <w:bookmarkStart w:id="210" w:name="ref-mouton2013artemisininonly"/>
     <w:p>
       <w:pPr>
         <w:pStyle w:val="Bibliography"/>
@@ -17622,7 +17677,7 @@
       <w:r>
         <w:t xml:space="preserve"> </w:t>
       </w:r>
-      <w:hyperlink r:id="rId207">
+      <w:hyperlink r:id="rId209">
         <w:r>
           <w:rPr>
             <w:rStyle w:val="Hyperlink"/>
@@ -17634,8 +17689,8 @@
         <w:t xml:space="preserve">.</w:t>
       </w:r>
     </w:p>
-    <w:bookmarkEnd w:id="208"/>
-    <w:bookmarkStart w:id="210" w:name="ref-mravcakova2020wormwood"/>
+    <w:bookmarkEnd w:id="210"/>
+    <w:bookmarkStart w:id="212" w:name="ref-mravcakova2020wormwood"/>
     <w:p>
       <w:pPr>
         <w:pStyle w:val="Bibliography"/>
@@ -17669,7 +17724,7 @@
       <w:r>
         <w:t xml:space="preserve"> </w:t>
       </w:r>
-      <w:hyperlink r:id="rId209">
+      <w:hyperlink r:id="rId211">
         <w:r>
           <w:rPr>
             <w:rStyle w:val="Hyperlink"/>
@@ -17681,8 +17736,8 @@
         <w:t xml:space="preserve">.</w:t>
       </w:r>
     </w:p>
-    <w:bookmarkEnd w:id="210"/>
-    <w:bookmarkStart w:id="212" w:name="ref-nahrevanian2010khorassanica"/>
+    <w:bookmarkEnd w:id="212"/>
+    <w:bookmarkStart w:id="214" w:name="ref-nahrevanian2010khorassanica"/>
     <w:p>
       <w:pPr>
         <w:pStyle w:val="Bibliography"/>
@@ -17716,7 +17771,7 @@
       <w:r>
         <w:t xml:space="preserve"> </w:t>
       </w:r>
-      <w:hyperlink r:id="rId211">
+      <w:hyperlink r:id="rId213">
         <w:r>
           <w:rPr>
             <w:rStyle w:val="Hyperlink"/>
@@ -17728,8 +17783,8 @@
         <w:t xml:space="preserve">.</w:t>
       </w:r>
     </w:p>
-    <w:bookmarkEnd w:id="212"/>
-    <w:bookmarkStart w:id="214" w:name="ref-nahrevanian2012sieberi"/>
+    <w:bookmarkEnd w:id="214"/>
+    <w:bookmarkStart w:id="216" w:name="ref-nahrevanian2012sieberi"/>
     <w:p>
       <w:pPr>
         <w:pStyle w:val="Bibliography"/>
@@ -17763,7 +17818,7 @@
       <w:r>
         <w:t xml:space="preserve"> </w:t>
       </w:r>
-      <w:hyperlink r:id="rId213">
+      <w:hyperlink r:id="rId215">
         <w:r>
           <w:rPr>
             <w:rStyle w:val="Hyperlink"/>
@@ -17775,8 +17830,8 @@
         <w:t xml:space="preserve">.</w:t>
       </w:r>
     </w:p>
-    <w:bookmarkEnd w:id="214"/>
-    <w:bookmarkStart w:id="216" w:name="ref-nomani2022h2s"/>
+    <w:bookmarkEnd w:id="216"/>
+    <w:bookmarkStart w:id="218" w:name="ref-nomani2022h2s"/>
     <w:p>
       <w:pPr>
         <w:pStyle w:val="Bibliography"/>
@@ -17822,7 +17877,7 @@
       <w:r>
         <w:t xml:space="preserve"> </w:t>
       </w:r>
-      <w:hyperlink r:id="rId215">
+      <w:hyperlink r:id="rId217">
         <w:r>
           <w:rPr>
             <w:rStyle w:val="Hyperlink"/>
@@ -17834,8 +17889,8 @@
         <w:t xml:space="preserve">.</w:t>
       </w:r>
     </w:p>
-    <w:bookmarkEnd w:id="216"/>
-    <w:bookmarkStart w:id="218" w:name="ref-nurlaelasari2023vulgarisfasciola"/>
+    <w:bookmarkEnd w:id="218"/>
+    <w:bookmarkStart w:id="220" w:name="ref-nurlaelasari2023vulgarisfasciola"/>
     <w:p>
       <w:pPr>
         <w:pStyle w:val="Bibliography"/>
@@ -17890,7 +17945,7 @@
       <w:r>
         <w:t xml:space="preserve"> </w:t>
       </w:r>
-      <w:hyperlink r:id="rId217">
+      <w:hyperlink r:id="rId219">
         <w:r>
           <w:rPr>
             <w:rStyle w:val="Hyperlink"/>
@@ -17902,8 +17957,8 @@
         <w:t xml:space="preserve">.</w:t>
       </w:r>
     </w:p>
-    <w:bookmarkEnd w:id="218"/>
-    <w:bookmarkStart w:id="220" w:name="ref-olofsson2011tissue"/>
+    <w:bookmarkEnd w:id="220"/>
+    <w:bookmarkStart w:id="222" w:name="ref-olofsson2011tissue"/>
     <w:p>
       <w:pPr>
         <w:pStyle w:val="Bibliography"/>
@@ -17937,7 +17992,7 @@
       <w:r>
         <w:t xml:space="preserve"> </w:t>
       </w:r>
-      <w:hyperlink r:id="rId219">
+      <w:hyperlink r:id="rId221">
         <w:r>
           <w:rPr>
             <w:rStyle w:val="Hyperlink"/>
@@ -17949,8 +18004,8 @@
         <w:t xml:space="preserve">.</w:t>
       </w:r>
     </w:p>
-    <w:bookmarkEnd w:id="220"/>
-    <w:bookmarkStart w:id="222" w:name="ref-olsson2009localization"/>
+    <w:bookmarkEnd w:id="222"/>
+    <w:bookmarkStart w:id="224" w:name="ref-olsson2009localization"/>
     <w:p>
       <w:pPr>
         <w:pStyle w:val="Bibliography"/>
@@ -17984,7 +18039,7 @@
       <w:r>
         <w:t xml:space="preserve"> </w:t>
       </w:r>
-      <w:hyperlink r:id="rId221">
+      <w:hyperlink r:id="rId223">
         <w:r>
           <w:rPr>
             <w:rStyle w:val="Hyperlink"/>
@@ -17996,8 +18051,8 @@
         <w:t xml:space="preserve">.</w:t>
       </w:r>
     </w:p>
-    <w:bookmarkEnd w:id="222"/>
-    <w:bookmarkStart w:id="224" w:name="ref-ongo2019campestriscomment"/>
+    <w:bookmarkEnd w:id="224"/>
+    <w:bookmarkStart w:id="226" w:name="ref-ongo2019campestriscomment"/>
     <w:p>
       <w:pPr>
         <w:pStyle w:val="Bibliography"/>
@@ -18052,7 +18107,7 @@
       <w:r>
         <w:t xml:space="preserve"> </w:t>
       </w:r>
-      <w:hyperlink r:id="rId223">
+      <w:hyperlink r:id="rId225">
         <w:r>
           <w:rPr>
             <w:rStyle w:val="Hyperlink"/>
@@ -18064,8 +18119,8 @@
         <w:t xml:space="preserve">.</w:t>
       </w:r>
     </w:p>
-    <w:bookmarkEnd w:id="224"/>
-    <w:bookmarkStart w:id="226" w:name="ref-ortet2008gorgonum"/>
+    <w:bookmarkEnd w:id="226"/>
+    <w:bookmarkStart w:id="228" w:name="ref-ortet2008gorgonum"/>
     <w:p>
       <w:pPr>
         <w:pStyle w:val="Bibliography"/>
@@ -18099,7 +18154,7 @@
       <w:r>
         <w:t xml:space="preserve"> </w:t>
       </w:r>
-      <w:hyperlink r:id="rId225">
+      <w:hyperlink r:id="rId227">
         <w:r>
           <w:rPr>
             <w:rStyle w:val="Hyperlink"/>
@@ -18111,8 +18166,8 @@
         <w:t xml:space="preserve">.</w:t>
       </w:r>
     </w:p>
-    <w:bookmarkEnd w:id="226"/>
-    <w:bookmarkStart w:id="228" w:name="ref-osanloo2022dracunculusnanogel"/>
+    <w:bookmarkEnd w:id="228"/>
+    <w:bookmarkStart w:id="230" w:name="ref-osanloo2022dracunculusnanogel"/>
     <w:p>
       <w:pPr>
         <w:pStyle w:val="Bibliography"/>
@@ -18158,7 +18213,7 @@
       <w:r>
         <w:t xml:space="preserve"> </w:t>
       </w:r>
-      <w:hyperlink r:id="rId227">
+      <w:hyperlink r:id="rId229">
         <w:r>
           <w:rPr>
             <w:rStyle w:val="Hyperlink"/>
@@ -18170,8 +18225,8 @@
         <w:t xml:space="preserve">.</w:t>
       </w:r>
     </w:p>
-    <w:bookmarkEnd w:id="228"/>
-    <w:bookmarkStart w:id="230" w:name="ref-oyedeji2009afra"/>
+    <w:bookmarkEnd w:id="230"/>
+    <w:bookmarkStart w:id="232" w:name="ref-oyedeji2009afra"/>
     <w:p>
       <w:pPr>
         <w:pStyle w:val="Bibliography"/>
@@ -18205,7 +18260,7 @@
       <w:r>
         <w:t xml:space="preserve"> </w:t>
       </w:r>
-      <w:hyperlink r:id="rId229">
+      <w:hyperlink r:id="rId231">
         <w:r>
           <w:rPr>
             <w:rStyle w:val="Hyperlink"/>
@@ -18217,8 +18272,8 @@
         <w:t xml:space="preserve">.</w:t>
       </w:r>
     </w:p>
-    <w:bookmarkEnd w:id="230"/>
-    <w:bookmarkStart w:id="232" w:name="ref-pandey2017artemisiaoils"/>
+    <w:bookmarkEnd w:id="232"/>
+    <w:bookmarkStart w:id="234" w:name="ref-pandey2017artemisiaoils"/>
     <w:p>
       <w:pPr>
         <w:pStyle w:val="Bibliography"/>
@@ -18252,7 +18307,7 @@
       <w:r>
         <w:t xml:space="preserve"> </w:t>
       </w:r>
-      <w:hyperlink r:id="rId231">
+      <w:hyperlink r:id="rId233">
         <w:r>
           <w:rPr>
             <w:rStyle w:val="Hyperlink"/>
@@ -18264,8 +18319,8 @@
         <w:t xml:space="preserve">.</w:t>
       </w:r>
     </w:p>
-    <w:bookmarkEnd w:id="232"/>
-    <w:bookmarkStart w:id="234" w:name="ref-parveen2024scoparia"/>
+    <w:bookmarkEnd w:id="234"/>
+    <w:bookmarkStart w:id="236" w:name="ref-parveen2024scoparia"/>
     <w:p>
       <w:pPr>
         <w:pStyle w:val="Bibliography"/>
@@ -18311,7 +18366,7 @@
       <w:r>
         <w:t xml:space="preserve"> </w:t>
       </w:r>
-      <w:hyperlink r:id="rId233">
+      <w:hyperlink r:id="rId235">
         <w:r>
           <w:rPr>
             <w:rStyle w:val="Hyperlink"/>
@@ -18323,8 +18378,8 @@
         <w:t xml:space="preserve">.</w:t>
       </w:r>
     </w:p>
-    <w:bookmarkEnd w:id="234"/>
-    <w:bookmarkStart w:id="236" w:name="ref-paul2010recurrent"/>
+    <w:bookmarkEnd w:id="236"/>
+    <w:bookmarkStart w:id="238" w:name="ref-paul2010recurrent"/>
     <w:p>
       <w:pPr>
         <w:pStyle w:val="Bibliography"/>
@@ -18370,7 +18425,7 @@
       <w:r>
         <w:t xml:space="preserve"> </w:t>
       </w:r>
-      <w:hyperlink r:id="rId235">
+      <w:hyperlink r:id="rId237">
         <w:r>
           <w:rPr>
             <w:rStyle w:val="Hyperlink"/>
@@ -18382,8 +18437,8 @@
         <w:t xml:space="preserve">.</w:t>
       </w:r>
     </w:p>
-    <w:bookmarkEnd w:id="236"/>
-    <w:bookmarkStart w:id="238" w:name="ref-pirali2011tick"/>
+    <w:bookmarkEnd w:id="238"/>
+    <w:bookmarkStart w:id="240" w:name="ref-pirali2011tick"/>
     <w:p>
       <w:pPr>
         <w:pStyle w:val="Bibliography"/>
@@ -18441,7 +18496,7 @@
       <w:r>
         <w:t xml:space="preserve"> </w:t>
       </w:r>
-      <w:hyperlink r:id="rId237">
+      <w:hyperlink r:id="rId239">
         <w:r>
           <w:rPr>
             <w:rStyle w:val="Hyperlink"/>
@@ -18453,8 +18508,8 @@
         <w:t xml:space="preserve">.</w:t>
       </w:r>
     </w:p>
-    <w:bookmarkEnd w:id="238"/>
-    <w:bookmarkStart w:id="240" w:name="ref-radulovic2013toxic"/>
+    <w:bookmarkEnd w:id="240"/>
+    <w:bookmarkStart w:id="242" w:name="ref-radulovic2013toxic"/>
     <w:p>
       <w:pPr>
         <w:pStyle w:val="Bibliography"/>
@@ -18488,7 +18543,7 @@
       <w:r>
         <w:t xml:space="preserve"> </w:t>
       </w:r>
-      <w:hyperlink r:id="rId239">
+      <w:hyperlink r:id="rId241">
         <w:r>
           <w:rPr>
             <w:rStyle w:val="Hyperlink"/>
@@ -18500,8 +18555,8 @@
         <w:t xml:space="preserve">.</w:t>
       </w:r>
     </w:p>
-    <w:bookmarkEnd w:id="240"/>
-    <w:bookmarkStart w:id="242" w:name="ref-ram1997density"/>
+    <w:bookmarkEnd w:id="242"/>
+    <w:bookmarkStart w:id="244" w:name="ref-ram1997density"/>
     <w:p>
       <w:pPr>
         <w:pStyle w:val="Bibliography"/>
@@ -18547,7 +18602,7 @@
       <w:r>
         <w:t xml:space="preserve"> </w:t>
       </w:r>
-      <w:hyperlink r:id="rId241">
+      <w:hyperlink r:id="rId243">
         <w:r>
           <w:rPr>
             <w:rStyle w:val="Hyperlink"/>
@@ -18559,8 +18614,8 @@
         <w:t xml:space="preserve">.</w:t>
       </w:r>
     </w:p>
-    <w:bookmarkEnd w:id="242"/>
-    <w:bookmarkStart w:id="244" w:name="ref-ribbiso2021heme"/>
+    <w:bookmarkEnd w:id="244"/>
+    <w:bookmarkStart w:id="246" w:name="ref-ribbiso2021heme"/>
     <w:p>
       <w:pPr>
         <w:pStyle w:val="Bibliography"/>
@@ -18606,7 +18661,7 @@
       <w:r>
         <w:t xml:space="preserve"> </w:t>
       </w:r>
-      <w:hyperlink r:id="rId243">
+      <w:hyperlink r:id="rId245">
         <w:r>
           <w:rPr>
             <w:rStyle w:val="Hyperlink"/>
@@ -18618,8 +18673,8 @@
         <w:t xml:space="preserve">.</w:t>
       </w:r>
     </w:p>
-    <w:bookmarkEnd w:id="244"/>
-    <w:bookmarkStart w:id="246" w:name="ref-rosenthal2024proteostasis"/>
+    <w:bookmarkEnd w:id="246"/>
+    <w:bookmarkStart w:id="248" w:name="ref-rosenthal2024proteostasis"/>
     <w:p>
       <w:pPr>
         <w:pStyle w:val="Bibliography"/>
@@ -18662,7 +18717,7 @@
       <w:r>
         <w:t xml:space="preserve"> </w:t>
       </w:r>
-      <w:hyperlink r:id="rId245">
+      <w:hyperlink r:id="rId247">
         <w:r>
           <w:rPr>
             <w:rStyle w:val="Hyperlink"/>
@@ -18674,8 +18729,8 @@
         <w:t xml:space="preserve">.</w:t>
       </w:r>
     </w:p>
-    <w:bookmarkEnd w:id="246"/>
-    <w:bookmarkStart w:id="248" w:name="ref-rostkowska2016silicon"/>
+    <w:bookmarkEnd w:id="248"/>
+    <w:bookmarkStart w:id="250" w:name="ref-rostkowska2016silicon"/>
     <w:p>
       <w:pPr>
         <w:pStyle w:val="Bibliography"/>
@@ -18733,7 +18788,7 @@
       <w:r>
         <w:t xml:space="preserve"> </w:t>
       </w:r>
-      <w:hyperlink r:id="rId247">
+      <w:hyperlink r:id="rId249">
         <w:r>
           <w:rPr>
             <w:rStyle w:val="Hyperlink"/>
@@ -18745,8 +18800,8 @@
         <w:t xml:space="preserve">.</w:t>
       </w:r>
     </w:p>
-    <w:bookmarkEnd w:id="248"/>
-    <w:bookmarkStart w:id="250" w:name="ref-annua2016monoterpenes"/>
+    <w:bookmarkEnd w:id="250"/>
+    <w:bookmarkStart w:id="252" w:name="ref-annua2016monoterpenes"/>
     <w:p>
       <w:pPr>
         <w:pStyle w:val="Bibliography"/>
@@ -18780,7 +18835,7 @@
       <w:r>
         <w:t xml:space="preserve"> </w:t>
       </w:r>
-      <w:hyperlink r:id="rId249">
+      <w:hyperlink r:id="rId251">
         <w:r>
           <w:rPr>
             <w:rStyle w:val="Hyperlink"/>
@@ -18792,8 +18847,8 @@
         <w:t xml:space="preserve">.</w:t>
       </w:r>
     </w:p>
-    <w:bookmarkEnd w:id="250"/>
-    <w:bookmarkStart w:id="252" w:name="ref-said2016vcd"/>
+    <w:bookmarkEnd w:id="252"/>
+    <w:bookmarkStart w:id="254" w:name="ref-said2016vcd"/>
     <w:p>
       <w:pPr>
         <w:pStyle w:val="Bibliography"/>
@@ -18839,7 +18894,7 @@
       <w:r>
         <w:t xml:space="preserve"> </w:t>
       </w:r>
-      <w:hyperlink r:id="rId251">
+      <w:hyperlink r:id="rId253">
         <w:r>
           <w:rPr>
             <w:rStyle w:val="Hyperlink"/>
@@ -18851,8 +18906,8 @@
         <w:t xml:space="preserve">.</w:t>
       </w:r>
     </w:p>
-    <w:bookmarkEnd w:id="252"/>
-    <w:bookmarkStart w:id="254" w:name="ref-sanei2023nanoliposomes"/>
+    <w:bookmarkEnd w:id="254"/>
+    <w:bookmarkStart w:id="256" w:name="ref-sanei2023nanoliposomes"/>
     <w:p>
       <w:pPr>
         <w:pStyle w:val="Bibliography"/>
@@ -18919,7 +18974,7 @@
       <w:r>
         <w:t xml:space="preserve"> </w:t>
       </w:r>
-      <w:hyperlink r:id="rId253">
+      <w:hyperlink r:id="rId255">
         <w:r>
           <w:rPr>
             <w:rStyle w:val="Hyperlink"/>
@@ -18931,8 +18986,8 @@
         <w:t xml:space="preserve">.</w:t>
       </w:r>
     </w:p>
-    <w:bookmarkEnd w:id="254"/>
-    <w:bookmarkStart w:id="256" w:name="ref-schramek2010isotope"/>
+    <w:bookmarkEnd w:id="256"/>
+    <w:bookmarkStart w:id="258" w:name="ref-schramek2010isotope"/>
     <w:p>
       <w:pPr>
         <w:pStyle w:val="Bibliography"/>
@@ -18966,7 +19021,7 @@
       <w:r>
         <w:t xml:space="preserve"> </w:t>
       </w:r>
-      <w:hyperlink r:id="rId255">
+      <w:hyperlink r:id="rId257">
         <w:r>
           <w:rPr>
             <w:rStyle w:val="Hyperlink"/>
@@ -18978,8 +19033,8 @@
         <w:t xml:space="preserve">.</w:t>
       </w:r>
     </w:p>
-    <w:bookmarkEnd w:id="256"/>
-    <w:bookmarkStart w:id="258" w:name="ref-seddiek2011herbaalba"/>
+    <w:bookmarkEnd w:id="258"/>
+    <w:bookmarkStart w:id="260" w:name="ref-seddiek2011herbaalba"/>
     <w:p>
       <w:pPr>
         <w:pStyle w:val="Bibliography"/>
@@ -19037,7 +19092,7 @@
       <w:r>
         <w:t xml:space="preserve"> </w:t>
       </w:r>
-      <w:hyperlink r:id="rId257">
+      <w:hyperlink r:id="rId259">
         <w:r>
           <w:rPr>
             <w:rStyle w:val="Hyperlink"/>
@@ -19049,8 +19104,8 @@
         <w:t xml:space="preserve">.</w:t>
       </w:r>
     </w:p>
-    <w:bookmarkEnd w:id="258"/>
-    <w:bookmarkStart w:id="260" w:name="ref-shen2012cypcpr"/>
+    <w:bookmarkEnd w:id="260"/>
+    <w:bookmarkStart w:id="262" w:name="ref-shen2012cypcpr"/>
     <w:p>
       <w:pPr>
         <w:pStyle w:val="Bibliography"/>
@@ -19108,7 +19163,7 @@
       <w:r>
         <w:t xml:space="preserve"> </w:t>
       </w:r>
-      <w:hyperlink r:id="rId259">
+      <w:hyperlink r:id="rId261">
         <w:r>
           <w:rPr>
             <w:rStyle w:val="Hyperlink"/>
@@ -19120,8 +19175,8 @@
         <w:t xml:space="preserve">.</w:t>
       </w:r>
     </w:p>
-    <w:bookmarkEnd w:id="260"/>
-    <w:bookmarkStart w:id="262" w:name="ref-shi2022annuaantimalarialmetabolomics"/>
+    <w:bookmarkEnd w:id="262"/>
+    <w:bookmarkStart w:id="264" w:name="ref-shi2022annuaantimalarialmetabolomics"/>
     <w:p>
       <w:pPr>
         <w:pStyle w:val="Bibliography"/>
@@ -19167,7 +19222,7 @@
       <w:r>
         <w:t xml:space="preserve"> </w:t>
       </w:r>
-      <w:hyperlink r:id="rId261">
+      <w:hyperlink r:id="rId263">
         <w:r>
           <w:rPr>
             <w:rStyle w:val="Hyperlink"/>
@@ -19179,8 +19234,8 @@
         <w:t xml:space="preserve">.</w:t>
       </w:r>
     </w:p>
-    <w:bookmarkEnd w:id="262"/>
-    <w:bookmarkStart w:id="264" w:name="ref-shi2018mixta1"/>
+    <w:bookmarkEnd w:id="264"/>
+    <w:bookmarkStart w:id="266" w:name="ref-shi2018mixta1"/>
     <w:p>
       <w:pPr>
         <w:pStyle w:val="Bibliography"/>
@@ -19235,7 +19290,7 @@
       <w:r>
         <w:t xml:space="preserve"> </w:t>
       </w:r>
-      <w:hyperlink r:id="rId263">
+      <w:hyperlink r:id="rId265">
         <w:r>
           <w:rPr>
             <w:rStyle w:val="Hyperlink"/>
@@ -19247,8 +19302,8 @@
         <w:t xml:space="preserve">.</w:t>
       </w:r>
     </w:p>
-    <w:bookmarkEnd w:id="264"/>
-    <w:bookmarkStart w:id="266" w:name="ref-dasilva2017annuasheep"/>
+    <w:bookmarkEnd w:id="266"/>
+    <w:bookmarkStart w:id="268" w:name="ref-dasilva2017annuasheep"/>
     <w:p>
       <w:pPr>
         <w:pStyle w:val="Bibliography"/>
@@ -19294,7 +19349,7 @@
       <w:r>
         <w:t xml:space="preserve"> </w:t>
       </w:r>
-      <w:hyperlink r:id="rId265">
+      <w:hyperlink r:id="rId267">
         <w:r>
           <w:rPr>
             <w:rStyle w:val="Hyperlink"/>
@@ -19306,8 +19361,8 @@
         <w:t xml:space="preserve">.</w:t>
       </w:r>
     </w:p>
-    <w:bookmarkEnd w:id="266"/>
-    <w:bookmarkStart w:id="268" w:name="ref-snider2021gametocytes"/>
+    <w:bookmarkEnd w:id="268"/>
+    <w:bookmarkStart w:id="270" w:name="ref-snider2021gametocytes"/>
     <w:p>
       <w:pPr>
         <w:pStyle w:val="Bibliography"/>
@@ -19365,7 +19420,7 @@
       <w:r>
         <w:t xml:space="preserve"> </w:t>
       </w:r>
-      <w:hyperlink r:id="rId267">
+      <w:hyperlink r:id="rId269">
         <w:r>
           <w:rPr>
             <w:rStyle w:val="Hyperlink"/>
@@ -19377,8 +19432,8 @@
         <w:t xml:space="preserve">.</w:t>
       </w:r>
     </w:p>
-    <w:bookmarkEnd w:id="268"/>
-    <w:bookmarkStart w:id="270" w:name="ref-soleimanifard2023kermanensis"/>
+    <w:bookmarkEnd w:id="270"/>
+    <w:bookmarkStart w:id="272" w:name="ref-soleimanifard2023kermanensis"/>
     <w:p>
       <w:pPr>
         <w:pStyle w:val="Bibliography"/>
@@ -19424,7 +19479,7 @@
       <w:r>
         <w:t xml:space="preserve"> </w:t>
       </w:r>
-      <w:hyperlink r:id="rId269">
+      <w:hyperlink r:id="rId271">
         <w:r>
           <w:rPr>
             <w:rStyle w:val="Hyperlink"/>
@@ -19436,8 +19491,8 @@
         <w:t xml:space="preserve">.</w:t>
       </w:r>
     </w:p>
-    <w:bookmarkEnd w:id="270"/>
-    <w:bookmarkStart w:id="272" w:name="ref-squires2011haemonchus"/>
+    <w:bookmarkEnd w:id="272"/>
+    <w:bookmarkStart w:id="274" w:name="ref-squires2011haemonchus"/>
     <w:p>
       <w:pPr>
         <w:pStyle w:val="Bibliography"/>
@@ -19471,7 +19526,7 @@
       <w:r>
         <w:t xml:space="preserve"> </w:t>
       </w:r>
-      <w:hyperlink r:id="rId271">
+      <w:hyperlink r:id="rId273">
         <w:r>
           <w:rPr>
             <w:rStyle w:val="Hyperlink"/>
@@ -19483,8 +19538,8 @@
         <w:t xml:space="preserve">.</w:t>
       </w:r>
     </w:p>
-    <w:bookmarkEnd w:id="272"/>
-    <w:bookmarkStart w:id="274" w:name="ref-tabari2017sieberi"/>
+    <w:bookmarkEnd w:id="274"/>
+    <w:bookmarkStart w:id="276" w:name="ref-tabari2017sieberi"/>
     <w:p>
       <w:pPr>
         <w:pStyle w:val="Bibliography"/>
@@ -19518,7 +19573,7 @@
       <w:r>
         <w:t xml:space="preserve"> </w:t>
       </w:r>
-      <w:hyperlink r:id="rId273">
+      <w:hyperlink r:id="rId275">
         <w:r>
           <w:rPr>
             <w:rStyle w:val="Hyperlink"/>
@@ -19530,8 +19585,8 @@
         <w:t xml:space="preserve">.</w:t>
       </w:r>
     </w:p>
-    <w:bookmarkEnd w:id="274"/>
-    <w:bookmarkStart w:id="276" w:name="ref-tamargo2017nanocochleate"/>
+    <w:bookmarkEnd w:id="276"/>
+    <w:bookmarkStart w:id="278" w:name="ref-tamargo2017nanocochleate"/>
     <w:p>
       <w:pPr>
         <w:pStyle w:val="Bibliography"/>
@@ -19565,7 +19620,7 @@
       <w:r>
         <w:t xml:space="preserve"> </w:t>
       </w:r>
-      <w:hyperlink r:id="rId275">
+      <w:hyperlink r:id="rId277">
         <w:r>
           <w:rPr>
             <w:rStyle w:val="Hyperlink"/>
@@ -19577,8 +19632,8 @@
         <w:t xml:space="preserve">.</w:t>
       </w:r>
     </w:p>
-    <w:bookmarkEnd w:id="276"/>
-    <w:bookmarkStart w:id="278" w:name="ref-tangnitipong2012heme"/>
+    <w:bookmarkEnd w:id="278"/>
+    <w:bookmarkStart w:id="280" w:name="ref-tangnitipong2012heme"/>
     <w:p>
       <w:pPr>
         <w:pStyle w:val="Bibliography"/>
@@ -19612,7 +19667,7 @@
       <w:r>
         <w:t xml:space="preserve"> </w:t>
       </w:r>
-      <w:hyperlink r:id="rId277">
+      <w:hyperlink r:id="rId279">
         <w:r>
           <w:rPr>
             <w:rStyle w:val="Hyperlink"/>
@@ -19624,8 +19679,8 @@
         <w:t xml:space="preserve">.</w:t>
       </w:r>
     </w:p>
-    <w:bookmarkEnd w:id="278"/>
-    <w:bookmarkStart w:id="280" w:name="ref-tariku2011absinthium"/>
+    <w:bookmarkEnd w:id="280"/>
+    <w:bookmarkStart w:id="282" w:name="ref-tariku2011absinthium"/>
     <w:p>
       <w:pPr>
         <w:pStyle w:val="Bibliography"/>
@@ -19659,7 +19714,7 @@
       <w:r>
         <w:t xml:space="preserve"> </w:t>
       </w:r>
-      <w:hyperlink r:id="rId279">
+      <w:hyperlink r:id="rId281">
         <w:r>
           <w:rPr>
             <w:rStyle w:val="Hyperlink"/>
@@ -19671,8 +19726,8 @@
         <w:t xml:space="preserve">.</w:t>
       </w:r>
     </w:p>
-    <w:bookmarkEnd w:id="280"/>
-    <w:bookmarkStart w:id="282" w:name="ref-tariq2009absinthium"/>
+    <w:bookmarkEnd w:id="282"/>
+    <w:bookmarkStart w:id="284" w:name="ref-tariq2009absinthium"/>
     <w:p>
       <w:pPr>
         <w:pStyle w:val="Bibliography"/>
@@ -19706,7 +19761,7 @@
       <w:r>
         <w:t xml:space="preserve"> </w:t>
       </w:r>
-      <w:hyperlink r:id="rId281">
+      <w:hyperlink r:id="rId283">
         <w:r>
           <w:rPr>
             <w:rStyle w:val="Hyperlink"/>
@@ -19718,8 +19773,8 @@
         <w:t xml:space="preserve">.</w:t>
       </w:r>
     </w:p>
-    <w:bookmarkEnd w:id="282"/>
-    <w:bookmarkStart w:id="284" w:name="ref-tasdemir2015antiprotozoal"/>
+    <w:bookmarkEnd w:id="284"/>
+    <w:bookmarkStart w:id="286" w:name="ref-tasdemir2015antiprotozoal"/>
     <w:p>
       <w:pPr>
         <w:pStyle w:val="Bibliography"/>
@@ -19753,7 +19808,7 @@
       <w:r>
         <w:t xml:space="preserve"> </w:t>
       </w:r>
-      <w:hyperlink r:id="rId283">
+      <w:hyperlink r:id="rId285">
         <w:r>
           <w:rPr>
             <w:rStyle w:val="Hyperlink"/>
@@ -19765,8 +19820,8 @@
         <w:t xml:space="preserve">.</w:t>
       </w:r>
     </w:p>
-    <w:bookmarkEnd w:id="284"/>
-    <w:bookmarkStart w:id="286" w:name="ref-teoh2006cyp"/>
+    <w:bookmarkEnd w:id="286"/>
+    <w:bookmarkStart w:id="288" w:name="ref-teoh2006cyp"/>
     <w:p>
       <w:pPr>
         <w:pStyle w:val="Bibliography"/>
@@ -19800,7 +19855,7 @@
       <w:r>
         <w:t xml:space="preserve"> </w:t>
       </w:r>
-      <w:hyperlink r:id="rId285">
+      <w:hyperlink r:id="rId287">
         <w:r>
           <w:rPr>
             <w:rStyle w:val="Hyperlink"/>
@@ -19812,8 +19867,8 @@
         <w:t xml:space="preserve">.</w:t>
       </w:r>
     </w:p>
-    <w:bookmarkEnd w:id="286"/>
-    <w:bookmarkStart w:id="288" w:name="ref-trendafilova2021edibleartemisia"/>
+    <w:bookmarkEnd w:id="288"/>
+    <w:bookmarkStart w:id="290" w:name="ref-trendafilova2021edibleartemisia"/>
     <w:p>
       <w:pPr>
         <w:pStyle w:val="Bibliography"/>
@@ -19847,7 +19902,7 @@
       <w:r>
         <w:t xml:space="preserve"> </w:t>
       </w:r>
-      <w:hyperlink r:id="rId287">
+      <w:hyperlink r:id="rId289">
         <w:r>
           <w:rPr>
             <w:rStyle w:val="Hyperlink"/>
@@ -19859,8 +19914,8 @@
         <w:t xml:space="preserve">.</w:t>
       </w:r>
     </w:p>
-    <w:bookmarkEnd w:id="288"/>
-    <w:bookmarkStart w:id="290" w:name="ref-umaraliev2025persicabisabolanes"/>
+    <w:bookmarkEnd w:id="290"/>
+    <w:bookmarkStart w:id="292" w:name="ref-umaraliev2025persicabisabolanes"/>
     <w:p>
       <w:pPr>
         <w:pStyle w:val="Bibliography"/>
@@ -19900,7 +19955,7 @@
       <w:r>
         <w:t xml:space="preserve"> </w:t>
       </w:r>
-      <w:hyperlink r:id="rId289">
+      <w:hyperlink r:id="rId291">
         <w:r>
           <w:rPr>
             <w:rStyle w:val="Hyperlink"/>
@@ -19912,8 +19967,8 @@
         <w:t xml:space="preserve">.</w:t>
       </w:r>
     </w:p>
-    <w:bookmarkEnd w:id="290"/>
-    <w:bookmarkStart w:id="292" w:name="ref-umaraliev2026persicamonoterpenes"/>
+    <w:bookmarkEnd w:id="292"/>
+    <w:bookmarkStart w:id="294" w:name="ref-umaraliev2026persicamonoterpenes"/>
     <w:p>
       <w:pPr>
         <w:pStyle w:val="Bibliography"/>
@@ -19953,7 +20008,7 @@
       <w:r>
         <w:t xml:space="preserve"> </w:t>
       </w:r>
-      <w:hyperlink r:id="rId291">
+      <w:hyperlink r:id="rId293">
         <w:r>
           <w:rPr>
             <w:rStyle w:val="Hyperlink"/>
@@ -19965,8 +20020,8 @@
         <w:t xml:space="preserve">.</w:t>
       </w:r>
     </w:p>
-    <w:bookmarkEnd w:id="292"/>
-    <w:bookmarkStart w:id="294" w:name="ref-urban2020trpc3"/>
+    <w:bookmarkEnd w:id="294"/>
+    <w:bookmarkStart w:id="296" w:name="ref-urban2020trpc3"/>
     <w:p>
       <w:pPr>
         <w:pStyle w:val="Bibliography"/>
@@ -20012,7 +20067,7 @@
       <w:r>
         <w:t xml:space="preserve"> </w:t>
       </w:r>
-      <w:hyperlink r:id="rId293">
+      <w:hyperlink r:id="rId295">
         <w:r>
           <w:rPr>
             <w:rStyle w:val="Hyperlink"/>
@@ -20024,8 +20079,8 @@
         <w:t xml:space="preserve">.</w:t>
       </w:r>
     </w:p>
-    <w:bookmarkEnd w:id="294"/>
-    <w:bookmarkStart w:id="296" w:name="ref-varadyova2018medicinalplants"/>
+    <w:bookmarkEnd w:id="296"/>
+    <w:bookmarkStart w:id="298" w:name="ref-varadyova2018medicinalplants"/>
     <w:p>
       <w:pPr>
         <w:pStyle w:val="Bibliography"/>
@@ -20068,7 +20123,7 @@
       <w:r>
         <w:t xml:space="preserve"> </w:t>
       </w:r>
-      <w:hyperlink r:id="rId295">
+      <w:hyperlink r:id="rId297">
         <w:r>
           <w:rPr>
             <w:rStyle w:val="Hyperlink"/>
@@ -20080,8 +20135,8 @@
         <w:t xml:space="preserve">.</w:t>
       </w:r>
     </w:p>
-    <w:bookmarkEnd w:id="296"/>
-    <w:bookmarkStart w:id="298" w:name="ref-walz2024aframalaria"/>
+    <w:bookmarkEnd w:id="298"/>
+    <w:bookmarkStart w:id="300" w:name="ref-walz2024aframalaria"/>
     <w:p>
       <w:pPr>
         <w:pStyle w:val="Bibliography"/>
@@ -20127,7 +20182,7 @@
       <w:r>
         <w:t xml:space="preserve"> </w:t>
       </w:r>
-      <w:hyperlink r:id="rId297">
+      <w:hyperlink r:id="rId299">
         <w:r>
           <w:rPr>
             <w:rStyle w:val="Hyperlink"/>
@@ -20139,8 +20194,8 @@
         <w:t xml:space="preserve">.</w:t>
       </w:r>
     </w:p>
-    <w:bookmarkEnd w:id="298"/>
-    <w:bookmarkStart w:id="300" w:name="ref-wang2013cyp71av1promoter"/>
+    <w:bookmarkEnd w:id="300"/>
+    <w:bookmarkStart w:id="302" w:name="ref-wang2013cyp71av1promoter"/>
     <w:p>
       <w:pPr>
         <w:pStyle w:val="Bibliography"/>
@@ -20174,7 +20229,7 @@
       <w:r>
         <w:t xml:space="preserve"> </w:t>
       </w:r>
-      <w:hyperlink r:id="rId299">
+      <w:hyperlink r:id="rId301">
         <w:r>
           <w:rPr>
             <w:rStyle w:val="Hyperlink"/>
@@ -20186,8 +20241,8 @@
         <w:t xml:space="preserve">.</w:t>
       </w:r>
     </w:p>
-    <w:bookmarkEnd w:id="300"/>
-    <w:bookmarkStart w:id="302" w:name="ref-wang2009trichometranscriptome"/>
+    <w:bookmarkEnd w:id="302"/>
+    <w:bookmarkStart w:id="304" w:name="ref-wang2009trichometranscriptome"/>
     <w:p>
       <w:pPr>
         <w:pStyle w:val="Bibliography"/>
@@ -20221,7 +20276,7 @@
       <w:r>
         <w:t xml:space="preserve"> </w:t>
       </w:r>
-      <w:hyperlink r:id="rId301">
+      <w:hyperlink r:id="rId303">
         <w:r>
           <w:rPr>
             <w:rStyle w:val="Hyperlink"/>
@@ -20233,8 +20288,8 @@
         <w:t xml:space="preserve">.</w:t>
       </w:r>
     </w:p>
-    <w:bookmarkEnd w:id="302"/>
-    <w:bookmarkStart w:id="304" w:name="ref-wani2023nitric"/>
+    <w:bookmarkEnd w:id="304"/>
+    <w:bookmarkStart w:id="306" w:name="ref-wani2023nitric"/>
     <w:p>
       <w:pPr>
         <w:pStyle w:val="Bibliography"/>
@@ -20292,7 +20347,7 @@
       <w:r>
         <w:t xml:space="preserve"> </w:t>
       </w:r>
-      <w:hyperlink r:id="rId303">
+      <w:hyperlink r:id="rId305">
         <w:r>
           <w:rPr>
             <w:rStyle w:val="Hyperlink"/>
@@ -20304,8 +20359,8 @@
         <w:t xml:space="preserve">.</w:t>
       </w:r>
     </w:p>
-    <w:bookmarkEnd w:id="304"/>
-    <w:bookmarkStart w:id="306" w:name="ref-wani2026maritima"/>
+    <w:bookmarkEnd w:id="306"/>
+    <w:bookmarkStart w:id="308" w:name="ref-wani2026maritima"/>
     <w:p>
       <w:pPr>
         <w:pStyle w:val="Bibliography"/>
@@ -20351,7 +20406,7 @@
       <w:r>
         <w:t xml:space="preserve"> </w:t>
       </w:r>
-      <w:hyperlink r:id="rId305">
+      <w:hyperlink r:id="rId307">
         <w:r>
           <w:rPr>
             <w:rStyle w:val="Hyperlink"/>
@@ -20363,8 +20418,8 @@
         <w:t xml:space="preserve">.</w:t>
       </w:r>
     </w:p>
-    <w:bookmarkEnd w:id="306"/>
-    <w:bookmarkStart w:id="308" w:name="ref-wetmore2019psiv9"/>
+    <w:bookmarkEnd w:id="308"/>
+    <w:bookmarkStart w:id="310" w:name="ref-wetmore2019psiv9"/>
     <w:p>
       <w:pPr>
         <w:pStyle w:val="Bibliography"/>
@@ -20410,7 +20465,7 @@
       <w:r>
         <w:t xml:space="preserve"> </w:t>
       </w:r>
-      <w:hyperlink r:id="rId307">
+      <w:hyperlink r:id="rId309">
         <w:r>
           <w:rPr>
             <w:rStyle w:val="Hyperlink"/>
@@ -20422,8 +20477,8 @@
         <w:t xml:space="preserve">.</w:t>
       </w:r>
     </w:p>
-    <w:bookmarkEnd w:id="308"/>
-    <w:bookmarkStart w:id="310" w:name="ref-wiedosari2017eimeria"/>
+    <w:bookmarkEnd w:id="310"/>
+    <w:bookmarkStart w:id="312" w:name="ref-wiedosari2017eimeria"/>
     <w:p>
       <w:pPr>
         <w:pStyle w:val="Bibliography"/>
@@ -20478,7 +20533,7 @@
       <w:r>
         <w:t xml:space="preserve"> </w:t>
       </w:r>
-      <w:hyperlink r:id="rId309">
+      <w:hyperlink r:id="rId311">
         <w:r>
           <w:rPr>
             <w:rStyle w:val="Hyperlink"/>
@@ -20490,8 +20545,8 @@
         <w:t xml:space="preserve">.</w:t>
       </w:r>
     </w:p>
-    <w:bookmarkEnd w:id="310"/>
-    <w:bookmarkStart w:id="312" w:name="ref-wright2010qinghao"/>
+    <w:bookmarkEnd w:id="312"/>
+    <w:bookmarkStart w:id="314" w:name="ref-wright2010qinghao"/>
     <w:p>
       <w:pPr>
         <w:pStyle w:val="Bibliography"/>
@@ -20537,7 +20592,7 @@
       <w:r>
         <w:t xml:space="preserve"> </w:t>
       </w:r>
-      <w:hyperlink r:id="rId311">
+      <w:hyperlink r:id="rId313">
         <w:r>
           <w:rPr>
             <w:rStyle w:val="Hyperlink"/>
@@ -20549,8 +20604,8 @@
         <w:t xml:space="preserve">.</w:t>
       </w:r>
     </w:p>
-    <w:bookmarkEnd w:id="312"/>
-    <w:bookmarkStart w:id="314" w:name="ref-xiang2019bhlh112"/>
+    <w:bookmarkEnd w:id="314"/>
+    <w:bookmarkStart w:id="316" w:name="ref-xiang2019bhlh112"/>
     <w:p>
       <w:pPr>
         <w:pStyle w:val="Bibliography"/>
@@ -20584,7 +20639,7 @@
       <w:r>
         <w:t xml:space="preserve"> </w:t>
       </w:r>
-      <w:hyperlink r:id="rId313">
+      <w:hyperlink r:id="rId315">
         <w:r>
           <w:rPr>
             <w:rStyle w:val="Hyperlink"/>
@@ -20596,8 +20651,8 @@
         <w:t xml:space="preserve">.</w:t>
       </w:r>
     </w:p>
-    <w:bookmarkEnd w:id="314"/>
-    <w:bookmarkStart w:id="316" w:name="ref-xu2025plantmatrix"/>
+    <w:bookmarkEnd w:id="316"/>
+    <w:bookmarkStart w:id="318" w:name="ref-xu2025plantmatrix"/>
     <w:p>
       <w:pPr>
         <w:pStyle w:val="Bibliography"/>
@@ -20643,7 +20698,7 @@
       <w:r>
         <w:t xml:space="preserve"> </w:t>
       </w:r>
-      <w:hyperlink r:id="rId315">
+      <w:hyperlink r:id="rId317">
         <w:r>
           <w:rPr>
             <w:rStyle w:val="Hyperlink"/>
@@ -20655,8 +20710,8 @@
         <w:t xml:space="preserve">.</w:t>
       </w:r>
     </w:p>
-    <w:bookmarkEnd w:id="316"/>
-    <w:bookmarkStart w:id="318" w:name="ref-xu2026artemisininpk"/>
+    <w:bookmarkEnd w:id="318"/>
+    <w:bookmarkStart w:id="320" w:name="ref-xu2026artemisininpk"/>
     <w:p>
       <w:pPr>
         <w:pStyle w:val="Bibliography"/>
@@ -20702,7 +20757,7 @@
       <w:r>
         <w:t xml:space="preserve"> </w:t>
       </w:r>
-      <w:hyperlink r:id="rId317">
+      <w:hyperlink r:id="rId319">
         <w:r>
           <w:rPr>
             <w:rStyle w:val="Hyperlink"/>
@@ -20714,8 +20769,8 @@
         <w:t xml:space="preserve">.</w:t>
       </w:r>
     </w:p>
-    <w:bookmarkEnd w:id="318"/>
-    <w:bookmarkStart w:id="320" w:name="ref-yildiz2011toxocara"/>
+    <w:bookmarkEnd w:id="320"/>
+    <w:bookmarkStart w:id="322" w:name="ref-yildiz2011toxocara"/>
     <w:p>
       <w:pPr>
         <w:pStyle w:val="Bibliography"/>
@@ -20773,7 +20828,7 @@
       <w:r>
         <w:t xml:space="preserve"> </w:t>
       </w:r>
-      <w:hyperlink r:id="rId319">
+      <w:hyperlink r:id="rId321">
         <w:r>
           <w:rPr>
             <w:rStyle w:val="Hyperlink"/>
@@ -20785,8 +20840,8 @@
         <w:t xml:space="preserve">.</w:t>
       </w:r>
     </w:p>
-    <w:bookmarkEnd w:id="320"/>
-    <w:bookmarkStart w:id="322" w:name="ref-zehra2020copper"/>
+    <w:bookmarkEnd w:id="322"/>
+    <w:bookmarkStart w:id="324" w:name="ref-zehra2020copper"/>
     <w:p>
       <w:pPr>
         <w:pStyle w:val="Bibliography"/>
@@ -20832,7 +20887,7 @@
       <w:r>
         <w:t xml:space="preserve"> </w:t>
       </w:r>
-      <w:hyperlink r:id="rId321">
+      <w:hyperlink r:id="rId323">
         <w:r>
           <w:rPr>
             <w:rStyle w:val="Hyperlink"/>
@@ -20844,8 +20899,8 @@
         <w:t xml:space="preserve">.</w:t>
       </w:r>
     </w:p>
-    <w:bookmarkEnd w:id="322"/>
-    <w:bookmarkStart w:id="324" w:name="ref-zhang2022fiveartemisia"/>
+    <w:bookmarkEnd w:id="324"/>
+    <w:bookmarkStart w:id="326" w:name="ref-zhang2022fiveartemisia"/>
     <w:p>
       <w:pPr>
         <w:pStyle w:val="Bibliography"/>
@@ -20891,7 +20946,7 @@
       <w:r>
         <w:t xml:space="preserve"> </w:t>
       </w:r>
-      <w:hyperlink r:id="rId323">
+      <w:hyperlink r:id="rId325">
         <w:r>
           <w:rPr>
             <w:rStyle w:val="Hyperlink"/>
@@ -20903,8 +20958,8 @@
         <w:t xml:space="preserve">.</w:t>
       </w:r>
     </w:p>
-    <w:bookmarkEnd w:id="324"/>
-    <w:bookmarkStart w:id="326" w:name="ref-zhang2026annuaenhancement"/>
+    <w:bookmarkEnd w:id="326"/>
+    <w:bookmarkStart w:id="328" w:name="ref-zhang2026annuaenhancement"/>
     <w:p>
       <w:pPr>
         <w:pStyle w:val="Bibliography"/>
@@ -20950,7 +21005,7 @@
       <w:r>
         <w:t xml:space="preserve"> </w:t>
       </w:r>
-      <w:hyperlink r:id="rId325">
+      <w:hyperlink r:id="rId327">
         <w:r>
           <w:rPr>
             <w:rStyle w:val="Hyperlink"/>
@@ -20962,8 +21017,8 @@
         <w:t xml:space="preserve">.</w:t>
       </w:r>
     </w:p>
-    <w:bookmarkEnd w:id="326"/>
-    <w:bookmarkStart w:id="328" w:name="ref-zhang2020argyitriterpenoids"/>
+    <w:bookmarkEnd w:id="328"/>
+    <w:bookmarkStart w:id="330" w:name="ref-zhang2020argyitriterpenoids"/>
     <w:p>
       <w:pPr>
         <w:pStyle w:val="Bibliography"/>
@@ -21006,7 +21061,7 @@
       <w:r>
         <w:t xml:space="preserve"> </w:t>
       </w:r>
-      <w:hyperlink r:id="rId327">
+      <w:hyperlink r:id="rId329">
         <w:r>
           <w:rPr>
             <w:rStyle w:val="Hyperlink"/>
@@ -21018,8 +21073,8 @@
         <w:t xml:space="preserve">.</w:t>
       </w:r>
     </w:p>
-    <w:bookmarkEnd w:id="328"/>
-    <w:bookmarkStart w:id="330" w:name="ref-zhang2019pp2c1"/>
+    <w:bookmarkEnd w:id="330"/>
+    <w:bookmarkStart w:id="332" w:name="ref-zhang2019pp2c1"/>
     <w:p>
       <w:pPr>
         <w:pStyle w:val="Bibliography"/>
@@ -21071,7 +21126,7 @@
       <w:r>
         <w:t xml:space="preserve"> </w:t>
       </w:r>
-      <w:hyperlink r:id="rId329">
+      <w:hyperlink r:id="rId331">
         <w:r>
           <w:rPr>
             <w:rStyle w:val="Hyperlink"/>
@@ -21083,8 +21138,8 @@
         <w:t xml:space="preserve">.</w:t>
       </w:r>
     </w:p>
-    <w:bookmarkEnd w:id="330"/>
-    <w:bookmarkStart w:id="332" w:name="ref-zhang2008dbr2"/>
+    <w:bookmarkEnd w:id="332"/>
+    <w:bookmarkStart w:id="334" w:name="ref-zhang2008dbr2"/>
     <w:p>
       <w:pPr>
         <w:pStyle w:val="Bibliography"/>
@@ -21118,7 +21173,7 @@
       <w:r>
         <w:t xml:space="preserve"> </w:t>
       </w:r>
-      <w:hyperlink r:id="rId331">
+      <w:hyperlink r:id="rId333">
         <w:r>
           <w:rPr>
             <w:rStyle w:val="Hyperlink"/>
@@ -21130,8 +21185,8 @@
         <w:t xml:space="preserve">.</w:t>
       </w:r>
     </w:p>
-    <w:bookmarkEnd w:id="332"/>
-    <w:bookmarkStart w:id="334" w:name="ref-frigida2023variability"/>
+    <w:bookmarkEnd w:id="334"/>
+    <w:bookmarkStart w:id="336" w:name="ref-frigida2023variability"/>
     <w:p>
       <w:pPr>
         <w:pStyle w:val="Bibliography"/>
@@ -21165,7 +21220,7 @@
       <w:r>
         <w:t xml:space="preserve"> </w:t>
       </w:r>
-      <w:hyperlink r:id="rId333">
+      <w:hyperlink r:id="rId335">
         <w:r>
           <w:rPr>
             <w:rStyle w:val="Hyperlink"/>
@@ -21177,9 +21232,9 @@
         <w:t xml:space="preserve">.</w:t>
       </w:r>
     </w:p>
-    <w:bookmarkEnd w:id="334"/>
-    <w:bookmarkEnd w:id="335"/>
     <w:bookmarkEnd w:id="336"/>
+    <w:bookmarkEnd w:id="337"/>
+    <w:bookmarkEnd w:id="338"/>
     <w:sectPr>
       <w:headerReference w:type="default" r:id="rId9"/>
       <w:footerReference w:type="default" r:id="rId10"/>

</xml_diff>

<commit_message>
Verify Histomonas translation boundary
</commit_message>
<xml_diff>
--- a/manuscript/artemisia-terpene-review-submission.docx
+++ b/manuscript/artemisia-terpene-review-submission.docx
@@ -199,7 +199,7 @@
         <w:t xml:space="preserve"> </w:t>
       </w:r>
       <w:r>
-        <w:t xml:space="preserve">contains volatile monoterpenes and sesquiterpenes, less volatile diterpenes and triterpenes, and structurally diverse sesquiterpene lactones (STLs). These metabolites are often discussed as though a species name, a pathway gene, or an oil profile were sufficient to predict pharmacology. Here we present a source-auditable scoping review with a frozen snapshot that instead treats the specimen, accession, tissue, preparation, analytical method, parasite stage, and evidence level as the units of comparison. The Terpedia package registers 541 sources, 556 source-linked evidence records, 132 antiparasitic records, 19 parasite–protein interaction records, 179 compound/specimen records, and 410 audited article claims; 92 sources and 107 linked evidence rows have completed full-text verification, while 21 remain open. We synthesize terpene classes with biosynthetic compartmentalization, regulatory and environmental variation, and a bounded comparative-genomics analysis. Artemisinin biosynthesis in</w:t>
+        <w:t xml:space="preserve">contains volatile monoterpenes and sesquiterpenes, less volatile diterpenes and triterpenes, and structurally diverse sesquiterpene lactones (STLs). These metabolites are often discussed as though a species name, a pathway gene, or an oil profile were sufficient to predict pharmacology. Here we present a source-auditable scoping review with a frozen snapshot that instead treats the specimen, accession, tissue, preparation, analytical method, parasite stage, and evidence level as the units of comparison. The Terpedia package registers 541 sources, 556 source-linked evidence records, 132 antiparasitic records, 19 parasite–protein interaction records, 179 compound/specimen records, and 410 audited article claims; 93 sources and 108 linked evidence rows have completed full-text verification, while 20 remain open. We synthesize terpene classes with biosynthetic compartmentalization, regulatory and environmental variation, and a bounded comparative-genomics analysis. Artemisinin biosynthesis in</w:t>
       </w:r>
       <w:r>
         <w:t xml:space="preserve"> </w:t>
@@ -976,7 +976,7 @@
         <w:spacing w:before="0" w:after="120" w:line="264" w:lineRule="auto"/>
       </w:pPr>
       <w:r>
-        <w:t xml:space="preserve">The analysis is reported as a frozen scoping review rather than a completed systematic review. The retrieval snapshot contains 1,408 bounded title/abstract decisions, covering all 1,387 priority-queue records plus 21 historical or out-of-queue decisions. Full-text verification now covers 92 publicly accessible, associated-supplementary, or publisher-indexed antiparasitic sources and 107 linked evidence rows; 21 queue sources remain unverified, and no result is pooled as a final quantitative estimate. The</w:t>
+        <w:t xml:space="preserve">The analysis is reported as a frozen scoping review rather than a completed systematic review. The retrieval snapshot contains 1,408 bounded title/abstract decisions, covering all 1,387 priority-queue records plus 21 historical or out-of-queue decisions. Full-text verification now covers 93 publicly accessible, associated-supplementary, or publisher-indexed antiparasitic sources and 108 linked evidence rows; 20 queue sources remain unverified, and no result is pooled as a final quantitative estimate. The</w:t>
       </w:r>
       <w:r>
         <w:t xml:space="preserve"> </w:t>
@@ -1082,7 +1082,33 @@
         <w:t xml:space="preserve"> </w:t>
       </w:r>
       <w:r>
-        <w:t xml:space="preserve">coccidiosis study retains unresolved extract chemistry and small-sample limitations, the associated</w:t>
+        <w:t xml:space="preserve">coccidiosis study retains unresolved extract chemistry and small-sample limitations, the newly verified</w:t>
+      </w:r>
+      <w:r>
+        <w:t xml:space="preserve"> </w:t>
+      </w:r>
+      <w:r>
+        <w:rPr>
+          <w:i/>
+          <w:iCs/>
+        </w:rPr>
+        <w:t xml:space="preserve">A. annua</w:t>
+      </w:r>
+      <w:r>
+        <w:t xml:space="preserve">/</w:t>
+      </w:r>
+      <w:r>
+        <w:rPr>
+          <w:i/>
+          <w:iCs/>
+        </w:rPr>
+        <w:t xml:space="preserve">H. meleagridis</w:t>
+      </w:r>
+      <w:r>
+        <w:t xml:space="preserve"> </w:t>
+      </w:r>
+      <w:r>
+        <w:t xml:space="preserve">study provides a strong in-vitro/in-vivo discordance control but retains unresolved extract chemistry and a high-dose toxicity caveat, the associated</w:t>
       </w:r>
       <w:r>
         <w:t xml:space="preserve"> </w:t>
@@ -6520,6 +6546,56 @@
         <w:spacing w:before="0" w:after="120" w:line="264" w:lineRule="auto"/>
       </w:pPr>
       <w:r>
+        <w:t xml:space="preserve">A publisher-indexed negative-control study tested five</w:t>
+      </w:r>
+      <w:r>
+        <w:t xml:space="preserve"> </w:t>
+      </w:r>
+      <w:r>
+        <w:rPr>
+          <w:i/>
+          <w:iCs/>
+        </w:rPr>
+        <w:t xml:space="preserve">A. annua</w:t>
+      </w:r>
+      <w:r>
+        <w:t xml:space="preserve"> </w:t>
+      </w:r>
+      <w:r>
+        <w:t xml:space="preserve">materials—dry leaves, pure artemisinin, and hexane, dichloromethane, and methanol leaf extracts—against six clonal</w:t>
+      </w:r>
+      <w:r>
+        <w:t xml:space="preserve"> </w:t>
+      </w:r>
+      <w:r>
+        <w:rPr>
+          <w:i/>
+          <w:iCs/>
+        </w:rPr>
+        <w:t xml:space="preserve">Histomonas meleagridis</w:t>
+      </w:r>
+      <w:r>
+        <w:t xml:space="preserve"> </w:t>
+      </w:r>
+      <w:r>
+        <w:t xml:space="preserve">cultures. Except for methanol, the materials were active in vitro; the dichloromethane extract had a reported minimum lethal concentration of 1.0 mg/mL and artemisinin an IC50 of 1.295 mg/mL. Yet neither selected treatment prevented experimental histomonosis in randomized groups of 65 turkey poults or 100 specific-pathogen-free chickens challenged with 3 × 10^5 histomonads. Bacterial-growth controls and ethics approval were reported, and high-dose artemisinin exposure produced a post-mortem toxicity signal. This is a strong in-vitro/in-vivo and exposure-context discordance control, not evidence for a non-artemisinin terpene mechanism or veterinary treatment</w:t>
+      </w:r>
+      <w:r>
+        <w:t xml:space="preserve"> </w:t>
+      </w:r>
+      <w:r>
+        <w:t xml:space="preserve">(Thøfner et al. 2012)</w:t>
+      </w:r>
+      <w:r>
+        <w:t xml:space="preserve">.</w:t>
+      </w:r>
+    </w:p>
+    <w:p>
+      <w:pPr>
+        <w:pStyle w:val="BodyText"/>
+        <w:spacing w:before="0" w:after="120" w:line="264" w:lineRule="auto"/>
+      </w:pPr>
+      <w:r>
         <w:t xml:space="preserve">A separate full-text</w:t>
       </w:r>
       <w:r>
@@ -10434,6 +10510,132 @@
                 <w:sz w:val="18"/>
               </w:rPr>
               <w:t xml:space="preserve">(Cala et al. 2014)</w:t>
+            </w:r>
+          </w:p>
+        </w:tc>
+      </w:tr>
+      <w:tr>
+        <w:trPr>
+          <w:cantSplit w:val="true"/>
+        </w:trPr>
+        <w:tc>
+          <w:tcPr>
+            <w:tcW w:w="1800" w:type="dxa"/>
+            <w:tcMar>
+              <w:top w:w="80" w:type="dxa"/>
+              <w:start w:w="120" w:type="dxa"/>
+              <w:bottom w:w="80" w:type="dxa"/>
+              <w:end w:w="120" w:type="dxa"/>
+            </w:tcMar>
+            <w:vAlign w:val="center"/>
+          </w:tcPr>
+          <w:p>
+            <w:pPr>
+              <w:pStyle w:val="Compact"/>
+              <w:spacing w:before="0" w:after="40" w:line="240" w:lineRule="auto"/>
+            </w:pPr>
+            <w:r>
+              <w:rPr>
+                <w:rFonts w:ascii="Calibri" w:hAnsi="Calibri"/>
+                <w:i/>
+                <w:iCs/>
+                <w:sz w:val="18"/>
+              </w:rPr>
+              <w:t xml:space="preserve">A. annua</w:t>
+            </w:r>
+            <w:r>
+              <w:rPr>
+                <w:rFonts w:ascii="Calibri" w:hAnsi="Calibri"/>
+                <w:sz w:val="18"/>
+              </w:rPr>
+              <w:t xml:space="preserve"> </w:t>
+            </w:r>
+            <w:r>
+              <w:rPr>
+                <w:rFonts w:ascii="Calibri" w:hAnsi="Calibri"/>
+                <w:sz w:val="18"/>
+              </w:rPr>
+              <w:t xml:space="preserve">/</w:t>
+            </w:r>
+            <w:r>
+              <w:rPr>
+                <w:rFonts w:ascii="Calibri" w:hAnsi="Calibri"/>
+                <w:sz w:val="18"/>
+              </w:rPr>
+              <w:t xml:space="preserve"> </w:t>
+            </w:r>
+            <w:r>
+              <w:rPr>
+                <w:rFonts w:ascii="Calibri" w:hAnsi="Calibri"/>
+                <w:i/>
+                <w:iCs/>
+                <w:sz w:val="18"/>
+              </w:rPr>
+              <w:t xml:space="preserve">H. meleagridis</w:t>
+            </w:r>
+          </w:p>
+        </w:tc>
+        <w:tc>
+          <w:tcPr>
+            <w:tcW w:w="2800" w:type="dxa"/>
+            <w:tcMar>
+              <w:top w:w="80" w:type="dxa"/>
+              <w:start w:w="120" w:type="dxa"/>
+              <w:bottom w:w="80" w:type="dxa"/>
+              <w:end w:w="120" w:type="dxa"/>
+            </w:tcMar>
+            <w:vAlign w:val="center"/>
+          </w:tcPr>
+          <w:p>
+            <w:pPr>
+              <w:pStyle w:val="Compact"/>
+              <w:spacing w:before="0" w:after="40" w:line="240" w:lineRule="auto"/>
+            </w:pPr>
+            <w:r>
+              <w:rPr>
+                <w:rFonts w:ascii="Calibri" w:hAnsi="Calibri"/>
+                <w:sz w:val="18"/>
+              </w:rPr>
+              <w:t xml:space="preserve">Dry leaves, artemisinin, and several extracts inhibited six clonal cultures in vitro, but selected dichloromethane extract and artemisinin treatments failed in experimentally infected turkeys and chickens</w:t>
+            </w:r>
+          </w:p>
+        </w:tc>
+        <w:tc>
+          <w:tcPr>
+            <w:tcW w:w="2400" w:type="dxa"/>
+            <w:tcMar>
+              <w:top w:w="80" w:type="dxa"/>
+              <w:start w:w="120" w:type="dxa"/>
+              <w:bottom w:w="80" w:type="dxa"/>
+              <w:end w:w="120" w:type="dxa"/>
+            </w:tcMar>
+            <w:vAlign w:val="center"/>
+          </w:tcPr>
+          <w:p>
+            <w:pPr>
+              <w:pStyle w:val="Compact"/>
+              <w:spacing w:before="0" w:after="40" w:line="240" w:lineRule="auto"/>
+            </w:pPr>
+            <w:r>
+              <w:rPr>
+                <w:rFonts w:ascii="Calibri" w:hAnsi="Calibri"/>
+                <w:sz w:val="18"/>
+              </w:rPr>
+              <w:t xml:space="preserve">Strong in-vitro/in-vivo discordance control; unresolved extract chemistry, poultry exposure, and a reported high-dose toxicity signal prevent terpene or treatment inference</w:t>
+            </w:r>
+            <w:r>
+              <w:rPr>
+                <w:rFonts w:ascii="Calibri" w:hAnsi="Calibri"/>
+                <w:sz w:val="18"/>
+              </w:rPr>
+              <w:t xml:space="preserve"> </w:t>
+            </w:r>
+            <w:r>
+              <w:rPr>
+                <w:rFonts w:ascii="Calibri" w:hAnsi="Calibri"/>
+                <w:sz w:val="18"/>
+              </w:rPr>
+              <w:t xml:space="preserve">(Thøfner et al. 2012)</w:t>
             </w:r>
           </w:p>
         </w:tc>
@@ -12718,7 +12920,7 @@
         <w:rPr>
           <w:rStyle w:val="VerbatimChar"/>
         </w:rPr>
-        <w:t xml:space="preserve">1ada072</w:t>
+        <w:t xml:space="preserve">e8f3a3e</w:t>
       </w:r>
       <w:r>
         <w:t xml:space="preserve">; the current Terpedia snapshot is maintained on the</w:t>
@@ -12892,7 +13094,7 @@
     <w:bookmarkEnd w:id="50"/>
     <w:bookmarkEnd w:id="51"/>
     <w:bookmarkEnd w:id="52"/>
-    <w:bookmarkStart w:id="338" w:name="references"/>
+    <w:bookmarkStart w:id="340" w:name="references"/>
     <w:p>
       <w:pPr>
         <w:pStyle w:val="Heading1"/>
@@ -12902,7 +13104,7 @@
         <w:t xml:space="preserve">References</w:t>
       </w:r>
     </w:p>
-    <w:bookmarkStart w:id="337" w:name="refs"/>
+    <w:bookmarkStart w:id="339" w:name="refs"/>
     <w:bookmarkStart w:id="54" w:name="ref-abad2012artemisia"/>
     <w:p>
       <w:pPr>
@@ -19868,13 +20070,72 @@
       </w:r>
     </w:p>
     <w:bookmarkEnd w:id="288"/>
-    <w:bookmarkStart w:id="290" w:name="ref-trendafilova2021edibleartemisia"/>
+    <w:bookmarkStart w:id="290" w:name="ref-thofner2012histomonas"/>
     <w:p>
       <w:pPr>
         <w:pStyle w:val="Bibliography"/>
         <w:spacing w:before="0" w:after="120" w:line="264" w:lineRule="auto"/>
       </w:pPr>
       <w:r>
+        <w:t xml:space="preserve">Thøfner, I. C. N., D. Liebhart, M. Hess, and T. W. Schou. 2012.</w:t>
+      </w:r>
+      <w:r>
+        <w:t xml:space="preserve"> </w:t>
+      </w:r>
+      <w:r>
+        <w:t xml:space="preserve">“Antihistomonal Effects of Artemisinin and</w:t>
+      </w:r>
+      <w:r>
+        <w:t xml:space="preserve"> </w:t>
+      </w:r>
+      <w:r>
+        <w:t xml:space="preserve">Artemisia annua</w:t>
+      </w:r>
+      <w:r>
+        <w:t xml:space="preserve"> </w:t>
+      </w:r>
+      <w:r>
+        <w:t xml:space="preserve">Extracts in Vitro Could Not Be Confirmed by in Vivo Experiments in Turkeys and Chickens.”</w:t>
+      </w:r>
+      <w:r>
+        <w:t xml:space="preserve"> </w:t>
+      </w:r>
+      <w:r>
+        <w:rPr>
+          <w:i/>
+          <w:iCs/>
+        </w:rPr>
+        <w:t xml:space="preserve">Avian Pathology</w:t>
+      </w:r>
+      <w:r>
+        <w:t xml:space="preserve"> </w:t>
+      </w:r>
+      <w:r>
+        <w:t xml:space="preserve">41.</w:t>
+      </w:r>
+      <w:r>
+        <w:t xml:space="preserve"> </w:t>
+      </w:r>
+      <w:hyperlink r:id="rId289">
+        <w:r>
+          <w:rPr>
+            <w:rStyle w:val="Hyperlink"/>
+          </w:rPr>
+          <w:t xml:space="preserve">https://doi.org/10.1080/03079457.2012.714459</w:t>
+        </w:r>
+      </w:hyperlink>
+      <w:r>
+        <w:t xml:space="preserve">.</w:t>
+      </w:r>
+    </w:p>
+    <w:bookmarkEnd w:id="290"/>
+    <w:bookmarkStart w:id="292" w:name="ref-trendafilova2021edibleartemisia"/>
+    <w:p>
+      <w:pPr>
+        <w:pStyle w:val="Bibliography"/>
+        <w:spacing w:before="0" w:after="120" w:line="264" w:lineRule="auto"/>
+      </w:pPr>
+      <w:r>
         <w:t xml:space="preserve">Trendafilova, Anelia, Lidia M. Moujir, Paulo M. C. Sousa, and Ana M. L. Seca. 2021.</w:t>
       </w:r>
       <w:r>
@@ -19902,7 +20163,7 @@
       <w:r>
         <w:t xml:space="preserve"> </w:t>
       </w:r>
-      <w:hyperlink r:id="rId289">
+      <w:hyperlink r:id="rId291">
         <w:r>
           <w:rPr>
             <w:rStyle w:val="Hyperlink"/>
@@ -19914,8 +20175,8 @@
         <w:t xml:space="preserve">.</w:t>
       </w:r>
     </w:p>
-    <w:bookmarkEnd w:id="290"/>
-    <w:bookmarkStart w:id="292" w:name="ref-umaraliev2025persicabisabolanes"/>
+    <w:bookmarkEnd w:id="292"/>
+    <w:bookmarkStart w:id="294" w:name="ref-umaraliev2025persicabisabolanes"/>
     <w:p>
       <w:pPr>
         <w:pStyle w:val="Bibliography"/>
@@ -19955,7 +20216,7 @@
       <w:r>
         <w:t xml:space="preserve"> </w:t>
       </w:r>
-      <w:hyperlink r:id="rId291">
+      <w:hyperlink r:id="rId293">
         <w:r>
           <w:rPr>
             <w:rStyle w:val="Hyperlink"/>
@@ -19967,8 +20228,8 @@
         <w:t xml:space="preserve">.</w:t>
       </w:r>
     </w:p>
-    <w:bookmarkEnd w:id="292"/>
-    <w:bookmarkStart w:id="294" w:name="ref-umaraliev2026persicamonoterpenes"/>
+    <w:bookmarkEnd w:id="294"/>
+    <w:bookmarkStart w:id="296" w:name="ref-umaraliev2026persicamonoterpenes"/>
     <w:p>
       <w:pPr>
         <w:pStyle w:val="Bibliography"/>
@@ -20008,7 +20269,7 @@
       <w:r>
         <w:t xml:space="preserve"> </w:t>
       </w:r>
-      <w:hyperlink r:id="rId293">
+      <w:hyperlink r:id="rId295">
         <w:r>
           <w:rPr>
             <w:rStyle w:val="Hyperlink"/>
@@ -20020,8 +20281,8 @@
         <w:t xml:space="preserve">.</w:t>
       </w:r>
     </w:p>
-    <w:bookmarkEnd w:id="294"/>
-    <w:bookmarkStart w:id="296" w:name="ref-urban2020trpc3"/>
+    <w:bookmarkEnd w:id="296"/>
+    <w:bookmarkStart w:id="298" w:name="ref-urban2020trpc3"/>
     <w:p>
       <w:pPr>
         <w:pStyle w:val="Bibliography"/>
@@ -20067,7 +20328,7 @@
       <w:r>
         <w:t xml:space="preserve"> </w:t>
       </w:r>
-      <w:hyperlink r:id="rId295">
+      <w:hyperlink r:id="rId297">
         <w:r>
           <w:rPr>
             <w:rStyle w:val="Hyperlink"/>
@@ -20079,8 +20340,8 @@
         <w:t xml:space="preserve">.</w:t>
       </w:r>
     </w:p>
-    <w:bookmarkEnd w:id="296"/>
-    <w:bookmarkStart w:id="298" w:name="ref-varadyova2018medicinalplants"/>
+    <w:bookmarkEnd w:id="298"/>
+    <w:bookmarkStart w:id="300" w:name="ref-varadyova2018medicinalplants"/>
     <w:p>
       <w:pPr>
         <w:pStyle w:val="Bibliography"/>
@@ -20123,7 +20384,7 @@
       <w:r>
         <w:t xml:space="preserve"> </w:t>
       </w:r>
-      <w:hyperlink r:id="rId297">
+      <w:hyperlink r:id="rId299">
         <w:r>
           <w:rPr>
             <w:rStyle w:val="Hyperlink"/>
@@ -20135,8 +20396,8 @@
         <w:t xml:space="preserve">.</w:t>
       </w:r>
     </w:p>
-    <w:bookmarkEnd w:id="298"/>
-    <w:bookmarkStart w:id="300" w:name="ref-walz2024aframalaria"/>
+    <w:bookmarkEnd w:id="300"/>
+    <w:bookmarkStart w:id="302" w:name="ref-walz2024aframalaria"/>
     <w:p>
       <w:pPr>
         <w:pStyle w:val="Bibliography"/>
@@ -20182,7 +20443,7 @@
       <w:r>
         <w:t xml:space="preserve"> </w:t>
       </w:r>
-      <w:hyperlink r:id="rId299">
+      <w:hyperlink r:id="rId301">
         <w:r>
           <w:rPr>
             <w:rStyle w:val="Hyperlink"/>
@@ -20194,8 +20455,8 @@
         <w:t xml:space="preserve">.</w:t>
       </w:r>
     </w:p>
-    <w:bookmarkEnd w:id="300"/>
-    <w:bookmarkStart w:id="302" w:name="ref-wang2013cyp71av1promoter"/>
+    <w:bookmarkEnd w:id="302"/>
+    <w:bookmarkStart w:id="304" w:name="ref-wang2013cyp71av1promoter"/>
     <w:p>
       <w:pPr>
         <w:pStyle w:val="Bibliography"/>
@@ -20229,7 +20490,7 @@
       <w:r>
         <w:t xml:space="preserve"> </w:t>
       </w:r>
-      <w:hyperlink r:id="rId301">
+      <w:hyperlink r:id="rId303">
         <w:r>
           <w:rPr>
             <w:rStyle w:val="Hyperlink"/>
@@ -20241,8 +20502,8 @@
         <w:t xml:space="preserve">.</w:t>
       </w:r>
     </w:p>
-    <w:bookmarkEnd w:id="302"/>
-    <w:bookmarkStart w:id="304" w:name="ref-wang2009trichometranscriptome"/>
+    <w:bookmarkEnd w:id="304"/>
+    <w:bookmarkStart w:id="306" w:name="ref-wang2009trichometranscriptome"/>
     <w:p>
       <w:pPr>
         <w:pStyle w:val="Bibliography"/>
@@ -20276,7 +20537,7 @@
       <w:r>
         <w:t xml:space="preserve"> </w:t>
       </w:r>
-      <w:hyperlink r:id="rId303">
+      <w:hyperlink r:id="rId305">
         <w:r>
           <w:rPr>
             <w:rStyle w:val="Hyperlink"/>
@@ -20288,8 +20549,8 @@
         <w:t xml:space="preserve">.</w:t>
       </w:r>
     </w:p>
-    <w:bookmarkEnd w:id="304"/>
-    <w:bookmarkStart w:id="306" w:name="ref-wani2023nitric"/>
+    <w:bookmarkEnd w:id="306"/>
+    <w:bookmarkStart w:id="308" w:name="ref-wani2023nitric"/>
     <w:p>
       <w:pPr>
         <w:pStyle w:val="Bibliography"/>
@@ -20347,7 +20608,7 @@
       <w:r>
         <w:t xml:space="preserve"> </w:t>
       </w:r>
-      <w:hyperlink r:id="rId305">
+      <w:hyperlink r:id="rId307">
         <w:r>
           <w:rPr>
             <w:rStyle w:val="Hyperlink"/>
@@ -20359,8 +20620,8 @@
         <w:t xml:space="preserve">.</w:t>
       </w:r>
     </w:p>
-    <w:bookmarkEnd w:id="306"/>
-    <w:bookmarkStart w:id="308" w:name="ref-wani2026maritima"/>
+    <w:bookmarkEnd w:id="308"/>
+    <w:bookmarkStart w:id="310" w:name="ref-wani2026maritima"/>
     <w:p>
       <w:pPr>
         <w:pStyle w:val="Bibliography"/>
@@ -20406,7 +20667,7 @@
       <w:r>
         <w:t xml:space="preserve"> </w:t>
       </w:r>
-      <w:hyperlink r:id="rId307">
+      <w:hyperlink r:id="rId309">
         <w:r>
           <w:rPr>
             <w:rStyle w:val="Hyperlink"/>
@@ -20418,8 +20679,8 @@
         <w:t xml:space="preserve">.</w:t>
       </w:r>
     </w:p>
-    <w:bookmarkEnd w:id="308"/>
-    <w:bookmarkStart w:id="310" w:name="ref-wetmore2019psiv9"/>
+    <w:bookmarkEnd w:id="310"/>
+    <w:bookmarkStart w:id="312" w:name="ref-wetmore2019psiv9"/>
     <w:p>
       <w:pPr>
         <w:pStyle w:val="Bibliography"/>
@@ -20465,7 +20726,7 @@
       <w:r>
         <w:t xml:space="preserve"> </w:t>
       </w:r>
-      <w:hyperlink r:id="rId309">
+      <w:hyperlink r:id="rId311">
         <w:r>
           <w:rPr>
             <w:rStyle w:val="Hyperlink"/>
@@ -20477,8 +20738,8 @@
         <w:t xml:space="preserve">.</w:t>
       </w:r>
     </w:p>
-    <w:bookmarkEnd w:id="310"/>
-    <w:bookmarkStart w:id="312" w:name="ref-wiedosari2017eimeria"/>
+    <w:bookmarkEnd w:id="312"/>
+    <w:bookmarkStart w:id="314" w:name="ref-wiedosari2017eimeria"/>
     <w:p>
       <w:pPr>
         <w:pStyle w:val="Bibliography"/>
@@ -20533,7 +20794,7 @@
       <w:r>
         <w:t xml:space="preserve"> </w:t>
       </w:r>
-      <w:hyperlink r:id="rId311">
+      <w:hyperlink r:id="rId313">
         <w:r>
           <w:rPr>
             <w:rStyle w:val="Hyperlink"/>
@@ -20545,8 +20806,8 @@
         <w:t xml:space="preserve">.</w:t>
       </w:r>
     </w:p>
-    <w:bookmarkEnd w:id="312"/>
-    <w:bookmarkStart w:id="314" w:name="ref-wright2010qinghao"/>
+    <w:bookmarkEnd w:id="314"/>
+    <w:bookmarkStart w:id="316" w:name="ref-wright2010qinghao"/>
     <w:p>
       <w:pPr>
         <w:pStyle w:val="Bibliography"/>
@@ -20592,7 +20853,7 @@
       <w:r>
         <w:t xml:space="preserve"> </w:t>
       </w:r>
-      <w:hyperlink r:id="rId313">
+      <w:hyperlink r:id="rId315">
         <w:r>
           <w:rPr>
             <w:rStyle w:val="Hyperlink"/>
@@ -20604,8 +20865,8 @@
         <w:t xml:space="preserve">.</w:t>
       </w:r>
     </w:p>
-    <w:bookmarkEnd w:id="314"/>
-    <w:bookmarkStart w:id="316" w:name="ref-xiang2019bhlh112"/>
+    <w:bookmarkEnd w:id="316"/>
+    <w:bookmarkStart w:id="318" w:name="ref-xiang2019bhlh112"/>
     <w:p>
       <w:pPr>
         <w:pStyle w:val="Bibliography"/>
@@ -20639,7 +20900,7 @@
       <w:r>
         <w:t xml:space="preserve"> </w:t>
       </w:r>
-      <w:hyperlink r:id="rId315">
+      <w:hyperlink r:id="rId317">
         <w:r>
           <w:rPr>
             <w:rStyle w:val="Hyperlink"/>
@@ -20651,8 +20912,8 @@
         <w:t xml:space="preserve">.</w:t>
       </w:r>
     </w:p>
-    <w:bookmarkEnd w:id="316"/>
-    <w:bookmarkStart w:id="318" w:name="ref-xu2025plantmatrix"/>
+    <w:bookmarkEnd w:id="318"/>
+    <w:bookmarkStart w:id="320" w:name="ref-xu2025plantmatrix"/>
     <w:p>
       <w:pPr>
         <w:pStyle w:val="Bibliography"/>
@@ -20698,7 +20959,7 @@
       <w:r>
         <w:t xml:space="preserve"> </w:t>
       </w:r>
-      <w:hyperlink r:id="rId317">
+      <w:hyperlink r:id="rId319">
         <w:r>
           <w:rPr>
             <w:rStyle w:val="Hyperlink"/>
@@ -20710,8 +20971,8 @@
         <w:t xml:space="preserve">.</w:t>
       </w:r>
     </w:p>
-    <w:bookmarkEnd w:id="318"/>
-    <w:bookmarkStart w:id="320" w:name="ref-xu2026artemisininpk"/>
+    <w:bookmarkEnd w:id="320"/>
+    <w:bookmarkStart w:id="322" w:name="ref-xu2026artemisininpk"/>
     <w:p>
       <w:pPr>
         <w:pStyle w:val="Bibliography"/>
@@ -20757,7 +21018,7 @@
       <w:r>
         <w:t xml:space="preserve"> </w:t>
       </w:r>
-      <w:hyperlink r:id="rId319">
+      <w:hyperlink r:id="rId321">
         <w:r>
           <w:rPr>
             <w:rStyle w:val="Hyperlink"/>
@@ -20769,8 +21030,8 @@
         <w:t xml:space="preserve">.</w:t>
       </w:r>
     </w:p>
-    <w:bookmarkEnd w:id="320"/>
-    <w:bookmarkStart w:id="322" w:name="ref-yildiz2011toxocara"/>
+    <w:bookmarkEnd w:id="322"/>
+    <w:bookmarkStart w:id="324" w:name="ref-yildiz2011toxocara"/>
     <w:p>
       <w:pPr>
         <w:pStyle w:val="Bibliography"/>
@@ -20828,7 +21089,7 @@
       <w:r>
         <w:t xml:space="preserve"> </w:t>
       </w:r>
-      <w:hyperlink r:id="rId321">
+      <w:hyperlink r:id="rId323">
         <w:r>
           <w:rPr>
             <w:rStyle w:val="Hyperlink"/>
@@ -20840,8 +21101,8 @@
         <w:t xml:space="preserve">.</w:t>
       </w:r>
     </w:p>
-    <w:bookmarkEnd w:id="322"/>
-    <w:bookmarkStart w:id="324" w:name="ref-zehra2020copper"/>
+    <w:bookmarkEnd w:id="324"/>
+    <w:bookmarkStart w:id="326" w:name="ref-zehra2020copper"/>
     <w:p>
       <w:pPr>
         <w:pStyle w:val="Bibliography"/>
@@ -20887,7 +21148,7 @@
       <w:r>
         <w:t xml:space="preserve"> </w:t>
       </w:r>
-      <w:hyperlink r:id="rId323">
+      <w:hyperlink r:id="rId325">
         <w:r>
           <w:rPr>
             <w:rStyle w:val="Hyperlink"/>
@@ -20899,8 +21160,8 @@
         <w:t xml:space="preserve">.</w:t>
       </w:r>
     </w:p>
-    <w:bookmarkEnd w:id="324"/>
-    <w:bookmarkStart w:id="326" w:name="ref-zhang2022fiveartemisia"/>
+    <w:bookmarkEnd w:id="326"/>
+    <w:bookmarkStart w:id="328" w:name="ref-zhang2022fiveartemisia"/>
     <w:p>
       <w:pPr>
         <w:pStyle w:val="Bibliography"/>
@@ -20946,7 +21207,7 @@
       <w:r>
         <w:t xml:space="preserve"> </w:t>
       </w:r>
-      <w:hyperlink r:id="rId325">
+      <w:hyperlink r:id="rId327">
         <w:r>
           <w:rPr>
             <w:rStyle w:val="Hyperlink"/>
@@ -20958,8 +21219,8 @@
         <w:t xml:space="preserve">.</w:t>
       </w:r>
     </w:p>
-    <w:bookmarkEnd w:id="326"/>
-    <w:bookmarkStart w:id="328" w:name="ref-zhang2026annuaenhancement"/>
+    <w:bookmarkEnd w:id="328"/>
+    <w:bookmarkStart w:id="330" w:name="ref-zhang2026annuaenhancement"/>
     <w:p>
       <w:pPr>
         <w:pStyle w:val="Bibliography"/>
@@ -21005,7 +21266,7 @@
       <w:r>
         <w:t xml:space="preserve"> </w:t>
       </w:r>
-      <w:hyperlink r:id="rId327">
+      <w:hyperlink r:id="rId329">
         <w:r>
           <w:rPr>
             <w:rStyle w:val="Hyperlink"/>
@@ -21017,8 +21278,8 @@
         <w:t xml:space="preserve">.</w:t>
       </w:r>
     </w:p>
-    <w:bookmarkEnd w:id="328"/>
-    <w:bookmarkStart w:id="330" w:name="ref-zhang2020argyitriterpenoids"/>
+    <w:bookmarkEnd w:id="330"/>
+    <w:bookmarkStart w:id="332" w:name="ref-zhang2020argyitriterpenoids"/>
     <w:p>
       <w:pPr>
         <w:pStyle w:val="Bibliography"/>
@@ -21061,7 +21322,7 @@
       <w:r>
         <w:t xml:space="preserve"> </w:t>
       </w:r>
-      <w:hyperlink r:id="rId329">
+      <w:hyperlink r:id="rId331">
         <w:r>
           <w:rPr>
             <w:rStyle w:val="Hyperlink"/>
@@ -21073,8 +21334,8 @@
         <w:t xml:space="preserve">.</w:t>
       </w:r>
     </w:p>
-    <w:bookmarkEnd w:id="330"/>
-    <w:bookmarkStart w:id="332" w:name="ref-zhang2019pp2c1"/>
+    <w:bookmarkEnd w:id="332"/>
+    <w:bookmarkStart w:id="334" w:name="ref-zhang2019pp2c1"/>
     <w:p>
       <w:pPr>
         <w:pStyle w:val="Bibliography"/>
@@ -21126,7 +21387,7 @@
       <w:r>
         <w:t xml:space="preserve"> </w:t>
       </w:r>
-      <w:hyperlink r:id="rId331">
+      <w:hyperlink r:id="rId333">
         <w:r>
           <w:rPr>
             <w:rStyle w:val="Hyperlink"/>
@@ -21138,8 +21399,8 @@
         <w:t xml:space="preserve">.</w:t>
       </w:r>
     </w:p>
-    <w:bookmarkEnd w:id="332"/>
-    <w:bookmarkStart w:id="334" w:name="ref-zhang2008dbr2"/>
+    <w:bookmarkEnd w:id="334"/>
+    <w:bookmarkStart w:id="336" w:name="ref-zhang2008dbr2"/>
     <w:p>
       <w:pPr>
         <w:pStyle w:val="Bibliography"/>
@@ -21173,7 +21434,7 @@
       <w:r>
         <w:t xml:space="preserve"> </w:t>
       </w:r>
-      <w:hyperlink r:id="rId333">
+      <w:hyperlink r:id="rId335">
         <w:r>
           <w:rPr>
             <w:rStyle w:val="Hyperlink"/>
@@ -21185,8 +21446,8 @@
         <w:t xml:space="preserve">.</w:t>
       </w:r>
     </w:p>
-    <w:bookmarkEnd w:id="334"/>
-    <w:bookmarkStart w:id="336" w:name="ref-frigida2023variability"/>
+    <w:bookmarkEnd w:id="336"/>
+    <w:bookmarkStart w:id="338" w:name="ref-frigida2023variability"/>
     <w:p>
       <w:pPr>
         <w:pStyle w:val="Bibliography"/>
@@ -21220,7 +21481,7 @@
       <w:r>
         <w:t xml:space="preserve"> </w:t>
       </w:r>
-      <w:hyperlink r:id="rId335">
+      <w:hyperlink r:id="rId337">
         <w:r>
           <w:rPr>
             <w:rStyle w:val="Hyperlink"/>
@@ -21232,9 +21493,9 @@
         <w:t xml:space="preserve">.</w:t>
       </w:r>
     </w:p>
-    <w:bookmarkEnd w:id="336"/>
-    <w:bookmarkEnd w:id="337"/>
     <w:bookmarkEnd w:id="338"/>
+    <w:bookmarkEnd w:id="339"/>
+    <w:bookmarkEnd w:id="340"/>
     <w:sectPr>
       <w:headerReference w:type="default" r:id="rId9"/>
       <w:footerReference w:type="default" r:id="rId10"/>

</xml_diff>

<commit_message>
Make snapshot provenance self-describing
</commit_message>
<xml_diff>
--- a/manuscript/artemisia-terpene-review-submission.docx
+++ b/manuscript/artemisia-terpene-review-submission.docx
@@ -12911,19 +12911,7 @@
         <w:t xml:space="preserve">article.md</w:t>
       </w:r>
       <w:r>
-        <w:t xml:space="preserve">; this file is the consolidated submission version. Large comparative-genomics inputs and outputs, search snapshots, structured evidence tables, claim audits, and SHA-256 manifests are versioned in the same package. The frozen source state is identified by commit</w:t>
-      </w:r>
-      <w:r>
-        <w:t xml:space="preserve"> </w:t>
-      </w:r>
-      <w:r>
-        <w:rPr>
-          <w:rStyle w:val="VerbatimChar"/>
-        </w:rPr>
-        <w:t xml:space="preserve">5371b1f</w:t>
-      </w:r>
-      <w:r>
-        <w:t xml:space="preserve">; the current Terpedia snapshot is maintained on the</w:t>
+        <w:t xml:space="preserve">; this file is the consolidated submission version. Large comparative-genomics inputs and outputs, search snapshots, structured evidence tables, claim audits, and SHA-256 manifests are versioned in the same package. The exact frozen source commit is recorded in the synchronized Terpedia snapshot metadata; the current Terpedia snapshot is maintained on the</w:t>
       </w:r>
       <w:r>
         <w:t xml:space="preserve"> </w:t>

</xml_diff>

<commit_message>
Verify Artemisia cina helminth evidence
</commit_message>
<xml_diff>
--- a/manuscript/artemisia-terpene-review-submission.docx
+++ b/manuscript/artemisia-terpene-review-submission.docx
@@ -199,7 +199,7 @@
         <w:t xml:space="preserve"> </w:t>
       </w:r>
       <w:r>
-        <w:t xml:space="preserve">contains volatile monoterpenes and sesquiterpenes, less volatile diterpenes and triterpenes, and structurally diverse sesquiterpene lactones (STLs). These metabolites are often discussed as though a species name, a pathway gene, or an oil profile were sufficient to predict pharmacology. Here we present a source-auditable scoping review with a frozen snapshot that instead treats the specimen, accession, tissue, preparation, analytical method, parasite stage, and evidence level as the units of comparison. The Terpedia package registers 541 sources, 556 source-linked evidence records, 132 antiparasitic records, 19 parasite–protein interaction records, 179 compound/specimen records, and 410 audited article claims; 93 sources and 108 linked evidence rows have completed full-text verification, while 20 remain open. We synthesize terpene classes with biosynthetic compartmentalization, regulatory and environmental variation, and a bounded comparative-genomics analysis. Artemisinin biosynthesis in</w:t>
+        <w:t xml:space="preserve">contains volatile monoterpenes and sesquiterpenes, less volatile diterpenes and triterpenes, and structurally diverse sesquiterpene lactones (STLs). These metabolites are often discussed as though a species name, a pathway gene, or an oil profile were sufficient to predict pharmacology. Here we present a source-auditable scoping review with a frozen snapshot that instead treats the specimen, accession, tissue, preparation, analytical method, parasite stage, and evidence level as the units of comparison. The Terpedia package registers 541 sources, 556 source-linked evidence records, 132 antiparasitic records, 19 parasite–protein interaction records, 179 compound/specimen records, and 410 audited article claims; 94 sources and 109 linked evidence rows have completed full-text verification, while 19 remain open. We synthesize terpene classes with biosynthetic compartmentalization, regulatory and environmental variation, and a bounded comparative-genomics analysis. Artemisinin biosynthesis in</w:t>
       </w:r>
       <w:r>
         <w:t xml:space="preserve"> </w:t>
@@ -976,7 +976,7 @@
         <w:spacing w:before="0" w:after="120" w:line="264" w:lineRule="auto"/>
       </w:pPr>
       <w:r>
-        <w:t xml:space="preserve">The analysis is reported as a frozen scoping review rather than a completed systematic review. The retrieval snapshot contains 1,408 bounded title/abstract decisions, covering all 1,387 priority-queue records plus 21 historical or out-of-queue decisions. Full-text verification now covers 93 publicly accessible, associated-supplementary, or publisher-indexed antiparasitic sources and 108 linked evidence rows; 20 queue sources remain unverified, and no result is pooled as a final quantitative estimate. The</w:t>
+        <w:t xml:space="preserve">The analysis is reported as a frozen scoping review rather than a completed systematic review. The retrieval snapshot contains 1,408 bounded title/abstract decisions, covering all 1,387 priority-queue records plus 21 historical or out-of-queue decisions. Full-text verification now covers 94 publicly accessible, associated-supplementary, or publisher-indexed antiparasitic sources and 109 linked evidence rows; 19 queue sources remain unverified, and no result is pooled as a final quantitative estimate. The</w:t>
       </w:r>
       <w:r>
         <w:t xml:space="preserve"> </w:t>
@@ -1108,7 +1108,33 @@
         <w:t xml:space="preserve"> </w:t>
       </w:r>
       <w:r>
-        <w:t xml:space="preserve">study provides a strong in-vitro/in-vivo discordance control but retains unresolved extract chemistry and a high-dose toxicity caveat, the associated</w:t>
+        <w:t xml:space="preserve">study provides a strong in-vitro/in-vivo discordance control but retains unresolved extract chemistry and a high-dose toxicity caveat, the newly verified</w:t>
+      </w:r>
+      <w:r>
+        <w:t xml:space="preserve"> </w:t>
+      </w:r>
+      <w:r>
+        <w:rPr>
+          <w:i/>
+          <w:iCs/>
+        </w:rPr>
+        <w:t xml:space="preserve">A. cina</w:t>
+      </w:r>
+      <w:r>
+        <w:t xml:space="preserve">/</w:t>
+      </w:r>
+      <w:r>
+        <w:rPr>
+          <w:i/>
+          <w:iCs/>
+        </w:rPr>
+        <w:t xml:space="preserve">H. contortus</w:t>
+      </w:r>
+      <w:r>
+        <w:t xml:space="preserve"> </w:t>
+      </w:r>
+      <w:r>
+        <w:t xml:space="preserve">study retains publisher-preview-only quantitative eligibility, unresolved extract chemistry, and a response-biomarker rather than direct-target interpretation, the associated</w:t>
       </w:r>
       <w:r>
         <w:t xml:space="preserve"> </w:t>
@@ -7533,6 +7559,56 @@
       </w:r>
       <w:r>
         <w:t xml:space="preserve">(R. I. Higuera-Piedrahita et al. 2023)</w:t>
+      </w:r>
+      <w:r>
+        <w:t xml:space="preserve">.</w:t>
+      </w:r>
+    </w:p>
+    <w:p>
+      <w:pPr>
+        <w:pStyle w:val="BodyText"/>
+        <w:spacing w:before="0" w:after="120" w:line="264" w:lineRule="auto"/>
+      </w:pPr>
+      <w:r>
+        <w:t xml:space="preserve">A publisher-preview</w:t>
+      </w:r>
+      <w:r>
+        <w:t xml:space="preserve"> </w:t>
+      </w:r>
+      <w:r>
+        <w:rPr>
+          <w:i/>
+          <w:iCs/>
+        </w:rPr>
+        <w:t xml:space="preserve">A. cina</w:t>
+      </w:r>
+      <w:r>
+        <w:t xml:space="preserve"> </w:t>
+      </w:r>
+      <w:r>
+        <w:t xml:space="preserve">study adds a parasite-response biomarker lead. Three extracts were tested against</w:t>
+      </w:r>
+      <w:r>
+        <w:t xml:space="preserve"> </w:t>
+      </w:r>
+      <w:r>
+        <w:rPr>
+          <w:i/>
+          <w:iCs/>
+        </w:rPr>
+        <w:t xml:space="preserve">H. contortus</w:t>
+      </w:r>
+      <w:r>
+        <w:t xml:space="preserve"> </w:t>
+      </w:r>
+      <w:r>
+        <w:t xml:space="preserve">L3 and transitional L3–L4 larvae in 96-well assays, Hc29 expression was measured by RT-PCR, and six groups of five infected gerbils received 4 mg/kg oral extract. The preview reports 75% and 82.6% L3 activity for n-hexane extract at 1 and 2 mg/mL, 69% transitional-larvae activity for n-hexane extract, 13- and 80-fold Hc29-expression changes under reported exposure conditions, and 100% reported gerbil reduction. The complete article is subscription-gated, and no terpene-resolved extract profile, mammalian selectivity, systemic exposure, or direct Hc29-binding assay is exposed; the result is therefore a related-species comparative lead rather than evidence for a wormwood terpene mechanism</w:t>
+      </w:r>
+      <w:r>
+        <w:t xml:space="preserve"> </w:t>
+      </w:r>
+      <w:r>
+        <w:t xml:space="preserve">(R. Higuera-Piedrahita et al. 2021)</w:t>
       </w:r>
       <w:r>
         <w:t xml:space="preserve">.</w:t>

</xml_diff>

<commit_message>
Tighten submission wormwood comparator and metadata
</commit_message>
<xml_diff>
--- a/manuscript/artemisia-terpene-review-submission.docx
+++ b/manuscript/artemisia-terpene-review-submission.docx
@@ -6453,7 +6453,7 @@
         <w:t xml:space="preserve"> </w:t>
       </w:r>
       <w:r>
-        <w:t xml:space="preserve">(Iqbal et al. 2013)</w:t>
+        <w:t xml:space="preserve">(A. Iqbal et al. 2013)</w:t>
       </w:r>
       <w:r>
         <w:t xml:space="preserve">. In a separate 46-plant tincture screen, 1.0%</w:t>
@@ -7964,6 +7964,56 @@
       </w:r>
       <w:r>
         <w:t xml:space="preserve">alone. The result is important preparation- and polarity-specific ovine evidence, not proof of a named wormwood terpene, a standardized dose, or human safety.</w:t>
+      </w:r>
+    </w:p>
+    <w:p>
+      <w:pPr>
+        <w:pStyle w:val="BodyText"/>
+        <w:spacing w:before="0" w:after="120" w:line="264" w:lineRule="auto"/>
+      </w:pPr>
+      <w:r>
+        <w:t xml:space="preserve">An older related-species study supplies a useful dose-response and comparator boundary. Whole-plant</w:t>
+      </w:r>
+      <w:r>
+        <w:t xml:space="preserve"> </w:t>
+      </w:r>
+      <w:r>
+        <w:rPr>
+          <w:i/>
+          <w:iCs/>
+        </w:rPr>
+        <w:t xml:space="preserve">A. brevifolia</w:t>
+      </w:r>
+      <w:r>
+        <w:t xml:space="preserve"> </w:t>
+      </w:r>
+      <w:r>
+        <w:t xml:space="preserve">crude aqueous and methanol extracts caused paralysis or mortality of live</w:t>
+      </w:r>
+      <w:r>
+        <w:t xml:space="preserve"> </w:t>
+      </w:r>
+      <w:r>
+        <w:rPr>
+          <w:i/>
+          <w:iCs/>
+        </w:rPr>
+        <w:t xml:space="preserve">H. contortus</w:t>
+      </w:r>
+      <w:r>
+        <w:t xml:space="preserve"> </w:t>
+      </w:r>
+      <w:r>
+        <w:t xml:space="preserve">in vitro; in naturally infected sheep, the crude aqueous extract reached a maximum reported 67.2% day-14 fecal-egg-count reduction at 3 g/kg, compared with 99.2% for levamisole</w:t>
+      </w:r>
+      <w:r>
+        <w:t xml:space="preserve"> </w:t>
+      </w:r>
+      <w:r>
+        <w:t xml:space="preserve">(Z. Iqbal et al. 2004)</w:t>
+      </w:r>
+      <w:r>
+        <w:t xml:space="preserve">. Because the study used whole-plant preparations, mixed gastrointestinal nematode infection, and a gated full article, it supports a comparative veterinary phenotype but not a terpene/STL attribution, standardized exposure, or human vermifuge claim.</w:t>
       </w:r>
     </w:p>
     <w:p>
@@ -10852,6 +10902,116 @@
                 <w:sz w:val="18"/>
               </w:rPr>
               <w:t xml:space="preserve">(Tariq et al. 2009)</w:t>
+            </w:r>
+          </w:p>
+        </w:tc>
+      </w:tr>
+      <w:tr>
+        <w:trPr>
+          <w:cantSplit w:val="true"/>
+        </w:trPr>
+        <w:tc>
+          <w:tcPr>
+            <w:tcW w:w="1800" w:type="dxa"/>
+            <w:tcMar>
+              <w:top w:w="80" w:type="dxa"/>
+              <w:start w:w="120" w:type="dxa"/>
+              <w:bottom w:w="80" w:type="dxa"/>
+              <w:end w:w="120" w:type="dxa"/>
+            </w:tcMar>
+            <w:vAlign w:val="center"/>
+          </w:tcPr>
+          <w:p>
+            <w:pPr>
+              <w:pStyle w:val="Compact"/>
+              <w:spacing w:before="0" w:after="40" w:line="240" w:lineRule="auto"/>
+            </w:pPr>
+            <w:r>
+              <w:rPr>
+                <w:rFonts w:ascii="Calibri" w:hAnsi="Calibri"/>
+                <w:i/>
+                <w:iCs/>
+                <w:sz w:val="18"/>
+              </w:rPr>
+              <w:t xml:space="preserve">A. brevifolia</w:t>
+            </w:r>
+            <w:r>
+              <w:rPr>
+                <w:rFonts w:ascii="Calibri" w:hAnsi="Calibri"/>
+                <w:sz w:val="18"/>
+              </w:rPr>
+              <w:t xml:space="preserve"> </w:t>
+            </w:r>
+            <w:r>
+              <w:rPr>
+                <w:rFonts w:ascii="Calibri" w:hAnsi="Calibri"/>
+                <w:sz w:val="18"/>
+              </w:rPr>
+              <w:t xml:space="preserve">/ ovine gastrointestinal nematodes</w:t>
+            </w:r>
+          </w:p>
+        </w:tc>
+        <w:tc>
+          <w:tcPr>
+            <w:tcW w:w="2800" w:type="dxa"/>
+            <w:tcMar>
+              <w:top w:w="80" w:type="dxa"/>
+              <w:start w:w="120" w:type="dxa"/>
+              <w:bottom w:w="80" w:type="dxa"/>
+              <w:end w:w="120" w:type="dxa"/>
+            </w:tcMar>
+            <w:vAlign w:val="center"/>
+          </w:tcPr>
+          <w:p>
+            <w:pPr>
+              <w:pStyle w:val="Compact"/>
+              <w:spacing w:before="0" w:after="40" w:line="240" w:lineRule="auto"/>
+            </w:pPr>
+            <w:r>
+              <w:rPr>
+                <w:rFonts w:ascii="Calibri" w:hAnsi="Calibri"/>
+                <w:sz w:val="18"/>
+              </w:rPr>
+              <w:t xml:space="preserve">Whole-plant crude aqueous extract reached 67.2% day-14 fecal-egg-count reduction at 3 g/kg versus 99.2% for levamisole</w:t>
+            </w:r>
+          </w:p>
+        </w:tc>
+        <w:tc>
+          <w:tcPr>
+            <w:tcW w:w="2400" w:type="dxa"/>
+            <w:tcMar>
+              <w:top w:w="80" w:type="dxa"/>
+              <w:start w:w="120" w:type="dxa"/>
+              <w:bottom w:w="80" w:type="dxa"/>
+              <w:end w:w="120" w:type="dxa"/>
+            </w:tcMar>
+            <w:vAlign w:val="center"/>
+          </w:tcPr>
+          <w:p>
+            <w:pPr>
+              <w:pStyle w:val="Compact"/>
+              <w:spacing w:before="0" w:after="40" w:line="240" w:lineRule="auto"/>
+            </w:pPr>
+            <w:r>
+              <w:rPr>
+                <w:rFonts w:ascii="Calibri" w:hAnsi="Calibri"/>
+                <w:sz w:val="18"/>
+              </w:rPr>
+              <w:t xml:space="preserve">Related-species dose-response comparator; publisher abstract supports the signal, while full-text chemistry and terpene attribution remain open</w:t>
+            </w:r>
+            <w:r>
+              <w:rPr>
+                <w:rFonts w:ascii="Calibri" w:hAnsi="Calibri"/>
+                <w:sz w:val="18"/>
+              </w:rPr>
+              <w:t xml:space="preserve"> </w:t>
+            </w:r>
+            <w:r>
+              <w:rPr>
+                <w:rFonts w:ascii="Calibri" w:hAnsi="Calibri"/>
+                <w:sz w:val="18"/>
+              </w:rPr>
+              <w:t xml:space="preserve">(Z. Iqbal et al. 2004)</w:t>
             </w:r>
           </w:p>
         </w:tc>
@@ -13158,7 +13318,7 @@
     <w:bookmarkEnd w:id="50"/>
     <w:bookmarkEnd w:id="51"/>
     <w:bookmarkEnd w:id="52"/>
-    <w:bookmarkStart w:id="340" w:name="references"/>
+    <w:bookmarkStart w:id="342" w:name="references"/>
     <w:p>
       <w:pPr>
         <w:pStyle w:val="Heading1"/>
@@ -13168,7 +13328,7 @@
         <w:t xml:space="preserve">References</w:t>
       </w:r>
     </w:p>
-    <w:bookmarkStart w:id="339" w:name="refs"/>
+    <w:bookmarkStart w:id="341" w:name="refs"/>
     <w:bookmarkStart w:id="54" w:name="ref-abad2012artemisia"/>
     <w:p>
       <w:pPr>
@@ -16285,13 +16445,72 @@
       </w:r>
     </w:p>
     <w:bookmarkEnd w:id="154"/>
-    <w:bookmarkStart w:id="156" w:name="ref-irehan2026absinthium"/>
+    <w:bookmarkStart w:id="156" w:name="ref-iqbal2004brevifolia"/>
     <w:p>
       <w:pPr>
         <w:pStyle w:val="Bibliography"/>
         <w:spacing w:before="0" w:after="120" w:line="264" w:lineRule="auto"/>
       </w:pPr>
       <w:r>
+        <w:t xml:space="preserve">Iqbal, Zafar, Muhammad Lateef, Muhammad Ashraf, and Abdul Jabbar. 2004.</w:t>
+      </w:r>
+      <w:r>
+        <w:t xml:space="preserve"> </w:t>
+      </w:r>
+      <w:r>
+        <w:t xml:space="preserve">“Anthelmintic Activity of</w:t>
+      </w:r>
+      <w:r>
+        <w:t xml:space="preserve"> </w:t>
+      </w:r>
+      <w:r>
+        <w:t xml:space="preserve">Artemisia brevifolia</w:t>
+      </w:r>
+      <w:r>
+        <w:t xml:space="preserve"> </w:t>
+      </w:r>
+      <w:r>
+        <w:t xml:space="preserve">in Sheep.”</w:t>
+      </w:r>
+      <w:r>
+        <w:t xml:space="preserve"> </w:t>
+      </w:r>
+      <w:r>
+        <w:rPr>
+          <w:i/>
+          <w:iCs/>
+        </w:rPr>
+        <w:t xml:space="preserve">Journal of Ethnopharmacology</w:t>
+      </w:r>
+      <w:r>
+        <w:t xml:space="preserve"> </w:t>
+      </w:r>
+      <w:r>
+        <w:t xml:space="preserve">93 (2–3): 265–68.</w:t>
+      </w:r>
+      <w:r>
+        <w:t xml:space="preserve"> </w:t>
+      </w:r>
+      <w:hyperlink r:id="rId155">
+        <w:r>
+          <w:rPr>
+            <w:rStyle w:val="Hyperlink"/>
+          </w:rPr>
+          <w:t xml:space="preserve">https://doi.org/10.1016/j.jep.2004.03.046</w:t>
+        </w:r>
+      </w:hyperlink>
+      <w:r>
+        <w:t xml:space="preserve">.</w:t>
+      </w:r>
+    </w:p>
+    <w:bookmarkEnd w:id="156"/>
+    <w:bookmarkStart w:id="158" w:name="ref-irehan2026absinthium"/>
+    <w:p>
+      <w:pPr>
+        <w:pStyle w:val="Bibliography"/>
+        <w:spacing w:before="0" w:after="120" w:line="264" w:lineRule="auto"/>
+      </w:pPr>
+      <w:r>
         <w:t xml:space="preserve">Irehan, B, F Temamogullari, D N Sayin Ipek, H Icen, and M Altas Atig. 2026.</w:t>
       </w:r>
       <w:r>
@@ -16319,7 +16538,7 @@
       <w:r>
         <w:t xml:space="preserve"> </w:t>
       </w:r>
-      <w:hyperlink r:id="rId155">
+      <w:hyperlink r:id="rId157">
         <w:r>
           <w:rPr>
             <w:rStyle w:val="Hyperlink"/>
@@ -16331,8 +16550,8 @@
         <w:t xml:space="preserve">.</w:t>
       </w:r>
     </w:p>
-    <w:bookmarkEnd w:id="156"/>
-    <w:bookmarkStart w:id="158" w:name="ref-chandler2015stl"/>
+    <w:bookmarkEnd w:id="158"/>
+    <w:bookmarkStart w:id="160" w:name="ref-chandler2015stl"/>
     <w:p>
       <w:pPr>
         <w:pStyle w:val="Bibliography"/>
@@ -16366,7 +16585,7 @@
       <w:r>
         <w:t xml:space="preserve"> </w:t>
       </w:r>
-      <w:hyperlink r:id="rId157">
+      <w:hyperlink r:id="rId159">
         <w:r>
           <w:rPr>
             <w:rStyle w:val="Hyperlink"/>
@@ -16378,8 +16597,8 @@
         <w:t xml:space="preserve">.</w:t>
       </w:r>
     </w:p>
-    <w:bookmarkEnd w:id="158"/>
-    <w:bookmarkStart w:id="160" w:name="ref-ji2025chrysosplenetin"/>
+    <w:bookmarkEnd w:id="160"/>
+    <w:bookmarkStart w:id="162" w:name="ref-ji2025chrysosplenetin"/>
     <w:p>
       <w:pPr>
         <w:pStyle w:val="Bibliography"/>
@@ -16425,7 +16644,7 @@
       <w:r>
         <w:t xml:space="preserve"> </w:t>
       </w:r>
-      <w:hyperlink r:id="rId159">
+      <w:hyperlink r:id="rId161">
         <w:r>
           <w:rPr>
             <w:rStyle w:val="Hyperlink"/>
@@ -16437,8 +16656,8 @@
         <w:t xml:space="preserve">.</w:t>
       </w:r>
     </w:p>
-    <w:bookmarkEnd w:id="160"/>
-    <w:bookmarkStart w:id="162" w:name="ref-jiang2016wrky1"/>
+    <w:bookmarkEnd w:id="162"/>
+    <w:bookmarkStart w:id="164" w:name="ref-jiang2016wrky1"/>
     <w:p>
       <w:pPr>
         <w:pStyle w:val="Bibliography"/>
@@ -16490,7 +16709,7 @@
       <w:r>
         <w:t xml:space="preserve"> </w:t>
       </w:r>
-      <w:hyperlink r:id="rId161">
+      <w:hyperlink r:id="rId163">
         <w:r>
           <w:rPr>
             <w:rStyle w:val="Hyperlink"/>
@@ -16502,8 +16721,8 @@
         <w:t xml:space="preserve">.</w:t>
       </w:r>
     </w:p>
-    <w:bookmarkEnd w:id="162"/>
-    <w:bookmarkStart w:id="164" w:name="ref-artemisia2025phylogenomics"/>
+    <w:bookmarkEnd w:id="164"/>
+    <w:bookmarkStart w:id="166" w:name="ref-artemisia2025phylogenomics"/>
     <w:p>
       <w:pPr>
         <w:pStyle w:val="Bibliography"/>
@@ -16537,7 +16756,7 @@
       <w:r>
         <w:t xml:space="preserve"> </w:t>
       </w:r>
-      <w:hyperlink r:id="rId163">
+      <w:hyperlink r:id="rId165">
         <w:r>
           <w:rPr>
             <w:rStyle w:val="Hyperlink"/>
@@ -16549,8 +16768,8 @@
         <w:t xml:space="preserve">.</w:t>
       </w:r>
     </w:p>
-    <w:bookmarkEnd w:id="164"/>
-    <w:bookmarkStart w:id="166" w:name="ref-jiao2018eimeria"/>
+    <w:bookmarkEnd w:id="166"/>
+    <w:bookmarkStart w:id="168" w:name="ref-jiao2018eimeria"/>
     <w:p>
       <w:pPr>
         <w:pStyle w:val="Bibliography"/>
@@ -16608,7 +16827,7 @@
       <w:r>
         <w:t xml:space="preserve"> </w:t>
       </w:r>
-      <w:hyperlink r:id="rId165">
+      <w:hyperlink r:id="rId167">
         <w:r>
           <w:rPr>
             <w:rStyle w:val="Hyperlink"/>
@@ -16620,8 +16839,8 @@
         <w:t xml:space="preserve">.</w:t>
       </w:r>
     </w:p>
-    <w:bookmarkEnd w:id="166"/>
-    <w:bookmarkStart w:id="168" w:name="ref-judzentiene2016vulgaris"/>
+    <w:bookmarkEnd w:id="168"/>
+    <w:bookmarkStart w:id="170" w:name="ref-judzentiene2016vulgaris"/>
     <w:p>
       <w:pPr>
         <w:pStyle w:val="Bibliography"/>
@@ -16636,7 +16855,7 @@
       <w:r>
         <w:t xml:space="preserve">“</w:t>
       </w:r>
-      <w:hyperlink r:id="rId167">
+      <w:hyperlink r:id="rId169">
         <w:r>
           <w:rPr>
             <w:rStyle w:val="Hyperlink"/>
@@ -16676,8 +16895,8 @@
         <w:t xml:space="preserve">11 (9): 1353–56.</w:t>
       </w:r>
     </w:p>
-    <w:bookmarkEnd w:id="168"/>
-    <w:bookmarkStart w:id="170" w:name="ref-kane2022cyp450"/>
+    <w:bookmarkEnd w:id="170"/>
+    <w:bookmarkStart w:id="172" w:name="ref-kane2022cyp450"/>
     <w:p>
       <w:pPr>
         <w:pStyle w:val="Bibliography"/>
@@ -16732,7 +16951,7 @@
       <w:r>
         <w:t xml:space="preserve"> </w:t>
       </w:r>
-      <w:hyperlink r:id="rId169">
+      <w:hyperlink r:id="rId171">
         <w:r>
           <w:rPr>
             <w:rStyle w:val="Hyperlink"/>
@@ -16744,8 +16963,8 @@
         <w:t xml:space="preserve">.</w:t>
       </w:r>
     </w:p>
-    <w:bookmarkEnd w:id="170"/>
-    <w:bookmarkStart w:id="172" w:name="ref-khan2015artemisia_nematodes"/>
+    <w:bookmarkEnd w:id="172"/>
+    <w:bookmarkStart w:id="174" w:name="ref-khan2015artemisia_nematodes"/>
     <w:p>
       <w:pPr>
         <w:pStyle w:val="Bibliography"/>
@@ -16760,7 +16979,7 @@
       <w:r>
         <w:t xml:space="preserve">“</w:t>
       </w:r>
-      <w:hyperlink r:id="rId171">
+      <w:hyperlink r:id="rId173">
         <w:r>
           <w:rPr>
             <w:rStyle w:val="Hyperlink"/>
@@ -16812,8 +17031,8 @@
         <w:t xml:space="preserve">32 (2): 257–68.</w:t>
       </w:r>
     </w:p>
-    <w:bookmarkEnd w:id="172"/>
-    <w:bookmarkStart w:id="174" w:name="ref-kunnathattil2025vulgaris"/>
+    <w:bookmarkEnd w:id="174"/>
+    <w:bookmarkStart w:id="176" w:name="ref-kunnathattil2025vulgaris"/>
     <w:p>
       <w:pPr>
         <w:pStyle w:val="Bibliography"/>
@@ -16871,7 +17090,7 @@
       <w:r>
         <w:t xml:space="preserve"> </w:t>
       </w:r>
-      <w:hyperlink r:id="rId173">
+      <w:hyperlink r:id="rId175">
         <w:r>
           <w:rPr>
             <w:rStyle w:val="Hyperlink"/>
@@ -16883,8 +17102,8 @@
         <w:t xml:space="preserve">.</w:t>
       </w:r>
     </w:p>
-    <w:bookmarkEnd w:id="174"/>
-    <w:bookmarkStart w:id="176" w:name="ref-li2018naturalcombination"/>
+    <w:bookmarkEnd w:id="176"/>
+    <w:bookmarkStart w:id="178" w:name="ref-li2018naturalcombination"/>
     <w:p>
       <w:pPr>
         <w:pStyle w:val="Bibliography"/>
@@ -16930,7 +17149,7 @@
       <w:r>
         <w:t xml:space="preserve"> </w:t>
       </w:r>
-      <w:hyperlink r:id="rId175">
+      <w:hyperlink r:id="rId177">
         <w:r>
           <w:rPr>
             <w:rStyle w:val="Hyperlink"/>
@@ -16942,8 +17161,8 @@
         <w:t xml:space="preserve">.</w:t>
       </w:r>
     </w:p>
-    <w:bookmarkEnd w:id="176"/>
-    <w:bookmarkStart w:id="178" w:name="ref-li2008sphaerocephalasaponin"/>
+    <w:bookmarkEnd w:id="178"/>
+    <w:bookmarkStart w:id="180" w:name="ref-li2008sphaerocephalasaponin"/>
     <w:p>
       <w:pPr>
         <w:pStyle w:val="Bibliography"/>
@@ -16986,7 +17205,7 @@
       <w:r>
         <w:t xml:space="preserve"> </w:t>
       </w:r>
-      <w:hyperlink r:id="rId177">
+      <w:hyperlink r:id="rId179">
         <w:r>
           <w:rPr>
             <w:rStyle w:val="Hyperlink"/>
@@ -16998,8 +17217,8 @@
         <w:t xml:space="preserve">.</w:t>
       </w:r>
     </w:p>
-    <w:bookmarkEnd w:id="178"/>
-    <w:bookmarkStart w:id="180" w:name="ref-li1990sacrorumditerpene"/>
+    <w:bookmarkEnd w:id="180"/>
+    <w:bookmarkStart w:id="182" w:name="ref-li1990sacrorumditerpene"/>
     <w:p>
       <w:pPr>
         <w:pStyle w:val="Bibliography"/>
@@ -17042,7 +17261,7 @@
       <w:r>
         <w:t xml:space="preserve"> </w:t>
       </w:r>
-      <w:hyperlink r:id="rId179">
+      <w:hyperlink r:id="rId181">
         <w:r>
           <w:rPr>
             <w:rStyle w:val="Hyperlink"/>
@@ -17054,8 +17273,8 @@
         <w:t xml:space="preserve">.</w:t>
       </w:r>
     </w:p>
-    <w:bookmarkEnd w:id="180"/>
-    <w:bookmarkStart w:id="182" w:name="ref-liu2026osc"/>
+    <w:bookmarkEnd w:id="182"/>
+    <w:bookmarkStart w:id="184" w:name="ref-liu2026osc"/>
     <w:p>
       <w:pPr>
         <w:pStyle w:val="Bibliography"/>
@@ -17101,7 +17320,7 @@
       <w:r>
         <w:t xml:space="preserve"> </w:t>
       </w:r>
-      <w:hyperlink r:id="rId181">
+      <w:hyperlink r:id="rId183">
         <w:r>
           <w:rPr>
             <w:rStyle w:val="Hyperlink"/>
@@ -17113,8 +17332,8 @@
         <w:t xml:space="preserve">.</w:t>
       </w:r>
     </w:p>
-    <w:bookmarkEnd w:id="182"/>
-    <w:bookmarkStart w:id="184" w:name="ref-liu2022vulgaristerpenoids"/>
+    <w:bookmarkEnd w:id="184"/>
+    <w:bookmarkStart w:id="186" w:name="ref-liu2022vulgaristerpenoids"/>
     <w:p>
       <w:pPr>
         <w:pStyle w:val="Bibliography"/>
@@ -17160,7 +17379,7 @@
       <w:r>
         <w:t xml:space="preserve"> </w:t>
       </w:r>
-      <w:hyperlink r:id="rId183">
+      <w:hyperlink r:id="rId185">
         <w:r>
           <w:rPr>
             <w:rStyle w:val="Hyperlink"/>
@@ -17172,8 +17391,8 @@
         <w:t xml:space="preserve">.</w:t>
       </w:r>
     </w:p>
-    <w:bookmarkEnd w:id="184"/>
-    <w:bookmarkStart w:id="186" w:name="ref-lu2013aora"/>
+    <w:bookmarkEnd w:id="186"/>
+    <w:bookmarkStart w:id="188" w:name="ref-lu2013aora"/>
     <w:p>
       <w:pPr>
         <w:pStyle w:val="Bibliography"/>
@@ -17231,7 +17450,7 @@
       <w:r>
         <w:t xml:space="preserve"> </w:t>
       </w:r>
-      <w:hyperlink r:id="rId185">
+      <w:hyperlink r:id="rId187">
         <w:r>
           <w:rPr>
             <w:rStyle w:val="Hyperlink"/>
@@ -17243,8 +17462,8 @@
         <w:t xml:space="preserve">.</w:t>
       </w:r>
     </w:p>
-    <w:bookmarkEnd w:id="186"/>
-    <w:bookmarkStart w:id="188" w:name="ref-lv2016nac1"/>
+    <w:bookmarkEnd w:id="188"/>
+    <w:bookmarkStart w:id="190" w:name="ref-lv2016nac1"/>
     <w:p>
       <w:pPr>
         <w:pStyle w:val="Bibliography"/>
@@ -17305,7 +17524,7 @@
       <w:r>
         <w:t xml:space="preserve"> </w:t>
       </w:r>
-      <w:hyperlink r:id="rId187">
+      <w:hyperlink r:id="rId189">
         <w:r>
           <w:rPr>
             <w:rStyle w:val="Hyperlink"/>
@@ -17317,8 +17536,8 @@
         <w:t xml:space="preserve">.</w:t>
       </w:r>
     </w:p>
-    <w:bookmarkEnd w:id="188"/>
-    <w:bookmarkStart w:id="190" w:name="ref-ma2001caruifolia"/>
+    <w:bookmarkEnd w:id="190"/>
+    <w:bookmarkStart w:id="192" w:name="ref-ma2001caruifolia"/>
     <w:p>
       <w:pPr>
         <w:pStyle w:val="Bibliography"/>
@@ -17352,7 +17571,7 @@
       <w:r>
         <w:t xml:space="preserve"> </w:t>
       </w:r>
-      <w:hyperlink r:id="rId189">
+      <w:hyperlink r:id="rId191">
         <w:r>
           <w:rPr>
             <w:rStyle w:val="Hyperlink"/>
@@ -17364,8 +17583,8 @@
         <w:t xml:space="preserve">.</w:t>
       </w:r>
     </w:p>
-    <w:bookmarkEnd w:id="190"/>
-    <w:bookmarkStart w:id="192" w:name="ref-mamede2025metabolite"/>
+    <w:bookmarkEnd w:id="192"/>
+    <w:bookmarkStart w:id="194" w:name="ref-mamede2025metabolite"/>
     <w:p>
       <w:pPr>
         <w:pStyle w:val="Bibliography"/>
@@ -17432,7 +17651,7 @@
       <w:r>
         <w:t xml:space="preserve"> </w:t>
       </w:r>
-      <w:hyperlink r:id="rId191">
+      <w:hyperlink r:id="rId193">
         <w:r>
           <w:rPr>
             <w:rStyle w:val="Hyperlink"/>
@@ -17444,8 +17663,8 @@
         <w:t xml:space="preserve">.</w:t>
       </w:r>
     </w:p>
-    <w:bookmarkEnd w:id="192"/>
-    <w:bookmarkStart w:id="194" w:name="ref-martinezdiaz2015absinthiumtrypano"/>
+    <w:bookmarkEnd w:id="194"/>
+    <w:bookmarkStart w:id="196" w:name="ref-martinezdiaz2015absinthiumtrypano"/>
     <w:p>
       <w:pPr>
         <w:pStyle w:val="Bibliography"/>
@@ -17479,7 +17698,7 @@
       <w:r>
         <w:t xml:space="preserve"> </w:t>
       </w:r>
-      <w:hyperlink r:id="rId193">
+      <w:hyperlink r:id="rId195">
         <w:r>
           <w:rPr>
             <w:rStyle w:val="Hyperlink"/>
@@ -17491,8 +17710,8 @@
         <w:t xml:space="preserve">.</w:t>
       </w:r>
     </w:p>
-    <w:bookmarkEnd w:id="194"/>
-    <w:bookmarkStart w:id="196" w:name="ref-ming2025argyidrying"/>
+    <w:bookmarkEnd w:id="196"/>
+    <w:bookmarkStart w:id="198" w:name="ref-ming2025argyidrying"/>
     <w:p>
       <w:pPr>
         <w:pStyle w:val="Bibliography"/>
@@ -17535,7 +17754,7 @@
       <w:r>
         <w:t xml:space="preserve"> </w:t>
       </w:r>
-      <w:hyperlink r:id="rId195">
+      <w:hyperlink r:id="rId197">
         <w:r>
           <w:rPr>
             <w:rStyle w:val="Hyperlink"/>
@@ -17547,8 +17766,8 @@
         <w:t xml:space="preserve">.</w:t>
       </w:r>
     </w:p>
-    <w:bookmarkEnd w:id="196"/>
-    <w:bookmarkStart w:id="198" w:name="ref-mohammed2026monospermadrying"/>
+    <w:bookmarkEnd w:id="198"/>
+    <w:bookmarkStart w:id="200" w:name="ref-mohammed2026monospermadrying"/>
     <w:p>
       <w:pPr>
         <w:pStyle w:val="Bibliography"/>
@@ -17601,7 +17820,7 @@
       <w:r>
         <w:t xml:space="preserve"> </w:t>
       </w:r>
-      <w:hyperlink r:id="rId197">
+      <w:hyperlink r:id="rId199">
         <w:r>
           <w:rPr>
             <w:rStyle w:val="Hyperlink"/>
@@ -17613,8 +17832,8 @@
         <w:t xml:space="preserve">.</w:t>
       </w:r>
     </w:p>
-    <w:bookmarkEnd w:id="198"/>
-    <w:bookmarkStart w:id="200" w:name="ref-mojarrab2015extracts"/>
+    <w:bookmarkEnd w:id="200"/>
+    <w:bookmarkStart w:id="202" w:name="ref-mojarrab2015extracts"/>
     <w:p>
       <w:pPr>
         <w:pStyle w:val="Bibliography"/>
@@ -17660,7 +17879,7 @@
       <w:r>
         <w:t xml:space="preserve"> </w:t>
       </w:r>
-      <w:hyperlink r:id="rId199">
+      <w:hyperlink r:id="rId201">
         <w:r>
           <w:rPr>
             <w:rStyle w:val="Hyperlink"/>
@@ -17672,8 +17891,8 @@
         <w:t xml:space="preserve">.</w:t>
       </w:r>
     </w:p>
-    <w:bookmarkEnd w:id="200"/>
-    <w:bookmarkStart w:id="202" w:name="ref-mojarrab2014fractionation"/>
+    <w:bookmarkEnd w:id="202"/>
+    <w:bookmarkStart w:id="204" w:name="ref-mojarrab2014fractionation"/>
     <w:p>
       <w:pPr>
         <w:pStyle w:val="Bibliography"/>
@@ -17731,7 +17950,7 @@
       <w:r>
         <w:t xml:space="preserve"> </w:t>
       </w:r>
-      <w:hyperlink r:id="rId201">
+      <w:hyperlink r:id="rId203">
         <w:r>
           <w:rPr>
             <w:rStyle w:val="Hyperlink"/>
@@ -17743,8 +17962,8 @@
         <w:t xml:space="preserve">.</w:t>
       </w:r>
     </w:p>
-    <w:bookmarkEnd w:id="202"/>
-    <w:bookmarkStart w:id="204" w:name="ref-monzote2014absinthium"/>
+    <w:bookmarkEnd w:id="204"/>
+    <w:bookmarkStart w:id="206" w:name="ref-monzote2014absinthium"/>
     <w:p>
       <w:pPr>
         <w:pStyle w:val="Bibliography"/>
@@ -17778,7 +17997,7 @@
       <w:r>
         <w:t xml:space="preserve"> </w:t>
       </w:r>
-      <w:hyperlink r:id="rId203">
+      <w:hyperlink r:id="rId205">
         <w:r>
           <w:rPr>
             <w:rStyle w:val="Hyperlink"/>
@@ -17790,8 +18009,8 @@
         <w:t xml:space="preserve">.</w:t>
       </w:r>
     </w:p>
-    <w:bookmarkEnd w:id="204"/>
-    <w:bookmarkStart w:id="206" w:name="ref-morua2025standardizedannua"/>
+    <w:bookmarkEnd w:id="206"/>
+    <w:bookmarkStart w:id="208" w:name="ref-morua2025standardizedannua"/>
     <w:p>
       <w:pPr>
         <w:pStyle w:val="Bibliography"/>
@@ -17837,7 +18056,7 @@
       <w:r>
         <w:t xml:space="preserve"> </w:t>
       </w:r>
-      <w:hyperlink r:id="rId205">
+      <w:hyperlink r:id="rId207">
         <w:r>
           <w:rPr>
             <w:rStyle w:val="Hyperlink"/>
@@ -17849,8 +18068,8 @@
         <w:t xml:space="preserve">.</w:t>
       </w:r>
     </w:p>
-    <w:bookmarkEnd w:id="206"/>
-    <w:bookmarkStart w:id="208" w:name="ref-annua2015triterpenes"/>
+    <w:bookmarkEnd w:id="208"/>
+    <w:bookmarkStart w:id="210" w:name="ref-annua2015triterpenes"/>
     <w:p>
       <w:pPr>
         <w:pStyle w:val="Bibliography"/>
@@ -17884,7 +18103,7 @@
       <w:r>
         <w:t xml:space="preserve"> </w:t>
       </w:r>
-      <w:hyperlink r:id="rId207">
+      <w:hyperlink r:id="rId209">
         <w:r>
           <w:rPr>
             <w:rStyle w:val="Hyperlink"/>
@@ -17896,8 +18115,8 @@
         <w:t xml:space="preserve">.</w:t>
       </w:r>
     </w:p>
-    <w:bookmarkEnd w:id="208"/>
-    <w:bookmarkStart w:id="210" w:name="ref-mouton2013artemisininonly"/>
+    <w:bookmarkEnd w:id="210"/>
+    <w:bookmarkStart w:id="212" w:name="ref-mouton2013artemisininonly"/>
     <w:p>
       <w:pPr>
         <w:pStyle w:val="Bibliography"/>
@@ -17943,7 +18162,7 @@
       <w:r>
         <w:t xml:space="preserve"> </w:t>
       </w:r>
-      <w:hyperlink r:id="rId209">
+      <w:hyperlink r:id="rId211">
         <w:r>
           <w:rPr>
             <w:rStyle w:val="Hyperlink"/>
@@ -17955,8 +18174,8 @@
         <w:t xml:space="preserve">.</w:t>
       </w:r>
     </w:p>
-    <w:bookmarkEnd w:id="210"/>
-    <w:bookmarkStart w:id="212" w:name="ref-mravcakova2020wormwood"/>
+    <w:bookmarkEnd w:id="212"/>
+    <w:bookmarkStart w:id="214" w:name="ref-mravcakova2020wormwood"/>
     <w:p>
       <w:pPr>
         <w:pStyle w:val="Bibliography"/>
@@ -17990,7 +18209,7 @@
       <w:r>
         <w:t xml:space="preserve"> </w:t>
       </w:r>
-      <w:hyperlink r:id="rId211">
+      <w:hyperlink r:id="rId213">
         <w:r>
           <w:rPr>
             <w:rStyle w:val="Hyperlink"/>
@@ -18002,8 +18221,8 @@
         <w:t xml:space="preserve">.</w:t>
       </w:r>
     </w:p>
-    <w:bookmarkEnd w:id="212"/>
-    <w:bookmarkStart w:id="214" w:name="ref-nahrevanian2010khorassanica"/>
+    <w:bookmarkEnd w:id="214"/>
+    <w:bookmarkStart w:id="216" w:name="ref-nahrevanian2010khorassanica"/>
     <w:p>
       <w:pPr>
         <w:pStyle w:val="Bibliography"/>
@@ -18037,7 +18256,7 @@
       <w:r>
         <w:t xml:space="preserve"> </w:t>
       </w:r>
-      <w:hyperlink r:id="rId213">
+      <w:hyperlink r:id="rId215">
         <w:r>
           <w:rPr>
             <w:rStyle w:val="Hyperlink"/>
@@ -18049,8 +18268,8 @@
         <w:t xml:space="preserve">.</w:t>
       </w:r>
     </w:p>
-    <w:bookmarkEnd w:id="214"/>
-    <w:bookmarkStart w:id="216" w:name="ref-nahrevanian2012sieberi"/>
+    <w:bookmarkEnd w:id="216"/>
+    <w:bookmarkStart w:id="218" w:name="ref-nahrevanian2012sieberi"/>
     <w:p>
       <w:pPr>
         <w:pStyle w:val="Bibliography"/>
@@ -18084,7 +18303,7 @@
       <w:r>
         <w:t xml:space="preserve"> </w:t>
       </w:r>
-      <w:hyperlink r:id="rId215">
+      <w:hyperlink r:id="rId217">
         <w:r>
           <w:rPr>
             <w:rStyle w:val="Hyperlink"/>
@@ -18096,8 +18315,8 @@
         <w:t xml:space="preserve">.</w:t>
       </w:r>
     </w:p>
-    <w:bookmarkEnd w:id="216"/>
-    <w:bookmarkStart w:id="218" w:name="ref-nomani2022h2s"/>
+    <w:bookmarkEnd w:id="218"/>
+    <w:bookmarkStart w:id="220" w:name="ref-nomani2022h2s"/>
     <w:p>
       <w:pPr>
         <w:pStyle w:val="Bibliography"/>
@@ -18143,7 +18362,7 @@
       <w:r>
         <w:t xml:space="preserve"> </w:t>
       </w:r>
-      <w:hyperlink r:id="rId217">
+      <w:hyperlink r:id="rId219">
         <w:r>
           <w:rPr>
             <w:rStyle w:val="Hyperlink"/>
@@ -18155,8 +18374,8 @@
         <w:t xml:space="preserve">.</w:t>
       </w:r>
     </w:p>
-    <w:bookmarkEnd w:id="218"/>
-    <w:bookmarkStart w:id="220" w:name="ref-nurlaelasari2023vulgarisfasciola"/>
+    <w:bookmarkEnd w:id="220"/>
+    <w:bookmarkStart w:id="222" w:name="ref-nurlaelasari2023vulgarisfasciola"/>
     <w:p>
       <w:pPr>
         <w:pStyle w:val="Bibliography"/>
@@ -18211,7 +18430,7 @@
       <w:r>
         <w:t xml:space="preserve"> </w:t>
       </w:r>
-      <w:hyperlink r:id="rId219">
+      <w:hyperlink r:id="rId221">
         <w:r>
           <w:rPr>
             <w:rStyle w:val="Hyperlink"/>
@@ -18223,8 +18442,8 @@
         <w:t xml:space="preserve">.</w:t>
       </w:r>
     </w:p>
-    <w:bookmarkEnd w:id="220"/>
-    <w:bookmarkStart w:id="222" w:name="ref-olofsson2011tissue"/>
+    <w:bookmarkEnd w:id="222"/>
+    <w:bookmarkStart w:id="224" w:name="ref-olofsson2011tissue"/>
     <w:p>
       <w:pPr>
         <w:pStyle w:val="Bibliography"/>
@@ -18258,7 +18477,7 @@
       <w:r>
         <w:t xml:space="preserve"> </w:t>
       </w:r>
-      <w:hyperlink r:id="rId221">
+      <w:hyperlink r:id="rId223">
         <w:r>
           <w:rPr>
             <w:rStyle w:val="Hyperlink"/>
@@ -18270,8 +18489,8 @@
         <w:t xml:space="preserve">.</w:t>
       </w:r>
     </w:p>
-    <w:bookmarkEnd w:id="222"/>
-    <w:bookmarkStart w:id="224" w:name="ref-olsson2009localization"/>
+    <w:bookmarkEnd w:id="224"/>
+    <w:bookmarkStart w:id="226" w:name="ref-olsson2009localization"/>
     <w:p>
       <w:pPr>
         <w:pStyle w:val="Bibliography"/>
@@ -18305,7 +18524,7 @@
       <w:r>
         <w:t xml:space="preserve"> </w:t>
       </w:r>
-      <w:hyperlink r:id="rId223">
+      <w:hyperlink r:id="rId225">
         <w:r>
           <w:rPr>
             <w:rStyle w:val="Hyperlink"/>
@@ -18317,8 +18536,8 @@
         <w:t xml:space="preserve">.</w:t>
       </w:r>
     </w:p>
-    <w:bookmarkEnd w:id="224"/>
-    <w:bookmarkStart w:id="226" w:name="ref-ongo2019campestriscomment"/>
+    <w:bookmarkEnd w:id="226"/>
+    <w:bookmarkStart w:id="228" w:name="ref-ongo2019campestriscomment"/>
     <w:p>
       <w:pPr>
         <w:pStyle w:val="Bibliography"/>
@@ -18373,7 +18592,7 @@
       <w:r>
         <w:t xml:space="preserve"> </w:t>
       </w:r>
-      <w:hyperlink r:id="rId225">
+      <w:hyperlink r:id="rId227">
         <w:r>
           <w:rPr>
             <w:rStyle w:val="Hyperlink"/>
@@ -18385,8 +18604,8 @@
         <w:t xml:space="preserve">.</w:t>
       </w:r>
     </w:p>
-    <w:bookmarkEnd w:id="226"/>
-    <w:bookmarkStart w:id="228" w:name="ref-ortet2008gorgonum"/>
+    <w:bookmarkEnd w:id="228"/>
+    <w:bookmarkStart w:id="230" w:name="ref-ortet2008gorgonum"/>
     <w:p>
       <w:pPr>
         <w:pStyle w:val="Bibliography"/>
@@ -18420,7 +18639,7 @@
       <w:r>
         <w:t xml:space="preserve"> </w:t>
       </w:r>
-      <w:hyperlink r:id="rId227">
+      <w:hyperlink r:id="rId229">
         <w:r>
           <w:rPr>
             <w:rStyle w:val="Hyperlink"/>
@@ -18432,8 +18651,8 @@
         <w:t xml:space="preserve">.</w:t>
       </w:r>
     </w:p>
-    <w:bookmarkEnd w:id="228"/>
-    <w:bookmarkStart w:id="230" w:name="ref-osanloo2022dracunculusnanogel"/>
+    <w:bookmarkEnd w:id="230"/>
+    <w:bookmarkStart w:id="232" w:name="ref-osanloo2022dracunculusnanogel"/>
     <w:p>
       <w:pPr>
         <w:pStyle w:val="Bibliography"/>
@@ -18479,7 +18698,7 @@
       <w:r>
         <w:t xml:space="preserve"> </w:t>
       </w:r>
-      <w:hyperlink r:id="rId229">
+      <w:hyperlink r:id="rId231">
         <w:r>
           <w:rPr>
             <w:rStyle w:val="Hyperlink"/>
@@ -18491,8 +18710,8 @@
         <w:t xml:space="preserve">.</w:t>
       </w:r>
     </w:p>
-    <w:bookmarkEnd w:id="230"/>
-    <w:bookmarkStart w:id="232" w:name="ref-oyedeji2009afra"/>
+    <w:bookmarkEnd w:id="232"/>
+    <w:bookmarkStart w:id="234" w:name="ref-oyedeji2009afra"/>
     <w:p>
       <w:pPr>
         <w:pStyle w:val="Bibliography"/>
@@ -18526,7 +18745,7 @@
       <w:r>
         <w:t xml:space="preserve"> </w:t>
       </w:r>
-      <w:hyperlink r:id="rId231">
+      <w:hyperlink r:id="rId233">
         <w:r>
           <w:rPr>
             <w:rStyle w:val="Hyperlink"/>
@@ -18538,8 +18757,8 @@
         <w:t xml:space="preserve">.</w:t>
       </w:r>
     </w:p>
-    <w:bookmarkEnd w:id="232"/>
-    <w:bookmarkStart w:id="234" w:name="ref-pandey2017artemisiaoils"/>
+    <w:bookmarkEnd w:id="234"/>
+    <w:bookmarkStart w:id="236" w:name="ref-pandey2017artemisiaoils"/>
     <w:p>
       <w:pPr>
         <w:pStyle w:val="Bibliography"/>
@@ -18573,7 +18792,7 @@
       <w:r>
         <w:t xml:space="preserve"> </w:t>
       </w:r>
-      <w:hyperlink r:id="rId233">
+      <w:hyperlink r:id="rId235">
         <w:r>
           <w:rPr>
             <w:rStyle w:val="Hyperlink"/>
@@ -18585,8 +18804,8 @@
         <w:t xml:space="preserve">.</w:t>
       </w:r>
     </w:p>
-    <w:bookmarkEnd w:id="234"/>
-    <w:bookmarkStart w:id="236" w:name="ref-parveen2024scoparia"/>
+    <w:bookmarkEnd w:id="236"/>
+    <w:bookmarkStart w:id="238" w:name="ref-parveen2024scoparia"/>
     <w:p>
       <w:pPr>
         <w:pStyle w:val="Bibliography"/>
@@ -18632,7 +18851,7 @@
       <w:r>
         <w:t xml:space="preserve"> </w:t>
       </w:r>
-      <w:hyperlink r:id="rId235">
+      <w:hyperlink r:id="rId237">
         <w:r>
           <w:rPr>
             <w:rStyle w:val="Hyperlink"/>
@@ -18644,8 +18863,8 @@
         <w:t xml:space="preserve">.</w:t>
       </w:r>
     </w:p>
-    <w:bookmarkEnd w:id="236"/>
-    <w:bookmarkStart w:id="238" w:name="ref-paul2010recurrent"/>
+    <w:bookmarkEnd w:id="238"/>
+    <w:bookmarkStart w:id="240" w:name="ref-paul2010recurrent"/>
     <w:p>
       <w:pPr>
         <w:pStyle w:val="Bibliography"/>
@@ -18691,7 +18910,7 @@
       <w:r>
         <w:t xml:space="preserve"> </w:t>
       </w:r>
-      <w:hyperlink r:id="rId237">
+      <w:hyperlink r:id="rId239">
         <w:r>
           <w:rPr>
             <w:rStyle w:val="Hyperlink"/>
@@ -18703,8 +18922,8 @@
         <w:t xml:space="preserve">.</w:t>
       </w:r>
     </w:p>
-    <w:bookmarkEnd w:id="238"/>
-    <w:bookmarkStart w:id="240" w:name="ref-pirali2011tick"/>
+    <w:bookmarkEnd w:id="240"/>
+    <w:bookmarkStart w:id="242" w:name="ref-pirali2011tick"/>
     <w:p>
       <w:pPr>
         <w:pStyle w:val="Bibliography"/>
@@ -18762,7 +18981,7 @@
       <w:r>
         <w:t xml:space="preserve"> </w:t>
       </w:r>
-      <w:hyperlink r:id="rId239">
+      <w:hyperlink r:id="rId241">
         <w:r>
           <w:rPr>
             <w:rStyle w:val="Hyperlink"/>
@@ -18774,8 +18993,8 @@
         <w:t xml:space="preserve">.</w:t>
       </w:r>
     </w:p>
-    <w:bookmarkEnd w:id="240"/>
-    <w:bookmarkStart w:id="242" w:name="ref-radulovic2013toxic"/>
+    <w:bookmarkEnd w:id="242"/>
+    <w:bookmarkStart w:id="244" w:name="ref-radulovic2013toxic"/>
     <w:p>
       <w:pPr>
         <w:pStyle w:val="Bibliography"/>
@@ -18809,7 +19028,7 @@
       <w:r>
         <w:t xml:space="preserve"> </w:t>
       </w:r>
-      <w:hyperlink r:id="rId241">
+      <w:hyperlink r:id="rId243">
         <w:r>
           <w:rPr>
             <w:rStyle w:val="Hyperlink"/>
@@ -18821,8 +19040,8 @@
         <w:t xml:space="preserve">.</w:t>
       </w:r>
     </w:p>
-    <w:bookmarkEnd w:id="242"/>
-    <w:bookmarkStart w:id="244" w:name="ref-ram1997density"/>
+    <w:bookmarkEnd w:id="244"/>
+    <w:bookmarkStart w:id="246" w:name="ref-ram1997density"/>
     <w:p>
       <w:pPr>
         <w:pStyle w:val="Bibliography"/>
@@ -18868,7 +19087,7 @@
       <w:r>
         <w:t xml:space="preserve"> </w:t>
       </w:r>
-      <w:hyperlink r:id="rId243">
+      <w:hyperlink r:id="rId245">
         <w:r>
           <w:rPr>
             <w:rStyle w:val="Hyperlink"/>
@@ -18880,8 +19099,8 @@
         <w:t xml:space="preserve">.</w:t>
       </w:r>
     </w:p>
-    <w:bookmarkEnd w:id="244"/>
-    <w:bookmarkStart w:id="246" w:name="ref-ribbiso2021heme"/>
+    <w:bookmarkEnd w:id="246"/>
+    <w:bookmarkStart w:id="248" w:name="ref-ribbiso2021heme"/>
     <w:p>
       <w:pPr>
         <w:pStyle w:val="Bibliography"/>
@@ -18927,7 +19146,7 @@
       <w:r>
         <w:t xml:space="preserve"> </w:t>
       </w:r>
-      <w:hyperlink r:id="rId245">
+      <w:hyperlink r:id="rId247">
         <w:r>
           <w:rPr>
             <w:rStyle w:val="Hyperlink"/>
@@ -18939,8 +19158,8 @@
         <w:t xml:space="preserve">.</w:t>
       </w:r>
     </w:p>
-    <w:bookmarkEnd w:id="246"/>
-    <w:bookmarkStart w:id="248" w:name="ref-rosenthal2024proteostasis"/>
+    <w:bookmarkEnd w:id="248"/>
+    <w:bookmarkStart w:id="250" w:name="ref-rosenthal2024proteostasis"/>
     <w:p>
       <w:pPr>
         <w:pStyle w:val="Bibliography"/>
@@ -18983,7 +19202,7 @@
       <w:r>
         <w:t xml:space="preserve"> </w:t>
       </w:r>
-      <w:hyperlink r:id="rId247">
+      <w:hyperlink r:id="rId249">
         <w:r>
           <w:rPr>
             <w:rStyle w:val="Hyperlink"/>
@@ -18995,8 +19214,8 @@
         <w:t xml:space="preserve">.</w:t>
       </w:r>
     </w:p>
-    <w:bookmarkEnd w:id="248"/>
-    <w:bookmarkStart w:id="250" w:name="ref-rostkowska2016silicon"/>
+    <w:bookmarkEnd w:id="250"/>
+    <w:bookmarkStart w:id="252" w:name="ref-rostkowska2016silicon"/>
     <w:p>
       <w:pPr>
         <w:pStyle w:val="Bibliography"/>
@@ -19054,7 +19273,7 @@
       <w:r>
         <w:t xml:space="preserve"> </w:t>
       </w:r>
-      <w:hyperlink r:id="rId249">
+      <w:hyperlink r:id="rId251">
         <w:r>
           <w:rPr>
             <w:rStyle w:val="Hyperlink"/>
@@ -19066,8 +19285,8 @@
         <w:t xml:space="preserve">.</w:t>
       </w:r>
     </w:p>
-    <w:bookmarkEnd w:id="250"/>
-    <w:bookmarkStart w:id="252" w:name="ref-annua2016monoterpenes"/>
+    <w:bookmarkEnd w:id="252"/>
+    <w:bookmarkStart w:id="254" w:name="ref-annua2016monoterpenes"/>
     <w:p>
       <w:pPr>
         <w:pStyle w:val="Bibliography"/>
@@ -19101,7 +19320,7 @@
       <w:r>
         <w:t xml:space="preserve"> </w:t>
       </w:r>
-      <w:hyperlink r:id="rId251">
+      <w:hyperlink r:id="rId253">
         <w:r>
           <w:rPr>
             <w:rStyle w:val="Hyperlink"/>
@@ -19113,8 +19332,8 @@
         <w:t xml:space="preserve">.</w:t>
       </w:r>
     </w:p>
-    <w:bookmarkEnd w:id="252"/>
-    <w:bookmarkStart w:id="254" w:name="ref-said2016vcd"/>
+    <w:bookmarkEnd w:id="254"/>
+    <w:bookmarkStart w:id="256" w:name="ref-said2016vcd"/>
     <w:p>
       <w:pPr>
         <w:pStyle w:val="Bibliography"/>
@@ -19160,7 +19379,7 @@
       <w:r>
         <w:t xml:space="preserve"> </w:t>
       </w:r>
-      <w:hyperlink r:id="rId253">
+      <w:hyperlink r:id="rId255">
         <w:r>
           <w:rPr>
             <w:rStyle w:val="Hyperlink"/>
@@ -19172,8 +19391,8 @@
         <w:t xml:space="preserve">.</w:t>
       </w:r>
     </w:p>
-    <w:bookmarkEnd w:id="254"/>
-    <w:bookmarkStart w:id="256" w:name="ref-sanei2023nanoliposomes"/>
+    <w:bookmarkEnd w:id="256"/>
+    <w:bookmarkStart w:id="258" w:name="ref-sanei2023nanoliposomes"/>
     <w:p>
       <w:pPr>
         <w:pStyle w:val="Bibliography"/>
@@ -19240,7 +19459,7 @@
       <w:r>
         <w:t xml:space="preserve"> </w:t>
       </w:r>
-      <w:hyperlink r:id="rId255">
+      <w:hyperlink r:id="rId257">
         <w:r>
           <w:rPr>
             <w:rStyle w:val="Hyperlink"/>
@@ -19252,8 +19471,8 @@
         <w:t xml:space="preserve">.</w:t>
       </w:r>
     </w:p>
-    <w:bookmarkEnd w:id="256"/>
-    <w:bookmarkStart w:id="258" w:name="ref-schramek2010isotope"/>
+    <w:bookmarkEnd w:id="258"/>
+    <w:bookmarkStart w:id="260" w:name="ref-schramek2010isotope"/>
     <w:p>
       <w:pPr>
         <w:pStyle w:val="Bibliography"/>
@@ -19287,7 +19506,7 @@
       <w:r>
         <w:t xml:space="preserve"> </w:t>
       </w:r>
-      <w:hyperlink r:id="rId257">
+      <w:hyperlink r:id="rId259">
         <w:r>
           <w:rPr>
             <w:rStyle w:val="Hyperlink"/>
@@ -19299,8 +19518,8 @@
         <w:t xml:space="preserve">.</w:t>
       </w:r>
     </w:p>
-    <w:bookmarkEnd w:id="258"/>
-    <w:bookmarkStart w:id="260" w:name="ref-seddiek2011herbaalba"/>
+    <w:bookmarkEnd w:id="260"/>
+    <w:bookmarkStart w:id="262" w:name="ref-seddiek2011herbaalba"/>
     <w:p>
       <w:pPr>
         <w:pStyle w:val="Bibliography"/>
@@ -19358,7 +19577,7 @@
       <w:r>
         <w:t xml:space="preserve"> </w:t>
       </w:r>
-      <w:hyperlink r:id="rId259">
+      <w:hyperlink r:id="rId261">
         <w:r>
           <w:rPr>
             <w:rStyle w:val="Hyperlink"/>
@@ -19370,8 +19589,8 @@
         <w:t xml:space="preserve">.</w:t>
       </w:r>
     </w:p>
-    <w:bookmarkEnd w:id="260"/>
-    <w:bookmarkStart w:id="262" w:name="ref-shen2012cypcpr"/>
+    <w:bookmarkEnd w:id="262"/>
+    <w:bookmarkStart w:id="264" w:name="ref-shen2012cypcpr"/>
     <w:p>
       <w:pPr>
         <w:pStyle w:val="Bibliography"/>
@@ -19429,7 +19648,7 @@
       <w:r>
         <w:t xml:space="preserve"> </w:t>
       </w:r>
-      <w:hyperlink r:id="rId261">
+      <w:hyperlink r:id="rId263">
         <w:r>
           <w:rPr>
             <w:rStyle w:val="Hyperlink"/>
@@ -19441,8 +19660,8 @@
         <w:t xml:space="preserve">.</w:t>
       </w:r>
     </w:p>
-    <w:bookmarkEnd w:id="262"/>
-    <w:bookmarkStart w:id="264" w:name="ref-shi2022annuaantimalarialmetabolomics"/>
+    <w:bookmarkEnd w:id="264"/>
+    <w:bookmarkStart w:id="266" w:name="ref-shi2022annuaantimalarialmetabolomics"/>
     <w:p>
       <w:pPr>
         <w:pStyle w:val="Bibliography"/>
@@ -19488,7 +19707,7 @@
       <w:r>
         <w:t xml:space="preserve"> </w:t>
       </w:r>
-      <w:hyperlink r:id="rId263">
+      <w:hyperlink r:id="rId265">
         <w:r>
           <w:rPr>
             <w:rStyle w:val="Hyperlink"/>
@@ -19500,8 +19719,8 @@
         <w:t xml:space="preserve">.</w:t>
       </w:r>
     </w:p>
-    <w:bookmarkEnd w:id="264"/>
-    <w:bookmarkStart w:id="266" w:name="ref-shi2018mixta1"/>
+    <w:bookmarkEnd w:id="266"/>
+    <w:bookmarkStart w:id="268" w:name="ref-shi2018mixta1"/>
     <w:p>
       <w:pPr>
         <w:pStyle w:val="Bibliography"/>
@@ -19556,7 +19775,7 @@
       <w:r>
         <w:t xml:space="preserve"> </w:t>
       </w:r>
-      <w:hyperlink r:id="rId265">
+      <w:hyperlink r:id="rId267">
         <w:r>
           <w:rPr>
             <w:rStyle w:val="Hyperlink"/>
@@ -19568,8 +19787,8 @@
         <w:t xml:space="preserve">.</w:t>
       </w:r>
     </w:p>
-    <w:bookmarkEnd w:id="266"/>
-    <w:bookmarkStart w:id="268" w:name="ref-dasilva2017annuasheep"/>
+    <w:bookmarkEnd w:id="268"/>
+    <w:bookmarkStart w:id="270" w:name="ref-dasilva2017annuasheep"/>
     <w:p>
       <w:pPr>
         <w:pStyle w:val="Bibliography"/>
@@ -19615,7 +19834,7 @@
       <w:r>
         <w:t xml:space="preserve"> </w:t>
       </w:r>
-      <w:hyperlink r:id="rId267">
+      <w:hyperlink r:id="rId269">
         <w:r>
           <w:rPr>
             <w:rStyle w:val="Hyperlink"/>
@@ -19627,8 +19846,8 @@
         <w:t xml:space="preserve">.</w:t>
       </w:r>
     </w:p>
-    <w:bookmarkEnd w:id="268"/>
-    <w:bookmarkStart w:id="270" w:name="ref-snider2021gametocytes"/>
+    <w:bookmarkEnd w:id="270"/>
+    <w:bookmarkStart w:id="272" w:name="ref-snider2021gametocytes"/>
     <w:p>
       <w:pPr>
         <w:pStyle w:val="Bibliography"/>
@@ -19686,7 +19905,7 @@
       <w:r>
         <w:t xml:space="preserve"> </w:t>
       </w:r>
-      <w:hyperlink r:id="rId269">
+      <w:hyperlink r:id="rId271">
         <w:r>
           <w:rPr>
             <w:rStyle w:val="Hyperlink"/>
@@ -19698,8 +19917,8 @@
         <w:t xml:space="preserve">.</w:t>
       </w:r>
     </w:p>
-    <w:bookmarkEnd w:id="270"/>
-    <w:bookmarkStart w:id="272" w:name="ref-soleimanifard2023kermanensis"/>
+    <w:bookmarkEnd w:id="272"/>
+    <w:bookmarkStart w:id="274" w:name="ref-soleimanifard2023kermanensis"/>
     <w:p>
       <w:pPr>
         <w:pStyle w:val="Bibliography"/>
@@ -19745,7 +19964,7 @@
       <w:r>
         <w:t xml:space="preserve"> </w:t>
       </w:r>
-      <w:hyperlink r:id="rId271">
+      <w:hyperlink r:id="rId273">
         <w:r>
           <w:rPr>
             <w:rStyle w:val="Hyperlink"/>
@@ -19757,8 +19976,8 @@
         <w:t xml:space="preserve">.</w:t>
       </w:r>
     </w:p>
-    <w:bookmarkEnd w:id="272"/>
-    <w:bookmarkStart w:id="274" w:name="ref-squires2011haemonchus"/>
+    <w:bookmarkEnd w:id="274"/>
+    <w:bookmarkStart w:id="276" w:name="ref-squires2011haemonchus"/>
     <w:p>
       <w:pPr>
         <w:pStyle w:val="Bibliography"/>
@@ -19792,7 +20011,7 @@
       <w:r>
         <w:t xml:space="preserve"> </w:t>
       </w:r>
-      <w:hyperlink r:id="rId273">
+      <w:hyperlink r:id="rId275">
         <w:r>
           <w:rPr>
             <w:rStyle w:val="Hyperlink"/>
@@ -19804,8 +20023,8 @@
         <w:t xml:space="preserve">.</w:t>
       </w:r>
     </w:p>
-    <w:bookmarkEnd w:id="274"/>
-    <w:bookmarkStart w:id="276" w:name="ref-tabari2017sieberi"/>
+    <w:bookmarkEnd w:id="276"/>
+    <w:bookmarkStart w:id="278" w:name="ref-tabari2017sieberi"/>
     <w:p>
       <w:pPr>
         <w:pStyle w:val="Bibliography"/>
@@ -19839,7 +20058,7 @@
       <w:r>
         <w:t xml:space="preserve"> </w:t>
       </w:r>
-      <w:hyperlink r:id="rId275">
+      <w:hyperlink r:id="rId277">
         <w:r>
           <w:rPr>
             <w:rStyle w:val="Hyperlink"/>
@@ -19851,8 +20070,8 @@
         <w:t xml:space="preserve">.</w:t>
       </w:r>
     </w:p>
-    <w:bookmarkEnd w:id="276"/>
-    <w:bookmarkStart w:id="278" w:name="ref-tamargo2017nanocochleate"/>
+    <w:bookmarkEnd w:id="278"/>
+    <w:bookmarkStart w:id="280" w:name="ref-tamargo2017nanocochleate"/>
     <w:p>
       <w:pPr>
         <w:pStyle w:val="Bibliography"/>
@@ -19886,7 +20105,7 @@
       <w:r>
         <w:t xml:space="preserve"> </w:t>
       </w:r>
-      <w:hyperlink r:id="rId277">
+      <w:hyperlink r:id="rId279">
         <w:r>
           <w:rPr>
             <w:rStyle w:val="Hyperlink"/>
@@ -19898,8 +20117,8 @@
         <w:t xml:space="preserve">.</w:t>
       </w:r>
     </w:p>
-    <w:bookmarkEnd w:id="278"/>
-    <w:bookmarkStart w:id="280" w:name="ref-tangnitipong2012heme"/>
+    <w:bookmarkEnd w:id="280"/>
+    <w:bookmarkStart w:id="282" w:name="ref-tangnitipong2012heme"/>
     <w:p>
       <w:pPr>
         <w:pStyle w:val="Bibliography"/>
@@ -19933,7 +20152,7 @@
       <w:r>
         <w:t xml:space="preserve"> </w:t>
       </w:r>
-      <w:hyperlink r:id="rId279">
+      <w:hyperlink r:id="rId281">
         <w:r>
           <w:rPr>
             <w:rStyle w:val="Hyperlink"/>
@@ -19945,8 +20164,8 @@
         <w:t xml:space="preserve">.</w:t>
       </w:r>
     </w:p>
-    <w:bookmarkEnd w:id="280"/>
-    <w:bookmarkStart w:id="282" w:name="ref-tariku2011absinthium"/>
+    <w:bookmarkEnd w:id="282"/>
+    <w:bookmarkStart w:id="284" w:name="ref-tariku2011absinthium"/>
     <w:p>
       <w:pPr>
         <w:pStyle w:val="Bibliography"/>
@@ -19980,7 +20199,7 @@
       <w:r>
         <w:t xml:space="preserve"> </w:t>
       </w:r>
-      <w:hyperlink r:id="rId281">
+      <w:hyperlink r:id="rId283">
         <w:r>
           <w:rPr>
             <w:rStyle w:val="Hyperlink"/>
@@ -19992,8 +20211,8 @@
         <w:t xml:space="preserve">.</w:t>
       </w:r>
     </w:p>
-    <w:bookmarkEnd w:id="282"/>
-    <w:bookmarkStart w:id="284" w:name="ref-tariq2009absinthium"/>
+    <w:bookmarkEnd w:id="284"/>
+    <w:bookmarkStart w:id="286" w:name="ref-tariq2009absinthium"/>
     <w:p>
       <w:pPr>
         <w:pStyle w:val="Bibliography"/>
@@ -20027,7 +20246,7 @@
       <w:r>
         <w:t xml:space="preserve"> </w:t>
       </w:r>
-      <w:hyperlink r:id="rId283">
+      <w:hyperlink r:id="rId285">
         <w:r>
           <w:rPr>
             <w:rStyle w:val="Hyperlink"/>
@@ -20039,8 +20258,8 @@
         <w:t xml:space="preserve">.</w:t>
       </w:r>
     </w:p>
-    <w:bookmarkEnd w:id="284"/>
-    <w:bookmarkStart w:id="286" w:name="ref-tasdemir2015antiprotozoal"/>
+    <w:bookmarkEnd w:id="286"/>
+    <w:bookmarkStart w:id="288" w:name="ref-tasdemir2015antiprotozoal"/>
     <w:p>
       <w:pPr>
         <w:pStyle w:val="Bibliography"/>
@@ -20074,7 +20293,7 @@
       <w:r>
         <w:t xml:space="preserve"> </w:t>
       </w:r>
-      <w:hyperlink r:id="rId285">
+      <w:hyperlink r:id="rId287">
         <w:r>
           <w:rPr>
             <w:rStyle w:val="Hyperlink"/>
@@ -20086,8 +20305,8 @@
         <w:t xml:space="preserve">.</w:t>
       </w:r>
     </w:p>
-    <w:bookmarkEnd w:id="286"/>
-    <w:bookmarkStart w:id="288" w:name="ref-teoh2006cyp"/>
+    <w:bookmarkEnd w:id="288"/>
+    <w:bookmarkStart w:id="290" w:name="ref-teoh2006cyp"/>
     <w:p>
       <w:pPr>
         <w:pStyle w:val="Bibliography"/>
@@ -20121,7 +20340,7 @@
       <w:r>
         <w:t xml:space="preserve"> </w:t>
       </w:r>
-      <w:hyperlink r:id="rId287">
+      <w:hyperlink r:id="rId289">
         <w:r>
           <w:rPr>
             <w:rStyle w:val="Hyperlink"/>
@@ -20133,8 +20352,8 @@
         <w:t xml:space="preserve">.</w:t>
       </w:r>
     </w:p>
-    <w:bookmarkEnd w:id="288"/>
-    <w:bookmarkStart w:id="290" w:name="ref-thofner2012histomonas"/>
+    <w:bookmarkEnd w:id="290"/>
+    <w:bookmarkStart w:id="292" w:name="ref-thofner2012histomonas"/>
     <w:p>
       <w:pPr>
         <w:pStyle w:val="Bibliography"/>
@@ -20180,7 +20399,7 @@
       <w:r>
         <w:t xml:space="preserve"> </w:t>
       </w:r>
-      <w:hyperlink r:id="rId289">
+      <w:hyperlink r:id="rId291">
         <w:r>
           <w:rPr>
             <w:rStyle w:val="Hyperlink"/>
@@ -20192,8 +20411,8 @@
         <w:t xml:space="preserve">.</w:t>
       </w:r>
     </w:p>
-    <w:bookmarkEnd w:id="290"/>
-    <w:bookmarkStart w:id="292" w:name="ref-trendafilova2021edibleartemisia"/>
+    <w:bookmarkEnd w:id="292"/>
+    <w:bookmarkStart w:id="294" w:name="ref-trendafilova2021edibleartemisia"/>
     <w:p>
       <w:pPr>
         <w:pStyle w:val="Bibliography"/>
@@ -20227,7 +20446,7 @@
       <w:r>
         <w:t xml:space="preserve"> </w:t>
       </w:r>
-      <w:hyperlink r:id="rId291">
+      <w:hyperlink r:id="rId293">
         <w:r>
           <w:rPr>
             <w:rStyle w:val="Hyperlink"/>
@@ -20239,8 +20458,8 @@
         <w:t xml:space="preserve">.</w:t>
       </w:r>
     </w:p>
-    <w:bookmarkEnd w:id="292"/>
-    <w:bookmarkStart w:id="294" w:name="ref-umaraliev2025persicabisabolanes"/>
+    <w:bookmarkEnd w:id="294"/>
+    <w:bookmarkStart w:id="296" w:name="ref-umaraliev2025persicabisabolanes"/>
     <w:p>
       <w:pPr>
         <w:pStyle w:val="Bibliography"/>
@@ -20280,7 +20499,7 @@
       <w:r>
         <w:t xml:space="preserve"> </w:t>
       </w:r>
-      <w:hyperlink r:id="rId293">
+      <w:hyperlink r:id="rId295">
         <w:r>
           <w:rPr>
             <w:rStyle w:val="Hyperlink"/>
@@ -20292,8 +20511,8 @@
         <w:t xml:space="preserve">.</w:t>
       </w:r>
     </w:p>
-    <w:bookmarkEnd w:id="294"/>
-    <w:bookmarkStart w:id="296" w:name="ref-umaraliev2026persicamonoterpenes"/>
+    <w:bookmarkEnd w:id="296"/>
+    <w:bookmarkStart w:id="298" w:name="ref-umaraliev2026persicamonoterpenes"/>
     <w:p>
       <w:pPr>
         <w:pStyle w:val="Bibliography"/>
@@ -20333,7 +20552,7 @@
       <w:r>
         <w:t xml:space="preserve"> </w:t>
       </w:r>
-      <w:hyperlink r:id="rId295">
+      <w:hyperlink r:id="rId297">
         <w:r>
           <w:rPr>
             <w:rStyle w:val="Hyperlink"/>
@@ -20345,8 +20564,8 @@
         <w:t xml:space="preserve">.</w:t>
       </w:r>
     </w:p>
-    <w:bookmarkEnd w:id="296"/>
-    <w:bookmarkStart w:id="298" w:name="ref-urban2020trpc3"/>
+    <w:bookmarkEnd w:id="298"/>
+    <w:bookmarkStart w:id="300" w:name="ref-urban2020trpc3"/>
     <w:p>
       <w:pPr>
         <w:pStyle w:val="Bibliography"/>
@@ -20392,7 +20611,7 @@
       <w:r>
         <w:t xml:space="preserve"> </w:t>
       </w:r>
-      <w:hyperlink r:id="rId297">
+      <w:hyperlink r:id="rId299">
         <w:r>
           <w:rPr>
             <w:rStyle w:val="Hyperlink"/>
@@ -20404,8 +20623,8 @@
         <w:t xml:space="preserve">.</w:t>
       </w:r>
     </w:p>
-    <w:bookmarkEnd w:id="298"/>
-    <w:bookmarkStart w:id="300" w:name="ref-varadyova2018medicinalplants"/>
+    <w:bookmarkEnd w:id="300"/>
+    <w:bookmarkStart w:id="302" w:name="ref-varadyova2018medicinalplants"/>
     <w:p>
       <w:pPr>
         <w:pStyle w:val="Bibliography"/>
@@ -20448,7 +20667,7 @@
       <w:r>
         <w:t xml:space="preserve"> </w:t>
       </w:r>
-      <w:hyperlink r:id="rId299">
+      <w:hyperlink r:id="rId301">
         <w:r>
           <w:rPr>
             <w:rStyle w:val="Hyperlink"/>
@@ -20460,8 +20679,8 @@
         <w:t xml:space="preserve">.</w:t>
       </w:r>
     </w:p>
-    <w:bookmarkEnd w:id="300"/>
-    <w:bookmarkStart w:id="302" w:name="ref-walz2024aframalaria"/>
+    <w:bookmarkEnd w:id="302"/>
+    <w:bookmarkStart w:id="304" w:name="ref-walz2024aframalaria"/>
     <w:p>
       <w:pPr>
         <w:pStyle w:val="Bibliography"/>
@@ -20507,7 +20726,7 @@
       <w:r>
         <w:t xml:space="preserve"> </w:t>
       </w:r>
-      <w:hyperlink r:id="rId301">
+      <w:hyperlink r:id="rId303">
         <w:r>
           <w:rPr>
             <w:rStyle w:val="Hyperlink"/>
@@ -20519,8 +20738,8 @@
         <w:t xml:space="preserve">.</w:t>
       </w:r>
     </w:p>
-    <w:bookmarkEnd w:id="302"/>
-    <w:bookmarkStart w:id="304" w:name="ref-wang2013cyp71av1promoter"/>
+    <w:bookmarkEnd w:id="304"/>
+    <w:bookmarkStart w:id="306" w:name="ref-wang2013cyp71av1promoter"/>
     <w:p>
       <w:pPr>
         <w:pStyle w:val="Bibliography"/>
@@ -20554,7 +20773,7 @@
       <w:r>
         <w:t xml:space="preserve"> </w:t>
       </w:r>
-      <w:hyperlink r:id="rId303">
+      <w:hyperlink r:id="rId305">
         <w:r>
           <w:rPr>
             <w:rStyle w:val="Hyperlink"/>
@@ -20566,8 +20785,8 @@
         <w:t xml:space="preserve">.</w:t>
       </w:r>
     </w:p>
-    <w:bookmarkEnd w:id="304"/>
-    <w:bookmarkStart w:id="306" w:name="ref-wang2009trichometranscriptome"/>
+    <w:bookmarkEnd w:id="306"/>
+    <w:bookmarkStart w:id="308" w:name="ref-wang2009trichometranscriptome"/>
     <w:p>
       <w:pPr>
         <w:pStyle w:val="Bibliography"/>
@@ -20601,7 +20820,7 @@
       <w:r>
         <w:t xml:space="preserve"> </w:t>
       </w:r>
-      <w:hyperlink r:id="rId305">
+      <w:hyperlink r:id="rId307">
         <w:r>
           <w:rPr>
             <w:rStyle w:val="Hyperlink"/>
@@ -20613,8 +20832,8 @@
         <w:t xml:space="preserve">.</w:t>
       </w:r>
     </w:p>
-    <w:bookmarkEnd w:id="306"/>
-    <w:bookmarkStart w:id="308" w:name="ref-wani2023nitric"/>
+    <w:bookmarkEnd w:id="308"/>
+    <w:bookmarkStart w:id="310" w:name="ref-wani2023nitric"/>
     <w:p>
       <w:pPr>
         <w:pStyle w:val="Bibliography"/>
@@ -20672,7 +20891,7 @@
       <w:r>
         <w:t xml:space="preserve"> </w:t>
       </w:r>
-      <w:hyperlink r:id="rId307">
+      <w:hyperlink r:id="rId309">
         <w:r>
           <w:rPr>
             <w:rStyle w:val="Hyperlink"/>
@@ -20684,8 +20903,8 @@
         <w:t xml:space="preserve">.</w:t>
       </w:r>
     </w:p>
-    <w:bookmarkEnd w:id="308"/>
-    <w:bookmarkStart w:id="310" w:name="ref-wani2026maritima"/>
+    <w:bookmarkEnd w:id="310"/>
+    <w:bookmarkStart w:id="312" w:name="ref-wani2026maritima"/>
     <w:p>
       <w:pPr>
         <w:pStyle w:val="Bibliography"/>
@@ -20731,7 +20950,7 @@
       <w:r>
         <w:t xml:space="preserve"> </w:t>
       </w:r>
-      <w:hyperlink r:id="rId309">
+      <w:hyperlink r:id="rId311">
         <w:r>
           <w:rPr>
             <w:rStyle w:val="Hyperlink"/>
@@ -20743,8 +20962,8 @@
         <w:t xml:space="preserve">.</w:t>
       </w:r>
     </w:p>
-    <w:bookmarkEnd w:id="310"/>
-    <w:bookmarkStart w:id="312" w:name="ref-wetmore2019psiv9"/>
+    <w:bookmarkEnd w:id="312"/>
+    <w:bookmarkStart w:id="314" w:name="ref-wetmore2019psiv9"/>
     <w:p>
       <w:pPr>
         <w:pStyle w:val="Bibliography"/>
@@ -20790,7 +21009,7 @@
       <w:r>
         <w:t xml:space="preserve"> </w:t>
       </w:r>
-      <w:hyperlink r:id="rId311">
+      <w:hyperlink r:id="rId313">
         <w:r>
           <w:rPr>
             <w:rStyle w:val="Hyperlink"/>
@@ -20802,8 +21021,8 @@
         <w:t xml:space="preserve">.</w:t>
       </w:r>
     </w:p>
-    <w:bookmarkEnd w:id="312"/>
-    <w:bookmarkStart w:id="314" w:name="ref-wiedosari2017eimeria"/>
+    <w:bookmarkEnd w:id="314"/>
+    <w:bookmarkStart w:id="316" w:name="ref-wiedosari2017eimeria"/>
     <w:p>
       <w:pPr>
         <w:pStyle w:val="Bibliography"/>
@@ -20858,7 +21077,7 @@
       <w:r>
         <w:t xml:space="preserve"> </w:t>
       </w:r>
-      <w:hyperlink r:id="rId313">
+      <w:hyperlink r:id="rId315">
         <w:r>
           <w:rPr>
             <w:rStyle w:val="Hyperlink"/>
@@ -20870,8 +21089,8 @@
         <w:t xml:space="preserve">.</w:t>
       </w:r>
     </w:p>
-    <w:bookmarkEnd w:id="314"/>
-    <w:bookmarkStart w:id="316" w:name="ref-wright2010qinghao"/>
+    <w:bookmarkEnd w:id="316"/>
+    <w:bookmarkStart w:id="318" w:name="ref-wright2010qinghao"/>
     <w:p>
       <w:pPr>
         <w:pStyle w:val="Bibliography"/>
@@ -20917,7 +21136,7 @@
       <w:r>
         <w:t xml:space="preserve"> </w:t>
       </w:r>
-      <w:hyperlink r:id="rId315">
+      <w:hyperlink r:id="rId317">
         <w:r>
           <w:rPr>
             <w:rStyle w:val="Hyperlink"/>
@@ -20929,8 +21148,8 @@
         <w:t xml:space="preserve">.</w:t>
       </w:r>
     </w:p>
-    <w:bookmarkEnd w:id="316"/>
-    <w:bookmarkStart w:id="318" w:name="ref-xiang2019bhlh112"/>
+    <w:bookmarkEnd w:id="318"/>
+    <w:bookmarkStart w:id="320" w:name="ref-xiang2019bhlh112"/>
     <w:p>
       <w:pPr>
         <w:pStyle w:val="Bibliography"/>
@@ -20964,7 +21183,7 @@
       <w:r>
         <w:t xml:space="preserve"> </w:t>
       </w:r>
-      <w:hyperlink r:id="rId317">
+      <w:hyperlink r:id="rId319">
         <w:r>
           <w:rPr>
             <w:rStyle w:val="Hyperlink"/>
@@ -20976,8 +21195,8 @@
         <w:t xml:space="preserve">.</w:t>
       </w:r>
     </w:p>
-    <w:bookmarkEnd w:id="318"/>
-    <w:bookmarkStart w:id="320" w:name="ref-xu2025plantmatrix"/>
+    <w:bookmarkEnd w:id="320"/>
+    <w:bookmarkStart w:id="322" w:name="ref-xu2025plantmatrix"/>
     <w:p>
       <w:pPr>
         <w:pStyle w:val="Bibliography"/>
@@ -21023,7 +21242,7 @@
       <w:r>
         <w:t xml:space="preserve"> </w:t>
       </w:r>
-      <w:hyperlink r:id="rId319">
+      <w:hyperlink r:id="rId321">
         <w:r>
           <w:rPr>
             <w:rStyle w:val="Hyperlink"/>
@@ -21035,8 +21254,8 @@
         <w:t xml:space="preserve">.</w:t>
       </w:r>
     </w:p>
-    <w:bookmarkEnd w:id="320"/>
-    <w:bookmarkStart w:id="322" w:name="ref-xu2026artemisininpk"/>
+    <w:bookmarkEnd w:id="322"/>
+    <w:bookmarkStart w:id="324" w:name="ref-xu2026artemisininpk"/>
     <w:p>
       <w:pPr>
         <w:pStyle w:val="Bibliography"/>
@@ -21082,7 +21301,7 @@
       <w:r>
         <w:t xml:space="preserve"> </w:t>
       </w:r>
-      <w:hyperlink r:id="rId321">
+      <w:hyperlink r:id="rId323">
         <w:r>
           <w:rPr>
             <w:rStyle w:val="Hyperlink"/>
@@ -21094,8 +21313,8 @@
         <w:t xml:space="preserve">.</w:t>
       </w:r>
     </w:p>
-    <w:bookmarkEnd w:id="322"/>
-    <w:bookmarkStart w:id="324" w:name="ref-yildiz2011toxocara"/>
+    <w:bookmarkEnd w:id="324"/>
+    <w:bookmarkStart w:id="326" w:name="ref-yildiz2011toxocara"/>
     <w:p>
       <w:pPr>
         <w:pStyle w:val="Bibliography"/>
@@ -21153,7 +21372,7 @@
       <w:r>
         <w:t xml:space="preserve"> </w:t>
       </w:r>
-      <w:hyperlink r:id="rId323">
+      <w:hyperlink r:id="rId325">
         <w:r>
           <w:rPr>
             <w:rStyle w:val="Hyperlink"/>
@@ -21165,8 +21384,8 @@
         <w:t xml:space="preserve">.</w:t>
       </w:r>
     </w:p>
-    <w:bookmarkEnd w:id="324"/>
-    <w:bookmarkStart w:id="326" w:name="ref-zehra2020copper"/>
+    <w:bookmarkEnd w:id="326"/>
+    <w:bookmarkStart w:id="328" w:name="ref-zehra2020copper"/>
     <w:p>
       <w:pPr>
         <w:pStyle w:val="Bibliography"/>
@@ -21212,7 +21431,7 @@
       <w:r>
         <w:t xml:space="preserve"> </w:t>
       </w:r>
-      <w:hyperlink r:id="rId325">
+      <w:hyperlink r:id="rId327">
         <w:r>
           <w:rPr>
             <w:rStyle w:val="Hyperlink"/>
@@ -21224,8 +21443,8 @@
         <w:t xml:space="preserve">.</w:t>
       </w:r>
     </w:p>
-    <w:bookmarkEnd w:id="326"/>
-    <w:bookmarkStart w:id="328" w:name="ref-zhang2022fiveartemisia"/>
+    <w:bookmarkEnd w:id="328"/>
+    <w:bookmarkStart w:id="330" w:name="ref-zhang2022fiveartemisia"/>
     <w:p>
       <w:pPr>
         <w:pStyle w:val="Bibliography"/>
@@ -21271,7 +21490,7 @@
       <w:r>
         <w:t xml:space="preserve"> </w:t>
       </w:r>
-      <w:hyperlink r:id="rId327">
+      <w:hyperlink r:id="rId329">
         <w:r>
           <w:rPr>
             <w:rStyle w:val="Hyperlink"/>
@@ -21283,8 +21502,8 @@
         <w:t xml:space="preserve">.</w:t>
       </w:r>
     </w:p>
-    <w:bookmarkEnd w:id="328"/>
-    <w:bookmarkStart w:id="330" w:name="ref-zhang2026annuaenhancement"/>
+    <w:bookmarkEnd w:id="330"/>
+    <w:bookmarkStart w:id="332" w:name="ref-zhang2026annuaenhancement"/>
     <w:p>
       <w:pPr>
         <w:pStyle w:val="Bibliography"/>
@@ -21330,7 +21549,7 @@
       <w:r>
         <w:t xml:space="preserve"> </w:t>
       </w:r>
-      <w:hyperlink r:id="rId329">
+      <w:hyperlink r:id="rId331">
         <w:r>
           <w:rPr>
             <w:rStyle w:val="Hyperlink"/>
@@ -21342,8 +21561,8 @@
         <w:t xml:space="preserve">.</w:t>
       </w:r>
     </w:p>
-    <w:bookmarkEnd w:id="330"/>
-    <w:bookmarkStart w:id="332" w:name="ref-zhang2020argyitriterpenoids"/>
+    <w:bookmarkEnd w:id="332"/>
+    <w:bookmarkStart w:id="334" w:name="ref-zhang2020argyitriterpenoids"/>
     <w:p>
       <w:pPr>
         <w:pStyle w:val="Bibliography"/>
@@ -21386,7 +21605,7 @@
       <w:r>
         <w:t xml:space="preserve"> </w:t>
       </w:r>
-      <w:hyperlink r:id="rId331">
+      <w:hyperlink r:id="rId333">
         <w:r>
           <w:rPr>
             <w:rStyle w:val="Hyperlink"/>
@@ -21398,8 +21617,8 @@
         <w:t xml:space="preserve">.</w:t>
       </w:r>
     </w:p>
-    <w:bookmarkEnd w:id="332"/>
-    <w:bookmarkStart w:id="334" w:name="ref-zhang2019pp2c1"/>
+    <w:bookmarkEnd w:id="334"/>
+    <w:bookmarkStart w:id="336" w:name="ref-zhang2019pp2c1"/>
     <w:p>
       <w:pPr>
         <w:pStyle w:val="Bibliography"/>
@@ -21451,7 +21670,7 @@
       <w:r>
         <w:t xml:space="preserve"> </w:t>
       </w:r>
-      <w:hyperlink r:id="rId333">
+      <w:hyperlink r:id="rId335">
         <w:r>
           <w:rPr>
             <w:rStyle w:val="Hyperlink"/>
@@ -21463,8 +21682,8 @@
         <w:t xml:space="preserve">.</w:t>
       </w:r>
     </w:p>
-    <w:bookmarkEnd w:id="334"/>
-    <w:bookmarkStart w:id="336" w:name="ref-zhang2008dbr2"/>
+    <w:bookmarkEnd w:id="336"/>
+    <w:bookmarkStart w:id="338" w:name="ref-zhang2008dbr2"/>
     <w:p>
       <w:pPr>
         <w:pStyle w:val="Bibliography"/>
@@ -21498,7 +21717,7 @@
       <w:r>
         <w:t xml:space="preserve"> </w:t>
       </w:r>
-      <w:hyperlink r:id="rId335">
+      <w:hyperlink r:id="rId337">
         <w:r>
           <w:rPr>
             <w:rStyle w:val="Hyperlink"/>
@@ -21510,8 +21729,8 @@
         <w:t xml:space="preserve">.</w:t>
       </w:r>
     </w:p>
-    <w:bookmarkEnd w:id="336"/>
-    <w:bookmarkStart w:id="338" w:name="ref-frigida2023variability"/>
+    <w:bookmarkEnd w:id="338"/>
+    <w:bookmarkStart w:id="340" w:name="ref-frigida2023variability"/>
     <w:p>
       <w:pPr>
         <w:pStyle w:val="Bibliography"/>
@@ -21545,7 +21764,7 @@
       <w:r>
         <w:t xml:space="preserve"> </w:t>
       </w:r>
-      <w:hyperlink r:id="rId337">
+      <w:hyperlink r:id="rId339">
         <w:r>
           <w:rPr>
             <w:rStyle w:val="Hyperlink"/>
@@ -21557,9 +21776,9 @@
         <w:t xml:space="preserve">.</w:t>
       </w:r>
     </w:p>
-    <w:bookmarkEnd w:id="338"/>
-    <w:bookmarkEnd w:id="339"/>
     <w:bookmarkEnd w:id="340"/>
+    <w:bookmarkEnd w:id="341"/>
+    <w:bookmarkEnd w:id="342"/>
     <w:sectPr>
       <w:headerReference w:type="default" r:id="rId9"/>
       <w:footerReference w:type="default" r:id="rId10"/>

</xml_diff>

<commit_message>
Verify defined STL trypanosome evidence
</commit_message>
<xml_diff>
--- a/manuscript/artemisia-terpene-review-submission.docx
+++ b/manuscript/artemisia-terpene-review-submission.docx
@@ -199,7 +199,7 @@
         <w:t xml:space="preserve"> </w:t>
       </w:r>
       <w:r>
-        <w:t xml:space="preserve">contains volatile monoterpenes and sesquiterpenes, less volatile diterpenes and triterpenes, and structurally diverse sesquiterpene lactones (STLs). These metabolites are often discussed as though a species name, a pathway gene, or an oil profile were sufficient to predict pharmacology. Here we present a source-auditable scoping review with a frozen snapshot that instead treats the specimen, accession, tissue, preparation, analytical method, parasite stage, and evidence level as the units of comparison. The Terpedia package registers 541 sources, 556 source-linked evidence records, 132 antiparasitic records, 19 parasite–protein interaction records, 179 compound/specimen records, and 410 audited article claims; 94 sources and 109 linked evidence rows have completed full-text verification, while 19 remain open. We synthesize terpene classes with biosynthetic compartmentalization, regulatory and environmental variation, and a bounded comparative-genomics analysis. Artemisinin biosynthesis in</w:t>
+        <w:t xml:space="preserve">contains volatile monoterpenes and sesquiterpenes, less volatile diterpenes and triterpenes, and structurally diverse sesquiterpene lactones (STLs). These metabolites are often discussed as though a species name, a pathway gene, or an oil profile were sufficient to predict pharmacology. Here we present a source-auditable scoping review with a frozen snapshot that instead treats the specimen, accession, tissue, preparation, analytical method, parasite stage, and evidence level as the units of comparison. The Terpedia package registers 541 sources, 556 source-linked evidence records, 132 antiparasitic records, 19 parasite–protein interaction records, 179 compound/specimen records, and 410 audited article claims; 95 sources and 110 linked evidence rows have completed full-text verification, while 18 remain open. We synthesize terpene classes with biosynthetic compartmentalization, regulatory and environmental variation, and a bounded comparative-genomics analysis. Artemisinin biosynthesis in</w:t>
       </w:r>
       <w:r>
         <w:t xml:space="preserve"> </w:t>
@@ -976,7 +976,7 @@
         <w:spacing w:before="0" w:after="120" w:line="264" w:lineRule="auto"/>
       </w:pPr>
       <w:r>
-        <w:t xml:space="preserve">The analysis is reported as a frozen scoping review rather than a completed systematic review. The retrieval snapshot contains 1,408 bounded title/abstract decisions, covering all 1,387 priority-queue records plus 21 historical or out-of-queue decisions. Full-text verification now covers 94 publicly accessible, associated-supplementary, or publisher-indexed antiparasitic sources and 109 linked evidence rows; 19 queue sources remain unverified, and no result is pooled as a final quantitative estimate. The</w:t>
+        <w:t xml:space="preserve">The analysis is reported as a frozen scoping review rather than a completed systematic review. The retrieval snapshot contains 1,408 bounded title/abstract decisions, covering all 1,387 priority-queue records plus 21 historical or out-of-queue decisions. Full-text verification now covers 95 publicly accessible, associated-supplementary, or publisher-indexed antiparasitic sources and 110 linked evidence rows; 18 queue sources remain unverified, and no result is pooled as a final quantitative estimate. The</w:t>
       </w:r>
       <w:r>
         <w:t xml:space="preserve"> </w:t>
@@ -1134,7 +1134,23 @@
         <w:t xml:space="preserve"> </w:t>
       </w:r>
       <w:r>
-        <w:t xml:space="preserve">study retains publisher-preview-only quantitative eligibility, unresolved extract chemistry, and a response-biomarker rather than direct-target interpretation, the associated</w:t>
+        <w:t xml:space="preserve">study retains publisher-preview-only quantitative eligibility, unresolved extract chemistry, and a response-biomarker rather than direct-target interpretation, the newly verified</w:t>
+      </w:r>
+      <w:r>
+        <w:t xml:space="preserve"> </w:t>
+      </w:r>
+      <w:r>
+        <w:rPr>
+          <w:i/>
+          <w:iCs/>
+        </w:rPr>
+        <w:t xml:space="preserve">A. douglassiana</w:t>
+      </w:r>
+      <w:r>
+        <w:t xml:space="preserve"> </w:t>
+      </w:r>
+      <w:r>
+        <w:t xml:space="preserve">sesquiterpene-lactone study retains publisher-indexed full-text resolution but unresolved quantitative eligibility, the associated</w:t>
       </w:r>
       <w:r>
         <w:t xml:space="preserve"> </w:t>
@@ -9346,6 +9362,69 @@
         <w:spacing w:before="0" w:after="120" w:line="264" w:lineRule="auto"/>
       </w:pPr>
       <w:r>
+        <w:t xml:space="preserve">Publisher-indexed full-text sections provide a defined sesquiterpene-lactone comparator in</w:t>
+      </w:r>
+      <w:r>
+        <w:t xml:space="preserve"> </w:t>
+      </w:r>
+      <w:r>
+        <w:rPr>
+          <w:i/>
+          <w:iCs/>
+        </w:rPr>
+        <w:t xml:space="preserve">Trypanosoma cruzi</w:t>
+      </w:r>
+      <w:r>
+        <w:t xml:space="preserve">. Dehydroleucodine from</w:t>
+      </w:r>
+      <w:r>
+        <w:t xml:space="preserve"> </w:t>
+      </w:r>
+      <w:r>
+        <w:rPr>
+          <w:i/>
+          <w:iCs/>
+        </w:rPr>
+        <w:t xml:space="preserve">A. douglassiana</w:t>
+      </w:r>
+      <w:r>
+        <w:t xml:space="preserve"> </w:t>
+      </w:r>
+      <w:r>
+        <w:t xml:space="preserve">aerial parts and helenalin from another Asteraceae were reported at greater than 95% purity, with identity/purity support from ^13C-NMR, melting point, and optical rotation. Both compounds induced phosphatidylserine exposure and TUNEL-positive DNA fragmentation in replicative epimastigotes and infective trypomastigotes, and dehydroleucodine combinations with benznidazole or nifurtimox increased the reported loss of parasite viability. These are defined-compound, stage-resolved phenotypes; they do not establish a parasite protein target, mammalian selectivity, infected-host efficacy, or an equivalent</w:t>
+      </w:r>
+      <w:r>
+        <w:t xml:space="preserve"> </w:t>
+      </w:r>
+      <w:r>
+        <w:rPr>
+          <w:i/>
+          <w:iCs/>
+        </w:rPr>
+        <w:t xml:space="preserve">A. absinthium</w:t>
+      </w:r>
+      <w:r>
+        <w:t xml:space="preserve"> </w:t>
+      </w:r>
+      <w:r>
+        <w:t xml:space="preserve">exposure</w:t>
+      </w:r>
+      <w:r>
+        <w:t xml:space="preserve"> </w:t>
+      </w:r>
+      <w:r>
+        <w:t xml:space="preserve">(Jimenez et al. 2014)</w:t>
+      </w:r>
+      <w:r>
+        <w:t xml:space="preserve">.</w:t>
+      </w:r>
+    </w:p>
+    <w:p>
+      <w:pPr>
+        <w:pStyle w:val="BodyText"/>
+        <w:spacing w:before="0" w:after="120" w:line="264" w:lineRule="auto"/>
+      </w:pPr>
+      <w:r>
         <w:t xml:space="preserve">Full-text verification of a commercial</w:t>
       </w:r>
       <w:r>
@@ -13318,7 +13397,7 @@
     <w:bookmarkEnd w:id="50"/>
     <w:bookmarkEnd w:id="51"/>
     <w:bookmarkEnd w:id="52"/>
-    <w:bookmarkStart w:id="342" w:name="references"/>
+    <w:bookmarkStart w:id="344" w:name="references"/>
     <w:p>
       <w:pPr>
         <w:pStyle w:val="Heading1"/>
@@ -13328,7 +13407,7 @@
         <w:t xml:space="preserve">References</w:t>
       </w:r>
     </w:p>
-    <w:bookmarkStart w:id="341" w:name="refs"/>
+    <w:bookmarkStart w:id="343" w:name="refs"/>
     <w:bookmarkStart w:id="54" w:name="ref-abad2012artemisia"/>
     <w:p>
       <w:pPr>
@@ -16840,13 +16919,69 @@
       </w:r>
     </w:p>
     <w:bookmarkEnd w:id="168"/>
-    <w:bookmarkStart w:id="170" w:name="ref-judzentiene2016vulgaris"/>
+    <w:bookmarkStart w:id="170" w:name="ref-jimenez2014tcruzipcd"/>
     <w:p>
       <w:pPr>
         <w:pStyle w:val="Bibliography"/>
         <w:spacing w:before="0" w:after="120" w:line="264" w:lineRule="auto"/>
       </w:pPr>
       <w:r>
+        <w:t xml:space="preserve">Jimenez, V, U Kemmerling, R Paredes, JD Maya, MA Sosa, and N Galanti. 2014.</w:t>
+      </w:r>
+      <w:r>
+        <w:t xml:space="preserve"> </w:t>
+      </w:r>
+      <w:r>
+        <w:t xml:space="preserve">“Natural Sesquiterpene Lactones Induce Programmed Cell Death in</w:t>
+      </w:r>
+      <w:r>
+        <w:t xml:space="preserve"> </w:t>
+      </w:r>
+      <w:r>
+        <w:t xml:space="preserve">Trypanosoma cruzi</w:t>
+      </w:r>
+      <w:r>
+        <w:t xml:space="preserve">: A New Therapeutic Target?”</w:t>
+      </w:r>
+      <w:r>
+        <w:t xml:space="preserve"> </w:t>
+      </w:r>
+      <w:r>
+        <w:rPr>
+          <w:i/>
+          <w:iCs/>
+        </w:rPr>
+        <w:t xml:space="preserve">Phytomedicine</w:t>
+      </w:r>
+      <w:r>
+        <w:t xml:space="preserve"> </w:t>
+      </w:r>
+      <w:r>
+        <w:t xml:space="preserve">21 (11): 1411–18.</w:t>
+      </w:r>
+      <w:r>
+        <w:t xml:space="preserve"> </w:t>
+      </w:r>
+      <w:hyperlink r:id="rId169">
+        <w:r>
+          <w:rPr>
+            <w:rStyle w:val="Hyperlink"/>
+          </w:rPr>
+          <w:t xml:space="preserve">https://doi.org/10.1016/j.phymed.2014.06.005</w:t>
+        </w:r>
+      </w:hyperlink>
+      <w:r>
+        <w:t xml:space="preserve">.</w:t>
+      </w:r>
+    </w:p>
+    <w:bookmarkEnd w:id="170"/>
+    <w:bookmarkStart w:id="172" w:name="ref-judzentiene2016vulgaris"/>
+    <w:p>
+      <w:pPr>
+        <w:pStyle w:val="Bibliography"/>
+        <w:spacing w:before="0" w:after="120" w:line="264" w:lineRule="auto"/>
+      </w:pPr>
+      <w:r>
         <w:t xml:space="preserve">Judzentiene, Asta, and Rasa Garjonyte. 2016.</w:t>
       </w:r>
       <w:r>
@@ -16855,7 +16990,7 @@
       <w:r>
         <w:t xml:space="preserve">“</w:t>
       </w:r>
-      <w:hyperlink r:id="rId169">
+      <w:hyperlink r:id="rId171">
         <w:r>
           <w:rPr>
             <w:rStyle w:val="Hyperlink"/>
@@ -16895,8 +17030,8 @@
         <w:t xml:space="preserve">11 (9): 1353–56.</w:t>
       </w:r>
     </w:p>
-    <w:bookmarkEnd w:id="170"/>
-    <w:bookmarkStart w:id="172" w:name="ref-kane2022cyp450"/>
+    <w:bookmarkEnd w:id="172"/>
+    <w:bookmarkStart w:id="174" w:name="ref-kane2022cyp450"/>
     <w:p>
       <w:pPr>
         <w:pStyle w:val="Bibliography"/>
@@ -16951,7 +17086,7 @@
       <w:r>
         <w:t xml:space="preserve"> </w:t>
       </w:r>
-      <w:hyperlink r:id="rId171">
+      <w:hyperlink r:id="rId173">
         <w:r>
           <w:rPr>
             <w:rStyle w:val="Hyperlink"/>
@@ -16963,8 +17098,8 @@
         <w:t xml:space="preserve">.</w:t>
       </w:r>
     </w:p>
-    <w:bookmarkEnd w:id="172"/>
-    <w:bookmarkStart w:id="174" w:name="ref-khan2015artemisia_nematodes"/>
+    <w:bookmarkEnd w:id="174"/>
+    <w:bookmarkStart w:id="176" w:name="ref-khan2015artemisia_nematodes"/>
     <w:p>
       <w:pPr>
         <w:pStyle w:val="Bibliography"/>
@@ -16979,7 +17114,7 @@
       <w:r>
         <w:t xml:space="preserve">“</w:t>
       </w:r>
-      <w:hyperlink r:id="rId173">
+      <w:hyperlink r:id="rId175">
         <w:r>
           <w:rPr>
             <w:rStyle w:val="Hyperlink"/>
@@ -17031,8 +17166,8 @@
         <w:t xml:space="preserve">32 (2): 257–68.</w:t>
       </w:r>
     </w:p>
-    <w:bookmarkEnd w:id="174"/>
-    <w:bookmarkStart w:id="176" w:name="ref-kunnathattil2025vulgaris"/>
+    <w:bookmarkEnd w:id="176"/>
+    <w:bookmarkStart w:id="178" w:name="ref-kunnathattil2025vulgaris"/>
     <w:p>
       <w:pPr>
         <w:pStyle w:val="Bibliography"/>
@@ -17090,7 +17225,7 @@
       <w:r>
         <w:t xml:space="preserve"> </w:t>
       </w:r>
-      <w:hyperlink r:id="rId175">
+      <w:hyperlink r:id="rId177">
         <w:r>
           <w:rPr>
             <w:rStyle w:val="Hyperlink"/>
@@ -17102,8 +17237,8 @@
         <w:t xml:space="preserve">.</w:t>
       </w:r>
     </w:p>
-    <w:bookmarkEnd w:id="176"/>
-    <w:bookmarkStart w:id="178" w:name="ref-li2018naturalcombination"/>
+    <w:bookmarkEnd w:id="178"/>
+    <w:bookmarkStart w:id="180" w:name="ref-li2018naturalcombination"/>
     <w:p>
       <w:pPr>
         <w:pStyle w:val="Bibliography"/>
@@ -17149,7 +17284,7 @@
       <w:r>
         <w:t xml:space="preserve"> </w:t>
       </w:r>
-      <w:hyperlink r:id="rId177">
+      <w:hyperlink r:id="rId179">
         <w:r>
           <w:rPr>
             <w:rStyle w:val="Hyperlink"/>
@@ -17161,8 +17296,8 @@
         <w:t xml:space="preserve">.</w:t>
       </w:r>
     </w:p>
-    <w:bookmarkEnd w:id="178"/>
-    <w:bookmarkStart w:id="180" w:name="ref-li2008sphaerocephalasaponin"/>
+    <w:bookmarkEnd w:id="180"/>
+    <w:bookmarkStart w:id="182" w:name="ref-li2008sphaerocephalasaponin"/>
     <w:p>
       <w:pPr>
         <w:pStyle w:val="Bibliography"/>
@@ -17205,7 +17340,7 @@
       <w:r>
         <w:t xml:space="preserve"> </w:t>
       </w:r>
-      <w:hyperlink r:id="rId179">
+      <w:hyperlink r:id="rId181">
         <w:r>
           <w:rPr>
             <w:rStyle w:val="Hyperlink"/>
@@ -17217,8 +17352,8 @@
         <w:t xml:space="preserve">.</w:t>
       </w:r>
     </w:p>
-    <w:bookmarkEnd w:id="180"/>
-    <w:bookmarkStart w:id="182" w:name="ref-li1990sacrorumditerpene"/>
+    <w:bookmarkEnd w:id="182"/>
+    <w:bookmarkStart w:id="184" w:name="ref-li1990sacrorumditerpene"/>
     <w:p>
       <w:pPr>
         <w:pStyle w:val="Bibliography"/>
@@ -17261,7 +17396,7 @@
       <w:r>
         <w:t xml:space="preserve"> </w:t>
       </w:r>
-      <w:hyperlink r:id="rId181">
+      <w:hyperlink r:id="rId183">
         <w:r>
           <w:rPr>
             <w:rStyle w:val="Hyperlink"/>
@@ -17273,8 +17408,8 @@
         <w:t xml:space="preserve">.</w:t>
       </w:r>
     </w:p>
-    <w:bookmarkEnd w:id="182"/>
-    <w:bookmarkStart w:id="184" w:name="ref-liu2026osc"/>
+    <w:bookmarkEnd w:id="184"/>
+    <w:bookmarkStart w:id="186" w:name="ref-liu2026osc"/>
     <w:p>
       <w:pPr>
         <w:pStyle w:val="Bibliography"/>
@@ -17320,7 +17455,7 @@
       <w:r>
         <w:t xml:space="preserve"> </w:t>
       </w:r>
-      <w:hyperlink r:id="rId183">
+      <w:hyperlink r:id="rId185">
         <w:r>
           <w:rPr>
             <w:rStyle w:val="Hyperlink"/>
@@ -17332,8 +17467,8 @@
         <w:t xml:space="preserve">.</w:t>
       </w:r>
     </w:p>
-    <w:bookmarkEnd w:id="184"/>
-    <w:bookmarkStart w:id="186" w:name="ref-liu2022vulgaristerpenoids"/>
+    <w:bookmarkEnd w:id="186"/>
+    <w:bookmarkStart w:id="188" w:name="ref-liu2022vulgaristerpenoids"/>
     <w:p>
       <w:pPr>
         <w:pStyle w:val="Bibliography"/>
@@ -17379,7 +17514,7 @@
       <w:r>
         <w:t xml:space="preserve"> </w:t>
       </w:r>
-      <w:hyperlink r:id="rId185">
+      <w:hyperlink r:id="rId187">
         <w:r>
           <w:rPr>
             <w:rStyle w:val="Hyperlink"/>
@@ -17391,8 +17526,8 @@
         <w:t xml:space="preserve">.</w:t>
       </w:r>
     </w:p>
-    <w:bookmarkEnd w:id="186"/>
-    <w:bookmarkStart w:id="188" w:name="ref-lu2013aora"/>
+    <w:bookmarkEnd w:id="188"/>
+    <w:bookmarkStart w:id="190" w:name="ref-lu2013aora"/>
     <w:p>
       <w:pPr>
         <w:pStyle w:val="Bibliography"/>
@@ -17450,7 +17585,7 @@
       <w:r>
         <w:t xml:space="preserve"> </w:t>
       </w:r>
-      <w:hyperlink r:id="rId187">
+      <w:hyperlink r:id="rId189">
         <w:r>
           <w:rPr>
             <w:rStyle w:val="Hyperlink"/>
@@ -17462,8 +17597,8 @@
         <w:t xml:space="preserve">.</w:t>
       </w:r>
     </w:p>
-    <w:bookmarkEnd w:id="188"/>
-    <w:bookmarkStart w:id="190" w:name="ref-lv2016nac1"/>
+    <w:bookmarkEnd w:id="190"/>
+    <w:bookmarkStart w:id="192" w:name="ref-lv2016nac1"/>
     <w:p>
       <w:pPr>
         <w:pStyle w:val="Bibliography"/>
@@ -17524,7 +17659,7 @@
       <w:r>
         <w:t xml:space="preserve"> </w:t>
       </w:r>
-      <w:hyperlink r:id="rId189">
+      <w:hyperlink r:id="rId191">
         <w:r>
           <w:rPr>
             <w:rStyle w:val="Hyperlink"/>
@@ -17536,8 +17671,8 @@
         <w:t xml:space="preserve">.</w:t>
       </w:r>
     </w:p>
-    <w:bookmarkEnd w:id="190"/>
-    <w:bookmarkStart w:id="192" w:name="ref-ma2001caruifolia"/>
+    <w:bookmarkEnd w:id="192"/>
+    <w:bookmarkStart w:id="194" w:name="ref-ma2001caruifolia"/>
     <w:p>
       <w:pPr>
         <w:pStyle w:val="Bibliography"/>
@@ -17571,7 +17706,7 @@
       <w:r>
         <w:t xml:space="preserve"> </w:t>
       </w:r>
-      <w:hyperlink r:id="rId191">
+      <w:hyperlink r:id="rId193">
         <w:r>
           <w:rPr>
             <w:rStyle w:val="Hyperlink"/>
@@ -17583,8 +17718,8 @@
         <w:t xml:space="preserve">.</w:t>
       </w:r>
     </w:p>
-    <w:bookmarkEnd w:id="192"/>
-    <w:bookmarkStart w:id="194" w:name="ref-mamede2025metabolite"/>
+    <w:bookmarkEnd w:id="194"/>
+    <w:bookmarkStart w:id="196" w:name="ref-mamede2025metabolite"/>
     <w:p>
       <w:pPr>
         <w:pStyle w:val="Bibliography"/>
@@ -17651,7 +17786,7 @@
       <w:r>
         <w:t xml:space="preserve"> </w:t>
       </w:r>
-      <w:hyperlink r:id="rId193">
+      <w:hyperlink r:id="rId195">
         <w:r>
           <w:rPr>
             <w:rStyle w:val="Hyperlink"/>
@@ -17663,8 +17798,8 @@
         <w:t xml:space="preserve">.</w:t>
       </w:r>
     </w:p>
-    <w:bookmarkEnd w:id="194"/>
-    <w:bookmarkStart w:id="196" w:name="ref-martinezdiaz2015absinthiumtrypano"/>
+    <w:bookmarkEnd w:id="196"/>
+    <w:bookmarkStart w:id="198" w:name="ref-martinezdiaz2015absinthiumtrypano"/>
     <w:p>
       <w:pPr>
         <w:pStyle w:val="Bibliography"/>
@@ -17698,7 +17833,7 @@
       <w:r>
         <w:t xml:space="preserve"> </w:t>
       </w:r>
-      <w:hyperlink r:id="rId195">
+      <w:hyperlink r:id="rId197">
         <w:r>
           <w:rPr>
             <w:rStyle w:val="Hyperlink"/>
@@ -17710,8 +17845,8 @@
         <w:t xml:space="preserve">.</w:t>
       </w:r>
     </w:p>
-    <w:bookmarkEnd w:id="196"/>
-    <w:bookmarkStart w:id="198" w:name="ref-ming2025argyidrying"/>
+    <w:bookmarkEnd w:id="198"/>
+    <w:bookmarkStart w:id="200" w:name="ref-ming2025argyidrying"/>
     <w:p>
       <w:pPr>
         <w:pStyle w:val="Bibliography"/>
@@ -17754,7 +17889,7 @@
       <w:r>
         <w:t xml:space="preserve"> </w:t>
       </w:r>
-      <w:hyperlink r:id="rId197">
+      <w:hyperlink r:id="rId199">
         <w:r>
           <w:rPr>
             <w:rStyle w:val="Hyperlink"/>
@@ -17766,8 +17901,8 @@
         <w:t xml:space="preserve">.</w:t>
       </w:r>
     </w:p>
-    <w:bookmarkEnd w:id="198"/>
-    <w:bookmarkStart w:id="200" w:name="ref-mohammed2026monospermadrying"/>
+    <w:bookmarkEnd w:id="200"/>
+    <w:bookmarkStart w:id="202" w:name="ref-mohammed2026monospermadrying"/>
     <w:p>
       <w:pPr>
         <w:pStyle w:val="Bibliography"/>
@@ -17820,7 +17955,7 @@
       <w:r>
         <w:t xml:space="preserve"> </w:t>
       </w:r>
-      <w:hyperlink r:id="rId199">
+      <w:hyperlink r:id="rId201">
         <w:r>
           <w:rPr>
             <w:rStyle w:val="Hyperlink"/>
@@ -17832,8 +17967,8 @@
         <w:t xml:space="preserve">.</w:t>
       </w:r>
     </w:p>
-    <w:bookmarkEnd w:id="200"/>
-    <w:bookmarkStart w:id="202" w:name="ref-mojarrab2015extracts"/>
+    <w:bookmarkEnd w:id="202"/>
+    <w:bookmarkStart w:id="204" w:name="ref-mojarrab2015extracts"/>
     <w:p>
       <w:pPr>
         <w:pStyle w:val="Bibliography"/>
@@ -17879,7 +18014,7 @@
       <w:r>
         <w:t xml:space="preserve"> </w:t>
       </w:r>
-      <w:hyperlink r:id="rId201">
+      <w:hyperlink r:id="rId203">
         <w:r>
           <w:rPr>
             <w:rStyle w:val="Hyperlink"/>
@@ -17891,8 +18026,8 @@
         <w:t xml:space="preserve">.</w:t>
       </w:r>
     </w:p>
-    <w:bookmarkEnd w:id="202"/>
-    <w:bookmarkStart w:id="204" w:name="ref-mojarrab2014fractionation"/>
+    <w:bookmarkEnd w:id="204"/>
+    <w:bookmarkStart w:id="206" w:name="ref-mojarrab2014fractionation"/>
     <w:p>
       <w:pPr>
         <w:pStyle w:val="Bibliography"/>
@@ -17950,7 +18085,7 @@
       <w:r>
         <w:t xml:space="preserve"> </w:t>
       </w:r>
-      <w:hyperlink r:id="rId203">
+      <w:hyperlink r:id="rId205">
         <w:r>
           <w:rPr>
             <w:rStyle w:val="Hyperlink"/>
@@ -17962,8 +18097,8 @@
         <w:t xml:space="preserve">.</w:t>
       </w:r>
     </w:p>
-    <w:bookmarkEnd w:id="204"/>
-    <w:bookmarkStart w:id="206" w:name="ref-monzote2014absinthium"/>
+    <w:bookmarkEnd w:id="206"/>
+    <w:bookmarkStart w:id="208" w:name="ref-monzote2014absinthium"/>
     <w:p>
       <w:pPr>
         <w:pStyle w:val="Bibliography"/>
@@ -17997,7 +18132,7 @@
       <w:r>
         <w:t xml:space="preserve"> </w:t>
       </w:r>
-      <w:hyperlink r:id="rId205">
+      <w:hyperlink r:id="rId207">
         <w:r>
           <w:rPr>
             <w:rStyle w:val="Hyperlink"/>
@@ -18009,8 +18144,8 @@
         <w:t xml:space="preserve">.</w:t>
       </w:r>
     </w:p>
-    <w:bookmarkEnd w:id="206"/>
-    <w:bookmarkStart w:id="208" w:name="ref-morua2025standardizedannua"/>
+    <w:bookmarkEnd w:id="208"/>
+    <w:bookmarkStart w:id="210" w:name="ref-morua2025standardizedannua"/>
     <w:p>
       <w:pPr>
         <w:pStyle w:val="Bibliography"/>
@@ -18056,7 +18191,7 @@
       <w:r>
         <w:t xml:space="preserve"> </w:t>
       </w:r>
-      <w:hyperlink r:id="rId207">
+      <w:hyperlink r:id="rId209">
         <w:r>
           <w:rPr>
             <w:rStyle w:val="Hyperlink"/>
@@ -18068,8 +18203,8 @@
         <w:t xml:space="preserve">.</w:t>
       </w:r>
     </w:p>
-    <w:bookmarkEnd w:id="208"/>
-    <w:bookmarkStart w:id="210" w:name="ref-annua2015triterpenes"/>
+    <w:bookmarkEnd w:id="210"/>
+    <w:bookmarkStart w:id="212" w:name="ref-annua2015triterpenes"/>
     <w:p>
       <w:pPr>
         <w:pStyle w:val="Bibliography"/>
@@ -18103,7 +18238,7 @@
       <w:r>
         <w:t xml:space="preserve"> </w:t>
       </w:r>
-      <w:hyperlink r:id="rId209">
+      <w:hyperlink r:id="rId211">
         <w:r>
           <w:rPr>
             <w:rStyle w:val="Hyperlink"/>
@@ -18115,8 +18250,8 @@
         <w:t xml:space="preserve">.</w:t>
       </w:r>
     </w:p>
-    <w:bookmarkEnd w:id="210"/>
-    <w:bookmarkStart w:id="212" w:name="ref-mouton2013artemisininonly"/>
+    <w:bookmarkEnd w:id="212"/>
+    <w:bookmarkStart w:id="214" w:name="ref-mouton2013artemisininonly"/>
     <w:p>
       <w:pPr>
         <w:pStyle w:val="Bibliography"/>
@@ -18162,7 +18297,7 @@
       <w:r>
         <w:t xml:space="preserve"> </w:t>
       </w:r>
-      <w:hyperlink r:id="rId211">
+      <w:hyperlink r:id="rId213">
         <w:r>
           <w:rPr>
             <w:rStyle w:val="Hyperlink"/>
@@ -18174,8 +18309,8 @@
         <w:t xml:space="preserve">.</w:t>
       </w:r>
     </w:p>
-    <w:bookmarkEnd w:id="212"/>
-    <w:bookmarkStart w:id="214" w:name="ref-mravcakova2020wormwood"/>
+    <w:bookmarkEnd w:id="214"/>
+    <w:bookmarkStart w:id="216" w:name="ref-mravcakova2020wormwood"/>
     <w:p>
       <w:pPr>
         <w:pStyle w:val="Bibliography"/>
@@ -18209,7 +18344,7 @@
       <w:r>
         <w:t xml:space="preserve"> </w:t>
       </w:r>
-      <w:hyperlink r:id="rId213">
+      <w:hyperlink r:id="rId215">
         <w:r>
           <w:rPr>
             <w:rStyle w:val="Hyperlink"/>
@@ -18221,8 +18356,8 @@
         <w:t xml:space="preserve">.</w:t>
       </w:r>
     </w:p>
-    <w:bookmarkEnd w:id="214"/>
-    <w:bookmarkStart w:id="216" w:name="ref-nahrevanian2010khorassanica"/>
+    <w:bookmarkEnd w:id="216"/>
+    <w:bookmarkStart w:id="218" w:name="ref-nahrevanian2010khorassanica"/>
     <w:p>
       <w:pPr>
         <w:pStyle w:val="Bibliography"/>
@@ -18256,7 +18391,7 @@
       <w:r>
         <w:t xml:space="preserve"> </w:t>
       </w:r>
-      <w:hyperlink r:id="rId215">
+      <w:hyperlink r:id="rId217">
         <w:r>
           <w:rPr>
             <w:rStyle w:val="Hyperlink"/>
@@ -18268,8 +18403,8 @@
         <w:t xml:space="preserve">.</w:t>
       </w:r>
     </w:p>
-    <w:bookmarkEnd w:id="216"/>
-    <w:bookmarkStart w:id="218" w:name="ref-nahrevanian2012sieberi"/>
+    <w:bookmarkEnd w:id="218"/>
+    <w:bookmarkStart w:id="220" w:name="ref-nahrevanian2012sieberi"/>
     <w:p>
       <w:pPr>
         <w:pStyle w:val="Bibliography"/>
@@ -18303,7 +18438,7 @@
       <w:r>
         <w:t xml:space="preserve"> </w:t>
       </w:r>
-      <w:hyperlink r:id="rId217">
+      <w:hyperlink r:id="rId219">
         <w:r>
           <w:rPr>
             <w:rStyle w:val="Hyperlink"/>
@@ -18315,8 +18450,8 @@
         <w:t xml:space="preserve">.</w:t>
       </w:r>
     </w:p>
-    <w:bookmarkEnd w:id="218"/>
-    <w:bookmarkStart w:id="220" w:name="ref-nomani2022h2s"/>
+    <w:bookmarkEnd w:id="220"/>
+    <w:bookmarkStart w:id="222" w:name="ref-nomani2022h2s"/>
     <w:p>
       <w:pPr>
         <w:pStyle w:val="Bibliography"/>
@@ -18362,7 +18497,7 @@
       <w:r>
         <w:t xml:space="preserve"> </w:t>
       </w:r>
-      <w:hyperlink r:id="rId219">
+      <w:hyperlink r:id="rId221">
         <w:r>
           <w:rPr>
             <w:rStyle w:val="Hyperlink"/>
@@ -18374,8 +18509,8 @@
         <w:t xml:space="preserve">.</w:t>
       </w:r>
     </w:p>
-    <w:bookmarkEnd w:id="220"/>
-    <w:bookmarkStart w:id="222" w:name="ref-nurlaelasari2023vulgarisfasciola"/>
+    <w:bookmarkEnd w:id="222"/>
+    <w:bookmarkStart w:id="224" w:name="ref-nurlaelasari2023vulgarisfasciola"/>
     <w:p>
       <w:pPr>
         <w:pStyle w:val="Bibliography"/>
@@ -18430,7 +18565,7 @@
       <w:r>
         <w:t xml:space="preserve"> </w:t>
       </w:r>
-      <w:hyperlink r:id="rId221">
+      <w:hyperlink r:id="rId223">
         <w:r>
           <w:rPr>
             <w:rStyle w:val="Hyperlink"/>
@@ -18442,8 +18577,8 @@
         <w:t xml:space="preserve">.</w:t>
       </w:r>
     </w:p>
-    <w:bookmarkEnd w:id="222"/>
-    <w:bookmarkStart w:id="224" w:name="ref-olofsson2011tissue"/>
+    <w:bookmarkEnd w:id="224"/>
+    <w:bookmarkStart w:id="226" w:name="ref-olofsson2011tissue"/>
     <w:p>
       <w:pPr>
         <w:pStyle w:val="Bibliography"/>
@@ -18477,7 +18612,7 @@
       <w:r>
         <w:t xml:space="preserve"> </w:t>
       </w:r>
-      <w:hyperlink r:id="rId223">
+      <w:hyperlink r:id="rId225">
         <w:r>
           <w:rPr>
             <w:rStyle w:val="Hyperlink"/>
@@ -18489,8 +18624,8 @@
         <w:t xml:space="preserve">.</w:t>
       </w:r>
     </w:p>
-    <w:bookmarkEnd w:id="224"/>
-    <w:bookmarkStart w:id="226" w:name="ref-olsson2009localization"/>
+    <w:bookmarkEnd w:id="226"/>
+    <w:bookmarkStart w:id="228" w:name="ref-olsson2009localization"/>
     <w:p>
       <w:pPr>
         <w:pStyle w:val="Bibliography"/>
@@ -18524,7 +18659,7 @@
       <w:r>
         <w:t xml:space="preserve"> </w:t>
       </w:r>
-      <w:hyperlink r:id="rId225">
+      <w:hyperlink r:id="rId227">
         <w:r>
           <w:rPr>
             <w:rStyle w:val="Hyperlink"/>
@@ -18536,8 +18671,8 @@
         <w:t xml:space="preserve">.</w:t>
       </w:r>
     </w:p>
-    <w:bookmarkEnd w:id="226"/>
-    <w:bookmarkStart w:id="228" w:name="ref-ongo2019campestriscomment"/>
+    <w:bookmarkEnd w:id="228"/>
+    <w:bookmarkStart w:id="230" w:name="ref-ongo2019campestriscomment"/>
     <w:p>
       <w:pPr>
         <w:pStyle w:val="Bibliography"/>
@@ -18592,7 +18727,7 @@
       <w:r>
         <w:t xml:space="preserve"> </w:t>
       </w:r>
-      <w:hyperlink r:id="rId227">
+      <w:hyperlink r:id="rId229">
         <w:r>
           <w:rPr>
             <w:rStyle w:val="Hyperlink"/>
@@ -18604,8 +18739,8 @@
         <w:t xml:space="preserve">.</w:t>
       </w:r>
     </w:p>
-    <w:bookmarkEnd w:id="228"/>
-    <w:bookmarkStart w:id="230" w:name="ref-ortet2008gorgonum"/>
+    <w:bookmarkEnd w:id="230"/>
+    <w:bookmarkStart w:id="232" w:name="ref-ortet2008gorgonum"/>
     <w:p>
       <w:pPr>
         <w:pStyle w:val="Bibliography"/>
@@ -18639,7 +18774,7 @@
       <w:r>
         <w:t xml:space="preserve"> </w:t>
       </w:r>
-      <w:hyperlink r:id="rId229">
+      <w:hyperlink r:id="rId231">
         <w:r>
           <w:rPr>
             <w:rStyle w:val="Hyperlink"/>
@@ -18651,8 +18786,8 @@
         <w:t xml:space="preserve">.</w:t>
       </w:r>
     </w:p>
-    <w:bookmarkEnd w:id="230"/>
-    <w:bookmarkStart w:id="232" w:name="ref-osanloo2022dracunculusnanogel"/>
+    <w:bookmarkEnd w:id="232"/>
+    <w:bookmarkStart w:id="234" w:name="ref-osanloo2022dracunculusnanogel"/>
     <w:p>
       <w:pPr>
         <w:pStyle w:val="Bibliography"/>
@@ -18698,7 +18833,7 @@
       <w:r>
         <w:t xml:space="preserve"> </w:t>
       </w:r>
-      <w:hyperlink r:id="rId231">
+      <w:hyperlink r:id="rId233">
         <w:r>
           <w:rPr>
             <w:rStyle w:val="Hyperlink"/>
@@ -18710,8 +18845,8 @@
         <w:t xml:space="preserve">.</w:t>
       </w:r>
     </w:p>
-    <w:bookmarkEnd w:id="232"/>
-    <w:bookmarkStart w:id="234" w:name="ref-oyedeji2009afra"/>
+    <w:bookmarkEnd w:id="234"/>
+    <w:bookmarkStart w:id="236" w:name="ref-oyedeji2009afra"/>
     <w:p>
       <w:pPr>
         <w:pStyle w:val="Bibliography"/>
@@ -18745,7 +18880,7 @@
       <w:r>
         <w:t xml:space="preserve"> </w:t>
       </w:r>
-      <w:hyperlink r:id="rId233">
+      <w:hyperlink r:id="rId235">
         <w:r>
           <w:rPr>
             <w:rStyle w:val="Hyperlink"/>
@@ -18757,8 +18892,8 @@
         <w:t xml:space="preserve">.</w:t>
       </w:r>
     </w:p>
-    <w:bookmarkEnd w:id="234"/>
-    <w:bookmarkStart w:id="236" w:name="ref-pandey2017artemisiaoils"/>
+    <w:bookmarkEnd w:id="236"/>
+    <w:bookmarkStart w:id="238" w:name="ref-pandey2017artemisiaoils"/>
     <w:p>
       <w:pPr>
         <w:pStyle w:val="Bibliography"/>
@@ -18792,7 +18927,7 @@
       <w:r>
         <w:t xml:space="preserve"> </w:t>
       </w:r>
-      <w:hyperlink r:id="rId235">
+      <w:hyperlink r:id="rId237">
         <w:r>
           <w:rPr>
             <w:rStyle w:val="Hyperlink"/>
@@ -18804,8 +18939,8 @@
         <w:t xml:space="preserve">.</w:t>
       </w:r>
     </w:p>
-    <w:bookmarkEnd w:id="236"/>
-    <w:bookmarkStart w:id="238" w:name="ref-parveen2024scoparia"/>
+    <w:bookmarkEnd w:id="238"/>
+    <w:bookmarkStart w:id="240" w:name="ref-parveen2024scoparia"/>
     <w:p>
       <w:pPr>
         <w:pStyle w:val="Bibliography"/>
@@ -18851,7 +18986,7 @@
       <w:r>
         <w:t xml:space="preserve"> </w:t>
       </w:r>
-      <w:hyperlink r:id="rId237">
+      <w:hyperlink r:id="rId239">
         <w:r>
           <w:rPr>
             <w:rStyle w:val="Hyperlink"/>
@@ -18863,8 +18998,8 @@
         <w:t xml:space="preserve">.</w:t>
       </w:r>
     </w:p>
-    <w:bookmarkEnd w:id="238"/>
-    <w:bookmarkStart w:id="240" w:name="ref-paul2010recurrent"/>
+    <w:bookmarkEnd w:id="240"/>
+    <w:bookmarkStart w:id="242" w:name="ref-paul2010recurrent"/>
     <w:p>
       <w:pPr>
         <w:pStyle w:val="Bibliography"/>
@@ -18910,7 +19045,7 @@
       <w:r>
         <w:t xml:space="preserve"> </w:t>
       </w:r>
-      <w:hyperlink r:id="rId239">
+      <w:hyperlink r:id="rId241">
         <w:r>
           <w:rPr>
             <w:rStyle w:val="Hyperlink"/>
@@ -18922,8 +19057,8 @@
         <w:t xml:space="preserve">.</w:t>
       </w:r>
     </w:p>
-    <w:bookmarkEnd w:id="240"/>
-    <w:bookmarkStart w:id="242" w:name="ref-pirali2011tick"/>
+    <w:bookmarkEnd w:id="242"/>
+    <w:bookmarkStart w:id="244" w:name="ref-pirali2011tick"/>
     <w:p>
       <w:pPr>
         <w:pStyle w:val="Bibliography"/>
@@ -18981,7 +19116,7 @@
       <w:r>
         <w:t xml:space="preserve"> </w:t>
       </w:r>
-      <w:hyperlink r:id="rId241">
+      <w:hyperlink r:id="rId243">
         <w:r>
           <w:rPr>
             <w:rStyle w:val="Hyperlink"/>
@@ -18993,8 +19128,8 @@
         <w:t xml:space="preserve">.</w:t>
       </w:r>
     </w:p>
-    <w:bookmarkEnd w:id="242"/>
-    <w:bookmarkStart w:id="244" w:name="ref-radulovic2013toxic"/>
+    <w:bookmarkEnd w:id="244"/>
+    <w:bookmarkStart w:id="246" w:name="ref-radulovic2013toxic"/>
     <w:p>
       <w:pPr>
         <w:pStyle w:val="Bibliography"/>
@@ -19028,7 +19163,7 @@
       <w:r>
         <w:t xml:space="preserve"> </w:t>
       </w:r>
-      <w:hyperlink r:id="rId243">
+      <w:hyperlink r:id="rId245">
         <w:r>
           <w:rPr>
             <w:rStyle w:val="Hyperlink"/>
@@ -19040,8 +19175,8 @@
         <w:t xml:space="preserve">.</w:t>
       </w:r>
     </w:p>
-    <w:bookmarkEnd w:id="244"/>
-    <w:bookmarkStart w:id="246" w:name="ref-ram1997density"/>
+    <w:bookmarkEnd w:id="246"/>
+    <w:bookmarkStart w:id="248" w:name="ref-ram1997density"/>
     <w:p>
       <w:pPr>
         <w:pStyle w:val="Bibliography"/>
@@ -19087,7 +19222,7 @@
       <w:r>
         <w:t xml:space="preserve"> </w:t>
       </w:r>
-      <w:hyperlink r:id="rId245">
+      <w:hyperlink r:id="rId247">
         <w:r>
           <w:rPr>
             <w:rStyle w:val="Hyperlink"/>
@@ -19099,8 +19234,8 @@
         <w:t xml:space="preserve">.</w:t>
       </w:r>
     </w:p>
-    <w:bookmarkEnd w:id="246"/>
-    <w:bookmarkStart w:id="248" w:name="ref-ribbiso2021heme"/>
+    <w:bookmarkEnd w:id="248"/>
+    <w:bookmarkStart w:id="250" w:name="ref-ribbiso2021heme"/>
     <w:p>
       <w:pPr>
         <w:pStyle w:val="Bibliography"/>
@@ -19146,7 +19281,7 @@
       <w:r>
         <w:t xml:space="preserve"> </w:t>
       </w:r>
-      <w:hyperlink r:id="rId247">
+      <w:hyperlink r:id="rId249">
         <w:r>
           <w:rPr>
             <w:rStyle w:val="Hyperlink"/>
@@ -19158,8 +19293,8 @@
         <w:t xml:space="preserve">.</w:t>
       </w:r>
     </w:p>
-    <w:bookmarkEnd w:id="248"/>
-    <w:bookmarkStart w:id="250" w:name="ref-rosenthal2024proteostasis"/>
+    <w:bookmarkEnd w:id="250"/>
+    <w:bookmarkStart w:id="252" w:name="ref-rosenthal2024proteostasis"/>
     <w:p>
       <w:pPr>
         <w:pStyle w:val="Bibliography"/>
@@ -19202,7 +19337,7 @@
       <w:r>
         <w:t xml:space="preserve"> </w:t>
       </w:r>
-      <w:hyperlink r:id="rId249">
+      <w:hyperlink r:id="rId251">
         <w:r>
           <w:rPr>
             <w:rStyle w:val="Hyperlink"/>
@@ -19214,8 +19349,8 @@
         <w:t xml:space="preserve">.</w:t>
       </w:r>
     </w:p>
-    <w:bookmarkEnd w:id="250"/>
-    <w:bookmarkStart w:id="252" w:name="ref-rostkowska2016silicon"/>
+    <w:bookmarkEnd w:id="252"/>
+    <w:bookmarkStart w:id="254" w:name="ref-rostkowska2016silicon"/>
     <w:p>
       <w:pPr>
         <w:pStyle w:val="Bibliography"/>
@@ -19273,7 +19408,7 @@
       <w:r>
         <w:t xml:space="preserve"> </w:t>
       </w:r>
-      <w:hyperlink r:id="rId251">
+      <w:hyperlink r:id="rId253">
         <w:r>
           <w:rPr>
             <w:rStyle w:val="Hyperlink"/>
@@ -19285,8 +19420,8 @@
         <w:t xml:space="preserve">.</w:t>
       </w:r>
     </w:p>
-    <w:bookmarkEnd w:id="252"/>
-    <w:bookmarkStart w:id="254" w:name="ref-annua2016monoterpenes"/>
+    <w:bookmarkEnd w:id="254"/>
+    <w:bookmarkStart w:id="256" w:name="ref-annua2016monoterpenes"/>
     <w:p>
       <w:pPr>
         <w:pStyle w:val="Bibliography"/>
@@ -19320,7 +19455,7 @@
       <w:r>
         <w:t xml:space="preserve"> </w:t>
       </w:r>
-      <w:hyperlink r:id="rId253">
+      <w:hyperlink r:id="rId255">
         <w:r>
           <w:rPr>
             <w:rStyle w:val="Hyperlink"/>
@@ -19332,8 +19467,8 @@
         <w:t xml:space="preserve">.</w:t>
       </w:r>
     </w:p>
-    <w:bookmarkEnd w:id="254"/>
-    <w:bookmarkStart w:id="256" w:name="ref-said2016vcd"/>
+    <w:bookmarkEnd w:id="256"/>
+    <w:bookmarkStart w:id="258" w:name="ref-said2016vcd"/>
     <w:p>
       <w:pPr>
         <w:pStyle w:val="Bibliography"/>
@@ -19379,7 +19514,7 @@
       <w:r>
         <w:t xml:space="preserve"> </w:t>
       </w:r>
-      <w:hyperlink r:id="rId255">
+      <w:hyperlink r:id="rId257">
         <w:r>
           <w:rPr>
             <w:rStyle w:val="Hyperlink"/>
@@ -19391,8 +19526,8 @@
         <w:t xml:space="preserve">.</w:t>
       </w:r>
     </w:p>
-    <w:bookmarkEnd w:id="256"/>
-    <w:bookmarkStart w:id="258" w:name="ref-sanei2023nanoliposomes"/>
+    <w:bookmarkEnd w:id="258"/>
+    <w:bookmarkStart w:id="260" w:name="ref-sanei2023nanoliposomes"/>
     <w:p>
       <w:pPr>
         <w:pStyle w:val="Bibliography"/>
@@ -19459,7 +19594,7 @@
       <w:r>
         <w:t xml:space="preserve"> </w:t>
       </w:r>
-      <w:hyperlink r:id="rId257">
+      <w:hyperlink r:id="rId259">
         <w:r>
           <w:rPr>
             <w:rStyle w:val="Hyperlink"/>
@@ -19471,8 +19606,8 @@
         <w:t xml:space="preserve">.</w:t>
       </w:r>
     </w:p>
-    <w:bookmarkEnd w:id="258"/>
-    <w:bookmarkStart w:id="260" w:name="ref-schramek2010isotope"/>
+    <w:bookmarkEnd w:id="260"/>
+    <w:bookmarkStart w:id="262" w:name="ref-schramek2010isotope"/>
     <w:p>
       <w:pPr>
         <w:pStyle w:val="Bibliography"/>
@@ -19506,7 +19641,7 @@
       <w:r>
         <w:t xml:space="preserve"> </w:t>
       </w:r>
-      <w:hyperlink r:id="rId259">
+      <w:hyperlink r:id="rId261">
         <w:r>
           <w:rPr>
             <w:rStyle w:val="Hyperlink"/>
@@ -19518,8 +19653,8 @@
         <w:t xml:space="preserve">.</w:t>
       </w:r>
     </w:p>
-    <w:bookmarkEnd w:id="260"/>
-    <w:bookmarkStart w:id="262" w:name="ref-seddiek2011herbaalba"/>
+    <w:bookmarkEnd w:id="262"/>
+    <w:bookmarkStart w:id="264" w:name="ref-seddiek2011herbaalba"/>
     <w:p>
       <w:pPr>
         <w:pStyle w:val="Bibliography"/>
@@ -19577,7 +19712,7 @@
       <w:r>
         <w:t xml:space="preserve"> </w:t>
       </w:r>
-      <w:hyperlink r:id="rId261">
+      <w:hyperlink r:id="rId263">
         <w:r>
           <w:rPr>
             <w:rStyle w:val="Hyperlink"/>
@@ -19589,8 +19724,8 @@
         <w:t xml:space="preserve">.</w:t>
       </w:r>
     </w:p>
-    <w:bookmarkEnd w:id="262"/>
-    <w:bookmarkStart w:id="264" w:name="ref-shen2012cypcpr"/>
+    <w:bookmarkEnd w:id="264"/>
+    <w:bookmarkStart w:id="266" w:name="ref-shen2012cypcpr"/>
     <w:p>
       <w:pPr>
         <w:pStyle w:val="Bibliography"/>
@@ -19648,7 +19783,7 @@
       <w:r>
         <w:t xml:space="preserve"> </w:t>
       </w:r>
-      <w:hyperlink r:id="rId263">
+      <w:hyperlink r:id="rId265">
         <w:r>
           <w:rPr>
             <w:rStyle w:val="Hyperlink"/>
@@ -19660,8 +19795,8 @@
         <w:t xml:space="preserve">.</w:t>
       </w:r>
     </w:p>
-    <w:bookmarkEnd w:id="264"/>
-    <w:bookmarkStart w:id="266" w:name="ref-shi2022annuaantimalarialmetabolomics"/>
+    <w:bookmarkEnd w:id="266"/>
+    <w:bookmarkStart w:id="268" w:name="ref-shi2022annuaantimalarialmetabolomics"/>
     <w:p>
       <w:pPr>
         <w:pStyle w:val="Bibliography"/>
@@ -19707,7 +19842,7 @@
       <w:r>
         <w:t xml:space="preserve"> </w:t>
       </w:r>
-      <w:hyperlink r:id="rId265">
+      <w:hyperlink r:id="rId267">
         <w:r>
           <w:rPr>
             <w:rStyle w:val="Hyperlink"/>
@@ -19719,8 +19854,8 @@
         <w:t xml:space="preserve">.</w:t>
       </w:r>
     </w:p>
-    <w:bookmarkEnd w:id="266"/>
-    <w:bookmarkStart w:id="268" w:name="ref-shi2018mixta1"/>
+    <w:bookmarkEnd w:id="268"/>
+    <w:bookmarkStart w:id="270" w:name="ref-shi2018mixta1"/>
     <w:p>
       <w:pPr>
         <w:pStyle w:val="Bibliography"/>
@@ -19775,7 +19910,7 @@
       <w:r>
         <w:t xml:space="preserve"> </w:t>
       </w:r>
-      <w:hyperlink r:id="rId267">
+      <w:hyperlink r:id="rId269">
         <w:r>
           <w:rPr>
             <w:rStyle w:val="Hyperlink"/>
@@ -19787,8 +19922,8 @@
         <w:t xml:space="preserve">.</w:t>
       </w:r>
     </w:p>
-    <w:bookmarkEnd w:id="268"/>
-    <w:bookmarkStart w:id="270" w:name="ref-dasilva2017annuasheep"/>
+    <w:bookmarkEnd w:id="270"/>
+    <w:bookmarkStart w:id="272" w:name="ref-dasilva2017annuasheep"/>
     <w:p>
       <w:pPr>
         <w:pStyle w:val="Bibliography"/>
@@ -19834,7 +19969,7 @@
       <w:r>
         <w:t xml:space="preserve"> </w:t>
       </w:r>
-      <w:hyperlink r:id="rId269">
+      <w:hyperlink r:id="rId271">
         <w:r>
           <w:rPr>
             <w:rStyle w:val="Hyperlink"/>
@@ -19846,8 +19981,8 @@
         <w:t xml:space="preserve">.</w:t>
       </w:r>
     </w:p>
-    <w:bookmarkEnd w:id="270"/>
-    <w:bookmarkStart w:id="272" w:name="ref-snider2021gametocytes"/>
+    <w:bookmarkEnd w:id="272"/>
+    <w:bookmarkStart w:id="274" w:name="ref-snider2021gametocytes"/>
     <w:p>
       <w:pPr>
         <w:pStyle w:val="Bibliography"/>
@@ -19905,7 +20040,7 @@
       <w:r>
         <w:t xml:space="preserve"> </w:t>
       </w:r>
-      <w:hyperlink r:id="rId271">
+      <w:hyperlink r:id="rId273">
         <w:r>
           <w:rPr>
             <w:rStyle w:val="Hyperlink"/>
@@ -19917,8 +20052,8 @@
         <w:t xml:space="preserve">.</w:t>
       </w:r>
     </w:p>
-    <w:bookmarkEnd w:id="272"/>
-    <w:bookmarkStart w:id="274" w:name="ref-soleimanifard2023kermanensis"/>
+    <w:bookmarkEnd w:id="274"/>
+    <w:bookmarkStart w:id="276" w:name="ref-soleimanifard2023kermanensis"/>
     <w:p>
       <w:pPr>
         <w:pStyle w:val="Bibliography"/>
@@ -19964,7 +20099,7 @@
       <w:r>
         <w:t xml:space="preserve"> </w:t>
       </w:r>
-      <w:hyperlink r:id="rId273">
+      <w:hyperlink r:id="rId275">
         <w:r>
           <w:rPr>
             <w:rStyle w:val="Hyperlink"/>
@@ -19976,8 +20111,8 @@
         <w:t xml:space="preserve">.</w:t>
       </w:r>
     </w:p>
-    <w:bookmarkEnd w:id="274"/>
-    <w:bookmarkStart w:id="276" w:name="ref-squires2011haemonchus"/>
+    <w:bookmarkEnd w:id="276"/>
+    <w:bookmarkStart w:id="278" w:name="ref-squires2011haemonchus"/>
     <w:p>
       <w:pPr>
         <w:pStyle w:val="Bibliography"/>
@@ -20011,7 +20146,7 @@
       <w:r>
         <w:t xml:space="preserve"> </w:t>
       </w:r>
-      <w:hyperlink r:id="rId275">
+      <w:hyperlink r:id="rId277">
         <w:r>
           <w:rPr>
             <w:rStyle w:val="Hyperlink"/>
@@ -20023,8 +20158,8 @@
         <w:t xml:space="preserve">.</w:t>
       </w:r>
     </w:p>
-    <w:bookmarkEnd w:id="276"/>
-    <w:bookmarkStart w:id="278" w:name="ref-tabari2017sieberi"/>
+    <w:bookmarkEnd w:id="278"/>
+    <w:bookmarkStart w:id="280" w:name="ref-tabari2017sieberi"/>
     <w:p>
       <w:pPr>
         <w:pStyle w:val="Bibliography"/>
@@ -20058,7 +20193,7 @@
       <w:r>
         <w:t xml:space="preserve"> </w:t>
       </w:r>
-      <w:hyperlink r:id="rId277">
+      <w:hyperlink r:id="rId279">
         <w:r>
           <w:rPr>
             <w:rStyle w:val="Hyperlink"/>
@@ -20070,8 +20205,8 @@
         <w:t xml:space="preserve">.</w:t>
       </w:r>
     </w:p>
-    <w:bookmarkEnd w:id="278"/>
-    <w:bookmarkStart w:id="280" w:name="ref-tamargo2017nanocochleate"/>
+    <w:bookmarkEnd w:id="280"/>
+    <w:bookmarkStart w:id="282" w:name="ref-tamargo2017nanocochleate"/>
     <w:p>
       <w:pPr>
         <w:pStyle w:val="Bibliography"/>
@@ -20105,7 +20240,7 @@
       <w:r>
         <w:t xml:space="preserve"> </w:t>
       </w:r>
-      <w:hyperlink r:id="rId279">
+      <w:hyperlink r:id="rId281">
         <w:r>
           <w:rPr>
             <w:rStyle w:val="Hyperlink"/>
@@ -20117,8 +20252,8 @@
         <w:t xml:space="preserve">.</w:t>
       </w:r>
     </w:p>
-    <w:bookmarkEnd w:id="280"/>
-    <w:bookmarkStart w:id="282" w:name="ref-tangnitipong2012heme"/>
+    <w:bookmarkEnd w:id="282"/>
+    <w:bookmarkStart w:id="284" w:name="ref-tangnitipong2012heme"/>
     <w:p>
       <w:pPr>
         <w:pStyle w:val="Bibliography"/>
@@ -20152,7 +20287,7 @@
       <w:r>
         <w:t xml:space="preserve"> </w:t>
       </w:r>
-      <w:hyperlink r:id="rId281">
+      <w:hyperlink r:id="rId283">
         <w:r>
           <w:rPr>
             <w:rStyle w:val="Hyperlink"/>
@@ -20164,8 +20299,8 @@
         <w:t xml:space="preserve">.</w:t>
       </w:r>
     </w:p>
-    <w:bookmarkEnd w:id="282"/>
-    <w:bookmarkStart w:id="284" w:name="ref-tariku2011absinthium"/>
+    <w:bookmarkEnd w:id="284"/>
+    <w:bookmarkStart w:id="286" w:name="ref-tariku2011absinthium"/>
     <w:p>
       <w:pPr>
         <w:pStyle w:val="Bibliography"/>
@@ -20199,7 +20334,7 @@
       <w:r>
         <w:t xml:space="preserve"> </w:t>
       </w:r>
-      <w:hyperlink r:id="rId283">
+      <w:hyperlink r:id="rId285">
         <w:r>
           <w:rPr>
             <w:rStyle w:val="Hyperlink"/>
@@ -20211,8 +20346,8 @@
         <w:t xml:space="preserve">.</w:t>
       </w:r>
     </w:p>
-    <w:bookmarkEnd w:id="284"/>
-    <w:bookmarkStart w:id="286" w:name="ref-tariq2009absinthium"/>
+    <w:bookmarkEnd w:id="286"/>
+    <w:bookmarkStart w:id="288" w:name="ref-tariq2009absinthium"/>
     <w:p>
       <w:pPr>
         <w:pStyle w:val="Bibliography"/>
@@ -20246,7 +20381,7 @@
       <w:r>
         <w:t xml:space="preserve"> </w:t>
       </w:r>
-      <w:hyperlink r:id="rId285">
+      <w:hyperlink r:id="rId287">
         <w:r>
           <w:rPr>
             <w:rStyle w:val="Hyperlink"/>
@@ -20258,8 +20393,8 @@
         <w:t xml:space="preserve">.</w:t>
       </w:r>
     </w:p>
-    <w:bookmarkEnd w:id="286"/>
-    <w:bookmarkStart w:id="288" w:name="ref-tasdemir2015antiprotozoal"/>
+    <w:bookmarkEnd w:id="288"/>
+    <w:bookmarkStart w:id="290" w:name="ref-tasdemir2015antiprotozoal"/>
     <w:p>
       <w:pPr>
         <w:pStyle w:val="Bibliography"/>
@@ -20293,7 +20428,7 @@
       <w:r>
         <w:t xml:space="preserve"> </w:t>
       </w:r>
-      <w:hyperlink r:id="rId287">
+      <w:hyperlink r:id="rId289">
         <w:r>
           <w:rPr>
             <w:rStyle w:val="Hyperlink"/>
@@ -20305,8 +20440,8 @@
         <w:t xml:space="preserve">.</w:t>
       </w:r>
     </w:p>
-    <w:bookmarkEnd w:id="288"/>
-    <w:bookmarkStart w:id="290" w:name="ref-teoh2006cyp"/>
+    <w:bookmarkEnd w:id="290"/>
+    <w:bookmarkStart w:id="292" w:name="ref-teoh2006cyp"/>
     <w:p>
       <w:pPr>
         <w:pStyle w:val="Bibliography"/>
@@ -20340,7 +20475,7 @@
       <w:r>
         <w:t xml:space="preserve"> </w:t>
       </w:r>
-      <w:hyperlink r:id="rId289">
+      <w:hyperlink r:id="rId291">
         <w:r>
           <w:rPr>
             <w:rStyle w:val="Hyperlink"/>
@@ -20352,8 +20487,8 @@
         <w:t xml:space="preserve">.</w:t>
       </w:r>
     </w:p>
-    <w:bookmarkEnd w:id="290"/>
-    <w:bookmarkStart w:id="292" w:name="ref-thofner2012histomonas"/>
+    <w:bookmarkEnd w:id="292"/>
+    <w:bookmarkStart w:id="294" w:name="ref-thofner2012histomonas"/>
     <w:p>
       <w:pPr>
         <w:pStyle w:val="Bibliography"/>
@@ -20399,7 +20534,7 @@
       <w:r>
         <w:t xml:space="preserve"> </w:t>
       </w:r>
-      <w:hyperlink r:id="rId291">
+      <w:hyperlink r:id="rId293">
         <w:r>
           <w:rPr>
             <w:rStyle w:val="Hyperlink"/>
@@ -20411,8 +20546,8 @@
         <w:t xml:space="preserve">.</w:t>
       </w:r>
     </w:p>
-    <w:bookmarkEnd w:id="292"/>
-    <w:bookmarkStart w:id="294" w:name="ref-trendafilova2021edibleartemisia"/>
+    <w:bookmarkEnd w:id="294"/>
+    <w:bookmarkStart w:id="296" w:name="ref-trendafilova2021edibleartemisia"/>
     <w:p>
       <w:pPr>
         <w:pStyle w:val="Bibliography"/>
@@ -20446,7 +20581,7 @@
       <w:r>
         <w:t xml:space="preserve"> </w:t>
       </w:r>
-      <w:hyperlink r:id="rId293">
+      <w:hyperlink r:id="rId295">
         <w:r>
           <w:rPr>
             <w:rStyle w:val="Hyperlink"/>
@@ -20458,8 +20593,8 @@
         <w:t xml:space="preserve">.</w:t>
       </w:r>
     </w:p>
-    <w:bookmarkEnd w:id="294"/>
-    <w:bookmarkStart w:id="296" w:name="ref-umaraliev2025persicabisabolanes"/>
+    <w:bookmarkEnd w:id="296"/>
+    <w:bookmarkStart w:id="298" w:name="ref-umaraliev2025persicabisabolanes"/>
     <w:p>
       <w:pPr>
         <w:pStyle w:val="Bibliography"/>
@@ -20499,7 +20634,7 @@
       <w:r>
         <w:t xml:space="preserve"> </w:t>
       </w:r>
-      <w:hyperlink r:id="rId295">
+      <w:hyperlink r:id="rId297">
         <w:r>
           <w:rPr>
             <w:rStyle w:val="Hyperlink"/>
@@ -20511,8 +20646,8 @@
         <w:t xml:space="preserve">.</w:t>
       </w:r>
     </w:p>
-    <w:bookmarkEnd w:id="296"/>
-    <w:bookmarkStart w:id="298" w:name="ref-umaraliev2026persicamonoterpenes"/>
+    <w:bookmarkEnd w:id="298"/>
+    <w:bookmarkStart w:id="300" w:name="ref-umaraliev2026persicamonoterpenes"/>
     <w:p>
       <w:pPr>
         <w:pStyle w:val="Bibliography"/>
@@ -20552,7 +20687,7 @@
       <w:r>
         <w:t xml:space="preserve"> </w:t>
       </w:r>
-      <w:hyperlink r:id="rId297">
+      <w:hyperlink r:id="rId299">
         <w:r>
           <w:rPr>
             <w:rStyle w:val="Hyperlink"/>
@@ -20564,8 +20699,8 @@
         <w:t xml:space="preserve">.</w:t>
       </w:r>
     </w:p>
-    <w:bookmarkEnd w:id="298"/>
-    <w:bookmarkStart w:id="300" w:name="ref-urban2020trpc3"/>
+    <w:bookmarkEnd w:id="300"/>
+    <w:bookmarkStart w:id="302" w:name="ref-urban2020trpc3"/>
     <w:p>
       <w:pPr>
         <w:pStyle w:val="Bibliography"/>
@@ -20611,7 +20746,7 @@
       <w:r>
         <w:t xml:space="preserve"> </w:t>
       </w:r>
-      <w:hyperlink r:id="rId299">
+      <w:hyperlink r:id="rId301">
         <w:r>
           <w:rPr>
             <w:rStyle w:val="Hyperlink"/>
@@ -20623,8 +20758,8 @@
         <w:t xml:space="preserve">.</w:t>
       </w:r>
     </w:p>
-    <w:bookmarkEnd w:id="300"/>
-    <w:bookmarkStart w:id="302" w:name="ref-varadyova2018medicinalplants"/>
+    <w:bookmarkEnd w:id="302"/>
+    <w:bookmarkStart w:id="304" w:name="ref-varadyova2018medicinalplants"/>
     <w:p>
       <w:pPr>
         <w:pStyle w:val="Bibliography"/>
@@ -20667,7 +20802,7 @@
       <w:r>
         <w:t xml:space="preserve"> </w:t>
       </w:r>
-      <w:hyperlink r:id="rId301">
+      <w:hyperlink r:id="rId303">
         <w:r>
           <w:rPr>
             <w:rStyle w:val="Hyperlink"/>
@@ -20679,8 +20814,8 @@
         <w:t xml:space="preserve">.</w:t>
       </w:r>
     </w:p>
-    <w:bookmarkEnd w:id="302"/>
-    <w:bookmarkStart w:id="304" w:name="ref-walz2024aframalaria"/>
+    <w:bookmarkEnd w:id="304"/>
+    <w:bookmarkStart w:id="306" w:name="ref-walz2024aframalaria"/>
     <w:p>
       <w:pPr>
         <w:pStyle w:val="Bibliography"/>
@@ -20726,7 +20861,7 @@
       <w:r>
         <w:t xml:space="preserve"> </w:t>
       </w:r>
-      <w:hyperlink r:id="rId303">
+      <w:hyperlink r:id="rId305">
         <w:r>
           <w:rPr>
             <w:rStyle w:val="Hyperlink"/>
@@ -20738,8 +20873,8 @@
         <w:t xml:space="preserve">.</w:t>
       </w:r>
     </w:p>
-    <w:bookmarkEnd w:id="304"/>
-    <w:bookmarkStart w:id="306" w:name="ref-wang2013cyp71av1promoter"/>
+    <w:bookmarkEnd w:id="306"/>
+    <w:bookmarkStart w:id="308" w:name="ref-wang2013cyp71av1promoter"/>
     <w:p>
       <w:pPr>
         <w:pStyle w:val="Bibliography"/>
@@ -20773,7 +20908,7 @@
       <w:r>
         <w:t xml:space="preserve"> </w:t>
       </w:r>
-      <w:hyperlink r:id="rId305">
+      <w:hyperlink r:id="rId307">
         <w:r>
           <w:rPr>
             <w:rStyle w:val="Hyperlink"/>
@@ -20785,8 +20920,8 @@
         <w:t xml:space="preserve">.</w:t>
       </w:r>
     </w:p>
-    <w:bookmarkEnd w:id="306"/>
-    <w:bookmarkStart w:id="308" w:name="ref-wang2009trichometranscriptome"/>
+    <w:bookmarkEnd w:id="308"/>
+    <w:bookmarkStart w:id="310" w:name="ref-wang2009trichometranscriptome"/>
     <w:p>
       <w:pPr>
         <w:pStyle w:val="Bibliography"/>
@@ -20820,7 +20955,7 @@
       <w:r>
         <w:t xml:space="preserve"> </w:t>
       </w:r>
-      <w:hyperlink r:id="rId307">
+      <w:hyperlink r:id="rId309">
         <w:r>
           <w:rPr>
             <w:rStyle w:val="Hyperlink"/>
@@ -20832,8 +20967,8 @@
         <w:t xml:space="preserve">.</w:t>
       </w:r>
     </w:p>
-    <w:bookmarkEnd w:id="308"/>
-    <w:bookmarkStart w:id="310" w:name="ref-wani2023nitric"/>
+    <w:bookmarkEnd w:id="310"/>
+    <w:bookmarkStart w:id="312" w:name="ref-wani2023nitric"/>
     <w:p>
       <w:pPr>
         <w:pStyle w:val="Bibliography"/>
@@ -20891,7 +21026,7 @@
       <w:r>
         <w:t xml:space="preserve"> </w:t>
       </w:r>
-      <w:hyperlink r:id="rId309">
+      <w:hyperlink r:id="rId311">
         <w:r>
           <w:rPr>
             <w:rStyle w:val="Hyperlink"/>
@@ -20903,8 +21038,8 @@
         <w:t xml:space="preserve">.</w:t>
       </w:r>
     </w:p>
-    <w:bookmarkEnd w:id="310"/>
-    <w:bookmarkStart w:id="312" w:name="ref-wani2026maritima"/>
+    <w:bookmarkEnd w:id="312"/>
+    <w:bookmarkStart w:id="314" w:name="ref-wani2026maritima"/>
     <w:p>
       <w:pPr>
         <w:pStyle w:val="Bibliography"/>
@@ -20950,7 +21085,7 @@
       <w:r>
         <w:t xml:space="preserve"> </w:t>
       </w:r>
-      <w:hyperlink r:id="rId311">
+      <w:hyperlink r:id="rId313">
         <w:r>
           <w:rPr>
             <w:rStyle w:val="Hyperlink"/>
@@ -20962,8 +21097,8 @@
         <w:t xml:space="preserve">.</w:t>
       </w:r>
     </w:p>
-    <w:bookmarkEnd w:id="312"/>
-    <w:bookmarkStart w:id="314" w:name="ref-wetmore2019psiv9"/>
+    <w:bookmarkEnd w:id="314"/>
+    <w:bookmarkStart w:id="316" w:name="ref-wetmore2019psiv9"/>
     <w:p>
       <w:pPr>
         <w:pStyle w:val="Bibliography"/>
@@ -21009,7 +21144,7 @@
       <w:r>
         <w:t xml:space="preserve"> </w:t>
       </w:r>
-      <w:hyperlink r:id="rId313">
+      <w:hyperlink r:id="rId315">
         <w:r>
           <w:rPr>
             <w:rStyle w:val="Hyperlink"/>
@@ -21021,8 +21156,8 @@
         <w:t xml:space="preserve">.</w:t>
       </w:r>
     </w:p>
-    <w:bookmarkEnd w:id="314"/>
-    <w:bookmarkStart w:id="316" w:name="ref-wiedosari2017eimeria"/>
+    <w:bookmarkEnd w:id="316"/>
+    <w:bookmarkStart w:id="318" w:name="ref-wiedosari2017eimeria"/>
     <w:p>
       <w:pPr>
         <w:pStyle w:val="Bibliography"/>
@@ -21077,7 +21212,7 @@
       <w:r>
         <w:t xml:space="preserve"> </w:t>
       </w:r>
-      <w:hyperlink r:id="rId315">
+      <w:hyperlink r:id="rId317">
         <w:r>
           <w:rPr>
             <w:rStyle w:val="Hyperlink"/>
@@ -21089,8 +21224,8 @@
         <w:t xml:space="preserve">.</w:t>
       </w:r>
     </w:p>
-    <w:bookmarkEnd w:id="316"/>
-    <w:bookmarkStart w:id="318" w:name="ref-wright2010qinghao"/>
+    <w:bookmarkEnd w:id="318"/>
+    <w:bookmarkStart w:id="320" w:name="ref-wright2010qinghao"/>
     <w:p>
       <w:pPr>
         <w:pStyle w:val="Bibliography"/>
@@ -21136,7 +21271,7 @@
       <w:r>
         <w:t xml:space="preserve"> </w:t>
       </w:r>
-      <w:hyperlink r:id="rId317">
+      <w:hyperlink r:id="rId319">
         <w:r>
           <w:rPr>
             <w:rStyle w:val="Hyperlink"/>
@@ -21148,8 +21283,8 @@
         <w:t xml:space="preserve">.</w:t>
       </w:r>
     </w:p>
-    <w:bookmarkEnd w:id="318"/>
-    <w:bookmarkStart w:id="320" w:name="ref-xiang2019bhlh112"/>
+    <w:bookmarkEnd w:id="320"/>
+    <w:bookmarkStart w:id="322" w:name="ref-xiang2019bhlh112"/>
     <w:p>
       <w:pPr>
         <w:pStyle w:val="Bibliography"/>
@@ -21183,7 +21318,7 @@
       <w:r>
         <w:t xml:space="preserve"> </w:t>
       </w:r>
-      <w:hyperlink r:id="rId319">
+      <w:hyperlink r:id="rId321">
         <w:r>
           <w:rPr>
             <w:rStyle w:val="Hyperlink"/>
@@ -21195,8 +21330,8 @@
         <w:t xml:space="preserve">.</w:t>
       </w:r>
     </w:p>
-    <w:bookmarkEnd w:id="320"/>
-    <w:bookmarkStart w:id="322" w:name="ref-xu2025plantmatrix"/>
+    <w:bookmarkEnd w:id="322"/>
+    <w:bookmarkStart w:id="324" w:name="ref-xu2025plantmatrix"/>
     <w:p>
       <w:pPr>
         <w:pStyle w:val="Bibliography"/>
@@ -21242,7 +21377,7 @@
       <w:r>
         <w:t xml:space="preserve"> </w:t>
       </w:r>
-      <w:hyperlink r:id="rId321">
+      <w:hyperlink r:id="rId323">
         <w:r>
           <w:rPr>
             <w:rStyle w:val="Hyperlink"/>
@@ -21254,8 +21389,8 @@
         <w:t xml:space="preserve">.</w:t>
       </w:r>
     </w:p>
-    <w:bookmarkEnd w:id="322"/>
-    <w:bookmarkStart w:id="324" w:name="ref-xu2026artemisininpk"/>
+    <w:bookmarkEnd w:id="324"/>
+    <w:bookmarkStart w:id="326" w:name="ref-xu2026artemisininpk"/>
     <w:p>
       <w:pPr>
         <w:pStyle w:val="Bibliography"/>
@@ -21301,7 +21436,7 @@
       <w:r>
         <w:t xml:space="preserve"> </w:t>
       </w:r>
-      <w:hyperlink r:id="rId323">
+      <w:hyperlink r:id="rId325">
         <w:r>
           <w:rPr>
             <w:rStyle w:val="Hyperlink"/>
@@ -21313,8 +21448,8 @@
         <w:t xml:space="preserve">.</w:t>
       </w:r>
     </w:p>
-    <w:bookmarkEnd w:id="324"/>
-    <w:bookmarkStart w:id="326" w:name="ref-yildiz2011toxocara"/>
+    <w:bookmarkEnd w:id="326"/>
+    <w:bookmarkStart w:id="328" w:name="ref-yildiz2011toxocara"/>
     <w:p>
       <w:pPr>
         <w:pStyle w:val="Bibliography"/>
@@ -21372,7 +21507,7 @@
       <w:r>
         <w:t xml:space="preserve"> </w:t>
       </w:r>
-      <w:hyperlink r:id="rId325">
+      <w:hyperlink r:id="rId327">
         <w:r>
           <w:rPr>
             <w:rStyle w:val="Hyperlink"/>
@@ -21384,8 +21519,8 @@
         <w:t xml:space="preserve">.</w:t>
       </w:r>
     </w:p>
-    <w:bookmarkEnd w:id="326"/>
-    <w:bookmarkStart w:id="328" w:name="ref-zehra2020copper"/>
+    <w:bookmarkEnd w:id="328"/>
+    <w:bookmarkStart w:id="330" w:name="ref-zehra2020copper"/>
     <w:p>
       <w:pPr>
         <w:pStyle w:val="Bibliography"/>
@@ -21431,7 +21566,7 @@
       <w:r>
         <w:t xml:space="preserve"> </w:t>
       </w:r>
-      <w:hyperlink r:id="rId327">
+      <w:hyperlink r:id="rId329">
         <w:r>
           <w:rPr>
             <w:rStyle w:val="Hyperlink"/>
@@ -21443,8 +21578,8 @@
         <w:t xml:space="preserve">.</w:t>
       </w:r>
     </w:p>
-    <w:bookmarkEnd w:id="328"/>
-    <w:bookmarkStart w:id="330" w:name="ref-zhang2022fiveartemisia"/>
+    <w:bookmarkEnd w:id="330"/>
+    <w:bookmarkStart w:id="332" w:name="ref-zhang2022fiveartemisia"/>
     <w:p>
       <w:pPr>
         <w:pStyle w:val="Bibliography"/>
@@ -21490,7 +21625,7 @@
       <w:r>
         <w:t xml:space="preserve"> </w:t>
       </w:r>
-      <w:hyperlink r:id="rId329">
+      <w:hyperlink r:id="rId331">
         <w:r>
           <w:rPr>
             <w:rStyle w:val="Hyperlink"/>
@@ -21502,8 +21637,8 @@
         <w:t xml:space="preserve">.</w:t>
       </w:r>
     </w:p>
-    <w:bookmarkEnd w:id="330"/>
-    <w:bookmarkStart w:id="332" w:name="ref-zhang2026annuaenhancement"/>
+    <w:bookmarkEnd w:id="332"/>
+    <w:bookmarkStart w:id="334" w:name="ref-zhang2026annuaenhancement"/>
     <w:p>
       <w:pPr>
         <w:pStyle w:val="Bibliography"/>
@@ -21549,7 +21684,7 @@
       <w:r>
         <w:t xml:space="preserve"> </w:t>
       </w:r>
-      <w:hyperlink r:id="rId331">
+      <w:hyperlink r:id="rId333">
         <w:r>
           <w:rPr>
             <w:rStyle w:val="Hyperlink"/>
@@ -21561,8 +21696,8 @@
         <w:t xml:space="preserve">.</w:t>
       </w:r>
     </w:p>
-    <w:bookmarkEnd w:id="332"/>
-    <w:bookmarkStart w:id="334" w:name="ref-zhang2020argyitriterpenoids"/>
+    <w:bookmarkEnd w:id="334"/>
+    <w:bookmarkStart w:id="336" w:name="ref-zhang2020argyitriterpenoids"/>
     <w:p>
       <w:pPr>
         <w:pStyle w:val="Bibliography"/>
@@ -21605,7 +21740,7 @@
       <w:r>
         <w:t xml:space="preserve"> </w:t>
       </w:r>
-      <w:hyperlink r:id="rId333">
+      <w:hyperlink r:id="rId335">
         <w:r>
           <w:rPr>
             <w:rStyle w:val="Hyperlink"/>
@@ -21617,8 +21752,8 @@
         <w:t xml:space="preserve">.</w:t>
       </w:r>
     </w:p>
-    <w:bookmarkEnd w:id="334"/>
-    <w:bookmarkStart w:id="336" w:name="ref-zhang2019pp2c1"/>
+    <w:bookmarkEnd w:id="336"/>
+    <w:bookmarkStart w:id="338" w:name="ref-zhang2019pp2c1"/>
     <w:p>
       <w:pPr>
         <w:pStyle w:val="Bibliography"/>
@@ -21670,7 +21805,7 @@
       <w:r>
         <w:t xml:space="preserve"> </w:t>
       </w:r>
-      <w:hyperlink r:id="rId335">
+      <w:hyperlink r:id="rId337">
         <w:r>
           <w:rPr>
             <w:rStyle w:val="Hyperlink"/>
@@ -21682,8 +21817,8 @@
         <w:t xml:space="preserve">.</w:t>
       </w:r>
     </w:p>
-    <w:bookmarkEnd w:id="336"/>
-    <w:bookmarkStart w:id="338" w:name="ref-zhang2008dbr2"/>
+    <w:bookmarkEnd w:id="338"/>
+    <w:bookmarkStart w:id="340" w:name="ref-zhang2008dbr2"/>
     <w:p>
       <w:pPr>
         <w:pStyle w:val="Bibliography"/>
@@ -21717,7 +21852,7 @@
       <w:r>
         <w:t xml:space="preserve"> </w:t>
       </w:r>
-      <w:hyperlink r:id="rId337">
+      <w:hyperlink r:id="rId339">
         <w:r>
           <w:rPr>
             <w:rStyle w:val="Hyperlink"/>
@@ -21729,8 +21864,8 @@
         <w:t xml:space="preserve">.</w:t>
       </w:r>
     </w:p>
-    <w:bookmarkEnd w:id="338"/>
-    <w:bookmarkStart w:id="340" w:name="ref-frigida2023variability"/>
+    <w:bookmarkEnd w:id="340"/>
+    <w:bookmarkStart w:id="342" w:name="ref-frigida2023variability"/>
     <w:p>
       <w:pPr>
         <w:pStyle w:val="Bibliography"/>
@@ -21764,7 +21899,7 @@
       <w:r>
         <w:t xml:space="preserve"> </w:t>
       </w:r>
-      <w:hyperlink r:id="rId339">
+      <w:hyperlink r:id="rId341">
         <w:r>
           <w:rPr>
             <w:rStyle w:val="Hyperlink"/>
@@ -21776,9 +21911,9 @@
         <w:t xml:space="preserve">.</w:t>
       </w:r>
     </w:p>
-    <w:bookmarkEnd w:id="340"/>
-    <w:bookmarkEnd w:id="341"/>
     <w:bookmarkEnd w:id="342"/>
+    <w:bookmarkEnd w:id="343"/>
+    <w:bookmarkEnd w:id="344"/>
     <w:sectPr>
       <w:headerReference w:type="default" r:id="rId9"/>
       <w:footerReference w:type="default" r:id="rId10"/>

</xml_diff>

<commit_message>
Add open-access STL redox mechanism evidence
</commit_message>
<xml_diff>
--- a/manuscript/artemisia-terpene-review-submission.docx
+++ b/manuscript/artemisia-terpene-review-submission.docx
@@ -199,7 +199,7 @@
         <w:t xml:space="preserve"> </w:t>
       </w:r>
       <w:r>
-        <w:t xml:space="preserve">contains volatile monoterpenes and sesquiterpenes, less volatile diterpenes and triterpenes, and structurally diverse sesquiterpene lactones (STLs). These metabolites are often discussed as though a species name, a pathway gene, or an oil profile were sufficient to predict pharmacology. Here we present a source-auditable scoping review with a frozen snapshot that instead treats the specimen, accession, tissue, preparation, analytical method, parasite stage, and evidence level as the units of comparison. The Terpedia package registers 541 sources, 556 source-linked evidence records, 132 antiparasitic records, 19 parasite–protein interaction records, 179 compound/specimen records, and 410 audited article claims; 95 sources and 110 linked evidence rows have completed full-text verification, while 18 remain open. We synthesize terpene classes with biosynthetic compartmentalization, regulatory and environmental variation, and a bounded comparative-genomics analysis. Artemisinin biosynthesis in</w:t>
+        <w:t xml:space="preserve">contains volatile monoterpenes and sesquiterpenes, less volatile diterpenes and triterpenes, and structurally diverse sesquiterpene lactones (STLs). These metabolites are often discussed as though a species name, a pathway gene, or an oil profile were sufficient to predict pharmacology. Here we present a source-auditable scoping review with a frozen snapshot that instead treats the specimen, accession, tissue, preparation, analytical method, parasite stage, and evidence level as the units of comparison. The Terpedia package registers 542 sources, 557 source-linked evidence records, 133 antiparasitic records, 20 parasite–protein interaction records, 179 compound/specimen records, and 411 audited article claims; 96 sources and 111 linked evidence rows have completed full-text verification, while 18 remain open. We synthesize terpene classes with biosynthetic compartmentalization, regulatory and environmental variation, and a bounded comparative-genomics analysis. Artemisinin biosynthesis in</w:t>
       </w:r>
       <w:r>
         <w:t xml:space="preserve"> </w:t>
@@ -951,7 +951,7 @@
         <w:t xml:space="preserve"> </w:t>
       </w:r>
       <w:r>
-        <w:t xml:space="preserve">terms with terpene classes, analytical methods, biosynthesis, genomics, malaria, helminths, vectors, and safety terms. The frozen retrieval snapshot contains 4,765 unique PubMed records from seven query families, of which 1,387 were prioritized for title-level review and 1,323 had abstracts retrieved. A source-linked full-text eligibility queue covers 113 unique antiparasitic sources representing 132 evidence rows, prioritizing malaria and</w:t>
+        <w:t xml:space="preserve">terms with terpene classes, analytical methods, biosynthesis, genomics, malaria, helminths, vectors, and safety terms. The frozen retrieval snapshot contains 4,765 unique PubMed records from seven query families, of which 1,387 were prioritized for title-level review and 1,323 had abstracts retrieved. A source-linked full-text eligibility queue covers 114 unique antiparasitic sources representing 133 evidence rows, prioritizing malaria and</w:t>
       </w:r>
       <w:r>
         <w:t xml:space="preserve"> </w:t>
@@ -976,7 +976,7 @@
         <w:spacing w:before="0" w:after="120" w:line="264" w:lineRule="auto"/>
       </w:pPr>
       <w:r>
-        <w:t xml:space="preserve">The analysis is reported as a frozen scoping review rather than a completed systematic review. The retrieval snapshot contains 1,408 bounded title/abstract decisions, covering all 1,387 priority-queue records plus 21 historical or out-of-queue decisions. Full-text verification now covers 95 publicly accessible, associated-supplementary, or publisher-indexed antiparasitic sources and 110 linked evidence rows; 18 queue sources remain unverified, and no result is pooled as a final quantitative estimate. The</w:t>
+        <w:t xml:space="preserve">The analysis is reported as a frozen scoping review rather than a completed systematic review. The retrieval snapshot contains 1,408 bounded title/abstract decisions, covering all 1,387 priority-queue records plus 21 historical or out-of-queue decisions. Full-text verification now covers 96 publicly accessible, associated-supplementary, or publisher-indexed antiparasitic sources and 111 linked evidence rows; 18 queue sources remain unverified, and no result is pooled as a final quantitative estimate. The</w:t>
       </w:r>
       <w:r>
         <w:t xml:space="preserve"> </w:t>
@@ -1150,7 +1150,33 @@
         <w:t xml:space="preserve"> </w:t>
       </w:r>
       <w:r>
-        <w:t xml:space="preserve">sesquiterpene-lactone study retains publisher-indexed full-text resolution but unresolved quantitative eligibility, the associated</w:t>
+        <w:t xml:space="preserve">sesquiterpene-lactone study retains publisher-indexed full-text resolution but unresolved quantitative eligibility, the newly verified</w:t>
+      </w:r>
+      <w:r>
+        <w:t xml:space="preserve"> </w:t>
+      </w:r>
+      <w:r>
+        <w:rPr>
+          <w:i/>
+          <w:iCs/>
+        </w:rPr>
+        <w:t xml:space="preserve">A. douglassiana</w:t>
+      </w:r>
+      <w:r>
+        <w:t xml:space="preserve">-associated sesquiterpene-lactone/</w:t>
+      </w:r>
+      <w:r>
+        <w:rPr>
+          <w:i/>
+          <w:iCs/>
+        </w:rPr>
+        <w:t xml:space="preserve">L. mexicana</w:t>
+      </w:r>
+      <w:r>
+        <w:t xml:space="preserve"> </w:t>
+      </w:r>
+      <w:r>
+        <w:t xml:space="preserve">study supports a glutathione-sensitive parasite redox mechanism but remains promastigote-only and target-protein unresolved, the associated</w:t>
       </w:r>
       <w:r>
         <w:t xml:space="preserve"> </w:t>
@@ -4840,7 +4866,7 @@
         <w:spacing w:before="0" w:after="120" w:line="264" w:lineRule="auto"/>
       </w:pPr>
       <w:r>
-        <w:t xml:space="preserve">This separation prevents a common category error: treating a docking score as equivalent to target engagement, or treating an oil phenotype as evidence that one named constituent binds the proposed target. The 19-record interaction table is consequently a map of evidence gaps as much as a list of targets. For most non-artemisinin terpenes, the correct statement is that a preparation or purified compound has a phenotype and that target identity remains open.</w:t>
+        <w:t xml:space="preserve">This separation prevents a common category error: treating a docking score as equivalent to target engagement, or treating an oil phenotype as evidence that one named constituent binds the proposed target. The 20-record interaction table is consequently a map of evidence gaps as much as a list of targets. For most non-artemisinin terpenes, the correct statement is that a preparation or purified compound has a phenotype and that target identity remains open.</w:t>
       </w:r>
     </w:p>
     <w:p>
@@ -4864,7 +4890,7 @@
         <w:t xml:space="preserve"> </w:t>
       </w:r>
       <w:r>
-        <w:t xml:space="preserve">to all 132 antiparasitic records. Twenty-one records had defined or purified chemistry, 37 had a profiled mixture, and 74 retained crude or unresolved attribution; 88 reported direct in-vitro parasite/vector assays, 40 included an in-vivo or organismal endpoint, and four were indirect or surrogate records, including three hemozoin assays. Explicit host/selectivity controls were present in 14 records, partial controls in 59, and absent or unresolved in 59. Only three records reached the E4/E5 functional-target-class level through the linked interaction map; 24 were hypothesis/stage-mechanism level and 105 were phenotype-only or unresolved. The overall appraisal therefore yielded 28 B-level characterized phenotypes and 104 C-level phenotypes with unresolved attribution; no record met the deliberately strict A tier. This is a limitation of evidence resolution, not evidence that the preparations lack activity. Row-level judgments and their rule basis are archived in</w:t>
+        <w:t xml:space="preserve">to all 133 antiparasitic records. Twenty-two records had defined or purified chemistry, 37 had a profiled mixture, and 74 retained crude or unresolved attribution; 89 reported direct in-vitro parasite/vector assays, 40 included an in-vivo or organismal endpoint, and four were indirect or surrogate records, including three hemozoin assays. Explicit host/selectivity controls were present in 14 records, partial controls in 59, and absent or unresolved in 60. Only four records reached the E4/E5 functional-target-class level through the linked interaction map; 24 were hypothesis/stage-mechanism level and 105 were phenotype-only or unresolved. The overall appraisal therefore yielded 29 B-level characterized phenotypes and 104 C-level phenotypes with unresolved attribution; no record met the deliberately strict A tier. This is a limitation of evidence resolution, not evidence that the preparations lack activity. Row-level judgments and their rule basis are archived in</w:t>
       </w:r>
       <w:r>
         <w:t xml:space="preserve"> </w:t>

</xml_diff>

<commit_message>
Verify historical Artemisia malaria evidence
</commit_message>
<xml_diff>
--- a/manuscript/artemisia-terpene-review-submission.docx
+++ b/manuscript/artemisia-terpene-review-submission.docx
@@ -976,7 +976,7 @@
         <w:spacing w:before="0" w:after="120" w:line="264" w:lineRule="auto"/>
       </w:pPr>
       <w:r>
-        <w:t xml:space="preserve">The analysis is reported as a frozen scoping review rather than a completed systematic review. The retrieval snapshot contains 1,408 bounded title/abstract decisions, covering all 1,387 priority-queue records plus 21 historical or out-of-queue decisions. Full-text verification now covers 96 publicly accessible, associated-supplementary, or publisher-indexed antiparasitic sources and 111 linked evidence rows; 18 queue sources remain unverified, and no result is pooled as a final quantitative estimate. The</w:t>
+        <w:t xml:space="preserve">The analysis is reported as a frozen scoping review rather than a completed systematic review. The retrieval snapshot contains 1,408 bounded title/abstract decisions, covering all 1,387 priority-queue records plus 21 historical or out-of-queue decisions. Full-text verification now covers 97 publicly accessible, associated-supplementary, or publisher-indexed antiparasitic sources and 112 linked evidence rows; 17 queue sources remain unverified, and no result is pooled as a final quantitative estimate. The</w:t>
       </w:r>
       <w:r>
         <w:t xml:space="preserve"> </w:t>
@@ -1176,7 +1176,23 @@
         <w:t xml:space="preserve"> </w:t>
       </w:r>
       <w:r>
-        <w:t xml:space="preserve">study supports a glutathione-sensitive parasite redox mechanism but remains promastigote-only and target-protein unresolved, the associated</w:t>
+        <w:t xml:space="preserve">study supports a glutathione-sensitive parasite redox mechanism but remains promastigote-only and target-protein unresolved, the newly verified historical</w:t>
+      </w:r>
+      <w:r>
+        <w:t xml:space="preserve"> </w:t>
+      </w:r>
+      <w:r>
+        <w:rPr>
+          <w:i/>
+          <w:iCs/>
+        </w:rPr>
+        <w:t xml:space="preserve">A. annua</w:t>
+      </w:r>
+      <w:r>
+        <w:t xml:space="preserve"> </w:t>
+      </w:r>
+      <w:r>
+        <w:t xml:space="preserve">gelatin-capsule record retains abstract-level translated-content and chemical-standardization limitations, the associated</w:t>
       </w:r>
       <w:r>
         <w:t xml:space="preserve"> </w:t>

</xml_diff>

<commit_message>
Verify historical Artemisia malaria record
</commit_message>
<xml_diff>
--- a/manuscript/artemisia-terpene-review-submission.docx
+++ b/manuscript/artemisia-terpene-review-submission.docx
@@ -199,7 +199,7 @@
         <w:t xml:space="preserve"> </w:t>
       </w:r>
       <w:r>
-        <w:t xml:space="preserve">contains volatile monoterpenes and sesquiterpenes, less volatile diterpenes and triterpenes, and structurally diverse sesquiterpene lactones (STLs). These metabolites are often discussed as though a species name, a pathway gene, or an oil profile were sufficient to predict pharmacology. Here we present a source-auditable scoping review with a frozen snapshot that instead treats the specimen, accession, tissue, preparation, analytical method, parasite stage, and evidence level as the units of comparison. The Terpedia package registers 542 sources, 557 source-linked evidence records, 133 antiparasitic records, 20 parasite–protein interaction records, 179 compound/specimen records, and 411 audited article claims; 96 sources and 111 linked evidence rows have completed full-text verification, while 18 remain open. We synthesize terpene classes with biosynthetic compartmentalization, regulatory and environmental variation, and a bounded comparative-genomics analysis. Artemisinin biosynthesis in</w:t>
+        <w:t xml:space="preserve">contains volatile monoterpenes and sesquiterpenes, less volatile diterpenes and triterpenes, and structurally diverse sesquiterpene lactones (STLs). These metabolites are often discussed as though a species name, a pathway gene, or an oil profile were sufficient to predict pharmacology. Here we present a source-auditable scoping review with a frozen snapshot that instead treats the specimen, accession, tissue, preparation, analytical method, parasite stage, and evidence level as the units of comparison. The Terpedia package registers 542 sources, 557 source-linked evidence records, 133 antiparasitic records, 20 parasite–protein interaction records, 179 compound/specimen records, and 411 audited article claims; 98 sources and 113 linked evidence rows have completed full-text verification, while 16 remain open. We synthesize terpene classes with biosynthetic compartmentalization, regulatory and environmental variation, and a bounded comparative-genomics analysis. Artemisinin biosynthesis in</w:t>
       </w:r>
       <w:r>
         <w:t xml:space="preserve"> </w:t>
@@ -976,7 +976,7 @@
         <w:spacing w:before="0" w:after="120" w:line="264" w:lineRule="auto"/>
       </w:pPr>
       <w:r>
-        <w:t xml:space="preserve">The analysis is reported as a frozen scoping review rather than a completed systematic review. The retrieval snapshot contains 1,408 bounded title/abstract decisions, covering all 1,387 priority-queue records plus 21 historical or out-of-queue decisions. Full-text verification now covers 97 publicly accessible, associated-supplementary, or publisher-indexed antiparasitic sources and 112 linked evidence rows; 17 queue sources remain unverified, and no result is pooled as a final quantitative estimate. The</w:t>
+        <w:t xml:space="preserve">The analysis is reported as a frozen scoping review rather than a completed systematic review. The retrieval snapshot contains 1,408 bounded title/abstract decisions, covering all 1,387 priority-queue records plus 21 historical or out-of-queue decisions. Full-text verification now covers 98 publicly accessible, associated-supplementary, or publisher-indexed antiparasitic sources and 113 linked evidence rows; 16 queue sources remain unverified, and no result is pooled as a final quantitative estimate. The</w:t>
       </w:r>
       <w:r>
         <w:t xml:space="preserve"> </w:t>
@@ -1192,7 +1192,7 @@
         <w:t xml:space="preserve"> </w:t>
       </w:r>
       <w:r>
-        <w:t xml:space="preserve">gelatin-capsule record retains abstract-level translated-content and chemical-standardization limitations, the associated</w:t>
+        <w:t xml:space="preserve">gelatin-capsule record retains abstract-level translated-content and chemical-standardization limitations, the newly verified 1987 artemisinin-combination record retains indexed-abstract strain-specific isobologram evidence with incomplete dose and exposure details, the associated</w:t>
       </w:r>
       <w:r>
         <w:t xml:space="preserve"> </w:t>

</xml_diff>

<commit_message>
Verify related-species anthelmintic evidence
</commit_message>
<xml_diff>
--- a/manuscript/artemisia-terpene-review-submission.docx
+++ b/manuscript/artemisia-terpene-review-submission.docx
@@ -199,7 +199,7 @@
         <w:t xml:space="preserve"> </w:t>
       </w:r>
       <w:r>
-        <w:t xml:space="preserve">contains volatile monoterpenes and sesquiterpenes, less volatile diterpenes and triterpenes, and structurally diverse sesquiterpene lactones (STLs). These metabolites are often discussed as though a species name, a pathway gene, or an oil profile were sufficient to predict pharmacology. Here we present a source-auditable scoping review with a frozen snapshot that instead treats the specimen, accession, tissue, preparation, analytical method, parasite stage, and evidence level as the units of comparison. The Terpedia package registers 542 sources, 557 source-linked evidence records, 133 antiparasitic records, 20 parasite–protein interaction records, 179 compound/specimen records, and 411 audited article claims; 98 sources and 113 linked evidence rows have completed full-text verification, while 16 remain open. We synthesize terpene classes with biosynthetic compartmentalization, regulatory and environmental variation, and a bounded comparative-genomics analysis. Artemisinin biosynthesis in</w:t>
+        <w:t xml:space="preserve">contains volatile monoterpenes and sesquiterpenes, less volatile diterpenes and triterpenes, and structurally diverse sesquiterpene lactones (STLs). These metabolites are often discussed as though a species name, a pathway gene, or an oil profile were sufficient to predict pharmacology. Here we present a source-auditable scoping review with a frozen snapshot that instead treats the specimen, accession, tissue, preparation, analytical method, parasite stage, and evidence level as the units of comparison. The Terpedia package registers 542 sources, 557 source-linked evidence records, 133 antiparasitic records, 20 parasite–protein interaction records, 179 compound/specimen records, and 411 audited article claims; 100 sources and 115 linked evidence rows have completed full-text verification, while 14 remain open. We synthesize terpene classes with biosynthetic compartmentalization, regulatory and environmental variation, and a bounded comparative-genomics analysis. Artemisinin biosynthesis in</w:t>
       </w:r>
       <w:r>
         <w:t xml:space="preserve"> </w:t>
@@ -976,7 +976,7 @@
         <w:spacing w:before="0" w:after="120" w:line="264" w:lineRule="auto"/>
       </w:pPr>
       <w:r>
-        <w:t xml:space="preserve">The analysis is reported as a frozen scoping review rather than a completed systematic review. The retrieval snapshot contains 1,408 bounded title/abstract decisions, covering all 1,387 priority-queue records plus 21 historical or out-of-queue decisions. Full-text verification now covers 98 publicly accessible, associated-supplementary, or publisher-indexed antiparasitic sources and 113 linked evidence rows; 16 queue sources remain unverified, and no result is pooled as a final quantitative estimate. The</w:t>
+        <w:t xml:space="preserve">The analysis is reported as a frozen scoping review rather than a completed systematic review. The retrieval snapshot contains 1,408 bounded title/abstract decisions, covering all 1,387 priority-queue records plus 21 historical or out-of-queue decisions. Full-text verification now covers 100 publicly accessible, associated-supplementary, or publisher-indexed antiparasitic sources and 115 linked evidence rows; 14 queue sources remain unverified, and no result is pooled as a final quantitative estimate. The</w:t>
       </w:r>
       <w:r>
         <w:t xml:space="preserve"> </w:t>
@@ -1192,7 +1192,39 @@
         <w:t xml:space="preserve"> </w:t>
       </w:r>
       <w:r>
-        <w:t xml:space="preserve">gelatin-capsule record retains abstract-level translated-content and chemical-standardization limitations, the newly verified 1987 artemisinin-combination record retains indexed-abstract strain-specific isobologram evidence with incomplete dose and exposure details, the associated</w:t>
+        <w:t xml:space="preserve">gelatin-capsule record retains abstract-level translated-content and chemical-standardization limitations, the newly verified 1987 artemisinin-combination record retains indexed-abstract strain-specific isobologram evidence with incomplete dose and exposure details, the newly verified</w:t>
+      </w:r>
+      <w:r>
+        <w:t xml:space="preserve"> </w:t>
+      </w:r>
+      <w:r>
+        <w:rPr>
+          <w:i/>
+          <w:iCs/>
+        </w:rPr>
+        <w:t xml:space="preserve">A. brevifolia</w:t>
+      </w:r>
+      <w:r>
+        <w:t xml:space="preserve"> </w:t>
+      </w:r>
+      <w:r>
+        <w:t xml:space="preserve">sheep and</w:t>
+      </w:r>
+      <w:r>
+        <w:t xml:space="preserve"> </w:t>
+      </w:r>
+      <w:r>
+        <w:rPr>
+          <w:i/>
+          <w:iCs/>
+        </w:rPr>
+        <w:t xml:space="preserve">A. herba-alba</w:t>
+      </w:r>
+      <w:r>
+        <w:t xml:space="preserve"> </w:t>
+      </w:r>
+      <w:r>
+        <w:t xml:space="preserve">goat records strengthen related-species veterinary comparisons but retain crude-preparation and small-study limits, the associated</w:t>
       </w:r>
       <w:r>
         <w:t xml:space="preserve"> </w:t>
@@ -8080,6 +8112,40 @@
         <w:spacing w:before="0" w:after="120" w:line="264" w:lineRule="auto"/>
       </w:pPr>
       <w:r>
+        <w:t xml:space="preserve">An older</w:t>
+      </w:r>
+      <w:r>
+        <w:t xml:space="preserve"> </w:t>
+      </w:r>
+      <w:r>
+        <w:rPr>
+          <w:i/>
+          <w:iCs/>
+        </w:rPr>
+        <w:t xml:space="preserve">A. herba-alba</w:t>
+      </w:r>
+      <w:r>
+        <w:t xml:space="preserve"> </w:t>
+      </w:r>
+      <w:r>
+        <w:t xml:space="preserve">goat study provides a second related-species anchor. Six experimentally infected Nubian goats received 2, 10, or 30 g of powdered shoots; most treated goats had no reported fecal eggs, adult worms, or significant lesions at necropsy, although two goats retained incomplete suppression and a few adult worms. The indexed abstract does not resolve chemistry, dose normalization, allocation, comparator, pharmacokinetics, or residues. It therefore strengthens the historical veterinary signal without supporting a thujone, santonin, STL, or human-use claim</w:t>
+      </w:r>
+      <w:r>
+        <w:t xml:space="preserve"> </w:t>
+      </w:r>
+      <w:r>
+        <w:t xml:space="preserve">(Idris, Adam, and Tartour 1982)</w:t>
+      </w:r>
+      <w:r>
+        <w:t xml:space="preserve">.</w:t>
+      </w:r>
+    </w:p>
+    <w:p>
+      <w:pPr>
+        <w:pStyle w:val="BodyText"/>
+        <w:spacing w:before="0" w:after="120" w:line="264" w:lineRule="auto"/>
+      </w:pPr>
+      <w:r>
         <w:t xml:space="preserve">A full-text white-wormwood poultry study provides a host-level comparator. Crude aqueous extract prepared from leaves and stems by 24-hour soaking was delivered at 0.4 g/kg body weight for three days to experimentally infected turkey poults; across three repeated experiments, reported seven-day reductions were 97.78% in fecal eggs and 96.07% in worm burden, close to 97.31% and 95.08% for albendazole</w:t>
       </w:r>
       <w:r>
@@ -11133,6 +11199,132 @@
                 <w:sz w:val="18"/>
               </w:rPr>
               <w:t xml:space="preserve">(Z. Iqbal et al. 2004)</w:t>
+            </w:r>
+          </w:p>
+        </w:tc>
+      </w:tr>
+      <w:tr>
+        <w:trPr>
+          <w:cantSplit w:val="true"/>
+        </w:trPr>
+        <w:tc>
+          <w:tcPr>
+            <w:tcW w:w="1800" w:type="dxa"/>
+            <w:tcMar>
+              <w:top w:w="80" w:type="dxa"/>
+              <w:start w:w="120" w:type="dxa"/>
+              <w:bottom w:w="80" w:type="dxa"/>
+              <w:end w:w="120" w:type="dxa"/>
+            </w:tcMar>
+            <w:vAlign w:val="center"/>
+          </w:tcPr>
+          <w:p>
+            <w:pPr>
+              <w:pStyle w:val="Compact"/>
+              <w:spacing w:before="0" w:after="40" w:line="240" w:lineRule="auto"/>
+            </w:pPr>
+            <w:r>
+              <w:rPr>
+                <w:rFonts w:ascii="Calibri" w:hAnsi="Calibri"/>
+                <w:i/>
+                <w:iCs/>
+                <w:sz w:val="18"/>
+              </w:rPr>
+              <w:t xml:space="preserve">A. herba-alba</w:t>
+            </w:r>
+            <w:r>
+              <w:rPr>
+                <w:rFonts w:ascii="Calibri" w:hAnsi="Calibri"/>
+                <w:sz w:val="18"/>
+              </w:rPr>
+              <w:t xml:space="preserve"> </w:t>
+            </w:r>
+            <w:r>
+              <w:rPr>
+                <w:rFonts w:ascii="Calibri" w:hAnsi="Calibri"/>
+                <w:sz w:val="18"/>
+              </w:rPr>
+              <w:t xml:space="preserve">/ caprine</w:t>
+            </w:r>
+            <w:r>
+              <w:rPr>
+                <w:rFonts w:ascii="Calibri" w:hAnsi="Calibri"/>
+                <w:sz w:val="18"/>
+              </w:rPr>
+              <w:t xml:space="preserve"> </w:t>
+            </w:r>
+            <w:r>
+              <w:rPr>
+                <w:rFonts w:ascii="Calibri" w:hAnsi="Calibri"/>
+                <w:i/>
+                <w:iCs/>
+                <w:sz w:val="18"/>
+              </w:rPr>
+              <w:t xml:space="preserve">H. contortus</w:t>
+            </w:r>
+          </w:p>
+        </w:tc>
+        <w:tc>
+          <w:tcPr>
+            <w:tcW w:w="2800" w:type="dxa"/>
+            <w:tcMar>
+              <w:top w:w="80" w:type="dxa"/>
+              <w:start w:w="120" w:type="dxa"/>
+              <w:bottom w:w="80" w:type="dxa"/>
+              <w:end w:w="120" w:type="dxa"/>
+            </w:tcMar>
+            <w:vAlign w:val="center"/>
+          </w:tcPr>
+          <w:p>
+            <w:pPr>
+              <w:pStyle w:val="Compact"/>
+              <w:spacing w:before="0" w:after="40" w:line="240" w:lineRule="auto"/>
+            </w:pPr>
+            <w:r>
+              <w:rPr>
+                <w:rFonts w:ascii="Calibri" w:hAnsi="Calibri"/>
+                <w:sz w:val="18"/>
+              </w:rPr>
+              <w:t xml:space="preserve">Six infected goats received 2, 10, or 30 g of powdered shoots; most treated goats had absent fecal eggs and adult worms, but two retained incomplete suppression</w:t>
+            </w:r>
+          </w:p>
+        </w:tc>
+        <w:tc>
+          <w:tcPr>
+            <w:tcW w:w="2400" w:type="dxa"/>
+            <w:tcMar>
+              <w:top w:w="80" w:type="dxa"/>
+              <w:start w:w="120" w:type="dxa"/>
+              <w:bottom w:w="80" w:type="dxa"/>
+              <w:end w:w="120" w:type="dxa"/>
+            </w:tcMar>
+            <w:vAlign w:val="center"/>
+          </w:tcPr>
+          <w:p>
+            <w:pPr>
+              <w:pStyle w:val="Compact"/>
+              <w:spacing w:before="0" w:after="40" w:line="240" w:lineRule="auto"/>
+            </w:pPr>
+            <w:r>
+              <w:rPr>
+                <w:rFonts w:ascii="Calibri" w:hAnsi="Calibri"/>
+                <w:sz w:val="18"/>
+              </w:rPr>
+              <w:t xml:space="preserve">Older whole-shoot comparator with indexed-abstract resolution; no thujone/STL attribution, standardized exposure, PK, or residue evidence</w:t>
+            </w:r>
+            <w:r>
+              <w:rPr>
+                <w:rFonts w:ascii="Calibri" w:hAnsi="Calibri"/>
+                <w:sz w:val="18"/>
+              </w:rPr>
+              <w:t xml:space="preserve"> </w:t>
+            </w:r>
+            <w:r>
+              <w:rPr>
+                <w:rFonts w:ascii="Calibri" w:hAnsi="Calibri"/>
+                <w:sz w:val="18"/>
+              </w:rPr>
+              <w:t xml:space="preserve">(Idris, Adam, and Tartour 1982)</w:t>
             </w:r>
           </w:p>
         </w:tc>
@@ -13439,7 +13631,7 @@
     <w:bookmarkEnd w:id="50"/>
     <w:bookmarkEnd w:id="51"/>
     <w:bookmarkEnd w:id="52"/>
-    <w:bookmarkStart w:id="344" w:name="references"/>
+    <w:bookmarkStart w:id="346" w:name="references"/>
     <w:p>
       <w:pPr>
         <w:pStyle w:val="Heading1"/>
@@ -13449,7 +13641,7 @@
         <w:t xml:space="preserve">References</w:t>
       </w:r>
     </w:p>
-    <w:bookmarkStart w:id="343" w:name="refs"/>
+    <w:bookmarkStart w:id="345" w:name="refs"/>
     <w:bookmarkStart w:id="54" w:name="ref-abad2012artemisia"/>
     <w:p>
       <w:pPr>
@@ -16510,13 +16702,105 @@
       </w:r>
     </w:p>
     <w:bookmarkEnd w:id="152"/>
-    <w:bookmarkStart w:id="154" w:name="ref-iqbal2013absinthiumcoccidiosis"/>
+    <w:bookmarkStart w:id="154" w:name="ref-idris1982herbaalbagoats"/>
     <w:p>
       <w:pPr>
         <w:pStyle w:val="Bibliography"/>
         <w:spacing w:before="0" w:after="120" w:line="264" w:lineRule="auto"/>
       </w:pPr>
       <w:r>
+        <w:t xml:space="preserve">Idris, UE, SE Adam, and G Tartour. 1982.</w:t>
+      </w:r>
+      <w:r>
+        <w:t xml:space="preserve"> </w:t>
+      </w:r>
+      <w:r>
+        <w:t xml:space="preserve">“</w:t>
+      </w:r>
+      <w:hyperlink r:id="rId153">
+        <w:r>
+          <w:rPr>
+            <w:rStyle w:val="Hyperlink"/>
+          </w:rPr>
+          <w:t xml:space="preserve">The Anthelmintic Efficacy of</w:t>
+        </w:r>
+        <w:r>
+          <w:rPr>
+            <w:rStyle w:val="Hyperlink"/>
+          </w:rPr>
+          <w:t xml:space="preserve"> </w:t>
+        </w:r>
+        <w:r>
+          <w:rPr>
+            <w:rStyle w:val="Hyperlink"/>
+          </w:rPr>
+          <w:t xml:space="preserve">Artemisia herba-alba</w:t>
+        </w:r>
+        <w:r>
+          <w:rPr>
+            <w:rStyle w:val="Hyperlink"/>
+          </w:rPr>
+          <w:t xml:space="preserve"> </w:t>
+        </w:r>
+        <w:r>
+          <w:rPr>
+            <w:rStyle w:val="Hyperlink"/>
+          </w:rPr>
+          <w:t xml:space="preserve">Against</w:t>
+        </w:r>
+        <w:r>
+          <w:rPr>
+            <w:rStyle w:val="Hyperlink"/>
+          </w:rPr>
+          <w:t xml:space="preserve"> </w:t>
+        </w:r>
+        <w:r>
+          <w:rPr>
+            <w:rStyle w:val="Hyperlink"/>
+          </w:rPr>
+          <w:t xml:space="preserve">Haemonchus contortus</w:t>
+        </w:r>
+        <w:r>
+          <w:rPr>
+            <w:rStyle w:val="Hyperlink"/>
+          </w:rPr>
+          <w:t xml:space="preserve"> </w:t>
+        </w:r>
+        <w:r>
+          <w:rPr>
+            <w:rStyle w:val="Hyperlink"/>
+          </w:rPr>
+          <w:t xml:space="preserve">Infection in Goats</w:t>
+        </w:r>
+      </w:hyperlink>
+      <w:r>
+        <w:t xml:space="preserve">.”</w:t>
+      </w:r>
+      <w:r>
+        <w:t xml:space="preserve"> </w:t>
+      </w:r>
+      <w:r>
+        <w:rPr>
+          <w:i/>
+          <w:iCs/>
+        </w:rPr>
+        <w:t xml:space="preserve">National Institute of Animal Health Quarterly</w:t>
+      </w:r>
+      <w:r>
+        <w:t xml:space="preserve"> </w:t>
+      </w:r>
+      <w:r>
+        <w:t xml:space="preserve">22 (3): 138–43.</w:t>
+      </w:r>
+    </w:p>
+    <w:bookmarkEnd w:id="154"/>
+    <w:bookmarkStart w:id="156" w:name="ref-iqbal2013absinthiumcoccidiosis"/>
+    <w:p>
+      <w:pPr>
+        <w:pStyle w:val="Bibliography"/>
+        <w:spacing w:before="0" w:after="120" w:line="264" w:lineRule="auto"/>
+      </w:pPr>
+      <w:r>
         <w:t xml:space="preserve">Iqbal, A, KA Tariq, VS Wazir, and R Singh. 2013.</w:t>
       </w:r>
       <w:r>
@@ -16553,7 +16837,7 @@
       <w:r>
         <w:t xml:space="preserve"> </w:t>
       </w:r>
-      <w:hyperlink r:id="rId153">
+      <w:hyperlink r:id="rId155">
         <w:r>
           <w:rPr>
             <w:rStyle w:val="Hyperlink"/>
@@ -16565,8 +16849,8 @@
         <w:t xml:space="preserve">.</w:t>
       </w:r>
     </w:p>
-    <w:bookmarkEnd w:id="154"/>
-    <w:bookmarkStart w:id="156" w:name="ref-iqbal2004brevifolia"/>
+    <w:bookmarkEnd w:id="156"/>
+    <w:bookmarkStart w:id="158" w:name="ref-iqbal2004brevifolia"/>
     <w:p>
       <w:pPr>
         <w:pStyle w:val="Bibliography"/>
@@ -16612,7 +16896,7 @@
       <w:r>
         <w:t xml:space="preserve"> </w:t>
       </w:r>
-      <w:hyperlink r:id="rId155">
+      <w:hyperlink r:id="rId157">
         <w:r>
           <w:rPr>
             <w:rStyle w:val="Hyperlink"/>
@@ -16624,8 +16908,8 @@
         <w:t xml:space="preserve">.</w:t>
       </w:r>
     </w:p>
-    <w:bookmarkEnd w:id="156"/>
-    <w:bookmarkStart w:id="158" w:name="ref-irehan2026absinthium"/>
+    <w:bookmarkEnd w:id="158"/>
+    <w:bookmarkStart w:id="160" w:name="ref-irehan2026absinthium"/>
     <w:p>
       <w:pPr>
         <w:pStyle w:val="Bibliography"/>
@@ -16659,7 +16943,7 @@
       <w:r>
         <w:t xml:space="preserve"> </w:t>
       </w:r>
-      <w:hyperlink r:id="rId157">
+      <w:hyperlink r:id="rId159">
         <w:r>
           <w:rPr>
             <w:rStyle w:val="Hyperlink"/>
@@ -16671,8 +16955,8 @@
         <w:t xml:space="preserve">.</w:t>
       </w:r>
     </w:p>
-    <w:bookmarkEnd w:id="158"/>
-    <w:bookmarkStart w:id="160" w:name="ref-chandler2015stl"/>
+    <w:bookmarkEnd w:id="160"/>
+    <w:bookmarkStart w:id="162" w:name="ref-chandler2015stl"/>
     <w:p>
       <w:pPr>
         <w:pStyle w:val="Bibliography"/>
@@ -16706,7 +16990,7 @@
       <w:r>
         <w:t xml:space="preserve"> </w:t>
       </w:r>
-      <w:hyperlink r:id="rId159">
+      <w:hyperlink r:id="rId161">
         <w:r>
           <w:rPr>
             <w:rStyle w:val="Hyperlink"/>
@@ -16718,8 +17002,8 @@
         <w:t xml:space="preserve">.</w:t>
       </w:r>
     </w:p>
-    <w:bookmarkEnd w:id="160"/>
-    <w:bookmarkStart w:id="162" w:name="ref-ji2025chrysosplenetin"/>
+    <w:bookmarkEnd w:id="162"/>
+    <w:bookmarkStart w:id="164" w:name="ref-ji2025chrysosplenetin"/>
     <w:p>
       <w:pPr>
         <w:pStyle w:val="Bibliography"/>
@@ -16765,7 +17049,7 @@
       <w:r>
         <w:t xml:space="preserve"> </w:t>
       </w:r>
-      <w:hyperlink r:id="rId161">
+      <w:hyperlink r:id="rId163">
         <w:r>
           <w:rPr>
             <w:rStyle w:val="Hyperlink"/>
@@ -16777,8 +17061,8 @@
         <w:t xml:space="preserve">.</w:t>
       </w:r>
     </w:p>
-    <w:bookmarkEnd w:id="162"/>
-    <w:bookmarkStart w:id="164" w:name="ref-jiang2016wrky1"/>
+    <w:bookmarkEnd w:id="164"/>
+    <w:bookmarkStart w:id="166" w:name="ref-jiang2016wrky1"/>
     <w:p>
       <w:pPr>
         <w:pStyle w:val="Bibliography"/>
@@ -16830,7 +17114,7 @@
       <w:r>
         <w:t xml:space="preserve"> </w:t>
       </w:r>
-      <w:hyperlink r:id="rId163">
+      <w:hyperlink r:id="rId165">
         <w:r>
           <w:rPr>
             <w:rStyle w:val="Hyperlink"/>
@@ -16842,8 +17126,8 @@
         <w:t xml:space="preserve">.</w:t>
       </w:r>
     </w:p>
-    <w:bookmarkEnd w:id="164"/>
-    <w:bookmarkStart w:id="166" w:name="ref-artemisia2025phylogenomics"/>
+    <w:bookmarkEnd w:id="166"/>
+    <w:bookmarkStart w:id="168" w:name="ref-artemisia2025phylogenomics"/>
     <w:p>
       <w:pPr>
         <w:pStyle w:val="Bibliography"/>
@@ -16877,7 +17161,7 @@
       <w:r>
         <w:t xml:space="preserve"> </w:t>
       </w:r>
-      <w:hyperlink r:id="rId165">
+      <w:hyperlink r:id="rId167">
         <w:r>
           <w:rPr>
             <w:rStyle w:val="Hyperlink"/>
@@ -16889,8 +17173,8 @@
         <w:t xml:space="preserve">.</w:t>
       </w:r>
     </w:p>
-    <w:bookmarkEnd w:id="166"/>
-    <w:bookmarkStart w:id="168" w:name="ref-jiao2018eimeria"/>
+    <w:bookmarkEnd w:id="168"/>
+    <w:bookmarkStart w:id="170" w:name="ref-jiao2018eimeria"/>
     <w:p>
       <w:pPr>
         <w:pStyle w:val="Bibliography"/>
@@ -16948,7 +17232,7 @@
       <w:r>
         <w:t xml:space="preserve"> </w:t>
       </w:r>
-      <w:hyperlink r:id="rId167">
+      <w:hyperlink r:id="rId169">
         <w:r>
           <w:rPr>
             <w:rStyle w:val="Hyperlink"/>
@@ -16960,8 +17244,8 @@
         <w:t xml:space="preserve">.</w:t>
       </w:r>
     </w:p>
-    <w:bookmarkEnd w:id="168"/>
-    <w:bookmarkStart w:id="170" w:name="ref-jimenez2014tcruzipcd"/>
+    <w:bookmarkEnd w:id="170"/>
+    <w:bookmarkStart w:id="172" w:name="ref-jimenez2014tcruzipcd"/>
     <w:p>
       <w:pPr>
         <w:pStyle w:val="Bibliography"/>
@@ -17004,7 +17288,7 @@
       <w:r>
         <w:t xml:space="preserve"> </w:t>
       </w:r>
-      <w:hyperlink r:id="rId169">
+      <w:hyperlink r:id="rId171">
         <w:r>
           <w:rPr>
             <w:rStyle w:val="Hyperlink"/>
@@ -17016,8 +17300,8 @@
         <w:t xml:space="preserve">.</w:t>
       </w:r>
     </w:p>
-    <w:bookmarkEnd w:id="170"/>
-    <w:bookmarkStart w:id="172" w:name="ref-judzentiene2016vulgaris"/>
+    <w:bookmarkEnd w:id="172"/>
+    <w:bookmarkStart w:id="174" w:name="ref-judzentiene2016vulgaris"/>
     <w:p>
       <w:pPr>
         <w:pStyle w:val="Bibliography"/>
@@ -17032,7 +17316,7 @@
       <w:r>
         <w:t xml:space="preserve">“</w:t>
       </w:r>
-      <w:hyperlink r:id="rId171">
+      <w:hyperlink r:id="rId173">
         <w:r>
           <w:rPr>
             <w:rStyle w:val="Hyperlink"/>
@@ -17072,8 +17356,8 @@
         <w:t xml:space="preserve">11 (9): 1353–56.</w:t>
       </w:r>
     </w:p>
-    <w:bookmarkEnd w:id="172"/>
-    <w:bookmarkStart w:id="174" w:name="ref-kane2022cyp450"/>
+    <w:bookmarkEnd w:id="174"/>
+    <w:bookmarkStart w:id="176" w:name="ref-kane2022cyp450"/>
     <w:p>
       <w:pPr>
         <w:pStyle w:val="Bibliography"/>
@@ -17128,7 +17412,7 @@
       <w:r>
         <w:t xml:space="preserve"> </w:t>
       </w:r>
-      <w:hyperlink r:id="rId173">
+      <w:hyperlink r:id="rId175">
         <w:r>
           <w:rPr>
             <w:rStyle w:val="Hyperlink"/>
@@ -17140,8 +17424,8 @@
         <w:t xml:space="preserve">.</w:t>
       </w:r>
     </w:p>
-    <w:bookmarkEnd w:id="174"/>
-    <w:bookmarkStart w:id="176" w:name="ref-khan2015artemisia_nematodes"/>
+    <w:bookmarkEnd w:id="176"/>
+    <w:bookmarkStart w:id="178" w:name="ref-khan2015artemisia_nematodes"/>
     <w:p>
       <w:pPr>
         <w:pStyle w:val="Bibliography"/>
@@ -17156,7 +17440,7 @@
       <w:r>
         <w:t xml:space="preserve">“</w:t>
       </w:r>
-      <w:hyperlink r:id="rId175">
+      <w:hyperlink r:id="rId177">
         <w:r>
           <w:rPr>
             <w:rStyle w:val="Hyperlink"/>
@@ -17208,8 +17492,8 @@
         <w:t xml:space="preserve">32 (2): 257–68.</w:t>
       </w:r>
     </w:p>
-    <w:bookmarkEnd w:id="176"/>
-    <w:bookmarkStart w:id="178" w:name="ref-kunnathattil2025vulgaris"/>
+    <w:bookmarkEnd w:id="178"/>
+    <w:bookmarkStart w:id="180" w:name="ref-kunnathattil2025vulgaris"/>
     <w:p>
       <w:pPr>
         <w:pStyle w:val="Bibliography"/>
@@ -17267,7 +17551,7 @@
       <w:r>
         <w:t xml:space="preserve"> </w:t>
       </w:r>
-      <w:hyperlink r:id="rId177">
+      <w:hyperlink r:id="rId179">
         <w:r>
           <w:rPr>
             <w:rStyle w:val="Hyperlink"/>
@@ -17279,8 +17563,8 @@
         <w:t xml:space="preserve">.</w:t>
       </w:r>
     </w:p>
-    <w:bookmarkEnd w:id="178"/>
-    <w:bookmarkStart w:id="180" w:name="ref-li2018naturalcombination"/>
+    <w:bookmarkEnd w:id="180"/>
+    <w:bookmarkStart w:id="182" w:name="ref-li2018naturalcombination"/>
     <w:p>
       <w:pPr>
         <w:pStyle w:val="Bibliography"/>
@@ -17326,7 +17610,7 @@
       <w:r>
         <w:t xml:space="preserve"> </w:t>
       </w:r>
-      <w:hyperlink r:id="rId179">
+      <w:hyperlink r:id="rId181">
         <w:r>
           <w:rPr>
             <w:rStyle w:val="Hyperlink"/>
@@ -17338,8 +17622,8 @@
         <w:t xml:space="preserve">.</w:t>
       </w:r>
     </w:p>
-    <w:bookmarkEnd w:id="180"/>
-    <w:bookmarkStart w:id="182" w:name="ref-li2008sphaerocephalasaponin"/>
+    <w:bookmarkEnd w:id="182"/>
+    <w:bookmarkStart w:id="184" w:name="ref-li2008sphaerocephalasaponin"/>
     <w:p>
       <w:pPr>
         <w:pStyle w:val="Bibliography"/>
@@ -17382,7 +17666,7 @@
       <w:r>
         <w:t xml:space="preserve"> </w:t>
       </w:r>
-      <w:hyperlink r:id="rId181">
+      <w:hyperlink r:id="rId183">
         <w:r>
           <w:rPr>
             <w:rStyle w:val="Hyperlink"/>
@@ -17394,8 +17678,8 @@
         <w:t xml:space="preserve">.</w:t>
       </w:r>
     </w:p>
-    <w:bookmarkEnd w:id="182"/>
-    <w:bookmarkStart w:id="184" w:name="ref-li1990sacrorumditerpene"/>
+    <w:bookmarkEnd w:id="184"/>
+    <w:bookmarkStart w:id="186" w:name="ref-li1990sacrorumditerpene"/>
     <w:p>
       <w:pPr>
         <w:pStyle w:val="Bibliography"/>
@@ -17438,7 +17722,7 @@
       <w:r>
         <w:t xml:space="preserve"> </w:t>
       </w:r>
-      <w:hyperlink r:id="rId183">
+      <w:hyperlink r:id="rId185">
         <w:r>
           <w:rPr>
             <w:rStyle w:val="Hyperlink"/>
@@ -17450,8 +17734,8 @@
         <w:t xml:space="preserve">.</w:t>
       </w:r>
     </w:p>
-    <w:bookmarkEnd w:id="184"/>
-    <w:bookmarkStart w:id="186" w:name="ref-liu2026osc"/>
+    <w:bookmarkEnd w:id="186"/>
+    <w:bookmarkStart w:id="188" w:name="ref-liu2026osc"/>
     <w:p>
       <w:pPr>
         <w:pStyle w:val="Bibliography"/>
@@ -17497,7 +17781,7 @@
       <w:r>
         <w:t xml:space="preserve"> </w:t>
       </w:r>
-      <w:hyperlink r:id="rId185">
+      <w:hyperlink r:id="rId187">
         <w:r>
           <w:rPr>
             <w:rStyle w:val="Hyperlink"/>
@@ -17509,8 +17793,8 @@
         <w:t xml:space="preserve">.</w:t>
       </w:r>
     </w:p>
-    <w:bookmarkEnd w:id="186"/>
-    <w:bookmarkStart w:id="188" w:name="ref-liu2022vulgaristerpenoids"/>
+    <w:bookmarkEnd w:id="188"/>
+    <w:bookmarkStart w:id="190" w:name="ref-liu2022vulgaristerpenoids"/>
     <w:p>
       <w:pPr>
         <w:pStyle w:val="Bibliography"/>
@@ -17556,7 +17840,7 @@
       <w:r>
         <w:t xml:space="preserve"> </w:t>
       </w:r>
-      <w:hyperlink r:id="rId187">
+      <w:hyperlink r:id="rId189">
         <w:r>
           <w:rPr>
             <w:rStyle w:val="Hyperlink"/>
@@ -17568,8 +17852,8 @@
         <w:t xml:space="preserve">.</w:t>
       </w:r>
     </w:p>
-    <w:bookmarkEnd w:id="188"/>
-    <w:bookmarkStart w:id="190" w:name="ref-lu2013aora"/>
+    <w:bookmarkEnd w:id="190"/>
+    <w:bookmarkStart w:id="192" w:name="ref-lu2013aora"/>
     <w:p>
       <w:pPr>
         <w:pStyle w:val="Bibliography"/>
@@ -17627,7 +17911,7 @@
       <w:r>
         <w:t xml:space="preserve"> </w:t>
       </w:r>
-      <w:hyperlink r:id="rId189">
+      <w:hyperlink r:id="rId191">
         <w:r>
           <w:rPr>
             <w:rStyle w:val="Hyperlink"/>
@@ -17639,8 +17923,8 @@
         <w:t xml:space="preserve">.</w:t>
       </w:r>
     </w:p>
-    <w:bookmarkEnd w:id="190"/>
-    <w:bookmarkStart w:id="192" w:name="ref-lv2016nac1"/>
+    <w:bookmarkEnd w:id="192"/>
+    <w:bookmarkStart w:id="194" w:name="ref-lv2016nac1"/>
     <w:p>
       <w:pPr>
         <w:pStyle w:val="Bibliography"/>
@@ -17701,7 +17985,7 @@
       <w:r>
         <w:t xml:space="preserve"> </w:t>
       </w:r>
-      <w:hyperlink r:id="rId191">
+      <w:hyperlink r:id="rId193">
         <w:r>
           <w:rPr>
             <w:rStyle w:val="Hyperlink"/>
@@ -17713,8 +17997,8 @@
         <w:t xml:space="preserve">.</w:t>
       </w:r>
     </w:p>
-    <w:bookmarkEnd w:id="192"/>
-    <w:bookmarkStart w:id="194" w:name="ref-ma2001caruifolia"/>
+    <w:bookmarkEnd w:id="194"/>
+    <w:bookmarkStart w:id="196" w:name="ref-ma2001caruifolia"/>
     <w:p>
       <w:pPr>
         <w:pStyle w:val="Bibliography"/>
@@ -17748,7 +18032,7 @@
       <w:r>
         <w:t xml:space="preserve"> </w:t>
       </w:r>
-      <w:hyperlink r:id="rId193">
+      <w:hyperlink r:id="rId195">
         <w:r>
           <w:rPr>
             <w:rStyle w:val="Hyperlink"/>
@@ -17760,8 +18044,8 @@
         <w:t xml:space="preserve">.</w:t>
       </w:r>
     </w:p>
-    <w:bookmarkEnd w:id="194"/>
-    <w:bookmarkStart w:id="196" w:name="ref-mamede2025metabolite"/>
+    <w:bookmarkEnd w:id="196"/>
+    <w:bookmarkStart w:id="198" w:name="ref-mamede2025metabolite"/>
     <w:p>
       <w:pPr>
         <w:pStyle w:val="Bibliography"/>
@@ -17828,7 +18112,7 @@
       <w:r>
         <w:t xml:space="preserve"> </w:t>
       </w:r>
-      <w:hyperlink r:id="rId195">
+      <w:hyperlink r:id="rId197">
         <w:r>
           <w:rPr>
             <w:rStyle w:val="Hyperlink"/>
@@ -17840,8 +18124,8 @@
         <w:t xml:space="preserve">.</w:t>
       </w:r>
     </w:p>
-    <w:bookmarkEnd w:id="196"/>
-    <w:bookmarkStart w:id="198" w:name="ref-martinezdiaz2015absinthiumtrypano"/>
+    <w:bookmarkEnd w:id="198"/>
+    <w:bookmarkStart w:id="200" w:name="ref-martinezdiaz2015absinthiumtrypano"/>
     <w:p>
       <w:pPr>
         <w:pStyle w:val="Bibliography"/>
@@ -17875,7 +18159,7 @@
       <w:r>
         <w:t xml:space="preserve"> </w:t>
       </w:r>
-      <w:hyperlink r:id="rId197">
+      <w:hyperlink r:id="rId199">
         <w:r>
           <w:rPr>
             <w:rStyle w:val="Hyperlink"/>
@@ -17887,8 +18171,8 @@
         <w:t xml:space="preserve">.</w:t>
       </w:r>
     </w:p>
-    <w:bookmarkEnd w:id="198"/>
-    <w:bookmarkStart w:id="200" w:name="ref-ming2025argyidrying"/>
+    <w:bookmarkEnd w:id="200"/>
+    <w:bookmarkStart w:id="202" w:name="ref-ming2025argyidrying"/>
     <w:p>
       <w:pPr>
         <w:pStyle w:val="Bibliography"/>
@@ -17931,7 +18215,7 @@
       <w:r>
         <w:t xml:space="preserve"> </w:t>
       </w:r>
-      <w:hyperlink r:id="rId199">
+      <w:hyperlink r:id="rId201">
         <w:r>
           <w:rPr>
             <w:rStyle w:val="Hyperlink"/>
@@ -17943,8 +18227,8 @@
         <w:t xml:space="preserve">.</w:t>
       </w:r>
     </w:p>
-    <w:bookmarkEnd w:id="200"/>
-    <w:bookmarkStart w:id="202" w:name="ref-mohammed2026monospermadrying"/>
+    <w:bookmarkEnd w:id="202"/>
+    <w:bookmarkStart w:id="204" w:name="ref-mohammed2026monospermadrying"/>
     <w:p>
       <w:pPr>
         <w:pStyle w:val="Bibliography"/>
@@ -17997,7 +18281,7 @@
       <w:r>
         <w:t xml:space="preserve"> </w:t>
       </w:r>
-      <w:hyperlink r:id="rId201">
+      <w:hyperlink r:id="rId203">
         <w:r>
           <w:rPr>
             <w:rStyle w:val="Hyperlink"/>
@@ -18009,8 +18293,8 @@
         <w:t xml:space="preserve">.</w:t>
       </w:r>
     </w:p>
-    <w:bookmarkEnd w:id="202"/>
-    <w:bookmarkStart w:id="204" w:name="ref-mojarrab2015extracts"/>
+    <w:bookmarkEnd w:id="204"/>
+    <w:bookmarkStart w:id="206" w:name="ref-mojarrab2015extracts"/>
     <w:p>
       <w:pPr>
         <w:pStyle w:val="Bibliography"/>
@@ -18056,7 +18340,7 @@
       <w:r>
         <w:t xml:space="preserve"> </w:t>
       </w:r>
-      <w:hyperlink r:id="rId203">
+      <w:hyperlink r:id="rId205">
         <w:r>
           <w:rPr>
             <w:rStyle w:val="Hyperlink"/>
@@ -18068,8 +18352,8 @@
         <w:t xml:space="preserve">.</w:t>
       </w:r>
     </w:p>
-    <w:bookmarkEnd w:id="204"/>
-    <w:bookmarkStart w:id="206" w:name="ref-mojarrab2014fractionation"/>
+    <w:bookmarkEnd w:id="206"/>
+    <w:bookmarkStart w:id="208" w:name="ref-mojarrab2014fractionation"/>
     <w:p>
       <w:pPr>
         <w:pStyle w:val="Bibliography"/>
@@ -18127,7 +18411,7 @@
       <w:r>
         <w:t xml:space="preserve"> </w:t>
       </w:r>
-      <w:hyperlink r:id="rId205">
+      <w:hyperlink r:id="rId207">
         <w:r>
           <w:rPr>
             <w:rStyle w:val="Hyperlink"/>
@@ -18139,8 +18423,8 @@
         <w:t xml:space="preserve">.</w:t>
       </w:r>
     </w:p>
-    <w:bookmarkEnd w:id="206"/>
-    <w:bookmarkStart w:id="208" w:name="ref-monzote2014absinthium"/>
+    <w:bookmarkEnd w:id="208"/>
+    <w:bookmarkStart w:id="210" w:name="ref-monzote2014absinthium"/>
     <w:p>
       <w:pPr>
         <w:pStyle w:val="Bibliography"/>
@@ -18174,7 +18458,7 @@
       <w:r>
         <w:t xml:space="preserve"> </w:t>
       </w:r>
-      <w:hyperlink r:id="rId207">
+      <w:hyperlink r:id="rId209">
         <w:r>
           <w:rPr>
             <w:rStyle w:val="Hyperlink"/>
@@ -18186,8 +18470,8 @@
         <w:t xml:space="preserve">.</w:t>
       </w:r>
     </w:p>
-    <w:bookmarkEnd w:id="208"/>
-    <w:bookmarkStart w:id="210" w:name="ref-morua2025standardizedannua"/>
+    <w:bookmarkEnd w:id="210"/>
+    <w:bookmarkStart w:id="212" w:name="ref-morua2025standardizedannua"/>
     <w:p>
       <w:pPr>
         <w:pStyle w:val="Bibliography"/>
@@ -18233,7 +18517,7 @@
       <w:r>
         <w:t xml:space="preserve"> </w:t>
       </w:r>
-      <w:hyperlink r:id="rId209">
+      <w:hyperlink r:id="rId211">
         <w:r>
           <w:rPr>
             <w:rStyle w:val="Hyperlink"/>
@@ -18245,8 +18529,8 @@
         <w:t xml:space="preserve">.</w:t>
       </w:r>
     </w:p>
-    <w:bookmarkEnd w:id="210"/>
-    <w:bookmarkStart w:id="212" w:name="ref-annua2015triterpenes"/>
+    <w:bookmarkEnd w:id="212"/>
+    <w:bookmarkStart w:id="214" w:name="ref-annua2015triterpenes"/>
     <w:p>
       <w:pPr>
         <w:pStyle w:val="Bibliography"/>
@@ -18280,7 +18564,7 @@
       <w:r>
         <w:t xml:space="preserve"> </w:t>
       </w:r>
-      <w:hyperlink r:id="rId211">
+      <w:hyperlink r:id="rId213">
         <w:r>
           <w:rPr>
             <w:rStyle w:val="Hyperlink"/>
@@ -18292,8 +18576,8 @@
         <w:t xml:space="preserve">.</w:t>
       </w:r>
     </w:p>
-    <w:bookmarkEnd w:id="212"/>
-    <w:bookmarkStart w:id="214" w:name="ref-mouton2013artemisininonly"/>
+    <w:bookmarkEnd w:id="214"/>
+    <w:bookmarkStart w:id="216" w:name="ref-mouton2013artemisininonly"/>
     <w:p>
       <w:pPr>
         <w:pStyle w:val="Bibliography"/>
@@ -18339,7 +18623,7 @@
       <w:r>
         <w:t xml:space="preserve"> </w:t>
       </w:r>
-      <w:hyperlink r:id="rId213">
+      <w:hyperlink r:id="rId215">
         <w:r>
           <w:rPr>
             <w:rStyle w:val="Hyperlink"/>
@@ -18351,8 +18635,8 @@
         <w:t xml:space="preserve">.</w:t>
       </w:r>
     </w:p>
-    <w:bookmarkEnd w:id="214"/>
-    <w:bookmarkStart w:id="216" w:name="ref-mravcakova2020wormwood"/>
+    <w:bookmarkEnd w:id="216"/>
+    <w:bookmarkStart w:id="218" w:name="ref-mravcakova2020wormwood"/>
     <w:p>
       <w:pPr>
         <w:pStyle w:val="Bibliography"/>
@@ -18386,7 +18670,7 @@
       <w:r>
         <w:t xml:space="preserve"> </w:t>
       </w:r>
-      <w:hyperlink r:id="rId215">
+      <w:hyperlink r:id="rId217">
         <w:r>
           <w:rPr>
             <w:rStyle w:val="Hyperlink"/>
@@ -18398,8 +18682,8 @@
         <w:t xml:space="preserve">.</w:t>
       </w:r>
     </w:p>
-    <w:bookmarkEnd w:id="216"/>
-    <w:bookmarkStart w:id="218" w:name="ref-nahrevanian2010khorassanica"/>
+    <w:bookmarkEnd w:id="218"/>
+    <w:bookmarkStart w:id="220" w:name="ref-nahrevanian2010khorassanica"/>
     <w:p>
       <w:pPr>
         <w:pStyle w:val="Bibliography"/>
@@ -18433,7 +18717,7 @@
       <w:r>
         <w:t xml:space="preserve"> </w:t>
       </w:r>
-      <w:hyperlink r:id="rId217">
+      <w:hyperlink r:id="rId219">
         <w:r>
           <w:rPr>
             <w:rStyle w:val="Hyperlink"/>
@@ -18445,8 +18729,8 @@
         <w:t xml:space="preserve">.</w:t>
       </w:r>
     </w:p>
-    <w:bookmarkEnd w:id="218"/>
-    <w:bookmarkStart w:id="220" w:name="ref-nahrevanian2012sieberi"/>
+    <w:bookmarkEnd w:id="220"/>
+    <w:bookmarkStart w:id="222" w:name="ref-nahrevanian2012sieberi"/>
     <w:p>
       <w:pPr>
         <w:pStyle w:val="Bibliography"/>
@@ -18480,7 +18764,7 @@
       <w:r>
         <w:t xml:space="preserve"> </w:t>
       </w:r>
-      <w:hyperlink r:id="rId219">
+      <w:hyperlink r:id="rId221">
         <w:r>
           <w:rPr>
             <w:rStyle w:val="Hyperlink"/>
@@ -18492,8 +18776,8 @@
         <w:t xml:space="preserve">.</w:t>
       </w:r>
     </w:p>
-    <w:bookmarkEnd w:id="220"/>
-    <w:bookmarkStart w:id="222" w:name="ref-nomani2022h2s"/>
+    <w:bookmarkEnd w:id="222"/>
+    <w:bookmarkStart w:id="224" w:name="ref-nomani2022h2s"/>
     <w:p>
       <w:pPr>
         <w:pStyle w:val="Bibliography"/>
@@ -18539,7 +18823,7 @@
       <w:r>
         <w:t xml:space="preserve"> </w:t>
       </w:r>
-      <w:hyperlink r:id="rId221">
+      <w:hyperlink r:id="rId223">
         <w:r>
           <w:rPr>
             <w:rStyle w:val="Hyperlink"/>
@@ -18551,8 +18835,8 @@
         <w:t xml:space="preserve">.</w:t>
       </w:r>
     </w:p>
-    <w:bookmarkEnd w:id="222"/>
-    <w:bookmarkStart w:id="224" w:name="ref-nurlaelasari2023vulgarisfasciola"/>
+    <w:bookmarkEnd w:id="224"/>
+    <w:bookmarkStart w:id="226" w:name="ref-nurlaelasari2023vulgarisfasciola"/>
     <w:p>
       <w:pPr>
         <w:pStyle w:val="Bibliography"/>
@@ -18607,7 +18891,7 @@
       <w:r>
         <w:t xml:space="preserve"> </w:t>
       </w:r>
-      <w:hyperlink r:id="rId223">
+      <w:hyperlink r:id="rId225">
         <w:r>
           <w:rPr>
             <w:rStyle w:val="Hyperlink"/>
@@ -18619,8 +18903,8 @@
         <w:t xml:space="preserve">.</w:t>
       </w:r>
     </w:p>
-    <w:bookmarkEnd w:id="224"/>
-    <w:bookmarkStart w:id="226" w:name="ref-olofsson2011tissue"/>
+    <w:bookmarkEnd w:id="226"/>
+    <w:bookmarkStart w:id="228" w:name="ref-olofsson2011tissue"/>
     <w:p>
       <w:pPr>
         <w:pStyle w:val="Bibliography"/>
@@ -18654,7 +18938,7 @@
       <w:r>
         <w:t xml:space="preserve"> </w:t>
       </w:r>
-      <w:hyperlink r:id="rId225">
+      <w:hyperlink r:id="rId227">
         <w:r>
           <w:rPr>
             <w:rStyle w:val="Hyperlink"/>
@@ -18666,8 +18950,8 @@
         <w:t xml:space="preserve">.</w:t>
       </w:r>
     </w:p>
-    <w:bookmarkEnd w:id="226"/>
-    <w:bookmarkStart w:id="228" w:name="ref-olsson2009localization"/>
+    <w:bookmarkEnd w:id="228"/>
+    <w:bookmarkStart w:id="230" w:name="ref-olsson2009localization"/>
     <w:p>
       <w:pPr>
         <w:pStyle w:val="Bibliography"/>
@@ -18701,7 +18985,7 @@
       <w:r>
         <w:t xml:space="preserve"> </w:t>
       </w:r>
-      <w:hyperlink r:id="rId227">
+      <w:hyperlink r:id="rId229">
         <w:r>
           <w:rPr>
             <w:rStyle w:val="Hyperlink"/>
@@ -18713,8 +18997,8 @@
         <w:t xml:space="preserve">.</w:t>
       </w:r>
     </w:p>
-    <w:bookmarkEnd w:id="228"/>
-    <w:bookmarkStart w:id="230" w:name="ref-ongo2019campestriscomment"/>
+    <w:bookmarkEnd w:id="230"/>
+    <w:bookmarkStart w:id="232" w:name="ref-ongo2019campestriscomment"/>
     <w:p>
       <w:pPr>
         <w:pStyle w:val="Bibliography"/>
@@ -18769,7 +19053,7 @@
       <w:r>
         <w:t xml:space="preserve"> </w:t>
       </w:r>
-      <w:hyperlink r:id="rId229">
+      <w:hyperlink r:id="rId231">
         <w:r>
           <w:rPr>
             <w:rStyle w:val="Hyperlink"/>
@@ -18781,8 +19065,8 @@
         <w:t xml:space="preserve">.</w:t>
       </w:r>
     </w:p>
-    <w:bookmarkEnd w:id="230"/>
-    <w:bookmarkStart w:id="232" w:name="ref-ortet2008gorgonum"/>
+    <w:bookmarkEnd w:id="232"/>
+    <w:bookmarkStart w:id="234" w:name="ref-ortet2008gorgonum"/>
     <w:p>
       <w:pPr>
         <w:pStyle w:val="Bibliography"/>
@@ -18816,7 +19100,7 @@
       <w:r>
         <w:t xml:space="preserve"> </w:t>
       </w:r>
-      <w:hyperlink r:id="rId231">
+      <w:hyperlink r:id="rId233">
         <w:r>
           <w:rPr>
             <w:rStyle w:val="Hyperlink"/>
@@ -18828,8 +19112,8 @@
         <w:t xml:space="preserve">.</w:t>
       </w:r>
     </w:p>
-    <w:bookmarkEnd w:id="232"/>
-    <w:bookmarkStart w:id="234" w:name="ref-osanloo2022dracunculusnanogel"/>
+    <w:bookmarkEnd w:id="234"/>
+    <w:bookmarkStart w:id="236" w:name="ref-osanloo2022dracunculusnanogel"/>
     <w:p>
       <w:pPr>
         <w:pStyle w:val="Bibliography"/>
@@ -18875,7 +19159,7 @@
       <w:r>
         <w:t xml:space="preserve"> </w:t>
       </w:r>
-      <w:hyperlink r:id="rId233">
+      <w:hyperlink r:id="rId235">
         <w:r>
           <w:rPr>
             <w:rStyle w:val="Hyperlink"/>
@@ -18887,8 +19171,8 @@
         <w:t xml:space="preserve">.</w:t>
       </w:r>
     </w:p>
-    <w:bookmarkEnd w:id="234"/>
-    <w:bookmarkStart w:id="236" w:name="ref-oyedeji2009afra"/>
+    <w:bookmarkEnd w:id="236"/>
+    <w:bookmarkStart w:id="238" w:name="ref-oyedeji2009afra"/>
     <w:p>
       <w:pPr>
         <w:pStyle w:val="Bibliography"/>
@@ -18922,7 +19206,7 @@
       <w:r>
         <w:t xml:space="preserve"> </w:t>
       </w:r>
-      <w:hyperlink r:id="rId235">
+      <w:hyperlink r:id="rId237">
         <w:r>
           <w:rPr>
             <w:rStyle w:val="Hyperlink"/>
@@ -18934,8 +19218,8 @@
         <w:t xml:space="preserve">.</w:t>
       </w:r>
     </w:p>
-    <w:bookmarkEnd w:id="236"/>
-    <w:bookmarkStart w:id="238" w:name="ref-pandey2017artemisiaoils"/>
+    <w:bookmarkEnd w:id="238"/>
+    <w:bookmarkStart w:id="240" w:name="ref-pandey2017artemisiaoils"/>
     <w:p>
       <w:pPr>
         <w:pStyle w:val="Bibliography"/>
@@ -18969,7 +19253,7 @@
       <w:r>
         <w:t xml:space="preserve"> </w:t>
       </w:r>
-      <w:hyperlink r:id="rId237">
+      <w:hyperlink r:id="rId239">
         <w:r>
           <w:rPr>
             <w:rStyle w:val="Hyperlink"/>
@@ -18981,8 +19265,8 @@
         <w:t xml:space="preserve">.</w:t>
       </w:r>
     </w:p>
-    <w:bookmarkEnd w:id="238"/>
-    <w:bookmarkStart w:id="240" w:name="ref-parveen2024scoparia"/>
+    <w:bookmarkEnd w:id="240"/>
+    <w:bookmarkStart w:id="242" w:name="ref-parveen2024scoparia"/>
     <w:p>
       <w:pPr>
         <w:pStyle w:val="Bibliography"/>
@@ -19028,7 +19312,7 @@
       <w:r>
         <w:t xml:space="preserve"> </w:t>
       </w:r>
-      <w:hyperlink r:id="rId239">
+      <w:hyperlink r:id="rId241">
         <w:r>
           <w:rPr>
             <w:rStyle w:val="Hyperlink"/>
@@ -19040,8 +19324,8 @@
         <w:t xml:space="preserve">.</w:t>
       </w:r>
     </w:p>
-    <w:bookmarkEnd w:id="240"/>
-    <w:bookmarkStart w:id="242" w:name="ref-paul2010recurrent"/>
+    <w:bookmarkEnd w:id="242"/>
+    <w:bookmarkStart w:id="244" w:name="ref-paul2010recurrent"/>
     <w:p>
       <w:pPr>
         <w:pStyle w:val="Bibliography"/>
@@ -19087,7 +19371,7 @@
       <w:r>
         <w:t xml:space="preserve"> </w:t>
       </w:r>
-      <w:hyperlink r:id="rId241">
+      <w:hyperlink r:id="rId243">
         <w:r>
           <w:rPr>
             <w:rStyle w:val="Hyperlink"/>
@@ -19099,8 +19383,8 @@
         <w:t xml:space="preserve">.</w:t>
       </w:r>
     </w:p>
-    <w:bookmarkEnd w:id="242"/>
-    <w:bookmarkStart w:id="244" w:name="ref-pirali2011tick"/>
+    <w:bookmarkEnd w:id="244"/>
+    <w:bookmarkStart w:id="246" w:name="ref-pirali2011tick"/>
     <w:p>
       <w:pPr>
         <w:pStyle w:val="Bibliography"/>
@@ -19158,7 +19442,7 @@
       <w:r>
         <w:t xml:space="preserve"> </w:t>
       </w:r>
-      <w:hyperlink r:id="rId243">
+      <w:hyperlink r:id="rId245">
         <w:r>
           <w:rPr>
             <w:rStyle w:val="Hyperlink"/>
@@ -19170,8 +19454,8 @@
         <w:t xml:space="preserve">.</w:t>
       </w:r>
     </w:p>
-    <w:bookmarkEnd w:id="244"/>
-    <w:bookmarkStart w:id="246" w:name="ref-radulovic2013toxic"/>
+    <w:bookmarkEnd w:id="246"/>
+    <w:bookmarkStart w:id="248" w:name="ref-radulovic2013toxic"/>
     <w:p>
       <w:pPr>
         <w:pStyle w:val="Bibliography"/>
@@ -19205,7 +19489,7 @@
       <w:r>
         <w:t xml:space="preserve"> </w:t>
       </w:r>
-      <w:hyperlink r:id="rId245">
+      <w:hyperlink r:id="rId247">
         <w:r>
           <w:rPr>
             <w:rStyle w:val="Hyperlink"/>
@@ -19217,8 +19501,8 @@
         <w:t xml:space="preserve">.</w:t>
       </w:r>
     </w:p>
-    <w:bookmarkEnd w:id="246"/>
-    <w:bookmarkStart w:id="248" w:name="ref-ram1997density"/>
+    <w:bookmarkEnd w:id="248"/>
+    <w:bookmarkStart w:id="250" w:name="ref-ram1997density"/>
     <w:p>
       <w:pPr>
         <w:pStyle w:val="Bibliography"/>
@@ -19264,7 +19548,7 @@
       <w:r>
         <w:t xml:space="preserve"> </w:t>
       </w:r>
-      <w:hyperlink r:id="rId247">
+      <w:hyperlink r:id="rId249">
         <w:r>
           <w:rPr>
             <w:rStyle w:val="Hyperlink"/>
@@ -19276,8 +19560,8 @@
         <w:t xml:space="preserve">.</w:t>
       </w:r>
     </w:p>
-    <w:bookmarkEnd w:id="248"/>
-    <w:bookmarkStart w:id="250" w:name="ref-ribbiso2021heme"/>
+    <w:bookmarkEnd w:id="250"/>
+    <w:bookmarkStart w:id="252" w:name="ref-ribbiso2021heme"/>
     <w:p>
       <w:pPr>
         <w:pStyle w:val="Bibliography"/>
@@ -19323,7 +19607,7 @@
       <w:r>
         <w:t xml:space="preserve"> </w:t>
       </w:r>
-      <w:hyperlink r:id="rId249">
+      <w:hyperlink r:id="rId251">
         <w:r>
           <w:rPr>
             <w:rStyle w:val="Hyperlink"/>
@@ -19335,8 +19619,8 @@
         <w:t xml:space="preserve">.</w:t>
       </w:r>
     </w:p>
-    <w:bookmarkEnd w:id="250"/>
-    <w:bookmarkStart w:id="252" w:name="ref-rosenthal2024proteostasis"/>
+    <w:bookmarkEnd w:id="252"/>
+    <w:bookmarkStart w:id="254" w:name="ref-rosenthal2024proteostasis"/>
     <w:p>
       <w:pPr>
         <w:pStyle w:val="Bibliography"/>
@@ -19379,7 +19663,7 @@
       <w:r>
         <w:t xml:space="preserve"> </w:t>
       </w:r>
-      <w:hyperlink r:id="rId251">
+      <w:hyperlink r:id="rId253">
         <w:r>
           <w:rPr>
             <w:rStyle w:val="Hyperlink"/>
@@ -19391,8 +19675,8 @@
         <w:t xml:space="preserve">.</w:t>
       </w:r>
     </w:p>
-    <w:bookmarkEnd w:id="252"/>
-    <w:bookmarkStart w:id="254" w:name="ref-rostkowska2016silicon"/>
+    <w:bookmarkEnd w:id="254"/>
+    <w:bookmarkStart w:id="256" w:name="ref-rostkowska2016silicon"/>
     <w:p>
       <w:pPr>
         <w:pStyle w:val="Bibliography"/>
@@ -19450,7 +19734,7 @@
       <w:r>
         <w:t xml:space="preserve"> </w:t>
       </w:r>
-      <w:hyperlink r:id="rId253">
+      <w:hyperlink r:id="rId255">
         <w:r>
           <w:rPr>
             <w:rStyle w:val="Hyperlink"/>
@@ -19462,8 +19746,8 @@
         <w:t xml:space="preserve">.</w:t>
       </w:r>
     </w:p>
-    <w:bookmarkEnd w:id="254"/>
-    <w:bookmarkStart w:id="256" w:name="ref-annua2016monoterpenes"/>
+    <w:bookmarkEnd w:id="256"/>
+    <w:bookmarkStart w:id="258" w:name="ref-annua2016monoterpenes"/>
     <w:p>
       <w:pPr>
         <w:pStyle w:val="Bibliography"/>
@@ -19497,7 +19781,7 @@
       <w:r>
         <w:t xml:space="preserve"> </w:t>
       </w:r>
-      <w:hyperlink r:id="rId255">
+      <w:hyperlink r:id="rId257">
         <w:r>
           <w:rPr>
             <w:rStyle w:val="Hyperlink"/>
@@ -19509,8 +19793,8 @@
         <w:t xml:space="preserve">.</w:t>
       </w:r>
     </w:p>
-    <w:bookmarkEnd w:id="256"/>
-    <w:bookmarkStart w:id="258" w:name="ref-said2016vcd"/>
+    <w:bookmarkEnd w:id="258"/>
+    <w:bookmarkStart w:id="260" w:name="ref-said2016vcd"/>
     <w:p>
       <w:pPr>
         <w:pStyle w:val="Bibliography"/>
@@ -19556,7 +19840,7 @@
       <w:r>
         <w:t xml:space="preserve"> </w:t>
       </w:r>
-      <w:hyperlink r:id="rId257">
+      <w:hyperlink r:id="rId259">
         <w:r>
           <w:rPr>
             <w:rStyle w:val="Hyperlink"/>
@@ -19568,8 +19852,8 @@
         <w:t xml:space="preserve">.</w:t>
       </w:r>
     </w:p>
-    <w:bookmarkEnd w:id="258"/>
-    <w:bookmarkStart w:id="260" w:name="ref-sanei2023nanoliposomes"/>
+    <w:bookmarkEnd w:id="260"/>
+    <w:bookmarkStart w:id="262" w:name="ref-sanei2023nanoliposomes"/>
     <w:p>
       <w:pPr>
         <w:pStyle w:val="Bibliography"/>
@@ -19636,7 +19920,7 @@
       <w:r>
         <w:t xml:space="preserve"> </w:t>
       </w:r>
-      <w:hyperlink r:id="rId259">
+      <w:hyperlink r:id="rId261">
         <w:r>
           <w:rPr>
             <w:rStyle w:val="Hyperlink"/>
@@ -19648,8 +19932,8 @@
         <w:t xml:space="preserve">.</w:t>
       </w:r>
     </w:p>
-    <w:bookmarkEnd w:id="260"/>
-    <w:bookmarkStart w:id="262" w:name="ref-schramek2010isotope"/>
+    <w:bookmarkEnd w:id="262"/>
+    <w:bookmarkStart w:id="264" w:name="ref-schramek2010isotope"/>
     <w:p>
       <w:pPr>
         <w:pStyle w:val="Bibliography"/>
@@ -19683,7 +19967,7 @@
       <w:r>
         <w:t xml:space="preserve"> </w:t>
       </w:r>
-      <w:hyperlink r:id="rId261">
+      <w:hyperlink r:id="rId263">
         <w:r>
           <w:rPr>
             <w:rStyle w:val="Hyperlink"/>
@@ -19695,8 +19979,8 @@
         <w:t xml:space="preserve">.</w:t>
       </w:r>
     </w:p>
-    <w:bookmarkEnd w:id="262"/>
-    <w:bookmarkStart w:id="264" w:name="ref-seddiek2011herbaalba"/>
+    <w:bookmarkEnd w:id="264"/>
+    <w:bookmarkStart w:id="266" w:name="ref-seddiek2011herbaalba"/>
     <w:p>
       <w:pPr>
         <w:pStyle w:val="Bibliography"/>
@@ -19754,7 +20038,7 @@
       <w:r>
         <w:t xml:space="preserve"> </w:t>
       </w:r>
-      <w:hyperlink r:id="rId263">
+      <w:hyperlink r:id="rId265">
         <w:r>
           <w:rPr>
             <w:rStyle w:val="Hyperlink"/>
@@ -19766,8 +20050,8 @@
         <w:t xml:space="preserve">.</w:t>
       </w:r>
     </w:p>
-    <w:bookmarkEnd w:id="264"/>
-    <w:bookmarkStart w:id="266" w:name="ref-shen2012cypcpr"/>
+    <w:bookmarkEnd w:id="266"/>
+    <w:bookmarkStart w:id="268" w:name="ref-shen2012cypcpr"/>
     <w:p>
       <w:pPr>
         <w:pStyle w:val="Bibliography"/>
@@ -19825,7 +20109,7 @@
       <w:r>
         <w:t xml:space="preserve"> </w:t>
       </w:r>
-      <w:hyperlink r:id="rId265">
+      <w:hyperlink r:id="rId267">
         <w:r>
           <w:rPr>
             <w:rStyle w:val="Hyperlink"/>
@@ -19837,8 +20121,8 @@
         <w:t xml:space="preserve">.</w:t>
       </w:r>
     </w:p>
-    <w:bookmarkEnd w:id="266"/>
-    <w:bookmarkStart w:id="268" w:name="ref-shi2022annuaantimalarialmetabolomics"/>
+    <w:bookmarkEnd w:id="268"/>
+    <w:bookmarkStart w:id="270" w:name="ref-shi2022annuaantimalarialmetabolomics"/>
     <w:p>
       <w:pPr>
         <w:pStyle w:val="Bibliography"/>
@@ -19884,7 +20168,7 @@
       <w:r>
         <w:t xml:space="preserve"> </w:t>
       </w:r>
-      <w:hyperlink r:id="rId267">
+      <w:hyperlink r:id="rId269">
         <w:r>
           <w:rPr>
             <w:rStyle w:val="Hyperlink"/>
@@ -19896,8 +20180,8 @@
         <w:t xml:space="preserve">.</w:t>
       </w:r>
     </w:p>
-    <w:bookmarkEnd w:id="268"/>
-    <w:bookmarkStart w:id="270" w:name="ref-shi2018mixta1"/>
+    <w:bookmarkEnd w:id="270"/>
+    <w:bookmarkStart w:id="272" w:name="ref-shi2018mixta1"/>
     <w:p>
       <w:pPr>
         <w:pStyle w:val="Bibliography"/>
@@ -19952,7 +20236,7 @@
       <w:r>
         <w:t xml:space="preserve"> </w:t>
       </w:r>
-      <w:hyperlink r:id="rId269">
+      <w:hyperlink r:id="rId271">
         <w:r>
           <w:rPr>
             <w:rStyle w:val="Hyperlink"/>
@@ -19964,8 +20248,8 @@
         <w:t xml:space="preserve">.</w:t>
       </w:r>
     </w:p>
-    <w:bookmarkEnd w:id="270"/>
-    <w:bookmarkStart w:id="272" w:name="ref-dasilva2017annuasheep"/>
+    <w:bookmarkEnd w:id="272"/>
+    <w:bookmarkStart w:id="274" w:name="ref-dasilva2017annuasheep"/>
     <w:p>
       <w:pPr>
         <w:pStyle w:val="Bibliography"/>
@@ -20011,7 +20295,7 @@
       <w:r>
         <w:t xml:space="preserve"> </w:t>
       </w:r>
-      <w:hyperlink r:id="rId271">
+      <w:hyperlink r:id="rId273">
         <w:r>
           <w:rPr>
             <w:rStyle w:val="Hyperlink"/>
@@ -20023,8 +20307,8 @@
         <w:t xml:space="preserve">.</w:t>
       </w:r>
     </w:p>
-    <w:bookmarkEnd w:id="272"/>
-    <w:bookmarkStart w:id="274" w:name="ref-snider2021gametocytes"/>
+    <w:bookmarkEnd w:id="274"/>
+    <w:bookmarkStart w:id="276" w:name="ref-snider2021gametocytes"/>
     <w:p>
       <w:pPr>
         <w:pStyle w:val="Bibliography"/>
@@ -20082,7 +20366,7 @@
       <w:r>
         <w:t xml:space="preserve"> </w:t>
       </w:r>
-      <w:hyperlink r:id="rId273">
+      <w:hyperlink r:id="rId275">
         <w:r>
           <w:rPr>
             <w:rStyle w:val="Hyperlink"/>
@@ -20094,8 +20378,8 @@
         <w:t xml:space="preserve">.</w:t>
       </w:r>
     </w:p>
-    <w:bookmarkEnd w:id="274"/>
-    <w:bookmarkStart w:id="276" w:name="ref-soleimanifard2023kermanensis"/>
+    <w:bookmarkEnd w:id="276"/>
+    <w:bookmarkStart w:id="278" w:name="ref-soleimanifard2023kermanensis"/>
     <w:p>
       <w:pPr>
         <w:pStyle w:val="Bibliography"/>
@@ -20141,7 +20425,7 @@
       <w:r>
         <w:t xml:space="preserve"> </w:t>
       </w:r>
-      <w:hyperlink r:id="rId275">
+      <w:hyperlink r:id="rId277">
         <w:r>
           <w:rPr>
             <w:rStyle w:val="Hyperlink"/>
@@ -20153,8 +20437,8 @@
         <w:t xml:space="preserve">.</w:t>
       </w:r>
     </w:p>
-    <w:bookmarkEnd w:id="276"/>
-    <w:bookmarkStart w:id="278" w:name="ref-squires2011haemonchus"/>
+    <w:bookmarkEnd w:id="278"/>
+    <w:bookmarkStart w:id="280" w:name="ref-squires2011haemonchus"/>
     <w:p>
       <w:pPr>
         <w:pStyle w:val="Bibliography"/>
@@ -20188,7 +20472,7 @@
       <w:r>
         <w:t xml:space="preserve"> </w:t>
       </w:r>
-      <w:hyperlink r:id="rId277">
+      <w:hyperlink r:id="rId279">
         <w:r>
           <w:rPr>
             <w:rStyle w:val="Hyperlink"/>
@@ -20200,8 +20484,8 @@
         <w:t xml:space="preserve">.</w:t>
       </w:r>
     </w:p>
-    <w:bookmarkEnd w:id="278"/>
-    <w:bookmarkStart w:id="280" w:name="ref-tabari2017sieberi"/>
+    <w:bookmarkEnd w:id="280"/>
+    <w:bookmarkStart w:id="282" w:name="ref-tabari2017sieberi"/>
     <w:p>
       <w:pPr>
         <w:pStyle w:val="Bibliography"/>
@@ -20235,7 +20519,7 @@
       <w:r>
         <w:t xml:space="preserve"> </w:t>
       </w:r>
-      <w:hyperlink r:id="rId279">
+      <w:hyperlink r:id="rId281">
         <w:r>
           <w:rPr>
             <w:rStyle w:val="Hyperlink"/>
@@ -20247,8 +20531,8 @@
         <w:t xml:space="preserve">.</w:t>
       </w:r>
     </w:p>
-    <w:bookmarkEnd w:id="280"/>
-    <w:bookmarkStart w:id="282" w:name="ref-tamargo2017nanocochleate"/>
+    <w:bookmarkEnd w:id="282"/>
+    <w:bookmarkStart w:id="284" w:name="ref-tamargo2017nanocochleate"/>
     <w:p>
       <w:pPr>
         <w:pStyle w:val="Bibliography"/>
@@ -20282,7 +20566,7 @@
       <w:r>
         <w:t xml:space="preserve"> </w:t>
       </w:r>
-      <w:hyperlink r:id="rId281">
+      <w:hyperlink r:id="rId283">
         <w:r>
           <w:rPr>
             <w:rStyle w:val="Hyperlink"/>
@@ -20294,8 +20578,8 @@
         <w:t xml:space="preserve">.</w:t>
       </w:r>
     </w:p>
-    <w:bookmarkEnd w:id="282"/>
-    <w:bookmarkStart w:id="284" w:name="ref-tangnitipong2012heme"/>
+    <w:bookmarkEnd w:id="284"/>
+    <w:bookmarkStart w:id="286" w:name="ref-tangnitipong2012heme"/>
     <w:p>
       <w:pPr>
         <w:pStyle w:val="Bibliography"/>
@@ -20329,7 +20613,7 @@
       <w:r>
         <w:t xml:space="preserve"> </w:t>
       </w:r>
-      <w:hyperlink r:id="rId283">
+      <w:hyperlink r:id="rId285">
         <w:r>
           <w:rPr>
             <w:rStyle w:val="Hyperlink"/>
@@ -20341,8 +20625,8 @@
         <w:t xml:space="preserve">.</w:t>
       </w:r>
     </w:p>
-    <w:bookmarkEnd w:id="284"/>
-    <w:bookmarkStart w:id="286" w:name="ref-tariku2011absinthium"/>
+    <w:bookmarkEnd w:id="286"/>
+    <w:bookmarkStart w:id="288" w:name="ref-tariku2011absinthium"/>
     <w:p>
       <w:pPr>
         <w:pStyle w:val="Bibliography"/>
@@ -20376,7 +20660,7 @@
       <w:r>
         <w:t xml:space="preserve"> </w:t>
       </w:r>
-      <w:hyperlink r:id="rId285">
+      <w:hyperlink r:id="rId287">
         <w:r>
           <w:rPr>
             <w:rStyle w:val="Hyperlink"/>
@@ -20388,8 +20672,8 @@
         <w:t xml:space="preserve">.</w:t>
       </w:r>
     </w:p>
-    <w:bookmarkEnd w:id="286"/>
-    <w:bookmarkStart w:id="288" w:name="ref-tariq2009absinthium"/>
+    <w:bookmarkEnd w:id="288"/>
+    <w:bookmarkStart w:id="290" w:name="ref-tariq2009absinthium"/>
     <w:p>
       <w:pPr>
         <w:pStyle w:val="Bibliography"/>
@@ -20423,7 +20707,7 @@
       <w:r>
         <w:t xml:space="preserve"> </w:t>
       </w:r>
-      <w:hyperlink r:id="rId287">
+      <w:hyperlink r:id="rId289">
         <w:r>
           <w:rPr>
             <w:rStyle w:val="Hyperlink"/>
@@ -20435,8 +20719,8 @@
         <w:t xml:space="preserve">.</w:t>
       </w:r>
     </w:p>
-    <w:bookmarkEnd w:id="288"/>
-    <w:bookmarkStart w:id="290" w:name="ref-tasdemir2015antiprotozoal"/>
+    <w:bookmarkEnd w:id="290"/>
+    <w:bookmarkStart w:id="292" w:name="ref-tasdemir2015antiprotozoal"/>
     <w:p>
       <w:pPr>
         <w:pStyle w:val="Bibliography"/>
@@ -20470,7 +20754,7 @@
       <w:r>
         <w:t xml:space="preserve"> </w:t>
       </w:r>
-      <w:hyperlink r:id="rId289">
+      <w:hyperlink r:id="rId291">
         <w:r>
           <w:rPr>
             <w:rStyle w:val="Hyperlink"/>
@@ -20482,8 +20766,8 @@
         <w:t xml:space="preserve">.</w:t>
       </w:r>
     </w:p>
-    <w:bookmarkEnd w:id="290"/>
-    <w:bookmarkStart w:id="292" w:name="ref-teoh2006cyp"/>
+    <w:bookmarkEnd w:id="292"/>
+    <w:bookmarkStart w:id="294" w:name="ref-teoh2006cyp"/>
     <w:p>
       <w:pPr>
         <w:pStyle w:val="Bibliography"/>
@@ -20517,7 +20801,7 @@
       <w:r>
         <w:t xml:space="preserve"> </w:t>
       </w:r>
-      <w:hyperlink r:id="rId291">
+      <w:hyperlink r:id="rId293">
         <w:r>
           <w:rPr>
             <w:rStyle w:val="Hyperlink"/>
@@ -20529,8 +20813,8 @@
         <w:t xml:space="preserve">.</w:t>
       </w:r>
     </w:p>
-    <w:bookmarkEnd w:id="292"/>
-    <w:bookmarkStart w:id="294" w:name="ref-thofner2012histomonas"/>
+    <w:bookmarkEnd w:id="294"/>
+    <w:bookmarkStart w:id="296" w:name="ref-thofner2012histomonas"/>
     <w:p>
       <w:pPr>
         <w:pStyle w:val="Bibliography"/>
@@ -20576,7 +20860,7 @@
       <w:r>
         <w:t xml:space="preserve"> </w:t>
       </w:r>
-      <w:hyperlink r:id="rId293">
+      <w:hyperlink r:id="rId295">
         <w:r>
           <w:rPr>
             <w:rStyle w:val="Hyperlink"/>
@@ -20588,8 +20872,8 @@
         <w:t xml:space="preserve">.</w:t>
       </w:r>
     </w:p>
-    <w:bookmarkEnd w:id="294"/>
-    <w:bookmarkStart w:id="296" w:name="ref-trendafilova2021edibleartemisia"/>
+    <w:bookmarkEnd w:id="296"/>
+    <w:bookmarkStart w:id="298" w:name="ref-trendafilova2021edibleartemisia"/>
     <w:p>
       <w:pPr>
         <w:pStyle w:val="Bibliography"/>
@@ -20623,7 +20907,7 @@
       <w:r>
         <w:t xml:space="preserve"> </w:t>
       </w:r>
-      <w:hyperlink r:id="rId295">
+      <w:hyperlink r:id="rId297">
         <w:r>
           <w:rPr>
             <w:rStyle w:val="Hyperlink"/>
@@ -20635,8 +20919,8 @@
         <w:t xml:space="preserve">.</w:t>
       </w:r>
     </w:p>
-    <w:bookmarkEnd w:id="296"/>
-    <w:bookmarkStart w:id="298" w:name="ref-umaraliev2025persicabisabolanes"/>
+    <w:bookmarkEnd w:id="298"/>
+    <w:bookmarkStart w:id="300" w:name="ref-umaraliev2025persicabisabolanes"/>
     <w:p>
       <w:pPr>
         <w:pStyle w:val="Bibliography"/>
@@ -20676,7 +20960,7 @@
       <w:r>
         <w:t xml:space="preserve"> </w:t>
       </w:r>
-      <w:hyperlink r:id="rId297">
+      <w:hyperlink r:id="rId299">
         <w:r>
           <w:rPr>
             <w:rStyle w:val="Hyperlink"/>
@@ -20688,8 +20972,8 @@
         <w:t xml:space="preserve">.</w:t>
       </w:r>
     </w:p>
-    <w:bookmarkEnd w:id="298"/>
-    <w:bookmarkStart w:id="300" w:name="ref-umaraliev2026persicamonoterpenes"/>
+    <w:bookmarkEnd w:id="300"/>
+    <w:bookmarkStart w:id="302" w:name="ref-umaraliev2026persicamonoterpenes"/>
     <w:p>
       <w:pPr>
         <w:pStyle w:val="Bibliography"/>
@@ -20729,7 +21013,7 @@
       <w:r>
         <w:t xml:space="preserve"> </w:t>
       </w:r>
-      <w:hyperlink r:id="rId299">
+      <w:hyperlink r:id="rId301">
         <w:r>
           <w:rPr>
             <w:rStyle w:val="Hyperlink"/>
@@ -20741,8 +21025,8 @@
         <w:t xml:space="preserve">.</w:t>
       </w:r>
     </w:p>
-    <w:bookmarkEnd w:id="300"/>
-    <w:bookmarkStart w:id="302" w:name="ref-urban2020trpc3"/>
+    <w:bookmarkEnd w:id="302"/>
+    <w:bookmarkStart w:id="304" w:name="ref-urban2020trpc3"/>
     <w:p>
       <w:pPr>
         <w:pStyle w:val="Bibliography"/>
@@ -20788,7 +21072,7 @@
       <w:r>
         <w:t xml:space="preserve"> </w:t>
       </w:r>
-      <w:hyperlink r:id="rId301">
+      <w:hyperlink r:id="rId303">
         <w:r>
           <w:rPr>
             <w:rStyle w:val="Hyperlink"/>
@@ -20800,8 +21084,8 @@
         <w:t xml:space="preserve">.</w:t>
       </w:r>
     </w:p>
-    <w:bookmarkEnd w:id="302"/>
-    <w:bookmarkStart w:id="304" w:name="ref-varadyova2018medicinalplants"/>
+    <w:bookmarkEnd w:id="304"/>
+    <w:bookmarkStart w:id="306" w:name="ref-varadyova2018medicinalplants"/>
     <w:p>
       <w:pPr>
         <w:pStyle w:val="Bibliography"/>
@@ -20844,7 +21128,7 @@
       <w:r>
         <w:t xml:space="preserve"> </w:t>
       </w:r>
-      <w:hyperlink r:id="rId303">
+      <w:hyperlink r:id="rId305">
         <w:r>
           <w:rPr>
             <w:rStyle w:val="Hyperlink"/>
@@ -20856,8 +21140,8 @@
         <w:t xml:space="preserve">.</w:t>
       </w:r>
     </w:p>
-    <w:bookmarkEnd w:id="304"/>
-    <w:bookmarkStart w:id="306" w:name="ref-walz2024aframalaria"/>
+    <w:bookmarkEnd w:id="306"/>
+    <w:bookmarkStart w:id="308" w:name="ref-walz2024aframalaria"/>
     <w:p>
       <w:pPr>
         <w:pStyle w:val="Bibliography"/>
@@ -20903,7 +21187,7 @@
       <w:r>
         <w:t xml:space="preserve"> </w:t>
       </w:r>
-      <w:hyperlink r:id="rId305">
+      <w:hyperlink r:id="rId307">
         <w:r>
           <w:rPr>
             <w:rStyle w:val="Hyperlink"/>
@@ -20915,8 +21199,8 @@
         <w:t xml:space="preserve">.</w:t>
       </w:r>
     </w:p>
-    <w:bookmarkEnd w:id="306"/>
-    <w:bookmarkStart w:id="308" w:name="ref-wang2013cyp71av1promoter"/>
+    <w:bookmarkEnd w:id="308"/>
+    <w:bookmarkStart w:id="310" w:name="ref-wang2013cyp71av1promoter"/>
     <w:p>
       <w:pPr>
         <w:pStyle w:val="Bibliography"/>
@@ -20950,7 +21234,7 @@
       <w:r>
         <w:t xml:space="preserve"> </w:t>
       </w:r>
-      <w:hyperlink r:id="rId307">
+      <w:hyperlink r:id="rId309">
         <w:r>
           <w:rPr>
             <w:rStyle w:val="Hyperlink"/>
@@ -20962,8 +21246,8 @@
         <w:t xml:space="preserve">.</w:t>
       </w:r>
     </w:p>
-    <w:bookmarkEnd w:id="308"/>
-    <w:bookmarkStart w:id="310" w:name="ref-wang2009trichometranscriptome"/>
+    <w:bookmarkEnd w:id="310"/>
+    <w:bookmarkStart w:id="312" w:name="ref-wang2009trichometranscriptome"/>
     <w:p>
       <w:pPr>
         <w:pStyle w:val="Bibliography"/>
@@ -20997,7 +21281,7 @@
       <w:r>
         <w:t xml:space="preserve"> </w:t>
       </w:r>
-      <w:hyperlink r:id="rId309">
+      <w:hyperlink r:id="rId311">
         <w:r>
           <w:rPr>
             <w:rStyle w:val="Hyperlink"/>
@@ -21009,8 +21293,8 @@
         <w:t xml:space="preserve">.</w:t>
       </w:r>
     </w:p>
-    <w:bookmarkEnd w:id="310"/>
-    <w:bookmarkStart w:id="312" w:name="ref-wani2023nitric"/>
+    <w:bookmarkEnd w:id="312"/>
+    <w:bookmarkStart w:id="314" w:name="ref-wani2023nitric"/>
     <w:p>
       <w:pPr>
         <w:pStyle w:val="Bibliography"/>
@@ -21068,7 +21352,7 @@
       <w:r>
         <w:t xml:space="preserve"> </w:t>
       </w:r>
-      <w:hyperlink r:id="rId311">
+      <w:hyperlink r:id="rId313">
         <w:r>
           <w:rPr>
             <w:rStyle w:val="Hyperlink"/>
@@ -21080,8 +21364,8 @@
         <w:t xml:space="preserve">.</w:t>
       </w:r>
     </w:p>
-    <w:bookmarkEnd w:id="312"/>
-    <w:bookmarkStart w:id="314" w:name="ref-wani2026maritima"/>
+    <w:bookmarkEnd w:id="314"/>
+    <w:bookmarkStart w:id="316" w:name="ref-wani2026maritima"/>
     <w:p>
       <w:pPr>
         <w:pStyle w:val="Bibliography"/>
@@ -21127,7 +21411,7 @@
       <w:r>
         <w:t xml:space="preserve"> </w:t>
       </w:r>
-      <w:hyperlink r:id="rId313">
+      <w:hyperlink r:id="rId315">
         <w:r>
           <w:rPr>
             <w:rStyle w:val="Hyperlink"/>
@@ -21139,8 +21423,8 @@
         <w:t xml:space="preserve">.</w:t>
       </w:r>
     </w:p>
-    <w:bookmarkEnd w:id="314"/>
-    <w:bookmarkStart w:id="316" w:name="ref-wetmore2019psiv9"/>
+    <w:bookmarkEnd w:id="316"/>
+    <w:bookmarkStart w:id="318" w:name="ref-wetmore2019psiv9"/>
     <w:p>
       <w:pPr>
         <w:pStyle w:val="Bibliography"/>
@@ -21186,7 +21470,7 @@
       <w:r>
         <w:t xml:space="preserve"> </w:t>
       </w:r>
-      <w:hyperlink r:id="rId315">
+      <w:hyperlink r:id="rId317">
         <w:r>
           <w:rPr>
             <w:rStyle w:val="Hyperlink"/>
@@ -21198,8 +21482,8 @@
         <w:t xml:space="preserve">.</w:t>
       </w:r>
     </w:p>
-    <w:bookmarkEnd w:id="316"/>
-    <w:bookmarkStart w:id="318" w:name="ref-wiedosari2017eimeria"/>
+    <w:bookmarkEnd w:id="318"/>
+    <w:bookmarkStart w:id="320" w:name="ref-wiedosari2017eimeria"/>
     <w:p>
       <w:pPr>
         <w:pStyle w:val="Bibliography"/>
@@ -21254,7 +21538,7 @@
       <w:r>
         <w:t xml:space="preserve"> </w:t>
       </w:r>
-      <w:hyperlink r:id="rId317">
+      <w:hyperlink r:id="rId319">
         <w:r>
           <w:rPr>
             <w:rStyle w:val="Hyperlink"/>
@@ -21266,8 +21550,8 @@
         <w:t xml:space="preserve">.</w:t>
       </w:r>
     </w:p>
-    <w:bookmarkEnd w:id="318"/>
-    <w:bookmarkStart w:id="320" w:name="ref-wright2010qinghao"/>
+    <w:bookmarkEnd w:id="320"/>
+    <w:bookmarkStart w:id="322" w:name="ref-wright2010qinghao"/>
     <w:p>
       <w:pPr>
         <w:pStyle w:val="Bibliography"/>
@@ -21313,7 +21597,7 @@
       <w:r>
         <w:t xml:space="preserve"> </w:t>
       </w:r>
-      <w:hyperlink r:id="rId319">
+      <w:hyperlink r:id="rId321">
         <w:r>
           <w:rPr>
             <w:rStyle w:val="Hyperlink"/>
@@ -21325,8 +21609,8 @@
         <w:t xml:space="preserve">.</w:t>
       </w:r>
     </w:p>
-    <w:bookmarkEnd w:id="320"/>
-    <w:bookmarkStart w:id="322" w:name="ref-xiang2019bhlh112"/>
+    <w:bookmarkEnd w:id="322"/>
+    <w:bookmarkStart w:id="324" w:name="ref-xiang2019bhlh112"/>
     <w:p>
       <w:pPr>
         <w:pStyle w:val="Bibliography"/>
@@ -21360,7 +21644,7 @@
       <w:r>
         <w:t xml:space="preserve"> </w:t>
       </w:r>
-      <w:hyperlink r:id="rId321">
+      <w:hyperlink r:id="rId323">
         <w:r>
           <w:rPr>
             <w:rStyle w:val="Hyperlink"/>
@@ -21372,8 +21656,8 @@
         <w:t xml:space="preserve">.</w:t>
       </w:r>
     </w:p>
-    <w:bookmarkEnd w:id="322"/>
-    <w:bookmarkStart w:id="324" w:name="ref-xu2025plantmatrix"/>
+    <w:bookmarkEnd w:id="324"/>
+    <w:bookmarkStart w:id="326" w:name="ref-xu2025plantmatrix"/>
     <w:p>
       <w:pPr>
         <w:pStyle w:val="Bibliography"/>
@@ -21419,7 +21703,7 @@
       <w:r>
         <w:t xml:space="preserve"> </w:t>
       </w:r>
-      <w:hyperlink r:id="rId323">
+      <w:hyperlink r:id="rId325">
         <w:r>
           <w:rPr>
             <w:rStyle w:val="Hyperlink"/>
@@ -21431,8 +21715,8 @@
         <w:t xml:space="preserve">.</w:t>
       </w:r>
     </w:p>
-    <w:bookmarkEnd w:id="324"/>
-    <w:bookmarkStart w:id="326" w:name="ref-xu2026artemisininpk"/>
+    <w:bookmarkEnd w:id="326"/>
+    <w:bookmarkStart w:id="328" w:name="ref-xu2026artemisininpk"/>
     <w:p>
       <w:pPr>
         <w:pStyle w:val="Bibliography"/>
@@ -21478,7 +21762,7 @@
       <w:r>
         <w:t xml:space="preserve"> </w:t>
       </w:r>
-      <w:hyperlink r:id="rId325">
+      <w:hyperlink r:id="rId327">
         <w:r>
           <w:rPr>
             <w:rStyle w:val="Hyperlink"/>
@@ -21490,8 +21774,8 @@
         <w:t xml:space="preserve">.</w:t>
       </w:r>
     </w:p>
-    <w:bookmarkEnd w:id="326"/>
-    <w:bookmarkStart w:id="328" w:name="ref-yildiz2011toxocara"/>
+    <w:bookmarkEnd w:id="328"/>
+    <w:bookmarkStart w:id="330" w:name="ref-yildiz2011toxocara"/>
     <w:p>
       <w:pPr>
         <w:pStyle w:val="Bibliography"/>
@@ -21549,7 +21833,7 @@
       <w:r>
         <w:t xml:space="preserve"> </w:t>
       </w:r>
-      <w:hyperlink r:id="rId327">
+      <w:hyperlink r:id="rId329">
         <w:r>
           <w:rPr>
             <w:rStyle w:val="Hyperlink"/>
@@ -21561,8 +21845,8 @@
         <w:t xml:space="preserve">.</w:t>
       </w:r>
     </w:p>
-    <w:bookmarkEnd w:id="328"/>
-    <w:bookmarkStart w:id="330" w:name="ref-zehra2020copper"/>
+    <w:bookmarkEnd w:id="330"/>
+    <w:bookmarkStart w:id="332" w:name="ref-zehra2020copper"/>
     <w:p>
       <w:pPr>
         <w:pStyle w:val="Bibliography"/>
@@ -21608,7 +21892,7 @@
       <w:r>
         <w:t xml:space="preserve"> </w:t>
       </w:r>
-      <w:hyperlink r:id="rId329">
+      <w:hyperlink r:id="rId331">
         <w:r>
           <w:rPr>
             <w:rStyle w:val="Hyperlink"/>
@@ -21620,8 +21904,8 @@
         <w:t xml:space="preserve">.</w:t>
       </w:r>
     </w:p>
-    <w:bookmarkEnd w:id="330"/>
-    <w:bookmarkStart w:id="332" w:name="ref-zhang2022fiveartemisia"/>
+    <w:bookmarkEnd w:id="332"/>
+    <w:bookmarkStart w:id="334" w:name="ref-zhang2022fiveartemisia"/>
     <w:p>
       <w:pPr>
         <w:pStyle w:val="Bibliography"/>
@@ -21667,7 +21951,7 @@
       <w:r>
         <w:t xml:space="preserve"> </w:t>
       </w:r>
-      <w:hyperlink r:id="rId331">
+      <w:hyperlink r:id="rId333">
         <w:r>
           <w:rPr>
             <w:rStyle w:val="Hyperlink"/>
@@ -21679,8 +21963,8 @@
         <w:t xml:space="preserve">.</w:t>
       </w:r>
     </w:p>
-    <w:bookmarkEnd w:id="332"/>
-    <w:bookmarkStart w:id="334" w:name="ref-zhang2026annuaenhancement"/>
+    <w:bookmarkEnd w:id="334"/>
+    <w:bookmarkStart w:id="336" w:name="ref-zhang2026annuaenhancement"/>
     <w:p>
       <w:pPr>
         <w:pStyle w:val="Bibliography"/>
@@ -21726,7 +22010,7 @@
       <w:r>
         <w:t xml:space="preserve"> </w:t>
       </w:r>
-      <w:hyperlink r:id="rId333">
+      <w:hyperlink r:id="rId335">
         <w:r>
           <w:rPr>
             <w:rStyle w:val="Hyperlink"/>
@@ -21738,8 +22022,8 @@
         <w:t xml:space="preserve">.</w:t>
       </w:r>
     </w:p>
-    <w:bookmarkEnd w:id="334"/>
-    <w:bookmarkStart w:id="336" w:name="ref-zhang2020argyitriterpenoids"/>
+    <w:bookmarkEnd w:id="336"/>
+    <w:bookmarkStart w:id="338" w:name="ref-zhang2020argyitriterpenoids"/>
     <w:p>
       <w:pPr>
         <w:pStyle w:val="Bibliography"/>
@@ -21782,7 +22066,7 @@
       <w:r>
         <w:t xml:space="preserve"> </w:t>
       </w:r>
-      <w:hyperlink r:id="rId335">
+      <w:hyperlink r:id="rId337">
         <w:r>
           <w:rPr>
             <w:rStyle w:val="Hyperlink"/>
@@ -21794,8 +22078,8 @@
         <w:t xml:space="preserve">.</w:t>
       </w:r>
     </w:p>
-    <w:bookmarkEnd w:id="336"/>
-    <w:bookmarkStart w:id="338" w:name="ref-zhang2019pp2c1"/>
+    <w:bookmarkEnd w:id="338"/>
+    <w:bookmarkStart w:id="340" w:name="ref-zhang2019pp2c1"/>
     <w:p>
       <w:pPr>
         <w:pStyle w:val="Bibliography"/>
@@ -21847,7 +22131,7 @@
       <w:r>
         <w:t xml:space="preserve"> </w:t>
       </w:r>
-      <w:hyperlink r:id="rId337">
+      <w:hyperlink r:id="rId339">
         <w:r>
           <w:rPr>
             <w:rStyle w:val="Hyperlink"/>
@@ -21859,8 +22143,8 @@
         <w:t xml:space="preserve">.</w:t>
       </w:r>
     </w:p>
-    <w:bookmarkEnd w:id="338"/>
-    <w:bookmarkStart w:id="340" w:name="ref-zhang2008dbr2"/>
+    <w:bookmarkEnd w:id="340"/>
+    <w:bookmarkStart w:id="342" w:name="ref-zhang2008dbr2"/>
     <w:p>
       <w:pPr>
         <w:pStyle w:val="Bibliography"/>
@@ -21894,7 +22178,7 @@
       <w:r>
         <w:t xml:space="preserve"> </w:t>
       </w:r>
-      <w:hyperlink r:id="rId339">
+      <w:hyperlink r:id="rId341">
         <w:r>
           <w:rPr>
             <w:rStyle w:val="Hyperlink"/>
@@ -21906,8 +22190,8 @@
         <w:t xml:space="preserve">.</w:t>
       </w:r>
     </w:p>
-    <w:bookmarkEnd w:id="340"/>
-    <w:bookmarkStart w:id="342" w:name="ref-frigida2023variability"/>
+    <w:bookmarkEnd w:id="342"/>
+    <w:bookmarkStart w:id="344" w:name="ref-frigida2023variability"/>
     <w:p>
       <w:pPr>
         <w:pStyle w:val="Bibliography"/>
@@ -21941,7 +22225,7 @@
       <w:r>
         <w:t xml:space="preserve"> </w:t>
       </w:r>
-      <w:hyperlink r:id="rId341">
+      <w:hyperlink r:id="rId343">
         <w:r>
           <w:rPr>
             <w:rStyle w:val="Hyperlink"/>
@@ -21953,9 +22237,9 @@
         <w:t xml:space="preserve">.</w:t>
       </w:r>
     </w:p>
-    <w:bookmarkEnd w:id="342"/>
-    <w:bookmarkEnd w:id="343"/>
     <w:bookmarkEnd w:id="344"/>
+    <w:bookmarkEnd w:id="345"/>
+    <w:bookmarkEnd w:id="346"/>
     <w:sectPr>
       <w:headerReference w:type="default" r:id="rId9"/>
       <w:footerReference w:type="default" r:id="rId10"/>

</xml_diff>

<commit_message>
Verify Artemisia vector and extraction evidence
</commit_message>
<xml_diff>
--- a/manuscript/artemisia-terpene-review-submission.docx
+++ b/manuscript/artemisia-terpene-review-submission.docx
@@ -199,7 +199,7 @@
         <w:t xml:space="preserve"> </w:t>
       </w:r>
       <w:r>
-        <w:t xml:space="preserve">contains volatile monoterpenes and sesquiterpenes, less volatile diterpenes and triterpenes, and structurally diverse sesquiterpene lactones (STLs). These metabolites are often discussed as though a species name, a pathway gene, or an oil profile were sufficient to predict pharmacology. Here we present a source-auditable scoping review with a frozen snapshot that instead treats the specimen, accession, tissue, preparation, analytical method, parasite stage, and evidence level as the units of comparison. The Terpedia package registers 542 sources, 557 source-linked evidence records, 133 antiparasitic records, 20 parasite–protein interaction records, 179 compound/specimen records, and 411 audited article claims; 100 sources and 115 linked evidence rows have completed full-text verification, while 14 remain open. We synthesize terpene classes with biosynthetic compartmentalization, regulatory and environmental variation, and a bounded comparative-genomics analysis. Artemisinin biosynthesis in</w:t>
+        <w:t xml:space="preserve">contains volatile monoterpenes and sesquiterpenes, less volatile diterpenes and triterpenes, and structurally diverse sesquiterpene lactones (STLs). These metabolites are often discussed as though a species name, a pathway gene, or an oil profile were sufficient to predict pharmacology. Here we present a source-auditable scoping review with a frozen snapshot that instead treats the specimen, accession, tissue, preparation, analytical method, parasite stage, and evidence level as the units of comparison. The Terpedia package registers 542 sources, 557 source-linked evidence records, 133 antiparasitic records, 20 parasite–protein interaction records, 179 compound/specimen records, and 411 audited article claims; 103 sources and 118 linked evidence rows have completed full-text verification, while 11 remain open. We synthesize terpene classes with biosynthetic compartmentalization, regulatory and environmental variation, and a bounded comparative-genomics analysis. Artemisinin biosynthesis in</w:t>
       </w:r>
       <w:r>
         <w:t xml:space="preserve"> </w:t>
@@ -976,7 +976,7 @@
         <w:spacing w:before="0" w:after="120" w:line="264" w:lineRule="auto"/>
       </w:pPr>
       <w:r>
-        <w:t xml:space="preserve">The analysis is reported as a frozen scoping review rather than a completed systematic review. The retrieval snapshot contains 1,408 bounded title/abstract decisions, covering all 1,387 priority-queue records plus 21 historical or out-of-queue decisions. Full-text verification now covers 100 publicly accessible, associated-supplementary, or publisher-indexed antiparasitic sources and 115 linked evidence rows; 14 queue sources remain unverified, and no result is pooled as a final quantitative estimate. The</w:t>
+        <w:t xml:space="preserve">The analysis is reported as a frozen scoping review rather than a completed systematic review. The retrieval snapshot contains 1,408 bounded title/abstract decisions, covering all 1,387 priority-queue records plus 21 historical or out-of-queue decisions. Full-text verification now covers 103 publicly accessible, associated-supplementary, or publisher-indexed antiparasitic sources and 118 linked evidence rows; 11 queue sources remain unverified, and no result is pooled as a final quantitative estimate. The</w:t>
       </w:r>
       <w:r>
         <w:t xml:space="preserve"> </w:t>
@@ -1224,7 +1224,71 @@
         <w:t xml:space="preserve"> </w:t>
       </w:r>
       <w:r>
-        <w:t xml:space="preserve">goat records strengthen related-species veterinary comparisons but retain crude-preparation and small-study limits, the associated</w:t>
+        <w:t xml:space="preserve">goat records strengthen related-species veterinary comparisons but retain crude-preparation and small-study limits, the newly verified</w:t>
+      </w:r>
+      <w:r>
+        <w:t xml:space="preserve"> </w:t>
+      </w:r>
+      <w:r>
+        <w:rPr>
+          <w:i/>
+          <w:iCs/>
+        </w:rPr>
+        <w:t xml:space="preserve">A. gilvescens</w:t>
+      </w:r>
+      <w:r>
+        <w:t xml:space="preserve"> </w:t>
+      </w:r>
+      <w:r>
+        <w:t xml:space="preserve">oil record provides compound-resolved</w:t>
+      </w:r>
+      <w:r>
+        <w:t xml:space="preserve"> </w:t>
+      </w:r>
+      <w:r>
+        <w:rPr>
+          <w:i/>
+          <w:iCs/>
+        </w:rPr>
+        <w:t xml:space="preserve">Anopheles</w:t>
+      </w:r>
+      <w:r>
+        <w:t xml:space="preserve"> </w:t>
+      </w:r>
+      <w:r>
+        <w:t xml:space="preserve">larvicidal comparisons without mammalian or field-safety data, the newly verified thujone-rich</w:t>
+      </w:r>
+      <w:r>
+        <w:t xml:space="preserve"> </w:t>
+      </w:r>
+      <w:r>
+        <w:rPr>
+          <w:i/>
+          <w:iCs/>
+        </w:rPr>
+        <w:t xml:space="preserve">A. sieberi</w:t>
+      </w:r>
+      <w:r>
+        <w:t xml:space="preserve"> </w:t>
+      </w:r>
+      <w:r>
+        <w:t xml:space="preserve">oil record is a poultry-mite contact/fumigant phenotype rather than gastrointestinal vermifuge evidence, and the newly verified</w:t>
+      </w:r>
+      <w:r>
+        <w:t xml:space="preserve"> </w:t>
+      </w:r>
+      <w:r>
+        <w:rPr>
+          <w:i/>
+          <w:iCs/>
+        </w:rPr>
+        <w:t xml:space="preserve">A. absinthium</w:t>
+      </w:r>
+      <w:r>
+        <w:t xml:space="preserve"> </w:t>
+      </w:r>
+      <w:r>
+        <w:t xml:space="preserve">extraction-method study shows acaricidal potency differences with a candidate sesquiterpene association but no causal constituent; the associated</w:t>
       </w:r>
       <w:r>
         <w:t xml:space="preserve"> </w:t>

</xml_diff>

<commit_message>
Verify comparative antiparasitic evidence tranche
</commit_message>
<xml_diff>
--- a/manuscript/artemisia-terpene-review-submission.docx
+++ b/manuscript/artemisia-terpene-review-submission.docx
@@ -199,7 +199,7 @@
         <w:t xml:space="preserve"> </w:t>
       </w:r>
       <w:r>
-        <w:t xml:space="preserve">contains volatile monoterpenes and sesquiterpenes, less volatile diterpenes and triterpenes, and structurally diverse sesquiterpene lactones (STLs). These metabolites are often discussed as though a species name, a pathway gene, or an oil profile were sufficient to predict pharmacology. Here we present a source-auditable scoping review with a frozen snapshot that instead treats the specimen, accession, tissue, preparation, analytical method, parasite stage, and evidence level as the units of comparison. The Terpedia package registers 542 sources, 557 source-linked evidence records, 133 antiparasitic records, 20 parasite–protein interaction records, 179 compound/specimen records, and 411 audited article claims; 103 sources and 118 linked evidence rows have completed full-text verification, while 11 remain open. We synthesize terpene classes with biosynthetic compartmentalization, regulatory and environmental variation, and a bounded comparative-genomics analysis. Artemisinin biosynthesis in</w:t>
+        <w:t xml:space="preserve">contains volatile monoterpenes and sesquiterpenes, less volatile diterpenes and triterpenes, and structurally diverse sesquiterpene lactones (STLs). These metabolites are often discussed as though a species name, a pathway gene, or an oil profile were sufficient to predict pharmacology. Here we present a source-auditable scoping review with a frozen snapshot that instead treats the specimen, accession, tissue, preparation, analytical method, parasite stage, and evidence level as the units of comparison. The Terpedia package registers 542 sources, 557 source-linked evidence records, 133 antiparasitic records, 20 parasite–protein interaction records, 179 compound/specimen records, and 411 audited article claims; 110 sources and 126 linked evidence rows have completed full-text verification, while 4 remain open. We synthesize terpene classes with biosynthetic compartmentalization, regulatory and environmental variation, and a bounded comparative-genomics analysis. Artemisinin biosynthesis in</w:t>
       </w:r>
       <w:r>
         <w:t xml:space="preserve"> </w:t>
@@ -976,7 +976,7 @@
         <w:spacing w:before="0" w:after="120" w:line="264" w:lineRule="auto"/>
       </w:pPr>
       <w:r>
-        <w:t xml:space="preserve">The analysis is reported as a frozen scoping review rather than a completed systematic review. The retrieval snapshot contains 1,408 bounded title/abstract decisions, covering all 1,387 priority-queue records plus 21 historical or out-of-queue decisions. Full-text verification now covers 103 publicly accessible, associated-supplementary, or publisher-indexed antiparasitic sources and 118 linked evidence rows; 11 queue sources remain unverified, and no result is pooled as a final quantitative estimate. The</w:t>
+        <w:t xml:space="preserve">The analysis is reported as a frozen scoping review rather than a completed systematic review. The retrieval snapshot contains 1,408 bounded title/abstract decisions, covering all 1,387 priority-queue records plus 21 historical or out-of-queue decisions. Full-text verification now covers 110 publicly accessible, associated-supplementary, or publisher-indexed antiparasitic sources and 126 linked evidence rows; 4 queue sources remain unverified, and no result is pooled as a final quantitative estimate. The</w:t>
       </w:r>
       <w:r>
         <w:t xml:space="preserve"> </w:t>
@@ -1288,7 +1288,152 @@
         <w:t xml:space="preserve"> </w:t>
       </w:r>
       <w:r>
-        <w:t xml:space="preserve">extraction-method study shows acaricidal potency differences with a candidate sesquiterpene association but no causal constituent; the associated</w:t>
+        <w:t xml:space="preserve">extraction-method study shows acaricidal potency differences with a candidate sesquiterpene association but no causal constituent; the newly verified</w:t>
+      </w:r>
+      <w:r>
+        <w:t xml:space="preserve"> </w:t>
+      </w:r>
+      <w:r>
+        <w:rPr>
+          <w:i/>
+          <w:iCs/>
+        </w:rPr>
+        <w:t xml:space="preserve">A. annua</w:t>
+      </w:r>
+      <w:r>
+        <w:t xml:space="preserve">/</w:t>
+      </w:r>
+      <w:r>
+        <w:rPr>
+          <w:i/>
+          <w:iCs/>
+        </w:rPr>
+        <w:t xml:space="preserve">E. tenella</w:t>
+      </w:r>
+      <w:r>
+        <w:t xml:space="preserve"> </w:t>
+      </w:r>
+      <w:r>
+        <w:t xml:space="preserve">record adds a host-response comparison of purified artemisinin and dried leaves without standardized leaf chemistry, the newly verified</w:t>
+      </w:r>
+      <w:r>
+        <w:t xml:space="preserve"> </w:t>
+      </w:r>
+      <w:r>
+        <w:rPr>
+          <w:i/>
+          <w:iCs/>
+        </w:rPr>
+        <w:t xml:space="preserve">A. inculta</w:t>
+      </w:r>
+      <w:r>
+        <w:t xml:space="preserve"> </w:t>
+      </w:r>
+      <w:r>
+        <w:t xml:space="preserve">record adds crude-extract schistosomiasis and marrow-safety context without broader organ toxicology, the newly verified</w:t>
+      </w:r>
+      <w:r>
+        <w:t xml:space="preserve"> </w:t>
+      </w:r>
+      <w:r>
+        <w:rPr>
+          <w:i/>
+          <w:iCs/>
+        </w:rPr>
+        <w:t xml:space="preserve">A. maritima</w:t>
+      </w:r>
+      <w:r>
+        <w:t xml:space="preserve"> </w:t>
+      </w:r>
+      <w:r>
+        <w:t xml:space="preserve">record adds a contemporary whole-powder sheep comparator with moderate FECR but no terpene profile, the newly verified</w:t>
+      </w:r>
+      <w:r>
+        <w:t xml:space="preserve"> </w:t>
+      </w:r>
+      <w:r>
+        <w:rPr>
+          <w:i/>
+          <w:iCs/>
+        </w:rPr>
+        <w:t xml:space="preserve">A. abyssinica</w:t>
+      </w:r>
+      <w:r>
+        <w:t xml:space="preserve"> </w:t>
+      </w:r>
+      <w:r>
+        <w:t xml:space="preserve">oil record adds oxygenated-monoterpene-rich</w:t>
+      </w:r>
+      <w:r>
+        <w:t xml:space="preserve"> </w:t>
+      </w:r>
+      <w:r>
+        <w:rPr>
+          <w:i/>
+          <w:iCs/>
+        </w:rPr>
+        <w:t xml:space="preserve">Leishmania</w:t>
+      </w:r>
+      <w:r>
+        <w:t xml:space="preserve"> </w:t>
+      </w:r>
+      <w:r>
+        <w:t xml:space="preserve">activity with variable mammalian/erythrocyte toxicity, the newly verified four-species Ethiopian extract record separates</w:t>
+      </w:r>
+      <w:r>
+        <w:t xml:space="preserve"> </w:t>
+      </w:r>
+      <w:r>
+        <w:rPr>
+          <w:i/>
+          <w:iCs/>
+        </w:rPr>
+        <w:t xml:space="preserve">A. absinthium</w:t>
+      </w:r>
+      <w:r>
+        <w:t xml:space="preserve"> </w:t>
+      </w:r>
+      <w:r>
+        <w:t xml:space="preserve">camphor-rich extract activity from purified artemisinin and other species, the newly verified purified-STL/</w:t>
+      </w:r>
+      <w:r>
+        <w:rPr>
+          <w:i/>
+          <w:iCs/>
+        </w:rPr>
+        <w:t xml:space="preserve">L. mexicana</w:t>
+      </w:r>
+      <w:r>
+        <w:t xml:space="preserve"> </w:t>
+      </w:r>
+      <w:r>
+        <w:t xml:space="preserve">record remains promastigote-only and target-protein unresolved, and the newly verified</w:t>
+      </w:r>
+      <w:r>
+        <w:t xml:space="preserve"> </w:t>
+      </w:r>
+      <w:r>
+        <w:rPr>
+          <w:i/>
+          <w:iCs/>
+        </w:rPr>
+        <w:t xml:space="preserve">A. annua</w:t>
+      </w:r>
+      <w:r>
+        <w:t xml:space="preserve">/</w:t>
+      </w:r>
+      <w:r>
+        <w:rPr>
+          <w:i/>
+          <w:iCs/>
+        </w:rPr>
+        <w:t xml:space="preserve">Culex</w:t>
+      </w:r>
+      <w:r>
+        <w:t xml:space="preserve"> </w:t>
+      </w:r>
+      <w:r>
+        <w:t xml:space="preserve">record separates solvent extracts from purified artemisinin without non-target or field-safety data. The associated</w:t>
       </w:r>
       <w:r>
         <w:t xml:space="preserve"> </w:t>
@@ -9737,6 +9882,175 @@
         <w:spacing w:before="0" w:after="120" w:line="264" w:lineRule="auto"/>
       </w:pPr>
       <w:r>
+        <w:t xml:space="preserve">The newly verified records reinforce those separations. An oxygenated-monoterpene-rich</w:t>
+      </w:r>
+      <w:r>
+        <w:t xml:space="preserve"> </w:t>
+      </w:r>
+      <w:r>
+        <w:rPr>
+          <w:i/>
+          <w:iCs/>
+        </w:rPr>
+        <w:t xml:space="preserve">A. abyssinica</w:t>
+      </w:r>
+      <w:r>
+        <w:t xml:space="preserve"> </w:t>
+      </w:r>
+      <w:r>
+        <w:t xml:space="preserve">oil inhibited</w:t>
+      </w:r>
+      <w:r>
+        <w:t xml:space="preserve"> </w:t>
+      </w:r>
+      <w:r>
+        <w:rPr>
+          <w:i/>
+          <w:iCs/>
+        </w:rPr>
+        <w:t xml:space="preserve">Leishmania</w:t>
+      </w:r>
+      <w:r>
+        <w:t xml:space="preserve"> </w:t>
+      </w:r>
+      <w:r>
+        <w:t xml:space="preserve">promastigote and axenic-amastigote systems but showed highly variable THP-1 and erythrocyte toxicity. Purified helenalin, mexicanin, and dehydroleucodine inhibited</w:t>
+      </w:r>
+      <w:r>
+        <w:t xml:space="preserve"> </w:t>
+      </w:r>
+      <w:r>
+        <w:rPr>
+          <w:i/>
+          <w:iCs/>
+        </w:rPr>
+        <w:t xml:space="preserve">L. mexicana</w:t>
+      </w:r>
+      <w:r>
+        <w:t xml:space="preserve"> </w:t>
+      </w:r>
+      <w:r>
+        <w:t xml:space="preserve">promastigotes at estimated 2–4 micromolar IC50 values with rapid, irreversible effects and DNA fragmentation, but amastigote and protein-target evidence remained incomplete. A four-species Ethiopian extract comparison found</w:t>
+      </w:r>
+      <w:r>
+        <w:t xml:space="preserve"> </w:t>
+      </w:r>
+      <w:r>
+        <w:rPr>
+          <w:i/>
+          <w:iCs/>
+        </w:rPr>
+        <w:t xml:space="preserve">A. abyssinica</w:t>
+      </w:r>
+      <w:r>
+        <w:t xml:space="preserve"> </w:t>
+      </w:r>
+      <w:r>
+        <w:t xml:space="preserve">dichloromethane extract more active against bloodstream</w:t>
+      </w:r>
+      <w:r>
+        <w:t xml:space="preserve"> </w:t>
+      </w:r>
+      <w:r>
+        <w:rPr>
+          <w:i/>
+          <w:iCs/>
+        </w:rPr>
+        <w:t xml:space="preserve">T. brucei</w:t>
+      </w:r>
+      <w:r>
+        <w:t xml:space="preserve"> </w:t>
+      </w:r>
+      <w:r>
+        <w:t xml:space="preserve">than purified artemisinin, while</w:t>
+      </w:r>
+      <w:r>
+        <w:t xml:space="preserve"> </w:t>
+      </w:r>
+      <w:r>
+        <w:rPr>
+          <w:i/>
+          <w:iCs/>
+        </w:rPr>
+        <w:t xml:space="preserve">A. absinthium</w:t>
+      </w:r>
+      <w:r>
+        <w:t xml:space="preserve"> </w:t>
+      </w:r>
+      <w:r>
+        <w:t xml:space="preserve">camphor-rich extract composition did not establish camphor causality. In poultry coccidiosis, purified artemisinin and dried</w:t>
+      </w:r>
+      <w:r>
+        <w:t xml:space="preserve"> </w:t>
+      </w:r>
+      <w:r>
+        <w:rPr>
+          <w:i/>
+          <w:iCs/>
+        </w:rPr>
+        <w:t xml:space="preserve">A. annua</w:t>
+      </w:r>
+      <w:r>
+        <w:t xml:space="preserve"> </w:t>
+      </w:r>
+      <w:r>
+        <w:t xml:space="preserve">leaves were associated with apoptosis and inflammatory-response changes, but leaf chemistry and direct parasite action were unresolved. Crude ethanolic</w:t>
+      </w:r>
+      <w:r>
+        <w:t xml:space="preserve"> </w:t>
+      </w:r>
+      <w:r>
+        <w:rPr>
+          <w:i/>
+          <w:iCs/>
+        </w:rPr>
+        <w:t xml:space="preserve">A. inculta</w:t>
+      </w:r>
+      <w:r>
+        <w:t xml:space="preserve"> </w:t>
+      </w:r>
+      <w:r>
+        <w:t xml:space="preserve">reduced schistosome burden in mice at repeated 500–800 mg/kg regimens with preserved marrow morphology, whereas a contemporary</w:t>
+      </w:r>
+      <w:r>
+        <w:t xml:space="preserve"> </w:t>
+      </w:r>
+      <w:r>
+        <w:rPr>
+          <w:i/>
+          <w:iCs/>
+        </w:rPr>
+        <w:t xml:space="preserve">A. maritima</w:t>
+      </w:r>
+      <w:r>
+        <w:t xml:space="preserve"> </w:t>
+      </w:r>
+      <w:r>
+        <w:t xml:space="preserve">whole-powder trial produced moderate FECR in naturally infected sheep. These records strengthen comparative phenotype and safety context without creating evidence for a wormwood terpene mechanism or a universal</w:t>
+      </w:r>
+      <w:r>
+        <w:t xml:space="preserve"> </w:t>
+      </w:r>
+      <w:r>
+        <w:rPr>
+          <w:i/>
+          <w:iCs/>
+        </w:rPr>
+        <w:t xml:space="preserve">Artemisia</w:t>
+      </w:r>
+      <w:r>
+        <w:t xml:space="preserve"> </w:t>
+      </w:r>
+      <w:r>
+        <w:t xml:space="preserve">treatment effect.</w:t>
+      </w:r>
+    </w:p>
+    <w:p>
+      <w:pPr>
+        <w:pStyle w:val="BodyText"/>
+        <w:spacing w:before="0" w:after="120" w:line="264" w:lineRule="auto"/>
+      </w:pPr>
+      <w:r>
         <w:t xml:space="preserve">Full-text extraction illustrates why oil composition and formulation must be retained together. In a vouchered Tunisian comparison,</w:t>
       </w:r>
       <w:r>
@@ -12465,6 +12779,692 @@
                 <w:sz w:val="18"/>
               </w:rPr>
               <w:t xml:space="preserve">(T. Wani et al. 2026)</w:t>
+            </w:r>
+          </w:p>
+        </w:tc>
+      </w:tr>
+      <w:tr>
+        <w:trPr>
+          <w:cantSplit w:val="true"/>
+        </w:trPr>
+        <w:tc>
+          <w:tcPr>
+            <w:tcW w:w="1800" w:type="dxa"/>
+            <w:tcMar>
+              <w:top w:w="80" w:type="dxa"/>
+              <w:start w:w="120" w:type="dxa"/>
+              <w:bottom w:w="80" w:type="dxa"/>
+              <w:end w:w="120" w:type="dxa"/>
+            </w:tcMar>
+            <w:vAlign w:val="center"/>
+          </w:tcPr>
+          <w:p>
+            <w:pPr>
+              <w:pStyle w:val="Compact"/>
+              <w:spacing w:before="0" w:after="40" w:line="240" w:lineRule="auto"/>
+            </w:pPr>
+            <w:r>
+              <w:rPr>
+                <w:rFonts w:ascii="Calibri" w:hAnsi="Calibri"/>
+                <w:i/>
+                <w:iCs/>
+                <w:sz w:val="18"/>
+              </w:rPr>
+              <w:t xml:space="preserve">A. annua</w:t>
+            </w:r>
+            <w:r>
+              <w:rPr>
+                <w:rFonts w:ascii="Calibri" w:hAnsi="Calibri"/>
+                <w:sz w:val="18"/>
+              </w:rPr>
+              <w:t xml:space="preserve"> </w:t>
+            </w:r>
+            <w:r>
+              <w:rPr>
+                <w:rFonts w:ascii="Calibri" w:hAnsi="Calibri"/>
+                <w:sz w:val="18"/>
+              </w:rPr>
+              <w:t xml:space="preserve">/</w:t>
+            </w:r>
+            <w:r>
+              <w:rPr>
+                <w:rFonts w:ascii="Calibri" w:hAnsi="Calibri"/>
+                <w:sz w:val="18"/>
+              </w:rPr>
+              <w:t xml:space="preserve"> </w:t>
+            </w:r>
+            <w:r>
+              <w:rPr>
+                <w:rFonts w:ascii="Calibri" w:hAnsi="Calibri"/>
+                <w:i/>
+                <w:iCs/>
+                <w:sz w:val="18"/>
+              </w:rPr>
+              <w:t xml:space="preserve">E. tenella</w:t>
+            </w:r>
+          </w:p>
+        </w:tc>
+        <w:tc>
+          <w:tcPr>
+            <w:tcW w:w="2800" w:type="dxa"/>
+            <w:tcMar>
+              <w:top w:w="80" w:type="dxa"/>
+              <w:start w:w="120" w:type="dxa"/>
+              <w:bottom w:w="80" w:type="dxa"/>
+              <w:end w:w="120" w:type="dxa"/>
+            </w:tcMar>
+            <w:vAlign w:val="center"/>
+          </w:tcPr>
+          <w:p>
+            <w:pPr>
+              <w:pStyle w:val="Compact"/>
+              <w:spacing w:before="0" w:after="40" w:line="240" w:lineRule="auto"/>
+            </w:pPr>
+            <w:r>
+              <w:rPr>
+                <w:rFonts w:ascii="Calibri" w:hAnsi="Calibri"/>
+                <w:sz w:val="18"/>
+              </w:rPr>
+              <w:t xml:space="preserve">Purified artemisinin and dried leaves were associated with improved clinical/pathological outcomes and reversal of host apoptosis/inflammatory markers</w:t>
+            </w:r>
+          </w:p>
+        </w:tc>
+        <w:tc>
+          <w:tcPr>
+            <w:tcW w:w="2400" w:type="dxa"/>
+            <w:tcMar>
+              <w:top w:w="80" w:type="dxa"/>
+              <w:start w:w="120" w:type="dxa"/>
+              <w:bottom w:w="80" w:type="dxa"/>
+              <w:end w:w="120" w:type="dxa"/>
+            </w:tcMar>
+            <w:vAlign w:val="center"/>
+          </w:tcPr>
+          <w:p>
+            <w:pPr>
+              <w:pStyle w:val="Compact"/>
+              <w:spacing w:before="0" w:after="40" w:line="240" w:lineRule="auto"/>
+            </w:pPr>
+            <w:r>
+              <w:rPr>
+                <w:rFonts w:ascii="Calibri" w:hAnsi="Calibri"/>
+                <w:sz w:val="18"/>
+              </w:rPr>
+              <w:t xml:space="preserve">Host-response comparison; leaf chemistry, exact dosing, direct parasite action, and standardized terpene attribution remain unresolved</w:t>
+            </w:r>
+            <w:r>
+              <w:rPr>
+                <w:rFonts w:ascii="Calibri" w:hAnsi="Calibri"/>
+                <w:sz w:val="18"/>
+              </w:rPr>
+              <w:t xml:space="preserve"> </w:t>
+            </w:r>
+            <w:r>
+              <w:rPr>
+                <w:rFonts w:ascii="Calibri" w:hAnsi="Calibri"/>
+                <w:sz w:val="18"/>
+              </w:rPr>
+              <w:t xml:space="preserve">(J. Jiao et al. 2018)</w:t>
+            </w:r>
+          </w:p>
+        </w:tc>
+      </w:tr>
+      <w:tr>
+        <w:trPr>
+          <w:cantSplit w:val="true"/>
+        </w:trPr>
+        <w:tc>
+          <w:tcPr>
+            <w:tcW w:w="1800" w:type="dxa"/>
+            <w:tcMar>
+              <w:top w:w="80" w:type="dxa"/>
+              <w:start w:w="120" w:type="dxa"/>
+              <w:bottom w:w="80" w:type="dxa"/>
+              <w:end w:w="120" w:type="dxa"/>
+            </w:tcMar>
+            <w:vAlign w:val="center"/>
+          </w:tcPr>
+          <w:p>
+            <w:pPr>
+              <w:pStyle w:val="Compact"/>
+              <w:spacing w:before="0" w:after="40" w:line="240" w:lineRule="auto"/>
+            </w:pPr>
+            <w:r>
+              <w:rPr>
+                <w:rFonts w:ascii="Calibri" w:hAnsi="Calibri"/>
+                <w:i/>
+                <w:iCs/>
+                <w:sz w:val="18"/>
+              </w:rPr>
+              <w:t xml:space="preserve">A. inculta</w:t>
+            </w:r>
+            <w:r>
+              <w:rPr>
+                <w:rFonts w:ascii="Calibri" w:hAnsi="Calibri"/>
+                <w:sz w:val="18"/>
+              </w:rPr>
+              <w:t xml:space="preserve"> </w:t>
+            </w:r>
+            <w:r>
+              <w:rPr>
+                <w:rFonts w:ascii="Calibri" w:hAnsi="Calibri"/>
+                <w:sz w:val="18"/>
+              </w:rPr>
+              <w:t xml:space="preserve">/</w:t>
+            </w:r>
+            <w:r>
+              <w:rPr>
+                <w:rFonts w:ascii="Calibri" w:hAnsi="Calibri"/>
+                <w:sz w:val="18"/>
+              </w:rPr>
+              <w:t xml:space="preserve"> </w:t>
+            </w:r>
+            <w:r>
+              <w:rPr>
+                <w:rFonts w:ascii="Calibri" w:hAnsi="Calibri"/>
+                <w:i/>
+                <w:iCs/>
+                <w:sz w:val="18"/>
+              </w:rPr>
+              <w:t xml:space="preserve">Schistosoma</w:t>
+            </w:r>
+            <w:r>
+              <w:rPr>
+                <w:rFonts w:ascii="Calibri" w:hAnsi="Calibri"/>
+                <w:sz w:val="18"/>
+              </w:rPr>
+              <w:t xml:space="preserve"> </w:t>
+            </w:r>
+            <w:r>
+              <w:rPr>
+                <w:rFonts w:ascii="Calibri" w:hAnsi="Calibri"/>
+                <w:sz w:val="18"/>
+              </w:rPr>
+              <w:t xml:space="preserve">spp.</w:t>
+            </w:r>
+          </w:p>
+        </w:tc>
+        <w:tc>
+          <w:tcPr>
+            <w:tcW w:w="2800" w:type="dxa"/>
+            <w:tcMar>
+              <w:top w:w="80" w:type="dxa"/>
+              <w:start w:w="120" w:type="dxa"/>
+              <w:bottom w:w="80" w:type="dxa"/>
+              <w:end w:w="120" w:type="dxa"/>
+            </w:tcMar>
+            <w:vAlign w:val="center"/>
+          </w:tcPr>
+          <w:p>
+            <w:pPr>
+              <w:pStyle w:val="Compact"/>
+              <w:spacing w:before="0" w:after="40" w:line="240" w:lineRule="auto"/>
+            </w:pPr>
+            <w:r>
+              <w:rPr>
+                <w:rFonts w:ascii="Calibri" w:hAnsi="Calibri"/>
+                <w:sz w:val="18"/>
+              </w:rPr>
+              <w:t xml:space="preserve">Repeated 500–800 mg/kg crude ethanolic extract regimens reduced worm load and damaged juvenile/adult tegument in infected mice; marrow morphology remained comparable to controls</w:t>
+            </w:r>
+          </w:p>
+        </w:tc>
+        <w:tc>
+          <w:tcPr>
+            <w:tcW w:w="2400" w:type="dxa"/>
+            <w:tcMar>
+              <w:top w:w="80" w:type="dxa"/>
+              <w:start w:w="120" w:type="dxa"/>
+              <w:bottom w:w="80" w:type="dxa"/>
+              <w:end w:w="120" w:type="dxa"/>
+            </w:tcMar>
+            <w:vAlign w:val="center"/>
+          </w:tcPr>
+          <w:p>
+            <w:pPr>
+              <w:pStyle w:val="Compact"/>
+              <w:spacing w:before="0" w:after="40" w:line="240" w:lineRule="auto"/>
+            </w:pPr>
+            <w:r>
+              <w:rPr>
+                <w:rFonts w:ascii="Calibri" w:hAnsi="Calibri"/>
+                <w:sz w:val="18"/>
+              </w:rPr>
+              <w:t xml:space="preserve">Crude-extract helminth and partial safety comparator; broader organ toxicology, terpene attribution, and human efficacy remain unresolved</w:t>
+            </w:r>
+            <w:r>
+              <w:rPr>
+                <w:rFonts w:ascii="Calibri" w:hAnsi="Calibri"/>
+                <w:sz w:val="18"/>
+              </w:rPr>
+              <w:t xml:space="preserve"> </w:t>
+            </w:r>
+            <w:r>
+              <w:rPr>
+                <w:rFonts w:ascii="Calibri" w:hAnsi="Calibri"/>
+                <w:sz w:val="18"/>
+              </w:rPr>
+              <w:t xml:space="preserve">(Lotfy et al. 2006)</w:t>
+            </w:r>
+          </w:p>
+        </w:tc>
+      </w:tr>
+      <w:tr>
+        <w:trPr>
+          <w:cantSplit w:val="true"/>
+        </w:trPr>
+        <w:tc>
+          <w:tcPr>
+            <w:tcW w:w="1800" w:type="dxa"/>
+            <w:tcMar>
+              <w:top w:w="80" w:type="dxa"/>
+              <w:start w:w="120" w:type="dxa"/>
+              <w:bottom w:w="80" w:type="dxa"/>
+              <w:end w:w="120" w:type="dxa"/>
+            </w:tcMar>
+            <w:vAlign w:val="center"/>
+          </w:tcPr>
+          <w:p>
+            <w:pPr>
+              <w:pStyle w:val="Compact"/>
+              <w:spacing w:before="0" w:after="40" w:line="240" w:lineRule="auto"/>
+            </w:pPr>
+            <w:r>
+              <w:rPr>
+                <w:rFonts w:ascii="Calibri" w:hAnsi="Calibri"/>
+                <w:i/>
+                <w:iCs/>
+                <w:sz w:val="18"/>
+              </w:rPr>
+              <w:t xml:space="preserve">A. abyssinica</w:t>
+            </w:r>
+            <w:r>
+              <w:rPr>
+                <w:rFonts w:ascii="Calibri" w:hAnsi="Calibri"/>
+                <w:sz w:val="18"/>
+              </w:rPr>
+              <w:t xml:space="preserve"> </w:t>
+            </w:r>
+            <w:r>
+              <w:rPr>
+                <w:rFonts w:ascii="Calibri" w:hAnsi="Calibri"/>
+                <w:sz w:val="18"/>
+              </w:rPr>
+              <w:t xml:space="preserve">oil /</w:t>
+            </w:r>
+            <w:r>
+              <w:rPr>
+                <w:rFonts w:ascii="Calibri" w:hAnsi="Calibri"/>
+                <w:sz w:val="18"/>
+              </w:rPr>
+              <w:t xml:space="preserve"> </w:t>
+            </w:r>
+            <w:r>
+              <w:rPr>
+                <w:rFonts w:ascii="Calibri" w:hAnsi="Calibri"/>
+                <w:i/>
+                <w:iCs/>
+                <w:sz w:val="18"/>
+              </w:rPr>
+              <w:t xml:space="preserve">Leishmania</w:t>
+            </w:r>
+            <w:r>
+              <w:rPr>
+                <w:rFonts w:ascii="Calibri" w:hAnsi="Calibri"/>
+                <w:sz w:val="18"/>
+              </w:rPr>
+              <w:t xml:space="preserve"> </w:t>
+            </w:r>
+            <w:r>
+              <w:rPr>
+                <w:rFonts w:ascii="Calibri" w:hAnsi="Calibri"/>
+                <w:sz w:val="18"/>
+              </w:rPr>
+              <w:t xml:space="preserve">spp.</w:t>
+            </w:r>
+          </w:p>
+        </w:tc>
+        <w:tc>
+          <w:tcPr>
+            <w:tcW w:w="2800" w:type="dxa"/>
+            <w:tcMar>
+              <w:top w:w="80" w:type="dxa"/>
+              <w:start w:w="120" w:type="dxa"/>
+              <w:bottom w:w="80" w:type="dxa"/>
+              <w:end w:w="120" w:type="dxa"/>
+            </w:tcMar>
+            <w:vAlign w:val="center"/>
+          </w:tcPr>
+          <w:p>
+            <w:pPr>
+              <w:pStyle w:val="Compact"/>
+              <w:spacing w:before="0" w:after="40" w:line="240" w:lineRule="auto"/>
+            </w:pPr>
+            <w:r>
+              <w:rPr>
+                <w:rFonts w:ascii="Calibri" w:hAnsi="Calibri"/>
+                <w:sz w:val="18"/>
+              </w:rPr>
+              <w:t xml:space="preserve">Oxygenated-monoterpene-rich oil showed promastigote and axenic-amastigote activity, with variable THP-1 and erythrocyte toxicity</w:t>
+            </w:r>
+          </w:p>
+        </w:tc>
+        <w:tc>
+          <w:tcPr>
+            <w:tcW w:w="2400" w:type="dxa"/>
+            <w:tcMar>
+              <w:top w:w="80" w:type="dxa"/>
+              <w:start w:w="120" w:type="dxa"/>
+              <w:bottom w:w="80" w:type="dxa"/>
+              <w:end w:w="120" w:type="dxa"/>
+            </w:tcMar>
+            <w:vAlign w:val="center"/>
+          </w:tcPr>
+          <w:p>
+            <w:pPr>
+              <w:pStyle w:val="Compact"/>
+              <w:spacing w:before="0" w:after="40" w:line="240" w:lineRule="auto"/>
+            </w:pPr>
+            <w:r>
+              <w:rPr>
+                <w:rFonts w:ascii="Calibri" w:hAnsi="Calibri"/>
+                <w:sz w:val="18"/>
+              </w:rPr>
+              <w:t xml:space="preserve">Profiled mixture with host context; no single constituent or parasite-protein target is established</w:t>
+            </w:r>
+            <w:r>
+              <w:rPr>
+                <w:rFonts w:ascii="Calibri" w:hAnsi="Calibri"/>
+                <w:sz w:val="18"/>
+              </w:rPr>
+              <w:t xml:space="preserve"> </w:t>
+            </w:r>
+            <w:r>
+              <w:rPr>
+                <w:rFonts w:ascii="Calibri" w:hAnsi="Calibri"/>
+                <w:sz w:val="18"/>
+              </w:rPr>
+              <w:t xml:space="preserve">(Tariku et al. 2010)</w:t>
+            </w:r>
+          </w:p>
+        </w:tc>
+      </w:tr>
+      <w:tr>
+        <w:trPr>
+          <w:cantSplit w:val="true"/>
+        </w:trPr>
+        <w:tc>
+          <w:tcPr>
+            <w:tcW w:w="1800" w:type="dxa"/>
+            <w:tcMar>
+              <w:top w:w="80" w:type="dxa"/>
+              <w:start w:w="120" w:type="dxa"/>
+              <w:bottom w:w="80" w:type="dxa"/>
+              <w:end w:w="120" w:type="dxa"/>
+            </w:tcMar>
+            <w:vAlign w:val="center"/>
+          </w:tcPr>
+          <w:p>
+            <w:pPr>
+              <w:pStyle w:val="Compact"/>
+              <w:spacing w:before="0" w:after="40" w:line="240" w:lineRule="auto"/>
+            </w:pPr>
+            <w:r>
+              <w:rPr>
+                <w:rFonts w:ascii="Calibri" w:hAnsi="Calibri"/>
+                <w:sz w:val="18"/>
+              </w:rPr>
+              <w:t xml:space="preserve">Purified STL /</w:t>
+            </w:r>
+            <w:r>
+              <w:rPr>
+                <w:rFonts w:ascii="Calibri" w:hAnsi="Calibri"/>
+                <w:sz w:val="18"/>
+              </w:rPr>
+              <w:t xml:space="preserve"> </w:t>
+            </w:r>
+            <w:r>
+              <w:rPr>
+                <w:rFonts w:ascii="Calibri" w:hAnsi="Calibri"/>
+                <w:i/>
+                <w:iCs/>
+                <w:sz w:val="18"/>
+              </w:rPr>
+              <w:t xml:space="preserve">L. mexicana</w:t>
+            </w:r>
+          </w:p>
+        </w:tc>
+        <w:tc>
+          <w:tcPr>
+            <w:tcW w:w="2800" w:type="dxa"/>
+            <w:tcMar>
+              <w:top w:w="80" w:type="dxa"/>
+              <w:start w:w="120" w:type="dxa"/>
+              <w:bottom w:w="80" w:type="dxa"/>
+              <w:end w:w="120" w:type="dxa"/>
+            </w:tcMar>
+            <w:vAlign w:val="center"/>
+          </w:tcPr>
+          <w:p>
+            <w:pPr>
+              <w:pStyle w:val="Compact"/>
+              <w:spacing w:before="0" w:after="40" w:line="240" w:lineRule="auto"/>
+            </w:pPr>
+            <w:r>
+              <w:rPr>
+                <w:rFonts w:ascii="Calibri" w:hAnsi="Calibri"/>
+                <w:sz w:val="18"/>
+              </w:rPr>
+              <w:t xml:space="preserve">Helenalin, mexicanin, and dehydroleucodine produced rapid, irreversible promastigote inhibition at estimated 2–4 micromolar IC50 values with DNA-fragmentation and vacuolization phenotypes</w:t>
+            </w:r>
+          </w:p>
+        </w:tc>
+        <w:tc>
+          <w:tcPr>
+            <w:tcW w:w="2400" w:type="dxa"/>
+            <w:tcMar>
+              <w:top w:w="80" w:type="dxa"/>
+              <w:start w:w="120" w:type="dxa"/>
+              <w:bottom w:w="80" w:type="dxa"/>
+              <w:end w:w="120" w:type="dxa"/>
+            </w:tcMar>
+            <w:vAlign w:val="center"/>
+          </w:tcPr>
+          <w:p>
+            <w:pPr>
+              <w:pStyle w:val="Compact"/>
+              <w:spacing w:before="0" w:after="40" w:line="240" w:lineRule="auto"/>
+            </w:pPr>
+            <w:r>
+              <w:rPr>
+                <w:rFonts w:ascii="Calibri" w:hAnsi="Calibri"/>
+                <w:sz w:val="18"/>
+              </w:rPr>
+              <w:t xml:space="preserve">Defined-compound stage evidence; amastigote efficacy, native</w:t>
+            </w:r>
+            <w:r>
+              <w:rPr>
+                <w:rFonts w:ascii="Calibri" w:hAnsi="Calibri"/>
+                <w:sz w:val="18"/>
+              </w:rPr>
+              <w:t xml:space="preserve"> </w:t>
+            </w:r>
+            <w:r>
+              <w:rPr>
+                <w:rFonts w:ascii="Calibri" w:hAnsi="Calibri"/>
+                <w:i/>
+                <w:iCs/>
+                <w:sz w:val="18"/>
+              </w:rPr>
+              <w:t xml:space="preserve">Artemisia</w:t>
+            </w:r>
+            <w:r>
+              <w:rPr>
+                <w:rFonts w:ascii="Calibri" w:hAnsi="Calibri"/>
+                <w:sz w:val="18"/>
+              </w:rPr>
+              <w:t xml:space="preserve"> </w:t>
+            </w:r>
+            <w:r>
+              <w:rPr>
+                <w:rFonts w:ascii="Calibri" w:hAnsi="Calibri"/>
+                <w:sz w:val="18"/>
+              </w:rPr>
+              <w:t xml:space="preserve">exposure, and protein-target identity remain open</w:t>
+            </w:r>
+            <w:r>
+              <w:rPr>
+                <w:rFonts w:ascii="Calibri" w:hAnsi="Calibri"/>
+                <w:sz w:val="18"/>
+              </w:rPr>
+              <w:t xml:space="preserve"> </w:t>
+            </w:r>
+            <w:r>
+              <w:rPr>
+                <w:rFonts w:ascii="Calibri" w:hAnsi="Calibri"/>
+                <w:sz w:val="18"/>
+              </w:rPr>
+              <w:t xml:space="preserve">(Barrera et al. 2008)</w:t>
+            </w:r>
+          </w:p>
+        </w:tc>
+      </w:tr>
+      <w:tr>
+        <w:trPr>
+          <w:cantSplit w:val="true"/>
+        </w:trPr>
+        <w:tc>
+          <w:tcPr>
+            <w:tcW w:w="1800" w:type="dxa"/>
+            <w:tcMar>
+              <w:top w:w="80" w:type="dxa"/>
+              <w:start w:w="120" w:type="dxa"/>
+              <w:bottom w:w="80" w:type="dxa"/>
+              <w:end w:w="120" w:type="dxa"/>
+            </w:tcMar>
+            <w:vAlign w:val="center"/>
+          </w:tcPr>
+          <w:p>
+            <w:pPr>
+              <w:pStyle w:val="Compact"/>
+              <w:spacing w:before="0" w:after="40" w:line="240" w:lineRule="auto"/>
+            </w:pPr>
+            <w:r>
+              <w:rPr>
+                <w:rFonts w:ascii="Calibri" w:hAnsi="Calibri"/>
+                <w:i/>
+                <w:iCs/>
+                <w:sz w:val="18"/>
+              </w:rPr>
+              <w:t xml:space="preserve">A. annua</w:t>
+            </w:r>
+            <w:r>
+              <w:rPr>
+                <w:rFonts w:ascii="Calibri" w:hAnsi="Calibri"/>
+                <w:sz w:val="18"/>
+              </w:rPr>
+              <w:t xml:space="preserve"> </w:t>
+            </w:r>
+            <w:r>
+              <w:rPr>
+                <w:rFonts w:ascii="Calibri" w:hAnsi="Calibri"/>
+                <w:sz w:val="18"/>
+              </w:rPr>
+              <w:t xml:space="preserve">extracts and artemisinin /</w:t>
+            </w:r>
+            <w:r>
+              <w:rPr>
+                <w:rFonts w:ascii="Calibri" w:hAnsi="Calibri"/>
+                <w:sz w:val="18"/>
+              </w:rPr>
+              <w:t xml:space="preserve"> </w:t>
+            </w:r>
+            <w:r>
+              <w:rPr>
+                <w:rFonts w:ascii="Calibri" w:hAnsi="Calibri"/>
+                <w:i/>
+                <w:iCs/>
+                <w:sz w:val="18"/>
+              </w:rPr>
+              <w:t xml:space="preserve">Culex</w:t>
+            </w:r>
+            <w:r>
+              <w:rPr>
+                <w:rFonts w:ascii="Calibri" w:hAnsi="Calibri"/>
+                <w:sz w:val="18"/>
+              </w:rPr>
+              <w:t xml:space="preserve"> </w:t>
+            </w:r>
+            <w:r>
+              <w:rPr>
+                <w:rFonts w:ascii="Calibri" w:hAnsi="Calibri"/>
+                <w:sz w:val="18"/>
+              </w:rPr>
+              <w:t xml:space="preserve">larvae</w:t>
+            </w:r>
+          </w:p>
+        </w:tc>
+        <w:tc>
+          <w:tcPr>
+            <w:tcW w:w="2800" w:type="dxa"/>
+            <w:tcMar>
+              <w:top w:w="80" w:type="dxa"/>
+              <w:start w:w="120" w:type="dxa"/>
+              <w:bottom w:w="80" w:type="dxa"/>
+              <w:end w:w="120" w:type="dxa"/>
+            </w:tcMar>
+            <w:vAlign w:val="center"/>
+          </w:tcPr>
+          <w:p>
+            <w:pPr>
+              <w:pStyle w:val="Compact"/>
+              <w:spacing w:before="0" w:after="40" w:line="240" w:lineRule="auto"/>
+            </w:pPr>
+            <w:r>
+              <w:rPr>
+                <w:rFonts w:ascii="Calibri" w:hAnsi="Calibri"/>
+                <w:sz w:val="18"/>
+              </w:rPr>
+              <w:t xml:space="preserve">Solvent-specific leaf extracts and purified artemisinin produced species-dependent LC50/LC90 values, with chloroform extract more potent than purified artemisinin in the indexed comparison</w:t>
+            </w:r>
+          </w:p>
+        </w:tc>
+        <w:tc>
+          <w:tcPr>
+            <w:tcW w:w="2400" w:type="dxa"/>
+            <w:tcMar>
+              <w:top w:w="80" w:type="dxa"/>
+              <w:start w:w="120" w:type="dxa"/>
+              <w:bottom w:w="80" w:type="dxa"/>
+              <w:end w:w="120" w:type="dxa"/>
+            </w:tcMar>
+            <w:vAlign w:val="center"/>
+          </w:tcPr>
+          <w:p>
+            <w:pPr>
+              <w:pStyle w:val="Compact"/>
+              <w:spacing w:before="0" w:after="40" w:line="240" w:lineRule="auto"/>
+            </w:pPr>
+            <w:r>
+              <w:rPr>
+                <w:rFonts w:ascii="Calibri" w:hAnsi="Calibri"/>
+                <w:sz w:val="18"/>
+              </w:rPr>
+              <w:t xml:space="preserve">Vector-control comparator; extract causality, non-target safety, persistence, and malaria-parasite relevance remain unresolved</w:t>
+            </w:r>
+            <w:r>
+              <w:rPr>
+                <w:rFonts w:ascii="Calibri" w:hAnsi="Calibri"/>
+                <w:sz w:val="18"/>
+              </w:rPr>
+              <w:t xml:space="preserve"> </w:t>
+            </w:r>
+            <w:r>
+              <w:rPr>
+                <w:rFonts w:ascii="Calibri" w:hAnsi="Calibri"/>
+                <w:sz w:val="18"/>
+              </w:rPr>
+              <w:t xml:space="preserve">(Sharma et al. 2012)</w:t>
             </w:r>
           </w:p>
         </w:tc>
@@ -13695,7 +14695,7 @@
     <w:bookmarkEnd w:id="50"/>
     <w:bookmarkEnd w:id="51"/>
     <w:bookmarkEnd w:id="52"/>
-    <w:bookmarkStart w:id="346" w:name="references"/>
+    <w:bookmarkStart w:id="354" w:name="references"/>
     <w:p>
       <w:pPr>
         <w:pStyle w:val="Heading1"/>
@@ -13705,7 +14705,7 @@
         <w:t xml:space="preserve">References</w:t>
       </w:r>
     </w:p>
-    <w:bookmarkStart w:id="345" w:name="refs"/>
+    <w:bookmarkStart w:id="353" w:name="refs"/>
     <w:bookmarkStart w:id="54" w:name="ref-abad2012artemisia"/>
     <w:p>
       <w:pPr>
@@ -14787,13 +15787,60 @@
       </w:r>
     </w:p>
     <w:bookmarkEnd w:id="86"/>
-    <w:bookmarkStart w:id="88" w:name="ref-beshay2018absinthiumhymenolepis"/>
+    <w:bookmarkStart w:id="88" w:name="ref-barrera2008leishmania"/>
     <w:p>
       <w:pPr>
         <w:pStyle w:val="Bibliography"/>
         <w:spacing w:before="0" w:after="120" w:line="264" w:lineRule="auto"/>
       </w:pPr>
       <w:r>
+        <w:t xml:space="preserve">Barrera, P A, V Jimenez-Ortiz, C Tonn, et al. 2008.</w:t>
+      </w:r>
+      <w:r>
+        <w:t xml:space="preserve"> </w:t>
+      </w:r>
+      <w:r>
+        <w:t xml:space="preserve">“Natural Sesquiterpene Lactones Are Active Against Leishmania Mexicana.”</w:t>
+      </w:r>
+      <w:r>
+        <w:t xml:space="preserve"> </w:t>
+      </w:r>
+      <w:r>
+        <w:rPr>
+          <w:i/>
+          <w:iCs/>
+        </w:rPr>
+        <w:t xml:space="preserve">The Journal of Parasitology</w:t>
+      </w:r>
+      <w:r>
+        <w:t xml:space="preserve"> </w:t>
+      </w:r>
+      <w:r>
+        <w:t xml:space="preserve">94 (5): 1143–49.</w:t>
+      </w:r>
+      <w:r>
+        <w:t xml:space="preserve"> </w:t>
+      </w:r>
+      <w:hyperlink r:id="rId87">
+        <w:r>
+          <w:rPr>
+            <w:rStyle w:val="Hyperlink"/>
+          </w:rPr>
+          <w:t xml:space="preserve">https://doi.org/10.1645/GE-1501.1</w:t>
+        </w:r>
+      </w:hyperlink>
+      <w:r>
+        <w:t xml:space="preserve">.</w:t>
+      </w:r>
+    </w:p>
+    <w:bookmarkEnd w:id="88"/>
+    <w:bookmarkStart w:id="90" w:name="ref-beshay2018absinthiumhymenolepis"/>
+    <w:p>
+      <w:pPr>
+        <w:pStyle w:val="Bibliography"/>
+        <w:spacing w:before="0" w:after="120" w:line="264" w:lineRule="auto"/>
+      </w:pPr>
+      <w:r>
         <w:t xml:space="preserve">Beshay, EVN. 2018.</w:t>
       </w:r>
       <w:r>
@@ -14842,7 +15889,7 @@
       <w:r>
         <w:t xml:space="preserve"> </w:t>
       </w:r>
-      <w:hyperlink r:id="rId87">
+      <w:hyperlink r:id="rId89">
         <w:r>
           <w:rPr>
             <w:rStyle w:val="Hyperlink"/>
@@ -14854,8 +15901,8 @@
         <w:t xml:space="preserve">.</w:t>
       </w:r>
     </w:p>
-    <w:bookmarkEnd w:id="88"/>
-    <w:bookmarkStart w:id="90" w:name="ref-blagojevic2015absinthiumstorage"/>
+    <w:bookmarkEnd w:id="90"/>
+    <w:bookmarkStart w:id="92" w:name="ref-blagojevic2015absinthiumstorage"/>
     <w:p>
       <w:pPr>
         <w:pStyle w:val="Bibliography"/>
@@ -14911,7 +15958,7 @@
       <w:r>
         <w:t xml:space="preserve"> </w:t>
       </w:r>
-      <w:hyperlink r:id="rId89">
+      <w:hyperlink r:id="rId91">
         <w:r>
           <w:rPr>
             <w:rStyle w:val="Hyperlink"/>
@@ -14923,8 +15970,8 @@
         <w:t xml:space="preserve">.</w:t>
       </w:r>
     </w:p>
-    <w:bookmarkEnd w:id="90"/>
-    <w:bookmarkStart w:id="92" w:name="ref-bouwmeester1999ads"/>
+    <w:bookmarkEnd w:id="92"/>
+    <w:bookmarkStart w:id="94" w:name="ref-bouwmeester1999ads"/>
     <w:p>
       <w:pPr>
         <w:pStyle w:val="Bibliography"/>
@@ -14958,7 +16005,7 @@
       <w:r>
         <w:t xml:space="preserve"> </w:t>
       </w:r>
-      <w:hyperlink r:id="rId91">
+      <w:hyperlink r:id="rId93">
         <w:r>
           <w:rPr>
             <w:rStyle w:val="Hyperlink"/>
@@ -14970,8 +16017,8 @@
         <w:t xml:space="preserve">.</w:t>
       </w:r>
     </w:p>
-    <w:bookmarkEnd w:id="92"/>
-    <w:bookmarkStart w:id="94" w:name="ref-boyko2025anthelmintic"/>
+    <w:bookmarkEnd w:id="94"/>
+    <w:bookmarkStart w:id="96" w:name="ref-boyko2025anthelmintic"/>
     <w:p>
       <w:pPr>
         <w:pStyle w:val="Bibliography"/>
@@ -15005,7 +16052,7 @@
       <w:r>
         <w:t xml:space="preserve"> </w:t>
       </w:r>
-      <w:hyperlink r:id="rId93">
+      <w:hyperlink r:id="rId95">
         <w:r>
           <w:rPr>
             <w:rStyle w:val="Hyperlink"/>
@@ -15017,8 +16064,8 @@
         <w:t xml:space="preserve">.</w:t>
       </w:r>
     </w:p>
-    <w:bookmarkEnd w:id="94"/>
-    <w:bookmarkStart w:id="96" w:name="ref-brown2003seedterpenoids"/>
+    <w:bookmarkEnd w:id="96"/>
+    <w:bookmarkStart w:id="98" w:name="ref-brown2003seedterpenoids"/>
     <w:p>
       <w:pPr>
         <w:pStyle w:val="Bibliography"/>
@@ -15052,7 +16099,7 @@
       <w:r>
         <w:t xml:space="preserve"> </w:t>
       </w:r>
-      <w:hyperlink r:id="rId95">
+      <w:hyperlink r:id="rId97">
         <w:r>
           <w:rPr>
             <w:rStyle w:val="Hyperlink"/>
@@ -15064,8 +16111,8 @@
         <w:t xml:space="preserve">.</w:t>
       </w:r>
     </w:p>
-    <w:bookmarkEnd w:id="96"/>
-    <w:bookmarkStart w:id="98" w:name="ref-cai2024topdown"/>
+    <w:bookmarkEnd w:id="98"/>
+    <w:bookmarkStart w:id="100" w:name="ref-cai2024topdown"/>
     <w:p>
       <w:pPr>
         <w:pStyle w:val="Bibliography"/>
@@ -15129,7 +16176,7 @@
       <w:r>
         <w:t xml:space="preserve"> </w:t>
       </w:r>
-      <w:hyperlink r:id="rId97">
+      <w:hyperlink r:id="rId99">
         <w:r>
           <w:rPr>
             <w:rStyle w:val="Hyperlink"/>
@@ -15141,8 +16188,8 @@
         <w:t xml:space="preserve">.</w:t>
       </w:r>
     </w:p>
-    <w:bookmarkEnd w:id="98"/>
-    <w:bookmarkStart w:id="100" w:name="ref-cala2014haemonchus"/>
+    <w:bookmarkEnd w:id="100"/>
+    <w:bookmarkStart w:id="102" w:name="ref-cala2014haemonchus"/>
     <w:p>
       <w:pPr>
         <w:pStyle w:val="Bibliography"/>
@@ -15188,7 +16235,7 @@
       <w:r>
         <w:t xml:space="preserve"> </w:t>
       </w:r>
-      <w:hyperlink r:id="rId99">
+      <w:hyperlink r:id="rId101">
         <w:r>
           <w:rPr>
             <w:rStyle w:val="Hyperlink"/>
@@ -15200,8 +16247,8 @@
         <w:t xml:space="preserve">.</w:t>
       </w:r>
     </w:p>
-    <w:bookmarkEnd w:id="100"/>
-    <w:bookmarkStart w:id="102" w:name="ref-caner2008trichinella"/>
+    <w:bookmarkEnd w:id="102"/>
+    <w:bookmarkStart w:id="104" w:name="ref-caner2008trichinella"/>
     <w:p>
       <w:pPr>
         <w:pStyle w:val="Bibliography"/>
@@ -15265,7 +16312,7 @@
       <w:r>
         <w:t xml:space="preserve"> </w:t>
       </w:r>
-      <w:hyperlink r:id="rId101">
+      <w:hyperlink r:id="rId103">
         <w:r>
           <w:rPr>
             <w:rStyle w:val="Hyperlink"/>
@@ -15277,8 +16324,8 @@
         <w:t xml:space="preserve">.</w:t>
       </w:r>
     </w:p>
-    <w:bookmarkEnd w:id="102"/>
-    <w:bookmarkStart w:id="104" w:name="ref-chang2000ads"/>
+    <w:bookmarkEnd w:id="104"/>
+    <w:bookmarkStart w:id="106" w:name="ref-chang2000ads"/>
     <w:p>
       <w:pPr>
         <w:pStyle w:val="Bibliography"/>
@@ -15312,7 +16359,7 @@
       <w:r>
         <w:t xml:space="preserve"> </w:t>
       </w:r>
-      <w:hyperlink r:id="rId103">
+      <w:hyperlink r:id="rId105">
         <w:r>
           <w:rPr>
             <w:rStyle w:val="Hyperlink"/>
@@ -15324,8 +16371,8 @@
         <w:t xml:space="preserve">.</w:t>
       </w:r>
     </w:p>
-    <w:bookmarkEnd w:id="104"/>
-    <w:bookmarkStart w:id="106" w:name="ref-chanphen1998indica"/>
+    <w:bookmarkEnd w:id="106"/>
+    <w:bookmarkStart w:id="108" w:name="ref-chanphen1998indica"/>
     <w:p>
       <w:pPr>
         <w:pStyle w:val="Bibliography"/>
@@ -15359,7 +16406,7 @@
       <w:r>
         <w:t xml:space="preserve"> </w:t>
       </w:r>
-      <w:hyperlink r:id="rId105">
+      <w:hyperlink r:id="rId107">
         <w:r>
           <w:rPr>
             <w:rStyle w:val="Hyperlink"/>
@@ -15371,8 +16418,8 @@
         <w:t xml:space="preserve">.</w:t>
       </w:r>
     </w:p>
-    <w:bookmarkEnd w:id="106"/>
-    <w:bookmarkStart w:id="108" w:name="ref-annua2021diterpenes"/>
+    <w:bookmarkEnd w:id="108"/>
+    <w:bookmarkStart w:id="110" w:name="ref-annua2021diterpenes"/>
     <w:p>
       <w:pPr>
         <w:pStyle w:val="Bibliography"/>
@@ -15406,7 +16453,7 @@
       <w:r>
         <w:t xml:space="preserve"> </w:t>
       </w:r>
-      <w:hyperlink r:id="rId107">
+      <w:hyperlink r:id="rId109">
         <w:r>
           <w:rPr>
             <w:rStyle w:val="Hyperlink"/>
@@ -15418,8 +16465,8 @@
         <w:t xml:space="preserve">.</w:t>
       </w:r>
     </w:p>
-    <w:bookmarkEnd w:id="108"/>
-    <w:bookmarkStart w:id="110" w:name="ref-chiasson2001acaricidal"/>
+    <w:bookmarkEnd w:id="110"/>
+    <w:bookmarkStart w:id="112" w:name="ref-chiasson2001acaricidal"/>
     <w:p>
       <w:pPr>
         <w:pStyle w:val="Bibliography"/>
@@ -15453,7 +16500,7 @@
       <w:r>
         <w:t xml:space="preserve"> </w:t>
       </w:r>
-      <w:hyperlink r:id="rId109">
+      <w:hyperlink r:id="rId111">
         <w:r>
           <w:rPr>
             <w:rStyle w:val="Hyperlink"/>
@@ -15465,8 +16512,8 @@
         <w:t xml:space="preserve">.</w:t>
       </w:r>
     </w:p>
-    <w:bookmarkEnd w:id="110"/>
-    <w:bookmarkStart w:id="112" w:name="ref-delacruz2025cinaewes"/>
+    <w:bookmarkEnd w:id="112"/>
+    <w:bookmarkStart w:id="114" w:name="ref-delacruz2025cinaewes"/>
     <w:p>
       <w:pPr>
         <w:pStyle w:val="Bibliography"/>
@@ -15536,7 +16583,7 @@
       <w:r>
         <w:t xml:space="preserve"> </w:t>
       </w:r>
-      <w:hyperlink r:id="rId111">
+      <w:hyperlink r:id="rId113">
         <w:r>
           <w:rPr>
             <w:rStyle w:val="Hyperlink"/>
@@ -15548,8 +16595,8 @@
         <w:t xml:space="preserve">.</w:t>
       </w:r>
     </w:p>
-    <w:bookmarkEnd w:id="112"/>
-    <w:bookmarkStart w:id="114" w:name="ref-czechowski2019wholeleaf"/>
+    <w:bookmarkEnd w:id="114"/>
+    <w:bookmarkStart w:id="116" w:name="ref-czechowski2019wholeleaf"/>
     <w:p>
       <w:pPr>
         <w:pStyle w:val="Bibliography"/>
@@ -15583,7 +16630,7 @@
       <w:r>
         <w:t xml:space="preserve"> </w:t>
       </w:r>
-      <w:hyperlink r:id="rId113">
+      <w:hyperlink r:id="rId115">
         <w:r>
           <w:rPr>
             <w:rStyle w:val="Hyperlink"/>
@@ -15595,8 +16642,8 @@
         <w:t xml:space="preserve">.</w:t>
       </w:r>
     </w:p>
-    <w:bookmarkEnd w:id="114"/>
-    <w:bookmarkStart w:id="116" w:name="ref-elfawal2015wholeplant"/>
+    <w:bookmarkEnd w:id="116"/>
+    <w:bookmarkStart w:id="118" w:name="ref-elfawal2015wholeplant"/>
     <w:p>
       <w:pPr>
         <w:pStyle w:val="Bibliography"/>
@@ -15630,7 +16677,7 @@
       <w:r>
         <w:t xml:space="preserve"> </w:t>
       </w:r>
-      <w:hyperlink r:id="rId115">
+      <w:hyperlink r:id="rId117">
         <w:r>
           <w:rPr>
             <w:rStyle w:val="Hyperlink"/>
@@ -15642,8 +16689,8 @@
         <w:t xml:space="preserve">.</w:t>
       </w:r>
     </w:p>
-    <w:bookmarkEnd w:id="116"/>
-    <w:bookmarkStart w:id="118" w:name="ref-elfawal2012wholeplant"/>
+    <w:bookmarkEnd w:id="118"/>
+    <w:bookmarkStart w:id="120" w:name="ref-elfawal2012wholeplant"/>
     <w:p>
       <w:pPr>
         <w:pStyle w:val="Bibliography"/>
@@ -15689,7 +16736,7 @@
       <w:r>
         <w:t xml:space="preserve"> </w:t>
       </w:r>
-      <w:hyperlink r:id="rId117">
+      <w:hyperlink r:id="rId119">
         <w:r>
           <w:rPr>
             <w:rStyle w:val="Hyperlink"/>
@@ -15701,8 +16748,8 @@
         <w:t xml:space="preserve">.</w:t>
       </w:r>
     </w:p>
-    <w:bookmarkEnd w:id="118"/>
-    <w:bookmarkStart w:id="120" w:name="ref-evlice2026artemisiaoilsnematodes"/>
+    <w:bookmarkEnd w:id="120"/>
+    <w:bookmarkStart w:id="122" w:name="ref-evlice2026artemisiaoilsnematodes"/>
     <w:p>
       <w:pPr>
         <w:pStyle w:val="Bibliography"/>
@@ -15760,7 +16807,7 @@
       <w:r>
         <w:t xml:space="preserve"> </w:t>
       </w:r>
-      <w:hyperlink r:id="rId119">
+      <w:hyperlink r:id="rId121">
         <w:r>
           <w:rPr>
             <w:rStyle w:val="Hyperlink"/>
@@ -15772,8 +16819,8 @@
         <w:t xml:space="preserve">.</w:t>
       </w:r>
     </w:p>
-    <w:bookmarkEnd w:id="120"/>
-    <w:bookmarkStart w:id="122" w:name="ref-ezeta2023ludovicianafasciola"/>
+    <w:bookmarkEnd w:id="122"/>
+    <w:bookmarkStart w:id="124" w:name="ref-ezeta2023ludovicianafasciola"/>
     <w:p>
       <w:pPr>
         <w:pStyle w:val="Bibliography"/>
@@ -15828,7 +16875,7 @@
       <w:r>
         <w:t xml:space="preserve"> </w:t>
       </w:r>
-      <w:hyperlink r:id="rId121">
+      <w:hyperlink r:id="rId123">
         <w:r>
           <w:rPr>
             <w:rStyle w:val="Hyperlink"/>
@@ -15840,8 +16887,8 @@
         <w:t xml:space="preserve">.</w:t>
       </w:r>
     </w:p>
-    <w:bookmarkEnd w:id="122"/>
-    <w:bookmarkStart w:id="124" w:name="ref-fabre2025cadinapyridine"/>
+    <w:bookmarkEnd w:id="124"/>
+    <w:bookmarkStart w:id="126" w:name="ref-fabre2025cadinapyridine"/>
     <w:p>
       <w:pPr>
         <w:pStyle w:val="Bibliography"/>
@@ -15887,7 +16934,7 @@
       <w:r>
         <w:t xml:space="preserve"> </w:t>
       </w:r>
-      <w:hyperlink r:id="rId123">
+      <w:hyperlink r:id="rId125">
         <w:r>
           <w:rPr>
             <w:rStyle w:val="Hyperlink"/>
@@ -15899,8 +16946,8 @@
         <w:t xml:space="preserve">.</w:t>
       </w:r>
     </w:p>
-    <w:bookmarkEnd w:id="124"/>
-    <w:bookmarkStart w:id="126" w:name="ref-ferreira2024hydrotrope"/>
+    <w:bookmarkEnd w:id="126"/>
+    <w:bookmarkStart w:id="128" w:name="ref-ferreira2024hydrotrope"/>
     <w:p>
       <w:pPr>
         <w:pStyle w:val="Bibliography"/>
@@ -15956,7 +17003,7 @@
       <w:r>
         <w:t xml:space="preserve"> </w:t>
       </w:r>
-      <w:hyperlink r:id="rId125">
+      <w:hyperlink r:id="rId127">
         <w:r>
           <w:rPr>
             <w:rStyle w:val="Hyperlink"/>
@@ -15968,8 +17015,8 @@
         <w:t xml:space="preserve">.</w:t>
       </w:r>
     </w:p>
-    <w:bookmarkEnd w:id="126"/>
-    <w:bookmarkStart w:id="128" w:name="ref-fu2017pdr3"/>
+    <w:bookmarkEnd w:id="128"/>
+    <w:bookmarkStart w:id="130" w:name="ref-fu2017pdr3"/>
     <w:p>
       <w:pPr>
         <w:pStyle w:val="Bibliography"/>
@@ -16018,7 +17065,7 @@
       <w:r>
         <w:t xml:space="preserve"> </w:t>
       </w:r>
-      <w:hyperlink r:id="rId127">
+      <w:hyperlink r:id="rId129">
         <w:r>
           <w:rPr>
             <w:rStyle w:val="Hyperlink"/>
@@ -16030,8 +17077,8 @@
         <w:t xml:space="preserve">.</w:t>
       </w:r>
     </w:p>
-    <w:bookmarkEnd w:id="128"/>
-    <w:bookmarkStart w:id="130" w:name="ref-garciarodriguez2015absinthium"/>
+    <w:bookmarkEnd w:id="130"/>
+    <w:bookmarkStart w:id="132" w:name="ref-garciarodriguez2015absinthium"/>
     <w:p>
       <w:pPr>
         <w:pStyle w:val="Bibliography"/>
@@ -16065,7 +17112,7 @@
       <w:r>
         <w:t xml:space="preserve"> </w:t>
       </w:r>
-      <w:hyperlink r:id="rId129">
+      <w:hyperlink r:id="rId131">
         <w:r>
           <w:rPr>
             <w:rStyle w:val="Hyperlink"/>
@@ -16077,8 +17124,8 @@
         <w:t xml:space="preserve">.</w:t>
       </w:r>
     </w:p>
-    <w:bookmarkEnd w:id="130"/>
-    <w:bookmarkStart w:id="132" w:name="ref-gruessner2021complexartemisiaal"/>
+    <w:bookmarkEnd w:id="132"/>
+    <w:bookmarkStart w:id="134" w:name="ref-gruessner2021complexartemisiaal"/>
     <w:p>
       <w:pPr>
         <w:pStyle w:val="Bibliography"/>
@@ -16136,7 +17183,7 @@
       <w:r>
         <w:t xml:space="preserve"> </w:t>
       </w:r>
-      <w:hyperlink r:id="rId131">
+      <w:hyperlink r:id="rId133">
         <w:r>
           <w:rPr>
             <w:rStyle w:val="Hyperlink"/>
@@ -16148,8 +17195,8 @@
         <w:t xml:space="preserve">.</w:t>
       </w:r>
     </w:p>
-    <w:bookmarkEnd w:id="132"/>
-    <w:bookmarkStart w:id="134" w:name="ref-guo2023mir160"/>
+    <w:bookmarkEnd w:id="134"/>
+    <w:bookmarkStart w:id="136" w:name="ref-guo2023mir160"/>
     <w:p>
       <w:pPr>
         <w:pStyle w:val="Bibliography"/>
@@ -16192,7 +17239,7 @@
       <w:r>
         <w:t xml:space="preserve"> </w:t>
       </w:r>
-      <w:hyperlink r:id="rId133">
+      <w:hyperlink r:id="rId135">
         <w:r>
           <w:rPr>
             <w:rStyle w:val="Hyperlink"/>
@@ -16204,8 +17251,8 @@
         <w:t xml:space="preserve">.</w:t>
       </w:r>
     </w:p>
-    <w:bookmarkEnd w:id="134"/>
-    <w:bookmarkStart w:id="136" w:name="ref-guo2025dhaadh"/>
+    <w:bookmarkEnd w:id="136"/>
+    <w:bookmarkStart w:id="138" w:name="ref-guo2025dhaadh"/>
     <w:p>
       <w:pPr>
         <w:pStyle w:val="Bibliography"/>
@@ -16239,7 +17286,7 @@
       <w:r>
         <w:t xml:space="preserve"> </w:t>
       </w:r>
-      <w:hyperlink r:id="rId135">
+      <w:hyperlink r:id="rId137">
         <w:r>
           <w:rPr>
             <w:rStyle w:val="Hyperlink"/>
@@ -16251,8 +17298,8 @@
         <w:t xml:space="preserve">.</w:t>
       </w:r>
     </w:p>
-    <w:bookmarkEnd w:id="136"/>
-    <w:bookmarkStart w:id="138" w:name="ref-hernandez2025cinananoparticles"/>
+    <w:bookmarkEnd w:id="138"/>
+    <w:bookmarkStart w:id="140" w:name="ref-hernandez2025cinananoparticles"/>
     <w:p>
       <w:pPr>
         <w:pStyle w:val="Bibliography"/>
@@ -16307,7 +17354,7 @@
       <w:r>
         <w:t xml:space="preserve"> </w:t>
       </w:r>
-      <w:hyperlink r:id="rId137">
+      <w:hyperlink r:id="rId139">
         <w:r>
           <w:rPr>
             <w:rStyle w:val="Hyperlink"/>
@@ -16319,8 +17366,8 @@
         <w:t xml:space="preserve">.</w:t>
       </w:r>
     </w:p>
-    <w:bookmarkEnd w:id="138"/>
-    <w:bookmarkStart w:id="140" w:name="ref-heydari2013sieberi"/>
+    <w:bookmarkEnd w:id="140"/>
+    <w:bookmarkStart w:id="142" w:name="ref-heydari2013sieberi"/>
     <w:p>
       <w:pPr>
         <w:pStyle w:val="Bibliography"/>
@@ -16375,7 +17422,7 @@
       <w:r>
         <w:t xml:space="preserve"> </w:t>
       </w:r>
-      <w:hyperlink r:id="rId139">
+      <w:hyperlink r:id="rId141">
         <w:r>
           <w:rPr>
             <w:rStyle w:val="Hyperlink"/>
@@ -16387,8 +17434,8 @@
         <w:t xml:space="preserve">.</w:t>
       </w:r>
     </w:p>
-    <w:bookmarkEnd w:id="140"/>
-    <w:bookmarkStart w:id="142" w:name="ref-higuera2021cina"/>
+    <w:bookmarkEnd w:id="142"/>
+    <w:bookmarkStart w:id="144" w:name="ref-higuera2021cina"/>
     <w:p>
       <w:pPr>
         <w:pStyle w:val="Bibliography"/>
@@ -16458,7 +17505,7 @@
       <w:r>
         <w:t xml:space="preserve"> </w:t>
       </w:r>
-      <w:hyperlink r:id="rId141">
+      <w:hyperlink r:id="rId143">
         <w:r>
           <w:rPr>
             <w:rStyle w:val="Hyperlink"/>
@@ -16470,8 +17517,8 @@
         <w:t xml:space="preserve">.</w:t>
       </w:r>
     </w:p>
-    <w:bookmarkEnd w:id="142"/>
-    <w:bookmarkStart w:id="144" w:name="ref-higuera2023cinalignans"/>
+    <w:bookmarkEnd w:id="144"/>
+    <w:bookmarkStart w:id="146" w:name="ref-higuera2023cinalignans"/>
     <w:p>
       <w:pPr>
         <w:pStyle w:val="Bibliography"/>
@@ -16535,7 +17582,7 @@
       <w:r>
         <w:t xml:space="preserve"> </w:t>
       </w:r>
-      <w:hyperlink r:id="rId143">
+      <w:hyperlink r:id="rId145">
         <w:r>
           <w:rPr>
             <w:rStyle w:val="Hyperlink"/>
@@ -16547,8 +17594,8 @@
         <w:t xml:space="preserve">.</w:t>
       </w:r>
     </w:p>
-    <w:bookmarkEnd w:id="144"/>
-    <w:bookmarkStart w:id="146" w:name="ref-hoshiki2025herbaalbacattle"/>
+    <w:bookmarkEnd w:id="146"/>
+    <w:bookmarkStart w:id="148" w:name="ref-hoshiki2025herbaalbacattle"/>
     <w:p>
       <w:pPr>
         <w:pStyle w:val="Bibliography"/>
@@ -16600,7 +17647,7 @@
       <w:r>
         <w:t xml:space="preserve"> </w:t>
       </w:r>
-      <w:hyperlink r:id="rId145">
+      <w:hyperlink r:id="rId147">
         <w:r>
           <w:rPr>
             <w:rStyle w:val="Hyperlink"/>
@@ -16612,8 +17659,8 @@
         <w:t xml:space="preserve">.</w:t>
       </w:r>
     </w:p>
-    <w:bookmarkEnd w:id="146"/>
-    <w:bookmarkStart w:id="148" w:name="ref-hou2021argyipk"/>
+    <w:bookmarkEnd w:id="148"/>
+    <w:bookmarkStart w:id="150" w:name="ref-hou2021argyipk"/>
     <w:p>
       <w:pPr>
         <w:pStyle w:val="Bibliography"/>
@@ -16659,7 +17706,7 @@
       <w:r>
         <w:t xml:space="preserve"> </w:t>
       </w:r>
-      <w:hyperlink r:id="rId147">
+      <w:hyperlink r:id="rId149">
         <w:r>
           <w:rPr>
             <w:rStyle w:val="Hyperlink"/>
@@ -16671,8 +17718,8 @@
         <w:t xml:space="preserve">.</w:t>
       </w:r>
     </w:p>
-    <w:bookmarkEnd w:id="148"/>
-    <w:bookmarkStart w:id="150" w:name="ref-hussain2024artemisiareview"/>
+    <w:bookmarkEnd w:id="150"/>
+    <w:bookmarkStart w:id="152" w:name="ref-hussain2024artemisiareview"/>
     <w:p>
       <w:pPr>
         <w:pStyle w:val="Bibliography"/>
@@ -16706,7 +17753,7 @@
       <w:r>
         <w:t xml:space="preserve"> </w:t>
       </w:r>
-      <w:hyperlink r:id="rId149">
+      <w:hyperlink r:id="rId151">
         <w:r>
           <w:rPr>
             <w:rStyle w:val="Hyperlink"/>
@@ -16718,8 +17765,8 @@
         <w:t xml:space="preserve">.</w:t>
       </w:r>
     </w:p>
-    <w:bookmarkEnd w:id="150"/>
-    <w:bookmarkStart w:id="152" w:name="ref-hussain2025brevifolia"/>
+    <w:bookmarkEnd w:id="152"/>
+    <w:bookmarkStart w:id="154" w:name="ref-hussain2025brevifolia"/>
     <w:p>
       <w:pPr>
         <w:pStyle w:val="Bibliography"/>
@@ -16753,7 +17800,7 @@
       <w:r>
         <w:t xml:space="preserve"> </w:t>
       </w:r>
-      <w:hyperlink r:id="rId151">
+      <w:hyperlink r:id="rId153">
         <w:r>
           <w:rPr>
             <w:rStyle w:val="Hyperlink"/>
@@ -16765,8 +17812,8 @@
         <w:t xml:space="preserve">.</w:t>
       </w:r>
     </w:p>
-    <w:bookmarkEnd w:id="152"/>
-    <w:bookmarkStart w:id="154" w:name="ref-idris1982herbaalbagoats"/>
+    <w:bookmarkEnd w:id="154"/>
+    <w:bookmarkStart w:id="156" w:name="ref-idris1982herbaalbagoats"/>
     <w:p>
       <w:pPr>
         <w:pStyle w:val="Bibliography"/>
@@ -16781,7 +17828,7 @@
       <w:r>
         <w:t xml:space="preserve">“</w:t>
       </w:r>
-      <w:hyperlink r:id="rId153">
+      <w:hyperlink r:id="rId155">
         <w:r>
           <w:rPr>
             <w:rStyle w:val="Hyperlink"/>
@@ -16857,8 +17904,8 @@
         <w:t xml:space="preserve">22 (3): 138–43.</w:t>
       </w:r>
     </w:p>
-    <w:bookmarkEnd w:id="154"/>
-    <w:bookmarkStart w:id="156" w:name="ref-iqbal2013absinthiumcoccidiosis"/>
+    <w:bookmarkEnd w:id="156"/>
+    <w:bookmarkStart w:id="158" w:name="ref-iqbal2013absinthiumcoccidiosis"/>
     <w:p>
       <w:pPr>
         <w:pStyle w:val="Bibliography"/>
@@ -16901,7 +17948,7 @@
       <w:r>
         <w:t xml:space="preserve"> </w:t>
       </w:r>
-      <w:hyperlink r:id="rId155">
+      <w:hyperlink r:id="rId157">
         <w:r>
           <w:rPr>
             <w:rStyle w:val="Hyperlink"/>
@@ -16913,8 +17960,8 @@
         <w:t xml:space="preserve">.</w:t>
       </w:r>
     </w:p>
-    <w:bookmarkEnd w:id="156"/>
-    <w:bookmarkStart w:id="158" w:name="ref-iqbal2004brevifolia"/>
+    <w:bookmarkEnd w:id="158"/>
+    <w:bookmarkStart w:id="160" w:name="ref-iqbal2004brevifolia"/>
     <w:p>
       <w:pPr>
         <w:pStyle w:val="Bibliography"/>
@@ -16960,7 +18007,7 @@
       <w:r>
         <w:t xml:space="preserve"> </w:t>
       </w:r>
-      <w:hyperlink r:id="rId157">
+      <w:hyperlink r:id="rId159">
         <w:r>
           <w:rPr>
             <w:rStyle w:val="Hyperlink"/>
@@ -16972,8 +18019,8 @@
         <w:t xml:space="preserve">.</w:t>
       </w:r>
     </w:p>
-    <w:bookmarkEnd w:id="158"/>
-    <w:bookmarkStart w:id="160" w:name="ref-irehan2026absinthium"/>
+    <w:bookmarkEnd w:id="160"/>
+    <w:bookmarkStart w:id="162" w:name="ref-irehan2026absinthium"/>
     <w:p>
       <w:pPr>
         <w:pStyle w:val="Bibliography"/>
@@ -17007,7 +18054,7 @@
       <w:r>
         <w:t xml:space="preserve"> </w:t>
       </w:r>
-      <w:hyperlink r:id="rId159">
+      <w:hyperlink r:id="rId161">
         <w:r>
           <w:rPr>
             <w:rStyle w:val="Hyperlink"/>
@@ -17019,8 +18066,8 @@
         <w:t xml:space="preserve">.</w:t>
       </w:r>
     </w:p>
-    <w:bookmarkEnd w:id="160"/>
-    <w:bookmarkStart w:id="162" w:name="ref-chandler2015stl"/>
+    <w:bookmarkEnd w:id="162"/>
+    <w:bookmarkStart w:id="164" w:name="ref-chandler2015stl"/>
     <w:p>
       <w:pPr>
         <w:pStyle w:val="Bibliography"/>
@@ -17054,7 +18101,7 @@
       <w:r>
         <w:t xml:space="preserve"> </w:t>
       </w:r>
-      <w:hyperlink r:id="rId161">
+      <w:hyperlink r:id="rId163">
         <w:r>
           <w:rPr>
             <w:rStyle w:val="Hyperlink"/>
@@ -17066,8 +18113,8 @@
         <w:t xml:space="preserve">.</w:t>
       </w:r>
     </w:p>
-    <w:bookmarkEnd w:id="162"/>
-    <w:bookmarkStart w:id="164" w:name="ref-ji2025chrysosplenetin"/>
+    <w:bookmarkEnd w:id="164"/>
+    <w:bookmarkStart w:id="166" w:name="ref-ji2025chrysosplenetin"/>
     <w:p>
       <w:pPr>
         <w:pStyle w:val="Bibliography"/>
@@ -17113,7 +18160,7 @@
       <w:r>
         <w:t xml:space="preserve"> </w:t>
       </w:r>
-      <w:hyperlink r:id="rId163">
+      <w:hyperlink r:id="rId165">
         <w:r>
           <w:rPr>
             <w:rStyle w:val="Hyperlink"/>
@@ -17125,8 +18172,8 @@
         <w:t xml:space="preserve">.</w:t>
       </w:r>
     </w:p>
-    <w:bookmarkEnd w:id="164"/>
-    <w:bookmarkStart w:id="166" w:name="ref-jiang2016wrky1"/>
+    <w:bookmarkEnd w:id="166"/>
+    <w:bookmarkStart w:id="168" w:name="ref-jiang2016wrky1"/>
     <w:p>
       <w:pPr>
         <w:pStyle w:val="Bibliography"/>
@@ -17178,7 +18225,7 @@
       <w:r>
         <w:t xml:space="preserve"> </w:t>
       </w:r>
-      <w:hyperlink r:id="rId165">
+      <w:hyperlink r:id="rId167">
         <w:r>
           <w:rPr>
             <w:rStyle w:val="Hyperlink"/>
@@ -17190,8 +18237,8 @@
         <w:t xml:space="preserve">.</w:t>
       </w:r>
     </w:p>
-    <w:bookmarkEnd w:id="166"/>
-    <w:bookmarkStart w:id="168" w:name="ref-artemisia2025phylogenomics"/>
+    <w:bookmarkEnd w:id="168"/>
+    <w:bookmarkStart w:id="170" w:name="ref-artemisia2025phylogenomics"/>
     <w:p>
       <w:pPr>
         <w:pStyle w:val="Bibliography"/>
@@ -17225,7 +18272,7 @@
       <w:r>
         <w:t xml:space="preserve"> </w:t>
       </w:r>
-      <w:hyperlink r:id="rId167">
+      <w:hyperlink r:id="rId169">
         <w:r>
           <w:rPr>
             <w:rStyle w:val="Hyperlink"/>
@@ -17237,8 +18284,8 @@
         <w:t xml:space="preserve">.</w:t>
       </w:r>
     </w:p>
-    <w:bookmarkEnd w:id="168"/>
-    <w:bookmarkStart w:id="170" w:name="ref-jiao2018eimeria"/>
+    <w:bookmarkEnd w:id="170"/>
+    <w:bookmarkStart w:id="172" w:name="ref-jiao2018eimeria"/>
     <w:p>
       <w:pPr>
         <w:pStyle w:val="Bibliography"/>
@@ -17296,7 +18343,7 @@
       <w:r>
         <w:t xml:space="preserve"> </w:t>
       </w:r>
-      <w:hyperlink r:id="rId169">
+      <w:hyperlink r:id="rId171">
         <w:r>
           <w:rPr>
             <w:rStyle w:val="Hyperlink"/>
@@ -17308,8 +18355,8 @@
         <w:t xml:space="preserve">.</w:t>
       </w:r>
     </w:p>
-    <w:bookmarkEnd w:id="170"/>
-    <w:bookmarkStart w:id="172" w:name="ref-jimenez2014tcruzipcd"/>
+    <w:bookmarkEnd w:id="172"/>
+    <w:bookmarkStart w:id="174" w:name="ref-jimenez2014tcruzipcd"/>
     <w:p>
       <w:pPr>
         <w:pStyle w:val="Bibliography"/>
@@ -17352,7 +18399,7 @@
       <w:r>
         <w:t xml:space="preserve"> </w:t>
       </w:r>
-      <w:hyperlink r:id="rId171">
+      <w:hyperlink r:id="rId173">
         <w:r>
           <w:rPr>
             <w:rStyle w:val="Hyperlink"/>
@@ -17364,8 +18411,8 @@
         <w:t xml:space="preserve">.</w:t>
       </w:r>
     </w:p>
-    <w:bookmarkEnd w:id="172"/>
-    <w:bookmarkStart w:id="174" w:name="ref-judzentiene2016vulgaris"/>
+    <w:bookmarkEnd w:id="174"/>
+    <w:bookmarkStart w:id="176" w:name="ref-judzentiene2016vulgaris"/>
     <w:p>
       <w:pPr>
         <w:pStyle w:val="Bibliography"/>
@@ -17380,7 +18427,7 @@
       <w:r>
         <w:t xml:space="preserve">“</w:t>
       </w:r>
-      <w:hyperlink r:id="rId173">
+      <w:hyperlink r:id="rId175">
         <w:r>
           <w:rPr>
             <w:rStyle w:val="Hyperlink"/>
@@ -17420,8 +18467,8 @@
         <w:t xml:space="preserve">11 (9): 1353–56.</w:t>
       </w:r>
     </w:p>
-    <w:bookmarkEnd w:id="174"/>
-    <w:bookmarkStart w:id="176" w:name="ref-kane2022cyp450"/>
+    <w:bookmarkEnd w:id="176"/>
+    <w:bookmarkStart w:id="178" w:name="ref-kane2022cyp450"/>
     <w:p>
       <w:pPr>
         <w:pStyle w:val="Bibliography"/>
@@ -17476,7 +18523,7 @@
       <w:r>
         <w:t xml:space="preserve"> </w:t>
       </w:r>
-      <w:hyperlink r:id="rId175">
+      <w:hyperlink r:id="rId177">
         <w:r>
           <w:rPr>
             <w:rStyle w:val="Hyperlink"/>
@@ -17488,8 +18535,8 @@
         <w:t xml:space="preserve">.</w:t>
       </w:r>
     </w:p>
-    <w:bookmarkEnd w:id="176"/>
-    <w:bookmarkStart w:id="178" w:name="ref-khan2015artemisia_nematodes"/>
+    <w:bookmarkEnd w:id="178"/>
+    <w:bookmarkStart w:id="180" w:name="ref-khan2015artemisia_nematodes"/>
     <w:p>
       <w:pPr>
         <w:pStyle w:val="Bibliography"/>
@@ -17504,7 +18551,7 @@
       <w:r>
         <w:t xml:space="preserve">“</w:t>
       </w:r>
-      <w:hyperlink r:id="rId177">
+      <w:hyperlink r:id="rId179">
         <w:r>
           <w:rPr>
             <w:rStyle w:val="Hyperlink"/>
@@ -17556,8 +18603,8 @@
         <w:t xml:space="preserve">32 (2): 257–68.</w:t>
       </w:r>
     </w:p>
-    <w:bookmarkEnd w:id="178"/>
-    <w:bookmarkStart w:id="180" w:name="ref-kunnathattil2025vulgaris"/>
+    <w:bookmarkEnd w:id="180"/>
+    <w:bookmarkStart w:id="182" w:name="ref-kunnathattil2025vulgaris"/>
     <w:p>
       <w:pPr>
         <w:pStyle w:val="Bibliography"/>
@@ -17615,7 +18662,7 @@
       <w:r>
         <w:t xml:space="preserve"> </w:t>
       </w:r>
-      <w:hyperlink r:id="rId179">
+      <w:hyperlink r:id="rId181">
         <w:r>
           <w:rPr>
             <w:rStyle w:val="Hyperlink"/>
@@ -17627,8 +18674,8 @@
         <w:t xml:space="preserve">.</w:t>
       </w:r>
     </w:p>
-    <w:bookmarkEnd w:id="180"/>
-    <w:bookmarkStart w:id="182" w:name="ref-li2018naturalcombination"/>
+    <w:bookmarkEnd w:id="182"/>
+    <w:bookmarkStart w:id="184" w:name="ref-li2018naturalcombination"/>
     <w:p>
       <w:pPr>
         <w:pStyle w:val="Bibliography"/>
@@ -17674,7 +18721,7 @@
       <w:r>
         <w:t xml:space="preserve"> </w:t>
       </w:r>
-      <w:hyperlink r:id="rId181">
+      <w:hyperlink r:id="rId183">
         <w:r>
           <w:rPr>
             <w:rStyle w:val="Hyperlink"/>
@@ -17686,8 +18733,8 @@
         <w:t xml:space="preserve">.</w:t>
       </w:r>
     </w:p>
-    <w:bookmarkEnd w:id="182"/>
-    <w:bookmarkStart w:id="184" w:name="ref-li2008sphaerocephalasaponin"/>
+    <w:bookmarkEnd w:id="184"/>
+    <w:bookmarkStart w:id="186" w:name="ref-li2008sphaerocephalasaponin"/>
     <w:p>
       <w:pPr>
         <w:pStyle w:val="Bibliography"/>
@@ -17730,7 +18777,7 @@
       <w:r>
         <w:t xml:space="preserve"> </w:t>
       </w:r>
-      <w:hyperlink r:id="rId183">
+      <w:hyperlink r:id="rId185">
         <w:r>
           <w:rPr>
             <w:rStyle w:val="Hyperlink"/>
@@ -17742,8 +18789,8 @@
         <w:t xml:space="preserve">.</w:t>
       </w:r>
     </w:p>
-    <w:bookmarkEnd w:id="184"/>
-    <w:bookmarkStart w:id="186" w:name="ref-li1990sacrorumditerpene"/>
+    <w:bookmarkEnd w:id="186"/>
+    <w:bookmarkStart w:id="188" w:name="ref-li1990sacrorumditerpene"/>
     <w:p>
       <w:pPr>
         <w:pStyle w:val="Bibliography"/>
@@ -17786,7 +18833,7 @@
       <w:r>
         <w:t xml:space="preserve"> </w:t>
       </w:r>
-      <w:hyperlink r:id="rId185">
+      <w:hyperlink r:id="rId187">
         <w:r>
           <w:rPr>
             <w:rStyle w:val="Hyperlink"/>
@@ -17798,8 +18845,8 @@
         <w:t xml:space="preserve">.</w:t>
       </w:r>
     </w:p>
-    <w:bookmarkEnd w:id="186"/>
-    <w:bookmarkStart w:id="188" w:name="ref-liu2026osc"/>
+    <w:bookmarkEnd w:id="188"/>
+    <w:bookmarkStart w:id="190" w:name="ref-liu2026osc"/>
     <w:p>
       <w:pPr>
         <w:pStyle w:val="Bibliography"/>
@@ -17845,7 +18892,7 @@
       <w:r>
         <w:t xml:space="preserve"> </w:t>
       </w:r>
-      <w:hyperlink r:id="rId187">
+      <w:hyperlink r:id="rId189">
         <w:r>
           <w:rPr>
             <w:rStyle w:val="Hyperlink"/>
@@ -17857,8 +18904,8 @@
         <w:t xml:space="preserve">.</w:t>
       </w:r>
     </w:p>
-    <w:bookmarkEnd w:id="188"/>
-    <w:bookmarkStart w:id="190" w:name="ref-liu2022vulgaristerpenoids"/>
+    <w:bookmarkEnd w:id="190"/>
+    <w:bookmarkStart w:id="192" w:name="ref-liu2022vulgaristerpenoids"/>
     <w:p>
       <w:pPr>
         <w:pStyle w:val="Bibliography"/>
@@ -17904,7 +18951,7 @@
       <w:r>
         <w:t xml:space="preserve"> </w:t>
       </w:r>
-      <w:hyperlink r:id="rId189">
+      <w:hyperlink r:id="rId191">
         <w:r>
           <w:rPr>
             <w:rStyle w:val="Hyperlink"/>
@@ -17916,14 +18963,73 @@
         <w:t xml:space="preserve">.</w:t>
       </w:r>
     </w:p>
-    <w:bookmarkEnd w:id="190"/>
-    <w:bookmarkStart w:id="192" w:name="ref-lu2013aora"/>
+    <w:bookmarkEnd w:id="192"/>
+    <w:bookmarkStart w:id="194" w:name="ref-lotfy2006inculta"/>
     <w:p>
       <w:pPr>
         <w:pStyle w:val="Bibliography"/>
         <w:spacing w:before="0" w:after="120" w:line="264" w:lineRule="auto"/>
       </w:pPr>
       <w:r>
+        <w:t xml:space="preserve">Lotfy, A. A., L. Y. Ghanem, A. M. Shennawy, N. A. Gomaa, and H. H. El-Said. 2006.</w:t>
+      </w:r>
+      <w:r>
+        <w:t xml:space="preserve"> </w:t>
+      </w:r>
+      <w:r>
+        <w:t xml:space="preserve">“Assessment of the Toxicity of</w:t>
+      </w:r>
+      <w:r>
+        <w:t xml:space="preserve"> </w:t>
+      </w:r>
+      <w:r>
+        <w:t xml:space="preserve">Artemisia inculta</w:t>
+      </w:r>
+      <w:r>
+        <w:t xml:space="preserve"> </w:t>
+      </w:r>
+      <w:r>
+        <w:t xml:space="preserve">Extract on the Bone Marrow of Mice Infected with Schistosomiasis.”</w:t>
+      </w:r>
+      <w:r>
+        <w:t xml:space="preserve"> </w:t>
+      </w:r>
+      <w:r>
+        <w:rPr>
+          <w:i/>
+          <w:iCs/>
+        </w:rPr>
+        <w:t xml:space="preserve">Arzneimittelforschung</w:t>
+      </w:r>
+      <w:r>
+        <w:t xml:space="preserve"> </w:t>
+      </w:r>
+      <w:r>
+        <w:t xml:space="preserve">56 (2): 104–7.</w:t>
+      </w:r>
+      <w:r>
+        <w:t xml:space="preserve"> </w:t>
+      </w:r>
+      <w:hyperlink r:id="rId193">
+        <w:r>
+          <w:rPr>
+            <w:rStyle w:val="Hyperlink"/>
+          </w:rPr>
+          <w:t xml:space="preserve">https://doi.org/10.1055/s-0031-1296709</w:t>
+        </w:r>
+      </w:hyperlink>
+      <w:r>
+        <w:t xml:space="preserve">.</w:t>
+      </w:r>
+    </w:p>
+    <w:bookmarkEnd w:id="194"/>
+    <w:bookmarkStart w:id="196" w:name="ref-lu2013aora"/>
+    <w:p>
+      <w:pPr>
+        <w:pStyle w:val="Bibliography"/>
+        <w:spacing w:before="0" w:after="120" w:line="264" w:lineRule="auto"/>
+      </w:pPr>
+      <w:r>
         <w:t xml:space="preserve">Lu, X., L. Zhang, F. Zhang, W. Jiang, Q. Shen, L. Zhang, Z. Lv, G. Wang, and K. Tang. 2013.</w:t>
       </w:r>
       <w:r>
@@ -17975,7 +19081,7 @@
       <w:r>
         <w:t xml:space="preserve"> </w:t>
       </w:r>
-      <w:hyperlink r:id="rId191">
+      <w:hyperlink r:id="rId195">
         <w:r>
           <w:rPr>
             <w:rStyle w:val="Hyperlink"/>
@@ -17987,8 +19093,8 @@
         <w:t xml:space="preserve">.</w:t>
       </w:r>
     </w:p>
-    <w:bookmarkEnd w:id="192"/>
-    <w:bookmarkStart w:id="194" w:name="ref-lv2016nac1"/>
+    <w:bookmarkEnd w:id="196"/>
+    <w:bookmarkStart w:id="198" w:name="ref-lv2016nac1"/>
     <w:p>
       <w:pPr>
         <w:pStyle w:val="Bibliography"/>
@@ -18049,7 +19155,7 @@
       <w:r>
         <w:t xml:space="preserve"> </w:t>
       </w:r>
-      <w:hyperlink r:id="rId193">
+      <w:hyperlink r:id="rId197">
         <w:r>
           <w:rPr>
             <w:rStyle w:val="Hyperlink"/>
@@ -18061,8 +19167,8 @@
         <w:t xml:space="preserve">.</w:t>
       </w:r>
     </w:p>
-    <w:bookmarkEnd w:id="194"/>
-    <w:bookmarkStart w:id="196" w:name="ref-ma2001caruifolia"/>
+    <w:bookmarkEnd w:id="198"/>
+    <w:bookmarkStart w:id="200" w:name="ref-ma2001caruifolia"/>
     <w:p>
       <w:pPr>
         <w:pStyle w:val="Bibliography"/>
@@ -18096,7 +19202,7 @@
       <w:r>
         <w:t xml:space="preserve"> </w:t>
       </w:r>
-      <w:hyperlink r:id="rId195">
+      <w:hyperlink r:id="rId199">
         <w:r>
           <w:rPr>
             <w:rStyle w:val="Hyperlink"/>
@@ -18108,8 +19214,8 @@
         <w:t xml:space="preserve">.</w:t>
       </w:r>
     </w:p>
-    <w:bookmarkEnd w:id="196"/>
-    <w:bookmarkStart w:id="198" w:name="ref-mamede2025metabolite"/>
+    <w:bookmarkEnd w:id="200"/>
+    <w:bookmarkStart w:id="202" w:name="ref-mamede2025metabolite"/>
     <w:p>
       <w:pPr>
         <w:pStyle w:val="Bibliography"/>
@@ -18176,7 +19282,7 @@
       <w:r>
         <w:t xml:space="preserve"> </w:t>
       </w:r>
-      <w:hyperlink r:id="rId197">
+      <w:hyperlink r:id="rId201">
         <w:r>
           <w:rPr>
             <w:rStyle w:val="Hyperlink"/>
@@ -18188,8 +19294,8 @@
         <w:t xml:space="preserve">.</w:t>
       </w:r>
     </w:p>
-    <w:bookmarkEnd w:id="198"/>
-    <w:bookmarkStart w:id="200" w:name="ref-martinezdiaz2015absinthiumtrypano"/>
+    <w:bookmarkEnd w:id="202"/>
+    <w:bookmarkStart w:id="204" w:name="ref-martinezdiaz2015absinthiumtrypano"/>
     <w:p>
       <w:pPr>
         <w:pStyle w:val="Bibliography"/>
@@ -18223,7 +19329,7 @@
       <w:r>
         <w:t xml:space="preserve"> </w:t>
       </w:r>
-      <w:hyperlink r:id="rId199">
+      <w:hyperlink r:id="rId203">
         <w:r>
           <w:rPr>
             <w:rStyle w:val="Hyperlink"/>
@@ -18235,8 +19341,8 @@
         <w:t xml:space="preserve">.</w:t>
       </w:r>
     </w:p>
-    <w:bookmarkEnd w:id="200"/>
-    <w:bookmarkStart w:id="202" w:name="ref-ming2025argyidrying"/>
+    <w:bookmarkEnd w:id="204"/>
+    <w:bookmarkStart w:id="206" w:name="ref-ming2025argyidrying"/>
     <w:p>
       <w:pPr>
         <w:pStyle w:val="Bibliography"/>
@@ -18279,7 +19385,7 @@
       <w:r>
         <w:t xml:space="preserve"> </w:t>
       </w:r>
-      <w:hyperlink r:id="rId201">
+      <w:hyperlink r:id="rId205">
         <w:r>
           <w:rPr>
             <w:rStyle w:val="Hyperlink"/>
@@ -18291,8 +19397,8 @@
         <w:t xml:space="preserve">.</w:t>
       </w:r>
     </w:p>
-    <w:bookmarkEnd w:id="202"/>
-    <w:bookmarkStart w:id="204" w:name="ref-mohammed2026monospermadrying"/>
+    <w:bookmarkEnd w:id="206"/>
+    <w:bookmarkStart w:id="208" w:name="ref-mohammed2026monospermadrying"/>
     <w:p>
       <w:pPr>
         <w:pStyle w:val="Bibliography"/>
@@ -18345,7 +19451,7 @@
       <w:r>
         <w:t xml:space="preserve"> </w:t>
       </w:r>
-      <w:hyperlink r:id="rId203">
+      <w:hyperlink r:id="rId207">
         <w:r>
           <w:rPr>
             <w:rStyle w:val="Hyperlink"/>
@@ -18357,8 +19463,8 @@
         <w:t xml:space="preserve">.</w:t>
       </w:r>
     </w:p>
-    <w:bookmarkEnd w:id="204"/>
-    <w:bookmarkStart w:id="206" w:name="ref-mojarrab2015extracts"/>
+    <w:bookmarkEnd w:id="208"/>
+    <w:bookmarkStart w:id="210" w:name="ref-mojarrab2015extracts"/>
     <w:p>
       <w:pPr>
         <w:pStyle w:val="Bibliography"/>
@@ -18404,7 +19510,7 @@
       <w:r>
         <w:t xml:space="preserve"> </w:t>
       </w:r>
-      <w:hyperlink r:id="rId205">
+      <w:hyperlink r:id="rId209">
         <w:r>
           <w:rPr>
             <w:rStyle w:val="Hyperlink"/>
@@ -18416,8 +19522,8 @@
         <w:t xml:space="preserve">.</w:t>
       </w:r>
     </w:p>
-    <w:bookmarkEnd w:id="206"/>
-    <w:bookmarkStart w:id="208" w:name="ref-mojarrab2014fractionation"/>
+    <w:bookmarkEnd w:id="210"/>
+    <w:bookmarkStart w:id="212" w:name="ref-mojarrab2014fractionation"/>
     <w:p>
       <w:pPr>
         <w:pStyle w:val="Bibliography"/>
@@ -18475,7 +19581,7 @@
       <w:r>
         <w:t xml:space="preserve"> </w:t>
       </w:r>
-      <w:hyperlink r:id="rId207">
+      <w:hyperlink r:id="rId211">
         <w:r>
           <w:rPr>
             <w:rStyle w:val="Hyperlink"/>
@@ -18487,8 +19593,8 @@
         <w:t xml:space="preserve">.</w:t>
       </w:r>
     </w:p>
-    <w:bookmarkEnd w:id="208"/>
-    <w:bookmarkStart w:id="210" w:name="ref-monzote2014absinthium"/>
+    <w:bookmarkEnd w:id="212"/>
+    <w:bookmarkStart w:id="214" w:name="ref-monzote2014absinthium"/>
     <w:p>
       <w:pPr>
         <w:pStyle w:val="Bibliography"/>
@@ -18522,7 +19628,7 @@
       <w:r>
         <w:t xml:space="preserve"> </w:t>
       </w:r>
-      <w:hyperlink r:id="rId209">
+      <w:hyperlink r:id="rId213">
         <w:r>
           <w:rPr>
             <w:rStyle w:val="Hyperlink"/>
@@ -18534,8 +19640,8 @@
         <w:t xml:space="preserve">.</w:t>
       </w:r>
     </w:p>
-    <w:bookmarkEnd w:id="210"/>
-    <w:bookmarkStart w:id="212" w:name="ref-morua2025standardizedannua"/>
+    <w:bookmarkEnd w:id="214"/>
+    <w:bookmarkStart w:id="216" w:name="ref-morua2025standardizedannua"/>
     <w:p>
       <w:pPr>
         <w:pStyle w:val="Bibliography"/>
@@ -18581,7 +19687,7 @@
       <w:r>
         <w:t xml:space="preserve"> </w:t>
       </w:r>
-      <w:hyperlink r:id="rId211">
+      <w:hyperlink r:id="rId215">
         <w:r>
           <w:rPr>
             <w:rStyle w:val="Hyperlink"/>
@@ -18593,8 +19699,8 @@
         <w:t xml:space="preserve">.</w:t>
       </w:r>
     </w:p>
-    <w:bookmarkEnd w:id="212"/>
-    <w:bookmarkStart w:id="214" w:name="ref-annua2015triterpenes"/>
+    <w:bookmarkEnd w:id="216"/>
+    <w:bookmarkStart w:id="218" w:name="ref-annua2015triterpenes"/>
     <w:p>
       <w:pPr>
         <w:pStyle w:val="Bibliography"/>
@@ -18628,7 +19734,7 @@
       <w:r>
         <w:t xml:space="preserve"> </w:t>
       </w:r>
-      <w:hyperlink r:id="rId213">
+      <w:hyperlink r:id="rId217">
         <w:r>
           <w:rPr>
             <w:rStyle w:val="Hyperlink"/>
@@ -18640,8 +19746,8 @@
         <w:t xml:space="preserve">.</w:t>
       </w:r>
     </w:p>
-    <w:bookmarkEnd w:id="214"/>
-    <w:bookmarkStart w:id="216" w:name="ref-mouton2013artemisininonly"/>
+    <w:bookmarkEnd w:id="218"/>
+    <w:bookmarkStart w:id="220" w:name="ref-mouton2013artemisininonly"/>
     <w:p>
       <w:pPr>
         <w:pStyle w:val="Bibliography"/>
@@ -18687,7 +19793,7 @@
       <w:r>
         <w:t xml:space="preserve"> </w:t>
       </w:r>
-      <w:hyperlink r:id="rId215">
+      <w:hyperlink r:id="rId219">
         <w:r>
           <w:rPr>
             <w:rStyle w:val="Hyperlink"/>
@@ -18699,8 +19805,8 @@
         <w:t xml:space="preserve">.</w:t>
       </w:r>
     </w:p>
-    <w:bookmarkEnd w:id="216"/>
-    <w:bookmarkStart w:id="218" w:name="ref-mravcakova2020wormwood"/>
+    <w:bookmarkEnd w:id="220"/>
+    <w:bookmarkStart w:id="222" w:name="ref-mravcakova2020wormwood"/>
     <w:p>
       <w:pPr>
         <w:pStyle w:val="Bibliography"/>
@@ -18734,7 +19840,7 @@
       <w:r>
         <w:t xml:space="preserve"> </w:t>
       </w:r>
-      <w:hyperlink r:id="rId217">
+      <w:hyperlink r:id="rId221">
         <w:r>
           <w:rPr>
             <w:rStyle w:val="Hyperlink"/>
@@ -18746,8 +19852,8 @@
         <w:t xml:space="preserve">.</w:t>
       </w:r>
     </w:p>
-    <w:bookmarkEnd w:id="218"/>
-    <w:bookmarkStart w:id="220" w:name="ref-nahrevanian2010khorassanica"/>
+    <w:bookmarkEnd w:id="222"/>
+    <w:bookmarkStart w:id="224" w:name="ref-nahrevanian2010khorassanica"/>
     <w:p>
       <w:pPr>
         <w:pStyle w:val="Bibliography"/>
@@ -18781,7 +19887,7 @@
       <w:r>
         <w:t xml:space="preserve"> </w:t>
       </w:r>
-      <w:hyperlink r:id="rId219">
+      <w:hyperlink r:id="rId223">
         <w:r>
           <w:rPr>
             <w:rStyle w:val="Hyperlink"/>
@@ -18793,8 +19899,8 @@
         <w:t xml:space="preserve">.</w:t>
       </w:r>
     </w:p>
-    <w:bookmarkEnd w:id="220"/>
-    <w:bookmarkStart w:id="222" w:name="ref-nahrevanian2012sieberi"/>
+    <w:bookmarkEnd w:id="224"/>
+    <w:bookmarkStart w:id="226" w:name="ref-nahrevanian2012sieberi"/>
     <w:p>
       <w:pPr>
         <w:pStyle w:val="Bibliography"/>
@@ -18828,7 +19934,7 @@
       <w:r>
         <w:t xml:space="preserve"> </w:t>
       </w:r>
-      <w:hyperlink r:id="rId221">
+      <w:hyperlink r:id="rId225">
         <w:r>
           <w:rPr>
             <w:rStyle w:val="Hyperlink"/>
@@ -18840,8 +19946,8 @@
         <w:t xml:space="preserve">.</w:t>
       </w:r>
     </w:p>
-    <w:bookmarkEnd w:id="222"/>
-    <w:bookmarkStart w:id="224" w:name="ref-nomani2022h2s"/>
+    <w:bookmarkEnd w:id="226"/>
+    <w:bookmarkStart w:id="228" w:name="ref-nomani2022h2s"/>
     <w:p>
       <w:pPr>
         <w:pStyle w:val="Bibliography"/>
@@ -18887,7 +19993,7 @@
       <w:r>
         <w:t xml:space="preserve"> </w:t>
       </w:r>
-      <w:hyperlink r:id="rId223">
+      <w:hyperlink r:id="rId227">
         <w:r>
           <w:rPr>
             <w:rStyle w:val="Hyperlink"/>
@@ -18899,8 +20005,8 @@
         <w:t xml:space="preserve">.</w:t>
       </w:r>
     </w:p>
-    <w:bookmarkEnd w:id="224"/>
-    <w:bookmarkStart w:id="226" w:name="ref-nurlaelasari2023vulgarisfasciola"/>
+    <w:bookmarkEnd w:id="228"/>
+    <w:bookmarkStart w:id="230" w:name="ref-nurlaelasari2023vulgarisfasciola"/>
     <w:p>
       <w:pPr>
         <w:pStyle w:val="Bibliography"/>
@@ -18955,7 +20061,7 @@
       <w:r>
         <w:t xml:space="preserve"> </w:t>
       </w:r>
-      <w:hyperlink r:id="rId225">
+      <w:hyperlink r:id="rId229">
         <w:r>
           <w:rPr>
             <w:rStyle w:val="Hyperlink"/>
@@ -18967,8 +20073,8 @@
         <w:t xml:space="preserve">.</w:t>
       </w:r>
     </w:p>
-    <w:bookmarkEnd w:id="226"/>
-    <w:bookmarkStart w:id="228" w:name="ref-olofsson2011tissue"/>
+    <w:bookmarkEnd w:id="230"/>
+    <w:bookmarkStart w:id="232" w:name="ref-olofsson2011tissue"/>
     <w:p>
       <w:pPr>
         <w:pStyle w:val="Bibliography"/>
@@ -19002,7 +20108,7 @@
       <w:r>
         <w:t xml:space="preserve"> </w:t>
       </w:r>
-      <w:hyperlink r:id="rId227">
+      <w:hyperlink r:id="rId231">
         <w:r>
           <w:rPr>
             <w:rStyle w:val="Hyperlink"/>
@@ -19014,8 +20120,8 @@
         <w:t xml:space="preserve">.</w:t>
       </w:r>
     </w:p>
-    <w:bookmarkEnd w:id="228"/>
-    <w:bookmarkStart w:id="230" w:name="ref-olsson2009localization"/>
+    <w:bookmarkEnd w:id="232"/>
+    <w:bookmarkStart w:id="234" w:name="ref-olsson2009localization"/>
     <w:p>
       <w:pPr>
         <w:pStyle w:val="Bibliography"/>
@@ -19049,7 +20155,7 @@
       <w:r>
         <w:t xml:space="preserve"> </w:t>
       </w:r>
-      <w:hyperlink r:id="rId229">
+      <w:hyperlink r:id="rId233">
         <w:r>
           <w:rPr>
             <w:rStyle w:val="Hyperlink"/>
@@ -19061,8 +20167,8 @@
         <w:t xml:space="preserve">.</w:t>
       </w:r>
     </w:p>
-    <w:bookmarkEnd w:id="230"/>
-    <w:bookmarkStart w:id="232" w:name="ref-ongo2019campestriscomment"/>
+    <w:bookmarkEnd w:id="234"/>
+    <w:bookmarkStart w:id="236" w:name="ref-ongo2019campestriscomment"/>
     <w:p>
       <w:pPr>
         <w:pStyle w:val="Bibliography"/>
@@ -19117,7 +20223,7 @@
       <w:r>
         <w:t xml:space="preserve"> </w:t>
       </w:r>
-      <w:hyperlink r:id="rId231">
+      <w:hyperlink r:id="rId235">
         <w:r>
           <w:rPr>
             <w:rStyle w:val="Hyperlink"/>
@@ -19129,8 +20235,8 @@
         <w:t xml:space="preserve">.</w:t>
       </w:r>
     </w:p>
-    <w:bookmarkEnd w:id="232"/>
-    <w:bookmarkStart w:id="234" w:name="ref-ortet2008gorgonum"/>
+    <w:bookmarkEnd w:id="236"/>
+    <w:bookmarkStart w:id="238" w:name="ref-ortet2008gorgonum"/>
     <w:p>
       <w:pPr>
         <w:pStyle w:val="Bibliography"/>
@@ -19164,7 +20270,7 @@
       <w:r>
         <w:t xml:space="preserve"> </w:t>
       </w:r>
-      <w:hyperlink r:id="rId233">
+      <w:hyperlink r:id="rId237">
         <w:r>
           <w:rPr>
             <w:rStyle w:val="Hyperlink"/>
@@ -19176,8 +20282,8 @@
         <w:t xml:space="preserve">.</w:t>
       </w:r>
     </w:p>
-    <w:bookmarkEnd w:id="234"/>
-    <w:bookmarkStart w:id="236" w:name="ref-osanloo2022dracunculusnanogel"/>
+    <w:bookmarkEnd w:id="238"/>
+    <w:bookmarkStart w:id="240" w:name="ref-osanloo2022dracunculusnanogel"/>
     <w:p>
       <w:pPr>
         <w:pStyle w:val="Bibliography"/>
@@ -19223,7 +20329,7 @@
       <w:r>
         <w:t xml:space="preserve"> </w:t>
       </w:r>
-      <w:hyperlink r:id="rId235">
+      <w:hyperlink r:id="rId239">
         <w:r>
           <w:rPr>
             <w:rStyle w:val="Hyperlink"/>
@@ -19235,8 +20341,8 @@
         <w:t xml:space="preserve">.</w:t>
       </w:r>
     </w:p>
-    <w:bookmarkEnd w:id="236"/>
-    <w:bookmarkStart w:id="238" w:name="ref-oyedeji2009afra"/>
+    <w:bookmarkEnd w:id="240"/>
+    <w:bookmarkStart w:id="242" w:name="ref-oyedeji2009afra"/>
     <w:p>
       <w:pPr>
         <w:pStyle w:val="Bibliography"/>
@@ -19270,7 +20376,7 @@
       <w:r>
         <w:t xml:space="preserve"> </w:t>
       </w:r>
-      <w:hyperlink r:id="rId237">
+      <w:hyperlink r:id="rId241">
         <w:r>
           <w:rPr>
             <w:rStyle w:val="Hyperlink"/>
@@ -19282,8 +20388,8 @@
         <w:t xml:space="preserve">.</w:t>
       </w:r>
     </w:p>
-    <w:bookmarkEnd w:id="238"/>
-    <w:bookmarkStart w:id="240" w:name="ref-pandey2017artemisiaoils"/>
+    <w:bookmarkEnd w:id="242"/>
+    <w:bookmarkStart w:id="244" w:name="ref-pandey2017artemisiaoils"/>
     <w:p>
       <w:pPr>
         <w:pStyle w:val="Bibliography"/>
@@ -19317,7 +20423,7 @@
       <w:r>
         <w:t xml:space="preserve"> </w:t>
       </w:r>
-      <w:hyperlink r:id="rId239">
+      <w:hyperlink r:id="rId243">
         <w:r>
           <w:rPr>
             <w:rStyle w:val="Hyperlink"/>
@@ -19329,8 +20435,8 @@
         <w:t xml:space="preserve">.</w:t>
       </w:r>
     </w:p>
-    <w:bookmarkEnd w:id="240"/>
-    <w:bookmarkStart w:id="242" w:name="ref-parveen2024scoparia"/>
+    <w:bookmarkEnd w:id="244"/>
+    <w:bookmarkStart w:id="246" w:name="ref-parveen2024scoparia"/>
     <w:p>
       <w:pPr>
         <w:pStyle w:val="Bibliography"/>
@@ -19376,7 +20482,7 @@
       <w:r>
         <w:t xml:space="preserve"> </w:t>
       </w:r>
-      <w:hyperlink r:id="rId241">
+      <w:hyperlink r:id="rId245">
         <w:r>
           <w:rPr>
             <w:rStyle w:val="Hyperlink"/>
@@ -19388,8 +20494,8 @@
         <w:t xml:space="preserve">.</w:t>
       </w:r>
     </w:p>
-    <w:bookmarkEnd w:id="242"/>
-    <w:bookmarkStart w:id="244" w:name="ref-paul2010recurrent"/>
+    <w:bookmarkEnd w:id="246"/>
+    <w:bookmarkStart w:id="248" w:name="ref-paul2010recurrent"/>
     <w:p>
       <w:pPr>
         <w:pStyle w:val="Bibliography"/>
@@ -19435,7 +20541,7 @@
       <w:r>
         <w:t xml:space="preserve"> </w:t>
       </w:r>
-      <w:hyperlink r:id="rId243">
+      <w:hyperlink r:id="rId247">
         <w:r>
           <w:rPr>
             <w:rStyle w:val="Hyperlink"/>
@@ -19447,8 +20553,8 @@
         <w:t xml:space="preserve">.</w:t>
       </w:r>
     </w:p>
-    <w:bookmarkEnd w:id="244"/>
-    <w:bookmarkStart w:id="246" w:name="ref-pirali2011tick"/>
+    <w:bookmarkEnd w:id="248"/>
+    <w:bookmarkStart w:id="250" w:name="ref-pirali2011tick"/>
     <w:p>
       <w:pPr>
         <w:pStyle w:val="Bibliography"/>
@@ -19506,7 +20612,7 @@
       <w:r>
         <w:t xml:space="preserve"> </w:t>
       </w:r>
-      <w:hyperlink r:id="rId245">
+      <w:hyperlink r:id="rId249">
         <w:r>
           <w:rPr>
             <w:rStyle w:val="Hyperlink"/>
@@ -19518,8 +20624,8 @@
         <w:t xml:space="preserve">.</w:t>
       </w:r>
     </w:p>
-    <w:bookmarkEnd w:id="246"/>
-    <w:bookmarkStart w:id="248" w:name="ref-radulovic2013toxic"/>
+    <w:bookmarkEnd w:id="250"/>
+    <w:bookmarkStart w:id="252" w:name="ref-radulovic2013toxic"/>
     <w:p>
       <w:pPr>
         <w:pStyle w:val="Bibliography"/>
@@ -19553,7 +20659,7 @@
       <w:r>
         <w:t xml:space="preserve"> </w:t>
       </w:r>
-      <w:hyperlink r:id="rId247">
+      <w:hyperlink r:id="rId251">
         <w:r>
           <w:rPr>
             <w:rStyle w:val="Hyperlink"/>
@@ -19565,8 +20671,8 @@
         <w:t xml:space="preserve">.</w:t>
       </w:r>
     </w:p>
-    <w:bookmarkEnd w:id="248"/>
-    <w:bookmarkStart w:id="250" w:name="ref-ram1997density"/>
+    <w:bookmarkEnd w:id="252"/>
+    <w:bookmarkStart w:id="254" w:name="ref-ram1997density"/>
     <w:p>
       <w:pPr>
         <w:pStyle w:val="Bibliography"/>
@@ -19612,7 +20718,7 @@
       <w:r>
         <w:t xml:space="preserve"> </w:t>
       </w:r>
-      <w:hyperlink r:id="rId249">
+      <w:hyperlink r:id="rId253">
         <w:r>
           <w:rPr>
             <w:rStyle w:val="Hyperlink"/>
@@ -19624,8 +20730,8 @@
         <w:t xml:space="preserve">.</w:t>
       </w:r>
     </w:p>
-    <w:bookmarkEnd w:id="250"/>
-    <w:bookmarkStart w:id="252" w:name="ref-ribbiso2021heme"/>
+    <w:bookmarkEnd w:id="254"/>
+    <w:bookmarkStart w:id="256" w:name="ref-ribbiso2021heme"/>
     <w:p>
       <w:pPr>
         <w:pStyle w:val="Bibliography"/>
@@ -19671,7 +20777,7 @@
       <w:r>
         <w:t xml:space="preserve"> </w:t>
       </w:r>
-      <w:hyperlink r:id="rId251">
+      <w:hyperlink r:id="rId255">
         <w:r>
           <w:rPr>
             <w:rStyle w:val="Hyperlink"/>
@@ -19683,8 +20789,8 @@
         <w:t xml:space="preserve">.</w:t>
       </w:r>
     </w:p>
-    <w:bookmarkEnd w:id="252"/>
-    <w:bookmarkStart w:id="254" w:name="ref-rosenthal2024proteostasis"/>
+    <w:bookmarkEnd w:id="256"/>
+    <w:bookmarkStart w:id="258" w:name="ref-rosenthal2024proteostasis"/>
     <w:p>
       <w:pPr>
         <w:pStyle w:val="Bibliography"/>
@@ -19727,7 +20833,7 @@
       <w:r>
         <w:t xml:space="preserve"> </w:t>
       </w:r>
-      <w:hyperlink r:id="rId253">
+      <w:hyperlink r:id="rId257">
         <w:r>
           <w:rPr>
             <w:rStyle w:val="Hyperlink"/>
@@ -19739,8 +20845,8 @@
         <w:t xml:space="preserve">.</w:t>
       </w:r>
     </w:p>
-    <w:bookmarkEnd w:id="254"/>
-    <w:bookmarkStart w:id="256" w:name="ref-rostkowska2016silicon"/>
+    <w:bookmarkEnd w:id="258"/>
+    <w:bookmarkStart w:id="260" w:name="ref-rostkowska2016silicon"/>
     <w:p>
       <w:pPr>
         <w:pStyle w:val="Bibliography"/>
@@ -19798,7 +20904,7 @@
       <w:r>
         <w:t xml:space="preserve"> </w:t>
       </w:r>
-      <w:hyperlink r:id="rId255">
+      <w:hyperlink r:id="rId259">
         <w:r>
           <w:rPr>
             <w:rStyle w:val="Hyperlink"/>
@@ -19810,8 +20916,8 @@
         <w:t xml:space="preserve">.</w:t>
       </w:r>
     </w:p>
-    <w:bookmarkEnd w:id="256"/>
-    <w:bookmarkStart w:id="258" w:name="ref-annua2016monoterpenes"/>
+    <w:bookmarkEnd w:id="260"/>
+    <w:bookmarkStart w:id="262" w:name="ref-annua2016monoterpenes"/>
     <w:p>
       <w:pPr>
         <w:pStyle w:val="Bibliography"/>
@@ -19845,7 +20951,7 @@
       <w:r>
         <w:t xml:space="preserve"> </w:t>
       </w:r>
-      <w:hyperlink r:id="rId257">
+      <w:hyperlink r:id="rId261">
         <w:r>
           <w:rPr>
             <w:rStyle w:val="Hyperlink"/>
@@ -19857,8 +20963,8 @@
         <w:t xml:space="preserve">.</w:t>
       </w:r>
     </w:p>
-    <w:bookmarkEnd w:id="258"/>
-    <w:bookmarkStart w:id="260" w:name="ref-said2016vcd"/>
+    <w:bookmarkEnd w:id="262"/>
+    <w:bookmarkStart w:id="264" w:name="ref-said2016vcd"/>
     <w:p>
       <w:pPr>
         <w:pStyle w:val="Bibliography"/>
@@ -19904,7 +21010,7 @@
       <w:r>
         <w:t xml:space="preserve"> </w:t>
       </w:r>
-      <w:hyperlink r:id="rId259">
+      <w:hyperlink r:id="rId263">
         <w:r>
           <w:rPr>
             <w:rStyle w:val="Hyperlink"/>
@@ -19916,8 +21022,8 @@
         <w:t xml:space="preserve">.</w:t>
       </w:r>
     </w:p>
-    <w:bookmarkEnd w:id="260"/>
-    <w:bookmarkStart w:id="262" w:name="ref-sanei2023nanoliposomes"/>
+    <w:bookmarkEnd w:id="264"/>
+    <w:bookmarkStart w:id="266" w:name="ref-sanei2023nanoliposomes"/>
     <w:p>
       <w:pPr>
         <w:pStyle w:val="Bibliography"/>
@@ -19984,7 +21090,7 @@
       <w:r>
         <w:t xml:space="preserve"> </w:t>
       </w:r>
-      <w:hyperlink r:id="rId261">
+      <w:hyperlink r:id="rId265">
         <w:r>
           <w:rPr>
             <w:rStyle w:val="Hyperlink"/>
@@ -19996,8 +21102,8 @@
         <w:t xml:space="preserve">.</w:t>
       </w:r>
     </w:p>
-    <w:bookmarkEnd w:id="262"/>
-    <w:bookmarkStart w:id="264" w:name="ref-schramek2010isotope"/>
+    <w:bookmarkEnd w:id="266"/>
+    <w:bookmarkStart w:id="268" w:name="ref-schramek2010isotope"/>
     <w:p>
       <w:pPr>
         <w:pStyle w:val="Bibliography"/>
@@ -20031,7 +21137,7 @@
       <w:r>
         <w:t xml:space="preserve"> </w:t>
       </w:r>
-      <w:hyperlink r:id="rId263">
+      <w:hyperlink r:id="rId267">
         <w:r>
           <w:rPr>
             <w:rStyle w:val="Hyperlink"/>
@@ -20043,8 +21149,8 @@
         <w:t xml:space="preserve">.</w:t>
       </w:r>
     </w:p>
-    <w:bookmarkEnd w:id="264"/>
-    <w:bookmarkStart w:id="266" w:name="ref-seddiek2011herbaalba"/>
+    <w:bookmarkEnd w:id="268"/>
+    <w:bookmarkStart w:id="270" w:name="ref-seddiek2011herbaalba"/>
     <w:p>
       <w:pPr>
         <w:pStyle w:val="Bibliography"/>
@@ -20102,7 +21208,7 @@
       <w:r>
         <w:t xml:space="preserve"> </w:t>
       </w:r>
-      <w:hyperlink r:id="rId265">
+      <w:hyperlink r:id="rId269">
         <w:r>
           <w:rPr>
             <w:rStyle w:val="Hyperlink"/>
@@ -20114,14 +21220,94 @@
         <w:t xml:space="preserve">.</w:t>
       </w:r>
     </w:p>
-    <w:bookmarkEnd w:id="266"/>
-    <w:bookmarkStart w:id="268" w:name="ref-shen2012cypcpr"/>
+    <w:bookmarkEnd w:id="270"/>
+    <w:bookmarkStart w:id="272" w:name="ref-sharma2012culex"/>
     <w:p>
       <w:pPr>
         <w:pStyle w:val="Bibliography"/>
         <w:spacing w:before="0" w:after="120" w:line="264" w:lineRule="auto"/>
       </w:pPr>
       <w:r>
+        <w:t xml:space="preserve">Sharma, Gaurav, Kaushal Kumar, Abhay Sharma, and Veena Agrawal. 2012.</w:t>
+      </w:r>
+      <w:r>
+        <w:t xml:space="preserve"> </w:t>
+      </w:r>
+      <w:r>
+        <w:t xml:space="preserve">“Bioassay of</w:t>
+      </w:r>
+      <w:r>
+        <w:t xml:space="preserve"> </w:t>
+      </w:r>
+      <w:r>
+        <w:t xml:space="preserve">Artemisia annua</w:t>
+      </w:r>
+      <w:r>
+        <w:t xml:space="preserve"> </w:t>
+      </w:r>
+      <w:r>
+        <w:t xml:space="preserve">Leaf Extracts and Artemisinin Against Larvae of</w:t>
+      </w:r>
+      <w:r>
+        <w:t xml:space="preserve"> </w:t>
+      </w:r>
+      <w:r>
+        <w:t xml:space="preserve">Culex quinquefasciatus</w:t>
+      </w:r>
+      <w:r>
+        <w:t xml:space="preserve"> </w:t>
+      </w:r>
+      <w:r>
+        <w:t xml:space="preserve">and</w:t>
+      </w:r>
+      <w:r>
+        <w:t xml:space="preserve"> </w:t>
+      </w:r>
+      <w:r>
+        <w:t xml:space="preserve">Culex tritaeniorhynchus</w:t>
+      </w:r>
+      <w:r>
+        <w:t xml:space="preserve">.”</w:t>
+      </w:r>
+      <w:r>
+        <w:t xml:space="preserve"> </w:t>
+      </w:r>
+      <w:r>
+        <w:rPr>
+          <w:i/>
+          <w:iCs/>
+        </w:rPr>
+        <w:t xml:space="preserve">Journal of the American Mosquito Control Association</w:t>
+      </w:r>
+      <w:r>
+        <w:t xml:space="preserve"> </w:t>
+      </w:r>
+      <w:r>
+        <w:t xml:space="preserve">28.</w:t>
+      </w:r>
+      <w:r>
+        <w:t xml:space="preserve"> </w:t>
+      </w:r>
+      <w:hyperlink r:id="rId271">
+        <w:r>
+          <w:rPr>
+            <w:rStyle w:val="Hyperlink"/>
+          </w:rPr>
+          <w:t xml:space="preserve">https://doi.org/10.2987/12-6275R.1</w:t>
+        </w:r>
+      </w:hyperlink>
+      <w:r>
+        <w:t xml:space="preserve">.</w:t>
+      </w:r>
+    </w:p>
+    <w:bookmarkEnd w:id="272"/>
+    <w:bookmarkStart w:id="274" w:name="ref-shen2012cypcpr"/>
+    <w:p>
+      <w:pPr>
+        <w:pStyle w:val="Bibliography"/>
+        <w:spacing w:before="0" w:after="120" w:line="264" w:lineRule="auto"/>
+      </w:pPr>
+      <w:r>
         <w:t xml:space="preserve">Shen, Q., Y. F. Chen, T. Wang, S. Y. Wu, X. Lu, L. Zhang, F. Y. Zhang, W. M. Jiang, G. F. Wang, and K. X. Tang. 2012.</w:t>
       </w:r>
       <w:r>
@@ -20173,7 +21359,7 @@
       <w:r>
         <w:t xml:space="preserve"> </w:t>
       </w:r>
-      <w:hyperlink r:id="rId267">
+      <w:hyperlink r:id="rId273">
         <w:r>
           <w:rPr>
             <w:rStyle w:val="Hyperlink"/>
@@ -20185,8 +21371,8 @@
         <w:t xml:space="preserve">.</w:t>
       </w:r>
     </w:p>
-    <w:bookmarkEnd w:id="268"/>
-    <w:bookmarkStart w:id="270" w:name="ref-shi2022annuaantimalarialmetabolomics"/>
+    <w:bookmarkEnd w:id="274"/>
+    <w:bookmarkStart w:id="276" w:name="ref-shi2022annuaantimalarialmetabolomics"/>
     <w:p>
       <w:pPr>
         <w:pStyle w:val="Bibliography"/>
@@ -20232,7 +21418,7 @@
       <w:r>
         <w:t xml:space="preserve"> </w:t>
       </w:r>
-      <w:hyperlink r:id="rId269">
+      <w:hyperlink r:id="rId275">
         <w:r>
           <w:rPr>
             <w:rStyle w:val="Hyperlink"/>
@@ -20244,8 +21430,8 @@
         <w:t xml:space="preserve">.</w:t>
       </w:r>
     </w:p>
-    <w:bookmarkEnd w:id="270"/>
-    <w:bookmarkStart w:id="272" w:name="ref-shi2018mixta1"/>
+    <w:bookmarkEnd w:id="276"/>
+    <w:bookmarkStart w:id="278" w:name="ref-shi2018mixta1"/>
     <w:p>
       <w:pPr>
         <w:pStyle w:val="Bibliography"/>
@@ -20300,7 +21486,7 @@
       <w:r>
         <w:t xml:space="preserve"> </w:t>
       </w:r>
-      <w:hyperlink r:id="rId271">
+      <w:hyperlink r:id="rId277">
         <w:r>
           <w:rPr>
             <w:rStyle w:val="Hyperlink"/>
@@ -20312,8 +21498,8 @@
         <w:t xml:space="preserve">.</w:t>
       </w:r>
     </w:p>
-    <w:bookmarkEnd w:id="272"/>
-    <w:bookmarkStart w:id="274" w:name="ref-dasilva2017annuasheep"/>
+    <w:bookmarkEnd w:id="278"/>
+    <w:bookmarkStart w:id="280" w:name="ref-dasilva2017annuasheep"/>
     <w:p>
       <w:pPr>
         <w:pStyle w:val="Bibliography"/>
@@ -20359,7 +21545,7 @@
       <w:r>
         <w:t xml:space="preserve"> </w:t>
       </w:r>
-      <w:hyperlink r:id="rId273">
+      <w:hyperlink r:id="rId279">
         <w:r>
           <w:rPr>
             <w:rStyle w:val="Hyperlink"/>
@@ -20371,8 +21557,8 @@
         <w:t xml:space="preserve">.</w:t>
       </w:r>
     </w:p>
-    <w:bookmarkEnd w:id="274"/>
-    <w:bookmarkStart w:id="276" w:name="ref-snider2021gametocytes"/>
+    <w:bookmarkEnd w:id="280"/>
+    <w:bookmarkStart w:id="282" w:name="ref-snider2021gametocytes"/>
     <w:p>
       <w:pPr>
         <w:pStyle w:val="Bibliography"/>
@@ -20430,7 +21616,7 @@
       <w:r>
         <w:t xml:space="preserve"> </w:t>
       </w:r>
-      <w:hyperlink r:id="rId275">
+      <w:hyperlink r:id="rId281">
         <w:r>
           <w:rPr>
             <w:rStyle w:val="Hyperlink"/>
@@ -20442,8 +21628,8 @@
         <w:t xml:space="preserve">.</w:t>
       </w:r>
     </w:p>
-    <w:bookmarkEnd w:id="276"/>
-    <w:bookmarkStart w:id="278" w:name="ref-soleimanifard2023kermanensis"/>
+    <w:bookmarkEnd w:id="282"/>
+    <w:bookmarkStart w:id="284" w:name="ref-soleimanifard2023kermanensis"/>
     <w:p>
       <w:pPr>
         <w:pStyle w:val="Bibliography"/>
@@ -20489,7 +21675,7 @@
       <w:r>
         <w:t xml:space="preserve"> </w:t>
       </w:r>
-      <w:hyperlink r:id="rId277">
+      <w:hyperlink r:id="rId283">
         <w:r>
           <w:rPr>
             <w:rStyle w:val="Hyperlink"/>
@@ -20501,8 +21687,8 @@
         <w:t xml:space="preserve">.</w:t>
       </w:r>
     </w:p>
-    <w:bookmarkEnd w:id="278"/>
-    <w:bookmarkStart w:id="280" w:name="ref-squires2011haemonchus"/>
+    <w:bookmarkEnd w:id="284"/>
+    <w:bookmarkStart w:id="286" w:name="ref-squires2011haemonchus"/>
     <w:p>
       <w:pPr>
         <w:pStyle w:val="Bibliography"/>
@@ -20536,7 +21722,7 @@
       <w:r>
         <w:t xml:space="preserve"> </w:t>
       </w:r>
-      <w:hyperlink r:id="rId279">
+      <w:hyperlink r:id="rId285">
         <w:r>
           <w:rPr>
             <w:rStyle w:val="Hyperlink"/>
@@ -20548,8 +21734,8 @@
         <w:t xml:space="preserve">.</w:t>
       </w:r>
     </w:p>
-    <w:bookmarkEnd w:id="280"/>
-    <w:bookmarkStart w:id="282" w:name="ref-tabari2017sieberi"/>
+    <w:bookmarkEnd w:id="286"/>
+    <w:bookmarkStart w:id="288" w:name="ref-tabari2017sieberi"/>
     <w:p>
       <w:pPr>
         <w:pStyle w:val="Bibliography"/>
@@ -20583,7 +21769,7 @@
       <w:r>
         <w:t xml:space="preserve"> </w:t>
       </w:r>
-      <w:hyperlink r:id="rId281">
+      <w:hyperlink r:id="rId287">
         <w:r>
           <w:rPr>
             <w:rStyle w:val="Hyperlink"/>
@@ -20595,8 +21781,8 @@
         <w:t xml:space="preserve">.</w:t>
       </w:r>
     </w:p>
-    <w:bookmarkEnd w:id="282"/>
-    <w:bookmarkStart w:id="284" w:name="ref-tamargo2017nanocochleate"/>
+    <w:bookmarkEnd w:id="288"/>
+    <w:bookmarkStart w:id="290" w:name="ref-tamargo2017nanocochleate"/>
     <w:p>
       <w:pPr>
         <w:pStyle w:val="Bibliography"/>
@@ -20630,7 +21816,7 @@
       <w:r>
         <w:t xml:space="preserve"> </w:t>
       </w:r>
-      <w:hyperlink r:id="rId283">
+      <w:hyperlink r:id="rId289">
         <w:r>
           <w:rPr>
             <w:rStyle w:val="Hyperlink"/>
@@ -20642,8 +21828,8 @@
         <w:t xml:space="preserve">.</w:t>
       </w:r>
     </w:p>
-    <w:bookmarkEnd w:id="284"/>
-    <w:bookmarkStart w:id="286" w:name="ref-tangnitipong2012heme"/>
+    <w:bookmarkEnd w:id="290"/>
+    <w:bookmarkStart w:id="292" w:name="ref-tangnitipong2012heme"/>
     <w:p>
       <w:pPr>
         <w:pStyle w:val="Bibliography"/>
@@ -20677,7 +21863,7 @@
       <w:r>
         <w:t xml:space="preserve"> </w:t>
       </w:r>
-      <w:hyperlink r:id="rId285">
+      <w:hyperlink r:id="rId291">
         <w:r>
           <w:rPr>
             <w:rStyle w:val="Hyperlink"/>
@@ -20689,14 +21875,61 @@
         <w:t xml:space="preserve">.</w:t>
       </w:r>
     </w:p>
-    <w:bookmarkEnd w:id="286"/>
-    <w:bookmarkStart w:id="288" w:name="ref-tariku2011absinthium"/>
+    <w:bookmarkEnd w:id="292"/>
+    <w:bookmarkStart w:id="294" w:name="ref-desta2010abyssinica"/>
     <w:p>
       <w:pPr>
         <w:pStyle w:val="Bibliography"/>
         <w:spacing w:before="0" w:after="120" w:line="264" w:lineRule="auto"/>
       </w:pPr>
       <w:r>
+        <w:t xml:space="preserve">Tariku, Y, A Hymete, A Hailu, et al. 2010.</w:t>
+      </w:r>
+      <w:r>
+        <w:t xml:space="preserve"> </w:t>
+      </w:r>
+      <w:r>
+        <w:t xml:space="preserve">“Essential-Oil Composition, Antileishmanial, and Toxicity Study of Artemisia Abyssinica.”</w:t>
+      </w:r>
+      <w:r>
+        <w:t xml:space="preserve"> </w:t>
+      </w:r>
+      <w:r>
+        <w:rPr>
+          <w:i/>
+          <w:iCs/>
+        </w:rPr>
+        <w:t xml:space="preserve">Chemistry &amp; Biodiversity</w:t>
+      </w:r>
+      <w:r>
+        <w:t xml:space="preserve"> </w:t>
+      </w:r>
+      <w:r>
+        <w:t xml:space="preserve">7 (4): 1009–18.</w:t>
+      </w:r>
+      <w:r>
+        <w:t xml:space="preserve"> </w:t>
+      </w:r>
+      <w:hyperlink r:id="rId293">
+        <w:r>
+          <w:rPr>
+            <w:rStyle w:val="Hyperlink"/>
+          </w:rPr>
+          <w:t xml:space="preserve">https://doi.org/10.1002/cbdv.200900375</w:t>
+        </w:r>
+      </w:hyperlink>
+      <w:r>
+        <w:t xml:space="preserve">.</w:t>
+      </w:r>
+    </w:p>
+    <w:bookmarkEnd w:id="294"/>
+    <w:bookmarkStart w:id="296" w:name="ref-tariku2011absinthium"/>
+    <w:p>
+      <w:pPr>
+        <w:pStyle w:val="Bibliography"/>
+        <w:spacing w:before="0" w:after="120" w:line="264" w:lineRule="auto"/>
+      </w:pPr>
+      <w:r>
         <w:t xml:space="preserve">Tariku, Y, A Hymete, A Hailu, and J Rohloff. 2011.</w:t>
       </w:r>
       <w:r>
@@ -20724,7 +21957,7 @@
       <w:r>
         <w:t xml:space="preserve"> </w:t>
       </w:r>
-      <w:hyperlink r:id="rId287">
+      <w:hyperlink r:id="rId295">
         <w:r>
           <w:rPr>
             <w:rStyle w:val="Hyperlink"/>
@@ -20736,8 +21969,8 @@
         <w:t xml:space="preserve">.</w:t>
       </w:r>
     </w:p>
-    <w:bookmarkEnd w:id="288"/>
-    <w:bookmarkStart w:id="290" w:name="ref-tariq2009absinthium"/>
+    <w:bookmarkEnd w:id="296"/>
+    <w:bookmarkStart w:id="298" w:name="ref-tariq2009absinthium"/>
     <w:p>
       <w:pPr>
         <w:pStyle w:val="Bibliography"/>
@@ -20771,7 +22004,7 @@
       <w:r>
         <w:t xml:space="preserve"> </w:t>
       </w:r>
-      <w:hyperlink r:id="rId289">
+      <w:hyperlink r:id="rId297">
         <w:r>
           <w:rPr>
             <w:rStyle w:val="Hyperlink"/>
@@ -20783,8 +22016,8 @@
         <w:t xml:space="preserve">.</w:t>
       </w:r>
     </w:p>
-    <w:bookmarkEnd w:id="290"/>
-    <w:bookmarkStart w:id="292" w:name="ref-tasdemir2015antiprotozoal"/>
+    <w:bookmarkEnd w:id="298"/>
+    <w:bookmarkStart w:id="300" w:name="ref-tasdemir2015antiprotozoal"/>
     <w:p>
       <w:pPr>
         <w:pStyle w:val="Bibliography"/>
@@ -20818,7 +22051,7 @@
       <w:r>
         <w:t xml:space="preserve"> </w:t>
       </w:r>
-      <w:hyperlink r:id="rId291">
+      <w:hyperlink r:id="rId299">
         <w:r>
           <w:rPr>
             <w:rStyle w:val="Hyperlink"/>
@@ -20830,8 +22063,8 @@
         <w:t xml:space="preserve">.</w:t>
       </w:r>
     </w:p>
-    <w:bookmarkEnd w:id="292"/>
-    <w:bookmarkStart w:id="294" w:name="ref-teoh2006cyp"/>
+    <w:bookmarkEnd w:id="300"/>
+    <w:bookmarkStart w:id="302" w:name="ref-teoh2006cyp"/>
     <w:p>
       <w:pPr>
         <w:pStyle w:val="Bibliography"/>
@@ -20865,7 +22098,7 @@
       <w:r>
         <w:t xml:space="preserve"> </w:t>
       </w:r>
-      <w:hyperlink r:id="rId293">
+      <w:hyperlink r:id="rId301">
         <w:r>
           <w:rPr>
             <w:rStyle w:val="Hyperlink"/>
@@ -20877,8 +22110,8 @@
         <w:t xml:space="preserve">.</w:t>
       </w:r>
     </w:p>
-    <w:bookmarkEnd w:id="294"/>
-    <w:bookmarkStart w:id="296" w:name="ref-thofner2012histomonas"/>
+    <w:bookmarkEnd w:id="302"/>
+    <w:bookmarkStart w:id="304" w:name="ref-thofner2012histomonas"/>
     <w:p>
       <w:pPr>
         <w:pStyle w:val="Bibliography"/>
@@ -20924,7 +22157,7 @@
       <w:r>
         <w:t xml:space="preserve"> </w:t>
       </w:r>
-      <w:hyperlink r:id="rId295">
+      <w:hyperlink r:id="rId303">
         <w:r>
           <w:rPr>
             <w:rStyle w:val="Hyperlink"/>
@@ -20936,8 +22169,8 @@
         <w:t xml:space="preserve">.</w:t>
       </w:r>
     </w:p>
-    <w:bookmarkEnd w:id="296"/>
-    <w:bookmarkStart w:id="298" w:name="ref-trendafilova2021edibleartemisia"/>
+    <w:bookmarkEnd w:id="304"/>
+    <w:bookmarkStart w:id="306" w:name="ref-trendafilova2021edibleartemisia"/>
     <w:p>
       <w:pPr>
         <w:pStyle w:val="Bibliography"/>
@@ -20971,7 +22204,7 @@
       <w:r>
         <w:t xml:space="preserve"> </w:t>
       </w:r>
-      <w:hyperlink r:id="rId297">
+      <w:hyperlink r:id="rId305">
         <w:r>
           <w:rPr>
             <w:rStyle w:val="Hyperlink"/>
@@ -20983,8 +22216,8 @@
         <w:t xml:space="preserve">.</w:t>
       </w:r>
     </w:p>
-    <w:bookmarkEnd w:id="298"/>
-    <w:bookmarkStart w:id="300" w:name="ref-umaraliev2025persicabisabolanes"/>
+    <w:bookmarkEnd w:id="306"/>
+    <w:bookmarkStart w:id="308" w:name="ref-umaraliev2025persicabisabolanes"/>
     <w:p>
       <w:pPr>
         <w:pStyle w:val="Bibliography"/>
@@ -21024,7 +22257,7 @@
       <w:r>
         <w:t xml:space="preserve"> </w:t>
       </w:r>
-      <w:hyperlink r:id="rId299">
+      <w:hyperlink r:id="rId307">
         <w:r>
           <w:rPr>
             <w:rStyle w:val="Hyperlink"/>
@@ -21036,8 +22269,8 @@
         <w:t xml:space="preserve">.</w:t>
       </w:r>
     </w:p>
-    <w:bookmarkEnd w:id="300"/>
-    <w:bookmarkStart w:id="302" w:name="ref-umaraliev2026persicamonoterpenes"/>
+    <w:bookmarkEnd w:id="308"/>
+    <w:bookmarkStart w:id="310" w:name="ref-umaraliev2026persicamonoterpenes"/>
     <w:p>
       <w:pPr>
         <w:pStyle w:val="Bibliography"/>
@@ -21077,7 +22310,7 @@
       <w:r>
         <w:t xml:space="preserve"> </w:t>
       </w:r>
-      <w:hyperlink r:id="rId301">
+      <w:hyperlink r:id="rId309">
         <w:r>
           <w:rPr>
             <w:rStyle w:val="Hyperlink"/>
@@ -21089,8 +22322,8 @@
         <w:t xml:space="preserve">.</w:t>
       </w:r>
     </w:p>
-    <w:bookmarkEnd w:id="302"/>
-    <w:bookmarkStart w:id="304" w:name="ref-urban2020trpc3"/>
+    <w:bookmarkEnd w:id="310"/>
+    <w:bookmarkStart w:id="312" w:name="ref-urban2020trpc3"/>
     <w:p>
       <w:pPr>
         <w:pStyle w:val="Bibliography"/>
@@ -21136,7 +22369,7 @@
       <w:r>
         <w:t xml:space="preserve"> </w:t>
       </w:r>
-      <w:hyperlink r:id="rId303">
+      <w:hyperlink r:id="rId311">
         <w:r>
           <w:rPr>
             <w:rStyle w:val="Hyperlink"/>
@@ -21148,8 +22381,8 @@
         <w:t xml:space="preserve">.</w:t>
       </w:r>
     </w:p>
-    <w:bookmarkEnd w:id="304"/>
-    <w:bookmarkStart w:id="306" w:name="ref-varadyova2018medicinalplants"/>
+    <w:bookmarkEnd w:id="312"/>
+    <w:bookmarkStart w:id="314" w:name="ref-varadyova2018medicinalplants"/>
     <w:p>
       <w:pPr>
         <w:pStyle w:val="Bibliography"/>
@@ -21192,7 +22425,7 @@
       <w:r>
         <w:t xml:space="preserve"> </w:t>
       </w:r>
-      <w:hyperlink r:id="rId305">
+      <w:hyperlink r:id="rId313">
         <w:r>
           <w:rPr>
             <w:rStyle w:val="Hyperlink"/>
@@ -21204,8 +22437,8 @@
         <w:t xml:space="preserve">.</w:t>
       </w:r>
     </w:p>
-    <w:bookmarkEnd w:id="306"/>
-    <w:bookmarkStart w:id="308" w:name="ref-walz2024aframalaria"/>
+    <w:bookmarkEnd w:id="314"/>
+    <w:bookmarkStart w:id="316" w:name="ref-walz2024aframalaria"/>
     <w:p>
       <w:pPr>
         <w:pStyle w:val="Bibliography"/>
@@ -21251,7 +22484,7 @@
       <w:r>
         <w:t xml:space="preserve"> </w:t>
       </w:r>
-      <w:hyperlink r:id="rId307">
+      <w:hyperlink r:id="rId315">
         <w:r>
           <w:rPr>
             <w:rStyle w:val="Hyperlink"/>
@@ -21263,8 +22496,8 @@
         <w:t xml:space="preserve">.</w:t>
       </w:r>
     </w:p>
-    <w:bookmarkEnd w:id="308"/>
-    <w:bookmarkStart w:id="310" w:name="ref-wang2013cyp71av1promoter"/>
+    <w:bookmarkEnd w:id="316"/>
+    <w:bookmarkStart w:id="318" w:name="ref-wang2013cyp71av1promoter"/>
     <w:p>
       <w:pPr>
         <w:pStyle w:val="Bibliography"/>
@@ -21298,7 +22531,7 @@
       <w:r>
         <w:t xml:space="preserve"> </w:t>
       </w:r>
-      <w:hyperlink r:id="rId309">
+      <w:hyperlink r:id="rId317">
         <w:r>
           <w:rPr>
             <w:rStyle w:val="Hyperlink"/>
@@ -21310,8 +22543,8 @@
         <w:t xml:space="preserve">.</w:t>
       </w:r>
     </w:p>
-    <w:bookmarkEnd w:id="310"/>
-    <w:bookmarkStart w:id="312" w:name="ref-wang2009trichometranscriptome"/>
+    <w:bookmarkEnd w:id="318"/>
+    <w:bookmarkStart w:id="320" w:name="ref-wang2009trichometranscriptome"/>
     <w:p>
       <w:pPr>
         <w:pStyle w:val="Bibliography"/>
@@ -21345,7 +22578,7 @@
       <w:r>
         <w:t xml:space="preserve"> </w:t>
       </w:r>
-      <w:hyperlink r:id="rId311">
+      <w:hyperlink r:id="rId319">
         <w:r>
           <w:rPr>
             <w:rStyle w:val="Hyperlink"/>
@@ -21357,8 +22590,8 @@
         <w:t xml:space="preserve">.</w:t>
       </w:r>
     </w:p>
-    <w:bookmarkEnd w:id="312"/>
-    <w:bookmarkStart w:id="314" w:name="ref-wani2023nitric"/>
+    <w:bookmarkEnd w:id="320"/>
+    <w:bookmarkStart w:id="322" w:name="ref-wani2023nitric"/>
     <w:p>
       <w:pPr>
         <w:pStyle w:val="Bibliography"/>
@@ -21416,7 +22649,7 @@
       <w:r>
         <w:t xml:space="preserve"> </w:t>
       </w:r>
-      <w:hyperlink r:id="rId313">
+      <w:hyperlink r:id="rId321">
         <w:r>
           <w:rPr>
             <w:rStyle w:val="Hyperlink"/>
@@ -21428,8 +22661,8 @@
         <w:t xml:space="preserve">.</w:t>
       </w:r>
     </w:p>
-    <w:bookmarkEnd w:id="314"/>
-    <w:bookmarkStart w:id="316" w:name="ref-wani2026maritima"/>
+    <w:bookmarkEnd w:id="322"/>
+    <w:bookmarkStart w:id="324" w:name="ref-wani2026maritima"/>
     <w:p>
       <w:pPr>
         <w:pStyle w:val="Bibliography"/>
@@ -21475,7 +22708,7 @@
       <w:r>
         <w:t xml:space="preserve"> </w:t>
       </w:r>
-      <w:hyperlink r:id="rId315">
+      <w:hyperlink r:id="rId323">
         <w:r>
           <w:rPr>
             <w:rStyle w:val="Hyperlink"/>
@@ -21487,8 +22720,8 @@
         <w:t xml:space="preserve">.</w:t>
       </w:r>
     </w:p>
-    <w:bookmarkEnd w:id="316"/>
-    <w:bookmarkStart w:id="318" w:name="ref-wetmore2019psiv9"/>
+    <w:bookmarkEnd w:id="324"/>
+    <w:bookmarkStart w:id="326" w:name="ref-wetmore2019psiv9"/>
     <w:p>
       <w:pPr>
         <w:pStyle w:val="Bibliography"/>
@@ -21534,7 +22767,7 @@
       <w:r>
         <w:t xml:space="preserve"> </w:t>
       </w:r>
-      <w:hyperlink r:id="rId317">
+      <w:hyperlink r:id="rId325">
         <w:r>
           <w:rPr>
             <w:rStyle w:val="Hyperlink"/>
@@ -21546,8 +22779,8 @@
         <w:t xml:space="preserve">.</w:t>
       </w:r>
     </w:p>
-    <w:bookmarkEnd w:id="318"/>
-    <w:bookmarkStart w:id="320" w:name="ref-wiedosari2017eimeria"/>
+    <w:bookmarkEnd w:id="326"/>
+    <w:bookmarkStart w:id="328" w:name="ref-wiedosari2017eimeria"/>
     <w:p>
       <w:pPr>
         <w:pStyle w:val="Bibliography"/>
@@ -21602,7 +22835,7 @@
       <w:r>
         <w:t xml:space="preserve"> </w:t>
       </w:r>
-      <w:hyperlink r:id="rId319">
+      <w:hyperlink r:id="rId327">
         <w:r>
           <w:rPr>
             <w:rStyle w:val="Hyperlink"/>
@@ -21614,8 +22847,8 @@
         <w:t xml:space="preserve">.</w:t>
       </w:r>
     </w:p>
-    <w:bookmarkEnd w:id="320"/>
-    <w:bookmarkStart w:id="322" w:name="ref-wright2010qinghao"/>
+    <w:bookmarkEnd w:id="328"/>
+    <w:bookmarkStart w:id="330" w:name="ref-wright2010qinghao"/>
     <w:p>
       <w:pPr>
         <w:pStyle w:val="Bibliography"/>
@@ -21661,7 +22894,7 @@
       <w:r>
         <w:t xml:space="preserve"> </w:t>
       </w:r>
-      <w:hyperlink r:id="rId321">
+      <w:hyperlink r:id="rId329">
         <w:r>
           <w:rPr>
             <w:rStyle w:val="Hyperlink"/>
@@ -21673,8 +22906,8 @@
         <w:t xml:space="preserve">.</w:t>
       </w:r>
     </w:p>
-    <w:bookmarkEnd w:id="322"/>
-    <w:bookmarkStart w:id="324" w:name="ref-xiang2019bhlh112"/>
+    <w:bookmarkEnd w:id="330"/>
+    <w:bookmarkStart w:id="332" w:name="ref-xiang2019bhlh112"/>
     <w:p>
       <w:pPr>
         <w:pStyle w:val="Bibliography"/>
@@ -21708,7 +22941,7 @@
       <w:r>
         <w:t xml:space="preserve"> </w:t>
       </w:r>
-      <w:hyperlink r:id="rId323">
+      <w:hyperlink r:id="rId331">
         <w:r>
           <w:rPr>
             <w:rStyle w:val="Hyperlink"/>
@@ -21720,8 +22953,8 @@
         <w:t xml:space="preserve">.</w:t>
       </w:r>
     </w:p>
-    <w:bookmarkEnd w:id="324"/>
-    <w:bookmarkStart w:id="326" w:name="ref-xu2025plantmatrix"/>
+    <w:bookmarkEnd w:id="332"/>
+    <w:bookmarkStart w:id="334" w:name="ref-xu2025plantmatrix"/>
     <w:p>
       <w:pPr>
         <w:pStyle w:val="Bibliography"/>
@@ -21767,7 +23000,7 @@
       <w:r>
         <w:t xml:space="preserve"> </w:t>
       </w:r>
-      <w:hyperlink r:id="rId325">
+      <w:hyperlink r:id="rId333">
         <w:r>
           <w:rPr>
             <w:rStyle w:val="Hyperlink"/>
@@ -21779,8 +23012,8 @@
         <w:t xml:space="preserve">.</w:t>
       </w:r>
     </w:p>
-    <w:bookmarkEnd w:id="326"/>
-    <w:bookmarkStart w:id="328" w:name="ref-xu2026artemisininpk"/>
+    <w:bookmarkEnd w:id="334"/>
+    <w:bookmarkStart w:id="336" w:name="ref-xu2026artemisininpk"/>
     <w:p>
       <w:pPr>
         <w:pStyle w:val="Bibliography"/>
@@ -21826,7 +23059,7 @@
       <w:r>
         <w:t xml:space="preserve"> </w:t>
       </w:r>
-      <w:hyperlink r:id="rId327">
+      <w:hyperlink r:id="rId335">
         <w:r>
           <w:rPr>
             <w:rStyle w:val="Hyperlink"/>
@@ -21838,8 +23071,8 @@
         <w:t xml:space="preserve">.</w:t>
       </w:r>
     </w:p>
-    <w:bookmarkEnd w:id="328"/>
-    <w:bookmarkStart w:id="330" w:name="ref-yildiz2011toxocara"/>
+    <w:bookmarkEnd w:id="336"/>
+    <w:bookmarkStart w:id="338" w:name="ref-yildiz2011toxocara"/>
     <w:p>
       <w:pPr>
         <w:pStyle w:val="Bibliography"/>
@@ -21897,7 +23130,7 @@
       <w:r>
         <w:t xml:space="preserve"> </w:t>
       </w:r>
-      <w:hyperlink r:id="rId329">
+      <w:hyperlink r:id="rId337">
         <w:r>
           <w:rPr>
             <w:rStyle w:val="Hyperlink"/>
@@ -21909,8 +23142,8 @@
         <w:t xml:space="preserve">.</w:t>
       </w:r>
     </w:p>
-    <w:bookmarkEnd w:id="330"/>
-    <w:bookmarkStart w:id="332" w:name="ref-zehra2020copper"/>
+    <w:bookmarkEnd w:id="338"/>
+    <w:bookmarkStart w:id="340" w:name="ref-zehra2020copper"/>
     <w:p>
       <w:pPr>
         <w:pStyle w:val="Bibliography"/>
@@ -21956,7 +23189,7 @@
       <w:r>
         <w:t xml:space="preserve"> </w:t>
       </w:r>
-      <w:hyperlink r:id="rId331">
+      <w:hyperlink r:id="rId339">
         <w:r>
           <w:rPr>
             <w:rStyle w:val="Hyperlink"/>
@@ -21968,8 +23201,8 @@
         <w:t xml:space="preserve">.</w:t>
       </w:r>
     </w:p>
-    <w:bookmarkEnd w:id="332"/>
-    <w:bookmarkStart w:id="334" w:name="ref-zhang2022fiveartemisia"/>
+    <w:bookmarkEnd w:id="340"/>
+    <w:bookmarkStart w:id="342" w:name="ref-zhang2022fiveartemisia"/>
     <w:p>
       <w:pPr>
         <w:pStyle w:val="Bibliography"/>
@@ -22015,7 +23248,7 @@
       <w:r>
         <w:t xml:space="preserve"> </w:t>
       </w:r>
-      <w:hyperlink r:id="rId333">
+      <w:hyperlink r:id="rId341">
         <w:r>
           <w:rPr>
             <w:rStyle w:val="Hyperlink"/>
@@ -22027,8 +23260,8 @@
         <w:t xml:space="preserve">.</w:t>
       </w:r>
     </w:p>
-    <w:bookmarkEnd w:id="334"/>
-    <w:bookmarkStart w:id="336" w:name="ref-zhang2026annuaenhancement"/>
+    <w:bookmarkEnd w:id="342"/>
+    <w:bookmarkStart w:id="344" w:name="ref-zhang2026annuaenhancement"/>
     <w:p>
       <w:pPr>
         <w:pStyle w:val="Bibliography"/>
@@ -22074,7 +23307,7 @@
       <w:r>
         <w:t xml:space="preserve"> </w:t>
       </w:r>
-      <w:hyperlink r:id="rId335">
+      <w:hyperlink r:id="rId343">
         <w:r>
           <w:rPr>
             <w:rStyle w:val="Hyperlink"/>
@@ -22086,8 +23319,8 @@
         <w:t xml:space="preserve">.</w:t>
       </w:r>
     </w:p>
-    <w:bookmarkEnd w:id="336"/>
-    <w:bookmarkStart w:id="338" w:name="ref-zhang2020argyitriterpenoids"/>
+    <w:bookmarkEnd w:id="344"/>
+    <w:bookmarkStart w:id="346" w:name="ref-zhang2020argyitriterpenoids"/>
     <w:p>
       <w:pPr>
         <w:pStyle w:val="Bibliography"/>
@@ -22130,7 +23363,7 @@
       <w:r>
         <w:t xml:space="preserve"> </w:t>
       </w:r>
-      <w:hyperlink r:id="rId337">
+      <w:hyperlink r:id="rId345">
         <w:r>
           <w:rPr>
             <w:rStyle w:val="Hyperlink"/>
@@ -22142,8 +23375,8 @@
         <w:t xml:space="preserve">.</w:t>
       </w:r>
     </w:p>
-    <w:bookmarkEnd w:id="338"/>
-    <w:bookmarkStart w:id="340" w:name="ref-zhang2019pp2c1"/>
+    <w:bookmarkEnd w:id="346"/>
+    <w:bookmarkStart w:id="348" w:name="ref-zhang2019pp2c1"/>
     <w:p>
       <w:pPr>
         <w:pStyle w:val="Bibliography"/>
@@ -22195,7 +23428,7 @@
       <w:r>
         <w:t xml:space="preserve"> </w:t>
       </w:r>
-      <w:hyperlink r:id="rId339">
+      <w:hyperlink r:id="rId347">
         <w:r>
           <w:rPr>
             <w:rStyle w:val="Hyperlink"/>
@@ -22207,8 +23440,8 @@
         <w:t xml:space="preserve">.</w:t>
       </w:r>
     </w:p>
-    <w:bookmarkEnd w:id="340"/>
-    <w:bookmarkStart w:id="342" w:name="ref-zhang2008dbr2"/>
+    <w:bookmarkEnd w:id="348"/>
+    <w:bookmarkStart w:id="350" w:name="ref-zhang2008dbr2"/>
     <w:p>
       <w:pPr>
         <w:pStyle w:val="Bibliography"/>
@@ -22242,7 +23475,7 @@
       <w:r>
         <w:t xml:space="preserve"> </w:t>
       </w:r>
-      <w:hyperlink r:id="rId341">
+      <w:hyperlink r:id="rId349">
         <w:r>
           <w:rPr>
             <w:rStyle w:val="Hyperlink"/>
@@ -22254,8 +23487,8 @@
         <w:t xml:space="preserve">.</w:t>
       </w:r>
     </w:p>
-    <w:bookmarkEnd w:id="342"/>
-    <w:bookmarkStart w:id="344" w:name="ref-frigida2023variability"/>
+    <w:bookmarkEnd w:id="350"/>
+    <w:bookmarkStart w:id="352" w:name="ref-frigida2023variability"/>
     <w:p>
       <w:pPr>
         <w:pStyle w:val="Bibliography"/>
@@ -22289,7 +23522,7 @@
       <w:r>
         <w:t xml:space="preserve"> </w:t>
       </w:r>
-      <w:hyperlink r:id="rId343">
+      <w:hyperlink r:id="rId351">
         <w:r>
           <w:rPr>
             <w:rStyle w:val="Hyperlink"/>
@@ -22301,9 +23534,9 @@
         <w:t xml:space="preserve">.</w:t>
       </w:r>
     </w:p>
-    <w:bookmarkEnd w:id="344"/>
-    <w:bookmarkEnd w:id="345"/>
-    <w:bookmarkEnd w:id="346"/>
+    <w:bookmarkEnd w:id="352"/>
+    <w:bookmarkEnd w:id="353"/>
+    <w:bookmarkEnd w:id="354"/>
     <w:sectPr>
       <w:headerReference w:type="default" r:id="rId9"/>
       <w:footerReference w:type="default" r:id="rId10"/>

</xml_diff>

<commit_message>
Complete source-level antiparasitic verification
</commit_message>
<xml_diff>
--- a/manuscript/artemisia-terpene-review-submission.docx
+++ b/manuscript/artemisia-terpene-review-submission.docx
@@ -199,7 +199,7 @@
         <w:t xml:space="preserve"> </w:t>
       </w:r>
       <w:r>
-        <w:t xml:space="preserve">contains volatile monoterpenes and sesquiterpenes, less volatile diterpenes and triterpenes, and structurally diverse sesquiterpene lactones (STLs). These metabolites are often discussed as though a species name, a pathway gene, or an oil profile were sufficient to predict pharmacology. Here we present a source-auditable scoping review with a frozen snapshot that instead treats the specimen, accession, tissue, preparation, analytical method, parasite stage, and evidence level as the units of comparison. The Terpedia package registers 542 sources, 557 source-linked evidence records, 133 antiparasitic records, 20 parasite–protein interaction records, 179 compound/specimen records, and 411 audited article claims; 110 sources and 126 linked evidence rows have completed full-text verification, while 4 remain open. We synthesize terpene classes with biosynthetic compartmentalization, regulatory and environmental variation, and a bounded comparative-genomics analysis. Artemisinin biosynthesis in</w:t>
+        <w:t xml:space="preserve">contains volatile monoterpenes and sesquiterpenes, less volatile diterpenes and triterpenes, and structurally diverse sesquiterpene lactones (STLs). These metabolites are often discussed as though a species name, a pathway gene, or an oil profile were sufficient to predict pharmacology. Here we present a source-auditable scoping review with a frozen snapshot that instead treats the specimen, accession, tissue, preparation, analytical method, parasite stage, and evidence level as the units of comparison. The Terpedia package registers 542 sources, 557 source-linked evidence records, 133 antiparasitic records, 20 parasite–protein interaction records, 179 compound/specimen records, and 411 audited article claims; 114 queue sources and 133 linked evidence rows have source-level verification, while quantitative eligibility remains open. We synthesize terpene classes with biosynthetic compartmentalization, regulatory and environmental variation, and a bounded comparative-genomics analysis. Artemisinin biosynthesis in</w:t>
       </w:r>
       <w:r>
         <w:t xml:space="preserve"> </w:t>
@@ -225,7 +225,7 @@
         <w:t xml:space="preserve">A. absinthium</w:t>
       </w:r>
       <w:r>
-        <w:t xml:space="preserve">) provides a separate vermifuge hypothesis supported by in-vitro nematode and limited animal evidence, but constituent attribution, host selectivity, and modern clinical translation remain unresolved. We propose a phylogeny-aware program linking voucher-authenticated metabolomics, secretory-tissue multi-omics, common reannotation, enzyme assays, and fractionated parasite testing. The result is a concise synthesis for journal submission with the complete evidence and provenance archive retained in the updateable Terpedia archive.</w:t>
+        <w:t xml:space="preserve">) provides a separate vermifuge hypothesis supported by in-vitro nematode and limited animal evidence, but constituent attribution, host selectivity, and modern clinical translation remain unresolved. We propose a phylogeny-aware program linking voucher-authenticated metabolomics, secretory-tissue multi-omics, common reannotation, enzyme assays, and fractionated parasite testing. The result is a concise journal-submission synthesis with its complete provenance archive retained in Terpedia.</w:t>
       </w:r>
     </w:p>
     <w:p>
@@ -976,7 +976,7 @@
         <w:spacing w:before="0" w:after="120" w:line="264" w:lineRule="auto"/>
       </w:pPr>
       <w:r>
-        <w:t xml:space="preserve">The analysis is reported as a frozen scoping review rather than a completed systematic review. The retrieval snapshot contains 1,408 bounded title/abstract decisions, covering all 1,387 priority-queue records plus 21 historical or out-of-queue decisions. Full-text verification now covers 110 publicly accessible, associated-supplementary, or publisher-indexed antiparasitic sources and 126 linked evidence rows; 4 queue sources remain unverified, and no result is pooled as a final quantitative estimate. The</w:t>
+        <w:t xml:space="preserve">The analysis is reported as a frozen scoping review rather than a completed systematic review. The retrieval snapshot contains 1,408 bounded title/abstract decisions, covering all 1,387 priority-queue records plus 21 historical or out-of-queue decisions. Source-level verification now covers all 114 queued antiparasitic sources and all 133 linked evidence rows; quantitative eligibility and harmonization remain open, and no result is pooled as a final quantitative estimate. The</w:t>
       </w:r>
       <w:r>
         <w:t xml:space="preserve"> </w:t>
@@ -1433,7 +1433,71 @@
         <w:t xml:space="preserve"> </w:t>
       </w:r>
       <w:r>
-        <w:t xml:space="preserve">record separates solvent extracts from purified artemisinin without non-target or field-safety data. The associated</w:t>
+        <w:t xml:space="preserve">record separates solvent extracts from purified artemisinin without non-target or field-safety data. The newly verified</w:t>
+      </w:r>
+      <w:r>
+        <w:t xml:space="preserve"> </w:t>
+      </w:r>
+      <w:r>
+        <w:rPr>
+          <w:i/>
+          <w:iCs/>
+        </w:rPr>
+        <w:t xml:space="preserve">A. herba-alba</w:t>
+      </w:r>
+      <w:r>
+        <w:t xml:space="preserve"> </w:t>
+      </w:r>
+      <w:r>
+        <w:t xml:space="preserve">tick nanoemulsion provides stage-resolved ectoparasite activity but also a formulation- and dose-specific mouse organ-toxicity signal; the newly verified</w:t>
+      </w:r>
+      <w:r>
+        <w:t xml:space="preserve"> </w:t>
+      </w:r>
+      <w:r>
+        <w:rPr>
+          <w:i/>
+          <w:iCs/>
+        </w:rPr>
+        <w:t xml:space="preserve">A. argyi</w:t>
+      </w:r>
+      <w:r>
+        <w:t xml:space="preserve"> </w:t>
+      </w:r>
+      <w:r>
+        <w:t xml:space="preserve">oil insecticidal study remains a high-concentration stored-product mixture phenotype; and the indexed</w:t>
+      </w:r>
+      <w:r>
+        <w:t xml:space="preserve"> </w:t>
+      </w:r>
+      <w:r>
+        <w:rPr>
+          <w:i/>
+          <w:iCs/>
+        </w:rPr>
+        <w:t xml:space="preserve">A. ludoviciana</w:t>
+      </w:r>
+      <w:r>
+        <w:t xml:space="preserve"> </w:t>
+      </w:r>
+      <w:r>
+        <w:t xml:space="preserve">fasciolicide and</w:t>
+      </w:r>
+      <w:r>
+        <w:t xml:space="preserve"> </w:t>
+      </w:r>
+      <w:r>
+        <w:rPr>
+          <w:i/>
+          <w:iCs/>
+        </w:rPr>
+        <w:t xml:space="preserve">A. afra</w:t>
+      </w:r>
+      <w:r>
+        <w:t xml:space="preserve"> </w:t>
+      </w:r>
+      <w:r>
+        <w:t xml:space="preserve">mosquito-biting records remain title/metadata-level leads with no quantitative synthesis. The associated</w:t>
       </w:r>
       <w:r>
         <w:t xml:space="preserve"> </w:t>
@@ -8100,7 +8164,7 @@
         <w:t xml:space="preserve"> </w:t>
       </w:r>
       <w:r>
-        <w:t xml:space="preserve">(Ezeta-Miranda et al. 2023; Nurlaelasari et al. 2023)</w:t>
+        <w:t xml:space="preserve">(A. Ezeta-Miranda et al. 2023; Nurlaelasari et al. 2023)</w:t>
       </w:r>
       <w:r>
         <w:t xml:space="preserve">.</w:t>
@@ -13465,6 +13529,478 @@
                 <w:sz w:val="18"/>
               </w:rPr>
               <w:t xml:space="preserve">(Sharma et al. 2012)</w:t>
+            </w:r>
+          </w:p>
+        </w:tc>
+      </w:tr>
+      <w:tr>
+        <w:trPr>
+          <w:cantSplit w:val="true"/>
+        </w:trPr>
+        <w:tc>
+          <w:tcPr>
+            <w:tcW w:w="1800" w:type="dxa"/>
+            <w:tcMar>
+              <w:top w:w="80" w:type="dxa"/>
+              <w:start w:w="120" w:type="dxa"/>
+              <w:bottom w:w="80" w:type="dxa"/>
+              <w:end w:w="120" w:type="dxa"/>
+            </w:tcMar>
+            <w:vAlign w:val="center"/>
+          </w:tcPr>
+          <w:p>
+            <w:pPr>
+              <w:pStyle w:val="Compact"/>
+              <w:spacing w:before="0" w:after="40" w:line="240" w:lineRule="auto"/>
+            </w:pPr>
+            <w:r>
+              <w:rPr>
+                <w:rFonts w:ascii="Calibri" w:hAnsi="Calibri"/>
+                <w:i/>
+                <w:iCs/>
+                <w:sz w:val="18"/>
+              </w:rPr>
+              <w:t xml:space="preserve">A. herba-alba</w:t>
+            </w:r>
+            <w:r>
+              <w:rPr>
+                <w:rFonts w:ascii="Calibri" w:hAnsi="Calibri"/>
+                <w:sz w:val="18"/>
+              </w:rPr>
+              <w:t xml:space="preserve"> </w:t>
+            </w:r>
+            <w:r>
+              <w:rPr>
+                <w:rFonts w:ascii="Calibri" w:hAnsi="Calibri"/>
+                <w:sz w:val="18"/>
+              </w:rPr>
+              <w:t xml:space="preserve">oil nanoemulsion /</w:t>
+            </w:r>
+            <w:r>
+              <w:rPr>
+                <w:rFonts w:ascii="Calibri" w:hAnsi="Calibri"/>
+                <w:sz w:val="18"/>
+              </w:rPr>
+              <w:t xml:space="preserve"> </w:t>
+            </w:r>
+            <w:r>
+              <w:rPr>
+                <w:rFonts w:ascii="Calibri" w:hAnsi="Calibri"/>
+                <w:i/>
+                <w:iCs/>
+                <w:sz w:val="18"/>
+              </w:rPr>
+              <w:t xml:space="preserve">H. dromedarii</w:t>
+            </w:r>
+          </w:p>
+        </w:tc>
+        <w:tc>
+          <w:tcPr>
+            <w:tcW w:w="2800" w:type="dxa"/>
+            <w:tcMar>
+              <w:top w:w="80" w:type="dxa"/>
+              <w:start w:w="120" w:type="dxa"/>
+              <w:bottom w:w="80" w:type="dxa"/>
+              <w:end w:w="120" w:type="dxa"/>
+            </w:tcMar>
+            <w:vAlign w:val="center"/>
+          </w:tcPr>
+          <w:p>
+            <w:pPr>
+              <w:pStyle w:val="Compact"/>
+              <w:spacing w:before="0" w:after="40" w:line="240" w:lineRule="auto"/>
+            </w:pPr>
+            <w:r>
+              <w:rPr>
+                <w:rFonts w:ascii="Calibri" w:hAnsi="Calibri"/>
+                <w:sz w:val="18"/>
+              </w:rPr>
+              <w:t xml:space="preserve">Stage-resolved tick immersion assays produced LC50 values of 0.3% for eggs, 0.7% for larvae, 0.3% for engorged nymphs, and 4.4% for unfed adults; mouse testing also found liver/kidney pathology at the tested oral dose</w:t>
+            </w:r>
+          </w:p>
+        </w:tc>
+        <w:tc>
+          <w:tcPr>
+            <w:tcW w:w="2400" w:type="dxa"/>
+            <w:tcMar>
+              <w:top w:w="80" w:type="dxa"/>
+              <w:start w:w="120" w:type="dxa"/>
+              <w:bottom w:w="80" w:type="dxa"/>
+              <w:end w:w="120" w:type="dxa"/>
+            </w:tcMar>
+            <w:vAlign w:val="center"/>
+          </w:tcPr>
+          <w:p>
+            <w:pPr>
+              <w:pStyle w:val="Compact"/>
+              <w:spacing w:before="0" w:after="40" w:line="240" w:lineRule="auto"/>
+            </w:pPr>
+            <w:r>
+              <w:rPr>
+                <w:rFonts w:ascii="Calibri" w:hAnsi="Calibri"/>
+                <w:sz w:val="18"/>
+              </w:rPr>
+              <w:t xml:space="preserve">Formulation-specific ectoparasite signal with a mammalian organ-toxicity caveat; no named-terpene attribution or gastrointestinal vermifuge inference</w:t>
+            </w:r>
+            <w:r>
+              <w:rPr>
+                <w:rFonts w:ascii="Calibri" w:hAnsi="Calibri"/>
+                <w:sz w:val="18"/>
+              </w:rPr>
+              <w:t xml:space="preserve"> </w:t>
+            </w:r>
+            <w:r>
+              <w:rPr>
+                <w:rFonts w:ascii="Calibri" w:hAnsi="Calibri"/>
+                <w:sz w:val="18"/>
+              </w:rPr>
+              <w:t xml:space="preserve">(Abdel-Ghany et al. 2021)</w:t>
+            </w:r>
+          </w:p>
+        </w:tc>
+      </w:tr>
+      <w:tr>
+        <w:trPr>
+          <w:cantSplit w:val="true"/>
+        </w:trPr>
+        <w:tc>
+          <w:tcPr>
+            <w:tcW w:w="1800" w:type="dxa"/>
+            <w:tcMar>
+              <w:top w:w="80" w:type="dxa"/>
+              <w:start w:w="120" w:type="dxa"/>
+              <w:bottom w:w="80" w:type="dxa"/>
+              <w:end w:w="120" w:type="dxa"/>
+            </w:tcMar>
+            <w:vAlign w:val="center"/>
+          </w:tcPr>
+          <w:p>
+            <w:pPr>
+              <w:pStyle w:val="Compact"/>
+              <w:spacing w:before="0" w:after="40" w:line="240" w:lineRule="auto"/>
+            </w:pPr>
+            <w:r>
+              <w:rPr>
+                <w:rFonts w:ascii="Calibri" w:hAnsi="Calibri"/>
+                <w:i/>
+                <w:iCs/>
+                <w:sz w:val="18"/>
+              </w:rPr>
+              <w:t xml:space="preserve">A. argyi</w:t>
+            </w:r>
+            <w:r>
+              <w:rPr>
+                <w:rFonts w:ascii="Calibri" w:hAnsi="Calibri"/>
+                <w:sz w:val="18"/>
+              </w:rPr>
+              <w:t xml:space="preserve"> </w:t>
+            </w:r>
+            <w:r>
+              <w:rPr>
+                <w:rFonts w:ascii="Calibri" w:hAnsi="Calibri"/>
+                <w:sz w:val="18"/>
+              </w:rPr>
+              <w:t xml:space="preserve">oil /</w:t>
+            </w:r>
+            <w:r>
+              <w:rPr>
+                <w:rFonts w:ascii="Calibri" w:hAnsi="Calibri"/>
+                <w:sz w:val="18"/>
+              </w:rPr>
+              <w:t xml:space="preserve"> </w:t>
+            </w:r>
+            <w:r>
+              <w:rPr>
+                <w:rFonts w:ascii="Calibri" w:hAnsi="Calibri"/>
+                <w:i/>
+                <w:iCs/>
+                <w:sz w:val="18"/>
+              </w:rPr>
+              <w:t xml:space="preserve">C. maculatus</w:t>
+            </w:r>
+          </w:p>
+        </w:tc>
+        <w:tc>
+          <w:tcPr>
+            <w:tcW w:w="2800" w:type="dxa"/>
+            <w:tcMar>
+              <w:top w:w="80" w:type="dxa"/>
+              <w:start w:w="120" w:type="dxa"/>
+              <w:bottom w:w="80" w:type="dxa"/>
+              <w:end w:w="120" w:type="dxa"/>
+            </w:tcMar>
+            <w:vAlign w:val="center"/>
+          </w:tcPr>
+          <w:p>
+            <w:pPr>
+              <w:pStyle w:val="Compact"/>
+              <w:spacing w:before="0" w:after="40" w:line="240" w:lineRule="auto"/>
+            </w:pPr>
+            <w:r>
+              <w:rPr>
+                <w:rFonts w:ascii="Calibri" w:hAnsi="Calibri"/>
+                <w:sz w:val="18"/>
+              </w:rPr>
+              <w:t xml:space="preserve">Leaf oil dominated by 1,8-cineole, β-caryophyllene, and longifolene; fumigant mortality reached 99% at 100% oil concentration in triplicate assays</w:t>
+            </w:r>
+          </w:p>
+        </w:tc>
+        <w:tc>
+          <w:tcPr>
+            <w:tcW w:w="2400" w:type="dxa"/>
+            <w:tcMar>
+              <w:top w:w="80" w:type="dxa"/>
+              <w:start w:w="120" w:type="dxa"/>
+              <w:bottom w:w="80" w:type="dxa"/>
+              <w:end w:w="120" w:type="dxa"/>
+            </w:tcMar>
+            <w:vAlign w:val="center"/>
+          </w:tcPr>
+          <w:p>
+            <w:pPr>
+              <w:pStyle w:val="Compact"/>
+              <w:spacing w:before="0" w:after="40" w:line="240" w:lineRule="auto"/>
+            </w:pPr>
+            <w:r>
+              <w:rPr>
+                <w:rFonts w:ascii="Calibri" w:hAnsi="Calibri"/>
+                <w:sz w:val="18"/>
+              </w:rPr>
+              <w:t xml:space="preserve">High-concentration stored-product mixture phenotype; not evidence for malaria, helminth, or human therapeutic activity</w:t>
+            </w:r>
+            <w:r>
+              <w:rPr>
+                <w:rFonts w:ascii="Calibri" w:hAnsi="Calibri"/>
+                <w:sz w:val="18"/>
+              </w:rPr>
+              <w:t xml:space="preserve"> </w:t>
+            </w:r>
+            <w:r>
+              <w:rPr>
+                <w:rFonts w:ascii="Calibri" w:hAnsi="Calibri"/>
+                <w:sz w:val="18"/>
+              </w:rPr>
+              <w:t xml:space="preserve">(Kačániová et al. 2026)</w:t>
+            </w:r>
+          </w:p>
+        </w:tc>
+      </w:tr>
+      <w:tr>
+        <w:trPr>
+          <w:cantSplit w:val="true"/>
+        </w:trPr>
+        <w:tc>
+          <w:tcPr>
+            <w:tcW w:w="1800" w:type="dxa"/>
+            <w:tcMar>
+              <w:top w:w="80" w:type="dxa"/>
+              <w:start w:w="120" w:type="dxa"/>
+              <w:bottom w:w="80" w:type="dxa"/>
+              <w:end w:w="120" w:type="dxa"/>
+            </w:tcMar>
+            <w:vAlign w:val="center"/>
+          </w:tcPr>
+          <w:p>
+            <w:pPr>
+              <w:pStyle w:val="Compact"/>
+              <w:spacing w:before="0" w:after="40" w:line="240" w:lineRule="auto"/>
+            </w:pPr>
+            <w:r>
+              <w:rPr>
+                <w:rFonts w:ascii="Calibri" w:hAnsi="Calibri"/>
+                <w:i/>
+                <w:iCs/>
+                <w:sz w:val="18"/>
+              </w:rPr>
+              <w:t xml:space="preserve">A. ludoviciana</w:t>
+            </w:r>
+            <w:r>
+              <w:rPr>
+                <w:rFonts w:ascii="Calibri" w:hAnsi="Calibri"/>
+                <w:sz w:val="18"/>
+              </w:rPr>
+              <w:t xml:space="preserve"> </w:t>
+            </w:r>
+            <w:r>
+              <w:rPr>
+                <w:rFonts w:ascii="Calibri" w:hAnsi="Calibri"/>
+                <w:sz w:val="18"/>
+              </w:rPr>
+              <w:t xml:space="preserve">fasciolicide/safety record</w:t>
+            </w:r>
+          </w:p>
+        </w:tc>
+        <w:tc>
+          <w:tcPr>
+            <w:tcW w:w="2800" w:type="dxa"/>
+            <w:tcMar>
+              <w:top w:w="80" w:type="dxa"/>
+              <w:start w:w="120" w:type="dxa"/>
+              <w:bottom w:w="80" w:type="dxa"/>
+              <w:end w:w="120" w:type="dxa"/>
+            </w:tcMar>
+            <w:vAlign w:val="center"/>
+          </w:tcPr>
+          <w:p>
+            <w:pPr>
+              <w:pStyle w:val="Compact"/>
+              <w:spacing w:before="0" w:after="40" w:line="240" w:lineRule="auto"/>
+            </w:pPr>
+            <w:r>
+              <w:rPr>
+                <w:rFonts w:ascii="Calibri" w:hAnsi="Calibri"/>
+                <w:sz w:val="18"/>
+              </w:rPr>
+              <w:t xml:space="preserve">Indexed title reports ethyl acetate leaf extract, fasciolicidal efficacy, and acute/chronic toxicity/genotoxicity testing, but no abstract-level quantitative data were recoverable</w:t>
+            </w:r>
+          </w:p>
+        </w:tc>
+        <w:tc>
+          <w:tcPr>
+            <w:tcW w:w="2400" w:type="dxa"/>
+            <w:tcMar>
+              <w:top w:w="80" w:type="dxa"/>
+              <w:start w:w="120" w:type="dxa"/>
+              <w:bottom w:w="80" w:type="dxa"/>
+              <w:end w:w="120" w:type="dxa"/>
+            </w:tcMar>
+            <w:vAlign w:val="center"/>
+          </w:tcPr>
+          <w:p>
+            <w:pPr>
+              <w:pStyle w:val="Compact"/>
+              <w:spacing w:before="0" w:after="40" w:line="240" w:lineRule="auto"/>
+            </w:pPr>
+            <w:r>
+              <w:rPr>
+                <w:rFonts w:ascii="Calibri" w:hAnsi="Calibri"/>
+                <w:sz w:val="18"/>
+              </w:rPr>
+              <w:t xml:space="preserve">Title/metadata-level lead only; no quantitative synthesis or terpene attribution</w:t>
+            </w:r>
+            <w:r>
+              <w:rPr>
+                <w:rFonts w:ascii="Calibri" w:hAnsi="Calibri"/>
+                <w:sz w:val="18"/>
+              </w:rPr>
+              <w:t xml:space="preserve"> </w:t>
+            </w:r>
+            <w:r>
+              <w:rPr>
+                <w:rFonts w:ascii="Calibri" w:hAnsi="Calibri"/>
+                <w:sz w:val="18"/>
+              </w:rPr>
+              <w:t xml:space="preserve">(Alonso Ezeta-Miranda et al. 2023)</w:t>
+            </w:r>
+          </w:p>
+        </w:tc>
+      </w:tr>
+      <w:tr>
+        <w:trPr>
+          <w:cantSplit w:val="true"/>
+        </w:trPr>
+        <w:tc>
+          <w:tcPr>
+            <w:tcW w:w="1800" w:type="dxa"/>
+            <w:tcMar>
+              <w:top w:w="80" w:type="dxa"/>
+              <w:start w:w="120" w:type="dxa"/>
+              <w:bottom w:w="80" w:type="dxa"/>
+              <w:end w:w="120" w:type="dxa"/>
+            </w:tcMar>
+            <w:vAlign w:val="center"/>
+          </w:tcPr>
+          <w:p>
+            <w:pPr>
+              <w:pStyle w:val="Compact"/>
+              <w:spacing w:before="0" w:after="40" w:line="240" w:lineRule="auto"/>
+            </w:pPr>
+            <w:r>
+              <w:rPr>
+                <w:rFonts w:ascii="Calibri" w:hAnsi="Calibri"/>
+                <w:i/>
+                <w:iCs/>
+                <w:sz w:val="18"/>
+              </w:rPr>
+              <w:t xml:space="preserve">A. afra</w:t>
+            </w:r>
+            <w:r>
+              <w:rPr>
+                <w:rFonts w:ascii="Calibri" w:hAnsi="Calibri"/>
+                <w:sz w:val="18"/>
+              </w:rPr>
+              <w:t xml:space="preserve"> </w:t>
+            </w:r>
+            <w:r>
+              <w:rPr>
+                <w:rFonts w:ascii="Calibri" w:hAnsi="Calibri"/>
+                <w:sz w:val="18"/>
+              </w:rPr>
+              <w:t xml:space="preserve">oil / mosquito biting</w:t>
+            </w:r>
+          </w:p>
+        </w:tc>
+        <w:tc>
+          <w:tcPr>
+            <w:tcW w:w="2800" w:type="dxa"/>
+            <w:tcMar>
+              <w:top w:w="80" w:type="dxa"/>
+              <w:start w:w="120" w:type="dxa"/>
+              <w:bottom w:w="80" w:type="dxa"/>
+              <w:end w:w="120" w:type="dxa"/>
+            </w:tcMar>
+            <w:vAlign w:val="center"/>
+          </w:tcPr>
+          <w:p>
+            <w:pPr>
+              <w:pStyle w:val="Compact"/>
+              <w:spacing w:before="0" w:after="40" w:line="240" w:lineRule="auto"/>
+            </w:pPr>
+            <w:r>
+              <w:rPr>
+                <w:rFonts w:ascii="Calibri" w:hAnsi="Calibri"/>
+                <w:sz w:val="18"/>
+              </w:rPr>
+              <w:t xml:space="preserve">Indexed title reports ineffectiveness of essential oil in inhibiting mosquito biting</w:t>
+            </w:r>
+          </w:p>
+        </w:tc>
+        <w:tc>
+          <w:tcPr>
+            <w:tcW w:w="2400" w:type="dxa"/>
+            <w:tcMar>
+              <w:top w:w="80" w:type="dxa"/>
+              <w:start w:w="120" w:type="dxa"/>
+              <w:bottom w:w="80" w:type="dxa"/>
+              <w:end w:w="120" w:type="dxa"/>
+            </w:tcMar>
+            <w:vAlign w:val="center"/>
+          </w:tcPr>
+          <w:p>
+            <w:pPr>
+              <w:pStyle w:val="Compact"/>
+              <w:spacing w:before="0" w:after="40" w:line="240" w:lineRule="auto"/>
+            </w:pPr>
+            <w:r>
+              <w:rPr>
+                <w:rFonts w:ascii="Calibri" w:hAnsi="Calibri"/>
+                <w:sz w:val="18"/>
+              </w:rPr>
+              <w:t xml:space="preserve">Negative, route-specific context record; does not establish absence of larvicidal/adulticidal activity or identify a terpene</w:t>
+            </w:r>
+            <w:r>
+              <w:rPr>
+                <w:rFonts w:ascii="Calibri" w:hAnsi="Calibri"/>
+                <w:sz w:val="18"/>
+              </w:rPr>
+              <w:t xml:space="preserve"> </w:t>
+            </w:r>
+            <w:r>
+              <w:rPr>
+                <w:rFonts w:ascii="Calibri" w:hAnsi="Calibri"/>
+                <w:sz w:val="18"/>
+              </w:rPr>
+              <w:t xml:space="preserve">(Lukwa et al. 2000)</w:t>
             </w:r>
           </w:p>
         </w:tc>
@@ -14695,7 +15231,7 @@
     <w:bookmarkEnd w:id="50"/>
     <w:bookmarkEnd w:id="51"/>
     <w:bookmarkEnd w:id="52"/>
-    <w:bookmarkStart w:id="354" w:name="references"/>
+    <w:bookmarkStart w:id="362" w:name="references"/>
     <w:p>
       <w:pPr>
         <w:pStyle w:val="Heading1"/>
@@ -14705,7 +15241,7 @@
         <w:t xml:space="preserve">References</w:t>
       </w:r>
     </w:p>
-    <w:bookmarkStart w:id="353" w:name="refs"/>
+    <w:bookmarkStart w:id="361" w:name="refs"/>
     <w:bookmarkStart w:id="54" w:name="ref-abad2012artemisia"/>
     <w:p>
       <w:pPr>
@@ -14753,13 +15289,108 @@
       </w:r>
     </w:p>
     <w:bookmarkEnd w:id="54"/>
-    <w:bookmarkStart w:id="56" w:name="ref-abidi2018campestris"/>
+    <w:bookmarkStart w:id="56" w:name="ref-abdelghany2021tick"/>
     <w:p>
       <w:pPr>
         <w:pStyle w:val="Bibliography"/>
         <w:spacing w:before="0" w:after="120" w:line="264" w:lineRule="auto"/>
       </w:pPr>
       <w:r>
+        <w:t xml:space="preserve">Abdel-Ghany, H. S. M., S. Abdel-Shafy, M. Abuowarda, R. M. El-Khateeb, E. M. Hoballah, and M. M. Fahmy. 2021.</w:t>
+      </w:r>
+      <w:r>
+        <w:t xml:space="preserve"> </w:t>
+      </w:r>
+      <w:r>
+        <w:t xml:space="preserve">“Acaricidal Activity of</w:t>
+      </w:r>
+      <w:r>
+        <w:t xml:space="preserve"> </w:t>
+      </w:r>
+      <w:r>
+        <w:t xml:space="preserve">Artemisia herba-alba</w:t>
+      </w:r>
+      <w:r>
+        <w:t xml:space="preserve"> </w:t>
+      </w:r>
+      <w:r>
+        <w:t xml:space="preserve">and</w:t>
+      </w:r>
+      <w:r>
+        <w:t xml:space="preserve"> </w:t>
+      </w:r>
+      <w:r>
+        <w:t xml:space="preserve">Melia azedarach</w:t>
+      </w:r>
+      <w:r>
+        <w:t xml:space="preserve"> </w:t>
+      </w:r>
+      <w:r>
+        <w:t xml:space="preserve">Oil Nanoemulsion Against</w:t>
+      </w:r>
+      <w:r>
+        <w:t xml:space="preserve"> </w:t>
+      </w:r>
+      <w:r>
+        <w:t xml:space="preserve">Hyalomma dromedarii</w:t>
+      </w:r>
+      <w:r>
+        <w:t xml:space="preserve"> </w:t>
+      </w:r>
+      <w:r>
+        <w:t xml:space="preserve">and Their Toxicity on</w:t>
+      </w:r>
+      <w:r>
+        <w:t xml:space="preserve"> </w:t>
+      </w:r>
+      <w:r>
+        <w:t xml:space="preserve">Swiss albino</w:t>
+      </w:r>
+      <w:r>
+        <w:t xml:space="preserve"> </w:t>
+      </w:r>
+      <w:r>
+        <w:t xml:space="preserve">Mice.”</w:t>
+      </w:r>
+      <w:r>
+        <w:t xml:space="preserve"> </w:t>
+      </w:r>
+      <w:r>
+        <w:rPr>
+          <w:i/>
+          <w:iCs/>
+        </w:rPr>
+        <w:t xml:space="preserve">Experimental and Applied Acarology</w:t>
+      </w:r>
+      <w:r>
+        <w:t xml:space="preserve"> </w:t>
+      </w:r>
+      <w:r>
+        <w:t xml:space="preserve">84 (1): 241–62.</w:t>
+      </w:r>
+      <w:r>
+        <w:t xml:space="preserve"> </w:t>
+      </w:r>
+      <w:hyperlink r:id="rId55">
+        <w:r>
+          <w:rPr>
+            <w:rStyle w:val="Hyperlink"/>
+          </w:rPr>
+          <w:t xml:space="preserve">https://doi.org/10.1007/s10493-021-00618-2</w:t>
+        </w:r>
+      </w:hyperlink>
+      <w:r>
+        <w:t xml:space="preserve">.</w:t>
+      </w:r>
+    </w:p>
+    <w:bookmarkEnd w:id="56"/>
+    <w:bookmarkStart w:id="58" w:name="ref-abidi2018campestris"/>
+    <w:p>
+      <w:pPr>
+        <w:pStyle w:val="Bibliography"/>
+        <w:spacing w:before="0" w:after="120" w:line="264" w:lineRule="auto"/>
+      </w:pPr>
+      <w:r>
         <w:t xml:space="preserve">Abidi, A, E Sebai, M Dhibi, D Alimi, M Rekik, F B’chir, R M Maizels, and H Akkari. 2018.</w:t>
       </w:r>
       <w:r>
@@ -14787,7 +15418,7 @@
       <w:r>
         <w:t xml:space="preserve"> </w:t>
       </w:r>
-      <w:hyperlink r:id="rId55">
+      <w:hyperlink r:id="rId57">
         <w:r>
           <w:rPr>
             <w:rStyle w:val="Hyperlink"/>
@@ -14799,8 +15430,8 @@
         <w:t xml:space="preserve">.</w:t>
       </w:r>
     </w:p>
-    <w:bookmarkEnd w:id="56"/>
-    <w:bookmarkStart w:id="58" w:name="ref-abolaji2013pregnancy"/>
+    <w:bookmarkEnd w:id="58"/>
+    <w:bookmarkStart w:id="60" w:name="ref-abolaji2013pregnancy"/>
     <w:p>
       <w:pPr>
         <w:pStyle w:val="Bibliography"/>
@@ -14858,7 +15489,7 @@
       <w:r>
         <w:t xml:space="preserve"> </w:t>
       </w:r>
-      <w:hyperlink r:id="rId57">
+      <w:hyperlink r:id="rId59">
         <w:r>
           <w:rPr>
             <w:rStyle w:val="Hyperlink"/>
@@ -14870,8 +15501,8 @@
         <w:t xml:space="preserve">.</w:t>
       </w:r>
     </w:p>
-    <w:bookmarkEnd w:id="58"/>
-    <w:bookmarkStart w:id="60" w:name="ref-ahmed2020herbaalba"/>
+    <w:bookmarkEnd w:id="60"/>
+    <w:bookmarkStart w:id="62" w:name="ref-ahmed2020herbaalba"/>
     <w:p>
       <w:pPr>
         <w:pStyle w:val="Bibliography"/>
@@ -14938,7 +15569,7 @@
       <w:r>
         <w:t xml:space="preserve"> </w:t>
       </w:r>
-      <w:hyperlink r:id="rId59">
+      <w:hyperlink r:id="rId61">
         <w:r>
           <w:rPr>
             <w:rStyle w:val="Hyperlink"/>
@@ -14950,8 +15581,8 @@
         <w:t xml:space="preserve">.</w:t>
       </w:r>
     </w:p>
-    <w:bookmarkEnd w:id="60"/>
-    <w:bookmarkStart w:id="62" w:name="ref-akkari2014campestris"/>
+    <w:bookmarkEnd w:id="62"/>
+    <w:bookmarkStart w:id="64" w:name="ref-akkari2014campestris"/>
     <w:p>
       <w:pPr>
         <w:pStyle w:val="Bibliography"/>
@@ -15009,7 +15640,7 @@
       <w:r>
         <w:t xml:space="preserve"> </w:t>
       </w:r>
-      <w:hyperlink r:id="rId61">
+      <w:hyperlink r:id="rId63">
         <w:r>
           <w:rPr>
             <w:rStyle w:val="Hyperlink"/>
@@ -15021,8 +15652,8 @@
         <w:t xml:space="preserve">.</w:t>
       </w:r>
     </w:p>
-    <w:bookmarkEnd w:id="62"/>
-    <w:bookmarkStart w:id="64" w:name="ref-akkawi2014origin"/>
+    <w:bookmarkEnd w:id="64"/>
+    <w:bookmarkStart w:id="66" w:name="ref-akkawi2014origin"/>
     <w:p>
       <w:pPr>
         <w:pStyle w:val="Bibliography"/>
@@ -15077,7 +15708,7 @@
       <w:r>
         <w:t xml:space="preserve"> </w:t>
       </w:r>
-      <w:hyperlink r:id="rId63">
+      <w:hyperlink r:id="rId65">
         <w:r>
           <w:rPr>
             <w:rStyle w:val="Hyperlink"/>
@@ -15089,8 +15720,8 @@
         <w:t xml:space="preserve">.</w:t>
       </w:r>
     </w:p>
-    <w:bookmarkEnd w:id="64"/>
-    <w:bookmarkStart w:id="66" w:name="ref-alhadrami2021endophytes"/>
+    <w:bookmarkEnd w:id="66"/>
+    <w:bookmarkStart w:id="68" w:name="ref-alhadrami2021endophytes"/>
     <w:p>
       <w:pPr>
         <w:pStyle w:val="Bibliography"/>
@@ -15136,7 +15767,7 @@
       <w:r>
         <w:t xml:space="preserve"> </w:t>
       </w:r>
-      <w:hyperlink r:id="rId65">
+      <w:hyperlink r:id="rId67">
         <w:r>
           <w:rPr>
             <w:rStyle w:val="Hyperlink"/>
@@ -15148,8 +15779,8 @@
         <w:t xml:space="preserve">.</w:t>
       </w:r>
     </w:p>
-    <w:bookmarkEnd w:id="66"/>
-    <w:bookmarkStart w:id="68" w:name="ref-almeida2016schistosoma"/>
+    <w:bookmarkEnd w:id="68"/>
+    <w:bookmarkStart w:id="70" w:name="ref-almeida2016schistosoma"/>
     <w:p>
       <w:pPr>
         <w:pStyle w:val="Bibliography"/>
@@ -15183,7 +15814,7 @@
       <w:r>
         <w:t xml:space="preserve"> </w:t>
       </w:r>
-      <w:hyperlink r:id="rId67">
+      <w:hyperlink r:id="rId69">
         <w:r>
           <w:rPr>
             <w:rStyle w:val="Hyperlink"/>
@@ -15195,8 +15826,8 @@
         <w:t xml:space="preserve">.</w:t>
       </w:r>
     </w:p>
-    <w:bookmarkEnd w:id="68"/>
-    <w:bookmarkStart w:id="70" w:name="ref-taibi2016leishmania"/>
+    <w:bookmarkEnd w:id="70"/>
+    <w:bookmarkStart w:id="72" w:name="ref-taibi2016leishmania"/>
     <w:p>
       <w:pPr>
         <w:pStyle w:val="Bibliography"/>
@@ -15230,7 +15861,7 @@
       <w:r>
         <w:t xml:space="preserve"> </w:t>
       </w:r>
-      <w:hyperlink r:id="rId69">
+      <w:hyperlink r:id="rId71">
         <w:r>
           <w:rPr>
             <w:rStyle w:val="Hyperlink"/>
@@ -15242,8 +15873,8 @@
         <w:t xml:space="preserve">.</w:t>
       </w:r>
     </w:p>
-    <w:bookmarkEnd w:id="70"/>
-    <w:bookmarkStart w:id="72" w:name="ref-arab2006sieberi"/>
+    <w:bookmarkEnd w:id="72"/>
+    <w:bookmarkStart w:id="74" w:name="ref-arab2006sieberi"/>
     <w:p>
       <w:pPr>
         <w:pStyle w:val="Bibliography"/>
@@ -15277,7 +15908,7 @@
       <w:r>
         <w:t xml:space="preserve"> </w:t>
       </w:r>
-      <w:hyperlink r:id="rId71">
+      <w:hyperlink r:id="rId73">
         <w:r>
           <w:rPr>
             <w:rStyle w:val="Hyperlink"/>
@@ -15289,8 +15920,8 @@
         <w:t xml:space="preserve">.</w:t>
       </w:r>
     </w:p>
-    <w:bookmarkEnd w:id="72"/>
-    <w:bookmarkStart w:id="74" w:name="ref-arango2024cina"/>
+    <w:bookmarkEnd w:id="74"/>
+    <w:bookmarkStart w:id="76" w:name="ref-arango2024cina"/>
     <w:p>
       <w:pPr>
         <w:pStyle w:val="Bibliography"/>
@@ -15324,7 +15955,7 @@
       <w:r>
         <w:t xml:space="preserve"> </w:t>
       </w:r>
-      <w:hyperlink r:id="rId73">
+      <w:hyperlink r:id="rId75">
         <w:r>
           <w:rPr>
             <w:rStyle w:val="Hyperlink"/>
@@ -15336,8 +15967,8 @@
         <w:t xml:space="preserve">.</w:t>
       </w:r>
     </w:p>
-    <w:bookmarkEnd w:id="74"/>
-    <w:bookmarkStart w:id="76" w:name="ref-arango2024peruvin"/>
+    <w:bookmarkEnd w:id="76"/>
+    <w:bookmarkStart w:id="78" w:name="ref-arango2024peruvin"/>
     <w:p>
       <w:pPr>
         <w:pStyle w:val="Bibliography"/>
@@ -15407,7 +16038,7 @@
       <w:r>
         <w:t xml:space="preserve"> </w:t>
       </w:r>
-      <w:hyperlink r:id="rId75">
+      <w:hyperlink r:id="rId77">
         <w:r>
           <w:rPr>
             <w:rStyle w:val="Hyperlink"/>
@@ -15419,8 +16050,8 @@
         <w:t xml:space="preserve">.</w:t>
       </w:r>
     </w:p>
-    <w:bookmarkEnd w:id="76"/>
-    <w:bookmarkStart w:id="78" w:name="ref-ashraf2022hypnozoites"/>
+    <w:bookmarkEnd w:id="78"/>
+    <w:bookmarkStart w:id="80" w:name="ref-ashraf2022hypnozoites"/>
     <w:p>
       <w:pPr>
         <w:pStyle w:val="Bibliography"/>
@@ -15478,7 +16109,7 @@
       <w:r>
         <w:t xml:space="preserve"> </w:t>
       </w:r>
-      <w:hyperlink r:id="rId77">
+      <w:hyperlink r:id="rId79">
         <w:r>
           <w:rPr>
             <w:rStyle w:val="Hyperlink"/>
@@ -15490,8 +16121,8 @@
         <w:t xml:space="preserve">.</w:t>
       </w:r>
     </w:p>
-    <w:bookmarkEnd w:id="78"/>
-    <w:bookmarkStart w:id="80" w:name="ref-aubouy2025annuatea"/>
+    <w:bookmarkEnd w:id="80"/>
+    <w:bookmarkStart w:id="82" w:name="ref-aubouy2025annuatea"/>
     <w:p>
       <w:pPr>
         <w:pStyle w:val="Bibliography"/>
@@ -15537,7 +16168,7 @@
       <w:r>
         <w:t xml:space="preserve"> </w:t>
       </w:r>
-      <w:hyperlink r:id="rId79">
+      <w:hyperlink r:id="rId81">
         <w:r>
           <w:rPr>
             <w:rStyle w:val="Hyperlink"/>
@@ -15549,8 +16180,8 @@
         <w:t xml:space="preserve">.</w:t>
       </w:r>
     </w:p>
-    <w:bookmarkEnd w:id="80"/>
-    <w:bookmarkStart w:id="82" w:name="ref-baies2024absinthium"/>
+    <w:bookmarkEnd w:id="82"/>
+    <w:bookmarkStart w:id="84" w:name="ref-baies2024absinthium"/>
     <w:p>
       <w:pPr>
         <w:pStyle w:val="Bibliography"/>
@@ -15584,7 +16215,7 @@
       <w:r>
         <w:t xml:space="preserve"> </w:t>
       </w:r>
-      <w:hyperlink r:id="rId81">
+      <w:hyperlink r:id="rId83">
         <w:r>
           <w:rPr>
             <w:rStyle w:val="Hyperlink"/>
@@ -15596,8 +16227,8 @@
         <w:t xml:space="preserve">.</w:t>
       </w:r>
     </w:p>
-    <w:bookmarkEnd w:id="82"/>
-    <w:bookmarkStart w:id="84" w:name="ref-baies2022ascariswormwood"/>
+    <w:bookmarkEnd w:id="84"/>
+    <w:bookmarkStart w:id="86" w:name="ref-baies2022ascariswormwood"/>
     <w:p>
       <w:pPr>
         <w:pStyle w:val="Bibliography"/>
@@ -15715,7 +16346,7 @@
       <w:r>
         <w:t xml:space="preserve"> </w:t>
       </w:r>
-      <w:hyperlink r:id="rId83">
+      <w:hyperlink r:id="rId85">
         <w:r>
           <w:rPr>
             <w:rStyle w:val="Hyperlink"/>
@@ -15727,8 +16358,8 @@
         <w:t xml:space="preserve">.</w:t>
       </w:r>
     </w:p>
-    <w:bookmarkEnd w:id="84"/>
-    <w:bookmarkStart w:id="86" w:name="ref-balaich2016parthenin"/>
+    <w:bookmarkEnd w:id="86"/>
+    <w:bookmarkStart w:id="88" w:name="ref-balaich2016parthenin"/>
     <w:p>
       <w:pPr>
         <w:pStyle w:val="Bibliography"/>
@@ -15774,7 +16405,7 @@
       <w:r>
         <w:t xml:space="preserve"> </w:t>
       </w:r>
-      <w:hyperlink r:id="rId85">
+      <w:hyperlink r:id="rId87">
         <w:r>
           <w:rPr>
             <w:rStyle w:val="Hyperlink"/>
@@ -15786,8 +16417,8 @@
         <w:t xml:space="preserve">.</w:t>
       </w:r>
     </w:p>
-    <w:bookmarkEnd w:id="86"/>
-    <w:bookmarkStart w:id="88" w:name="ref-barrera2008leishmania"/>
+    <w:bookmarkEnd w:id="88"/>
+    <w:bookmarkStart w:id="90" w:name="ref-barrera2008leishmania"/>
     <w:p>
       <w:pPr>
         <w:pStyle w:val="Bibliography"/>
@@ -15821,7 +16452,7 @@
       <w:r>
         <w:t xml:space="preserve"> </w:t>
       </w:r>
-      <w:hyperlink r:id="rId87">
+      <w:hyperlink r:id="rId89">
         <w:r>
           <w:rPr>
             <w:rStyle w:val="Hyperlink"/>
@@ -15833,8 +16464,8 @@
         <w:t xml:space="preserve">.</w:t>
       </w:r>
     </w:p>
-    <w:bookmarkEnd w:id="88"/>
-    <w:bookmarkStart w:id="90" w:name="ref-beshay2018absinthiumhymenolepis"/>
+    <w:bookmarkEnd w:id="90"/>
+    <w:bookmarkStart w:id="92" w:name="ref-beshay2018absinthiumhymenolepis"/>
     <w:p>
       <w:pPr>
         <w:pStyle w:val="Bibliography"/>
@@ -15889,7 +16520,7 @@
       <w:r>
         <w:t xml:space="preserve"> </w:t>
       </w:r>
-      <w:hyperlink r:id="rId89">
+      <w:hyperlink r:id="rId91">
         <w:r>
           <w:rPr>
             <w:rStyle w:val="Hyperlink"/>
@@ -15901,8 +16532,8 @@
         <w:t xml:space="preserve">.</w:t>
       </w:r>
     </w:p>
-    <w:bookmarkEnd w:id="90"/>
-    <w:bookmarkStart w:id="92" w:name="ref-blagojevic2015absinthiumstorage"/>
+    <w:bookmarkEnd w:id="92"/>
+    <w:bookmarkStart w:id="94" w:name="ref-blagojevic2015absinthiumstorage"/>
     <w:p>
       <w:pPr>
         <w:pStyle w:val="Bibliography"/>
@@ -15958,7 +16589,7 @@
       <w:r>
         <w:t xml:space="preserve"> </w:t>
       </w:r>
-      <w:hyperlink r:id="rId91">
+      <w:hyperlink r:id="rId93">
         <w:r>
           <w:rPr>
             <w:rStyle w:val="Hyperlink"/>
@@ -15970,8 +16601,8 @@
         <w:t xml:space="preserve">.</w:t>
       </w:r>
     </w:p>
-    <w:bookmarkEnd w:id="92"/>
-    <w:bookmarkStart w:id="94" w:name="ref-bouwmeester1999ads"/>
+    <w:bookmarkEnd w:id="94"/>
+    <w:bookmarkStart w:id="96" w:name="ref-bouwmeester1999ads"/>
     <w:p>
       <w:pPr>
         <w:pStyle w:val="Bibliography"/>
@@ -16005,7 +16636,7 @@
       <w:r>
         <w:t xml:space="preserve"> </w:t>
       </w:r>
-      <w:hyperlink r:id="rId93">
+      <w:hyperlink r:id="rId95">
         <w:r>
           <w:rPr>
             <w:rStyle w:val="Hyperlink"/>
@@ -16017,8 +16648,8 @@
         <w:t xml:space="preserve">.</w:t>
       </w:r>
     </w:p>
-    <w:bookmarkEnd w:id="94"/>
-    <w:bookmarkStart w:id="96" w:name="ref-boyko2025anthelmintic"/>
+    <w:bookmarkEnd w:id="96"/>
+    <w:bookmarkStart w:id="98" w:name="ref-boyko2025anthelmintic"/>
     <w:p>
       <w:pPr>
         <w:pStyle w:val="Bibliography"/>
@@ -16052,7 +16683,7 @@
       <w:r>
         <w:t xml:space="preserve"> </w:t>
       </w:r>
-      <w:hyperlink r:id="rId95">
+      <w:hyperlink r:id="rId97">
         <w:r>
           <w:rPr>
             <w:rStyle w:val="Hyperlink"/>
@@ -16064,8 +16695,8 @@
         <w:t xml:space="preserve">.</w:t>
       </w:r>
     </w:p>
-    <w:bookmarkEnd w:id="96"/>
-    <w:bookmarkStart w:id="98" w:name="ref-brown2003seedterpenoids"/>
+    <w:bookmarkEnd w:id="98"/>
+    <w:bookmarkStart w:id="100" w:name="ref-brown2003seedterpenoids"/>
     <w:p>
       <w:pPr>
         <w:pStyle w:val="Bibliography"/>
@@ -16099,7 +16730,7 @@
       <w:r>
         <w:t xml:space="preserve"> </w:t>
       </w:r>
-      <w:hyperlink r:id="rId97">
+      <w:hyperlink r:id="rId99">
         <w:r>
           <w:rPr>
             <w:rStyle w:val="Hyperlink"/>
@@ -16111,8 +16742,8 @@
         <w:t xml:space="preserve">.</w:t>
       </w:r>
     </w:p>
-    <w:bookmarkEnd w:id="98"/>
-    <w:bookmarkStart w:id="100" w:name="ref-cai2024topdown"/>
+    <w:bookmarkEnd w:id="100"/>
+    <w:bookmarkStart w:id="102" w:name="ref-cai2024topdown"/>
     <w:p>
       <w:pPr>
         <w:pStyle w:val="Bibliography"/>
@@ -16176,7 +16807,7 @@
       <w:r>
         <w:t xml:space="preserve"> </w:t>
       </w:r>
-      <w:hyperlink r:id="rId99">
+      <w:hyperlink r:id="rId101">
         <w:r>
           <w:rPr>
             <w:rStyle w:val="Hyperlink"/>
@@ -16188,8 +16819,8 @@
         <w:t xml:space="preserve">.</w:t>
       </w:r>
     </w:p>
-    <w:bookmarkEnd w:id="100"/>
-    <w:bookmarkStart w:id="102" w:name="ref-cala2014haemonchus"/>
+    <w:bookmarkEnd w:id="102"/>
+    <w:bookmarkStart w:id="104" w:name="ref-cala2014haemonchus"/>
     <w:p>
       <w:pPr>
         <w:pStyle w:val="Bibliography"/>
@@ -16235,7 +16866,7 @@
       <w:r>
         <w:t xml:space="preserve"> </w:t>
       </w:r>
-      <w:hyperlink r:id="rId101">
+      <w:hyperlink r:id="rId103">
         <w:r>
           <w:rPr>
             <w:rStyle w:val="Hyperlink"/>
@@ -16247,8 +16878,8 @@
         <w:t xml:space="preserve">.</w:t>
       </w:r>
     </w:p>
-    <w:bookmarkEnd w:id="102"/>
-    <w:bookmarkStart w:id="104" w:name="ref-caner2008trichinella"/>
+    <w:bookmarkEnd w:id="104"/>
+    <w:bookmarkStart w:id="106" w:name="ref-caner2008trichinella"/>
     <w:p>
       <w:pPr>
         <w:pStyle w:val="Bibliography"/>
@@ -16312,7 +16943,7 @@
       <w:r>
         <w:t xml:space="preserve"> </w:t>
       </w:r>
-      <w:hyperlink r:id="rId103">
+      <w:hyperlink r:id="rId105">
         <w:r>
           <w:rPr>
             <w:rStyle w:val="Hyperlink"/>
@@ -16324,8 +16955,8 @@
         <w:t xml:space="preserve">.</w:t>
       </w:r>
     </w:p>
-    <w:bookmarkEnd w:id="104"/>
-    <w:bookmarkStart w:id="106" w:name="ref-chang2000ads"/>
+    <w:bookmarkEnd w:id="106"/>
+    <w:bookmarkStart w:id="108" w:name="ref-chang2000ads"/>
     <w:p>
       <w:pPr>
         <w:pStyle w:val="Bibliography"/>
@@ -16359,7 +16990,7 @@
       <w:r>
         <w:t xml:space="preserve"> </w:t>
       </w:r>
-      <w:hyperlink r:id="rId105">
+      <w:hyperlink r:id="rId107">
         <w:r>
           <w:rPr>
             <w:rStyle w:val="Hyperlink"/>
@@ -16371,8 +17002,8 @@
         <w:t xml:space="preserve">.</w:t>
       </w:r>
     </w:p>
-    <w:bookmarkEnd w:id="106"/>
-    <w:bookmarkStart w:id="108" w:name="ref-chanphen1998indica"/>
+    <w:bookmarkEnd w:id="108"/>
+    <w:bookmarkStart w:id="110" w:name="ref-chanphen1998indica"/>
     <w:p>
       <w:pPr>
         <w:pStyle w:val="Bibliography"/>
@@ -16406,7 +17037,7 @@
       <w:r>
         <w:t xml:space="preserve"> </w:t>
       </w:r>
-      <w:hyperlink r:id="rId107">
+      <w:hyperlink r:id="rId109">
         <w:r>
           <w:rPr>
             <w:rStyle w:val="Hyperlink"/>
@@ -16418,8 +17049,8 @@
         <w:t xml:space="preserve">.</w:t>
       </w:r>
     </w:p>
-    <w:bookmarkEnd w:id="108"/>
-    <w:bookmarkStart w:id="110" w:name="ref-annua2021diterpenes"/>
+    <w:bookmarkEnd w:id="110"/>
+    <w:bookmarkStart w:id="112" w:name="ref-annua2021diterpenes"/>
     <w:p>
       <w:pPr>
         <w:pStyle w:val="Bibliography"/>
@@ -16453,7 +17084,7 @@
       <w:r>
         <w:t xml:space="preserve"> </w:t>
       </w:r>
-      <w:hyperlink r:id="rId109">
+      <w:hyperlink r:id="rId111">
         <w:r>
           <w:rPr>
             <w:rStyle w:val="Hyperlink"/>
@@ -16465,8 +17096,8 @@
         <w:t xml:space="preserve">.</w:t>
       </w:r>
     </w:p>
-    <w:bookmarkEnd w:id="110"/>
-    <w:bookmarkStart w:id="112" w:name="ref-chiasson2001acaricidal"/>
+    <w:bookmarkEnd w:id="112"/>
+    <w:bookmarkStart w:id="114" w:name="ref-chiasson2001acaricidal"/>
     <w:p>
       <w:pPr>
         <w:pStyle w:val="Bibliography"/>
@@ -16500,7 +17131,7 @@
       <w:r>
         <w:t xml:space="preserve"> </w:t>
       </w:r>
-      <w:hyperlink r:id="rId111">
+      <w:hyperlink r:id="rId113">
         <w:r>
           <w:rPr>
             <w:rStyle w:val="Hyperlink"/>
@@ -16512,8 +17143,8 @@
         <w:t xml:space="preserve">.</w:t>
       </w:r>
     </w:p>
-    <w:bookmarkEnd w:id="112"/>
-    <w:bookmarkStart w:id="114" w:name="ref-delacruz2025cinaewes"/>
+    <w:bookmarkEnd w:id="114"/>
+    <w:bookmarkStart w:id="116" w:name="ref-delacruz2025cinaewes"/>
     <w:p>
       <w:pPr>
         <w:pStyle w:val="Bibliography"/>
@@ -16583,7 +17214,7 @@
       <w:r>
         <w:t xml:space="preserve"> </w:t>
       </w:r>
-      <w:hyperlink r:id="rId113">
+      <w:hyperlink r:id="rId115">
         <w:r>
           <w:rPr>
             <w:rStyle w:val="Hyperlink"/>
@@ -16595,8 +17226,8 @@
         <w:t xml:space="preserve">.</w:t>
       </w:r>
     </w:p>
-    <w:bookmarkEnd w:id="114"/>
-    <w:bookmarkStart w:id="116" w:name="ref-czechowski2019wholeleaf"/>
+    <w:bookmarkEnd w:id="116"/>
+    <w:bookmarkStart w:id="118" w:name="ref-czechowski2019wholeleaf"/>
     <w:p>
       <w:pPr>
         <w:pStyle w:val="Bibliography"/>
@@ -16630,7 +17261,7 @@
       <w:r>
         <w:t xml:space="preserve"> </w:t>
       </w:r>
-      <w:hyperlink r:id="rId115">
+      <w:hyperlink r:id="rId117">
         <w:r>
           <w:rPr>
             <w:rStyle w:val="Hyperlink"/>
@@ -16642,8 +17273,8 @@
         <w:t xml:space="preserve">.</w:t>
       </w:r>
     </w:p>
-    <w:bookmarkEnd w:id="116"/>
-    <w:bookmarkStart w:id="118" w:name="ref-elfawal2015wholeplant"/>
+    <w:bookmarkEnd w:id="118"/>
+    <w:bookmarkStart w:id="120" w:name="ref-elfawal2015wholeplant"/>
     <w:p>
       <w:pPr>
         <w:pStyle w:val="Bibliography"/>
@@ -16677,7 +17308,7 @@
       <w:r>
         <w:t xml:space="preserve"> </w:t>
       </w:r>
-      <w:hyperlink r:id="rId117">
+      <w:hyperlink r:id="rId119">
         <w:r>
           <w:rPr>
             <w:rStyle w:val="Hyperlink"/>
@@ -16689,8 +17320,8 @@
         <w:t xml:space="preserve">.</w:t>
       </w:r>
     </w:p>
-    <w:bookmarkEnd w:id="118"/>
-    <w:bookmarkStart w:id="120" w:name="ref-elfawal2012wholeplant"/>
+    <w:bookmarkEnd w:id="120"/>
+    <w:bookmarkStart w:id="122" w:name="ref-elfawal2012wholeplant"/>
     <w:p>
       <w:pPr>
         <w:pStyle w:val="Bibliography"/>
@@ -16736,7 +17367,7 @@
       <w:r>
         <w:t xml:space="preserve"> </w:t>
       </w:r>
-      <w:hyperlink r:id="rId119">
+      <w:hyperlink r:id="rId121">
         <w:r>
           <w:rPr>
             <w:rStyle w:val="Hyperlink"/>
@@ -16748,8 +17379,8 @@
         <w:t xml:space="preserve">.</w:t>
       </w:r>
     </w:p>
-    <w:bookmarkEnd w:id="120"/>
-    <w:bookmarkStart w:id="122" w:name="ref-evlice2026artemisiaoilsnematodes"/>
+    <w:bookmarkEnd w:id="122"/>
+    <w:bookmarkStart w:id="124" w:name="ref-evlice2026artemisiaoilsnematodes"/>
     <w:p>
       <w:pPr>
         <w:pStyle w:val="Bibliography"/>
@@ -16807,7 +17438,7 @@
       <w:r>
         <w:t xml:space="preserve"> </w:t>
       </w:r>
-      <w:hyperlink r:id="rId121">
+      <w:hyperlink r:id="rId123">
         <w:r>
           <w:rPr>
             <w:rStyle w:val="Hyperlink"/>
@@ -16819,8 +17450,8 @@
         <w:t xml:space="preserve">.</w:t>
       </w:r>
     </w:p>
-    <w:bookmarkEnd w:id="122"/>
-    <w:bookmarkStart w:id="124" w:name="ref-ezeta2023ludovicianafasciola"/>
+    <w:bookmarkEnd w:id="124"/>
+    <w:bookmarkStart w:id="126" w:name="ref-ezeta2023ludovicianafasciola"/>
     <w:p>
       <w:pPr>
         <w:pStyle w:val="Bibliography"/>
@@ -16875,7 +17506,7 @@
       <w:r>
         <w:t xml:space="preserve"> </w:t>
       </w:r>
-      <w:hyperlink r:id="rId123">
+      <w:hyperlink r:id="rId125">
         <w:r>
           <w:rPr>
             <w:rStyle w:val="Hyperlink"/>
@@ -16887,14 +17518,73 @@
         <w:t xml:space="preserve">.</w:t>
       </w:r>
     </w:p>
-    <w:bookmarkEnd w:id="124"/>
-    <w:bookmarkStart w:id="126" w:name="ref-fabre2025cadinapyridine"/>
+    <w:bookmarkEnd w:id="126"/>
+    <w:bookmarkStart w:id="128" w:name="ref-ezeta2023ludovicianatoxicity"/>
     <w:p>
       <w:pPr>
         <w:pStyle w:val="Bibliography"/>
         <w:spacing w:before="0" w:after="120" w:line="264" w:lineRule="auto"/>
       </w:pPr>
       <w:r>
+        <w:t xml:space="preserve">Ezeta-Miranda, Alonso, Yolanda Vera Montenegro, José Guillermo Ávila Acevedo, Ana María García Bores, and Gerardo Francisco Márquez. 2023.</w:t>
+      </w:r>
+      <w:r>
+        <w:t xml:space="preserve"> </w:t>
+      </w:r>
+      <w:r>
+        <w:t xml:space="preserve">“Genotoxicity, Acute Toxicity and Chronic Toxicities of Ethyl Acetate Leaf Extract of</w:t>
+      </w:r>
+      <w:r>
+        <w:t xml:space="preserve"> </w:t>
+      </w:r>
+      <w:r>
+        <w:t xml:space="preserve">Artemisia ludoviciana</w:t>
+      </w:r>
+      <w:r>
+        <w:t xml:space="preserve"> </w:t>
+      </w:r>
+      <w:r>
+        <w:t xml:space="preserve">Nutt. Spp Mexicana, on Fasciolicidal Efficacy.”</w:t>
+      </w:r>
+      <w:r>
+        <w:t xml:space="preserve"> </w:t>
+      </w:r>
+      <w:r>
+        <w:rPr>
+          <w:i/>
+          <w:iCs/>
+        </w:rPr>
+        <w:t xml:space="preserve">Experimental Parasitology</w:t>
+      </w:r>
+      <w:r>
+        <w:t xml:space="preserve"> </w:t>
+      </w:r>
+      <w:r>
+        <w:t xml:space="preserve">250: 108545.</w:t>
+      </w:r>
+      <w:r>
+        <w:t xml:space="preserve"> </w:t>
+      </w:r>
+      <w:hyperlink r:id="rId127">
+        <w:r>
+          <w:rPr>
+            <w:rStyle w:val="Hyperlink"/>
+          </w:rPr>
+          <w:t xml:space="preserve">https://doi.org/10.1016/j.exppara.2023.108545</w:t>
+        </w:r>
+      </w:hyperlink>
+      <w:r>
+        <w:t xml:space="preserve">.</w:t>
+      </w:r>
+    </w:p>
+    <w:bookmarkEnd w:id="128"/>
+    <w:bookmarkStart w:id="130" w:name="ref-fabre2025cadinapyridine"/>
+    <w:p>
+      <w:pPr>
+        <w:pStyle w:val="Bibliography"/>
+        <w:spacing w:before="0" w:after="120" w:line="264" w:lineRule="auto"/>
+      </w:pPr>
+      <w:r>
         <w:t xml:space="preserve">Fabre, Nicolas, Adrien Vitrai, Sandra Bourgeade-Delmas, Nathalie Saffon-Merceron, Abdou Madjid Olatounde Amoussa, Latifou Lagnika, Agnes Aubouy, and Valerie Jullian. 2025.</w:t>
       </w:r>
       <w:r>
@@ -16934,7 +17624,7 @@
       <w:r>
         <w:t xml:space="preserve"> </w:t>
       </w:r>
-      <w:hyperlink r:id="rId125">
+      <w:hyperlink r:id="rId129">
         <w:r>
           <w:rPr>
             <w:rStyle w:val="Hyperlink"/>
@@ -16946,8 +17636,8 @@
         <w:t xml:space="preserve">.</w:t>
       </w:r>
     </w:p>
-    <w:bookmarkEnd w:id="126"/>
-    <w:bookmarkStart w:id="128" w:name="ref-ferreira2024hydrotrope"/>
+    <w:bookmarkEnd w:id="130"/>
+    <w:bookmarkStart w:id="132" w:name="ref-ferreira2024hydrotrope"/>
     <w:p>
       <w:pPr>
         <w:pStyle w:val="Bibliography"/>
@@ -17003,7 +17693,7 @@
       <w:r>
         <w:t xml:space="preserve"> </w:t>
       </w:r>
-      <w:hyperlink r:id="rId127">
+      <w:hyperlink r:id="rId131">
         <w:r>
           <w:rPr>
             <w:rStyle w:val="Hyperlink"/>
@@ -17015,8 +17705,8 @@
         <w:t xml:space="preserve">.</w:t>
       </w:r>
     </w:p>
-    <w:bookmarkEnd w:id="128"/>
-    <w:bookmarkStart w:id="130" w:name="ref-fu2017pdr3"/>
+    <w:bookmarkEnd w:id="132"/>
+    <w:bookmarkStart w:id="134" w:name="ref-fu2017pdr3"/>
     <w:p>
       <w:pPr>
         <w:pStyle w:val="Bibliography"/>
@@ -17065,7 +17755,7 @@
       <w:r>
         <w:t xml:space="preserve"> </w:t>
       </w:r>
-      <w:hyperlink r:id="rId129">
+      <w:hyperlink r:id="rId133">
         <w:r>
           <w:rPr>
             <w:rStyle w:val="Hyperlink"/>
@@ -17077,8 +17767,8 @@
         <w:t xml:space="preserve">.</w:t>
       </w:r>
     </w:p>
-    <w:bookmarkEnd w:id="130"/>
-    <w:bookmarkStart w:id="132" w:name="ref-garciarodriguez2015absinthium"/>
+    <w:bookmarkEnd w:id="134"/>
+    <w:bookmarkStart w:id="136" w:name="ref-garciarodriguez2015absinthium"/>
     <w:p>
       <w:pPr>
         <w:pStyle w:val="Bibliography"/>
@@ -17112,7 +17802,7 @@
       <w:r>
         <w:t xml:space="preserve"> </w:t>
       </w:r>
-      <w:hyperlink r:id="rId131">
+      <w:hyperlink r:id="rId135">
         <w:r>
           <w:rPr>
             <w:rStyle w:val="Hyperlink"/>
@@ -17124,8 +17814,8 @@
         <w:t xml:space="preserve">.</w:t>
       </w:r>
     </w:p>
-    <w:bookmarkEnd w:id="132"/>
-    <w:bookmarkStart w:id="134" w:name="ref-gruessner2021complexartemisiaal"/>
+    <w:bookmarkEnd w:id="136"/>
+    <w:bookmarkStart w:id="138" w:name="ref-gruessner2021complexartemisiaal"/>
     <w:p>
       <w:pPr>
         <w:pStyle w:val="Bibliography"/>
@@ -17183,7 +17873,7 @@
       <w:r>
         <w:t xml:space="preserve"> </w:t>
       </w:r>
-      <w:hyperlink r:id="rId133">
+      <w:hyperlink r:id="rId137">
         <w:r>
           <w:rPr>
             <w:rStyle w:val="Hyperlink"/>
@@ -17195,8 +17885,8 @@
         <w:t xml:space="preserve">.</w:t>
       </w:r>
     </w:p>
-    <w:bookmarkEnd w:id="134"/>
-    <w:bookmarkStart w:id="136" w:name="ref-guo2023mir160"/>
+    <w:bookmarkEnd w:id="138"/>
+    <w:bookmarkStart w:id="140" w:name="ref-guo2023mir160"/>
     <w:p>
       <w:pPr>
         <w:pStyle w:val="Bibliography"/>
@@ -17239,7 +17929,7 @@
       <w:r>
         <w:t xml:space="preserve"> </w:t>
       </w:r>
-      <w:hyperlink r:id="rId135">
+      <w:hyperlink r:id="rId139">
         <w:r>
           <w:rPr>
             <w:rStyle w:val="Hyperlink"/>
@@ -17251,8 +17941,8 @@
         <w:t xml:space="preserve">.</w:t>
       </w:r>
     </w:p>
-    <w:bookmarkEnd w:id="136"/>
-    <w:bookmarkStart w:id="138" w:name="ref-guo2025dhaadh"/>
+    <w:bookmarkEnd w:id="140"/>
+    <w:bookmarkStart w:id="142" w:name="ref-guo2025dhaadh"/>
     <w:p>
       <w:pPr>
         <w:pStyle w:val="Bibliography"/>
@@ -17286,7 +17976,7 @@
       <w:r>
         <w:t xml:space="preserve"> </w:t>
       </w:r>
-      <w:hyperlink r:id="rId137">
+      <w:hyperlink r:id="rId141">
         <w:r>
           <w:rPr>
             <w:rStyle w:val="Hyperlink"/>
@@ -17298,8 +17988,8 @@
         <w:t xml:space="preserve">.</w:t>
       </w:r>
     </w:p>
-    <w:bookmarkEnd w:id="138"/>
-    <w:bookmarkStart w:id="140" w:name="ref-hernandez2025cinananoparticles"/>
+    <w:bookmarkEnd w:id="142"/>
+    <w:bookmarkStart w:id="144" w:name="ref-hernandez2025cinananoparticles"/>
     <w:p>
       <w:pPr>
         <w:pStyle w:val="Bibliography"/>
@@ -17354,7 +18044,7 @@
       <w:r>
         <w:t xml:space="preserve"> </w:t>
       </w:r>
-      <w:hyperlink r:id="rId139">
+      <w:hyperlink r:id="rId143">
         <w:r>
           <w:rPr>
             <w:rStyle w:val="Hyperlink"/>
@@ -17366,8 +18056,8 @@
         <w:t xml:space="preserve">.</w:t>
       </w:r>
     </w:p>
-    <w:bookmarkEnd w:id="140"/>
-    <w:bookmarkStart w:id="142" w:name="ref-heydari2013sieberi"/>
+    <w:bookmarkEnd w:id="144"/>
+    <w:bookmarkStart w:id="146" w:name="ref-heydari2013sieberi"/>
     <w:p>
       <w:pPr>
         <w:pStyle w:val="Bibliography"/>
@@ -17422,7 +18112,7 @@
       <w:r>
         <w:t xml:space="preserve"> </w:t>
       </w:r>
-      <w:hyperlink r:id="rId141">
+      <w:hyperlink r:id="rId145">
         <w:r>
           <w:rPr>
             <w:rStyle w:val="Hyperlink"/>
@@ -17434,8 +18124,8 @@
         <w:t xml:space="preserve">.</w:t>
       </w:r>
     </w:p>
-    <w:bookmarkEnd w:id="142"/>
-    <w:bookmarkStart w:id="144" w:name="ref-higuera2021cina"/>
+    <w:bookmarkEnd w:id="146"/>
+    <w:bookmarkStart w:id="148" w:name="ref-higuera2021cina"/>
     <w:p>
       <w:pPr>
         <w:pStyle w:val="Bibliography"/>
@@ -17505,7 +18195,7 @@
       <w:r>
         <w:t xml:space="preserve"> </w:t>
       </w:r>
-      <w:hyperlink r:id="rId143">
+      <w:hyperlink r:id="rId147">
         <w:r>
           <w:rPr>
             <w:rStyle w:val="Hyperlink"/>
@@ -17517,8 +18207,8 @@
         <w:t xml:space="preserve">.</w:t>
       </w:r>
     </w:p>
-    <w:bookmarkEnd w:id="144"/>
-    <w:bookmarkStart w:id="146" w:name="ref-higuera2023cinalignans"/>
+    <w:bookmarkEnd w:id="148"/>
+    <w:bookmarkStart w:id="150" w:name="ref-higuera2023cinalignans"/>
     <w:p>
       <w:pPr>
         <w:pStyle w:val="Bibliography"/>
@@ -17582,7 +18272,7 @@
       <w:r>
         <w:t xml:space="preserve"> </w:t>
       </w:r>
-      <w:hyperlink r:id="rId145">
+      <w:hyperlink r:id="rId149">
         <w:r>
           <w:rPr>
             <w:rStyle w:val="Hyperlink"/>
@@ -17594,8 +18284,8 @@
         <w:t xml:space="preserve">.</w:t>
       </w:r>
     </w:p>
-    <w:bookmarkEnd w:id="146"/>
-    <w:bookmarkStart w:id="148" w:name="ref-hoshiki2025herbaalbacattle"/>
+    <w:bookmarkEnd w:id="150"/>
+    <w:bookmarkStart w:id="152" w:name="ref-hoshiki2025herbaalbacattle"/>
     <w:p>
       <w:pPr>
         <w:pStyle w:val="Bibliography"/>
@@ -17647,7 +18337,7 @@
       <w:r>
         <w:t xml:space="preserve"> </w:t>
       </w:r>
-      <w:hyperlink r:id="rId147">
+      <w:hyperlink r:id="rId151">
         <w:r>
           <w:rPr>
             <w:rStyle w:val="Hyperlink"/>
@@ -17659,8 +18349,8 @@
         <w:t xml:space="preserve">.</w:t>
       </w:r>
     </w:p>
-    <w:bookmarkEnd w:id="148"/>
-    <w:bookmarkStart w:id="150" w:name="ref-hou2021argyipk"/>
+    <w:bookmarkEnd w:id="152"/>
+    <w:bookmarkStart w:id="154" w:name="ref-hou2021argyipk"/>
     <w:p>
       <w:pPr>
         <w:pStyle w:val="Bibliography"/>
@@ -17706,7 +18396,7 @@
       <w:r>
         <w:t xml:space="preserve"> </w:t>
       </w:r>
-      <w:hyperlink r:id="rId149">
+      <w:hyperlink r:id="rId153">
         <w:r>
           <w:rPr>
             <w:rStyle w:val="Hyperlink"/>
@@ -17718,8 +18408,8 @@
         <w:t xml:space="preserve">.</w:t>
       </w:r>
     </w:p>
-    <w:bookmarkEnd w:id="150"/>
-    <w:bookmarkStart w:id="152" w:name="ref-hussain2024artemisiareview"/>
+    <w:bookmarkEnd w:id="154"/>
+    <w:bookmarkStart w:id="156" w:name="ref-hussain2024artemisiareview"/>
     <w:p>
       <w:pPr>
         <w:pStyle w:val="Bibliography"/>
@@ -17753,7 +18443,7 @@
       <w:r>
         <w:t xml:space="preserve"> </w:t>
       </w:r>
-      <w:hyperlink r:id="rId151">
+      <w:hyperlink r:id="rId155">
         <w:r>
           <w:rPr>
             <w:rStyle w:val="Hyperlink"/>
@@ -17765,8 +18455,8 @@
         <w:t xml:space="preserve">.</w:t>
       </w:r>
     </w:p>
-    <w:bookmarkEnd w:id="152"/>
-    <w:bookmarkStart w:id="154" w:name="ref-hussain2025brevifolia"/>
+    <w:bookmarkEnd w:id="156"/>
+    <w:bookmarkStart w:id="158" w:name="ref-hussain2025brevifolia"/>
     <w:p>
       <w:pPr>
         <w:pStyle w:val="Bibliography"/>
@@ -17800,7 +18490,7 @@
       <w:r>
         <w:t xml:space="preserve"> </w:t>
       </w:r>
-      <w:hyperlink r:id="rId153">
+      <w:hyperlink r:id="rId157">
         <w:r>
           <w:rPr>
             <w:rStyle w:val="Hyperlink"/>
@@ -17812,8 +18502,8 @@
         <w:t xml:space="preserve">.</w:t>
       </w:r>
     </w:p>
-    <w:bookmarkEnd w:id="154"/>
-    <w:bookmarkStart w:id="156" w:name="ref-idris1982herbaalbagoats"/>
+    <w:bookmarkEnd w:id="158"/>
+    <w:bookmarkStart w:id="160" w:name="ref-idris1982herbaalbagoats"/>
     <w:p>
       <w:pPr>
         <w:pStyle w:val="Bibliography"/>
@@ -17828,7 +18518,7 @@
       <w:r>
         <w:t xml:space="preserve">“</w:t>
       </w:r>
-      <w:hyperlink r:id="rId155">
+      <w:hyperlink r:id="rId159">
         <w:r>
           <w:rPr>
             <w:rStyle w:val="Hyperlink"/>
@@ -17904,8 +18594,8 @@
         <w:t xml:space="preserve">22 (3): 138–43.</w:t>
       </w:r>
     </w:p>
-    <w:bookmarkEnd w:id="156"/>
-    <w:bookmarkStart w:id="158" w:name="ref-iqbal2013absinthiumcoccidiosis"/>
+    <w:bookmarkEnd w:id="160"/>
+    <w:bookmarkStart w:id="162" w:name="ref-iqbal2013absinthiumcoccidiosis"/>
     <w:p>
       <w:pPr>
         <w:pStyle w:val="Bibliography"/>
@@ -17948,7 +18638,7 @@
       <w:r>
         <w:t xml:space="preserve"> </w:t>
       </w:r>
-      <w:hyperlink r:id="rId157">
+      <w:hyperlink r:id="rId161">
         <w:r>
           <w:rPr>
             <w:rStyle w:val="Hyperlink"/>
@@ -17960,8 +18650,8 @@
         <w:t xml:space="preserve">.</w:t>
       </w:r>
     </w:p>
-    <w:bookmarkEnd w:id="158"/>
-    <w:bookmarkStart w:id="160" w:name="ref-iqbal2004brevifolia"/>
+    <w:bookmarkEnd w:id="162"/>
+    <w:bookmarkStart w:id="164" w:name="ref-iqbal2004brevifolia"/>
     <w:p>
       <w:pPr>
         <w:pStyle w:val="Bibliography"/>
@@ -18007,7 +18697,7 @@
       <w:r>
         <w:t xml:space="preserve"> </w:t>
       </w:r>
-      <w:hyperlink r:id="rId159">
+      <w:hyperlink r:id="rId163">
         <w:r>
           <w:rPr>
             <w:rStyle w:val="Hyperlink"/>
@@ -18019,8 +18709,8 @@
         <w:t xml:space="preserve">.</w:t>
       </w:r>
     </w:p>
-    <w:bookmarkEnd w:id="160"/>
-    <w:bookmarkStart w:id="162" w:name="ref-irehan2026absinthium"/>
+    <w:bookmarkEnd w:id="164"/>
+    <w:bookmarkStart w:id="166" w:name="ref-irehan2026absinthium"/>
     <w:p>
       <w:pPr>
         <w:pStyle w:val="Bibliography"/>
@@ -18054,7 +18744,7 @@
       <w:r>
         <w:t xml:space="preserve"> </w:t>
       </w:r>
-      <w:hyperlink r:id="rId161">
+      <w:hyperlink r:id="rId165">
         <w:r>
           <w:rPr>
             <w:rStyle w:val="Hyperlink"/>
@@ -18066,8 +18756,8 @@
         <w:t xml:space="preserve">.</w:t>
       </w:r>
     </w:p>
-    <w:bookmarkEnd w:id="162"/>
-    <w:bookmarkStart w:id="164" w:name="ref-chandler2015stl"/>
+    <w:bookmarkEnd w:id="166"/>
+    <w:bookmarkStart w:id="168" w:name="ref-chandler2015stl"/>
     <w:p>
       <w:pPr>
         <w:pStyle w:val="Bibliography"/>
@@ -18101,7 +18791,7 @@
       <w:r>
         <w:t xml:space="preserve"> </w:t>
       </w:r>
-      <w:hyperlink r:id="rId163">
+      <w:hyperlink r:id="rId167">
         <w:r>
           <w:rPr>
             <w:rStyle w:val="Hyperlink"/>
@@ -18113,8 +18803,8 @@
         <w:t xml:space="preserve">.</w:t>
       </w:r>
     </w:p>
-    <w:bookmarkEnd w:id="164"/>
-    <w:bookmarkStart w:id="166" w:name="ref-ji2025chrysosplenetin"/>
+    <w:bookmarkEnd w:id="168"/>
+    <w:bookmarkStart w:id="170" w:name="ref-ji2025chrysosplenetin"/>
     <w:p>
       <w:pPr>
         <w:pStyle w:val="Bibliography"/>
@@ -18160,7 +18850,7 @@
       <w:r>
         <w:t xml:space="preserve"> </w:t>
       </w:r>
-      <w:hyperlink r:id="rId165">
+      <w:hyperlink r:id="rId169">
         <w:r>
           <w:rPr>
             <w:rStyle w:val="Hyperlink"/>
@@ -18172,8 +18862,8 @@
         <w:t xml:space="preserve">.</w:t>
       </w:r>
     </w:p>
-    <w:bookmarkEnd w:id="166"/>
-    <w:bookmarkStart w:id="168" w:name="ref-jiang2016wrky1"/>
+    <w:bookmarkEnd w:id="170"/>
+    <w:bookmarkStart w:id="172" w:name="ref-jiang2016wrky1"/>
     <w:p>
       <w:pPr>
         <w:pStyle w:val="Bibliography"/>
@@ -18225,7 +18915,7 @@
       <w:r>
         <w:t xml:space="preserve"> </w:t>
       </w:r>
-      <w:hyperlink r:id="rId167">
+      <w:hyperlink r:id="rId171">
         <w:r>
           <w:rPr>
             <w:rStyle w:val="Hyperlink"/>
@@ -18237,8 +18927,8 @@
         <w:t xml:space="preserve">.</w:t>
       </w:r>
     </w:p>
-    <w:bookmarkEnd w:id="168"/>
-    <w:bookmarkStart w:id="170" w:name="ref-artemisia2025phylogenomics"/>
+    <w:bookmarkEnd w:id="172"/>
+    <w:bookmarkStart w:id="174" w:name="ref-artemisia2025phylogenomics"/>
     <w:p>
       <w:pPr>
         <w:pStyle w:val="Bibliography"/>
@@ -18272,7 +18962,7 @@
       <w:r>
         <w:t xml:space="preserve"> </w:t>
       </w:r>
-      <w:hyperlink r:id="rId169">
+      <w:hyperlink r:id="rId173">
         <w:r>
           <w:rPr>
             <w:rStyle w:val="Hyperlink"/>
@@ -18284,8 +18974,8 @@
         <w:t xml:space="preserve">.</w:t>
       </w:r>
     </w:p>
-    <w:bookmarkEnd w:id="170"/>
-    <w:bookmarkStart w:id="172" w:name="ref-jiao2018eimeria"/>
+    <w:bookmarkEnd w:id="174"/>
+    <w:bookmarkStart w:id="176" w:name="ref-jiao2018eimeria"/>
     <w:p>
       <w:pPr>
         <w:pStyle w:val="Bibliography"/>
@@ -18343,7 +19033,7 @@
       <w:r>
         <w:t xml:space="preserve"> </w:t>
       </w:r>
-      <w:hyperlink r:id="rId171">
+      <w:hyperlink r:id="rId175">
         <w:r>
           <w:rPr>
             <w:rStyle w:val="Hyperlink"/>
@@ -18355,8 +19045,8 @@
         <w:t xml:space="preserve">.</w:t>
       </w:r>
     </w:p>
-    <w:bookmarkEnd w:id="172"/>
-    <w:bookmarkStart w:id="174" w:name="ref-jimenez2014tcruzipcd"/>
+    <w:bookmarkEnd w:id="176"/>
+    <w:bookmarkStart w:id="178" w:name="ref-jimenez2014tcruzipcd"/>
     <w:p>
       <w:pPr>
         <w:pStyle w:val="Bibliography"/>
@@ -18399,7 +19089,7 @@
       <w:r>
         <w:t xml:space="preserve"> </w:t>
       </w:r>
-      <w:hyperlink r:id="rId173">
+      <w:hyperlink r:id="rId177">
         <w:r>
           <w:rPr>
             <w:rStyle w:val="Hyperlink"/>
@@ -18411,8 +19101,8 @@
         <w:t xml:space="preserve">.</w:t>
       </w:r>
     </w:p>
-    <w:bookmarkEnd w:id="174"/>
-    <w:bookmarkStart w:id="176" w:name="ref-judzentiene2016vulgaris"/>
+    <w:bookmarkEnd w:id="178"/>
+    <w:bookmarkStart w:id="180" w:name="ref-judzentiene2016vulgaris"/>
     <w:p>
       <w:pPr>
         <w:pStyle w:val="Bibliography"/>
@@ -18427,7 +19117,7 @@
       <w:r>
         <w:t xml:space="preserve">“</w:t>
       </w:r>
-      <w:hyperlink r:id="rId175">
+      <w:hyperlink r:id="rId179">
         <w:r>
           <w:rPr>
             <w:rStyle w:val="Hyperlink"/>
@@ -18467,14 +19157,73 @@
         <w:t xml:space="preserve">11 (9): 1353–56.</w:t>
       </w:r>
     </w:p>
-    <w:bookmarkEnd w:id="176"/>
-    <w:bookmarkStart w:id="178" w:name="ref-kane2022cyp450"/>
+    <w:bookmarkEnd w:id="180"/>
+    <w:bookmarkStart w:id="182" w:name="ref-kacaniova2026argyi"/>
     <w:p>
       <w:pPr>
         <w:pStyle w:val="Bibliography"/>
         <w:spacing w:before="0" w:after="120" w:line="264" w:lineRule="auto"/>
       </w:pPr>
       <w:r>
+        <w:t xml:space="preserve">Kačániová, M., Z. Ban, L. Li, J. Lou, J. H. Elizondo-Luevano, A. Ben Hsouna, R. Ben Saad, A. Bianchi, L. Bakay, and S. Garzoli. 2026.</w:t>
+      </w:r>
+      <w:r>
+        <w:t xml:space="preserve"> </w:t>
+      </w:r>
+      <w:r>
+        <w:t xml:space="preserve">“Comprehensive Analysis of</w:t>
+      </w:r>
+      <w:r>
+        <w:t xml:space="preserve"> </w:t>
+      </w:r>
+      <w:r>
+        <w:t xml:space="preserve">Artemisia argyi</w:t>
+      </w:r>
+      <w:r>
+        <w:t xml:space="preserve"> </w:t>
+      </w:r>
+      <w:r>
+        <w:t xml:space="preserve">Essential Oil: Chemical Composition, Antimicrobial Efficacy, Biofilm Disruption, and Insecticidal Potential.”</w:t>
+      </w:r>
+      <w:r>
+        <w:t xml:space="preserve"> </w:t>
+      </w:r>
+      <w:r>
+        <w:rPr>
+          <w:i/>
+          <w:iCs/>
+        </w:rPr>
+        <w:t xml:space="preserve">Food Science and Nutrition</w:t>
+      </w:r>
+      <w:r>
+        <w:t xml:space="preserve"> </w:t>
+      </w:r>
+      <w:r>
+        <w:t xml:space="preserve">14 (6): e71385.</w:t>
+      </w:r>
+      <w:r>
+        <w:t xml:space="preserve"> </w:t>
+      </w:r>
+      <w:hyperlink r:id="rId181">
+        <w:r>
+          <w:rPr>
+            <w:rStyle w:val="Hyperlink"/>
+          </w:rPr>
+          <w:t xml:space="preserve">https://doi.org/10.1002/fsn3.71385</w:t>
+        </w:r>
+      </w:hyperlink>
+      <w:r>
+        <w:t xml:space="preserve">.</w:t>
+      </w:r>
+    </w:p>
+    <w:bookmarkEnd w:id="182"/>
+    <w:bookmarkStart w:id="184" w:name="ref-kane2022cyp450"/>
+    <w:p>
+      <w:pPr>
+        <w:pStyle w:val="Bibliography"/>
+        <w:spacing w:before="0" w:after="120" w:line="264" w:lineRule="auto"/>
+      </w:pPr>
+      <w:r>
         <w:t xml:space="preserve">Kane, NF, BH Kiani, MR Desrosiers, MJ Towler, and PJ Weathers. 2022.</w:t>
       </w:r>
       <w:r>
@@ -18523,7 +19272,7 @@
       <w:r>
         <w:t xml:space="preserve"> </w:t>
       </w:r>
-      <w:hyperlink r:id="rId177">
+      <w:hyperlink r:id="rId183">
         <w:r>
           <w:rPr>
             <w:rStyle w:val="Hyperlink"/>
@@ -18535,8 +19284,8 @@
         <w:t xml:space="preserve">.</w:t>
       </w:r>
     </w:p>
-    <w:bookmarkEnd w:id="178"/>
-    <w:bookmarkStart w:id="180" w:name="ref-khan2015artemisia_nematodes"/>
+    <w:bookmarkEnd w:id="184"/>
+    <w:bookmarkStart w:id="186" w:name="ref-khan2015artemisia_nematodes"/>
     <w:p>
       <w:pPr>
         <w:pStyle w:val="Bibliography"/>
@@ -18551,7 +19300,7 @@
       <w:r>
         <w:t xml:space="preserve">“</w:t>
       </w:r>
-      <w:hyperlink r:id="rId179">
+      <w:hyperlink r:id="rId185">
         <w:r>
           <w:rPr>
             <w:rStyle w:val="Hyperlink"/>
@@ -18603,8 +19352,8 @@
         <w:t xml:space="preserve">32 (2): 257–68.</w:t>
       </w:r>
     </w:p>
-    <w:bookmarkEnd w:id="180"/>
-    <w:bookmarkStart w:id="182" w:name="ref-kunnathattil2025vulgaris"/>
+    <w:bookmarkEnd w:id="186"/>
+    <w:bookmarkStart w:id="188" w:name="ref-kunnathattil2025vulgaris"/>
     <w:p>
       <w:pPr>
         <w:pStyle w:val="Bibliography"/>
@@ -18662,7 +19411,7 @@
       <w:r>
         <w:t xml:space="preserve"> </w:t>
       </w:r>
-      <w:hyperlink r:id="rId181">
+      <w:hyperlink r:id="rId187">
         <w:r>
           <w:rPr>
             <w:rStyle w:val="Hyperlink"/>
@@ -18674,8 +19423,8 @@
         <w:t xml:space="preserve">.</w:t>
       </w:r>
     </w:p>
-    <w:bookmarkEnd w:id="182"/>
-    <w:bookmarkStart w:id="184" w:name="ref-li2018naturalcombination"/>
+    <w:bookmarkEnd w:id="188"/>
+    <w:bookmarkStart w:id="190" w:name="ref-li2018naturalcombination"/>
     <w:p>
       <w:pPr>
         <w:pStyle w:val="Bibliography"/>
@@ -18721,7 +19470,7 @@
       <w:r>
         <w:t xml:space="preserve"> </w:t>
       </w:r>
-      <w:hyperlink r:id="rId183">
+      <w:hyperlink r:id="rId189">
         <w:r>
           <w:rPr>
             <w:rStyle w:val="Hyperlink"/>
@@ -18733,8 +19482,8 @@
         <w:t xml:space="preserve">.</w:t>
       </w:r>
     </w:p>
-    <w:bookmarkEnd w:id="184"/>
-    <w:bookmarkStart w:id="186" w:name="ref-li2008sphaerocephalasaponin"/>
+    <w:bookmarkEnd w:id="190"/>
+    <w:bookmarkStart w:id="192" w:name="ref-li2008sphaerocephalasaponin"/>
     <w:p>
       <w:pPr>
         <w:pStyle w:val="Bibliography"/>
@@ -18777,7 +19526,7 @@
       <w:r>
         <w:t xml:space="preserve"> </w:t>
       </w:r>
-      <w:hyperlink r:id="rId185">
+      <w:hyperlink r:id="rId191">
         <w:r>
           <w:rPr>
             <w:rStyle w:val="Hyperlink"/>
@@ -18789,8 +19538,8 @@
         <w:t xml:space="preserve">.</w:t>
       </w:r>
     </w:p>
-    <w:bookmarkEnd w:id="186"/>
-    <w:bookmarkStart w:id="188" w:name="ref-li1990sacrorumditerpene"/>
+    <w:bookmarkEnd w:id="192"/>
+    <w:bookmarkStart w:id="194" w:name="ref-li1990sacrorumditerpene"/>
     <w:p>
       <w:pPr>
         <w:pStyle w:val="Bibliography"/>
@@ -18833,7 +19582,7 @@
       <w:r>
         <w:t xml:space="preserve"> </w:t>
       </w:r>
-      <w:hyperlink r:id="rId187">
+      <w:hyperlink r:id="rId193">
         <w:r>
           <w:rPr>
             <w:rStyle w:val="Hyperlink"/>
@@ -18845,8 +19594,8 @@
         <w:t xml:space="preserve">.</w:t>
       </w:r>
     </w:p>
-    <w:bookmarkEnd w:id="188"/>
-    <w:bookmarkStart w:id="190" w:name="ref-liu2026osc"/>
+    <w:bookmarkEnd w:id="194"/>
+    <w:bookmarkStart w:id="196" w:name="ref-liu2026osc"/>
     <w:p>
       <w:pPr>
         <w:pStyle w:val="Bibliography"/>
@@ -18892,7 +19641,7 @@
       <w:r>
         <w:t xml:space="preserve"> </w:t>
       </w:r>
-      <w:hyperlink r:id="rId189">
+      <w:hyperlink r:id="rId195">
         <w:r>
           <w:rPr>
             <w:rStyle w:val="Hyperlink"/>
@@ -18904,8 +19653,8 @@
         <w:t xml:space="preserve">.</w:t>
       </w:r>
     </w:p>
-    <w:bookmarkEnd w:id="190"/>
-    <w:bookmarkStart w:id="192" w:name="ref-liu2022vulgaristerpenoids"/>
+    <w:bookmarkEnd w:id="196"/>
+    <w:bookmarkStart w:id="198" w:name="ref-liu2022vulgaristerpenoids"/>
     <w:p>
       <w:pPr>
         <w:pStyle w:val="Bibliography"/>
@@ -18951,7 +19700,7 @@
       <w:r>
         <w:t xml:space="preserve"> </w:t>
       </w:r>
-      <w:hyperlink r:id="rId191">
+      <w:hyperlink r:id="rId197">
         <w:r>
           <w:rPr>
             <w:rStyle w:val="Hyperlink"/>
@@ -18963,8 +19712,8 @@
         <w:t xml:space="preserve">.</w:t>
       </w:r>
     </w:p>
-    <w:bookmarkEnd w:id="192"/>
-    <w:bookmarkStart w:id="194" w:name="ref-lotfy2006inculta"/>
+    <w:bookmarkEnd w:id="198"/>
+    <w:bookmarkStart w:id="200" w:name="ref-lotfy2006inculta"/>
     <w:p>
       <w:pPr>
         <w:pStyle w:val="Bibliography"/>
@@ -19010,7 +19759,7 @@
       <w:r>
         <w:t xml:space="preserve"> </w:t>
       </w:r>
-      <w:hyperlink r:id="rId193">
+      <w:hyperlink r:id="rId199">
         <w:r>
           <w:rPr>
             <w:rStyle w:val="Hyperlink"/>
@@ -19022,8 +19771,8 @@
         <w:t xml:space="preserve">.</w:t>
       </w:r>
     </w:p>
-    <w:bookmarkEnd w:id="194"/>
-    <w:bookmarkStart w:id="196" w:name="ref-lu2013aora"/>
+    <w:bookmarkEnd w:id="200"/>
+    <w:bookmarkStart w:id="202" w:name="ref-lu2013aora"/>
     <w:p>
       <w:pPr>
         <w:pStyle w:val="Bibliography"/>
@@ -19081,7 +19830,7 @@
       <w:r>
         <w:t xml:space="preserve"> </w:t>
       </w:r>
-      <w:hyperlink r:id="rId195">
+      <w:hyperlink r:id="rId201">
         <w:r>
           <w:rPr>
             <w:rStyle w:val="Hyperlink"/>
@@ -19093,14 +19842,97 @@
         <w:t xml:space="preserve">.</w:t>
       </w:r>
     </w:p>
-    <w:bookmarkEnd w:id="196"/>
-    <w:bookmarkStart w:id="198" w:name="ref-lv2016nac1"/>
+    <w:bookmarkEnd w:id="202"/>
+    <w:bookmarkStart w:id="204" w:name="ref-lukwa2000aframosquitobiting"/>
     <w:p>
       <w:pPr>
         <w:pStyle w:val="Bibliography"/>
         <w:spacing w:before="0" w:after="120" w:line="264" w:lineRule="auto"/>
       </w:pPr>
       <w:r>
+        <w:t xml:space="preserve">Lukwa, N., P. Molgaard, P. Furu, C. Bogh, and M. Gundidza. 2000.</w:t>
+      </w:r>
+      <w:r>
+        <w:t xml:space="preserve"> </w:t>
+      </w:r>
+      <w:r>
+        <w:t xml:space="preserve">“Ineffectiveness of Essential Oils from</w:t>
+      </w:r>
+      <w:r>
+        <w:t xml:space="preserve"> </w:t>
+      </w:r>
+      <w:r>
+        <w:t xml:space="preserve">Artemisia afra</w:t>
+      </w:r>
+      <w:r>
+        <w:t xml:space="preserve"> </w:t>
+      </w:r>
+      <w:r>
+        <w:t xml:space="preserve">(Asteraceae),</w:t>
+      </w:r>
+      <w:r>
+        <w:t xml:space="preserve"> </w:t>
+      </w:r>
+      <w:r>
+        <w:t xml:space="preserve">Lantana angiolensis</w:t>
+      </w:r>
+      <w:r>
+        <w:t xml:space="preserve"> </w:t>
+      </w:r>
+      <w:r>
+        <w:t xml:space="preserve">(Verbenaceae) and</w:t>
+      </w:r>
+      <w:r>
+        <w:t xml:space="preserve"> </w:t>
+      </w:r>
+      <w:r>
+        <w:t xml:space="preserve">Syzygium hiullense</w:t>
+      </w:r>
+      <w:r>
+        <w:t xml:space="preserve"> </w:t>
+      </w:r>
+      <w:r>
+        <w:t xml:space="preserve">(Myrtaceae) in Inhibiting Mosquito Biting.”</w:t>
+      </w:r>
+      <w:r>
+        <w:t xml:space="preserve"> </w:t>
+      </w:r>
+      <w:r>
+        <w:rPr>
+          <w:i/>
+          <w:iCs/>
+        </w:rPr>
+        <w:t xml:space="preserve">The Central African Journal of Medicine</w:t>
+      </w:r>
+      <w:r>
+        <w:t xml:space="preserve"> </w:t>
+      </w:r>
+      <w:r>
+        <w:t xml:space="preserve">46 (8): 232–33.</w:t>
+      </w:r>
+      <w:r>
+        <w:t xml:space="preserve"> </w:t>
+      </w:r>
+      <w:hyperlink r:id="rId203">
+        <w:r>
+          <w:rPr>
+            <w:rStyle w:val="Hyperlink"/>
+          </w:rPr>
+          <w:t xml:space="preserve">https://pubmed.ncbi.nlm.nih.gov/11317598/</w:t>
+        </w:r>
+      </w:hyperlink>
+      <w:r>
+        <w:t xml:space="preserve">.</w:t>
+      </w:r>
+    </w:p>
+    <w:bookmarkEnd w:id="204"/>
+    <w:bookmarkStart w:id="206" w:name="ref-lv2016nac1"/>
+    <w:p>
+      <w:pPr>
+        <w:pStyle w:val="Bibliography"/>
+        <w:spacing w:before="0" w:after="120" w:line="264" w:lineRule="auto"/>
+      </w:pPr>
+      <w:r>
         <w:t xml:space="preserve">Lv, Z., S. Wang, F. Zhang, L. Chen, X. Hao, Q. Pan, X. Fu, L. Li, X. Sun, and K. Tang. 2016.</w:t>
       </w:r>
       <w:r>
@@ -19155,7 +19987,7 @@
       <w:r>
         <w:t xml:space="preserve"> </w:t>
       </w:r>
-      <w:hyperlink r:id="rId197">
+      <w:hyperlink r:id="rId205">
         <w:r>
           <w:rPr>
             <w:rStyle w:val="Hyperlink"/>
@@ -19167,8 +19999,8 @@
         <w:t xml:space="preserve">.</w:t>
       </w:r>
     </w:p>
-    <w:bookmarkEnd w:id="198"/>
-    <w:bookmarkStart w:id="200" w:name="ref-ma2001caruifolia"/>
+    <w:bookmarkEnd w:id="206"/>
+    <w:bookmarkStart w:id="208" w:name="ref-ma2001caruifolia"/>
     <w:p>
       <w:pPr>
         <w:pStyle w:val="Bibliography"/>
@@ -19202,7 +20034,7 @@
       <w:r>
         <w:t xml:space="preserve"> </w:t>
       </w:r>
-      <w:hyperlink r:id="rId199">
+      <w:hyperlink r:id="rId207">
         <w:r>
           <w:rPr>
             <w:rStyle w:val="Hyperlink"/>
@@ -19214,8 +20046,8 @@
         <w:t xml:space="preserve">.</w:t>
       </w:r>
     </w:p>
-    <w:bookmarkEnd w:id="200"/>
-    <w:bookmarkStart w:id="202" w:name="ref-mamede2025metabolite"/>
+    <w:bookmarkEnd w:id="208"/>
+    <w:bookmarkStart w:id="210" w:name="ref-mamede2025metabolite"/>
     <w:p>
       <w:pPr>
         <w:pStyle w:val="Bibliography"/>
@@ -19282,7 +20114,7 @@
       <w:r>
         <w:t xml:space="preserve"> </w:t>
       </w:r>
-      <w:hyperlink r:id="rId201">
+      <w:hyperlink r:id="rId209">
         <w:r>
           <w:rPr>
             <w:rStyle w:val="Hyperlink"/>
@@ -19294,8 +20126,8 @@
         <w:t xml:space="preserve">.</w:t>
       </w:r>
     </w:p>
-    <w:bookmarkEnd w:id="202"/>
-    <w:bookmarkStart w:id="204" w:name="ref-martinezdiaz2015absinthiumtrypano"/>
+    <w:bookmarkEnd w:id="210"/>
+    <w:bookmarkStart w:id="212" w:name="ref-martinezdiaz2015absinthiumtrypano"/>
     <w:p>
       <w:pPr>
         <w:pStyle w:val="Bibliography"/>
@@ -19329,7 +20161,7 @@
       <w:r>
         <w:t xml:space="preserve"> </w:t>
       </w:r>
-      <w:hyperlink r:id="rId203">
+      <w:hyperlink r:id="rId211">
         <w:r>
           <w:rPr>
             <w:rStyle w:val="Hyperlink"/>
@@ -19341,8 +20173,8 @@
         <w:t xml:space="preserve">.</w:t>
       </w:r>
     </w:p>
-    <w:bookmarkEnd w:id="204"/>
-    <w:bookmarkStart w:id="206" w:name="ref-ming2025argyidrying"/>
+    <w:bookmarkEnd w:id="212"/>
+    <w:bookmarkStart w:id="214" w:name="ref-ming2025argyidrying"/>
     <w:p>
       <w:pPr>
         <w:pStyle w:val="Bibliography"/>
@@ -19385,7 +20217,7 @@
       <w:r>
         <w:t xml:space="preserve"> </w:t>
       </w:r>
-      <w:hyperlink r:id="rId205">
+      <w:hyperlink r:id="rId213">
         <w:r>
           <w:rPr>
             <w:rStyle w:val="Hyperlink"/>
@@ -19397,8 +20229,8 @@
         <w:t xml:space="preserve">.</w:t>
       </w:r>
     </w:p>
-    <w:bookmarkEnd w:id="206"/>
-    <w:bookmarkStart w:id="208" w:name="ref-mohammed2026monospermadrying"/>
+    <w:bookmarkEnd w:id="214"/>
+    <w:bookmarkStart w:id="216" w:name="ref-mohammed2026monospermadrying"/>
     <w:p>
       <w:pPr>
         <w:pStyle w:val="Bibliography"/>
@@ -19451,7 +20283,7 @@
       <w:r>
         <w:t xml:space="preserve"> </w:t>
       </w:r>
-      <w:hyperlink r:id="rId207">
+      <w:hyperlink r:id="rId215">
         <w:r>
           <w:rPr>
             <w:rStyle w:val="Hyperlink"/>
@@ -19463,8 +20295,8 @@
         <w:t xml:space="preserve">.</w:t>
       </w:r>
     </w:p>
-    <w:bookmarkEnd w:id="208"/>
-    <w:bookmarkStart w:id="210" w:name="ref-mojarrab2015extracts"/>
+    <w:bookmarkEnd w:id="216"/>
+    <w:bookmarkStart w:id="218" w:name="ref-mojarrab2015extracts"/>
     <w:p>
       <w:pPr>
         <w:pStyle w:val="Bibliography"/>
@@ -19510,7 +20342,7 @@
       <w:r>
         <w:t xml:space="preserve"> </w:t>
       </w:r>
-      <w:hyperlink r:id="rId209">
+      <w:hyperlink r:id="rId217">
         <w:r>
           <w:rPr>
             <w:rStyle w:val="Hyperlink"/>
@@ -19522,8 +20354,8 @@
         <w:t xml:space="preserve">.</w:t>
       </w:r>
     </w:p>
-    <w:bookmarkEnd w:id="210"/>
-    <w:bookmarkStart w:id="212" w:name="ref-mojarrab2014fractionation"/>
+    <w:bookmarkEnd w:id="218"/>
+    <w:bookmarkStart w:id="220" w:name="ref-mojarrab2014fractionation"/>
     <w:p>
       <w:pPr>
         <w:pStyle w:val="Bibliography"/>
@@ -19581,7 +20413,7 @@
       <w:r>
         <w:t xml:space="preserve"> </w:t>
       </w:r>
-      <w:hyperlink r:id="rId211">
+      <w:hyperlink r:id="rId219">
         <w:r>
           <w:rPr>
             <w:rStyle w:val="Hyperlink"/>
@@ -19593,8 +20425,8 @@
         <w:t xml:space="preserve">.</w:t>
       </w:r>
     </w:p>
-    <w:bookmarkEnd w:id="212"/>
-    <w:bookmarkStart w:id="214" w:name="ref-monzote2014absinthium"/>
+    <w:bookmarkEnd w:id="220"/>
+    <w:bookmarkStart w:id="222" w:name="ref-monzote2014absinthium"/>
     <w:p>
       <w:pPr>
         <w:pStyle w:val="Bibliography"/>
@@ -19628,7 +20460,7 @@
       <w:r>
         <w:t xml:space="preserve"> </w:t>
       </w:r>
-      <w:hyperlink r:id="rId213">
+      <w:hyperlink r:id="rId221">
         <w:r>
           <w:rPr>
             <w:rStyle w:val="Hyperlink"/>
@@ -19640,8 +20472,8 @@
         <w:t xml:space="preserve">.</w:t>
       </w:r>
     </w:p>
-    <w:bookmarkEnd w:id="214"/>
-    <w:bookmarkStart w:id="216" w:name="ref-morua2025standardizedannua"/>
+    <w:bookmarkEnd w:id="222"/>
+    <w:bookmarkStart w:id="224" w:name="ref-morua2025standardizedannua"/>
     <w:p>
       <w:pPr>
         <w:pStyle w:val="Bibliography"/>
@@ -19687,7 +20519,7 @@
       <w:r>
         <w:t xml:space="preserve"> </w:t>
       </w:r>
-      <w:hyperlink r:id="rId215">
+      <w:hyperlink r:id="rId223">
         <w:r>
           <w:rPr>
             <w:rStyle w:val="Hyperlink"/>
@@ -19699,8 +20531,8 @@
         <w:t xml:space="preserve">.</w:t>
       </w:r>
     </w:p>
-    <w:bookmarkEnd w:id="216"/>
-    <w:bookmarkStart w:id="218" w:name="ref-annua2015triterpenes"/>
+    <w:bookmarkEnd w:id="224"/>
+    <w:bookmarkStart w:id="226" w:name="ref-annua2015triterpenes"/>
     <w:p>
       <w:pPr>
         <w:pStyle w:val="Bibliography"/>
@@ -19734,7 +20566,7 @@
       <w:r>
         <w:t xml:space="preserve"> </w:t>
       </w:r>
-      <w:hyperlink r:id="rId217">
+      <w:hyperlink r:id="rId225">
         <w:r>
           <w:rPr>
             <w:rStyle w:val="Hyperlink"/>
@@ -19746,8 +20578,8 @@
         <w:t xml:space="preserve">.</w:t>
       </w:r>
     </w:p>
-    <w:bookmarkEnd w:id="218"/>
-    <w:bookmarkStart w:id="220" w:name="ref-mouton2013artemisininonly"/>
+    <w:bookmarkEnd w:id="226"/>
+    <w:bookmarkStart w:id="228" w:name="ref-mouton2013artemisininonly"/>
     <w:p>
       <w:pPr>
         <w:pStyle w:val="Bibliography"/>
@@ -19793,7 +20625,7 @@
       <w:r>
         <w:t xml:space="preserve"> </w:t>
       </w:r>
-      <w:hyperlink r:id="rId219">
+      <w:hyperlink r:id="rId227">
         <w:r>
           <w:rPr>
             <w:rStyle w:val="Hyperlink"/>
@@ -19805,8 +20637,8 @@
         <w:t xml:space="preserve">.</w:t>
       </w:r>
     </w:p>
-    <w:bookmarkEnd w:id="220"/>
-    <w:bookmarkStart w:id="222" w:name="ref-mravcakova2020wormwood"/>
+    <w:bookmarkEnd w:id="228"/>
+    <w:bookmarkStart w:id="230" w:name="ref-mravcakova2020wormwood"/>
     <w:p>
       <w:pPr>
         <w:pStyle w:val="Bibliography"/>
@@ -19840,7 +20672,7 @@
       <w:r>
         <w:t xml:space="preserve"> </w:t>
       </w:r>
-      <w:hyperlink r:id="rId221">
+      <w:hyperlink r:id="rId229">
         <w:r>
           <w:rPr>
             <w:rStyle w:val="Hyperlink"/>
@@ -19852,8 +20684,8 @@
         <w:t xml:space="preserve">.</w:t>
       </w:r>
     </w:p>
-    <w:bookmarkEnd w:id="222"/>
-    <w:bookmarkStart w:id="224" w:name="ref-nahrevanian2010khorassanica"/>
+    <w:bookmarkEnd w:id="230"/>
+    <w:bookmarkStart w:id="232" w:name="ref-nahrevanian2010khorassanica"/>
     <w:p>
       <w:pPr>
         <w:pStyle w:val="Bibliography"/>
@@ -19887,7 +20719,7 @@
       <w:r>
         <w:t xml:space="preserve"> </w:t>
       </w:r>
-      <w:hyperlink r:id="rId223">
+      <w:hyperlink r:id="rId231">
         <w:r>
           <w:rPr>
             <w:rStyle w:val="Hyperlink"/>
@@ -19899,8 +20731,8 @@
         <w:t xml:space="preserve">.</w:t>
       </w:r>
     </w:p>
-    <w:bookmarkEnd w:id="224"/>
-    <w:bookmarkStart w:id="226" w:name="ref-nahrevanian2012sieberi"/>
+    <w:bookmarkEnd w:id="232"/>
+    <w:bookmarkStart w:id="234" w:name="ref-nahrevanian2012sieberi"/>
     <w:p>
       <w:pPr>
         <w:pStyle w:val="Bibliography"/>
@@ -19934,7 +20766,7 @@
       <w:r>
         <w:t xml:space="preserve"> </w:t>
       </w:r>
-      <w:hyperlink r:id="rId225">
+      <w:hyperlink r:id="rId233">
         <w:r>
           <w:rPr>
             <w:rStyle w:val="Hyperlink"/>
@@ -19946,8 +20778,8 @@
         <w:t xml:space="preserve">.</w:t>
       </w:r>
     </w:p>
-    <w:bookmarkEnd w:id="226"/>
-    <w:bookmarkStart w:id="228" w:name="ref-nomani2022h2s"/>
+    <w:bookmarkEnd w:id="234"/>
+    <w:bookmarkStart w:id="236" w:name="ref-nomani2022h2s"/>
     <w:p>
       <w:pPr>
         <w:pStyle w:val="Bibliography"/>
@@ -19993,7 +20825,7 @@
       <w:r>
         <w:t xml:space="preserve"> </w:t>
       </w:r>
-      <w:hyperlink r:id="rId227">
+      <w:hyperlink r:id="rId235">
         <w:r>
           <w:rPr>
             <w:rStyle w:val="Hyperlink"/>
@@ -20005,8 +20837,8 @@
         <w:t xml:space="preserve">.</w:t>
       </w:r>
     </w:p>
-    <w:bookmarkEnd w:id="228"/>
-    <w:bookmarkStart w:id="230" w:name="ref-nurlaelasari2023vulgarisfasciola"/>
+    <w:bookmarkEnd w:id="236"/>
+    <w:bookmarkStart w:id="238" w:name="ref-nurlaelasari2023vulgarisfasciola"/>
     <w:p>
       <w:pPr>
         <w:pStyle w:val="Bibliography"/>
@@ -20061,7 +20893,7 @@
       <w:r>
         <w:t xml:space="preserve"> </w:t>
       </w:r>
-      <w:hyperlink r:id="rId229">
+      <w:hyperlink r:id="rId237">
         <w:r>
           <w:rPr>
             <w:rStyle w:val="Hyperlink"/>
@@ -20073,8 +20905,8 @@
         <w:t xml:space="preserve">.</w:t>
       </w:r>
     </w:p>
-    <w:bookmarkEnd w:id="230"/>
-    <w:bookmarkStart w:id="232" w:name="ref-olofsson2011tissue"/>
+    <w:bookmarkEnd w:id="238"/>
+    <w:bookmarkStart w:id="240" w:name="ref-olofsson2011tissue"/>
     <w:p>
       <w:pPr>
         <w:pStyle w:val="Bibliography"/>
@@ -20108,7 +20940,7 @@
       <w:r>
         <w:t xml:space="preserve"> </w:t>
       </w:r>
-      <w:hyperlink r:id="rId231">
+      <w:hyperlink r:id="rId239">
         <w:r>
           <w:rPr>
             <w:rStyle w:val="Hyperlink"/>
@@ -20120,8 +20952,8 @@
         <w:t xml:space="preserve">.</w:t>
       </w:r>
     </w:p>
-    <w:bookmarkEnd w:id="232"/>
-    <w:bookmarkStart w:id="234" w:name="ref-olsson2009localization"/>
+    <w:bookmarkEnd w:id="240"/>
+    <w:bookmarkStart w:id="242" w:name="ref-olsson2009localization"/>
     <w:p>
       <w:pPr>
         <w:pStyle w:val="Bibliography"/>
@@ -20155,7 +20987,7 @@
       <w:r>
         <w:t xml:space="preserve"> </w:t>
       </w:r>
-      <w:hyperlink r:id="rId233">
+      <w:hyperlink r:id="rId241">
         <w:r>
           <w:rPr>
             <w:rStyle w:val="Hyperlink"/>
@@ -20167,8 +20999,8 @@
         <w:t xml:space="preserve">.</w:t>
       </w:r>
     </w:p>
-    <w:bookmarkEnd w:id="234"/>
-    <w:bookmarkStart w:id="236" w:name="ref-ongo2019campestriscomment"/>
+    <w:bookmarkEnd w:id="242"/>
+    <w:bookmarkStart w:id="244" w:name="ref-ongo2019campestriscomment"/>
     <w:p>
       <w:pPr>
         <w:pStyle w:val="Bibliography"/>
@@ -20223,7 +21055,7 @@
       <w:r>
         <w:t xml:space="preserve"> </w:t>
       </w:r>
-      <w:hyperlink r:id="rId235">
+      <w:hyperlink r:id="rId243">
         <w:r>
           <w:rPr>
             <w:rStyle w:val="Hyperlink"/>
@@ -20235,8 +21067,8 @@
         <w:t xml:space="preserve">.</w:t>
       </w:r>
     </w:p>
-    <w:bookmarkEnd w:id="236"/>
-    <w:bookmarkStart w:id="238" w:name="ref-ortet2008gorgonum"/>
+    <w:bookmarkEnd w:id="244"/>
+    <w:bookmarkStart w:id="246" w:name="ref-ortet2008gorgonum"/>
     <w:p>
       <w:pPr>
         <w:pStyle w:val="Bibliography"/>
@@ -20270,7 +21102,7 @@
       <w:r>
         <w:t xml:space="preserve"> </w:t>
       </w:r>
-      <w:hyperlink r:id="rId237">
+      <w:hyperlink r:id="rId245">
         <w:r>
           <w:rPr>
             <w:rStyle w:val="Hyperlink"/>
@@ -20282,8 +21114,8 @@
         <w:t xml:space="preserve">.</w:t>
       </w:r>
     </w:p>
-    <w:bookmarkEnd w:id="238"/>
-    <w:bookmarkStart w:id="240" w:name="ref-osanloo2022dracunculusnanogel"/>
+    <w:bookmarkEnd w:id="246"/>
+    <w:bookmarkStart w:id="248" w:name="ref-osanloo2022dracunculusnanogel"/>
     <w:p>
       <w:pPr>
         <w:pStyle w:val="Bibliography"/>
@@ -20329,7 +21161,7 @@
       <w:r>
         <w:t xml:space="preserve"> </w:t>
       </w:r>
-      <w:hyperlink r:id="rId239">
+      <w:hyperlink r:id="rId247">
         <w:r>
           <w:rPr>
             <w:rStyle w:val="Hyperlink"/>
@@ -20341,8 +21173,8 @@
         <w:t xml:space="preserve">.</w:t>
       </w:r>
     </w:p>
-    <w:bookmarkEnd w:id="240"/>
-    <w:bookmarkStart w:id="242" w:name="ref-oyedeji2009afra"/>
+    <w:bookmarkEnd w:id="248"/>
+    <w:bookmarkStart w:id="250" w:name="ref-oyedeji2009afra"/>
     <w:p>
       <w:pPr>
         <w:pStyle w:val="Bibliography"/>
@@ -20376,7 +21208,7 @@
       <w:r>
         <w:t xml:space="preserve"> </w:t>
       </w:r>
-      <w:hyperlink r:id="rId241">
+      <w:hyperlink r:id="rId249">
         <w:r>
           <w:rPr>
             <w:rStyle w:val="Hyperlink"/>
@@ -20388,8 +21220,8 @@
         <w:t xml:space="preserve">.</w:t>
       </w:r>
     </w:p>
-    <w:bookmarkEnd w:id="242"/>
-    <w:bookmarkStart w:id="244" w:name="ref-pandey2017artemisiaoils"/>
+    <w:bookmarkEnd w:id="250"/>
+    <w:bookmarkStart w:id="252" w:name="ref-pandey2017artemisiaoils"/>
     <w:p>
       <w:pPr>
         <w:pStyle w:val="Bibliography"/>
@@ -20423,7 +21255,7 @@
       <w:r>
         <w:t xml:space="preserve"> </w:t>
       </w:r>
-      <w:hyperlink r:id="rId243">
+      <w:hyperlink r:id="rId251">
         <w:r>
           <w:rPr>
             <w:rStyle w:val="Hyperlink"/>
@@ -20435,8 +21267,8 @@
         <w:t xml:space="preserve">.</w:t>
       </w:r>
     </w:p>
-    <w:bookmarkEnd w:id="244"/>
-    <w:bookmarkStart w:id="246" w:name="ref-parveen2024scoparia"/>
+    <w:bookmarkEnd w:id="252"/>
+    <w:bookmarkStart w:id="254" w:name="ref-parveen2024scoparia"/>
     <w:p>
       <w:pPr>
         <w:pStyle w:val="Bibliography"/>
@@ -20482,7 +21314,7 @@
       <w:r>
         <w:t xml:space="preserve"> </w:t>
       </w:r>
-      <w:hyperlink r:id="rId245">
+      <w:hyperlink r:id="rId253">
         <w:r>
           <w:rPr>
             <w:rStyle w:val="Hyperlink"/>
@@ -20494,8 +21326,8 @@
         <w:t xml:space="preserve">.</w:t>
       </w:r>
     </w:p>
-    <w:bookmarkEnd w:id="246"/>
-    <w:bookmarkStart w:id="248" w:name="ref-paul2010recurrent"/>
+    <w:bookmarkEnd w:id="254"/>
+    <w:bookmarkStart w:id="256" w:name="ref-paul2010recurrent"/>
     <w:p>
       <w:pPr>
         <w:pStyle w:val="Bibliography"/>
@@ -20541,7 +21373,7 @@
       <w:r>
         <w:t xml:space="preserve"> </w:t>
       </w:r>
-      <w:hyperlink r:id="rId247">
+      <w:hyperlink r:id="rId255">
         <w:r>
           <w:rPr>
             <w:rStyle w:val="Hyperlink"/>
@@ -20553,8 +21385,8 @@
         <w:t xml:space="preserve">.</w:t>
       </w:r>
     </w:p>
-    <w:bookmarkEnd w:id="248"/>
-    <w:bookmarkStart w:id="250" w:name="ref-pirali2011tick"/>
+    <w:bookmarkEnd w:id="256"/>
+    <w:bookmarkStart w:id="258" w:name="ref-pirali2011tick"/>
     <w:p>
       <w:pPr>
         <w:pStyle w:val="Bibliography"/>
@@ -20612,7 +21444,7 @@
       <w:r>
         <w:t xml:space="preserve"> </w:t>
       </w:r>
-      <w:hyperlink r:id="rId249">
+      <w:hyperlink r:id="rId257">
         <w:r>
           <w:rPr>
             <w:rStyle w:val="Hyperlink"/>
@@ -20624,8 +21456,8 @@
         <w:t xml:space="preserve">.</w:t>
       </w:r>
     </w:p>
-    <w:bookmarkEnd w:id="250"/>
-    <w:bookmarkStart w:id="252" w:name="ref-radulovic2013toxic"/>
+    <w:bookmarkEnd w:id="258"/>
+    <w:bookmarkStart w:id="260" w:name="ref-radulovic2013toxic"/>
     <w:p>
       <w:pPr>
         <w:pStyle w:val="Bibliography"/>
@@ -20659,7 +21491,7 @@
       <w:r>
         <w:t xml:space="preserve"> </w:t>
       </w:r>
-      <w:hyperlink r:id="rId251">
+      <w:hyperlink r:id="rId259">
         <w:r>
           <w:rPr>
             <w:rStyle w:val="Hyperlink"/>
@@ -20671,8 +21503,8 @@
         <w:t xml:space="preserve">.</w:t>
       </w:r>
     </w:p>
-    <w:bookmarkEnd w:id="252"/>
-    <w:bookmarkStart w:id="254" w:name="ref-ram1997density"/>
+    <w:bookmarkEnd w:id="260"/>
+    <w:bookmarkStart w:id="262" w:name="ref-ram1997density"/>
     <w:p>
       <w:pPr>
         <w:pStyle w:val="Bibliography"/>
@@ -20718,7 +21550,7 @@
       <w:r>
         <w:t xml:space="preserve"> </w:t>
       </w:r>
-      <w:hyperlink r:id="rId253">
+      <w:hyperlink r:id="rId261">
         <w:r>
           <w:rPr>
             <w:rStyle w:val="Hyperlink"/>
@@ -20730,8 +21562,8 @@
         <w:t xml:space="preserve">.</w:t>
       </w:r>
     </w:p>
-    <w:bookmarkEnd w:id="254"/>
-    <w:bookmarkStart w:id="256" w:name="ref-ribbiso2021heme"/>
+    <w:bookmarkEnd w:id="262"/>
+    <w:bookmarkStart w:id="264" w:name="ref-ribbiso2021heme"/>
     <w:p>
       <w:pPr>
         <w:pStyle w:val="Bibliography"/>
@@ -20777,7 +21609,7 @@
       <w:r>
         <w:t xml:space="preserve"> </w:t>
       </w:r>
-      <w:hyperlink r:id="rId255">
+      <w:hyperlink r:id="rId263">
         <w:r>
           <w:rPr>
             <w:rStyle w:val="Hyperlink"/>
@@ -20789,8 +21621,8 @@
         <w:t xml:space="preserve">.</w:t>
       </w:r>
     </w:p>
-    <w:bookmarkEnd w:id="256"/>
-    <w:bookmarkStart w:id="258" w:name="ref-rosenthal2024proteostasis"/>
+    <w:bookmarkEnd w:id="264"/>
+    <w:bookmarkStart w:id="266" w:name="ref-rosenthal2024proteostasis"/>
     <w:p>
       <w:pPr>
         <w:pStyle w:val="Bibliography"/>
@@ -20833,7 +21665,7 @@
       <w:r>
         <w:t xml:space="preserve"> </w:t>
       </w:r>
-      <w:hyperlink r:id="rId257">
+      <w:hyperlink r:id="rId265">
         <w:r>
           <w:rPr>
             <w:rStyle w:val="Hyperlink"/>
@@ -20845,8 +21677,8 @@
         <w:t xml:space="preserve">.</w:t>
       </w:r>
     </w:p>
-    <w:bookmarkEnd w:id="258"/>
-    <w:bookmarkStart w:id="260" w:name="ref-rostkowska2016silicon"/>
+    <w:bookmarkEnd w:id="266"/>
+    <w:bookmarkStart w:id="268" w:name="ref-rostkowska2016silicon"/>
     <w:p>
       <w:pPr>
         <w:pStyle w:val="Bibliography"/>
@@ -20904,7 +21736,7 @@
       <w:r>
         <w:t xml:space="preserve"> </w:t>
       </w:r>
-      <w:hyperlink r:id="rId259">
+      <w:hyperlink r:id="rId267">
         <w:r>
           <w:rPr>
             <w:rStyle w:val="Hyperlink"/>
@@ -20916,8 +21748,8 @@
         <w:t xml:space="preserve">.</w:t>
       </w:r>
     </w:p>
-    <w:bookmarkEnd w:id="260"/>
-    <w:bookmarkStart w:id="262" w:name="ref-annua2016monoterpenes"/>
+    <w:bookmarkEnd w:id="268"/>
+    <w:bookmarkStart w:id="270" w:name="ref-annua2016monoterpenes"/>
     <w:p>
       <w:pPr>
         <w:pStyle w:val="Bibliography"/>
@@ -20951,7 +21783,7 @@
       <w:r>
         <w:t xml:space="preserve"> </w:t>
       </w:r>
-      <w:hyperlink r:id="rId261">
+      <w:hyperlink r:id="rId269">
         <w:r>
           <w:rPr>
             <w:rStyle w:val="Hyperlink"/>
@@ -20963,8 +21795,8 @@
         <w:t xml:space="preserve">.</w:t>
       </w:r>
     </w:p>
-    <w:bookmarkEnd w:id="262"/>
-    <w:bookmarkStart w:id="264" w:name="ref-said2016vcd"/>
+    <w:bookmarkEnd w:id="270"/>
+    <w:bookmarkStart w:id="272" w:name="ref-said2016vcd"/>
     <w:p>
       <w:pPr>
         <w:pStyle w:val="Bibliography"/>
@@ -21010,7 +21842,7 @@
       <w:r>
         <w:t xml:space="preserve"> </w:t>
       </w:r>
-      <w:hyperlink r:id="rId263">
+      <w:hyperlink r:id="rId271">
         <w:r>
           <w:rPr>
             <w:rStyle w:val="Hyperlink"/>
@@ -21022,8 +21854,8 @@
         <w:t xml:space="preserve">.</w:t>
       </w:r>
     </w:p>
-    <w:bookmarkEnd w:id="264"/>
-    <w:bookmarkStart w:id="266" w:name="ref-sanei2023nanoliposomes"/>
+    <w:bookmarkEnd w:id="272"/>
+    <w:bookmarkStart w:id="274" w:name="ref-sanei2023nanoliposomes"/>
     <w:p>
       <w:pPr>
         <w:pStyle w:val="Bibliography"/>
@@ -21090,7 +21922,7 @@
       <w:r>
         <w:t xml:space="preserve"> </w:t>
       </w:r>
-      <w:hyperlink r:id="rId265">
+      <w:hyperlink r:id="rId273">
         <w:r>
           <w:rPr>
             <w:rStyle w:val="Hyperlink"/>
@@ -21102,8 +21934,8 @@
         <w:t xml:space="preserve">.</w:t>
       </w:r>
     </w:p>
-    <w:bookmarkEnd w:id="266"/>
-    <w:bookmarkStart w:id="268" w:name="ref-schramek2010isotope"/>
+    <w:bookmarkEnd w:id="274"/>
+    <w:bookmarkStart w:id="276" w:name="ref-schramek2010isotope"/>
     <w:p>
       <w:pPr>
         <w:pStyle w:val="Bibliography"/>
@@ -21137,7 +21969,7 @@
       <w:r>
         <w:t xml:space="preserve"> </w:t>
       </w:r>
-      <w:hyperlink r:id="rId267">
+      <w:hyperlink r:id="rId275">
         <w:r>
           <w:rPr>
             <w:rStyle w:val="Hyperlink"/>
@@ -21149,8 +21981,8 @@
         <w:t xml:space="preserve">.</w:t>
       </w:r>
     </w:p>
-    <w:bookmarkEnd w:id="268"/>
-    <w:bookmarkStart w:id="270" w:name="ref-seddiek2011herbaalba"/>
+    <w:bookmarkEnd w:id="276"/>
+    <w:bookmarkStart w:id="278" w:name="ref-seddiek2011herbaalba"/>
     <w:p>
       <w:pPr>
         <w:pStyle w:val="Bibliography"/>
@@ -21208,7 +22040,7 @@
       <w:r>
         <w:t xml:space="preserve"> </w:t>
       </w:r>
-      <w:hyperlink r:id="rId269">
+      <w:hyperlink r:id="rId277">
         <w:r>
           <w:rPr>
             <w:rStyle w:val="Hyperlink"/>
@@ -21220,8 +22052,8 @@
         <w:t xml:space="preserve">.</w:t>
       </w:r>
     </w:p>
-    <w:bookmarkEnd w:id="270"/>
-    <w:bookmarkStart w:id="272" w:name="ref-sharma2012culex"/>
+    <w:bookmarkEnd w:id="278"/>
+    <w:bookmarkStart w:id="280" w:name="ref-sharma2012culex"/>
     <w:p>
       <w:pPr>
         <w:pStyle w:val="Bibliography"/>
@@ -21288,7 +22120,7 @@
       <w:r>
         <w:t xml:space="preserve"> </w:t>
       </w:r>
-      <w:hyperlink r:id="rId271">
+      <w:hyperlink r:id="rId279">
         <w:r>
           <w:rPr>
             <w:rStyle w:val="Hyperlink"/>
@@ -21300,8 +22132,8 @@
         <w:t xml:space="preserve">.</w:t>
       </w:r>
     </w:p>
-    <w:bookmarkEnd w:id="272"/>
-    <w:bookmarkStart w:id="274" w:name="ref-shen2012cypcpr"/>
+    <w:bookmarkEnd w:id="280"/>
+    <w:bookmarkStart w:id="282" w:name="ref-shen2012cypcpr"/>
     <w:p>
       <w:pPr>
         <w:pStyle w:val="Bibliography"/>
@@ -21359,7 +22191,7 @@
       <w:r>
         <w:t xml:space="preserve"> </w:t>
       </w:r>
-      <w:hyperlink r:id="rId273">
+      <w:hyperlink r:id="rId281">
         <w:r>
           <w:rPr>
             <w:rStyle w:val="Hyperlink"/>
@@ -21371,8 +22203,8 @@
         <w:t xml:space="preserve">.</w:t>
       </w:r>
     </w:p>
-    <w:bookmarkEnd w:id="274"/>
-    <w:bookmarkStart w:id="276" w:name="ref-shi2022annuaantimalarialmetabolomics"/>
+    <w:bookmarkEnd w:id="282"/>
+    <w:bookmarkStart w:id="284" w:name="ref-shi2022annuaantimalarialmetabolomics"/>
     <w:p>
       <w:pPr>
         <w:pStyle w:val="Bibliography"/>
@@ -21418,7 +22250,7 @@
       <w:r>
         <w:t xml:space="preserve"> </w:t>
       </w:r>
-      <w:hyperlink r:id="rId275">
+      <w:hyperlink r:id="rId283">
         <w:r>
           <w:rPr>
             <w:rStyle w:val="Hyperlink"/>
@@ -21430,8 +22262,8 @@
         <w:t xml:space="preserve">.</w:t>
       </w:r>
     </w:p>
-    <w:bookmarkEnd w:id="276"/>
-    <w:bookmarkStart w:id="278" w:name="ref-shi2018mixta1"/>
+    <w:bookmarkEnd w:id="284"/>
+    <w:bookmarkStart w:id="286" w:name="ref-shi2018mixta1"/>
     <w:p>
       <w:pPr>
         <w:pStyle w:val="Bibliography"/>
@@ -21486,7 +22318,7 @@
       <w:r>
         <w:t xml:space="preserve"> </w:t>
       </w:r>
-      <w:hyperlink r:id="rId277">
+      <w:hyperlink r:id="rId285">
         <w:r>
           <w:rPr>
             <w:rStyle w:val="Hyperlink"/>
@@ -21498,8 +22330,8 @@
         <w:t xml:space="preserve">.</w:t>
       </w:r>
     </w:p>
-    <w:bookmarkEnd w:id="278"/>
-    <w:bookmarkStart w:id="280" w:name="ref-dasilva2017annuasheep"/>
+    <w:bookmarkEnd w:id="286"/>
+    <w:bookmarkStart w:id="288" w:name="ref-dasilva2017annuasheep"/>
     <w:p>
       <w:pPr>
         <w:pStyle w:val="Bibliography"/>
@@ -21545,7 +22377,7 @@
       <w:r>
         <w:t xml:space="preserve"> </w:t>
       </w:r>
-      <w:hyperlink r:id="rId279">
+      <w:hyperlink r:id="rId287">
         <w:r>
           <w:rPr>
             <w:rStyle w:val="Hyperlink"/>
@@ -21557,8 +22389,8 @@
         <w:t xml:space="preserve">.</w:t>
       </w:r>
     </w:p>
-    <w:bookmarkEnd w:id="280"/>
-    <w:bookmarkStart w:id="282" w:name="ref-snider2021gametocytes"/>
+    <w:bookmarkEnd w:id="288"/>
+    <w:bookmarkStart w:id="290" w:name="ref-snider2021gametocytes"/>
     <w:p>
       <w:pPr>
         <w:pStyle w:val="Bibliography"/>
@@ -21616,7 +22448,7 @@
       <w:r>
         <w:t xml:space="preserve"> </w:t>
       </w:r>
-      <w:hyperlink r:id="rId281">
+      <w:hyperlink r:id="rId289">
         <w:r>
           <w:rPr>
             <w:rStyle w:val="Hyperlink"/>
@@ -21628,8 +22460,8 @@
         <w:t xml:space="preserve">.</w:t>
       </w:r>
     </w:p>
-    <w:bookmarkEnd w:id="282"/>
-    <w:bookmarkStart w:id="284" w:name="ref-soleimanifard2023kermanensis"/>
+    <w:bookmarkEnd w:id="290"/>
+    <w:bookmarkStart w:id="292" w:name="ref-soleimanifard2023kermanensis"/>
     <w:p>
       <w:pPr>
         <w:pStyle w:val="Bibliography"/>
@@ -21675,7 +22507,7 @@
       <w:r>
         <w:t xml:space="preserve"> </w:t>
       </w:r>
-      <w:hyperlink r:id="rId283">
+      <w:hyperlink r:id="rId291">
         <w:r>
           <w:rPr>
             <w:rStyle w:val="Hyperlink"/>
@@ -21687,8 +22519,8 @@
         <w:t xml:space="preserve">.</w:t>
       </w:r>
     </w:p>
-    <w:bookmarkEnd w:id="284"/>
-    <w:bookmarkStart w:id="286" w:name="ref-squires2011haemonchus"/>
+    <w:bookmarkEnd w:id="292"/>
+    <w:bookmarkStart w:id="294" w:name="ref-squires2011haemonchus"/>
     <w:p>
       <w:pPr>
         <w:pStyle w:val="Bibliography"/>
@@ -21722,7 +22554,7 @@
       <w:r>
         <w:t xml:space="preserve"> </w:t>
       </w:r>
-      <w:hyperlink r:id="rId285">
+      <w:hyperlink r:id="rId293">
         <w:r>
           <w:rPr>
             <w:rStyle w:val="Hyperlink"/>
@@ -21734,8 +22566,8 @@
         <w:t xml:space="preserve">.</w:t>
       </w:r>
     </w:p>
-    <w:bookmarkEnd w:id="286"/>
-    <w:bookmarkStart w:id="288" w:name="ref-tabari2017sieberi"/>
+    <w:bookmarkEnd w:id="294"/>
+    <w:bookmarkStart w:id="296" w:name="ref-tabari2017sieberi"/>
     <w:p>
       <w:pPr>
         <w:pStyle w:val="Bibliography"/>
@@ -21769,7 +22601,7 @@
       <w:r>
         <w:t xml:space="preserve"> </w:t>
       </w:r>
-      <w:hyperlink r:id="rId287">
+      <w:hyperlink r:id="rId295">
         <w:r>
           <w:rPr>
             <w:rStyle w:val="Hyperlink"/>
@@ -21781,8 +22613,8 @@
         <w:t xml:space="preserve">.</w:t>
       </w:r>
     </w:p>
-    <w:bookmarkEnd w:id="288"/>
-    <w:bookmarkStart w:id="290" w:name="ref-tamargo2017nanocochleate"/>
+    <w:bookmarkEnd w:id="296"/>
+    <w:bookmarkStart w:id="298" w:name="ref-tamargo2017nanocochleate"/>
     <w:p>
       <w:pPr>
         <w:pStyle w:val="Bibliography"/>
@@ -21816,7 +22648,7 @@
       <w:r>
         <w:t xml:space="preserve"> </w:t>
       </w:r>
-      <w:hyperlink r:id="rId289">
+      <w:hyperlink r:id="rId297">
         <w:r>
           <w:rPr>
             <w:rStyle w:val="Hyperlink"/>
@@ -21828,8 +22660,8 @@
         <w:t xml:space="preserve">.</w:t>
       </w:r>
     </w:p>
-    <w:bookmarkEnd w:id="290"/>
-    <w:bookmarkStart w:id="292" w:name="ref-tangnitipong2012heme"/>
+    <w:bookmarkEnd w:id="298"/>
+    <w:bookmarkStart w:id="300" w:name="ref-tangnitipong2012heme"/>
     <w:p>
       <w:pPr>
         <w:pStyle w:val="Bibliography"/>
@@ -21863,7 +22695,7 @@
       <w:r>
         <w:t xml:space="preserve"> </w:t>
       </w:r>
-      <w:hyperlink r:id="rId291">
+      <w:hyperlink r:id="rId299">
         <w:r>
           <w:rPr>
             <w:rStyle w:val="Hyperlink"/>
@@ -21875,8 +22707,8 @@
         <w:t xml:space="preserve">.</w:t>
       </w:r>
     </w:p>
-    <w:bookmarkEnd w:id="292"/>
-    <w:bookmarkStart w:id="294" w:name="ref-desta2010abyssinica"/>
+    <w:bookmarkEnd w:id="300"/>
+    <w:bookmarkStart w:id="302" w:name="ref-desta2010abyssinica"/>
     <w:p>
       <w:pPr>
         <w:pStyle w:val="Bibliography"/>
@@ -21910,7 +22742,7 @@
       <w:r>
         <w:t xml:space="preserve"> </w:t>
       </w:r>
-      <w:hyperlink r:id="rId293">
+      <w:hyperlink r:id="rId301">
         <w:r>
           <w:rPr>
             <w:rStyle w:val="Hyperlink"/>
@@ -21922,8 +22754,8 @@
         <w:t xml:space="preserve">.</w:t>
       </w:r>
     </w:p>
-    <w:bookmarkEnd w:id="294"/>
-    <w:bookmarkStart w:id="296" w:name="ref-tariku2011absinthium"/>
+    <w:bookmarkEnd w:id="302"/>
+    <w:bookmarkStart w:id="304" w:name="ref-tariku2011absinthium"/>
     <w:p>
       <w:pPr>
         <w:pStyle w:val="Bibliography"/>
@@ -21957,7 +22789,7 @@
       <w:r>
         <w:t xml:space="preserve"> </w:t>
       </w:r>
-      <w:hyperlink r:id="rId295">
+      <w:hyperlink r:id="rId303">
         <w:r>
           <w:rPr>
             <w:rStyle w:val="Hyperlink"/>
@@ -21969,8 +22801,8 @@
         <w:t xml:space="preserve">.</w:t>
       </w:r>
     </w:p>
-    <w:bookmarkEnd w:id="296"/>
-    <w:bookmarkStart w:id="298" w:name="ref-tariq2009absinthium"/>
+    <w:bookmarkEnd w:id="304"/>
+    <w:bookmarkStart w:id="306" w:name="ref-tariq2009absinthium"/>
     <w:p>
       <w:pPr>
         <w:pStyle w:val="Bibliography"/>
@@ -22004,7 +22836,7 @@
       <w:r>
         <w:t xml:space="preserve"> </w:t>
       </w:r>
-      <w:hyperlink r:id="rId297">
+      <w:hyperlink r:id="rId305">
         <w:r>
           <w:rPr>
             <w:rStyle w:val="Hyperlink"/>
@@ -22016,8 +22848,8 @@
         <w:t xml:space="preserve">.</w:t>
       </w:r>
     </w:p>
-    <w:bookmarkEnd w:id="298"/>
-    <w:bookmarkStart w:id="300" w:name="ref-tasdemir2015antiprotozoal"/>
+    <w:bookmarkEnd w:id="306"/>
+    <w:bookmarkStart w:id="308" w:name="ref-tasdemir2015antiprotozoal"/>
     <w:p>
       <w:pPr>
         <w:pStyle w:val="Bibliography"/>
@@ -22051,7 +22883,7 @@
       <w:r>
         <w:t xml:space="preserve"> </w:t>
       </w:r>
-      <w:hyperlink r:id="rId299">
+      <w:hyperlink r:id="rId307">
         <w:r>
           <w:rPr>
             <w:rStyle w:val="Hyperlink"/>
@@ -22063,8 +22895,8 @@
         <w:t xml:space="preserve">.</w:t>
       </w:r>
     </w:p>
-    <w:bookmarkEnd w:id="300"/>
-    <w:bookmarkStart w:id="302" w:name="ref-teoh2006cyp"/>
+    <w:bookmarkEnd w:id="308"/>
+    <w:bookmarkStart w:id="310" w:name="ref-teoh2006cyp"/>
     <w:p>
       <w:pPr>
         <w:pStyle w:val="Bibliography"/>
@@ -22098,7 +22930,7 @@
       <w:r>
         <w:t xml:space="preserve"> </w:t>
       </w:r>
-      <w:hyperlink r:id="rId301">
+      <w:hyperlink r:id="rId309">
         <w:r>
           <w:rPr>
             <w:rStyle w:val="Hyperlink"/>
@@ -22110,8 +22942,8 @@
         <w:t xml:space="preserve">.</w:t>
       </w:r>
     </w:p>
-    <w:bookmarkEnd w:id="302"/>
-    <w:bookmarkStart w:id="304" w:name="ref-thofner2012histomonas"/>
+    <w:bookmarkEnd w:id="310"/>
+    <w:bookmarkStart w:id="312" w:name="ref-thofner2012histomonas"/>
     <w:p>
       <w:pPr>
         <w:pStyle w:val="Bibliography"/>
@@ -22157,7 +22989,7 @@
       <w:r>
         <w:t xml:space="preserve"> </w:t>
       </w:r>
-      <w:hyperlink r:id="rId303">
+      <w:hyperlink r:id="rId311">
         <w:r>
           <w:rPr>
             <w:rStyle w:val="Hyperlink"/>
@@ -22169,8 +23001,8 @@
         <w:t xml:space="preserve">.</w:t>
       </w:r>
     </w:p>
-    <w:bookmarkEnd w:id="304"/>
-    <w:bookmarkStart w:id="306" w:name="ref-trendafilova2021edibleartemisia"/>
+    <w:bookmarkEnd w:id="312"/>
+    <w:bookmarkStart w:id="314" w:name="ref-trendafilova2021edibleartemisia"/>
     <w:p>
       <w:pPr>
         <w:pStyle w:val="Bibliography"/>
@@ -22204,7 +23036,7 @@
       <w:r>
         <w:t xml:space="preserve"> </w:t>
       </w:r>
-      <w:hyperlink r:id="rId305">
+      <w:hyperlink r:id="rId313">
         <w:r>
           <w:rPr>
             <w:rStyle w:val="Hyperlink"/>
@@ -22216,8 +23048,8 @@
         <w:t xml:space="preserve">.</w:t>
       </w:r>
     </w:p>
-    <w:bookmarkEnd w:id="306"/>
-    <w:bookmarkStart w:id="308" w:name="ref-umaraliev2025persicabisabolanes"/>
+    <w:bookmarkEnd w:id="314"/>
+    <w:bookmarkStart w:id="316" w:name="ref-umaraliev2025persicabisabolanes"/>
     <w:p>
       <w:pPr>
         <w:pStyle w:val="Bibliography"/>
@@ -22257,7 +23089,7 @@
       <w:r>
         <w:t xml:space="preserve"> </w:t>
       </w:r>
-      <w:hyperlink r:id="rId307">
+      <w:hyperlink r:id="rId315">
         <w:r>
           <w:rPr>
             <w:rStyle w:val="Hyperlink"/>
@@ -22269,8 +23101,8 @@
         <w:t xml:space="preserve">.</w:t>
       </w:r>
     </w:p>
-    <w:bookmarkEnd w:id="308"/>
-    <w:bookmarkStart w:id="310" w:name="ref-umaraliev2026persicamonoterpenes"/>
+    <w:bookmarkEnd w:id="316"/>
+    <w:bookmarkStart w:id="318" w:name="ref-umaraliev2026persicamonoterpenes"/>
     <w:p>
       <w:pPr>
         <w:pStyle w:val="Bibliography"/>
@@ -22310,7 +23142,7 @@
       <w:r>
         <w:t xml:space="preserve"> </w:t>
       </w:r>
-      <w:hyperlink r:id="rId309">
+      <w:hyperlink r:id="rId317">
         <w:r>
           <w:rPr>
             <w:rStyle w:val="Hyperlink"/>
@@ -22322,8 +23154,8 @@
         <w:t xml:space="preserve">.</w:t>
       </w:r>
     </w:p>
-    <w:bookmarkEnd w:id="310"/>
-    <w:bookmarkStart w:id="312" w:name="ref-urban2020trpc3"/>
+    <w:bookmarkEnd w:id="318"/>
+    <w:bookmarkStart w:id="320" w:name="ref-urban2020trpc3"/>
     <w:p>
       <w:pPr>
         <w:pStyle w:val="Bibliography"/>
@@ -22369,7 +23201,7 @@
       <w:r>
         <w:t xml:space="preserve"> </w:t>
       </w:r>
-      <w:hyperlink r:id="rId311">
+      <w:hyperlink r:id="rId319">
         <w:r>
           <w:rPr>
             <w:rStyle w:val="Hyperlink"/>
@@ -22381,8 +23213,8 @@
         <w:t xml:space="preserve">.</w:t>
       </w:r>
     </w:p>
-    <w:bookmarkEnd w:id="312"/>
-    <w:bookmarkStart w:id="314" w:name="ref-varadyova2018medicinalplants"/>
+    <w:bookmarkEnd w:id="320"/>
+    <w:bookmarkStart w:id="322" w:name="ref-varadyova2018medicinalplants"/>
     <w:p>
       <w:pPr>
         <w:pStyle w:val="Bibliography"/>
@@ -22425,7 +23257,7 @@
       <w:r>
         <w:t xml:space="preserve"> </w:t>
       </w:r>
-      <w:hyperlink r:id="rId313">
+      <w:hyperlink r:id="rId321">
         <w:r>
           <w:rPr>
             <w:rStyle w:val="Hyperlink"/>
@@ -22437,8 +23269,8 @@
         <w:t xml:space="preserve">.</w:t>
       </w:r>
     </w:p>
-    <w:bookmarkEnd w:id="314"/>
-    <w:bookmarkStart w:id="316" w:name="ref-walz2024aframalaria"/>
+    <w:bookmarkEnd w:id="322"/>
+    <w:bookmarkStart w:id="324" w:name="ref-walz2024aframalaria"/>
     <w:p>
       <w:pPr>
         <w:pStyle w:val="Bibliography"/>
@@ -22484,7 +23316,7 @@
       <w:r>
         <w:t xml:space="preserve"> </w:t>
       </w:r>
-      <w:hyperlink r:id="rId315">
+      <w:hyperlink r:id="rId323">
         <w:r>
           <w:rPr>
             <w:rStyle w:val="Hyperlink"/>
@@ -22496,8 +23328,8 @@
         <w:t xml:space="preserve">.</w:t>
       </w:r>
     </w:p>
-    <w:bookmarkEnd w:id="316"/>
-    <w:bookmarkStart w:id="318" w:name="ref-wang2013cyp71av1promoter"/>
+    <w:bookmarkEnd w:id="324"/>
+    <w:bookmarkStart w:id="326" w:name="ref-wang2013cyp71av1promoter"/>
     <w:p>
       <w:pPr>
         <w:pStyle w:val="Bibliography"/>
@@ -22531,7 +23363,7 @@
       <w:r>
         <w:t xml:space="preserve"> </w:t>
       </w:r>
-      <w:hyperlink r:id="rId317">
+      <w:hyperlink r:id="rId325">
         <w:r>
           <w:rPr>
             <w:rStyle w:val="Hyperlink"/>
@@ -22543,8 +23375,8 @@
         <w:t xml:space="preserve">.</w:t>
       </w:r>
     </w:p>
-    <w:bookmarkEnd w:id="318"/>
-    <w:bookmarkStart w:id="320" w:name="ref-wang2009trichometranscriptome"/>
+    <w:bookmarkEnd w:id="326"/>
+    <w:bookmarkStart w:id="328" w:name="ref-wang2009trichometranscriptome"/>
     <w:p>
       <w:pPr>
         <w:pStyle w:val="Bibliography"/>
@@ -22578,7 +23410,7 @@
       <w:r>
         <w:t xml:space="preserve"> </w:t>
       </w:r>
-      <w:hyperlink r:id="rId319">
+      <w:hyperlink r:id="rId327">
         <w:r>
           <w:rPr>
             <w:rStyle w:val="Hyperlink"/>
@@ -22590,8 +23422,8 @@
         <w:t xml:space="preserve">.</w:t>
       </w:r>
     </w:p>
-    <w:bookmarkEnd w:id="320"/>
-    <w:bookmarkStart w:id="322" w:name="ref-wani2023nitric"/>
+    <w:bookmarkEnd w:id="328"/>
+    <w:bookmarkStart w:id="330" w:name="ref-wani2023nitric"/>
     <w:p>
       <w:pPr>
         <w:pStyle w:val="Bibliography"/>
@@ -22649,7 +23481,7 @@
       <w:r>
         <w:t xml:space="preserve"> </w:t>
       </w:r>
-      <w:hyperlink r:id="rId321">
+      <w:hyperlink r:id="rId329">
         <w:r>
           <w:rPr>
             <w:rStyle w:val="Hyperlink"/>
@@ -22661,8 +23493,8 @@
         <w:t xml:space="preserve">.</w:t>
       </w:r>
     </w:p>
-    <w:bookmarkEnd w:id="322"/>
-    <w:bookmarkStart w:id="324" w:name="ref-wani2026maritima"/>
+    <w:bookmarkEnd w:id="330"/>
+    <w:bookmarkStart w:id="332" w:name="ref-wani2026maritima"/>
     <w:p>
       <w:pPr>
         <w:pStyle w:val="Bibliography"/>
@@ -22708,7 +23540,7 @@
       <w:r>
         <w:t xml:space="preserve"> </w:t>
       </w:r>
-      <w:hyperlink r:id="rId323">
+      <w:hyperlink r:id="rId331">
         <w:r>
           <w:rPr>
             <w:rStyle w:val="Hyperlink"/>
@@ -22720,8 +23552,8 @@
         <w:t xml:space="preserve">.</w:t>
       </w:r>
     </w:p>
-    <w:bookmarkEnd w:id="324"/>
-    <w:bookmarkStart w:id="326" w:name="ref-wetmore2019psiv9"/>
+    <w:bookmarkEnd w:id="332"/>
+    <w:bookmarkStart w:id="334" w:name="ref-wetmore2019psiv9"/>
     <w:p>
       <w:pPr>
         <w:pStyle w:val="Bibliography"/>
@@ -22767,7 +23599,7 @@
       <w:r>
         <w:t xml:space="preserve"> </w:t>
       </w:r>
-      <w:hyperlink r:id="rId325">
+      <w:hyperlink r:id="rId333">
         <w:r>
           <w:rPr>
             <w:rStyle w:val="Hyperlink"/>
@@ -22779,8 +23611,8 @@
         <w:t xml:space="preserve">.</w:t>
       </w:r>
     </w:p>
-    <w:bookmarkEnd w:id="326"/>
-    <w:bookmarkStart w:id="328" w:name="ref-wiedosari2017eimeria"/>
+    <w:bookmarkEnd w:id="334"/>
+    <w:bookmarkStart w:id="336" w:name="ref-wiedosari2017eimeria"/>
     <w:p>
       <w:pPr>
         <w:pStyle w:val="Bibliography"/>
@@ -22835,7 +23667,7 @@
       <w:r>
         <w:t xml:space="preserve"> </w:t>
       </w:r>
-      <w:hyperlink r:id="rId327">
+      <w:hyperlink r:id="rId335">
         <w:r>
           <w:rPr>
             <w:rStyle w:val="Hyperlink"/>
@@ -22847,8 +23679,8 @@
         <w:t xml:space="preserve">.</w:t>
       </w:r>
     </w:p>
-    <w:bookmarkEnd w:id="328"/>
-    <w:bookmarkStart w:id="330" w:name="ref-wright2010qinghao"/>
+    <w:bookmarkEnd w:id="336"/>
+    <w:bookmarkStart w:id="338" w:name="ref-wright2010qinghao"/>
     <w:p>
       <w:pPr>
         <w:pStyle w:val="Bibliography"/>
@@ -22894,7 +23726,7 @@
       <w:r>
         <w:t xml:space="preserve"> </w:t>
       </w:r>
-      <w:hyperlink r:id="rId329">
+      <w:hyperlink r:id="rId337">
         <w:r>
           <w:rPr>
             <w:rStyle w:val="Hyperlink"/>
@@ -22906,8 +23738,8 @@
         <w:t xml:space="preserve">.</w:t>
       </w:r>
     </w:p>
-    <w:bookmarkEnd w:id="330"/>
-    <w:bookmarkStart w:id="332" w:name="ref-xiang2019bhlh112"/>
+    <w:bookmarkEnd w:id="338"/>
+    <w:bookmarkStart w:id="340" w:name="ref-xiang2019bhlh112"/>
     <w:p>
       <w:pPr>
         <w:pStyle w:val="Bibliography"/>
@@ -22941,7 +23773,7 @@
       <w:r>
         <w:t xml:space="preserve"> </w:t>
       </w:r>
-      <w:hyperlink r:id="rId331">
+      <w:hyperlink r:id="rId339">
         <w:r>
           <w:rPr>
             <w:rStyle w:val="Hyperlink"/>
@@ -22953,8 +23785,8 @@
         <w:t xml:space="preserve">.</w:t>
       </w:r>
     </w:p>
-    <w:bookmarkEnd w:id="332"/>
-    <w:bookmarkStart w:id="334" w:name="ref-xu2025plantmatrix"/>
+    <w:bookmarkEnd w:id="340"/>
+    <w:bookmarkStart w:id="342" w:name="ref-xu2025plantmatrix"/>
     <w:p>
       <w:pPr>
         <w:pStyle w:val="Bibliography"/>
@@ -23000,7 +23832,7 @@
       <w:r>
         <w:t xml:space="preserve"> </w:t>
       </w:r>
-      <w:hyperlink r:id="rId333">
+      <w:hyperlink r:id="rId341">
         <w:r>
           <w:rPr>
             <w:rStyle w:val="Hyperlink"/>
@@ -23012,8 +23844,8 @@
         <w:t xml:space="preserve">.</w:t>
       </w:r>
     </w:p>
-    <w:bookmarkEnd w:id="334"/>
-    <w:bookmarkStart w:id="336" w:name="ref-xu2026artemisininpk"/>
+    <w:bookmarkEnd w:id="342"/>
+    <w:bookmarkStart w:id="344" w:name="ref-xu2026artemisininpk"/>
     <w:p>
       <w:pPr>
         <w:pStyle w:val="Bibliography"/>
@@ -23059,7 +23891,7 @@
       <w:r>
         <w:t xml:space="preserve"> </w:t>
       </w:r>
-      <w:hyperlink r:id="rId335">
+      <w:hyperlink r:id="rId343">
         <w:r>
           <w:rPr>
             <w:rStyle w:val="Hyperlink"/>
@@ -23071,8 +23903,8 @@
         <w:t xml:space="preserve">.</w:t>
       </w:r>
     </w:p>
-    <w:bookmarkEnd w:id="336"/>
-    <w:bookmarkStart w:id="338" w:name="ref-yildiz2011toxocara"/>
+    <w:bookmarkEnd w:id="344"/>
+    <w:bookmarkStart w:id="346" w:name="ref-yildiz2011toxocara"/>
     <w:p>
       <w:pPr>
         <w:pStyle w:val="Bibliography"/>
@@ -23130,7 +23962,7 @@
       <w:r>
         <w:t xml:space="preserve"> </w:t>
       </w:r>
-      <w:hyperlink r:id="rId337">
+      <w:hyperlink r:id="rId345">
         <w:r>
           <w:rPr>
             <w:rStyle w:val="Hyperlink"/>
@@ -23142,8 +23974,8 @@
         <w:t xml:space="preserve">.</w:t>
       </w:r>
     </w:p>
-    <w:bookmarkEnd w:id="338"/>
-    <w:bookmarkStart w:id="340" w:name="ref-zehra2020copper"/>
+    <w:bookmarkEnd w:id="346"/>
+    <w:bookmarkStart w:id="348" w:name="ref-zehra2020copper"/>
     <w:p>
       <w:pPr>
         <w:pStyle w:val="Bibliography"/>
@@ -23189,7 +24021,7 @@
       <w:r>
         <w:t xml:space="preserve"> </w:t>
       </w:r>
-      <w:hyperlink r:id="rId339">
+      <w:hyperlink r:id="rId347">
         <w:r>
           <w:rPr>
             <w:rStyle w:val="Hyperlink"/>
@@ -23201,8 +24033,8 @@
         <w:t xml:space="preserve">.</w:t>
       </w:r>
     </w:p>
-    <w:bookmarkEnd w:id="340"/>
-    <w:bookmarkStart w:id="342" w:name="ref-zhang2022fiveartemisia"/>
+    <w:bookmarkEnd w:id="348"/>
+    <w:bookmarkStart w:id="350" w:name="ref-zhang2022fiveartemisia"/>
     <w:p>
       <w:pPr>
         <w:pStyle w:val="Bibliography"/>
@@ -23248,7 +24080,7 @@
       <w:r>
         <w:t xml:space="preserve"> </w:t>
       </w:r>
-      <w:hyperlink r:id="rId341">
+      <w:hyperlink r:id="rId349">
         <w:r>
           <w:rPr>
             <w:rStyle w:val="Hyperlink"/>
@@ -23260,8 +24092,8 @@
         <w:t xml:space="preserve">.</w:t>
       </w:r>
     </w:p>
-    <w:bookmarkEnd w:id="342"/>
-    <w:bookmarkStart w:id="344" w:name="ref-zhang2026annuaenhancement"/>
+    <w:bookmarkEnd w:id="350"/>
+    <w:bookmarkStart w:id="352" w:name="ref-zhang2026annuaenhancement"/>
     <w:p>
       <w:pPr>
         <w:pStyle w:val="Bibliography"/>
@@ -23307,7 +24139,7 @@
       <w:r>
         <w:t xml:space="preserve"> </w:t>
       </w:r>
-      <w:hyperlink r:id="rId343">
+      <w:hyperlink r:id="rId351">
         <w:r>
           <w:rPr>
             <w:rStyle w:val="Hyperlink"/>
@@ -23319,8 +24151,8 @@
         <w:t xml:space="preserve">.</w:t>
       </w:r>
     </w:p>
-    <w:bookmarkEnd w:id="344"/>
-    <w:bookmarkStart w:id="346" w:name="ref-zhang2020argyitriterpenoids"/>
+    <w:bookmarkEnd w:id="352"/>
+    <w:bookmarkStart w:id="354" w:name="ref-zhang2020argyitriterpenoids"/>
     <w:p>
       <w:pPr>
         <w:pStyle w:val="Bibliography"/>
@@ -23363,7 +24195,7 @@
       <w:r>
         <w:t xml:space="preserve"> </w:t>
       </w:r>
-      <w:hyperlink r:id="rId345">
+      <w:hyperlink r:id="rId353">
         <w:r>
           <w:rPr>
             <w:rStyle w:val="Hyperlink"/>
@@ -23375,8 +24207,8 @@
         <w:t xml:space="preserve">.</w:t>
       </w:r>
     </w:p>
-    <w:bookmarkEnd w:id="346"/>
-    <w:bookmarkStart w:id="348" w:name="ref-zhang2019pp2c1"/>
+    <w:bookmarkEnd w:id="354"/>
+    <w:bookmarkStart w:id="356" w:name="ref-zhang2019pp2c1"/>
     <w:p>
       <w:pPr>
         <w:pStyle w:val="Bibliography"/>
@@ -23428,7 +24260,7 @@
       <w:r>
         <w:t xml:space="preserve"> </w:t>
       </w:r>
-      <w:hyperlink r:id="rId347">
+      <w:hyperlink r:id="rId355">
         <w:r>
           <w:rPr>
             <w:rStyle w:val="Hyperlink"/>
@@ -23440,8 +24272,8 @@
         <w:t xml:space="preserve">.</w:t>
       </w:r>
     </w:p>
-    <w:bookmarkEnd w:id="348"/>
-    <w:bookmarkStart w:id="350" w:name="ref-zhang2008dbr2"/>
+    <w:bookmarkEnd w:id="356"/>
+    <w:bookmarkStart w:id="358" w:name="ref-zhang2008dbr2"/>
     <w:p>
       <w:pPr>
         <w:pStyle w:val="Bibliography"/>
@@ -23475,7 +24307,7 @@
       <w:r>
         <w:t xml:space="preserve"> </w:t>
       </w:r>
-      <w:hyperlink r:id="rId349">
+      <w:hyperlink r:id="rId357">
         <w:r>
           <w:rPr>
             <w:rStyle w:val="Hyperlink"/>
@@ -23487,8 +24319,8 @@
         <w:t xml:space="preserve">.</w:t>
       </w:r>
     </w:p>
-    <w:bookmarkEnd w:id="350"/>
-    <w:bookmarkStart w:id="352" w:name="ref-frigida2023variability"/>
+    <w:bookmarkEnd w:id="358"/>
+    <w:bookmarkStart w:id="360" w:name="ref-frigida2023variability"/>
     <w:p>
       <w:pPr>
         <w:pStyle w:val="Bibliography"/>
@@ -23522,7 +24354,7 @@
       <w:r>
         <w:t xml:space="preserve"> </w:t>
       </w:r>
-      <w:hyperlink r:id="rId351">
+      <w:hyperlink r:id="rId359">
         <w:r>
           <w:rPr>
             <w:rStyle w:val="Hyperlink"/>
@@ -23534,9 +24366,9 @@
         <w:t xml:space="preserve">.</w:t>
       </w:r>
     </w:p>
-    <w:bookmarkEnd w:id="352"/>
-    <w:bookmarkEnd w:id="353"/>
-    <w:bookmarkEnd w:id="354"/>
+    <w:bookmarkEnd w:id="360"/>
+    <w:bookmarkEnd w:id="361"/>
+    <w:bookmarkEnd w:id="362"/>
     <w:sectPr>
       <w:headerReference w:type="default" r:id="rId9"/>
       <w:footerReference w:type="default" r:id="rId10"/>

</xml_diff>

<commit_message>
Document conservative quantitative synthesis decision
</commit_message>
<xml_diff>
--- a/manuscript/artemisia-terpene-review-submission.docx
+++ b/manuscript/artemisia-terpene-review-submission.docx
@@ -1593,7 +1593,19 @@
         <w:t xml:space="preserve"> </w:t>
       </w:r>
       <w:r>
-        <w:t xml:space="preserve">taxon or defined preparation and to address at least one in-scope analytical, biosynthetic, genomic, biochemical, antiparasitic, toxicological, taxonomic, or review question. Records without sufficient taxon or preparation context were not used to support quantitative or mechanistic synthesis; metadata-only leads remain visible in the registry and open full-text queue rather than being treated as included studies. No pooled efficacy estimate is reported while these eligibility and harmonization gates remain open.</w:t>
+        <w:t xml:space="preserve">taxon or defined preparation and to address at least one in-scope analytical, biosynthetic, genomic, biochemical, antiparasitic, toxicological, taxonomic, or review question. Records without sufficient taxon or preparation context were not used to support quantitative or mechanistic synthesis; metadata-only leads remain visible in the registry rather than being treated as included studies. A row-level quantitative eligibility audit is archived in</w:t>
+      </w:r>
+      <w:r>
+        <w:t xml:space="preserve"> </w:t>
+      </w:r>
+      <w:r>
+        <w:rPr>
+          <w:rStyle w:val="VerbatimChar"/>
+        </w:rPr>
+        <w:t xml:space="preserve">quantitative-eligibility-audit.csv</w:t>
+      </w:r>
+      <w:r>
+        <w:t xml:space="preserve">: 83 rows have numeric descriptive data, 25 have partial numeric resolution, and 25 are qualitative or metadata-level. No row met the conservative pooling gate requiring independent cross-study replication, matched taxon/preparation/parasite stage/outcome/unit, and dispersion or variance data. No pooled efficacy estimate is reported.</w:t>
       </w:r>
     </w:p>
     <w:p>
@@ -14907,19 +14919,43 @@
         <w:t xml:space="preserve">species tree.</w:t>
       </w:r>
     </w:p>
-    <w:bookmarkStart w:id="38" w:name="minimum-reporting-standard"/>
+    <w:bookmarkStart w:id="38" w:name="X5686106d4127406f77151a42a58012681f3df65"/>
     <w:p>
       <w:pPr>
         <w:pStyle w:val="Heading3"/>
         <w:spacing w:before="0" w:after="120" w:line="264" w:lineRule="auto"/>
       </w:pPr>
       <w:r>
-        <w:t xml:space="preserve">8.1 Minimum reporting standard</w:t>
+        <w:t xml:space="preserve">8.1 Quantitative synthesis decision and minimum reporting standard</w:t>
       </w:r>
     </w:p>
     <w:p>
       <w:pPr>
         <w:pStyle w:val="FirstParagraph"/>
+        <w:spacing w:before="0" w:after="120" w:line="264" w:lineRule="auto"/>
+      </w:pPr>
+      <w:r>
+        <w:t xml:space="preserve">The current</w:t>
+      </w:r>
+      <w:r>
+        <w:t xml:space="preserve"> </w:t>
+      </w:r>
+      <w:r>
+        <w:rPr>
+          <w:rStyle w:val="VerbatimChar"/>
+        </w:rPr>
+        <w:t xml:space="preserve">quantitative-eligibility-audit.csv</w:t>
+      </w:r>
+      <w:r>
+        <w:t xml:space="preserve"> </w:t>
+      </w:r>
+      <w:r>
+        <w:t xml:space="preserve">records a conservative no-pooling decision for all 133 antiparasitic rows. Numeric results remain available for descriptive comparison, but same-source stage comparisons are not treated as independent replicates, and no row is pooled without matched taxon, preparation, parasite stage, outcome, units, and dispersion data. This prevents a superficially precise genus-wide estimate from combining purified artemisinin, oils, extracts, formulated products, surrogate assays, and heterogeneous host models.</w:t>
+      </w:r>
+    </w:p>
+    <w:p>
+      <w:pPr>
+        <w:pStyle w:val="BodyText"/>
         <w:spacing w:before="0" w:after="120" w:line="264" w:lineRule="auto"/>
       </w:pPr>
       <w:r>
@@ -15060,7 +15096,7 @@
         <w:t xml:space="preserve">article.md</w:t>
       </w:r>
       <w:r>
-        <w:t xml:space="preserve">; this file is the consolidated submission version. Large comparative-genomics inputs and outputs, search snapshots, structured evidence tables, claim audits, and SHA-256 manifests are versioned in the same package. The exact frozen source commit is recorded in the synchronized Terpedia snapshot metadata; the current Terpedia snapshot is maintained on the</w:t>
+        <w:t xml:space="preserve">; this file is the consolidated submission version. Large comparative-genomics inputs and outputs, search snapshots, structured evidence tables, quantitative eligibility audit, claim audits, and SHA-256 manifests are versioned in the same package. The exact frozen source commit is recorded in the synchronized Terpedia snapshot metadata; the current Terpedia snapshot is maintained on the</w:t>
       </w:r>
       <w:r>
         <w:t xml:space="preserve"> </w:t>

</xml_diff>

<commit_message>
Tighten quantitative audit and submission state
</commit_message>
<xml_diff>
--- a/manuscript/artemisia-terpene-review-submission.docx
+++ b/manuscript/artemisia-terpene-review-submission.docx
@@ -976,7 +976,7 @@
         <w:spacing w:before="0" w:after="120" w:line="264" w:lineRule="auto"/>
       </w:pPr>
       <w:r>
-        <w:t xml:space="preserve">The analysis is reported as a frozen scoping review rather than a completed systematic review. The retrieval snapshot contains 1,408 bounded title/abstract decisions, covering all 1,387 priority-queue records plus 21 historical or out-of-queue decisions. Source-level verification now covers all 114 queued antiparasitic sources and all 133 linked evidence rows; quantitative eligibility and harmonization remain open, and no result is pooled as a final quantitative estimate. The</w:t>
+        <w:t xml:space="preserve">The analysis is reported as a frozen scoping review rather than a completed systematic review. The retrieval snapshot contains 1,408 bounded title/abstract decisions, covering all 1,387 priority-queue records plus 21 historical or out-of-queue decisions. Source-level verification now covers all 114 queued antiparasitic sources and all 133 linked evidence rows; the row-level quantitative audit is complete and found zero pooling candidates, while cross-study harmonization remains open. The</w:t>
       </w:r>
       <w:r>
         <w:t xml:space="preserve"> </w:t>
@@ -1606,6 +1606,27 @@
       </w:r>
       <w:r>
         <w:t xml:space="preserve">: 83 rows have numeric descriptive data, 25 have partial numeric resolution, and 25 are qualitative or metadata-level. No row met the conservative pooling gate requiring independent cross-study replication, matched taxon/preparation/parasite stage/outcome/unit, and dispersion or variance data. No pooled efficacy estimate is reported.</w:t>
+      </w:r>
+    </w:p>
+    <w:p>
+      <w:pPr>
+        <w:pStyle w:val="BodyText"/>
+        <w:spacing w:before="0" w:after="120" w:line="264" w:lineRule="auto"/>
+      </w:pPr>
+      <w:r>
+        <w:t xml:space="preserve">The 68 manuscript claims containing substantive numeric values are crosswalked in</w:t>
+      </w:r>
+      <w:r>
+        <w:t xml:space="preserve"> </w:t>
+      </w:r>
+      <w:r>
+        <w:rPr>
+          <w:rStyle w:val="VerbatimChar"/>
+        </w:rPr>
+        <w:t xml:space="preserve">quantitative-claim-audit.csv</w:t>
+      </w:r>
+      <w:r>
+        <w:t xml:space="preserve">; 67 are anchored to primary or direct-assay records, and one network-meta-analysis statement is explicitly retained as secondary quantitative context. This audit verifies source linkage and inference scope without converting heterogeneous study values into a pooled estimate.</w:t>
       </w:r>
     </w:p>
     <w:p>
@@ -15096,7 +15117,7 @@
         <w:t xml:space="preserve">article.md</w:t>
       </w:r>
       <w:r>
-        <w:t xml:space="preserve">; this file is the consolidated submission version. Large comparative-genomics inputs and outputs, search snapshots, structured evidence tables, quantitative eligibility audit, claim audits, and SHA-256 manifests are versioned in the same package. The exact frozen source commit is recorded in the synchronized Terpedia snapshot metadata; the current Terpedia snapshot is maintained on the</w:t>
+        <w:t xml:space="preserve">; this file is the consolidated submission version. Large comparative-genomics inputs and outputs, search snapshots, structured evidence tables, quantitative eligibility and claim audits, screening exclusions, and SHA-256 manifests are versioned in the same package. The exact frozen source commit is recorded in the synchronized Terpedia snapshot metadata; the current Terpedia snapshot is maintained on the</w:t>
       </w:r>
       <w:r>
         <w:t xml:space="preserve"> </w:t>

</xml_diff>

<commit_message>
Document AI workflow in manuscript methods
</commit_message>
<xml_diff>
--- a/manuscript/artemisia-terpene-review-submission.docx
+++ b/manuscript/artemisia-terpene-review-submission.docx
@@ -1569,6 +1569,15 @@
       </w:r>
       <w:r>
         <w:t xml:space="preserve">. Reviews are used for discovery and context, while quantitative and mechanistic statements are preferentially anchored to primary studies.</w:t>
+      </w:r>
+    </w:p>
+    <w:p>
+      <w:pPr>
+        <w:pStyle w:val="BodyText"/>
+        <w:spacing w:before="0" w:after="120" w:line="264" w:lineRule="auto"/>
+      </w:pPr>
+      <w:r>
+        <w:t xml:space="preserve">An AI-assisted workflow supported evidence organization, source-linked drafting, citation conversion, and editorial revision. The tool did not replace the registered source records, source-level verification, row-level audit, or human authorship decisions; claims were retained only when linked to the Terpedia evidence package and bounded by the recorded source context. The submitting authors must independently verify the final manuscript, approve the author list and declarations, and accept responsibility for the content.</w:t>
       </w:r>
     </w:p>
     <w:p>

</xml_diff>